<commit_message>
docs(knowledge): add BE-28 (session sign-in) to the Phase 1 guide
Section 2 walks through the sign-in flow, the session cookie flags,
why CSRF must be on once a cookie rides along (double submit cookie,
csrf.spa()), the hand-written sign-in endpoint (constant-time unknown
email, session fixation, saving the security context), the BCrypt salt
trap of remember-me and its HMAC fingerprint, dropping HTTP Basic, the
Jackson 3 primitive trap, testing on a real server, and the mutation
that survived until a session-invalidation test was added. Five
self-check questions added. The Word copy is regenerated (docs check
clean) and the new pages were inspected.

Co-Authored-By: Claude Opus 5.5 (1M context) <noreply@anthropic.com>
</commit_message>
<xml_diff>
--- a/docs/knowledge/phase-1-frontend-foundation.docx
+++ b/docs/knowledge/phase-1-frontend-foundation.docx
@@ -106,7 +106,7 @@
         <w:t xml:space="preserve">openspec/changes/fe-f01-web-foundation</w:t>
       </w:r>
       <w:r>
-        <w:t xml:space="preserve"> (D-22 + F01-FE). Đang làm: xong BE-27.</w:t>
+        <w:t xml:space="preserve"> (D-22 + F01-FE). Đang làm: xong BE-27, BE-28.</w:t>
         <w:br/>
       </w:r>
       <w:r>
@@ -505,7 +505,7 @@
           </w:tcPr>
           <w:p>
             <w:r>
-              <w:t xml:space="preserve">chưa làm</w:t>
+              <w:t xml:space="preserve">xong</w:t>
             </w:r>
           </w:p>
         </w:tc>
@@ -1302,6 +1302,1201 @@
         <w:pStyle w:val="Heading2"/>
       </w:pPr>
       <w:r>
+        <w:t xml:space="preserve">2. Đăng nhập bằng session, CSRF, remember-me (BE-28)</w:t>
+      </w:r>
+    </w:p>
+    <w:p>
+      <w:pPr>
+        <w:pStyle w:val="Heading3"/>
+      </w:pPr>
+      <w:r>
+        <w:t xml:space="preserve">2.1 Luồng đăng nhập từ đầu tới cuối</w:t>
+      </w:r>
+    </w:p>
+    <w:p>
+      <w:pPr>
+        <w:pStyle w:val="ListParagraph"/>
+        <w:numPr>
+          <w:ilvl w:val="0"/>
+          <w:numId w:val="1"/>
+        </w:numPr>
+      </w:pPr>
+      <w:r>
+        <w:rPr>
+          <w:b/>
+          <w:bCs/>
+        </w:rPr>
+        <w:t xml:space="preserve">Ở đâu:</w:t>
+      </w:r>
+      <w:r>
+        <w:t xml:space="preserve"> </w:t>
+      </w:r>
+      <w:r>
+        <w:rPr>
+          <w:rFonts w:ascii="Consolas" w:eastAsia="Consolas" w:hAnsi="Consolas" w:cs="Consolas"/>
+        </w:rPr>
+        <w:t xml:space="preserve">common/security/SecurityConfig.java</w:t>
+      </w:r>
+      <w:r>
+        <w:t xml:space="preserve"> (luật truy cập, CSRF, remember-me, đăng xuất), </w:t>
+      </w:r>
+      <w:r>
+        <w:rPr>
+          <w:rFonts w:ascii="Consolas" w:eastAsia="Consolas" w:hAnsi="Consolas" w:cs="Consolas"/>
+        </w:rPr>
+        <w:t xml:space="preserve">identity/api/AuthController.java</w:t>
+      </w:r>
+      <w:r>
+        <w:t xml:space="preserve"> (</w:t>
+      </w:r>
+      <w:r>
+        <w:rPr>
+          <w:rFonts w:ascii="Consolas" w:eastAsia="Consolas" w:hAnsi="Consolas" w:cs="Consolas"/>
+        </w:rPr>
+        <w:t xml:space="preserve">/me</w:t>
+      </w:r>
+      <w:r>
+        <w:t xml:space="preserve">, </w:t>
+      </w:r>
+      <w:r>
+        <w:rPr>
+          <w:rFonts w:ascii="Consolas" w:eastAsia="Consolas" w:hAnsi="Consolas" w:cs="Consolas"/>
+        </w:rPr>
+        <w:t xml:space="preserve">/login</w:t>
+      </w:r>
+      <w:r>
+        <w:t xml:space="preserve">), </w:t>
+      </w:r>
+      <w:r>
+        <w:rPr>
+          <w:rFonts w:ascii="Consolas" w:eastAsia="Consolas" w:hAnsi="Consolas" w:cs="Consolas"/>
+        </w:rPr>
+        <w:t xml:space="preserve">identity/application/SignInService.java</w:t>
+      </w:r>
+      <w:r>
+        <w:t xml:space="preserve">, </w:t>
+      </w:r>
+      <w:r>
+        <w:rPr>
+          <w:rFonts w:ascii="Consolas" w:eastAsia="Consolas" w:hAnsi="Consolas" w:cs="Consolas"/>
+        </w:rPr>
+        <w:t xml:space="preserve">identity/application/LoginConfiguration.java</w:t>
+      </w:r>
+      <w:r>
+        <w:t xml:space="preserve"> (các bean đăng nhập).</w:t>
+      </w:r>
+    </w:p>
+    <w:p>
+      <w:pPr>
+        <w:shd w:val="clear" w:color="auto" w:fill="F2F3F5"/>
+        <w:ind w:left="0"/>
+      </w:pPr>
+      <w:r>
+        <w:rPr>
+          <w:rFonts w:ascii="Consolas" w:eastAsia="Consolas" w:hAnsi="Consolas" w:cs="Consolas"/>
+          <w:sz w:val="19"/>
+          <w:szCs w:val="19"/>
+        </w:rPr>
+        <w:t xml:space="preserve">1. GET /api/auth/me</w:t>
+        <w:br/>
+        <w:t xml:space="preserve">     &lt;- 401 + cookie XSRF-TOKEN=abc (JavaScript đọc được)</w:t>
+        <w:br/>
+        <w:t xml:space="preserve">2. POST /api/auth/login</w:t>
+        <w:br/>
+        <w:t xml:space="preserve">     header X-XSRF-TOKEN: abc</w:t>
+        <w:br/>
+        <w:t xml:space="preserve">     body {email, password, rememberMe}</w:t>
+        <w:br/>
+        <w:t xml:space="preserve">     server: kiểm CSRF (header phải = cookie)</w:t>
+        <w:br/>
+        <w:t xml:space="preserve">             so mật khẩu với bản băm BCrypt</w:t>
+        <w:br/>
+        <w:t xml:space="preserve">             đổi session ID, lưu "ai đang đăng nhập" vào session</w:t>
+        <w:br/>
+        <w:t xml:space="preserve">     &lt;- 204 + cookie JSESSIONID (HttpOnly, SameSite=Lax)</w:t>
+        <w:br/>
+        <w:t xml:space="preserve">            [+ cookie remember-me nếu chọn ghi nhớ]</w:t>
+        <w:br/>
+        <w:t xml:space="preserve">3. GET /api/accounts (cookie tự đi kèm)</w:t>
+        <w:br/>
+        <w:t xml:space="preserve">     &lt;- 200</w:t>
+        <w:br/>
+        <w:t xml:space="preserve">4. POST /api/auth/logout + header X-XSRF-TOKEN</w:t>
+        <w:br/>
+        <w:t xml:space="preserve">     &lt;- 204: hủy session, xóa cookie ghi nhớ</w:t>
+      </w:r>
+    </w:p>
+    <w:p>
+      <w:pPr>
+        <w:pStyle w:val="Heading3"/>
+      </w:pPr>
+      <w:r>
+        <w:t xml:space="preserve">2.2 Cookie session</w:t>
+      </w:r>
+    </w:p>
+    <w:p>
+      <w:pPr>
+        <w:pStyle w:val="ListParagraph"/>
+        <w:numPr>
+          <w:ilvl w:val="0"/>
+          <w:numId w:val="1"/>
+        </w:numPr>
+      </w:pPr>
+      <w:r>
+        <w:rPr>
+          <w:rFonts w:ascii="Consolas" w:eastAsia="Consolas" w:hAnsi="Consolas" w:cs="Consolas"/>
+          <w:b/>
+          <w:bCs/>
+        </w:rPr>
+        <w:t xml:space="preserve">HttpOnly</w:t>
+      </w:r>
+      <w:r>
+        <w:rPr>
+          <w:b/>
+          <w:bCs/>
+        </w:rPr>
+        <w:t xml:space="preserve">:</w:t>
+      </w:r>
+      <w:r>
+        <w:t xml:space="preserve"> JavaScript không đọc được, nên một đoạn script bị chèn vào trang (XSS) không lấy cắp được phiên.</w:t>
+      </w:r>
+    </w:p>
+    <w:p>
+      <w:pPr>
+        <w:pStyle w:val="ListParagraph"/>
+        <w:numPr>
+          <w:ilvl w:val="0"/>
+          <w:numId w:val="1"/>
+        </w:numPr>
+      </w:pPr>
+      <w:r>
+        <w:rPr>
+          <w:rFonts w:ascii="Consolas" w:eastAsia="Consolas" w:hAnsi="Consolas" w:cs="Consolas"/>
+          <w:b/>
+          <w:bCs/>
+        </w:rPr>
+        <w:t xml:space="preserve">SameSite=Lax</w:t>
+      </w:r>
+      <w:r>
+        <w:rPr>
+          <w:b/>
+          <w:bCs/>
+        </w:rPr>
+        <w:t xml:space="preserve">:</w:t>
+      </w:r>
+      <w:r>
+        <w:t xml:space="preserve"> trình duyệt không gửi cookie này theo request POST/PATCH/DELETE xuất phát từ trang web khác. Đây là lớp chặn CSRF thứ nhất.</w:t>
+      </w:r>
+    </w:p>
+    <w:p>
+      <w:pPr>
+        <w:pStyle w:val="ListParagraph"/>
+        <w:numPr>
+          <w:ilvl w:val="0"/>
+          <w:numId w:val="1"/>
+        </w:numPr>
+      </w:pPr>
+      <w:r>
+        <w:rPr>
+          <w:rFonts w:ascii="Consolas" w:eastAsia="Consolas" w:hAnsi="Consolas" w:cs="Consolas"/>
+          <w:b/>
+          <w:bCs/>
+        </w:rPr>
+        <w:t xml:space="preserve">Secure</w:t>
+      </w:r>
+      <w:r>
+        <w:rPr>
+          <w:b/>
+          <w:bCs/>
+        </w:rPr>
+        <w:t xml:space="preserve">:</w:t>
+      </w:r>
+      <w:r>
+        <w:t xml:space="preserve"> chỉ gửi qua HTTPS; bật bằng </w:t>
+      </w:r>
+      <w:r>
+        <w:rPr>
+          <w:rFonts w:ascii="Consolas" w:eastAsia="Consolas" w:hAnsi="Consolas" w:cs="Consolas"/>
+        </w:rPr>
+        <w:t xml:space="preserve">SINO_SESSION_COOKIE_SECURE=true</w:t>
+      </w:r>
+      <w:r>
+        <w:t xml:space="preserve"> khi chạy thật.</w:t>
+      </w:r>
+    </w:p>
+    <w:p>
+      <w:pPr>
+        <w:pStyle w:val="ListParagraph"/>
+        <w:numPr>
+          <w:ilvl w:val="0"/>
+          <w:numId w:val="1"/>
+        </w:numPr>
+      </w:pPr>
+      <w:r>
+        <w:rPr>
+          <w:b/>
+          <w:bCs/>
+        </w:rPr>
+        <w:t xml:space="preserve">Hết hạn sau 30 phút không dùng.</w:t>
+      </w:r>
+      <w:r>
+        <w:t xml:space="preserve"> Cấu hình ở </w:t>
+      </w:r>
+      <w:r>
+        <w:rPr>
+          <w:rFonts w:ascii="Consolas" w:eastAsia="Consolas" w:hAnsi="Consolas" w:cs="Consolas"/>
+        </w:rPr>
+        <w:t xml:space="preserve">server.servlet.session</w:t>
+      </w:r>
+      <w:r>
+        <w:t xml:space="preserve"> trong </w:t>
+      </w:r>
+      <w:r>
+        <w:rPr>
+          <w:rFonts w:ascii="Consolas" w:eastAsia="Consolas" w:hAnsi="Consolas" w:cs="Consolas"/>
+        </w:rPr>
+        <w:t xml:space="preserve">application.yaml</w:t>
+      </w:r>
+      <w:r>
+        <w:t xml:space="preserve">.</w:t>
+      </w:r>
+    </w:p>
+    <w:p>
+      <w:pPr>
+        <w:pStyle w:val="Heading3"/>
+      </w:pPr>
+      <w:r>
+        <w:t xml:space="preserve">2.3 CSRF: vì sao giờ phải bật</w:t>
+      </w:r>
+    </w:p>
+    <w:p>
+      <w:pPr>
+        <w:pStyle w:val="ListParagraph"/>
+        <w:numPr>
+          <w:ilvl w:val="0"/>
+          <w:numId w:val="1"/>
+        </w:numPr>
+      </w:pPr>
+      <w:r>
+        <w:rPr>
+          <w:b/>
+          <w:bCs/>
+        </w:rPr>
+        <w:t xml:space="preserve">CSRF là gì:</w:t>
+      </w:r>
+      <w:r>
+        <w:t xml:space="preserve"> một trang độc (ví dụ </w:t>
+      </w:r>
+      <w:r>
+        <w:rPr>
+          <w:rFonts w:ascii="Consolas" w:eastAsia="Consolas" w:hAnsi="Consolas" w:cs="Consolas"/>
+        </w:rPr>
+        <w:t xml:space="preserve">evil.example</w:t>
+      </w:r>
+      <w:r>
+        <w:t xml:space="preserve">) bí mật gửi request tới Sino, và trình duyệt </w:t>
+      </w:r>
+      <w:r>
+        <w:rPr>
+          <w:b/>
+          <w:bCs/>
+        </w:rPr>
+        <w:t xml:space="preserve">tự kèm cookie</w:t>
+      </w:r>
+      <w:r>
+        <w:t xml:space="preserve"> của Sino theo request đó. Server tưởng là người dùng tự làm.</w:t>
+      </w:r>
+    </w:p>
+    <w:p>
+      <w:pPr>
+        <w:pStyle w:val="ListParagraph"/>
+        <w:numPr>
+          <w:ilvl w:val="0"/>
+          <w:numId w:val="1"/>
+        </w:numPr>
+      </w:pPr>
+      <w:r>
+        <w:rPr>
+          <w:b/>
+          <w:bCs/>
+        </w:rPr>
+        <w:t xml:space="preserve">Vì sao trước đây tắt được:</w:t>
+      </w:r>
+      <w:r>
+        <w:t xml:space="preserve"> với HTTP Basic và không có session, không có cookie nào tự đi kèm, nên CSRF không có gì để lợi dụng. Có session cookie rồi thì phải bật.</w:t>
+      </w:r>
+    </w:p>
+    <w:p>
+      <w:pPr>
+        <w:pStyle w:val="ListParagraph"/>
+        <w:numPr>
+          <w:ilvl w:val="0"/>
+          <w:numId w:val="1"/>
+        </w:numPr>
+      </w:pPr>
+      <w:r>
+        <w:rPr>
+          <w:b/>
+          <w:bCs/>
+        </w:rPr>
+        <w:t xml:space="preserve">"Double submit cookie":</w:t>
+      </w:r>
+      <w:r>
+        <w:t xml:space="preserve"> server đặt cookie </w:t>
+      </w:r>
+      <w:r>
+        <w:rPr>
+          <w:rFonts w:ascii="Consolas" w:eastAsia="Consolas" w:hAnsi="Consolas" w:cs="Consolas"/>
+        </w:rPr>
+        <w:t xml:space="preserve">XSRF-TOKEN</w:t>
+      </w:r>
+      <w:r>
+        <w:t xml:space="preserve"> mà JavaScript </w:t>
+      </w:r>
+      <w:r>
+        <w:rPr>
+          <w:b/>
+          <w:bCs/>
+        </w:rPr>
+        <w:t xml:space="preserve">của Sino</w:t>
+      </w:r>
+      <w:r>
+        <w:t xml:space="preserve"> đọc được; web gửi lại giá trị đó trong header </w:t>
+      </w:r>
+      <w:r>
+        <w:rPr>
+          <w:rFonts w:ascii="Consolas" w:eastAsia="Consolas" w:hAnsi="Consolas" w:cs="Consolas"/>
+        </w:rPr>
+        <w:t xml:space="preserve">X-XSRF-TOKEN</w:t>
+      </w:r>
+      <w:r>
+        <w:t xml:space="preserve">. Trang </w:t>
+      </w:r>
+      <w:r>
+        <w:rPr>
+          <w:rFonts w:ascii="Consolas" w:eastAsia="Consolas" w:hAnsi="Consolas" w:cs="Consolas"/>
+        </w:rPr>
+        <w:t xml:space="preserve">evil.example</w:t>
+      </w:r>
+      <w:r>
+        <w:t xml:space="preserve"> không đọc được cookie của Sino (luật same-origin của trình duyệt), nên không gửi được header đúng.</w:t>
+      </w:r>
+    </w:p>
+    <w:p>
+      <w:pPr>
+        <w:pStyle w:val="ListParagraph"/>
+        <w:numPr>
+          <w:ilvl w:val="0"/>
+          <w:numId w:val="1"/>
+        </w:numPr>
+      </w:pPr>
+      <w:r>
+        <w:rPr>
+          <w:rFonts w:ascii="Consolas" w:eastAsia="Consolas" w:hAnsi="Consolas" w:cs="Consolas"/>
+          <w:b/>
+          <w:bCs/>
+        </w:rPr>
+        <w:t xml:space="preserve">csrf.spa()</w:t>
+      </w:r>
+      <w:r>
+        <w:rPr>
+          <w:b/>
+          <w:bCs/>
+        </w:rPr>
+        <w:t xml:space="preserve">:</w:t>
+      </w:r>
+      <w:r>
+        <w:t xml:space="preserve"> cấu hình có sẵn của Spring Security 7 cho SPA. Lỗi CSRF trả </w:t>
+      </w:r>
+      <w:r>
+        <w:rPr>
+          <w:rFonts w:ascii="Consolas" w:eastAsia="Consolas" w:hAnsi="Consolas" w:cs="Consolas"/>
+        </w:rPr>
+        <w:t xml:space="preserve">403 CSRF_TOKEN_INVALID</w:t>
+      </w:r>
+      <w:r>
+        <w:t xml:space="preserve">; web sẽ lấy token mới rồi thử lại một lần (FE-02).</w:t>
+      </w:r>
+    </w:p>
+    <w:p>
+      <w:pPr>
+        <w:pStyle w:val="Heading3"/>
+      </w:pPr>
+      <w:r>
+        <w:t xml:space="preserve">2.4 Endpoint đăng nhập tự viết</w:t>
+      </w:r>
+    </w:p>
+    <w:p>
+      <w:pPr>
+        <w:pStyle w:val="ListParagraph"/>
+        <w:numPr>
+          <w:ilvl w:val="0"/>
+          <w:numId w:val="1"/>
+        </w:numPr>
+      </w:pPr>
+      <w:r>
+        <w:rPr>
+          <w:b/>
+          <w:bCs/>
+        </w:rPr>
+        <w:t xml:space="preserve">Vì sao không dùng </w:t>
+      </w:r>
+      <w:r>
+        <w:rPr>
+          <w:rFonts w:ascii="Consolas" w:eastAsia="Consolas" w:hAnsi="Consolas" w:cs="Consolas"/>
+          <w:b/>
+          <w:bCs/>
+        </w:rPr>
+        <w:t xml:space="preserve">formLogin()</w:t>
+      </w:r>
+      <w:r>
+        <w:rPr>
+          <w:b/>
+          <w:bCs/>
+        </w:rPr>
+        <w:t xml:space="preserve"> có sẵn:</w:t>
+      </w:r>
+      <w:r>
+        <w:t xml:space="preserve"> nó nhận form HTML và trả về chuyển hướng (redirect), trong khi web cần JSON vào, Problem Details ra.</w:t>
+      </w:r>
+    </w:p>
+    <w:p>
+      <w:pPr>
+        <w:pStyle w:val="ListParagraph"/>
+        <w:numPr>
+          <w:ilvl w:val="0"/>
+          <w:numId w:val="1"/>
+        </w:numPr>
+      </w:pPr>
+      <w:r>
+        <w:rPr>
+          <w:rFonts w:ascii="Consolas" w:eastAsia="Consolas" w:hAnsi="Consolas" w:cs="Consolas"/>
+          <w:b/>
+          <w:bCs/>
+        </w:rPr>
+        <w:t xml:space="preserve">AuthenticationManager</w:t>
+      </w:r>
+      <w:r>
+        <w:rPr>
+          <w:b/>
+          <w:bCs/>
+        </w:rPr>
+        <w:t xml:space="preserve"> + </w:t>
+      </w:r>
+      <w:r>
+        <w:rPr>
+          <w:rFonts w:ascii="Consolas" w:eastAsia="Consolas" w:hAnsi="Consolas" w:cs="Consolas"/>
+          <w:b/>
+          <w:bCs/>
+        </w:rPr>
+        <w:t xml:space="preserve">DaoAuthenticationProvider</w:t>
+      </w:r>
+      <w:r>
+        <w:rPr>
+          <w:b/>
+          <w:bCs/>
+        </w:rPr>
+        <w:t xml:space="preserve">:</w:t>
+      </w:r>
+      <w:r>
+        <w:t xml:space="preserve"> so mật khẩu bằng </w:t>
+      </w:r>
+      <w:r>
+        <w:rPr>
+          <w:rFonts w:ascii="Consolas" w:eastAsia="Consolas" w:hAnsi="Consolas" w:cs="Consolas"/>
+        </w:rPr>
+        <w:t xml:space="preserve">PasswordEncoder</w:t>
+      </w:r>
+      <w:r>
+        <w:t xml:space="preserve">. Với email không tồn tại, nó vẫn chạy BCrypt trên một bản băm giả, nên hai trường hợp mất cùng một khoảng thời gian, và kẻ dò không đoán được email nào có thật qua tốc độ trả lời.</w:t>
+      </w:r>
+    </w:p>
+    <w:p>
+      <w:pPr>
+        <w:pStyle w:val="ListParagraph"/>
+        <w:numPr>
+          <w:ilvl w:val="0"/>
+          <w:numId w:val="1"/>
+        </w:numPr>
+      </w:pPr>
+      <w:r>
+        <w:rPr>
+          <w:b/>
+          <w:bCs/>
+        </w:rPr>
+        <w:t xml:space="preserve">Session fixation và </w:t>
+      </w:r>
+      <w:r>
+        <w:rPr>
+          <w:rFonts w:ascii="Consolas" w:eastAsia="Consolas" w:hAnsi="Consolas" w:cs="Consolas"/>
+          <w:b/>
+          <w:bCs/>
+        </w:rPr>
+        <w:t xml:space="preserve">ChangeSessionIdAuthenticationStrategy</w:t>
+      </w:r>
+      <w:r>
+        <w:rPr>
+          <w:b/>
+          <w:bCs/>
+        </w:rPr>
+        <w:t xml:space="preserve">:</w:t>
+      </w:r>
+      <w:r>
+        <w:t xml:space="preserve"> nếu kẻ xấu cài sẵn một session ID vào trình duyệt nạn nhân, rồi nạn nhân đăng nhập trên chính session đó, kẻ xấu sẽ dùng chung được phiên. Đổi session ID ngay lúc đăng nhập là chặn được.</w:t>
+      </w:r>
+    </w:p>
+    <w:p>
+      <w:pPr>
+        <w:pStyle w:val="ListParagraph"/>
+        <w:numPr>
+          <w:ilvl w:val="0"/>
+          <w:numId w:val="1"/>
+        </w:numPr>
+      </w:pPr>
+      <w:r>
+        <w:rPr>
+          <w:rFonts w:ascii="Consolas" w:eastAsia="Consolas" w:hAnsi="Consolas" w:cs="Consolas"/>
+          <w:b/>
+          <w:bCs/>
+        </w:rPr>
+        <w:t xml:space="preserve">HttpSessionSecurityContextRepository.saveContext</w:t>
+      </w:r>
+      <w:r>
+        <w:rPr>
+          <w:b/>
+          <w:bCs/>
+        </w:rPr>
+        <w:t xml:space="preserve">:</w:t>
+      </w:r>
+      <w:r>
+        <w:t xml:space="preserve"> lưu "ai đang đăng nhập" vào session, để các request sau biết người đó là ai.</w:t>
+      </w:r>
+    </w:p>
+    <w:p>
+      <w:pPr>
+        <w:pStyle w:val="ListParagraph"/>
+        <w:numPr>
+          <w:ilvl w:val="0"/>
+          <w:numId w:val="1"/>
+        </w:numPr>
+      </w:pPr>
+      <w:r>
+        <w:rPr>
+          <w:b/>
+          <w:bCs/>
+        </w:rPr>
+        <w:t xml:space="preserve">Đăng xuất dùng </w:t>
+      </w:r>
+      <w:r>
+        <w:rPr>
+          <w:rFonts w:ascii="Consolas" w:eastAsia="Consolas" w:hAnsi="Consolas" w:cs="Consolas"/>
+          <w:b/>
+          <w:bCs/>
+        </w:rPr>
+        <w:t xml:space="preserve">LogoutFilter</w:t>
+      </w:r>
+      <w:r>
+        <w:rPr>
+          <w:b/>
+          <w:bCs/>
+        </w:rPr>
+        <w:t xml:space="preserve"> có sẵn:</w:t>
+      </w:r>
+      <w:r>
+        <w:t xml:space="preserve"> nó hủy session, xóa cookie ghi nhớ và xóa CSRF token. Trả </w:t>
+      </w:r>
+      <w:r>
+        <w:rPr>
+          <w:rFonts w:ascii="Consolas" w:eastAsia="Consolas" w:hAnsi="Consolas" w:cs="Consolas"/>
+        </w:rPr>
+        <w:t xml:space="preserve">204</w:t>
+      </w:r>
+      <w:r>
+        <w:t xml:space="preserve"> kể cả khi chưa đăng nhập (đăng xuất lặp lại cũng vô hại).</w:t>
+      </w:r>
+    </w:p>
+    <w:p>
+      <w:pPr>
+        <w:pStyle w:val="Heading3"/>
+      </w:pPr>
+      <w:r>
+        <w:t xml:space="preserve">2.5 Remember-me và cái bẫy của BCrypt</w:t>
+      </w:r>
+    </w:p>
+    <w:p>
+      <w:pPr>
+        <w:pStyle w:val="ListParagraph"/>
+        <w:numPr>
+          <w:ilvl w:val="0"/>
+          <w:numId w:val="1"/>
+        </w:numPr>
+      </w:pPr>
+      <w:r>
+        <w:rPr>
+          <w:b/>
+          <w:bCs/>
+        </w:rPr>
+        <w:t xml:space="preserve">Cookie remember-me chứa gì:</w:t>
+      </w:r>
+      <w:r>
+        <w:t xml:space="preserve"> email, hạn dùng và một chữ ký SHA-256. Chữ ký được tính từ email, hạn dùng, "mật khẩu" của người dùng và khóa bí mật. Đổi mật khẩu thì chữ ký cũ không còn khớp, nên cookie cũ hết tác dụng.</w:t>
+      </w:r>
+    </w:p>
+    <w:p>
+      <w:pPr>
+        <w:pStyle w:val="ListParagraph"/>
+        <w:numPr>
+          <w:ilvl w:val="0"/>
+          <w:numId w:val="1"/>
+        </w:numPr>
+      </w:pPr>
+      <w:r>
+        <w:rPr>
+          <w:b/>
+          <w:bCs/>
+        </w:rPr>
+        <w:t xml:space="preserve">Bẫy:</w:t>
+      </w:r>
+      <w:r>
+        <w:t xml:space="preserve"> "mật khẩu" mà Spring lấy ra là </w:t>
+      </w:r>
+      <w:r>
+        <w:rPr>
+          <w:b/>
+          <w:bCs/>
+        </w:rPr>
+        <w:t xml:space="preserve">bản băm BCrypt</w:t>
+      </w:r>
+      <w:r>
+        <w:t xml:space="preserve">, mà BCrypt thêm muối ngẫu nhiên. Mỗi lần khởi động lại, bản băm của </w:t>
+      </w:r>
+      <w:r>
+        <w:rPr>
+          <w:b/>
+          <w:bCs/>
+        </w:rPr>
+        <w:t xml:space="preserve">cùng một mật khẩu</w:t>
+      </w:r>
+      <w:r>
+        <w:t xml:space="preserve"> lại khác, nên mọi cookie ghi nhớ sẽ chết sau khi server khởi động lại. Như vậy là trái hẳn mục đích "giữ đăng nhập" (D-34).</w:t>
+      </w:r>
+    </w:p>
+    <w:p>
+      <w:pPr>
+        <w:pStyle w:val="ListParagraph"/>
+        <w:numPr>
+          <w:ilvl w:val="0"/>
+          <w:numId w:val="1"/>
+        </w:numPr>
+      </w:pPr>
+      <w:r>
+        <w:rPr>
+          <w:b/>
+          <w:bCs/>
+        </w:rPr>
+        <w:t xml:space="preserve">Cách sửa:</w:t>
+      </w:r>
+      <w:r>
+        <w:t xml:space="preserve"> remember-me dùng một "dấu vân tay" ổn định, </w:t>
+      </w:r>
+      <w:r>
+        <w:rPr>
+          <w:rFonts w:ascii="Consolas" w:eastAsia="Consolas" w:hAnsi="Consolas" w:cs="Consolas"/>
+        </w:rPr>
+        <w:t xml:space="preserve">HMAC-SHA256(SINO_REMEMBER_ME_KEY, mật khẩu)</w:t>
+      </w:r>
+      <w:r>
+        <w:t xml:space="preserve">, tính một lần lúc khởi động. Dấu này không đổi qua các lần khởi động, nhưng đổi khi mật khẩu hoặc khóa đổi. Việc đăng nhập bình thường vẫn so bằng BCrypt.</w:t>
+      </w:r>
+    </w:p>
+    <w:p>
+      <w:pPr>
+        <w:pStyle w:val="ListParagraph"/>
+        <w:numPr>
+          <w:ilvl w:val="0"/>
+          <w:numId w:val="1"/>
+        </w:numPr>
+      </w:pPr>
+      <w:r>
+        <w:rPr>
+          <w:rFonts w:ascii="Consolas" w:eastAsia="Consolas" w:hAnsi="Consolas" w:cs="Consolas"/>
+          <w:b/>
+          <w:bCs/>
+        </w:rPr>
+        <w:t xml:space="preserve">setAlwaysRemember(true)</w:t>
+      </w:r>
+      <w:r>
+        <w:rPr>
+          <w:b/>
+          <w:bCs/>
+        </w:rPr>
+        <w:t xml:space="preserve">:</w:t>
+      </w:r>
+      <w:r>
+        <w:t xml:space="preserve"> Spring mặc định tìm tham số </w:t>
+      </w:r>
+      <w:r>
+        <w:rPr>
+          <w:rFonts w:ascii="Consolas" w:eastAsia="Consolas" w:hAnsi="Consolas" w:cs="Consolas"/>
+        </w:rPr>
+        <w:t xml:space="preserve">remember-me</w:t>
+      </w:r>
+      <w:r>
+        <w:t xml:space="preserve"> trong form, mà body của Sino là JSON; vì vậy controller tự quyết định có gọi </w:t>
+      </w:r>
+      <w:r>
+        <w:rPr>
+          <w:rFonts w:ascii="Consolas" w:eastAsia="Consolas" w:hAnsi="Consolas" w:cs="Consolas"/>
+        </w:rPr>
+        <w:t xml:space="preserve">loginSuccess</w:t>
+      </w:r>
+      <w:r>
+        <w:t xml:space="preserve"> hay không, dựa vào trường </w:t>
+      </w:r>
+      <w:r>
+        <w:rPr>
+          <w:rFonts w:ascii="Consolas" w:eastAsia="Consolas" w:hAnsi="Consolas" w:cs="Consolas"/>
+        </w:rPr>
+        <w:t xml:space="preserve">rememberMe</w:t>
+      </w:r>
+      <w:r>
+        <w:t xml:space="preserve">.</w:t>
+      </w:r>
+    </w:p>
+    <w:p>
+      <w:pPr>
+        <w:pStyle w:val="Heading3"/>
+      </w:pPr>
+      <w:r>
+        <w:t xml:space="preserve">2.6 Bỏ HTTP Basic, </w:t>
+      </w:r>
+      <w:r>
+        <w:rPr>
+          <w:rFonts w:ascii="Consolas" w:eastAsia="Consolas" w:hAnsi="Consolas" w:cs="Consolas"/>
+        </w:rPr>
+        <w:t xml:space="preserve">401</w:t>
+      </w:r>
+      <w:r>
+        <w:t xml:space="preserve"> không có </w:t>
+      </w:r>
+      <w:r>
+        <w:rPr>
+          <w:rFonts w:ascii="Consolas" w:eastAsia="Consolas" w:hAnsi="Consolas" w:cs="Consolas"/>
+        </w:rPr>
+        <w:t xml:space="preserve">WWW-Authenticate</w:t>
+      </w:r>
+    </w:p>
+    <w:p>
+      <w:pPr>
+        <w:pStyle w:val="ListParagraph"/>
+        <w:numPr>
+          <w:ilvl w:val="0"/>
+          <w:numId w:val="1"/>
+        </w:numPr>
+      </w:pPr>
+      <w:r>
+        <w:t xml:space="preserve">Header </w:t>
+      </w:r>
+      <w:r>
+        <w:rPr>
+          <w:rFonts w:ascii="Consolas" w:eastAsia="Consolas" w:hAnsi="Consolas" w:cs="Consolas"/>
+        </w:rPr>
+        <w:t xml:space="preserve">WWW-Authenticate: Basic</w:t>
+      </w:r>
+      <w:r>
+        <w:t xml:space="preserve"> làm trình duyệt bật hộp thoại đăng nhập của chính nó. Bỏ Basic thì bỏ luôn header đó, và mọi </w:t>
+      </w:r>
+      <w:r>
+        <w:rPr>
+          <w:rFonts w:ascii="Consolas" w:eastAsia="Consolas" w:hAnsi="Consolas" w:cs="Consolas"/>
+        </w:rPr>
+        <w:t xml:space="preserve">401</w:t>
+      </w:r>
+      <w:r>
+        <w:t xml:space="preserve"> là JSON Problem Details để web tự xử lý.</w:t>
+      </w:r>
+    </w:p>
+    <w:p>
+      <w:pPr>
+        <w:pStyle w:val="Heading3"/>
+      </w:pPr>
+      <w:r>
+        <w:t xml:space="preserve">2.7 Bẫy Jackson 3: kiểu nguyên thủy</w:t>
+      </w:r>
+    </w:p>
+    <w:p>
+      <w:pPr>
+        <w:pStyle w:val="ListParagraph"/>
+        <w:numPr>
+          <w:ilvl w:val="0"/>
+          <w:numId w:val="1"/>
+        </w:numPr>
+      </w:pPr>
+      <w:r>
+        <w:rPr>
+          <w:rFonts w:ascii="Consolas" w:eastAsia="Consolas" w:hAnsi="Consolas" w:cs="Consolas"/>
+        </w:rPr>
+        <w:t xml:space="preserve">rememberMe</w:t>
+      </w:r>
+      <w:r>
+        <w:t xml:space="preserve"> lúc đầu là </w:t>
+      </w:r>
+      <w:r>
+        <w:rPr>
+          <w:rFonts w:ascii="Consolas" w:eastAsia="Consolas" w:hAnsi="Consolas" w:cs="Consolas"/>
+        </w:rPr>
+        <w:t xml:space="preserve">boolean</w:t>
+      </w:r>
+      <w:r>
+        <w:t xml:space="preserve">. Web không gửi trường đó thì Jackson 3 (mặc định mới) </w:t>
+      </w:r>
+      <w:r>
+        <w:rPr>
+          <w:b/>
+          <w:bCs/>
+        </w:rPr>
+        <w:t xml:space="preserve">từ chối</w:t>
+      </w:r>
+      <w:r>
+        <w:t xml:space="preserve">, trả </w:t>
+      </w:r>
+      <w:r>
+        <w:rPr>
+          <w:rFonts w:ascii="Consolas" w:eastAsia="Consolas" w:hAnsi="Consolas" w:cs="Consolas"/>
+        </w:rPr>
+        <w:t xml:space="preserve">400 MALFORMED_REQUEST</w:t>
+      </w:r>
+      <w:r>
+        <w:t xml:space="preserve">. Đổi sang </w:t>
+      </w:r>
+      <w:r>
+        <w:rPr>
+          <w:rFonts w:ascii="Consolas" w:eastAsia="Consolas" w:hAnsi="Consolas" w:cs="Consolas"/>
+        </w:rPr>
+        <w:t xml:space="preserve">Boolean</w:t>
+      </w:r>
+      <w:r>
+        <w:t xml:space="preserve"> (thiếu thì là </w:t>
+      </w:r>
+      <w:r>
+        <w:rPr>
+          <w:rFonts w:ascii="Consolas" w:eastAsia="Consolas" w:hAnsi="Consolas" w:cs="Consolas"/>
+        </w:rPr>
+        <w:t xml:space="preserve">null</w:t>
+      </w:r>
+      <w:r>
+        <w:t xml:space="preserve">, coi như </w:t>
+      </w:r>
+      <w:r>
+        <w:rPr>
+          <w:rFonts w:ascii="Consolas" w:eastAsia="Consolas" w:hAnsi="Consolas" w:cs="Consolas"/>
+        </w:rPr>
+        <w:t xml:space="preserve">false</w:t>
+      </w:r>
+      <w:r>
+        <w:t xml:space="preserve">). Bài học: trường tùy chọn trong request thì dùng kiểu bọc (</w:t>
+      </w:r>
+      <w:r>
+        <w:rPr>
+          <w:rFonts w:ascii="Consolas" w:eastAsia="Consolas" w:hAnsi="Consolas" w:cs="Consolas"/>
+        </w:rPr>
+        <w:t xml:space="preserve">Boolean</w:t>
+      </w:r>
+      <w:r>
+        <w:t xml:space="preserve">, </w:t>
+      </w:r>
+      <w:r>
+        <w:rPr>
+          <w:rFonts w:ascii="Consolas" w:eastAsia="Consolas" w:hAnsi="Consolas" w:cs="Consolas"/>
+        </w:rPr>
+        <w:t xml:space="preserve">Integer</w:t>
+      </w:r>
+      <w:r>
+        <w:t xml:space="preserve">), không dùng kiểu nguyên thủy.</w:t>
+      </w:r>
+    </w:p>
+    <w:p>
+      <w:pPr>
+        <w:pStyle w:val="Heading3"/>
+      </w:pPr>
+      <w:r>
+        <w:t xml:space="preserve">2.8 Test với server thật</w:t>
+      </w:r>
+    </w:p>
+    <w:p>
+      <w:pPr>
+        <w:pStyle w:val="ListParagraph"/>
+        <w:numPr>
+          <w:ilvl w:val="0"/>
+          <w:numId w:val="1"/>
+        </w:numPr>
+      </w:pPr>
+      <w:r>
+        <w:rPr>
+          <w:b/>
+          <w:bCs/>
+        </w:rPr>
+        <w:t xml:space="preserve">Vì sao không dùng MockMvc cho phần này:</w:t>
+      </w:r>
+      <w:r>
+        <w:t xml:space="preserve"> MockMvc giả lập session bằng </w:t>
+      </w:r>
+      <w:r>
+        <w:rPr>
+          <w:rFonts w:ascii="Consolas" w:eastAsia="Consolas" w:hAnsi="Consolas" w:cs="Consolas"/>
+        </w:rPr>
+        <w:t xml:space="preserve">MockHttpSession</w:t>
+      </w:r>
+      <w:r>
+        <w:t xml:space="preserve">, không có cookie </w:t>
+      </w:r>
+      <w:r>
+        <w:rPr>
+          <w:rFonts w:ascii="Consolas" w:eastAsia="Consolas" w:hAnsi="Consolas" w:cs="Consolas"/>
+        </w:rPr>
+        <w:t xml:space="preserve">JSESSIONID</w:t>
+      </w:r>
+      <w:r>
+        <w:t xml:space="preserve"> thật, nên không kiểm được </w:t>
+      </w:r>
+      <w:r>
+        <w:rPr>
+          <w:rFonts w:ascii="Consolas" w:eastAsia="Consolas" w:hAnsi="Consolas" w:cs="Consolas"/>
+        </w:rPr>
+        <w:t xml:space="preserve">HttpOnly</w:t>
+      </w:r>
+      <w:r>
+        <w:t xml:space="preserve">, </w:t>
+      </w:r>
+      <w:r>
+        <w:rPr>
+          <w:rFonts w:ascii="Consolas" w:eastAsia="Consolas" w:hAnsi="Consolas" w:cs="Consolas"/>
+        </w:rPr>
+        <w:t xml:space="preserve">SameSite</w:t>
+      </w:r>
+      <w:r>
+        <w:t xml:space="preserve">, việc đổi session ID hay remember-me khi mất cookie session.</w:t>
+      </w:r>
+    </w:p>
+    <w:p>
+      <w:pPr>
+        <w:pStyle w:val="ListParagraph"/>
+        <w:numPr>
+          <w:ilvl w:val="0"/>
+          <w:numId w:val="1"/>
+        </w:numPr>
+      </w:pPr>
+      <w:r>
+        <w:rPr>
+          <w:rFonts w:ascii="Consolas" w:eastAsia="Consolas" w:hAnsi="Consolas" w:cs="Consolas"/>
+          <w:b/>
+          <w:bCs/>
+        </w:rPr>
+        <w:t xml:space="preserve">@SpringBootTest(webEnvironment = RANDOM_PORT)</w:t>
+      </w:r>
+      <w:r>
+        <w:t xml:space="preserve"> chạy Tomcat thật trên một cổng ngẫu nhiên; test dùng </w:t>
+      </w:r>
+      <w:r>
+        <w:rPr>
+          <w:rFonts w:ascii="Consolas" w:eastAsia="Consolas" w:hAnsi="Consolas" w:cs="Consolas"/>
+        </w:rPr>
+        <w:t xml:space="preserve">java.net.http.HttpClient</w:t>
+      </w:r>
+      <w:r>
+        <w:t xml:space="preserve"> kèm một "trình duyệt" nhỏ tự giữ cookie.</w:t>
+      </w:r>
+    </w:p>
+    <w:p>
+      <w:pPr>
+        <w:pStyle w:val="ListParagraph"/>
+        <w:numPr>
+          <w:ilvl w:val="0"/>
+          <w:numId w:val="1"/>
+        </w:numPr>
+      </w:pPr>
+      <w:r>
+        <w:rPr>
+          <w:b/>
+          <w:bCs/>
+        </w:rPr>
+        <w:t xml:space="preserve">Hai lần khởi động trong một test:</w:t>
+      </w:r>
+      <w:r>
+        <w:t xml:space="preserve"> </w:t>
+      </w:r>
+      <w:r>
+        <w:rPr>
+          <w:rFonts w:ascii="Consolas" w:eastAsia="Consolas" w:hAnsi="Consolas" w:cs="Consolas"/>
+        </w:rPr>
+        <w:t xml:space="preserve">RememberMeAcrossRestartsTests</w:t>
+      </w:r>
+      <w:r>
+        <w:t xml:space="preserve"> dựng hai Spring context riêng (mỗi context là một lần khởi động) để chứng minh cookie từ lần trước vẫn dùng được.</w:t>
+      </w:r>
+    </w:p>
+    <w:p>
+      <w:pPr>
+        <w:pStyle w:val="ListParagraph"/>
+        <w:numPr>
+          <w:ilvl w:val="0"/>
+          <w:numId w:val="1"/>
+        </w:numPr>
+      </w:pPr>
+      <w:r>
+        <w:rPr>
+          <w:b/>
+          <w:bCs/>
+        </w:rPr>
+        <w:t xml:space="preserve">Test web slice cũ:</w:t>
+      </w:r>
+      <w:r>
+        <w:t xml:space="preserve"> đăng nhập bằng </w:t>
+      </w:r>
+      <w:r>
+        <w:rPr>
+          <w:rFonts w:ascii="Consolas" w:eastAsia="Consolas" w:hAnsi="Consolas" w:cs="Consolas"/>
+        </w:rPr>
+        <w:t xml:space="preserve">with(user("owner@sino.test"))</w:t>
+      </w:r>
+      <w:r>
+        <w:t xml:space="preserve">, và mọi request thay đổi dữ liệu thêm </w:t>
+      </w:r>
+      <w:r>
+        <w:rPr>
+          <w:rFonts w:ascii="Consolas" w:eastAsia="Consolas" w:hAnsi="Consolas" w:cs="Consolas"/>
+        </w:rPr>
+        <w:t xml:space="preserve">with(csrf())</w:t>
+      </w:r>
+      <w:r>
+        <w:t xml:space="preserve">.</w:t>
+      </w:r>
+    </w:p>
+    <w:p>
+      <w:pPr>
+        <w:pStyle w:val="Heading3"/>
+      </w:pPr>
+      <w:r>
+        <w:t xml:space="preserve">2.9 Kiểm tra ngược (BE-28)</w:t>
+      </w:r>
+    </w:p>
+    <w:p>
+      <w:pPr>
+        <w:pStyle w:val="ListParagraph"/>
+        <w:numPr>
+          <w:ilvl w:val="0"/>
+          <w:numId w:val="1"/>
+        </w:numPr>
+      </w:pPr>
+      <w:r>
+        <w:t xml:space="preserve">12 lỗi, mỗi lần một lỗi bằng script, 11 lỗi bị bắt ngay: tắt CSRF; bỏ đổi session ID; ký cookie ghi nhớ bằng bản băm BCrypt (chỉ test "hai lần khởi động" bắt được, đúng là lý do nó tồn tại); luôn cấp cookie ghi nhớ; trả lại </w:t>
+      </w:r>
+      <w:r>
+        <w:rPr>
+          <w:rFonts w:ascii="Consolas" w:eastAsia="Consolas" w:hAnsi="Consolas" w:cs="Consolas"/>
+        </w:rPr>
+        <w:t xml:space="preserve">WWW-Authenticate</w:t>
+      </w:r>
+      <w:r>
+        <w:t xml:space="preserve">; bật lại HTTP Basic; </w:t>
+      </w:r>
+      <w:r>
+        <w:rPr>
+          <w:rFonts w:ascii="Consolas" w:eastAsia="Consolas" w:hAnsi="Consolas" w:cs="Consolas"/>
+        </w:rPr>
+        <w:t xml:space="preserve">/me</w:t>
+      </w:r>
+      <w:r>
+        <w:t xml:space="preserve"> hay </w:t>
+      </w:r>
+      <w:r>
+        <w:rPr>
+          <w:rFonts w:ascii="Consolas" w:eastAsia="Consolas" w:hAnsi="Consolas" w:cs="Consolas"/>
+        </w:rPr>
+        <w:t xml:space="preserve">/login</w:t>
+      </w:r>
+      <w:r>
+        <w:t xml:space="preserve"> không công khai; bỏ </w:t>
+      </w:r>
+      <w:r>
+        <w:rPr>
+          <w:rFonts w:ascii="Consolas" w:eastAsia="Consolas" w:hAnsi="Consolas" w:cs="Consolas"/>
+        </w:rPr>
+        <w:t xml:space="preserve">SameSite</w:t>
+      </w:r>
+      <w:r>
+        <w:t xml:space="preserve">; email không chuẩn hóa; email lạ trả khác sai mật khẩu.</w:t>
+      </w:r>
+    </w:p>
+    <w:p>
+      <w:pPr>
+        <w:pStyle w:val="ListParagraph"/>
+        <w:numPr>
+          <w:ilvl w:val="0"/>
+          <w:numId w:val="1"/>
+        </w:numPr>
+      </w:pPr>
+      <w:r>
+        <w:rPr>
+          <w:b/>
+          <w:bCs/>
+        </w:rPr>
+        <w:t xml:space="preserve">Lỗi sống sót và bài học:</w:t>
+      </w:r>
+      <w:r>
+        <w:t xml:space="preserve"> "đăng xuất mà không hủy session" không làm test nào đỏ. Lý do: kể cả khi không hủy session, </w:t>
+      </w:r>
+      <w:r>
+        <w:rPr>
+          <w:rFonts w:ascii="Consolas" w:eastAsia="Consolas" w:hAnsi="Consolas" w:cs="Consolas"/>
+        </w:rPr>
+        <w:t xml:space="preserve">SecurityContextLogoutHandler</w:t>
+      </w:r>
+      <w:r>
+        <w:t xml:space="preserve"> vẫn thay thông tin đăng nhập trong session bằng một context rỗng, nên qua HTTP người dùng vẫn bị đăng xuất. Spec đòi "hủy session", nên có thêm một test MockMvc kiểm </w:t>
+      </w:r>
+      <w:r>
+        <w:rPr>
+          <w:rFonts w:ascii="Consolas" w:eastAsia="Consolas" w:hAnsi="Consolas" w:cs="Consolas"/>
+        </w:rPr>
+        <w:t xml:space="preserve">session.isInvalid()</w:t>
+      </w:r>
+      <w:r>
+        <w:t xml:space="preserve">. Chạy lại lỗi đó thì test mới đỏ.</w:t>
+      </w:r>
+    </w:p>
+    <w:p>
+      <w:pPr>
+        <w:pStyle w:val="ListParagraph"/>
+        <w:numPr>
+          <w:ilvl w:val="0"/>
+          <w:numId w:val="1"/>
+        </w:numPr>
+      </w:pPr>
+      <w:r>
+        <w:rPr>
+          <w:b/>
+          <w:bCs/>
+        </w:rPr>
+        <w:t xml:space="preserve">Bài học chung:</w:t>
+      </w:r>
+      <w:r>
+        <w:t xml:space="preserve"> kiểm tra ngược không chỉ để "đếm đỏ". Một lỗi sống sót cho biết hoặc test còn hở, hoặc hai cách viết thật sự tương đương; phải tìm hiểu xem là trường hợp nào.</w:t>
+      </w:r>
+    </w:p>
+    <w:p>
+      <w:pPr>
+        <w:pBdr>
+          <w:bottom w:val="single" w:sz="4" w:space="0" w:color="auto"/>
+        </w:pBdr>
+        <w:ind w:left="0"/>
+      </w:pPr>
+    </w:p>
+    <w:p>
+      <w:pPr>
+        <w:pStyle w:val="Heading2"/>
+      </w:pPr>
+      <w:r>
         <w:t xml:space="preserve">Tự kiểm tra</w:t>
       </w:r>
     </w:p>
@@ -1399,6 +2594,84 @@
       </w:r>
       <w:r>
         <w:t xml:space="preserve"> thì chuyện gì xảy ra?</w:t>
+      </w:r>
+    </w:p>
+    <w:p>
+      <w:pPr>
+        <w:pStyle w:val="ListParagraph"/>
+        <w:numPr>
+          <w:ilvl w:val="0"/>
+          <w:numId w:val="100"/>
+        </w:numPr>
+      </w:pPr>
+      <w:r>
+        <w:t xml:space="preserve">Vì sao bật session cookie thì bắt buộc phải bật CSRF, còn HTTP Basic trước đây thì không?</w:t>
+      </w:r>
+    </w:p>
+    <w:p>
+      <w:pPr>
+        <w:pStyle w:val="ListParagraph"/>
+        <w:numPr>
+          <w:ilvl w:val="0"/>
+          <w:numId w:val="100"/>
+        </w:numPr>
+      </w:pPr>
+      <w:r>
+        <w:t xml:space="preserve">Trang </w:t>
+      </w:r>
+      <w:r>
+        <w:rPr>
+          <w:rFonts w:ascii="Consolas" w:eastAsia="Consolas" w:hAnsi="Consolas" w:cs="Consolas"/>
+        </w:rPr>
+        <w:t xml:space="preserve">evil.example</w:t>
+      </w:r>
+      <w:r>
+        <w:t xml:space="preserve"> vì sao không gửi được header </w:t>
+      </w:r>
+      <w:r>
+        <w:rPr>
+          <w:rFonts w:ascii="Consolas" w:eastAsia="Consolas" w:hAnsi="Consolas" w:cs="Consolas"/>
+        </w:rPr>
+        <w:t xml:space="preserve">X-XSRF-TOKEN</w:t>
+      </w:r>
+      <w:r>
+        <w:t xml:space="preserve"> đúng?</w:t>
+      </w:r>
+    </w:p>
+    <w:p>
+      <w:pPr>
+        <w:pStyle w:val="ListParagraph"/>
+        <w:numPr>
+          <w:ilvl w:val="0"/>
+          <w:numId w:val="100"/>
+        </w:numPr>
+      </w:pPr>
+      <w:r>
+        <w:t xml:space="preserve">Session fixation là gì, và đổi session ID lúc đăng nhập chặn nó thế nào?</w:t>
+      </w:r>
+    </w:p>
+    <w:p>
+      <w:pPr>
+        <w:pStyle w:val="ListParagraph"/>
+        <w:numPr>
+          <w:ilvl w:val="0"/>
+          <w:numId w:val="100"/>
+        </w:numPr>
+      </w:pPr>
+      <w:r>
+        <w:t xml:space="preserve">Vì sao cookie remember-me không thể được ký bằng bản băm BCrypt của mật khẩu?</w:t>
+      </w:r>
+    </w:p>
+    <w:p>
+      <w:pPr>
+        <w:pStyle w:val="ListParagraph"/>
+        <w:numPr>
+          <w:ilvl w:val="0"/>
+          <w:numId w:val="100"/>
+        </w:numPr>
+      </w:pPr>
+      <w:r>
+        <w:t xml:space="preserve">Vì sao test đăng nhập dùng server thật thay vì MockMvc?</w:t>
       </w:r>
     </w:p>
     <w:p/>

</xml_diff>

<commit_message>
docs(knowledge): add BE-29 (login lock) to the Phase 1 guide
Co-Authored-By: Claude Opus 5.5 (1M context) <noreply@anthropic.com>
</commit_message>
<xml_diff>
--- a/docs/knowledge/phase-1-frontend-foundation.docx
+++ b/docs/knowledge/phase-1-frontend-foundation.docx
@@ -106,7 +106,7 @@
         <w:t xml:space="preserve">openspec/changes/fe-f01-web-foundation</w:t>
       </w:r>
       <w:r>
-        <w:t xml:space="preserve"> (D-22 + F01-FE). Đang làm: xong BE-27, BE-28.</w:t>
+        <w:t xml:space="preserve"> (D-22 + F01-FE). Đang làm: xong BE-27, BE-28, BE-29.</w:t>
         <w:br/>
       </w:r>
       <w:r>
@@ -537,7 +537,7 @@
           </w:tcPr>
           <w:p>
             <w:r>
-              <w:t xml:space="preserve">chưa làm</w:t>
+              <w:t xml:space="preserve">xong</w:t>
             </w:r>
           </w:p>
         </w:tc>
@@ -2497,6 +2497,1144 @@
         <w:pStyle w:val="Heading2"/>
       </w:pPr>
       <w:r>
+        <w:t xml:space="preserve">3. Khóa tạm khi đoán mật khẩu (BE-29, D-35)</w:t>
+      </w:r>
+    </w:p>
+    <w:p>
+      <w:pPr>
+        <w:pStyle w:val="Heading3"/>
+      </w:pPr>
+      <w:r>
+        <w:t xml:space="preserve">3.1 Bộ đếm </w:t>
+      </w:r>
+      <w:r>
+        <w:rPr>
+          <w:rFonts w:ascii="Consolas" w:eastAsia="Consolas" w:hAnsi="Consolas" w:cs="Consolas"/>
+        </w:rPr>
+        <w:t xml:space="preserve">LoginAttempts</w:t>
+      </w:r>
+    </w:p>
+    <w:p>
+      <w:pPr>
+        <w:pStyle w:val="ListParagraph"/>
+        <w:numPr>
+          <w:ilvl w:val="0"/>
+          <w:numId w:val="1"/>
+        </w:numPr>
+      </w:pPr>
+      <w:r>
+        <w:rPr>
+          <w:b/>
+          <w:bCs/>
+        </w:rPr>
+        <w:t xml:space="preserve">Ở đâu:</w:t>
+      </w:r>
+      <w:r>
+        <w:t xml:space="preserve"> </w:t>
+      </w:r>
+      <w:r>
+        <w:rPr>
+          <w:rFonts w:ascii="Consolas" w:eastAsia="Consolas" w:hAnsi="Consolas" w:cs="Consolas"/>
+        </w:rPr>
+        <w:t xml:space="preserve">identity/application/LoginAttempts.java</w:t>
+      </w:r>
+      <w:r>
+        <w:t xml:space="preserve">, dùng trong </w:t>
+      </w:r>
+      <w:r>
+        <w:rPr>
+          <w:rFonts w:ascii="Consolas" w:eastAsia="Consolas" w:hAnsi="Consolas" w:cs="Consolas"/>
+        </w:rPr>
+        <w:t xml:space="preserve">SignInService.authenticate</w:t>
+      </w:r>
+      <w:r>
+        <w:t xml:space="preserve">.</w:t>
+      </w:r>
+    </w:p>
+    <w:p>
+      <w:pPr>
+        <w:pStyle w:val="ListParagraph"/>
+        <w:numPr>
+          <w:ilvl w:val="0"/>
+          <w:numId w:val="1"/>
+        </w:numPr>
+      </w:pPr>
+      <w:r>
+        <w:rPr>
+          <w:b/>
+          <w:bCs/>
+        </w:rPr>
+        <w:t xml:space="preserve">Là gì:</w:t>
+      </w:r>
+      <w:r>
+        <w:t xml:space="preserve"> đếm số lần đăng nhập sai liên tiếp cho từng email (đã chuẩn hóa). Lần sai 1–4 trả về số lần còn lại (4, 3, 2, 1); lần thứ 5 khóa email đó 15 phút.</w:t>
+      </w:r>
+    </w:p>
+    <w:p>
+      <w:pPr>
+        <w:shd w:val="clear" w:color="auto" w:fill="F2F3F5"/>
+        <w:ind w:left="0"/>
+      </w:pPr>
+      <w:r>
+        <w:rPr>
+          <w:rFonts w:ascii="Consolas" w:eastAsia="Consolas" w:hAnsi="Consolas" w:cs="Consolas"/>
+          <w:sz w:val="19"/>
+          <w:szCs w:val="19"/>
+        </w:rPr>
+        <w:t xml:space="preserve">sai lần 1..4  -&gt; 401 INVALID_CREDENTIALS, remainingAttempts = 4, 3, 2, 1</w:t>
+        <w:br/>
+        <w:t xml:space="preserve">sai lần 5     -&gt; 429 LOGIN_LOCKED, retryAfterSeconds = 900, Retry-After: 900</w:t>
+        <w:br/>
+        <w:t xml:space="preserve">đang khóa     -&gt; 429 ngay, KHÔNG so mật khẩu (đúng hay sai cũng vậy)</w:t>
+        <w:br/>
+        <w:t xml:space="preserve">hết 15 phút   -&gt; mở khóa, đếm lại từ đầu</w:t>
+        <w:br/>
+        <w:t xml:space="preserve">đăng nhập đúng-&gt; bộ đếm về 0</w:t>
+      </w:r>
+    </w:p>
+    <w:p>
+      <w:pPr>
+        <w:pStyle w:val="ListParagraph"/>
+        <w:numPr>
+          <w:ilvl w:val="0"/>
+          <w:numId w:val="1"/>
+        </w:numPr>
+      </w:pPr>
+      <w:r>
+        <w:rPr>
+          <w:b/>
+          <w:bCs/>
+        </w:rPr>
+        <w:t xml:space="preserve">Vì sao kiểm khóa trước khi so mật khẩu:</w:t>
+      </w:r>
+      <w:r>
+        <w:t xml:space="preserve"> nếu so mật khẩu trước, khóa gần như vô dụng: kẻ dò vẫn đoán tiếp được trong lúc khóa, và chỉ cần câu trả lời khác đi một chút (đoán đúng thì vào được, hoặc thời gian trả lời khác nhau) là biết lần nào đúng. Thêm nữa, mỗi lần thử vẫn tốn một lần chạy BCrypt của server. Có test riêng: đúng mật khẩu khi đang khóa vẫn bị </w:t>
+      </w:r>
+      <w:r>
+        <w:rPr>
+          <w:rFonts w:ascii="Consolas" w:eastAsia="Consolas" w:hAnsi="Consolas" w:cs="Consolas"/>
+        </w:rPr>
+        <w:t xml:space="preserve">429</w:t>
+      </w:r>
+      <w:r>
+        <w:t xml:space="preserve"> và không có session.</w:t>
+      </w:r>
+    </w:p>
+    <w:p>
+      <w:pPr>
+        <w:pStyle w:val="ListParagraph"/>
+        <w:numPr>
+          <w:ilvl w:val="0"/>
+          <w:numId w:val="1"/>
+        </w:numPr>
+      </w:pPr>
+      <w:r>
+        <w:rPr>
+          <w:b/>
+          <w:bCs/>
+        </w:rPr>
+        <w:t xml:space="preserve">Đếm cả email không tồn tại:</w:t>
+      </w:r>
+      <w:r>
+        <w:t xml:space="preserve"> để câu trả lời cho "email lạ" và "sai mật khẩu" giống hệt nhau, kể cả </w:t>
+      </w:r>
+      <w:r>
+        <w:rPr>
+          <w:rFonts w:ascii="Consolas" w:eastAsia="Consolas" w:hAnsi="Consolas" w:cs="Consolas"/>
+        </w:rPr>
+        <w:t xml:space="preserve">remainingAttempts</w:t>
+      </w:r>
+      <w:r>
+        <w:t xml:space="preserve">.</w:t>
+      </w:r>
+    </w:p>
+    <w:p>
+      <w:pPr>
+        <w:pStyle w:val="Heading3"/>
+      </w:pPr>
+      <w:r>
+        <w:t xml:space="preserve">3.2 Giới hạn bộ nhớ, và cái bẫy khi giới hạn</w:t>
+      </w:r>
+    </w:p>
+    <w:p>
+      <w:pPr>
+        <w:pStyle w:val="ListParagraph"/>
+        <w:numPr>
+          <w:ilvl w:val="0"/>
+          <w:numId w:val="1"/>
+        </w:numPr>
+      </w:pPr>
+      <w:r>
+        <w:rPr>
+          <w:b/>
+          <w:bCs/>
+        </w:rPr>
+        <w:t xml:space="preserve">Vì sao phải giới hạn:</w:t>
+      </w:r>
+      <w:r>
+        <w:t xml:space="preserve"> bộ đếm nằm trong bộ nhớ. Kẻ tấn công gửi hàng triệu email bịa thì bảng đếm phình mãi. Vì vậy: một mục tự hết hạn 15 phút sau lần sai cuối, và tối đa 10 000 email.</w:t>
+      </w:r>
+    </w:p>
+    <w:p>
+      <w:pPr>
+        <w:pStyle w:val="ListParagraph"/>
+        <w:numPr>
+          <w:ilvl w:val="0"/>
+          <w:numId w:val="1"/>
+        </w:numPr>
+      </w:pPr>
+      <w:r>
+        <w:rPr>
+          <w:rFonts w:ascii="Consolas" w:eastAsia="Consolas" w:hAnsi="Consolas" w:cs="Consolas"/>
+          <w:b/>
+          <w:bCs/>
+        </w:rPr>
+        <w:t xml:space="preserve">LinkedHashMap</w:t>
+      </w:r>
+      <w:r>
+        <w:rPr>
+          <w:b/>
+          <w:bCs/>
+        </w:rPr>
+        <w:t xml:space="preserve"> giữ thứ tự:</w:t>
+      </w:r>
+      <w:r>
+        <w:t xml:space="preserve"> mỗi lần sai, mục được xóa rồi thêm lại vào cuối, nên đầu bảng luôn là email có lần sai cũ nhất. Bảng đầy thì bỏ mục đầu.</w:t>
+      </w:r>
+    </w:p>
+    <w:p>
+      <w:pPr>
+        <w:pStyle w:val="ListParagraph"/>
+        <w:numPr>
+          <w:ilvl w:val="0"/>
+          <w:numId w:val="1"/>
+        </w:numPr>
+      </w:pPr>
+      <w:r>
+        <w:rPr>
+          <w:b/>
+          <w:bCs/>
+        </w:rPr>
+        <w:t xml:space="preserve">Bẫy:</w:t>
+      </w:r>
+      <w:r>
+        <w:t xml:space="preserve"> nếu bỏ cả mục </w:t>
+      </w:r>
+      <w:r>
+        <w:rPr>
+          <w:b/>
+          <w:bCs/>
+        </w:rPr>
+        <w:t xml:space="preserve">đang khóa</w:t>
+      </w:r>
+      <w:r>
+        <w:t xml:space="preserve">, kẻ tấn công chỉ cần gửi 10 000 email bịa là "đẩy" được khóa của owner ra ngoài, rồi đoán tiếp. Vì vậy mục đang khóa không bao giờ bị bỏ. Có test riêng: </w:t>
+      </w:r>
+      <w:r>
+        <w:rPr>
+          <w:rFonts w:ascii="Consolas" w:eastAsia="Consolas" w:hAnsi="Consolas" w:cs="Consolas"/>
+        </w:rPr>
+        <w:t xml:space="preserve">aLockIsNotPushedOutByOtherEmails</w:t>
+      </w:r>
+      <w:r>
+        <w:t xml:space="preserve">.</w:t>
+      </w:r>
+    </w:p>
+    <w:p>
+      <w:pPr>
+        <w:pStyle w:val="ListParagraph"/>
+        <w:numPr>
+          <w:ilvl w:val="0"/>
+          <w:numId w:val="1"/>
+        </w:numPr>
+      </w:pPr>
+      <w:r>
+        <w:rPr>
+          <w:rFonts w:ascii="Consolas" w:eastAsia="Consolas" w:hAnsi="Consolas" w:cs="Consolas"/>
+          <w:b/>
+          <w:bCs/>
+        </w:rPr>
+        <w:t xml:space="preserve">synchronized</w:t>
+      </w:r>
+      <w:r>
+        <w:rPr>
+          <w:b/>
+          <w:bCs/>
+        </w:rPr>
+        <w:t xml:space="preserve">:</w:t>
+      </w:r>
+      <w:r>
+        <w:t xml:space="preserve"> nhiều request đăng nhập có thể chạy song song trên nhiều luồng; khóa cả method để bảng đếm không bị hỏng. Đăng nhập hiếm khi diễn ra, nên chờ nhau một chút không đáng kể.</w:t>
+      </w:r>
+    </w:p>
+    <w:p>
+      <w:pPr>
+        <w:pStyle w:val="Heading3"/>
+      </w:pPr>
+      <w:r>
+        <w:t xml:space="preserve">3.3 Thời gian từ bean </w:t>
+      </w:r>
+      <w:r>
+        <w:rPr>
+          <w:rFonts w:ascii="Consolas" w:eastAsia="Consolas" w:hAnsi="Consolas" w:cs="Consolas"/>
+        </w:rPr>
+        <w:t xml:space="preserve">Clock</w:t>
+      </w:r>
+    </w:p>
+    <w:p>
+      <w:pPr>
+        <w:pStyle w:val="ListParagraph"/>
+        <w:numPr>
+          <w:ilvl w:val="0"/>
+          <w:numId w:val="1"/>
+        </w:numPr>
+      </w:pPr>
+      <w:r>
+        <w:rPr>
+          <w:b/>
+          <w:bCs/>
+        </w:rPr>
+        <w:t xml:space="preserve">Ở đâu:</w:t>
+      </w:r>
+      <w:r>
+        <w:t xml:space="preserve"> </w:t>
+      </w:r>
+      <w:r>
+        <w:rPr>
+          <w:rFonts w:ascii="Consolas" w:eastAsia="Consolas" w:hAnsi="Consolas" w:cs="Consolas"/>
+        </w:rPr>
+        <w:t xml:space="preserve">common/time/ClockConfiguration.java</w:t>
+      </w:r>
+      <w:r>
+        <w:t xml:space="preserve"> (một bean </w:t>
+      </w:r>
+      <w:r>
+        <w:rPr>
+          <w:rFonts w:ascii="Consolas" w:eastAsia="Consolas" w:hAnsi="Consolas" w:cs="Consolas"/>
+        </w:rPr>
+        <w:t xml:space="preserve">Clock.systemUTC()</w:t>
+      </w:r>
+      <w:r>
+        <w:t xml:space="preserve">).</w:t>
+      </w:r>
+    </w:p>
+    <w:p>
+      <w:pPr>
+        <w:pStyle w:val="ListParagraph"/>
+        <w:numPr>
+          <w:ilvl w:val="0"/>
+          <w:numId w:val="1"/>
+        </w:numPr>
+      </w:pPr>
+      <w:r>
+        <w:rPr>
+          <w:b/>
+          <w:bCs/>
+        </w:rPr>
+        <w:t xml:space="preserve">Vì sao:</w:t>
+      </w:r>
+      <w:r>
+        <w:t xml:space="preserve"> code gọi </w:t>
+      </w:r>
+      <w:r>
+        <w:rPr>
+          <w:rFonts w:ascii="Consolas" w:eastAsia="Consolas" w:hAnsi="Consolas" w:cs="Consolas"/>
+        </w:rPr>
+        <w:t xml:space="preserve">clock.instant()</w:t>
+      </w:r>
+      <w:r>
+        <w:t xml:space="preserve"> thay vì </w:t>
+      </w:r>
+      <w:r>
+        <w:rPr>
+          <w:rFonts w:ascii="Consolas" w:eastAsia="Consolas" w:hAnsi="Consolas" w:cs="Consolas"/>
+        </w:rPr>
+        <w:t xml:space="preserve">Instant.now()</w:t>
+      </w:r>
+      <w:r>
+        <w:t xml:space="preserve">, nên test thay được đồng hồ. Unit test dùng một đồng hồ tự viết (</w:t>
+      </w:r>
+      <w:r>
+        <w:rPr>
+          <w:rFonts w:ascii="Consolas" w:eastAsia="Consolas" w:hAnsi="Consolas" w:cs="Consolas"/>
+        </w:rPr>
+        <w:t xml:space="preserve">MovableClock</w:t>
+      </w:r>
+      <w:r>
+        <w:t xml:space="preserve">) để tua 14 phút, 15 phút. Test với server thật dùng </w:t>
+      </w:r>
+      <w:r>
+        <w:rPr>
+          <w:rFonts w:ascii="Consolas" w:eastAsia="Consolas" w:hAnsi="Consolas" w:cs="Consolas"/>
+        </w:rPr>
+        <w:t xml:space="preserve">@MockitoBean Clock</w:t>
+      </w:r>
+      <w:r>
+        <w:t xml:space="preserve">, và mỗi test bắt đầu ở một mốc giờ cách nhau một tiếng, nên lần sai của test trước đã "quên" khi test sau chạy. Không cần thêm một method "reset" chỉ để test dùng.</w:t>
+      </w:r>
+    </w:p>
+    <w:p>
+      <w:pPr>
+        <w:pStyle w:val="Heading3"/>
+      </w:pPr>
+      <w:r>
+        <w:t xml:space="preserve">3.4 Problem Details có thêm trường, và header </w:t>
+      </w:r>
+      <w:r>
+        <w:rPr>
+          <w:rFonts w:ascii="Consolas" w:eastAsia="Consolas" w:hAnsi="Consolas" w:cs="Consolas"/>
+        </w:rPr>
+        <w:t xml:space="preserve">Retry-After</w:t>
+      </w:r>
+    </w:p>
+    <w:p>
+      <w:pPr>
+        <w:pStyle w:val="ListParagraph"/>
+        <w:numPr>
+          <w:ilvl w:val="0"/>
+          <w:numId w:val="1"/>
+        </w:numPr>
+      </w:pPr>
+      <w:r>
+        <w:rPr>
+          <w:b/>
+          <w:bCs/>
+        </w:rPr>
+        <w:t xml:space="preserve">Ở đâu:</w:t>
+      </w:r>
+      <w:r>
+        <w:t xml:space="preserve"> </w:t>
+      </w:r>
+      <w:r>
+        <w:rPr>
+          <w:rFonts w:ascii="Consolas" w:eastAsia="Consolas" w:hAnsi="Consolas" w:cs="Consolas"/>
+        </w:rPr>
+        <w:t xml:space="preserve">common/error/SinoException.java</w:t>
+      </w:r>
+      <w:r>
+        <w:t xml:space="preserve">, </w:t>
+      </w:r>
+      <w:r>
+        <w:rPr>
+          <w:rFonts w:ascii="Consolas" w:eastAsia="Consolas" w:hAnsi="Consolas" w:cs="Consolas"/>
+        </w:rPr>
+        <w:t xml:space="preserve">common/web/GlobalExceptionHandler.java</w:t>
+      </w:r>
+      <w:r>
+        <w:t xml:space="preserve">.</w:t>
+      </w:r>
+    </w:p>
+    <w:p>
+      <w:pPr>
+        <w:pStyle w:val="ListParagraph"/>
+        <w:numPr>
+          <w:ilvl w:val="0"/>
+          <w:numId w:val="1"/>
+        </w:numPr>
+      </w:pPr>
+      <w:r>
+        <w:rPr>
+          <w:rFonts w:ascii="Consolas" w:eastAsia="Consolas" w:hAnsi="Consolas" w:cs="Consolas"/>
+        </w:rPr>
+        <w:t xml:space="preserve">SinoException</w:t>
+      </w:r>
+      <w:r>
+        <w:t xml:space="preserve"> mang được thêm vài trường an toàn để hiện cho client (ví dụ </w:t>
+      </w:r>
+      <w:r>
+        <w:rPr>
+          <w:rFonts w:ascii="Consolas" w:eastAsia="Consolas" w:hAnsi="Consolas" w:cs="Consolas"/>
+        </w:rPr>
+        <w:t xml:space="preserve">remainingAttempts</w:t>
+      </w:r>
+      <w:r>
+        <w:t xml:space="preserve">). Các trường chuẩn (</w:t>
+      </w:r>
+      <w:r>
+        <w:rPr>
+          <w:rFonts w:ascii="Consolas" w:eastAsia="Consolas" w:hAnsi="Consolas" w:cs="Consolas"/>
+        </w:rPr>
+        <w:t xml:space="preserve">type</w:t>
+      </w:r>
+      <w:r>
+        <w:t xml:space="preserve">, </w:t>
+      </w:r>
+      <w:r>
+        <w:rPr>
+          <w:rFonts w:ascii="Consolas" w:eastAsia="Consolas" w:hAnsi="Consolas" w:cs="Consolas"/>
+        </w:rPr>
+        <w:t xml:space="preserve">title</w:t>
+      </w:r>
+      <w:r>
+        <w:t xml:space="preserve">, </w:t>
+      </w:r>
+      <w:r>
+        <w:rPr>
+          <w:rFonts w:ascii="Consolas" w:eastAsia="Consolas" w:hAnsi="Consolas" w:cs="Consolas"/>
+        </w:rPr>
+        <w:t xml:space="preserve">status</w:t>
+      </w:r>
+      <w:r>
+        <w:t xml:space="preserve">, </w:t>
+      </w:r>
+      <w:r>
+        <w:rPr>
+          <w:rFonts w:ascii="Consolas" w:eastAsia="Consolas" w:hAnsi="Consolas" w:cs="Consolas"/>
+        </w:rPr>
+        <w:t xml:space="preserve">detail</w:t>
+      </w:r>
+      <w:r>
+        <w:t xml:space="preserve">, </w:t>
+      </w:r>
+      <w:r>
+        <w:rPr>
+          <w:rFonts w:ascii="Consolas" w:eastAsia="Consolas" w:hAnsi="Consolas" w:cs="Consolas"/>
+        </w:rPr>
+        <w:t xml:space="preserve">instance</w:t>
+      </w:r>
+      <w:r>
+        <w:t xml:space="preserve">, </w:t>
+      </w:r>
+      <w:r>
+        <w:rPr>
+          <w:rFonts w:ascii="Consolas" w:eastAsia="Consolas" w:hAnsi="Consolas" w:cs="Consolas"/>
+        </w:rPr>
+        <w:t xml:space="preserve">code</w:t>
+      </w:r>
+      <w:r>
+        <w:t xml:space="preserve">) không ghi đè được.</w:t>
+      </w:r>
+    </w:p>
+    <w:p>
+      <w:pPr>
+        <w:pStyle w:val="ListParagraph"/>
+        <w:numPr>
+          <w:ilvl w:val="0"/>
+          <w:numId w:val="1"/>
+        </w:numPr>
+      </w:pPr>
+      <w:r>
+        <w:t xml:space="preserve">Lỗi loại </w:t>
+      </w:r>
+      <w:r>
+        <w:rPr>
+          <w:rFonts w:ascii="Consolas" w:eastAsia="Consolas" w:hAnsi="Consolas" w:cs="Consolas"/>
+        </w:rPr>
+        <w:t xml:space="preserve">RATE_LIMITED</w:t>
+      </w:r>
+      <w:r>
+        <w:t xml:space="preserve"> có </w:t>
+      </w:r>
+      <w:r>
+        <w:rPr>
+          <w:rFonts w:ascii="Consolas" w:eastAsia="Consolas" w:hAnsi="Consolas" w:cs="Consolas"/>
+        </w:rPr>
+        <w:t xml:space="preserve">retryAfterSeconds</w:t>
+      </w:r>
+      <w:r>
+        <w:t xml:space="preserve"> thì tự gửi thêm header chuẩn HTTP </w:t>
+      </w:r>
+      <w:r>
+        <w:rPr>
+          <w:rFonts w:ascii="Consolas" w:eastAsia="Consolas" w:hAnsi="Consolas" w:cs="Consolas"/>
+        </w:rPr>
+        <w:t xml:space="preserve">Retry-After</w:t>
+      </w:r>
+      <w:r>
+        <w:t xml:space="preserve">, để client nào cũng biết phải chờ bao lâu. F07 sẽ dùng lại khi provider báo "chậm lại".</w:t>
+      </w:r>
+    </w:p>
+    <w:p>
+      <w:pPr>
+        <w:pStyle w:val="ListParagraph"/>
+        <w:numPr>
+          <w:ilvl w:val="0"/>
+          <w:numId w:val="1"/>
+        </w:numPr>
+      </w:pPr>
+      <w:r>
+        <w:rPr>
+          <w:rFonts w:ascii="Consolas" w:eastAsia="Consolas" w:hAnsi="Consolas" w:cs="Consolas"/>
+        </w:rPr>
+        <w:t xml:space="preserve">retryAfterSeconds</w:t>
+      </w:r>
+      <w:r>
+        <w:t xml:space="preserve"> được làm tròn </w:t>
+      </w:r>
+      <w:r>
+        <w:rPr>
+          <w:b/>
+          <w:bCs/>
+        </w:rPr>
+        <w:t xml:space="preserve">lên</w:t>
+      </w:r>
+      <w:r>
+        <w:t xml:space="preserve">, để client không thử lại sớm hơn một chút so với lúc mở khóa.</w:t>
+      </w:r>
+    </w:p>
+    <w:p>
+      <w:pPr>
+        <w:pStyle w:val="Heading3"/>
+      </w:pPr>
+      <w:r>
+        <w:t xml:space="preserve">3.5 Bẫy: module test chỉ nạp "hàng xóm" trực tiếp</w:t>
+      </w:r>
+    </w:p>
+    <w:p>
+      <w:pPr>
+        <w:pStyle w:val="ListParagraph"/>
+        <w:numPr>
+          <w:ilvl w:val="0"/>
+          <w:numId w:val="1"/>
+        </w:numPr>
+      </w:pPr>
+      <w:r>
+        <w:rPr>
+          <w:b/>
+          <w:bCs/>
+        </w:rPr>
+        <w:t xml:space="preserve">Ở đâu:</w:t>
+      </w:r>
+      <w:r>
+        <w:t xml:space="preserve"> </w:t>
+      </w:r>
+      <w:r>
+        <w:rPr>
+          <w:rFonts w:ascii="Consolas" w:eastAsia="Consolas" w:hAnsi="Consolas" w:cs="Consolas"/>
+        </w:rPr>
+        <w:t xml:space="preserve">account/application/AccountRegistrationServiceTests</w:t>
+      </w:r>
+      <w:r>
+        <w:t xml:space="preserve"> (</w:t>
+      </w:r>
+      <w:r>
+        <w:rPr>
+          <w:rFonts w:ascii="Consolas" w:eastAsia="Consolas" w:hAnsi="Consolas" w:cs="Consolas"/>
+        </w:rPr>
+        <w:t xml:space="preserve">@ApplicationModuleTest(mode = DIRECT_DEPENDENCIES)</w:t>
+      </w:r>
+      <w:r>
+        <w:t xml:space="preserve">).</w:t>
+      </w:r>
+    </w:p>
+    <w:p>
+      <w:pPr>
+        <w:pStyle w:val="ListParagraph"/>
+        <w:numPr>
+          <w:ilvl w:val="0"/>
+          <w:numId w:val="1"/>
+        </w:numPr>
+      </w:pPr>
+      <w:r>
+        <w:rPr>
+          <w:b/>
+          <w:bCs/>
+        </w:rPr>
+        <w:t xml:space="preserve">Chuyện gì xảy ra:</w:t>
+      </w:r>
+      <w:r>
+        <w:t xml:space="preserve"> các test chạy riêng đều xanh, nhưng full </w:t>
+      </w:r>
+      <w:r>
+        <w:rPr>
+          <w:rFonts w:ascii="Consolas" w:eastAsia="Consolas" w:hAnsi="Consolas" w:cs="Consolas"/>
+        </w:rPr>
+        <w:t xml:space="preserve">verify</w:t>
+      </w:r>
+      <w:r>
+        <w:t xml:space="preserve"> có một lớp đỏ: </w:t>
+      </w:r>
+      <w:r>
+        <w:rPr>
+          <w:rFonts w:ascii="Consolas" w:eastAsia="Consolas" w:hAnsi="Consolas" w:cs="Consolas"/>
+        </w:rPr>
+        <w:t xml:space="preserve">LoginAttempts</w:t>
+      </w:r>
+      <w:r>
+        <w:t xml:space="preserve"> đòi bean </w:t>
+      </w:r>
+      <w:r>
+        <w:rPr>
+          <w:rFonts w:ascii="Consolas" w:eastAsia="Consolas" w:hAnsi="Consolas" w:cs="Consolas"/>
+        </w:rPr>
+        <w:t xml:space="preserve">Clock</w:t>
+      </w:r>
+      <w:r>
+        <w:t xml:space="preserve"> mà không có.</w:t>
+      </w:r>
+    </w:p>
+    <w:p>
+      <w:pPr>
+        <w:pStyle w:val="ListParagraph"/>
+        <w:numPr>
+          <w:ilvl w:val="0"/>
+          <w:numId w:val="1"/>
+        </w:numPr>
+      </w:pPr>
+      <w:r>
+        <w:rPr>
+          <w:b/>
+          <w:bCs/>
+        </w:rPr>
+        <w:t xml:space="preserve">Vì sao:</w:t>
+      </w:r>
+      <w:r>
+        <w:t xml:space="preserve"> module test của Spring Modulith không nạp cả ứng dụng. Ở chế độ </w:t>
+      </w:r>
+      <w:r>
+        <w:rPr>
+          <w:rFonts w:ascii="Consolas" w:eastAsia="Consolas" w:hAnsi="Consolas" w:cs="Consolas"/>
+        </w:rPr>
+        <w:t xml:space="preserve">DIRECT_DEPENDENCIES</w:t>
+      </w:r>
+      <w:r>
+        <w:t xml:space="preserve">, nó nạp module đang test và các module mà module đó </w:t>
+      </w:r>
+      <w:r>
+        <w:rPr>
+          <w:b/>
+          <w:bCs/>
+        </w:rPr>
+        <w:t xml:space="preserve">dùng bean</w:t>
+      </w:r>
+      <w:r>
+        <w:t xml:space="preserve"> trực tiếp. Log của test in rõ: dấu </w:t>
+      </w:r>
+      <w:r>
+        <w:rPr>
+          <w:rFonts w:ascii="Consolas" w:eastAsia="Consolas" w:hAnsi="Consolas" w:cs="Consolas"/>
+        </w:rPr>
+        <w:t xml:space="preserve">+</w:t>
+      </w:r>
+      <w:r>
+        <w:t xml:space="preserve"> là có nạp, dấu </w:t>
+      </w:r>
+      <w:r>
+        <w:rPr>
+          <w:rFonts w:ascii="Consolas" w:eastAsia="Consolas" w:hAnsi="Consolas" w:cs="Consolas"/>
+        </w:rPr>
+        <w:t xml:space="preserve">-</w:t>
+      </w:r>
+      <w:r>
+        <w:t xml:space="preserve"> là không.</w:t>
+      </w:r>
+    </w:p>
+    <w:p>
+      <w:pPr>
+        <w:shd w:val="clear" w:color="auto" w:fill="F2F3F5"/>
+        <w:ind w:left="0"/>
+      </w:pPr>
+      <w:r>
+        <w:rPr>
+          <w:rFonts w:ascii="Consolas" w:eastAsia="Consolas" w:hAnsi="Consolas" w:cs="Consolas"/>
+          <w:sz w:val="19"/>
+          <w:szCs w:val="19"/>
+        </w:rPr>
+        <w:t xml:space="preserve">account  (module đang test)</w:t>
+        <w:br/>
+        <w:t xml:space="preserve">  + identity   có nạp: account dùng bean của identity</w:t>
+        <w:br/>
+        <w:t xml:space="preserve">  + provider   có nạp</w:t>
+        <w:br/>
+        <w:t xml:space="preserve">  - common     KHÔNG nạp: account chỉ dùng kiểu (SinoException)</w:t>
+        <w:br/>
+        <w:t xml:space="preserve">identity</w:t>
+        <w:br/>
+        <w:t xml:space="preserve">  -&gt; cần bean Clock, nằm ở common  =&gt; không có =&gt; không khởi động</w:t>
+      </w:r>
+    </w:p>
+    <w:p>
+      <w:pPr>
+        <w:pStyle w:val="ListParagraph"/>
+        <w:numPr>
+          <w:ilvl w:val="0"/>
+          <w:numId w:val="1"/>
+        </w:numPr>
+      </w:pPr>
+      <w:r>
+        <w:rPr>
+          <w:b/>
+          <w:bCs/>
+        </w:rPr>
+        <w:t xml:space="preserve">Cách xử lý đúng của Modulith:</w:t>
+      </w:r>
+      <w:r>
+        <w:t xml:space="preserve"> "phụ thuộc của phụ thuộc" thì test tự cấp, bằng mock hoặc một bean thay thế. Ở đây test thêm </w:t>
+      </w:r>
+      <w:r>
+        <w:rPr>
+          <w:rFonts w:ascii="Consolas" w:eastAsia="Consolas" w:hAnsi="Consolas" w:cs="Consolas"/>
+        </w:rPr>
+        <w:t xml:space="preserve">@Bean Clock</w:t>
+      </w:r>
+      <w:r>
+        <w:t xml:space="preserve">.</w:t>
+      </w:r>
+    </w:p>
+    <w:p>
+      <w:pPr>
+        <w:pStyle w:val="ListParagraph"/>
+        <w:numPr>
+          <w:ilvl w:val="0"/>
+          <w:numId w:val="1"/>
+        </w:numPr>
+      </w:pPr>
+      <w:r>
+        <w:rPr>
+          <w:b/>
+          <w:bCs/>
+        </w:rPr>
+        <w:t xml:space="preserve">Bài học:</w:t>
+      </w:r>
+      <w:r>
+        <w:t xml:space="preserve"> thêm một bean mới mà module khác phụ thuộc vào thì phải chạy full </w:t>
+      </w:r>
+      <w:r>
+        <w:rPr>
+          <w:rFonts w:ascii="Consolas" w:eastAsia="Consolas" w:hAnsi="Consolas" w:cs="Consolas"/>
+        </w:rPr>
+        <w:t xml:space="preserve">verify</w:t>
+      </w:r>
+      <w:r>
+        <w:t xml:space="preserve">, vì chỉ module test mới lộ ra loại lỗi này.</w:t>
+      </w:r>
+    </w:p>
+    <w:p>
+      <w:pPr>
+        <w:pStyle w:val="Heading3"/>
+      </w:pPr>
+      <w:r>
+        <w:t xml:space="preserve">3.6 Kiểm tra ngược (BE-29)</w:t>
+      </w:r>
+    </w:p>
+    <w:p>
+      <w:r>
+        <w:t xml:space="preserve">Làm hỏng code mỗi lần một chỗ, và lần nào cũng có test đỏ:</w:t>
+      </w:r>
+    </w:p>
+    <w:tbl>
+      <w:tblPr>
+        <w:tblW w:w="9360" w:type="dxa"/>
+        <w:tblBorders>
+          <w:top w:val="single" w:sz="4" w:space="0" w:color="auto"/>
+          <w:left w:val="single" w:sz="4" w:space="0" w:color="auto"/>
+          <w:bottom w:val="single" w:sz="4" w:space="0" w:color="auto"/>
+          <w:right w:val="single" w:sz="4" w:space="0" w:color="auto"/>
+          <w:insideH w:val="single" w:sz="4" w:space="0" w:color="auto"/>
+          <w:insideV w:val="single" w:sz="4" w:space="0" w:color="auto"/>
+        </w:tblBorders>
+        <w:tblLayout w:type="fixed"/>
+      </w:tblPr>
+      <w:tblGrid>
+        <w:gridCol w:w="4680"/>
+        <w:gridCol w:w="4680"/>
+      </w:tblGrid>
+      <w:tr>
+        <w:tc>
+          <w:tcPr>
+            <w:tcW w:w="4680" w:type="dxa"/>
+            <w:shd w:val="clear" w:color="auto" w:fill="F2F2F2"/>
+          </w:tcPr>
+          <w:p>
+            <w:r>
+              <w:t xml:space="preserve">Lỗi cố ý</w:t>
+            </w:r>
+          </w:p>
+        </w:tc>
+        <w:tc>
+          <w:tcPr>
+            <w:tcW w:w="4680" w:type="dxa"/>
+            <w:shd w:val="clear" w:color="auto" w:fill="F2F2F2"/>
+          </w:tcPr>
+          <w:p>
+            <w:r>
+              <w:t xml:space="preserve">Test bắt được</w:t>
+            </w:r>
+          </w:p>
+        </w:tc>
+      </w:tr>
+      <w:tr>
+        <w:tc>
+          <w:tcPr>
+            <w:tcW w:w="4680" w:type="dxa"/>
+          </w:tcPr>
+          <w:p>
+            <w:r>
+              <w:t xml:space="preserve">So mật khẩu trước, kiểm khóa sau</w:t>
+            </w:r>
+          </w:p>
+        </w:tc>
+        <w:tc>
+          <w:tcPr>
+            <w:tcW w:w="4680" w:type="dxa"/>
+          </w:tcPr>
+          <w:p>
+            <w:r>
+              <w:t xml:space="preserve">đúng mật khẩu khi đang khóa vẫn vào được</w:t>
+            </w:r>
+          </w:p>
+        </w:tc>
+      </w:tr>
+      <w:tr>
+        <w:tc>
+          <w:tcPr>
+            <w:tcW w:w="4680" w:type="dxa"/>
+          </w:tcPr>
+          <w:p>
+            <w:r>
+              <w:t xml:space="preserve">Khóa ở lần sai thứ 6</w:t>
+            </w:r>
+          </w:p>
+        </w:tc>
+        <w:tc>
+          <w:tcPr>
+            <w:tcW w:w="4680" w:type="dxa"/>
+          </w:tcPr>
+          <w:p>
+            <w:r>
+              <w:t xml:space="preserve">đếm lùi, khóa ở lần 5 (12 test đỏ)</w:t>
+            </w:r>
+          </w:p>
+        </w:tc>
+      </w:tr>
+      <w:tr>
+        <w:tc>
+          <w:tcPr>
+            <w:tcW w:w="4680" w:type="dxa"/>
+          </w:tcPr>
+          <w:p>
+            <w:r>
+              <w:t xml:space="preserve">Khóa 14 phút thay vì 15</w:t>
+            </w:r>
+          </w:p>
+        </w:tc>
+        <w:tc>
+          <w:tcPr>
+            <w:tcW w:w="4680" w:type="dxa"/>
+          </w:tcPr>
+          <w:p>
+            <w:r>
+              <w:rPr>
+                <w:rFonts w:ascii="Consolas" w:eastAsia="Consolas" w:hAnsi="Consolas" w:cs="Consolas"/>
+              </w:rPr>
+              <w:t xml:space="preserve">retryAfterSeconds</w:t>
+            </w:r>
+            <w:r>
+              <w:t xml:space="preserve"> = 900, mở khóa ở phút 15</w:t>
+            </w:r>
+          </w:p>
+        </w:tc>
+      </w:tr>
+      <w:tr>
+        <w:tc>
+          <w:tcPr>
+            <w:tcW w:w="4680" w:type="dxa"/>
+          </w:tcPr>
+          <w:p>
+            <w:r>
+              <w:t xml:space="preserve">Đăng nhập đúng không xóa bộ đếm</w:t>
+            </w:r>
+          </w:p>
+        </w:tc>
+        <w:tc>
+          <w:tcPr>
+            <w:tcW w:w="4680" w:type="dxa"/>
+          </w:tcPr>
+          <w:p>
+            <w:r>
+              <w:t xml:space="preserve">đếm lại từ đầu sau khi đăng nhập đúng</w:t>
+            </w:r>
+          </w:p>
+        </w:tc>
+      </w:tr>
+      <w:tr>
+        <w:tc>
+          <w:tcPr>
+            <w:tcW w:w="4680" w:type="dxa"/>
+          </w:tcPr>
+          <w:p>
+            <w:r>
+              <w:t xml:space="preserve">Không bao giờ quên lần sai</w:t>
+            </w:r>
+          </w:p>
+        </w:tc>
+        <w:tc>
+          <w:tcPr>
+            <w:tcW w:w="4680" w:type="dxa"/>
+          </w:tcPr>
+          <w:p>
+            <w:r>
+              <w:t xml:space="preserve">quên sau 15 phút kể từ lần sai cuối</w:t>
+            </w:r>
+          </w:p>
+        </w:tc>
+      </w:tr>
+      <w:tr>
+        <w:tc>
+          <w:tcPr>
+            <w:tcW w:w="4680" w:type="dxa"/>
+          </w:tcPr>
+          <w:p>
+            <w:r>
+              <w:t xml:space="preserve">Không chuẩn hóa email</w:t>
+            </w:r>
+          </w:p>
+        </w:tc>
+        <w:tc>
+          <w:tcPr>
+            <w:tcW w:w="4680" w:type="dxa"/>
+          </w:tcPr>
+          <w:p>
+            <w:r>
+              <w:rPr>
+                <w:rFonts w:ascii="Consolas" w:eastAsia="Consolas" w:hAnsi="Consolas" w:cs="Consolas"/>
+              </w:rPr>
+              <w:t xml:space="preserve">" Owner@X "</w:t>
+            </w:r>
+            <w:r>
+              <w:t xml:space="preserve"> và </w:t>
+            </w:r>
+            <w:r>
+              <w:rPr>
+                <w:rFonts w:ascii="Consolas" w:eastAsia="Consolas" w:hAnsi="Consolas" w:cs="Consolas"/>
+              </w:rPr>
+              <w:t xml:space="preserve">"owner@x"</w:t>
+            </w:r>
+            <w:r>
+              <w:t xml:space="preserve"> là một email</w:t>
+            </w:r>
+          </w:p>
+        </w:tc>
+      </w:tr>
+      <w:tr>
+        <w:tc>
+          <w:tcPr>
+            <w:tcW w:w="4680" w:type="dxa"/>
+          </w:tcPr>
+          <w:p>
+            <w:r>
+              <w:t xml:space="preserve">Bỏ cả mục đang khóa khi bảng đầy</w:t>
+            </w:r>
+          </w:p>
+        </w:tc>
+        <w:tc>
+          <w:tcPr>
+            <w:tcW w:w="4680" w:type="dxa"/>
+          </w:tcPr>
+          <w:p>
+            <w:r>
+              <w:t xml:space="preserve">khóa không bị "đẩy" ra</w:t>
+            </w:r>
+          </w:p>
+        </w:tc>
+      </w:tr>
+      <w:tr>
+        <w:tc>
+          <w:tcPr>
+            <w:tcW w:w="4680" w:type="dxa"/>
+          </w:tcPr>
+          <w:p>
+            <w:r>
+              <w:t xml:space="preserve">Bảng không giới hạn</w:t>
+            </w:r>
+          </w:p>
+        </w:tc>
+        <w:tc>
+          <w:tcPr>
+            <w:tcW w:w="4680" w:type="dxa"/>
+          </w:tcPr>
+          <w:p>
+            <w:r>
+              <w:t xml:space="preserve">giữ tối đa N email, bỏ cái cũ nhất</w:t>
+            </w:r>
+          </w:p>
+        </w:tc>
+      </w:tr>
+      <w:tr>
+        <w:tc>
+          <w:tcPr>
+            <w:tcW w:w="4680" w:type="dxa"/>
+          </w:tcPr>
+          <w:p>
+            <w:r>
+              <w:t xml:space="preserve">Không gửi header </w:t>
+            </w:r>
+            <w:r>
+              <w:rPr>
+                <w:rFonts w:ascii="Consolas" w:eastAsia="Consolas" w:hAnsi="Consolas" w:cs="Consolas"/>
+              </w:rPr>
+              <w:t xml:space="preserve">Retry-After</w:t>
+            </w:r>
+          </w:p>
+        </w:tc>
+        <w:tc>
+          <w:tcPr>
+            <w:tcW w:w="4680" w:type="dxa"/>
+          </w:tcPr>
+          <w:p>
+            <w:r>
+              <w:t xml:space="preserve">header </w:t>
+            </w:r>
+            <w:r>
+              <w:rPr>
+                <w:rFonts w:ascii="Consolas" w:eastAsia="Consolas" w:hAnsi="Consolas" w:cs="Consolas"/>
+              </w:rPr>
+              <w:t xml:space="preserve">Retry-After: 900</w:t>
+            </w:r>
+          </w:p>
+        </w:tc>
+      </w:tr>
+      <w:tr>
+        <w:tc>
+          <w:tcPr>
+            <w:tcW w:w="4680" w:type="dxa"/>
+          </w:tcPr>
+          <w:p>
+            <w:r>
+              <w:t xml:space="preserve">Bỏ các trường phụ của lỗi</w:t>
+            </w:r>
+          </w:p>
+        </w:tc>
+        <w:tc>
+          <w:tcPr>
+            <w:tcW w:w="4680" w:type="dxa"/>
+          </w:tcPr>
+          <w:p>
+            <w:r>
+              <w:rPr>
+                <w:rFonts w:ascii="Consolas" w:eastAsia="Consolas" w:hAnsi="Consolas" w:cs="Consolas"/>
+              </w:rPr>
+              <w:t xml:space="preserve">remainingAttempts</w:t>
+            </w:r>
+            <w:r>
+              <w:t xml:space="preserve">, </w:t>
+            </w:r>
+            <w:r>
+              <w:rPr>
+                <w:rFonts w:ascii="Consolas" w:eastAsia="Consolas" w:hAnsi="Consolas" w:cs="Consolas"/>
+              </w:rPr>
+              <w:t xml:space="preserve">retryAfterSeconds</w:t>
+            </w:r>
+            <w:r>
+              <w:t xml:space="preserve"> có trong body</w:t>
+            </w:r>
+          </w:p>
+        </w:tc>
+      </w:tr>
+    </w:tbl>
+    <w:p>
+      <w:pPr>
+        <w:pBdr>
+          <w:bottom w:val="single" w:sz="4" w:space="0" w:color="auto"/>
+        </w:pBdr>
+        <w:ind w:left="0"/>
+      </w:pPr>
+    </w:p>
+    <w:p>
+      <w:pPr>
+        <w:pStyle w:val="Heading2"/>
+      </w:pPr>
+      <w:r>
         <w:t xml:space="preserve">Tự kiểm tra</w:t>
       </w:r>
     </w:p>
@@ -2672,6 +3810,90 @@
       </w:pPr>
       <w:r>
         <w:t xml:space="preserve">Vì sao test đăng nhập dùng server thật thay vì MockMvc?</w:t>
+      </w:r>
+    </w:p>
+    <w:p>
+      <w:pPr>
+        <w:pStyle w:val="ListParagraph"/>
+        <w:numPr>
+          <w:ilvl w:val="0"/>
+          <w:numId w:val="100"/>
+        </w:numPr>
+      </w:pPr>
+      <w:r>
+        <w:t xml:space="preserve">Vì sao phải kiểm khóa trước khi so mật khẩu?</w:t>
+      </w:r>
+    </w:p>
+    <w:p>
+      <w:pPr>
+        <w:pStyle w:val="ListParagraph"/>
+        <w:numPr>
+          <w:ilvl w:val="0"/>
+          <w:numId w:val="100"/>
+        </w:numPr>
+      </w:pPr>
+      <w:r>
+        <w:t xml:space="preserve">Nếu bộ đếm bỏ cả những email đang bị khóa khi bảng đầy, kẻ tấn công làm được gì?</w:t>
+      </w:r>
+    </w:p>
+    <w:p>
+      <w:pPr>
+        <w:pStyle w:val="ListParagraph"/>
+        <w:numPr>
+          <w:ilvl w:val="0"/>
+          <w:numId w:val="100"/>
+        </w:numPr>
+      </w:pPr>
+      <w:r>
+        <w:t xml:space="preserve">Vì sao code dùng một bean </w:t>
+      </w:r>
+      <w:r>
+        <w:rPr>
+          <w:rFonts w:ascii="Consolas" w:eastAsia="Consolas" w:hAnsi="Consolas" w:cs="Consolas"/>
+        </w:rPr>
+        <w:t xml:space="preserve">Clock</w:t>
+      </w:r>
+      <w:r>
+        <w:t xml:space="preserve"> thay vì gọi thẳng </w:t>
+      </w:r>
+      <w:r>
+        <w:rPr>
+          <w:rFonts w:ascii="Consolas" w:eastAsia="Consolas" w:hAnsi="Consolas" w:cs="Consolas"/>
+        </w:rPr>
+        <w:t xml:space="preserve">Instant.now()</w:t>
+      </w:r>
+      <w:r>
+        <w:t xml:space="preserve">?</w:t>
+      </w:r>
+    </w:p>
+    <w:p>
+      <w:pPr>
+        <w:pStyle w:val="ListParagraph"/>
+        <w:numPr>
+          <w:ilvl w:val="0"/>
+          <w:numId w:val="100"/>
+        </w:numPr>
+      </w:pPr>
+      <w:r>
+        <w:t xml:space="preserve">Module test của </w:t>
+      </w:r>
+      <w:r>
+        <w:rPr>
+          <w:rFonts w:ascii="Consolas" w:eastAsia="Consolas" w:hAnsi="Consolas" w:cs="Consolas"/>
+        </w:rPr>
+        <w:t xml:space="preserve">account</w:t>
+      </w:r>
+      <w:r>
+        <w:t xml:space="preserve"> không nạp </w:t>
+      </w:r>
+      <w:r>
+        <w:rPr>
+          <w:rFonts w:ascii="Consolas" w:eastAsia="Consolas" w:hAnsi="Consolas" w:cs="Consolas"/>
+        </w:rPr>
+        <w:t xml:space="preserve">common</w:t>
+      </w:r>
+      <w:r>
+        <w:t xml:space="preserve">. Vì sao trước BE-29 điều đó không gây lỗi, còn sau BE-29 thì có?</w:t>
       </w:r>
     </w:p>
     <w:p/>

</xml_diff>

<commit_message>
docs(knowledge): add FE-01 (web foundation) to the Phase 1 guide
Section 4: the frontend pieces, pnpm and the lockfile, the Vite proxy,
TypeScript aliases, Tailwind and the canvas tokens, the light/dark theme,
shadcn/ui and cn, self-hosted fonts, frontend tests, the independent review
(invisible focus outline, cn and shadow-popover) and the frontend CI.
Word copy regenerated with GenOffice; docs check clean.

Co-Authored-By: Claude Opus 5.5 (1M context) <noreply@anthropic.com>
</commit_message>
<xml_diff>
--- a/docs/knowledge/phase-1-frontend-foundation.docx
+++ b/docs/knowledge/phase-1-frontend-foundation.docx
@@ -106,7 +106,7 @@
         <w:t xml:space="preserve">openspec/changes/fe-f01-web-foundation</w:t>
       </w:r>
       <w:r>
-        <w:t xml:space="preserve"> (D-22 + F01-FE). Đang làm: xong BE-27, BE-28, BE-29.</w:t>
+        <w:t xml:space="preserve"> (D-22 + F01-FE). Đang làm: xong BE-27, BE-28, BE-29, FE-01.</w:t>
         <w:br/>
       </w:r>
       <w:r>
@@ -549,7 +549,7 @@
           </w:tcPr>
           <w:p>
             <w:r>
-              <w:t xml:space="preserve">FE-01…FE-05</w:t>
+              <w:t xml:space="preserve">FE-01</w:t>
             </w:r>
           </w:p>
         </w:tc>
@@ -559,7 +559,48 @@
           </w:tcPr>
           <w:p>
             <w:r>
-              <w:t xml:space="preserve">Nền móng web, API client, trang đăng nhập, khung app, nghiệm thu</w:t>
+              <w:t xml:space="preserve">Cài stack, design token, sáng/tối, proxy </w:t>
+            </w:r>
+            <w:r>
+              <w:rPr>
+                <w:rFonts w:ascii="Consolas" w:eastAsia="Consolas" w:hAnsi="Consolas" w:cs="Consolas"/>
+              </w:rPr>
+              <w:t xml:space="preserve">/api</w:t>
+            </w:r>
+            <w:r>
+              <w:t xml:space="preserve">, test, CI frontend</w:t>
+            </w:r>
+          </w:p>
+        </w:tc>
+        <w:tc>
+          <w:tcPr>
+            <w:tcW w:w="3120" w:type="dxa"/>
+          </w:tcPr>
+          <w:p>
+            <w:r>
+              <w:t xml:space="preserve">xong</w:t>
+            </w:r>
+          </w:p>
+        </w:tc>
+      </w:tr>
+      <w:tr>
+        <w:tc>
+          <w:tcPr>
+            <w:tcW w:w="3120" w:type="dxa"/>
+          </w:tcPr>
+          <w:p>
+            <w:r>
+              <w:t xml:space="preserve">FE-02…FE-05</w:t>
+            </w:r>
+          </w:p>
+        </w:tc>
+        <w:tc>
+          <w:tcPr>
+            <w:tcW w:w="3120" w:type="dxa"/>
+          </w:tcPr>
+          <w:p>
+            <w:r>
+              <w:t xml:space="preserve">API client, trang đăng nhập, khung app, nghiệm thu</w:t>
             </w:r>
           </w:p>
         </w:tc>
@@ -3635,6 +3676,3978 @@
         <w:pStyle w:val="Heading2"/>
       </w:pPr>
       <w:r>
+        <w:t xml:space="preserve">4. Nền móng web (FE-01)</w:t>
+      </w:r>
+    </w:p>
+    <w:p>
+      <w:pPr>
+        <w:pStyle w:val="Heading3"/>
+      </w:pPr>
+      <w:r>
+        <w:t xml:space="preserve">4.0 Bức tranh: các mảnh của frontend</w:t>
+      </w:r>
+    </w:p>
+    <w:p>
+      <w:pPr>
+        <w:shd w:val="clear" w:color="auto" w:fill="F2F3F5"/>
+        <w:ind w:left="0"/>
+      </w:pPr>
+      <w:r>
+        <w:rPr>
+          <w:rFonts w:ascii="Consolas" w:eastAsia="Consolas" w:hAnsi="Consolas" w:cs="Consolas"/>
+          <w:sz w:val="19"/>
+          <w:szCs w:val="19"/>
+        </w:rPr>
+        <w:t xml:space="preserve">LÚC DEV</w:t>
+        <w:br/>
+        <w:t xml:space="preserve">  trình duyệt --&gt; http://localhost:5173 (Vite dev server)</w:t>
+        <w:br/>
+        <w:t xml:space="preserve">                    /src/*.tsx  -&gt; dịch TypeScript + JSX, trả ngay (HMR)</w:t>
+        <w:br/>
+        <w:t xml:space="preserve">                    /api/...    -&gt; proxy --&gt; Spring Boot localhost:8080</w:t>
+        <w:br/>
+        <w:t xml:space="preserve">  =&gt; trình duyệt chỉ thấy MỘT địa chỉ:</w:t>
+        <w:br/>
+        <w:t xml:space="preserve">     cookie session và XSRF-TOKEN được lưu cho localhost:5173</w:t>
+        <w:br/>
+        <w:br/>
+        <w:t xml:space="preserve">LÚC BUILD (pnpm build)</w:t>
+        <w:br/>
+        <w:t xml:space="preserve">  tsc -b        kiểm kiểu toàn bộ src (không sinh file)</w:t>
+        <w:br/>
+        <w:t xml:space="preserve">  vite build    gom code thành dist/index.html + dist/assets/*.js, *.css, font</w:t>
+      </w:r>
+    </w:p>
+    <w:tbl>
+      <w:tblPr>
+        <w:tblW w:w="9360" w:type="dxa"/>
+        <w:tblBorders>
+          <w:top w:val="single" w:sz="4" w:space="0" w:color="auto"/>
+          <w:left w:val="single" w:sz="4" w:space="0" w:color="auto"/>
+          <w:bottom w:val="single" w:sz="4" w:space="0" w:color="auto"/>
+          <w:right w:val="single" w:sz="4" w:space="0" w:color="auto"/>
+          <w:insideH w:val="single" w:sz="4" w:space="0" w:color="auto"/>
+          <w:insideV w:val="single" w:sz="4" w:space="0" w:color="auto"/>
+        </w:tblBorders>
+        <w:tblLayout w:type="fixed"/>
+      </w:tblPr>
+      <w:tblGrid>
+        <w:gridCol w:w="3120"/>
+        <w:gridCol w:w="3120"/>
+        <w:gridCol w:w="3120"/>
+      </w:tblGrid>
+      <w:tr>
+        <w:tc>
+          <w:tcPr>
+            <w:tcW w:w="3120" w:type="dxa"/>
+            <w:shd w:val="clear" w:color="auto" w:fill="F2F2F2"/>
+          </w:tcPr>
+          <w:p>
+            <w:r>
+              <w:t xml:space="preserve">Mảnh</w:t>
+            </w:r>
+          </w:p>
+        </w:tc>
+        <w:tc>
+          <w:tcPr>
+            <w:tcW w:w="3120" w:type="dxa"/>
+            <w:shd w:val="clear" w:color="auto" w:fill="F2F2F2"/>
+          </w:tcPr>
+          <w:p>
+            <w:r>
+              <w:t xml:space="preserve">Vai trò</w:t>
+            </w:r>
+          </w:p>
+        </w:tc>
+        <w:tc>
+          <w:tcPr>
+            <w:tcW w:w="3120" w:type="dxa"/>
+            <w:shd w:val="clear" w:color="auto" w:fill="F2F2F2"/>
+          </w:tcPr>
+          <w:p>
+            <w:r>
+              <w:t xml:space="preserve">Tương đương bên Java</w:t>
+            </w:r>
+          </w:p>
+        </w:tc>
+      </w:tr>
+      <w:tr>
+        <w:tc>
+          <w:tcPr>
+            <w:tcW w:w="3120" w:type="dxa"/>
+          </w:tcPr>
+          <w:p>
+            <w:r>
+              <w:t xml:space="preserve">pnpm</w:t>
+            </w:r>
+          </w:p>
+        </w:tc>
+        <w:tc>
+          <w:tcPr>
+            <w:tcW w:w="3120" w:type="dxa"/>
+          </w:tcPr>
+          <w:p>
+            <w:r>
+              <w:t xml:space="preserve">cài thư viện, chạy script</w:t>
+            </w:r>
+          </w:p>
+        </w:tc>
+        <w:tc>
+          <w:tcPr>
+            <w:tcW w:w="3120" w:type="dxa"/>
+          </w:tcPr>
+          <w:p>
+            <w:r>
+              <w:t xml:space="preserve">Maven</w:t>
+            </w:r>
+          </w:p>
+        </w:tc>
+      </w:tr>
+      <w:tr>
+        <w:tc>
+          <w:tcPr>
+            <w:tcW w:w="3120" w:type="dxa"/>
+          </w:tcPr>
+          <w:p>
+            <w:r>
+              <w:t xml:space="preserve">Vite</w:t>
+            </w:r>
+          </w:p>
+        </w:tc>
+        <w:tc>
+          <w:tcPr>
+            <w:tcW w:w="3120" w:type="dxa"/>
+          </w:tcPr>
+          <w:p>
+            <w:r>
+              <w:t xml:space="preserve">dev server, đóng gói khi build</w:t>
+            </w:r>
+          </w:p>
+        </w:tc>
+        <w:tc>
+          <w:tcPr>
+            <w:tcW w:w="3120" w:type="dxa"/>
+          </w:tcPr>
+          <w:p>
+            <w:r>
+              <w:t xml:space="preserve">Spring Boot DevTools + plugin đóng gói của Maven</w:t>
+            </w:r>
+          </w:p>
+        </w:tc>
+      </w:tr>
+      <w:tr>
+        <w:tc>
+          <w:tcPr>
+            <w:tcW w:w="3120" w:type="dxa"/>
+          </w:tcPr>
+          <w:p>
+            <w:r>
+              <w:t xml:space="preserve">TypeScript</w:t>
+            </w:r>
+          </w:p>
+        </w:tc>
+        <w:tc>
+          <w:tcPr>
+            <w:tcW w:w="3120" w:type="dxa"/>
+          </w:tcPr>
+          <w:p>
+            <w:r>
+              <w:t xml:space="preserve">JavaScript có kiểu, </w:t>
+            </w:r>
+            <w:r>
+              <w:rPr>
+                <w:rFonts w:ascii="Consolas" w:eastAsia="Consolas" w:hAnsi="Consolas" w:cs="Consolas"/>
+              </w:rPr>
+              <w:t xml:space="preserve">tsc</w:t>
+            </w:r>
+            <w:r>
+              <w:t xml:space="preserve"> kiểm lỗi kiểu</w:t>
+            </w:r>
+          </w:p>
+        </w:tc>
+        <w:tc>
+          <w:tcPr>
+            <w:tcW w:w="3120" w:type="dxa"/>
+          </w:tcPr>
+          <w:p>
+            <w:r>
+              <w:rPr>
+                <w:rFonts w:ascii="Consolas" w:eastAsia="Consolas" w:hAnsi="Consolas" w:cs="Consolas"/>
+              </w:rPr>
+              <w:t xml:space="preserve">javac</w:t>
+            </w:r>
+          </w:p>
+        </w:tc>
+      </w:tr>
+      <w:tr>
+        <w:tc>
+          <w:tcPr>
+            <w:tcW w:w="3120" w:type="dxa"/>
+          </w:tcPr>
+          <w:p>
+            <w:r>
+              <w:t xml:space="preserve">React</w:t>
+            </w:r>
+          </w:p>
+        </w:tc>
+        <w:tc>
+          <w:tcPr>
+            <w:tcW w:w="3120" w:type="dxa"/>
+          </w:tcPr>
+          <w:p>
+            <w:r>
+              <w:t xml:space="preserve">vẽ giao diện bằng component</w:t>
+            </w:r>
+          </w:p>
+        </w:tc>
+        <w:tc>
+          <w:tcPr>
+            <w:tcW w:w="3120" w:type="dxa"/>
+          </w:tcPr>
+          <w:p>
+            <w:r>
+              <w:t xml:space="preserve">(không có tương đương trực tiếp)</w:t>
+            </w:r>
+          </w:p>
+        </w:tc>
+      </w:tr>
+      <w:tr>
+        <w:tc>
+          <w:tcPr>
+            <w:tcW w:w="3120" w:type="dxa"/>
+          </w:tcPr>
+          <w:p>
+            <w:r>
+              <w:t xml:space="preserve">Tailwind CSS</w:t>
+            </w:r>
+          </w:p>
+        </w:tc>
+        <w:tc>
+          <w:tcPr>
+            <w:tcW w:w="3120" w:type="dxa"/>
+          </w:tcPr>
+          <w:p>
+            <w:r>
+              <w:t xml:space="preserve">viết style bằng class ngắn trong JSX</w:t>
+            </w:r>
+          </w:p>
+        </w:tc>
+        <w:tc>
+          <w:tcPr>
+            <w:tcW w:w="3120" w:type="dxa"/>
+          </w:tcPr>
+          <w:p>
+            <w:r>
+              <w:t xml:space="preserve">(không có)</w:t>
+            </w:r>
+          </w:p>
+        </w:tc>
+      </w:tr>
+      <w:tr>
+        <w:tc>
+          <w:tcPr>
+            <w:tcW w:w="3120" w:type="dxa"/>
+          </w:tcPr>
+          <w:p>
+            <w:r>
+              <w:t xml:space="preserve">shadcn/ui + Radix</w:t>
+            </w:r>
+          </w:p>
+        </w:tc>
+        <w:tc>
+          <w:tcPr>
+            <w:tcW w:w="3120" w:type="dxa"/>
+          </w:tcPr>
+          <w:p>
+            <w:r>
+              <w:t xml:space="preserve">component có sẵn (nút, ô nhập, menu)</w:t>
+            </w:r>
+          </w:p>
+        </w:tc>
+        <w:tc>
+          <w:tcPr>
+            <w:tcW w:w="3120" w:type="dxa"/>
+          </w:tcPr>
+          <w:p>
+            <w:r>
+              <w:t xml:space="preserve">thư viện UI</w:t>
+            </w:r>
+          </w:p>
+        </w:tc>
+      </w:tr>
+      <w:tr>
+        <w:tc>
+          <w:tcPr>
+            <w:tcW w:w="3120" w:type="dxa"/>
+          </w:tcPr>
+          <w:p>
+            <w:r>
+              <w:t xml:space="preserve">TanStack Query</w:t>
+            </w:r>
+          </w:p>
+        </w:tc>
+        <w:tc>
+          <w:tcPr>
+            <w:tcW w:w="3120" w:type="dxa"/>
+          </w:tcPr>
+          <w:p>
+            <w:r>
+              <w:t xml:space="preserve">gọi API, cache, trạng thái loading/lỗi (dùng từ FE-02)</w:t>
+            </w:r>
+          </w:p>
+        </w:tc>
+        <w:tc>
+          <w:tcPr>
+            <w:tcW w:w="3120" w:type="dxa"/>
+          </w:tcPr>
+          <w:p>
+            <w:r>
+              <w:t xml:space="preserve">(không có)</w:t>
+            </w:r>
+          </w:p>
+        </w:tc>
+      </w:tr>
+      <w:tr>
+        <w:tc>
+          <w:tcPr>
+            <w:tcW w:w="3120" w:type="dxa"/>
+          </w:tcPr>
+          <w:p>
+            <w:r>
+              <w:t xml:space="preserve">React Router</w:t>
+            </w:r>
+          </w:p>
+        </w:tc>
+        <w:tc>
+          <w:tcPr>
+            <w:tcW w:w="3120" w:type="dxa"/>
+          </w:tcPr>
+          <w:p>
+            <w:r>
+              <w:t xml:space="preserve">chuyển trang theo URL (dùng từ FE-03/FE-04)</w:t>
+            </w:r>
+          </w:p>
+        </w:tc>
+        <w:tc>
+          <w:tcPr>
+            <w:tcW w:w="3120" w:type="dxa"/>
+          </w:tcPr>
+          <w:p>
+            <w:r>
+              <w:rPr>
+                <w:rFonts w:ascii="Consolas" w:eastAsia="Consolas" w:hAnsi="Consolas" w:cs="Consolas"/>
+              </w:rPr>
+              <w:t xml:space="preserve">@RequestMapping</w:t>
+            </w:r>
+            <w:r>
+              <w:t xml:space="preserve"> của trang</w:t>
+            </w:r>
+          </w:p>
+        </w:tc>
+      </w:tr>
+      <w:tr>
+        <w:tc>
+          <w:tcPr>
+            <w:tcW w:w="3120" w:type="dxa"/>
+          </w:tcPr>
+          <w:p>
+            <w:r>
+              <w:t xml:space="preserve">Vitest + Testing Library + MSW</w:t>
+            </w:r>
+          </w:p>
+        </w:tc>
+        <w:tc>
+          <w:tcPr>
+            <w:tcW w:w="3120" w:type="dxa"/>
+          </w:tcPr>
+          <w:p>
+            <w:r>
+              <w:t xml:space="preserve">chạy test, dựng component trong DOM giả, giả mạng</w:t>
+            </w:r>
+          </w:p>
+        </w:tc>
+        <w:tc>
+          <w:tcPr>
+            <w:tcW w:w="3120" w:type="dxa"/>
+          </w:tcPr>
+          <w:p>
+            <w:r>
+              <w:t xml:space="preserve">JUnit + MockMvc + WireMock</w:t>
+            </w:r>
+          </w:p>
+        </w:tc>
+      </w:tr>
+    </w:tbl>
+    <w:p>
+      <w:pPr>
+        <w:pStyle w:val="Heading3"/>
+      </w:pPr>
+      <w:r>
+        <w:t xml:space="preserve">4.1 pnpm, </w:t>
+      </w:r>
+      <w:r>
+        <w:rPr>
+          <w:rFonts w:ascii="Consolas" w:eastAsia="Consolas" w:hAnsi="Consolas" w:cs="Consolas"/>
+        </w:rPr>
+        <w:t xml:space="preserve">package.json</w:t>
+      </w:r>
+      <w:r>
+        <w:t xml:space="preserve"> và lockfile</w:t>
+      </w:r>
+    </w:p>
+    <w:p>
+      <w:pPr>
+        <w:pStyle w:val="ListParagraph"/>
+        <w:numPr>
+          <w:ilvl w:val="0"/>
+          <w:numId w:val="1"/>
+        </w:numPr>
+      </w:pPr>
+      <w:r>
+        <w:rPr>
+          <w:b/>
+          <w:bCs/>
+        </w:rPr>
+        <w:t xml:space="preserve">Ở đâu:</w:t>
+      </w:r>
+      <w:r>
+        <w:t xml:space="preserve"> </w:t>
+      </w:r>
+      <w:r>
+        <w:rPr>
+          <w:rFonts w:ascii="Consolas" w:eastAsia="Consolas" w:hAnsi="Consolas" w:cs="Consolas"/>
+        </w:rPr>
+        <w:t xml:space="preserve">package.json</w:t>
+      </w:r>
+      <w:r>
+        <w:t xml:space="preserve">, </w:t>
+      </w:r>
+      <w:r>
+        <w:rPr>
+          <w:rFonts w:ascii="Consolas" w:eastAsia="Consolas" w:hAnsi="Consolas" w:cs="Consolas"/>
+        </w:rPr>
+        <w:t xml:space="preserve">pnpm-lock.yaml</w:t>
+      </w:r>
+      <w:r>
+        <w:t xml:space="preserve">, </w:t>
+      </w:r>
+      <w:r>
+        <w:rPr>
+          <w:rFonts w:ascii="Consolas" w:eastAsia="Consolas" w:hAnsi="Consolas" w:cs="Consolas"/>
+        </w:rPr>
+        <w:t xml:space="preserve">pnpm-workspace.yaml</w:t>
+      </w:r>
+      <w:r>
+        <w:t xml:space="preserve">.</w:t>
+      </w:r>
+    </w:p>
+    <w:p>
+      <w:pPr>
+        <w:pStyle w:val="ListParagraph"/>
+        <w:numPr>
+          <w:ilvl w:val="0"/>
+          <w:numId w:val="1"/>
+        </w:numPr>
+      </w:pPr>
+      <w:r>
+        <w:rPr>
+          <w:b/>
+          <w:bCs/>
+        </w:rPr>
+        <w:t xml:space="preserve">Là gì:</w:t>
+      </w:r>
+      <w:r>
+        <w:t xml:space="preserve"> </w:t>
+      </w:r>
+      <w:r>
+        <w:rPr>
+          <w:rFonts w:ascii="Consolas" w:eastAsia="Consolas" w:hAnsi="Consolas" w:cs="Consolas"/>
+        </w:rPr>
+        <w:t xml:space="preserve">package.json</w:t>
+      </w:r>
+      <w:r>
+        <w:t xml:space="preserve"> khai báo thư viện cần dùng (</w:t>
+      </w:r>
+      <w:r>
+        <w:rPr>
+          <w:rFonts w:ascii="Consolas" w:eastAsia="Consolas" w:hAnsi="Consolas" w:cs="Consolas"/>
+        </w:rPr>
+        <w:t xml:space="preserve">dependencies</w:t>
+      </w:r>
+      <w:r>
+        <w:t xml:space="preserve"> cho code chạy trong trình duyệt, </w:t>
+      </w:r>
+      <w:r>
+        <w:rPr>
+          <w:rFonts w:ascii="Consolas" w:eastAsia="Consolas" w:hAnsi="Consolas" w:cs="Consolas"/>
+        </w:rPr>
+        <w:t xml:space="preserve">devDependencies</w:t>
+      </w:r>
+      <w:r>
+        <w:t xml:space="preserve"> cho công cụ: build, test, lint) và các script (</w:t>
+      </w:r>
+      <w:r>
+        <w:rPr>
+          <w:rFonts w:ascii="Consolas" w:eastAsia="Consolas" w:hAnsi="Consolas" w:cs="Consolas"/>
+        </w:rPr>
+        <w:t xml:space="preserve">pnpm dev</w:t>
+      </w:r>
+      <w:r>
+        <w:t xml:space="preserve">, </w:t>
+      </w:r>
+      <w:r>
+        <w:rPr>
+          <w:rFonts w:ascii="Consolas" w:eastAsia="Consolas" w:hAnsi="Consolas" w:cs="Consolas"/>
+        </w:rPr>
+        <w:t xml:space="preserve">pnpm test</w:t>
+      </w:r>
+      <w:r>
+        <w:t xml:space="preserve">...). </w:t>
+      </w:r>
+      <w:r>
+        <w:rPr>
+          <w:rFonts w:ascii="Consolas" w:eastAsia="Consolas" w:hAnsi="Consolas" w:cs="Consolas"/>
+        </w:rPr>
+        <w:t xml:space="preserve">pnpm-lock.yaml</w:t>
+      </w:r>
+      <w:r>
+        <w:t xml:space="preserve"> ghi </w:t>
+      </w:r>
+      <w:r>
+        <w:rPr>
+          <w:b/>
+          <w:bCs/>
+        </w:rPr>
+        <w:t xml:space="preserve">chính xác</w:t>
+      </w:r>
+      <w:r>
+        <w:t xml:space="preserve"> phiên bản của mọi thư viện, kể cả thư viện con, giống việc Maven luôn tải đúng một phiên bản đã ghi.</w:t>
+      </w:r>
+    </w:p>
+    <w:p>
+      <w:pPr>
+        <w:pStyle w:val="ListParagraph"/>
+        <w:numPr>
+          <w:ilvl w:val="0"/>
+          <w:numId w:val="1"/>
+        </w:numPr>
+      </w:pPr>
+      <w:r>
+        <w:rPr>
+          <w:rFonts w:ascii="Consolas" w:eastAsia="Consolas" w:hAnsi="Consolas" w:cs="Consolas"/>
+          <w:b/>
+          <w:bCs/>
+        </w:rPr>
+        <w:t xml:space="preserve">^5.104.1</w:t>
+      </w:r>
+      <w:r>
+        <w:rPr>
+          <w:b/>
+          <w:bCs/>
+        </w:rPr>
+        <w:t xml:space="preserve"> nghĩa là gì:</w:t>
+      </w:r>
+      <w:r>
+        <w:t xml:space="preserve"> cho phép bản vá và bản nhỏ mới hơn (5.x.y) nhưng không lên 6. Lockfile mới là thứ đảm bảo hai máy cài giống hệt nhau, nên CI chạy </w:t>
+      </w:r>
+      <w:r>
+        <w:rPr>
+          <w:rFonts w:ascii="Consolas" w:eastAsia="Consolas" w:hAnsi="Consolas" w:cs="Consolas"/>
+        </w:rPr>
+        <w:t xml:space="preserve">pnpm install --frozen-lockfile</w:t>
+      </w:r>
+      <w:r>
+        <w:t xml:space="preserve">: lockfile lệch với </w:t>
+      </w:r>
+      <w:r>
+        <w:rPr>
+          <w:rFonts w:ascii="Consolas" w:eastAsia="Consolas" w:hAnsi="Consolas" w:cs="Consolas"/>
+        </w:rPr>
+        <w:t xml:space="preserve">package.json</w:t>
+      </w:r>
+      <w:r>
+        <w:t xml:space="preserve"> thì dừng, không tự sửa.</w:t>
+      </w:r>
+    </w:p>
+    <w:p>
+      <w:pPr>
+        <w:pStyle w:val="ListParagraph"/>
+        <w:numPr>
+          <w:ilvl w:val="0"/>
+          <w:numId w:val="1"/>
+        </w:numPr>
+      </w:pPr>
+      <w:r>
+        <w:rPr>
+          <w:rFonts w:ascii="Consolas" w:eastAsia="Consolas" w:hAnsi="Consolas" w:cs="Consolas"/>
+          <w:b/>
+          <w:bCs/>
+        </w:rPr>
+        <w:t xml:space="preserve">packageManager: pnpm@11.21.0</w:t>
+      </w:r>
+      <w:r>
+        <w:rPr>
+          <w:b/>
+          <w:bCs/>
+        </w:rPr>
+        <w:t xml:space="preserve">:</w:t>
+      </w:r>
+      <w:r>
+        <w:t xml:space="preserve"> ghi phiên bản pnpm của dự án; CI (</w:t>
+      </w:r>
+      <w:r>
+        <w:rPr>
+          <w:rFonts w:ascii="Consolas" w:eastAsia="Consolas" w:hAnsi="Consolas" w:cs="Consolas"/>
+        </w:rPr>
+        <w:t xml:space="preserve">pnpm/action-setup</w:t>
+      </w:r>
+      <w:r>
+        <w:t xml:space="preserve">) đọc trường này để cài đúng bản. Trên máy thì tự cài: </w:t>
+      </w:r>
+      <w:r>
+        <w:rPr>
+          <w:rFonts w:ascii="Consolas" w:eastAsia="Consolas" w:hAnsi="Consolas" w:cs="Consolas"/>
+        </w:rPr>
+        <w:t xml:space="preserve">npm install -g pnpm@11</w:t>
+      </w:r>
+      <w:r>
+        <w:t xml:space="preserve"> (Node 25 trở đi không còn kèm </w:t>
+      </w:r>
+      <w:r>
+        <w:rPr>
+          <w:rFonts w:ascii="Consolas" w:eastAsia="Consolas" w:hAnsi="Consolas" w:cs="Consolas"/>
+        </w:rPr>
+        <w:t xml:space="preserve">corepack</w:t>
+      </w:r>
+      <w:r>
+        <w:t xml:space="preserve">).</w:t>
+      </w:r>
+    </w:p>
+    <w:p>
+      <w:pPr>
+        <w:pStyle w:val="ListParagraph"/>
+        <w:numPr>
+          <w:ilvl w:val="0"/>
+          <w:numId w:val="1"/>
+        </w:numPr>
+      </w:pPr>
+      <w:r>
+        <w:rPr>
+          <w:b/>
+          <w:bCs/>
+        </w:rPr>
+        <w:t xml:space="preserve">Bẫy 1, script cài đặt:</w:t>
+      </w:r>
+      <w:r>
+        <w:t xml:space="preserve"> một số thư viện chạy script ngay lúc cài (postinstall). Từ pnpm 10, các script này bị chặn mặc định vì một thư viện bị chiếm quyền có thể chạy mã độc trên máy bạn ngay khi cài. pnpm 11 còn </w:t>
+      </w:r>
+      <w:r>
+        <w:rPr>
+          <w:b/>
+          <w:bCs/>
+        </w:rPr>
+        <w:t xml:space="preserve">báo lỗi</w:t>
+      </w:r>
+      <w:r>
+        <w:t xml:space="preserve"> (</w:t>
+      </w:r>
+      <w:r>
+        <w:rPr>
+          <w:rFonts w:ascii="Consolas" w:eastAsia="Consolas" w:hAnsi="Consolas" w:cs="Consolas"/>
+        </w:rPr>
+        <w:t xml:space="preserve">ERR_PNPM_IGNORED_BUILDS</w:t>
+      </w:r>
+      <w:r>
+        <w:t xml:space="preserve">, thoát mã 1, CI sẽ đỏ) nếu ta chưa quyết. MSW có một script như vậy, chỉ để chép file service worker cho chế độ chạy trong trình duyệt, thứ ta không dùng; nên </w:t>
+      </w:r>
+      <w:r>
+        <w:rPr>
+          <w:rFonts w:ascii="Consolas" w:eastAsia="Consolas" w:hAnsi="Consolas" w:cs="Consolas"/>
+        </w:rPr>
+        <w:t xml:space="preserve">pnpm-workspace.yaml</w:t>
+      </w:r>
+      <w:r>
+        <w:t xml:space="preserve"> ghi </w:t>
+      </w:r>
+      <w:r>
+        <w:rPr>
+          <w:rFonts w:ascii="Consolas" w:eastAsia="Consolas" w:hAnsi="Consolas" w:cs="Consolas"/>
+        </w:rPr>
+        <w:t xml:space="preserve">allowBuilds: msw: false</w:t>
+      </w:r>
+      <w:r>
+        <w:t xml:space="preserve"> (quyết định tường minh: không cho chạy).</w:t>
+      </w:r>
+    </w:p>
+    <w:p>
+      <w:pPr>
+        <w:pStyle w:val="ListParagraph"/>
+        <w:numPr>
+          <w:ilvl w:val="0"/>
+          <w:numId w:val="1"/>
+        </w:numPr>
+      </w:pPr>
+      <w:r>
+        <w:rPr>
+          <w:b/>
+          <w:bCs/>
+        </w:rPr>
+        <w:t xml:space="preserve">Bẫy 2, bản major quá mới:</w:t>
+      </w:r>
+      <w:r>
+        <w:t xml:space="preserve"> MSW 3.0.0 ra ngày 2026-09-28, mà Vitest 5 vẫn khai báo cần </w:t>
+      </w:r>
+      <w:r>
+        <w:rPr>
+          <w:rFonts w:ascii="Consolas" w:eastAsia="Consolas" w:hAnsi="Consolas" w:cs="Consolas"/>
+        </w:rPr>
+        <w:t xml:space="preserve">msw ^2</w:t>
+      </w:r>
+      <w:r>
+        <w:t xml:space="preserve">. Chọn MSW 2.15 (ổn định từ tháng 7) thay vì bản mới nhất. Bài học: "mới nhất" chưa chắc là "đúng"; xem </w:t>
+      </w:r>
+      <w:r>
+        <w:rPr>
+          <w:rFonts w:ascii="Consolas" w:eastAsia="Consolas" w:hAnsi="Consolas" w:cs="Consolas"/>
+        </w:rPr>
+        <w:t xml:space="preserve">peerDependencies</w:t>
+      </w:r>
+      <w:r>
+        <w:t xml:space="preserve"> và ngày phát hành.</w:t>
+      </w:r>
+    </w:p>
+    <w:p>
+      <w:pPr>
+        <w:pStyle w:val="Heading3"/>
+      </w:pPr>
+      <w:r>
+        <w:t xml:space="preserve">4.2 Vite và proxy </w:t>
+      </w:r>
+      <w:r>
+        <w:rPr>
+          <w:rFonts w:ascii="Consolas" w:eastAsia="Consolas" w:hAnsi="Consolas" w:cs="Consolas"/>
+        </w:rPr>
+        <w:t xml:space="preserve">/api</w:t>
+      </w:r>
+    </w:p>
+    <w:p>
+      <w:pPr>
+        <w:pStyle w:val="ListParagraph"/>
+        <w:numPr>
+          <w:ilvl w:val="0"/>
+          <w:numId w:val="1"/>
+        </w:numPr>
+      </w:pPr>
+      <w:r>
+        <w:rPr>
+          <w:b/>
+          <w:bCs/>
+        </w:rPr>
+        <w:t xml:space="preserve">Ở đâu:</w:t>
+      </w:r>
+      <w:r>
+        <w:t xml:space="preserve"> </w:t>
+      </w:r>
+      <w:r>
+        <w:rPr>
+          <w:rFonts w:ascii="Consolas" w:eastAsia="Consolas" w:hAnsi="Consolas" w:cs="Consolas"/>
+        </w:rPr>
+        <w:t xml:space="preserve">vite.config.ts</w:t>
+      </w:r>
+      <w:r>
+        <w:t xml:space="preserve"> (</w:t>
+      </w:r>
+      <w:r>
+        <w:rPr>
+          <w:rFonts w:ascii="Consolas" w:eastAsia="Consolas" w:hAnsi="Consolas" w:cs="Consolas"/>
+        </w:rPr>
+        <w:t xml:space="preserve">server.proxy</w:t>
+      </w:r>
+      <w:r>
+        <w:t xml:space="preserve">).</w:t>
+      </w:r>
+    </w:p>
+    <w:p>
+      <w:pPr>
+        <w:pStyle w:val="ListParagraph"/>
+        <w:numPr>
+          <w:ilvl w:val="0"/>
+          <w:numId w:val="1"/>
+        </w:numPr>
+      </w:pPr>
+      <w:r>
+        <w:rPr>
+          <w:b/>
+          <w:bCs/>
+        </w:rPr>
+        <w:t xml:space="preserve">Là gì:</w:t>
+      </w:r>
+      <w:r>
+        <w:t xml:space="preserve"> lúc dev, mọi request có đường dẫn bắt đầu bằng </w:t>
+      </w:r>
+      <w:r>
+        <w:rPr>
+          <w:rFonts w:ascii="Consolas" w:eastAsia="Consolas" w:hAnsi="Consolas" w:cs="Consolas"/>
+        </w:rPr>
+        <w:t xml:space="preserve">/api/</w:t>
+      </w:r>
+      <w:r>
+        <w:t xml:space="preserve"> được Vite chuyển tiếp sang </w:t>
+      </w:r>
+      <w:r>
+        <w:rPr>
+          <w:rFonts w:ascii="Consolas" w:eastAsia="Consolas" w:hAnsi="Consolas" w:cs="Consolas"/>
+        </w:rPr>
+        <w:t xml:space="preserve">http://localhost:8080</w:t>
+      </w:r>
+      <w:r>
+        <w:t xml:space="preserve">; phần còn lại (</w:t>
+      </w:r>
+      <w:r>
+        <w:rPr>
+          <w:rFonts w:ascii="Consolas" w:eastAsia="Consolas" w:hAnsi="Consolas" w:cs="Consolas"/>
+        </w:rPr>
+        <w:t xml:space="preserve">/</w:t>
+      </w:r>
+      <w:r>
+        <w:t xml:space="preserve">, </w:t>
+      </w:r>
+      <w:r>
+        <w:rPr>
+          <w:rFonts w:ascii="Consolas" w:eastAsia="Consolas" w:hAnsi="Consolas" w:cs="Consolas"/>
+        </w:rPr>
+        <w:t xml:space="preserve">/accounts</w:t>
+      </w:r>
+      <w:r>
+        <w:t xml:space="preserve">, file </w:t>
+      </w:r>
+      <w:r>
+        <w:rPr>
+          <w:rFonts w:ascii="Consolas" w:eastAsia="Consolas" w:hAnsi="Consolas" w:cs="Consolas"/>
+        </w:rPr>
+        <w:t xml:space="preserve">.tsx</w:t>
+      </w:r>
+      <w:r>
+        <w:t xml:space="preserve">) do Vite tự trả.</w:t>
+      </w:r>
+    </w:p>
+    <w:p>
+      <w:pPr>
+        <w:pStyle w:val="ListParagraph"/>
+        <w:numPr>
+          <w:ilvl w:val="0"/>
+          <w:numId w:val="1"/>
+        </w:numPr>
+      </w:pPr>
+      <w:r>
+        <w:rPr>
+          <w:b/>
+          <w:bCs/>
+        </w:rPr>
+        <w:t xml:space="preserve">Vì sao khóa là </w:t>
+      </w:r>
+      <w:r>
+        <w:rPr>
+          <w:rFonts w:ascii="Consolas" w:eastAsia="Consolas" w:hAnsi="Consolas" w:cs="Consolas"/>
+          <w:b/>
+          <w:bCs/>
+        </w:rPr>
+        <w:t xml:space="preserve">/api/</w:t>
+      </w:r>
+      <w:r>
+        <w:rPr>
+          <w:b/>
+          <w:bCs/>
+        </w:rPr>
+        <w:t xml:space="preserve"> có dấu </w:t>
+      </w:r>
+      <w:r>
+        <w:rPr>
+          <w:rFonts w:ascii="Consolas" w:eastAsia="Consolas" w:hAnsi="Consolas" w:cs="Consolas"/>
+          <w:b/>
+          <w:bCs/>
+        </w:rPr>
+        <w:t xml:space="preserve">/</w:t>
+      </w:r>
+      <w:r>
+        <w:rPr>
+          <w:b/>
+          <w:bCs/>
+        </w:rPr>
+        <w:t xml:space="preserve"> ở cuối:</w:t>
+      </w:r>
+      <w:r>
+        <w:t xml:space="preserve"> Vite so khớp theo </w:t>
+      </w:r>
+      <w:r>
+        <w:rPr>
+          <w:b/>
+          <w:bCs/>
+        </w:rPr>
+        <w:t xml:space="preserve">tiền tố</w:t>
+      </w:r>
+      <w:r>
+        <w:t xml:space="preserve"> (</w:t>
+      </w:r>
+      <w:r>
+        <w:rPr>
+          <w:rFonts w:ascii="Consolas" w:eastAsia="Consolas" w:hAnsi="Consolas" w:cs="Consolas"/>
+        </w:rPr>
+        <w:t xml:space="preserve">startsWith</w:t>
+      </w:r>
+      <w:r>
+        <w:t xml:space="preserve">). Với khóa </w:t>
+      </w:r>
+      <w:r>
+        <w:rPr>
+          <w:rFonts w:ascii="Consolas" w:eastAsia="Consolas" w:hAnsi="Consolas" w:cs="Consolas"/>
+        </w:rPr>
+        <w:t xml:space="preserve">/api</w:t>
+      </w:r>
+      <w:r>
+        <w:t xml:space="preserve">, một trang web tên </w:t>
+      </w:r>
+      <w:r>
+        <w:rPr>
+          <w:rFonts w:ascii="Consolas" w:eastAsia="Consolas" w:hAnsi="Consolas" w:cs="Consolas"/>
+        </w:rPr>
+        <w:t xml:space="preserve">/apis</w:t>
+      </w:r>
+      <w:r>
+        <w:t xml:space="preserve"> hay </w:t>
+      </w:r>
+      <w:r>
+        <w:rPr>
+          <w:rFonts w:ascii="Consolas" w:eastAsia="Consolas" w:hAnsi="Consolas" w:cs="Consolas"/>
+        </w:rPr>
+        <w:t xml:space="preserve">/api-keys</w:t>
+      </w:r>
+      <w:r>
+        <w:t xml:space="preserve"> cũng bị đẩy sang backend. Đã kiểm: </w:t>
+      </w:r>
+      <w:r>
+        <w:rPr>
+          <w:rFonts w:ascii="Consolas" w:eastAsia="Consolas" w:hAnsi="Consolas" w:cs="Consolas"/>
+        </w:rPr>
+        <w:t xml:space="preserve">/apis</w:t>
+      </w:r>
+      <w:r>
+        <w:t xml:space="preserve"> và </w:t>
+      </w:r>
+      <w:r>
+        <w:rPr>
+          <w:rFonts w:ascii="Consolas" w:eastAsia="Consolas" w:hAnsi="Consolas" w:cs="Consolas"/>
+        </w:rPr>
+        <w:t xml:space="preserve">/api-keys</w:t>
+      </w:r>
+      <w:r>
+        <w:t xml:space="preserve"> vẫn do Vite trả.</w:t>
+      </w:r>
+    </w:p>
+    <w:p>
+      <w:pPr>
+        <w:pStyle w:val="ListParagraph"/>
+        <w:numPr>
+          <w:ilvl w:val="0"/>
+          <w:numId w:val="1"/>
+        </w:numPr>
+      </w:pPr>
+      <w:r>
+        <w:rPr>
+          <w:b/>
+          <w:bCs/>
+        </w:rPr>
+        <w:t xml:space="preserve">Vì sao proxy thay vì bật CORS ở Spring (D-36):</w:t>
+      </w:r>
+      <w:r>
+        <w:t xml:space="preserve"> trình duyệt coi </w:t>
+      </w:r>
+      <w:r>
+        <w:rPr>
+          <w:rFonts w:ascii="Consolas" w:eastAsia="Consolas" w:hAnsi="Consolas" w:cs="Consolas"/>
+        </w:rPr>
+        <w:t xml:space="preserve">localhost:5173</w:t>
+      </w:r>
+      <w:r>
+        <w:t xml:space="preserve"> và </w:t>
+      </w:r>
+      <w:r>
+        <w:rPr>
+          <w:rFonts w:ascii="Consolas" w:eastAsia="Consolas" w:hAnsi="Consolas" w:cs="Consolas"/>
+        </w:rPr>
+        <w:t xml:space="preserve">localhost:8080</w:t>
+      </w:r>
+      <w:r>
+        <w:t xml:space="preserve"> là </w:t>
+      </w:r>
+      <w:r>
+        <w:rPr>
+          <w:b/>
+          <w:bCs/>
+        </w:rPr>
+        <w:t xml:space="preserve">hai origin khác nhau</w:t>
+      </w:r>
+      <w:r>
+        <w:t xml:space="preserve"> (khác cổng là khác origin). Gọi thẳng sang 8080 thì phải bật CORS có cookie, cookie phải </w:t>
+      </w:r>
+      <w:r>
+        <w:rPr>
+          <w:rFonts w:ascii="Consolas" w:eastAsia="Consolas" w:hAnsi="Consolas" w:cs="Consolas"/>
+        </w:rPr>
+        <w:t xml:space="preserve">SameSite=None; Secure</w:t>
+      </w:r>
+      <w:r>
+        <w:t xml:space="preserve">, tức phải chạy HTTPS cả khi dev, thêm nhiều cấu hình dễ sai. Có proxy thì trình duyệt chỉ thấy một origin: cookie </w:t>
+      </w:r>
+      <w:r>
+        <w:rPr>
+          <w:rFonts w:ascii="Consolas" w:eastAsia="Consolas" w:hAnsi="Consolas" w:cs="Consolas"/>
+        </w:rPr>
+        <w:t xml:space="preserve">SameSite=Lax</w:t>
+      </w:r>
+      <w:r>
+        <w:t xml:space="preserve"> chạy tự nhiên, không cần CORS. Khi deploy (F12), web và API cũng sẽ nằm sau một origin.</w:t>
+      </w:r>
+    </w:p>
+    <w:p>
+      <w:pPr>
+        <w:pStyle w:val="ListParagraph"/>
+        <w:numPr>
+          <w:ilvl w:val="0"/>
+          <w:numId w:val="1"/>
+        </w:numPr>
+      </w:pPr>
+      <w:r>
+        <w:rPr>
+          <w:b/>
+          <w:bCs/>
+        </w:rPr>
+        <w:t xml:space="preserve">Đã kiểm thế nào:</w:t>
+      </w:r>
+      <w:r>
+        <w:t xml:space="preserve"> dựng một "backend giả" ở cổng 8080, gọi </w:t>
+      </w:r>
+      <w:r>
+        <w:rPr>
+          <w:rFonts w:ascii="Consolas" w:eastAsia="Consolas" w:hAnsi="Consolas" w:cs="Consolas"/>
+        </w:rPr>
+        <w:t xml:space="preserve">http://localhost:5173/api/auth/me</w:t>
+      </w:r>
+      <w:r>
+        <w:t xml:space="preserve"> thì backend giả nhận được request và cookie </w:t>
+      </w:r>
+      <w:r>
+        <w:rPr>
+          <w:rFonts w:ascii="Consolas" w:eastAsia="Consolas" w:hAnsi="Consolas" w:cs="Consolas"/>
+        </w:rPr>
+        <w:t xml:space="preserve">XSRF-TOKEN</w:t>
+      </w:r>
+      <w:r>
+        <w:t xml:space="preserve"> nó gửi về đi qua nguyên vẹn; còn </w:t>
+      </w:r>
+      <w:r>
+        <w:rPr>
+          <w:rFonts w:ascii="Consolas" w:eastAsia="Consolas" w:hAnsi="Consolas" w:cs="Consolas"/>
+        </w:rPr>
+        <w:t xml:space="preserve">/accounts</w:t>
+      </w:r>
+      <w:r>
+        <w:t xml:space="preserve"> vẫn do Vite trả </w:t>
+      </w:r>
+      <w:r>
+        <w:rPr>
+          <w:rFonts w:ascii="Consolas" w:eastAsia="Consolas" w:hAnsi="Consolas" w:cs="Consolas"/>
+        </w:rPr>
+        <w:t xml:space="preserve">index.html</w:t>
+      </w:r>
+      <w:r>
+        <w:t xml:space="preserve">.</w:t>
+      </w:r>
+    </w:p>
+    <w:p>
+      <w:pPr>
+        <w:pStyle w:val="ListParagraph"/>
+        <w:numPr>
+          <w:ilvl w:val="0"/>
+          <w:numId w:val="1"/>
+        </w:numPr>
+      </w:pPr>
+      <w:r>
+        <w:rPr>
+          <w:b/>
+          <w:bCs/>
+        </w:rPr>
+        <w:t xml:space="preserve">Bẫy:</w:t>
+      </w:r>
+      <w:r>
+        <w:t xml:space="preserve"> backend chưa chạy thì </w:t>
+      </w:r>
+      <w:r>
+        <w:rPr>
+          <w:rFonts w:ascii="Consolas" w:eastAsia="Consolas" w:hAnsi="Consolas" w:cs="Consolas"/>
+        </w:rPr>
+        <w:t xml:space="preserve">/api/...</w:t>
+      </w:r>
+      <w:r>
+        <w:t xml:space="preserve"> trả </w:t>
+      </w:r>
+      <w:r>
+        <w:rPr>
+          <w:rFonts w:ascii="Consolas" w:eastAsia="Consolas" w:hAnsi="Consolas" w:cs="Consolas"/>
+        </w:rPr>
+        <w:t xml:space="preserve">502</w:t>
+      </w:r>
+      <w:r>
+        <w:t xml:space="preserve"> rỗng, log Vite ghi </w:t>
+      </w:r>
+      <w:r>
+        <w:rPr>
+          <w:rFonts w:ascii="Consolas" w:eastAsia="Consolas" w:hAnsi="Consolas" w:cs="Consolas"/>
+        </w:rPr>
+        <w:t xml:space="preserve">http proxy error ... ECONNREFUSED</w:t>
+      </w:r>
+      <w:r>
+        <w:t xml:space="preserve">. </w:t>
+      </w:r>
+      <w:r>
+        <w:rPr>
+          <w:rFonts w:ascii="Consolas" w:eastAsia="Consolas" w:hAnsi="Consolas" w:cs="Consolas"/>
+        </w:rPr>
+        <w:t xml:space="preserve">pnpm preview</w:t>
+      </w:r>
+      <w:r>
+        <w:t xml:space="preserve"> (chạy bản build) </w:t>
+      </w:r>
+      <w:r>
+        <w:rPr>
+          <w:b/>
+          <w:bCs/>
+        </w:rPr>
+        <w:t xml:space="preserve">không</w:t>
+      </w:r>
+      <w:r>
+        <w:t xml:space="preserve"> có proxy.</w:t>
+      </w:r>
+    </w:p>
+    <w:p>
+      <w:pPr>
+        <w:pStyle w:val="Heading3"/>
+      </w:pPr>
+      <w:r>
+        <w:t xml:space="preserve">4.3 TypeScript: alias </w:t>
+      </w:r>
+      <w:r>
+        <w:rPr>
+          <w:rFonts w:ascii="Consolas" w:eastAsia="Consolas" w:hAnsi="Consolas" w:cs="Consolas"/>
+        </w:rPr>
+        <w:t xml:space="preserve">@/</w:t>
+      </w:r>
+      <w:r>
+        <w:t xml:space="preserve"> và kiểm kiểu khi build</w:t>
+      </w:r>
+    </w:p>
+    <w:p>
+      <w:pPr>
+        <w:pStyle w:val="ListParagraph"/>
+        <w:numPr>
+          <w:ilvl w:val="0"/>
+          <w:numId w:val="1"/>
+        </w:numPr>
+      </w:pPr>
+      <w:r>
+        <w:rPr>
+          <w:b/>
+          <w:bCs/>
+        </w:rPr>
+        <w:t xml:space="preserve">Ở đâu:</w:t>
+      </w:r>
+      <w:r>
+        <w:t xml:space="preserve"> </w:t>
+      </w:r>
+      <w:r>
+        <w:rPr>
+          <w:rFonts w:ascii="Consolas" w:eastAsia="Consolas" w:hAnsi="Consolas" w:cs="Consolas"/>
+        </w:rPr>
+        <w:t xml:space="preserve">tsconfig.json</w:t>
+      </w:r>
+      <w:r>
+        <w:t xml:space="preserve">, </w:t>
+      </w:r>
+      <w:r>
+        <w:rPr>
+          <w:rFonts w:ascii="Consolas" w:eastAsia="Consolas" w:hAnsi="Consolas" w:cs="Consolas"/>
+        </w:rPr>
+        <w:t xml:space="preserve">tsconfig.app.json</w:t>
+      </w:r>
+      <w:r>
+        <w:t xml:space="preserve"> (</w:t>
+      </w:r>
+      <w:r>
+        <w:rPr>
+          <w:rFonts w:ascii="Consolas" w:eastAsia="Consolas" w:hAnsi="Consolas" w:cs="Consolas"/>
+        </w:rPr>
+        <w:t xml:space="preserve">paths</w:t>
+      </w:r>
+      <w:r>
+        <w:t xml:space="preserve">), </w:t>
+      </w:r>
+      <w:r>
+        <w:rPr>
+          <w:rFonts w:ascii="Consolas" w:eastAsia="Consolas" w:hAnsi="Consolas" w:cs="Consolas"/>
+        </w:rPr>
+        <w:t xml:space="preserve">vite.config.ts</w:t>
+      </w:r>
+      <w:r>
+        <w:t xml:space="preserve"> (</w:t>
+      </w:r>
+      <w:r>
+        <w:rPr>
+          <w:rFonts w:ascii="Consolas" w:eastAsia="Consolas" w:hAnsi="Consolas" w:cs="Consolas"/>
+        </w:rPr>
+        <w:t xml:space="preserve">resolve.alias</w:t>
+      </w:r>
+      <w:r>
+        <w:t xml:space="preserve">).</w:t>
+      </w:r>
+    </w:p>
+    <w:p>
+      <w:pPr>
+        <w:pStyle w:val="ListParagraph"/>
+        <w:numPr>
+          <w:ilvl w:val="0"/>
+          <w:numId w:val="1"/>
+        </w:numPr>
+      </w:pPr>
+      <w:r>
+        <w:rPr>
+          <w:b/>
+          <w:bCs/>
+        </w:rPr>
+        <w:t xml:space="preserve">Là gì:</w:t>
+      </w:r>
+      <w:r>
+        <w:t xml:space="preserve"> </w:t>
+      </w:r>
+      <w:r>
+        <w:rPr>
+          <w:rFonts w:ascii="Consolas" w:eastAsia="Consolas" w:hAnsi="Consolas" w:cs="Consolas"/>
+        </w:rPr>
+        <w:t xml:space="preserve">import { Button } from '@/shared/ui/button'</w:t>
+      </w:r>
+      <w:r>
+        <w:t xml:space="preserve"> thay cho </w:t>
+      </w:r>
+      <w:r>
+        <w:rPr>
+          <w:rFonts w:ascii="Consolas" w:eastAsia="Consolas" w:hAnsi="Consolas" w:cs="Consolas"/>
+        </w:rPr>
+        <w:t xml:space="preserve">'../../shared/ui/button'</w:t>
+      </w:r>
+      <w:r>
+        <w:t xml:space="preserve">. Phải khai ở </w:t>
+      </w:r>
+      <w:r>
+        <w:rPr>
+          <w:b/>
+          <w:bCs/>
+        </w:rPr>
+        <w:t xml:space="preserve">hai</w:t>
+      </w:r>
+      <w:r>
+        <w:t xml:space="preserve"> nơi: </w:t>
+      </w:r>
+      <w:r>
+        <w:rPr>
+          <w:rFonts w:ascii="Consolas" w:eastAsia="Consolas" w:hAnsi="Consolas" w:cs="Consolas"/>
+        </w:rPr>
+        <w:t xml:space="preserve">tsconfig</w:t>
+      </w:r>
+      <w:r>
+        <w:t xml:space="preserve"> để TypeScript hiểu khi kiểm kiểu, </w:t>
+      </w:r>
+      <w:r>
+        <w:rPr>
+          <w:rFonts w:ascii="Consolas" w:eastAsia="Consolas" w:hAnsi="Consolas" w:cs="Consolas"/>
+        </w:rPr>
+        <w:t xml:space="preserve">vite.config.ts</w:t>
+      </w:r>
+      <w:r>
+        <w:t xml:space="preserve"> để Vite tìm được file khi chạy và build.</w:t>
+      </w:r>
+    </w:p>
+    <w:p>
+      <w:pPr>
+        <w:pStyle w:val="ListParagraph"/>
+        <w:numPr>
+          <w:ilvl w:val="0"/>
+          <w:numId w:val="1"/>
+        </w:numPr>
+      </w:pPr>
+      <w:r>
+        <w:rPr>
+          <w:b/>
+          <w:bCs/>
+        </w:rPr>
+        <w:t xml:space="preserve">Bẫy:</w:t>
+      </w:r>
+      <w:r>
+        <w:t xml:space="preserve"> TypeScript 6 đánh dấu </w:t>
+      </w:r>
+      <w:r>
+        <w:rPr>
+          <w:rFonts w:ascii="Consolas" w:eastAsia="Consolas" w:hAnsi="Consolas" w:cs="Consolas"/>
+        </w:rPr>
+        <w:t xml:space="preserve">baseUrl</w:t>
+      </w:r>
+      <w:r>
+        <w:t xml:space="preserve"> là lỗi thời, nên chỉ dùng </w:t>
+      </w:r>
+      <w:r>
+        <w:rPr>
+          <w:rFonts w:ascii="Consolas" w:eastAsia="Consolas" w:hAnsi="Consolas" w:cs="Consolas"/>
+        </w:rPr>
+        <w:t xml:space="preserve">paths</w:t>
+      </w:r>
+      <w:r>
+        <w:t xml:space="preserve"> với đường dẫn tương đối (</w:t>
+      </w:r>
+      <w:r>
+        <w:rPr>
+          <w:rFonts w:ascii="Consolas" w:eastAsia="Consolas" w:hAnsi="Consolas" w:cs="Consolas"/>
+        </w:rPr>
+        <w:t xml:space="preserve">./src/*</w:t>
+      </w:r>
+      <w:r>
+        <w:t xml:space="preserve">). </w:t>
+      </w:r>
+      <w:r>
+        <w:rPr>
+          <w:rFonts w:ascii="Consolas" w:eastAsia="Consolas" w:hAnsi="Consolas" w:cs="Consolas"/>
+        </w:rPr>
+        <w:t xml:space="preserve">pnpm build</w:t>
+      </w:r>
+      <w:r>
+        <w:t xml:space="preserve"> chạy </w:t>
+      </w:r>
+      <w:r>
+        <w:rPr>
+          <w:rFonts w:ascii="Consolas" w:eastAsia="Consolas" w:hAnsi="Consolas" w:cs="Consolas"/>
+        </w:rPr>
+        <w:t xml:space="preserve">tsc -b</w:t>
+      </w:r>
+      <w:r>
+        <w:t xml:space="preserve"> trước </w:t>
+      </w:r>
+      <w:r>
+        <w:rPr>
+          <w:rFonts w:ascii="Consolas" w:eastAsia="Consolas" w:hAnsi="Consolas" w:cs="Consolas"/>
+        </w:rPr>
+        <w:t xml:space="preserve">vite build</w:t>
+      </w:r>
+      <w:r>
+        <w:t xml:space="preserve">: Vite tự nó </w:t>
+      </w:r>
+      <w:r>
+        <w:rPr>
+          <w:b/>
+          <w:bCs/>
+        </w:rPr>
+        <w:t xml:space="preserve">không</w:t>
+      </w:r>
+      <w:r>
+        <w:t xml:space="preserve"> kiểm kiểu (chỉ bỏ phần kiểu đi cho nhanh), nên thiếu bước </w:t>
+      </w:r>
+      <w:r>
+        <w:rPr>
+          <w:rFonts w:ascii="Consolas" w:eastAsia="Consolas" w:hAnsi="Consolas" w:cs="Consolas"/>
+        </w:rPr>
+        <w:t xml:space="preserve">tsc</w:t>
+      </w:r>
+      <w:r>
+        <w:t xml:space="preserve"> thì lỗi kiểu vẫn lọt vào bản build.</w:t>
+      </w:r>
+    </w:p>
+    <w:p>
+      <w:pPr>
+        <w:pStyle w:val="Heading3"/>
+      </w:pPr>
+      <w:r>
+        <w:t xml:space="preserve">4.4 Tailwind CSS và design token từ canvas</w:t>
+      </w:r>
+    </w:p>
+    <w:p>
+      <w:pPr>
+        <w:pStyle w:val="ListParagraph"/>
+        <w:numPr>
+          <w:ilvl w:val="0"/>
+          <w:numId w:val="1"/>
+        </w:numPr>
+      </w:pPr>
+      <w:r>
+        <w:rPr>
+          <w:b/>
+          <w:bCs/>
+        </w:rPr>
+        <w:t xml:space="preserve">Ở đâu:</w:t>
+      </w:r>
+      <w:r>
+        <w:t xml:space="preserve"> </w:t>
+      </w:r>
+      <w:r>
+        <w:rPr>
+          <w:rFonts w:ascii="Consolas" w:eastAsia="Consolas" w:hAnsi="Consolas" w:cs="Consolas"/>
+        </w:rPr>
+        <w:t xml:space="preserve">src/index.css</w:t>
+      </w:r>
+      <w:r>
+        <w:t xml:space="preserve">.</w:t>
+      </w:r>
+    </w:p>
+    <w:p>
+      <w:pPr>
+        <w:pStyle w:val="ListParagraph"/>
+        <w:numPr>
+          <w:ilvl w:val="0"/>
+          <w:numId w:val="1"/>
+        </w:numPr>
+      </w:pPr>
+      <w:r>
+        <w:rPr>
+          <w:b/>
+          <w:bCs/>
+        </w:rPr>
+        <w:t xml:space="preserve">Tailwind là gì:</w:t>
+      </w:r>
+      <w:r>
+        <w:t xml:space="preserve"> thay vì viết file CSS riêng, ta ghép các class nhỏ ngay trong JSX: </w:t>
+      </w:r>
+      <w:r>
+        <w:rPr>
+          <w:rFonts w:ascii="Consolas" w:eastAsia="Consolas" w:hAnsi="Consolas" w:cs="Consolas"/>
+        </w:rPr>
+        <w:t xml:space="preserve">h-11 rounded-sm bg-primary px-4.5 text-sm font-semibold</w:t>
+      </w:r>
+      <w:r>
+        <w:t xml:space="preserve">. Khi build, Tailwind quét code và chỉ sinh CSS cho các class thật sự được dùng.</w:t>
+      </w:r>
+    </w:p>
+    <w:p>
+      <w:pPr>
+        <w:pStyle w:val="ListParagraph"/>
+        <w:numPr>
+          <w:ilvl w:val="0"/>
+          <w:numId w:val="1"/>
+        </w:numPr>
+      </w:pPr>
+      <w:r>
+        <w:rPr>
+          <w:b/>
+          <w:bCs/>
+        </w:rPr>
+        <w:t xml:space="preserve">Design token là gì:</w:t>
+      </w:r>
+      <w:r>
+        <w:t xml:space="preserve"> tên vai trò của màu, font, bo góc ("nền", "chữ mờ", "nút chính") thay vì mã màu cụ thể. Đổi theme chỉ là đổi giá trị của token, không phải sửa từng component.</w:t>
+      </w:r>
+    </w:p>
+    <w:p>
+      <w:pPr>
+        <w:pStyle w:val="ListParagraph"/>
+        <w:numPr>
+          <w:ilvl w:val="0"/>
+          <w:numId w:val="1"/>
+        </w:numPr>
+      </w:pPr>
+      <w:r>
+        <w:rPr>
+          <w:b/>
+          <w:bCs/>
+        </w:rPr>
+        <w:t xml:space="preserve">Hai lớp:</w:t>
+      </w:r>
+    </w:p>
+    <w:p>
+      <w:pPr>
+        <w:shd w:val="clear" w:color="auto" w:fill="F2F3F5"/>
+        <w:ind w:left="0"/>
+      </w:pPr>
+      <w:r>
+        <w:rPr>
+          <w:rFonts w:ascii="Consolas" w:eastAsia="Consolas" w:hAnsi="Consolas" w:cs="Consolas"/>
+          <w:sz w:val="19"/>
+          <w:szCs w:val="19"/>
+        </w:rPr>
+        <w:t xml:space="preserve">Lớp 1: biến CSS chép NGUYÊN từ canvas (design/sino-ui/project/sino.css)</w:t>
+        <w:br/>
+        <w:t xml:space="preserve">  :root, .theme-light   { --bg: #F2F2EF; --text: #111111; --inverse: #111111; ... }</w:t>
+        <w:br/>
+        <w:t xml:space="preserve">  .theme-dark           { --bg: #070707; --text: #F7F7F4; --inverse: #F7F7F4; ... }</w:t>
+        <w:br/>
+        <w:br/>
+        <w:t xml:space="preserve">Lớp 2: @theme inline nối biến đó sang tên class của Tailwind</w:t>
+        <w:br/>
+        <w:t xml:space="preserve">  --color-background: var(--bg)        -&gt; class bg-background</w:t>
+        <w:br/>
+        <w:t xml:space="preserve">  --color-primary:    var(--inverse)   -&gt; class bg-primary, text-primary</w:t>
+        <w:br/>
+        <w:t xml:space="preserve">  --radius-sm:        10px             -&gt; class rounded-sm</w:t>
+      </w:r>
+    </w:p>
+    <w:p>
+      <w:pPr>
+        <w:pStyle w:val="ListParagraph"/>
+        <w:numPr>
+          <w:ilvl w:val="0"/>
+          <w:numId w:val="1"/>
+        </w:numPr>
+      </w:pPr>
+      <w:r>
+        <w:rPr>
+          <w:b/>
+          <w:bCs/>
+        </w:rPr>
+        <w:t xml:space="preserve">Vì sao hai lớp:</w:t>
+      </w:r>
+      <w:r>
+        <w:t xml:space="preserve"> lớp 1 giữ đúng tên của canvas nên đối chiếu được với thiết kế từng dòng; lớp 2 cho component dùng tên quen của Tailwind/shadcn (</w:t>
+      </w:r>
+      <w:r>
+        <w:rPr>
+          <w:rFonts w:ascii="Consolas" w:eastAsia="Consolas" w:hAnsi="Consolas" w:cs="Consolas"/>
+        </w:rPr>
+        <w:t xml:space="preserve">bg-primary</w:t>
+      </w:r>
+      <w:r>
+        <w:t xml:space="preserve">, </w:t>
+      </w:r>
+      <w:r>
+        <w:rPr>
+          <w:rFonts w:ascii="Consolas" w:eastAsia="Consolas" w:hAnsi="Consolas" w:cs="Consolas"/>
+        </w:rPr>
+        <w:t xml:space="preserve">text-muted-foreground</w:t>
+      </w:r>
+      <w:r>
+        <w:t xml:space="preserve">). Thêm component shadcn mới thì nó tự ăn màu canvas.</w:t>
+      </w:r>
+    </w:p>
+    <w:p>
+      <w:pPr>
+        <w:pStyle w:val="ListParagraph"/>
+        <w:numPr>
+          <w:ilvl w:val="0"/>
+          <w:numId w:val="1"/>
+        </w:numPr>
+      </w:pPr>
+      <w:r>
+        <w:rPr>
+          <w:rFonts w:ascii="Consolas" w:eastAsia="Consolas" w:hAnsi="Consolas" w:cs="Consolas"/>
+          <w:b/>
+          <w:bCs/>
+        </w:rPr>
+        <w:t xml:space="preserve">inline</w:t>
+      </w:r>
+      <w:r>
+        <w:rPr>
+          <w:b/>
+          <w:bCs/>
+        </w:rPr>
+        <w:t xml:space="preserve"> để làm gì:</w:t>
+      </w:r>
+      <w:r>
+        <w:t xml:space="preserve"> class sinh ra trỏ thẳng tới </w:t>
+      </w:r>
+      <w:r>
+        <w:rPr>
+          <w:rFonts w:ascii="Consolas" w:eastAsia="Consolas" w:hAnsi="Consolas" w:cs="Consolas"/>
+        </w:rPr>
+        <w:t xml:space="preserve">var(--inverse)</w:t>
+      </w:r>
+      <w:r>
+        <w:t xml:space="preserve">, nên khi </w:t>
+      </w:r>
+      <w:r>
+        <w:rPr>
+          <w:rFonts w:ascii="Consolas" w:eastAsia="Consolas" w:hAnsi="Consolas" w:cs="Consolas"/>
+        </w:rPr>
+        <w:t xml:space="preserve">&lt;html&gt;</w:t>
+      </w:r>
+      <w:r>
+        <w:t xml:space="preserve"> đổi từ </w:t>
+      </w:r>
+      <w:r>
+        <w:rPr>
+          <w:rFonts w:ascii="Consolas" w:eastAsia="Consolas" w:hAnsi="Consolas" w:cs="Consolas"/>
+        </w:rPr>
+        <w:t xml:space="preserve">theme-light</w:t>
+      </w:r>
+      <w:r>
+        <w:t xml:space="preserve"> sang </w:t>
+      </w:r>
+      <w:r>
+        <w:rPr>
+          <w:rFonts w:ascii="Consolas" w:eastAsia="Consolas" w:hAnsi="Consolas" w:cs="Consolas"/>
+        </w:rPr>
+        <w:t xml:space="preserve">theme-dark</w:t>
+      </w:r>
+      <w:r>
+        <w:t xml:space="preserve">, giá trị đổi ngay mà không cần sinh lại CSS.</w:t>
+      </w:r>
+    </w:p>
+    <w:p>
+      <w:pPr>
+        <w:pStyle w:val="ListParagraph"/>
+        <w:numPr>
+          <w:ilvl w:val="0"/>
+          <w:numId w:val="1"/>
+        </w:numPr>
+      </w:pPr>
+      <w:r>
+        <w:rPr>
+          <w:b/>
+          <w:bCs/>
+        </w:rPr>
+        <w:t xml:space="preserve">Bẫy:</w:t>
+      </w:r>
+      <w:r>
+        <w:t xml:space="preserve"> bo góc của Tailwind mặc định khác canvas (</w:t>
+      </w:r>
+      <w:r>
+        <w:rPr>
+          <w:rFonts w:ascii="Consolas" w:eastAsia="Consolas" w:hAnsi="Consolas" w:cs="Consolas"/>
+        </w:rPr>
+        <w:t xml:space="preserve">rounded-sm</w:t>
+      </w:r>
+      <w:r>
+        <w:t xml:space="preserve"> mặc định là 4px); ở đây đã ghi đè thành thang của canvas (6 / 10 / 14 / 20px). Các góc 8px và 12px của canvas viết là </w:t>
+      </w:r>
+      <w:r>
+        <w:rPr>
+          <w:rFonts w:ascii="Consolas" w:eastAsia="Consolas" w:hAnsi="Consolas" w:cs="Consolas"/>
+        </w:rPr>
+        <w:t xml:space="preserve">rounded-[8px]</w:t>
+      </w:r>
+      <w:r>
+        <w:t xml:space="preserve"> và </w:t>
+      </w:r>
+      <w:r>
+        <w:rPr>
+          <w:rFonts w:ascii="Consolas" w:eastAsia="Consolas" w:hAnsi="Consolas" w:cs="Consolas"/>
+        </w:rPr>
+        <w:t xml:space="preserve">rounded-xl</w:t>
+      </w:r>
+      <w:r>
+        <w:t xml:space="preserve">.</w:t>
+      </w:r>
+    </w:p>
+    <w:p>
+      <w:pPr>
+        <w:pStyle w:val="Heading3"/>
+      </w:pPr>
+      <w:r>
+        <w:t xml:space="preserve">4.5 Giao diện sáng/tối</w:t>
+      </w:r>
+    </w:p>
+    <w:p>
+      <w:pPr>
+        <w:pStyle w:val="ListParagraph"/>
+        <w:numPr>
+          <w:ilvl w:val="0"/>
+          <w:numId w:val="1"/>
+        </w:numPr>
+      </w:pPr>
+      <w:r>
+        <w:rPr>
+          <w:b/>
+          <w:bCs/>
+        </w:rPr>
+        <w:t xml:space="preserve">Ở đâu:</w:t>
+      </w:r>
+      <w:r>
+        <w:t xml:space="preserve"> </w:t>
+      </w:r>
+      <w:r>
+        <w:rPr>
+          <w:rFonts w:ascii="Consolas" w:eastAsia="Consolas" w:hAnsi="Consolas" w:cs="Consolas"/>
+        </w:rPr>
+        <w:t xml:space="preserve">src/shared/theme/theme.ts</w:t>
+      </w:r>
+      <w:r>
+        <w:t xml:space="preserve"> (đọc, lưu, áp theme), </w:t>
+      </w:r>
+      <w:r>
+        <w:rPr>
+          <w:rFonts w:ascii="Consolas" w:eastAsia="Consolas" w:hAnsi="Consolas" w:cs="Consolas"/>
+        </w:rPr>
+        <w:t xml:space="preserve">ThemeProvider.tsx</w:t>
+      </w:r>
+      <w:r>
+        <w:t xml:space="preserve">, </w:t>
+      </w:r>
+      <w:r>
+        <w:rPr>
+          <w:rFonts w:ascii="Consolas" w:eastAsia="Consolas" w:hAnsi="Consolas" w:cs="Consolas"/>
+        </w:rPr>
+        <w:t xml:space="preserve">themeContext.ts</w:t>
+      </w:r>
+      <w:r>
+        <w:t xml:space="preserve"> (</w:t>
+      </w:r>
+      <w:r>
+        <w:rPr>
+          <w:rFonts w:ascii="Consolas" w:eastAsia="Consolas" w:hAnsi="Consolas" w:cs="Consolas"/>
+        </w:rPr>
+        <w:t xml:space="preserve">useTheme</w:t>
+      </w:r>
+      <w:r>
+        <w:t xml:space="preserve">), </w:t>
+      </w:r>
+      <w:r>
+        <w:rPr>
+          <w:rFonts w:ascii="Consolas" w:eastAsia="Consolas" w:hAnsi="Consolas" w:cs="Consolas"/>
+        </w:rPr>
+        <w:t xml:space="preserve">ThemeToggle.tsx</w:t>
+      </w:r>
+      <w:r>
+        <w:t xml:space="preserve">.</w:t>
+      </w:r>
+    </w:p>
+    <w:p>
+      <w:pPr>
+        <w:shd w:val="clear" w:color="auto" w:fill="F2F3F5"/>
+        <w:ind w:left="0"/>
+      </w:pPr>
+      <w:r>
+        <w:rPr>
+          <w:rFonts w:ascii="Consolas" w:eastAsia="Consolas" w:hAnsi="Consolas" w:cs="Consolas"/>
+          <w:sz w:val="19"/>
+          <w:szCs w:val="19"/>
+        </w:rPr>
+        <w:t xml:space="preserve">mở trang</w:t>
+        <w:br/>
+        <w:t xml:space="preserve">  -&gt; có lựa chọn đã lưu ("light"/"dark") trong localStorage["sino.theme"]? -&gt; dùng nó</w:t>
+        <w:br/>
+        <w:t xml:space="preserve">  -&gt; không có, hoặc giá trị lạ ("blue")                                    -&gt; theo hệ điều hành</w:t>
+        <w:br/>
+        <w:t xml:space="preserve">                                                                               (prefers-color-scheme)</w:t>
+        <w:br/>
+        <w:t xml:space="preserve">  -&gt; đặt class theme-light hoặc theme-dark lên &lt;html&gt;</w:t>
+        <w:br/>
+        <w:t xml:space="preserve">bấm nút đổi theme</w:t>
+        <w:br/>
+        <w:t xml:space="preserve">  -&gt; lưu vào localStorage (lỗi thì bỏ qua) -&gt; đổi class trên &lt;html&gt;</w:t>
+      </w:r>
+    </w:p>
+    <w:p>
+      <w:pPr>
+        <w:pStyle w:val="ListParagraph"/>
+        <w:numPr>
+          <w:ilvl w:val="0"/>
+          <w:numId w:val="1"/>
+        </w:numPr>
+      </w:pPr>
+      <w:r>
+        <w:rPr>
+          <w:b/>
+          <w:bCs/>
+        </w:rPr>
+        <w:t xml:space="preserve">React Context:</w:t>
+      </w:r>
+      <w:r>
+        <w:t xml:space="preserve"> </w:t>
+      </w:r>
+      <w:r>
+        <w:rPr>
+          <w:rFonts w:ascii="Consolas" w:eastAsia="Consolas" w:hAnsi="Consolas" w:cs="Consolas"/>
+        </w:rPr>
+        <w:t xml:space="preserve">ThemeProvider</w:t>
+      </w:r>
+      <w:r>
+        <w:t xml:space="preserve"> giữ theme hiện tại trong state, và mọi component bên dưới đọc được qua </w:t>
+      </w:r>
+      <w:r>
+        <w:rPr>
+          <w:rFonts w:ascii="Consolas" w:eastAsia="Consolas" w:hAnsi="Consolas" w:cs="Consolas"/>
+        </w:rPr>
+        <w:t xml:space="preserve">useTheme()</w:t>
+      </w:r>
+      <w:r>
+        <w:t xml:space="preserve"> mà không phải truyền tay qua từng tầng. Gọi </w:t>
+      </w:r>
+      <w:r>
+        <w:rPr>
+          <w:rFonts w:ascii="Consolas" w:eastAsia="Consolas" w:hAnsi="Consolas" w:cs="Consolas"/>
+        </w:rPr>
+        <w:t xml:space="preserve">useTheme()</w:t>
+      </w:r>
+      <w:r>
+        <w:t xml:space="preserve"> ngoài provider thì báo lỗi ngay, để không âm thầm chạy sai.</w:t>
+      </w:r>
+    </w:p>
+    <w:p>
+      <w:pPr>
+        <w:pStyle w:val="ListParagraph"/>
+        <w:numPr>
+          <w:ilvl w:val="0"/>
+          <w:numId w:val="1"/>
+        </w:numPr>
+      </w:pPr>
+      <w:r>
+        <w:rPr>
+          <w:b/>
+          <w:bCs/>
+        </w:rPr>
+        <w:t xml:space="preserve">Vì sao bọc </w:t>
+      </w:r>
+      <w:r>
+        <w:rPr>
+          <w:rFonts w:ascii="Consolas" w:eastAsia="Consolas" w:hAnsi="Consolas" w:cs="Consolas"/>
+          <w:b/>
+          <w:bCs/>
+        </w:rPr>
+        <w:t xml:space="preserve">try/catch</w:t>
+      </w:r>
+      <w:r>
+        <w:rPr>
+          <w:b/>
+          <w:bCs/>
+        </w:rPr>
+        <w:t xml:space="preserve"> quanh </w:t>
+      </w:r>
+      <w:r>
+        <w:rPr>
+          <w:rFonts w:ascii="Consolas" w:eastAsia="Consolas" w:hAnsi="Consolas" w:cs="Consolas"/>
+          <w:b/>
+          <w:bCs/>
+        </w:rPr>
+        <w:t xml:space="preserve">localStorage</w:t>
+      </w:r>
+      <w:r>
+        <w:rPr>
+          <w:b/>
+          <w:bCs/>
+        </w:rPr>
+        <w:t xml:space="preserve">:</w:t>
+      </w:r>
+      <w:r>
+        <w:t xml:space="preserve"> cửa sổ ẩn danh của vài trình duyệt, hoặc khi người dùng chặn dữ liệu trang web, việc đọc/ghi </w:t>
+      </w:r>
+      <w:r>
+        <w:rPr>
+          <w:rFonts w:ascii="Consolas" w:eastAsia="Consolas" w:hAnsi="Consolas" w:cs="Consolas"/>
+        </w:rPr>
+        <w:t xml:space="preserve">localStorage</w:t>
+      </w:r>
+      <w:r>
+        <w:t xml:space="preserve"> </w:t>
+      </w:r>
+      <w:r>
+        <w:rPr>
+          <w:b/>
+          <w:bCs/>
+        </w:rPr>
+        <w:t xml:space="preserve">ném lỗi</w:t>
+      </w:r>
+      <w:r>
+        <w:t xml:space="preserve"> chứ không trả </w:t>
+      </w:r>
+      <w:r>
+        <w:rPr>
+          <w:rFonts w:ascii="Consolas" w:eastAsia="Consolas" w:hAnsi="Consolas" w:cs="Consolas"/>
+        </w:rPr>
+        <w:t xml:space="preserve">null</w:t>
+      </w:r>
+      <w:r>
+        <w:t xml:space="preserve">. Không bọc thì cả app trắng màn hình chỉ vì không nhớ được màu nền.</w:t>
+      </w:r>
+    </w:p>
+    <w:p>
+      <w:pPr>
+        <w:pStyle w:val="ListParagraph"/>
+        <w:numPr>
+          <w:ilvl w:val="0"/>
+          <w:numId w:val="1"/>
+        </w:numPr>
+      </w:pPr>
+      <w:r>
+        <w:rPr>
+          <w:b/>
+          <w:bCs/>
+        </w:rPr>
+        <w:t xml:space="preserve">Vì sao kiểm giá trị đọc ra:</w:t>
+      </w:r>
+      <w:r>
+        <w:t xml:space="preserve"> </w:t>
+      </w:r>
+      <w:r>
+        <w:rPr>
+          <w:rFonts w:ascii="Consolas" w:eastAsia="Consolas" w:hAnsi="Consolas" w:cs="Consolas"/>
+        </w:rPr>
+        <w:t xml:space="preserve">localStorage</w:t>
+      </w:r>
+      <w:r>
+        <w:t xml:space="preserve"> ai cũng sửa được (DevTools, phiên bản cũ của app). Chỉ nhận đúng </w:t>
+      </w:r>
+      <w:r>
+        <w:rPr>
+          <w:rFonts w:ascii="Consolas" w:eastAsia="Consolas" w:hAnsi="Consolas" w:cs="Consolas"/>
+        </w:rPr>
+        <w:t xml:space="preserve">"light"</w:t>
+      </w:r>
+      <w:r>
+        <w:t xml:space="preserve"> hoặc </w:t>
+      </w:r>
+      <w:r>
+        <w:rPr>
+          <w:rFonts w:ascii="Consolas" w:eastAsia="Consolas" w:hAnsi="Consolas" w:cs="Consolas"/>
+        </w:rPr>
+        <w:t xml:space="preserve">"dark"</w:t>
+      </w:r>
+      <w:r>
+        <w:t xml:space="preserve">, giá trị khác thì coi như chưa chọn.</w:t>
+      </w:r>
+    </w:p>
+    <w:p>
+      <w:pPr>
+        <w:pStyle w:val="ListParagraph"/>
+        <w:numPr>
+          <w:ilvl w:val="0"/>
+          <w:numId w:val="1"/>
+        </w:numPr>
+      </w:pPr>
+      <w:r>
+        <w:rPr>
+          <w:rFonts w:ascii="Consolas" w:eastAsia="Consolas" w:hAnsi="Consolas" w:cs="Consolas"/>
+          <w:b/>
+          <w:bCs/>
+        </w:rPr>
+        <w:t xml:space="preserve">useLayoutEffect</w:t>
+      </w:r>
+      <w:r>
+        <w:rPr>
+          <w:b/>
+          <w:bCs/>
+        </w:rPr>
+        <w:t xml:space="preserve"> thay vì </w:t>
+      </w:r>
+      <w:r>
+        <w:rPr>
+          <w:rFonts w:ascii="Consolas" w:eastAsia="Consolas" w:hAnsi="Consolas" w:cs="Consolas"/>
+          <w:b/>
+          <w:bCs/>
+        </w:rPr>
+        <w:t xml:space="preserve">useEffect</w:t>
+      </w:r>
+      <w:r>
+        <w:rPr>
+          <w:b/>
+          <w:bCs/>
+        </w:rPr>
+        <w:t xml:space="preserve">:</w:t>
+      </w:r>
+      <w:r>
+        <w:t xml:space="preserve"> </w:t>
+      </w:r>
+      <w:r>
+        <w:rPr>
+          <w:rFonts w:ascii="Consolas" w:eastAsia="Consolas" w:hAnsi="Consolas" w:cs="Consolas"/>
+        </w:rPr>
+        <w:t xml:space="preserve">useLayoutEffect</w:t>
+      </w:r>
+      <w:r>
+        <w:t xml:space="preserve"> chạy </w:t>
+      </w:r>
+      <w:r>
+        <w:rPr>
+          <w:b/>
+          <w:bCs/>
+        </w:rPr>
+        <w:t xml:space="preserve">trước</w:t>
+      </w:r>
+      <w:r>
+        <w:t xml:space="preserve"> khi trình duyệt vẽ khung hình đầu, nên trang không bị chớp màu sai khi React vừa hiện.</w:t>
+      </w:r>
+    </w:p>
+    <w:p>
+      <w:pPr>
+        <w:pStyle w:val="ListParagraph"/>
+        <w:numPr>
+          <w:ilvl w:val="0"/>
+          <w:numId w:val="1"/>
+        </w:numPr>
+      </w:pPr>
+      <w:r>
+        <w:rPr>
+          <w:b/>
+          <w:bCs/>
+        </w:rPr>
+        <w:t xml:space="preserve">Bẫy, chớp trắng trước khi JavaScript chạy:</w:t>
+      </w:r>
+      <w:r>
+        <w:t xml:space="preserve"> trước khi script chạy, </w:t>
+      </w:r>
+      <w:r>
+        <w:rPr>
+          <w:rFonts w:ascii="Consolas" w:eastAsia="Consolas" w:hAnsi="Consolas" w:cs="Consolas"/>
+        </w:rPr>
+        <w:t xml:space="preserve">&lt;html&gt;</w:t>
+      </w:r>
+      <w:r>
+        <w:t xml:space="preserve"> chưa có class theme nào, nên trang dùng màu sáng mặc định; người dùng hệ điều hành tối sẽ thấy chớp trắng. </w:t>
+      </w:r>
+      <w:r>
+        <w:rPr>
+          <w:rFonts w:ascii="Consolas" w:eastAsia="Consolas" w:hAnsi="Consolas" w:cs="Consolas"/>
+        </w:rPr>
+        <w:t xml:space="preserve">index.css</w:t>
+      </w:r>
+      <w:r>
+        <w:t xml:space="preserve"> có một luật nhỏ: hệ điều hành tối và </w:t>
+      </w:r>
+      <w:r>
+        <w:rPr>
+          <w:rFonts w:ascii="Consolas" w:eastAsia="Consolas" w:hAnsi="Consolas" w:cs="Consolas"/>
+        </w:rPr>
+        <w:t xml:space="preserve">&lt;html&gt;</w:t>
+      </w:r>
+      <w:r>
+        <w:t xml:space="preserve"> chưa có class thì nền tối. Còn lại một trường hợp: người dùng đã chọn ngược với hệ điều hành (ví dụ hệ điều hành sáng, chọn tối) thì </w:t>
+      </w:r>
+      <w:r>
+        <w:rPr>
+          <w:b/>
+          <w:bCs/>
+        </w:rPr>
+        <w:t xml:space="preserve">mỗi lần tải trang</w:t>
+      </w:r>
+      <w:r>
+        <w:t xml:space="preserve"> vẫn chớp màu của hệ điều hành trong lúc tải gói JavaScript. Cách bỏ hẳn là thêm một script inline nhỏ trong </w:t>
+      </w:r>
+      <w:r>
+        <w:rPr>
+          <w:rFonts w:ascii="Consolas" w:eastAsia="Consolas" w:hAnsi="Consolas" w:cs="Consolas"/>
+        </w:rPr>
+        <w:t xml:space="preserve">index.html</w:t>
+      </w:r>
+      <w:r>
+        <w:t xml:space="preserve"> đặt class trước khi trang hiện; đổi lại, logic đọc theme nằm ở hai nơi, và F12 phải cho phép script đó trong Content-Security-Policy (dùng mã băm </w:t>
+      </w:r>
+      <w:r>
+        <w:rPr>
+          <w:rFonts w:ascii="Consolas" w:eastAsia="Consolas" w:hAnsi="Consolas" w:cs="Consolas"/>
+        </w:rPr>
+        <w:t xml:space="preserve">sha256-...</w:t>
+      </w:r>
+      <w:r>
+        <w:t xml:space="preserve"> là được). Chưa làm, để người dùng quyết.</w:t>
+      </w:r>
+    </w:p>
+    <w:p>
+      <w:pPr>
+        <w:pStyle w:val="Heading3"/>
+      </w:pPr>
+      <w:r>
+        <w:t xml:space="preserve">4.6 shadcn/ui, Radix và </w:t>
+      </w:r>
+      <w:r>
+        <w:rPr>
+          <w:rFonts w:ascii="Consolas" w:eastAsia="Consolas" w:hAnsi="Consolas" w:cs="Consolas"/>
+        </w:rPr>
+        <w:t xml:space="preserve">cn</w:t>
+      </w:r>
+    </w:p>
+    <w:p>
+      <w:pPr>
+        <w:pStyle w:val="ListParagraph"/>
+        <w:numPr>
+          <w:ilvl w:val="0"/>
+          <w:numId w:val="1"/>
+        </w:numPr>
+      </w:pPr>
+      <w:r>
+        <w:rPr>
+          <w:b/>
+          <w:bCs/>
+        </w:rPr>
+        <w:t xml:space="preserve">Ở đâu:</w:t>
+      </w:r>
+      <w:r>
+        <w:t xml:space="preserve"> </w:t>
+      </w:r>
+      <w:r>
+        <w:rPr>
+          <w:rFonts w:ascii="Consolas" w:eastAsia="Consolas" w:hAnsi="Consolas" w:cs="Consolas"/>
+        </w:rPr>
+        <w:t xml:space="preserve">src/shared/ui/*.tsx</w:t>
+      </w:r>
+      <w:r>
+        <w:t xml:space="preserve">, </w:t>
+      </w:r>
+      <w:r>
+        <w:rPr>
+          <w:rFonts w:ascii="Consolas" w:eastAsia="Consolas" w:hAnsi="Consolas" w:cs="Consolas"/>
+        </w:rPr>
+        <w:t xml:space="preserve">components.json</w:t>
+      </w:r>
+      <w:r>
+        <w:t xml:space="preserve">.</w:t>
+      </w:r>
+    </w:p>
+    <w:p>
+      <w:pPr>
+        <w:pStyle w:val="ListParagraph"/>
+        <w:numPr>
+          <w:ilvl w:val="0"/>
+          <w:numId w:val="1"/>
+        </w:numPr>
+      </w:pPr>
+      <w:r>
+        <w:rPr>
+          <w:b/>
+          <w:bCs/>
+        </w:rPr>
+        <w:t xml:space="preserve">Là gì:</w:t>
+      </w:r>
+      <w:r>
+        <w:t xml:space="preserve"> shadcn không phải thư viện cài vào </w:t>
+      </w:r>
+      <w:r>
+        <w:rPr>
+          <w:rFonts w:ascii="Consolas" w:eastAsia="Consolas" w:hAnsi="Consolas" w:cs="Consolas"/>
+        </w:rPr>
+        <w:t xml:space="preserve">node_modules</w:t>
+      </w:r>
+      <w:r>
+        <w:t xml:space="preserve"> mà là một </w:t>
+      </w:r>
+      <w:r>
+        <w:rPr>
+          <w:b/>
+          <w:bCs/>
+        </w:rPr>
+        <w:t xml:space="preserve">công cụ chép code</w:t>
+      </w:r>
+      <w:r>
+        <w:t xml:space="preserve">: </w:t>
+      </w:r>
+      <w:r>
+        <w:rPr>
+          <w:rFonts w:ascii="Consolas" w:eastAsia="Consolas" w:hAnsi="Consolas" w:cs="Consolas"/>
+        </w:rPr>
+        <w:t xml:space="preserve">pnpm dlx shadcn@latest add button</w:t>
+      </w:r>
+      <w:r>
+        <w:t xml:space="preserve"> chép file </w:t>
+      </w:r>
+      <w:r>
+        <w:rPr>
+          <w:rFonts w:ascii="Consolas" w:eastAsia="Consolas" w:hAnsi="Consolas" w:cs="Consolas"/>
+        </w:rPr>
+        <w:t xml:space="preserve">button.tsx</w:t>
+      </w:r>
+      <w:r>
+        <w:t xml:space="preserve"> vào dự án, và từ đó nó là code của ta, sửa thoải mái. Bên trong dùng </w:t>
+      </w:r>
+      <w:r>
+        <w:rPr>
+          <w:b/>
+          <w:bCs/>
+        </w:rPr>
+        <w:t xml:space="preserve">Radix</w:t>
+      </w:r>
+      <w:r>
+        <w:t xml:space="preserve"> cho phần khó: bàn phím, focus, thuộc tính </w:t>
+      </w:r>
+      <w:r>
+        <w:rPr>
+          <w:rFonts w:ascii="Consolas" w:eastAsia="Consolas" w:hAnsi="Consolas" w:cs="Consolas"/>
+        </w:rPr>
+        <w:t xml:space="preserve">aria-*</w:t>
+      </w:r>
+      <w:r>
+        <w:t xml:space="preserve"> cho trình đọc màn hình (ví dụ menu thả xuống mở bằng phím, đóng bằng Esc).</w:t>
+      </w:r>
+    </w:p>
+    <w:p>
+      <w:pPr>
+        <w:pStyle w:val="ListParagraph"/>
+        <w:numPr>
+          <w:ilvl w:val="0"/>
+          <w:numId w:val="1"/>
+        </w:numPr>
+      </w:pPr>
+      <w:r>
+        <w:rPr>
+          <w:rFonts w:ascii="Consolas" w:eastAsia="Consolas" w:hAnsi="Consolas" w:cs="Consolas"/>
+          <w:b/>
+          <w:bCs/>
+        </w:rPr>
+        <w:t xml:space="preserve">cva</w:t>
+      </w:r>
+      <w:r>
+        <w:rPr>
+          <w:b/>
+          <w:bCs/>
+        </w:rPr>
+        <w:t xml:space="preserve"> (class-variance-authority):</w:t>
+      </w:r>
+      <w:r>
+        <w:t xml:space="preserve"> khai báo các biến thể của nút (</w:t>
+      </w:r>
+      <w:r>
+        <w:rPr>
+          <w:rFonts w:ascii="Consolas" w:eastAsia="Consolas" w:hAnsi="Consolas" w:cs="Consolas"/>
+        </w:rPr>
+        <w:t xml:space="preserve">primary</w:t>
+      </w:r>
+      <w:r>
+        <w:t xml:space="preserve">, </w:t>
+      </w:r>
+      <w:r>
+        <w:rPr>
+          <w:rFonts w:ascii="Consolas" w:eastAsia="Consolas" w:hAnsi="Consolas" w:cs="Consolas"/>
+        </w:rPr>
+        <w:t xml:space="preserve">secondary</w:t>
+      </w:r>
+      <w:r>
+        <w:t xml:space="preserve">, </w:t>
+      </w:r>
+      <w:r>
+        <w:rPr>
+          <w:rFonts w:ascii="Consolas" w:eastAsia="Consolas" w:hAnsi="Consolas" w:cs="Consolas"/>
+        </w:rPr>
+        <w:t xml:space="preserve">ghost</w:t>
+      </w:r>
+      <w:r>
+        <w:t xml:space="preserve">, </w:t>
+      </w:r>
+      <w:r>
+        <w:rPr>
+          <w:rFonts w:ascii="Consolas" w:eastAsia="Consolas" w:hAnsi="Consolas" w:cs="Consolas"/>
+        </w:rPr>
+        <w:t xml:space="preserve">danger</w:t>
+      </w:r>
+      <w:r>
+        <w:t xml:space="preserve">) và kích thước (</w:t>
+      </w:r>
+      <w:r>
+        <w:rPr>
+          <w:rFonts w:ascii="Consolas" w:eastAsia="Consolas" w:hAnsi="Consolas" w:cs="Consolas"/>
+        </w:rPr>
+        <w:t xml:space="preserve">default</w:t>
+      </w:r>
+      <w:r>
+        <w:t xml:space="preserve">, </w:t>
+      </w:r>
+      <w:r>
+        <w:rPr>
+          <w:rFonts w:ascii="Consolas" w:eastAsia="Consolas" w:hAnsi="Consolas" w:cs="Consolas"/>
+        </w:rPr>
+        <w:t xml:space="preserve">sm</w:t>
+      </w:r>
+      <w:r>
+        <w:t xml:space="preserve">, </w:t>
+      </w:r>
+      <w:r>
+        <w:rPr>
+          <w:rFonts w:ascii="Consolas" w:eastAsia="Consolas" w:hAnsi="Consolas" w:cs="Consolas"/>
+        </w:rPr>
+        <w:t xml:space="preserve">icon</w:t>
+      </w:r>
+      <w:r>
+        <w:t xml:space="preserve">, </w:t>
+      </w:r>
+      <w:r>
+        <w:rPr>
+          <w:rFonts w:ascii="Consolas" w:eastAsia="Consolas" w:hAnsi="Consolas" w:cs="Consolas"/>
+        </w:rPr>
+        <w:t xml:space="preserve">icon-sm</w:t>
+      </w:r>
+      <w:r>
+        <w:t xml:space="preserve">) ở một chỗ; </w:t>
+      </w:r>
+      <w:r>
+        <w:rPr>
+          <w:rFonts w:ascii="Consolas" w:eastAsia="Consolas" w:hAnsi="Consolas" w:cs="Consolas"/>
+        </w:rPr>
+        <w:t xml:space="preserve">&lt;Button variant="secondary" size="sm"&gt;</w:t>
+      </w:r>
+      <w:r>
+        <w:t xml:space="preserve"> tự ghép đúng class.</w:t>
+      </w:r>
+    </w:p>
+    <w:p>
+      <w:pPr>
+        <w:pStyle w:val="ListParagraph"/>
+        <w:numPr>
+          <w:ilvl w:val="0"/>
+          <w:numId w:val="1"/>
+        </w:numPr>
+      </w:pPr>
+      <w:r>
+        <w:rPr>
+          <w:rFonts w:ascii="Consolas" w:eastAsia="Consolas" w:hAnsi="Consolas" w:cs="Consolas"/>
+          <w:b/>
+          <w:bCs/>
+        </w:rPr>
+        <w:t xml:space="preserve">cn</w:t>
+      </w:r>
+      <w:r>
+        <w:rPr>
+          <w:b/>
+          <w:bCs/>
+        </w:rPr>
+        <w:t xml:space="preserve">:</w:t>
+      </w:r>
+      <w:r>
+        <w:t xml:space="preserve"> ghép class và để class sau thắng class trước khi trùng loại: </w:t>
+      </w:r>
+      <w:r>
+        <w:rPr>
+          <w:rFonts w:ascii="Consolas" w:eastAsia="Consolas" w:hAnsi="Consolas" w:cs="Consolas"/>
+        </w:rPr>
+        <w:t xml:space="preserve">cn('h-9', 'h-11')</w:t>
+      </w:r>
+      <w:r>
+        <w:t xml:space="preserve"> cho </w:t>
+      </w:r>
+      <w:r>
+        <w:rPr>
+          <w:rFonts w:ascii="Consolas" w:eastAsia="Consolas" w:hAnsi="Consolas" w:cs="Consolas"/>
+        </w:rPr>
+        <w:t xml:space="preserve">h-11</w:t>
+      </w:r>
+      <w:r>
+        <w:t xml:space="preserve">. Nhờ vậy truyền </w:t>
+      </w:r>
+      <w:r>
+        <w:rPr>
+          <w:rFonts w:ascii="Consolas" w:eastAsia="Consolas" w:hAnsi="Consolas" w:cs="Consolas"/>
+        </w:rPr>
+        <w:t xml:space="preserve">className="w-full"</w:t>
+      </w:r>
+      <w:r>
+        <w:t xml:space="preserve"> từ ngoài vào là ghi đè được. shadcn 4.21 lấy hàm này từ gói npm </w:t>
+      </w:r>
+      <w:r>
+        <w:rPr>
+          <w:rFonts w:ascii="Consolas" w:eastAsia="Consolas" w:hAnsi="Consolas" w:cs="Consolas"/>
+        </w:rPr>
+        <w:t xml:space="preserve">cn</w:t>
+      </w:r>
+      <w:r>
+        <w:t xml:space="preserve"> của chính shadcn (thay cho cặp </w:t>
+      </w:r>
+      <w:r>
+        <w:rPr>
+          <w:rFonts w:ascii="Consolas" w:eastAsia="Consolas" w:hAnsi="Consolas" w:cs="Consolas"/>
+        </w:rPr>
+        <w:t xml:space="preserve">clsx</w:t>
+      </w:r>
+      <w:r>
+        <w:t xml:space="preserve"> + </w:t>
+      </w:r>
+      <w:r>
+        <w:rPr>
+          <w:rFonts w:ascii="Consolas" w:eastAsia="Consolas" w:hAnsi="Consolas" w:cs="Consolas"/>
+        </w:rPr>
+        <w:t xml:space="preserve">tailwind-merge</w:t>
+      </w:r>
+      <w:r>
+        <w:t xml:space="preserve"> trước đây).</w:t>
+      </w:r>
+    </w:p>
+    <w:p>
+      <w:pPr>
+        <w:pStyle w:val="ListParagraph"/>
+        <w:numPr>
+          <w:ilvl w:val="0"/>
+          <w:numId w:val="1"/>
+        </w:numPr>
+      </w:pPr>
+      <w:r>
+        <w:rPr>
+          <w:b/>
+          <w:bCs/>
+        </w:rPr>
+        <w:t xml:space="preserve">Bẫy, </w:t>
+      </w:r>
+      <w:r>
+        <w:rPr>
+          <w:rFonts w:ascii="Consolas" w:eastAsia="Consolas" w:hAnsi="Consolas" w:cs="Consolas"/>
+          <w:b/>
+          <w:bCs/>
+        </w:rPr>
+        <w:t xml:space="preserve">cn</w:t>
+      </w:r>
+      <w:r>
+        <w:rPr>
+          <w:b/>
+          <w:bCs/>
+        </w:rPr>
+        <w:t xml:space="preserve"> phải biết tên riêng của theme:</w:t>
+      </w:r>
+      <w:r>
+        <w:t xml:space="preserve"> </w:t>
+      </w:r>
+      <w:r>
+        <w:rPr>
+          <w:rFonts w:ascii="Consolas" w:eastAsia="Consolas" w:hAnsi="Consolas" w:cs="Consolas"/>
+        </w:rPr>
+        <w:t xml:space="preserve">cn</w:t>
+      </w:r>
+      <w:r>
+        <w:t xml:space="preserve"> đoán loại của class theo tên. </w:t>
+      </w:r>
+      <w:r>
+        <w:rPr>
+          <w:rFonts w:ascii="Consolas" w:eastAsia="Consolas" w:hAnsi="Consolas" w:cs="Consolas"/>
+        </w:rPr>
+        <w:t xml:space="preserve">shadow-sm</w:t>
+      </w:r>
+      <w:r>
+        <w:t xml:space="preserve">, </w:t>
+      </w:r>
+      <w:r>
+        <w:rPr>
+          <w:rFonts w:ascii="Consolas" w:eastAsia="Consolas" w:hAnsi="Consolas" w:cs="Consolas"/>
+        </w:rPr>
+        <w:t xml:space="preserve">shadow-lg</w:t>
+      </w:r>
+      <w:r>
+        <w:t xml:space="preserve"> là cỡ bóng; còn tên lạ như </w:t>
+      </w:r>
+      <w:r>
+        <w:rPr>
+          <w:rFonts w:ascii="Consolas" w:eastAsia="Consolas" w:hAnsi="Consolas" w:cs="Consolas"/>
+        </w:rPr>
+        <w:t xml:space="preserve">shadow-popover</w:t>
+      </w:r>
+      <w:r>
+        <w:t xml:space="preserve"> thì nó đoán là </w:t>
+      </w:r>
+      <w:r>
+        <w:rPr>
+          <w:b/>
+          <w:bCs/>
+        </w:rPr>
+        <w:t xml:space="preserve">màu</w:t>
+      </w:r>
+      <w:r>
+        <w:t xml:space="preserve"> của bóng. Kết quả: </w:t>
+      </w:r>
+      <w:r>
+        <w:rPr>
+          <w:rFonts w:ascii="Consolas" w:eastAsia="Consolas" w:hAnsi="Consolas" w:cs="Consolas"/>
+        </w:rPr>
+        <w:t xml:space="preserve">cn('shadow-popover', 'shadow-none')</w:t>
+      </w:r>
+      <w:r>
+        <w:t xml:space="preserve"> giữ cả hai, và class nào thắng tùy thứ tự trong file CSS chứ không phải thứ tự ta viết. Vì vậy có </w:t>
+      </w:r>
+      <w:r>
+        <w:rPr>
+          <w:rFonts w:ascii="Consolas" w:eastAsia="Consolas" w:hAnsi="Consolas" w:cs="Consolas"/>
+        </w:rPr>
+        <w:t xml:space="preserve">src/shared/lib/utils.ts</w:t>
+      </w:r>
+      <w:r>
+        <w:t xml:space="preserve">: một wrapper khai </w:t>
+      </w:r>
+      <w:r>
+        <w:rPr>
+          <w:rFonts w:ascii="Consolas" w:eastAsia="Consolas" w:hAnsi="Consolas" w:cs="Consolas"/>
+        </w:rPr>
+        <w:t xml:space="preserve">popover</w:t>
+      </w:r>
+      <w:r>
+        <w:t xml:space="preserve"> là cỡ bóng (</w:t>
+      </w:r>
+      <w:r>
+        <w:rPr>
+          <w:rFonts w:ascii="Consolas" w:eastAsia="Consolas" w:hAnsi="Consolas" w:cs="Consolas"/>
+        </w:rPr>
+        <w:t xml:space="preserve">createCn({ extend: { theme: { shadow: ['popover'] } } })</w:t>
+      </w:r>
+      <w:r>
+        <w:t xml:space="preserve">), có test riêng. </w:t>
+      </w:r>
+      <w:r>
+        <w:rPr>
+          <w:rFonts w:ascii="Consolas" w:eastAsia="Consolas" w:hAnsi="Consolas" w:cs="Consolas"/>
+        </w:rPr>
+        <w:t xml:space="preserve">shadcn add</w:t>
+      </w:r>
+      <w:r>
+        <w:t xml:space="preserve"> luôn sinh </w:t>
+      </w:r>
+      <w:r>
+        <w:rPr>
+          <w:rFonts w:ascii="Consolas" w:eastAsia="Consolas" w:hAnsi="Consolas" w:cs="Consolas"/>
+        </w:rPr>
+        <w:t xml:space="preserve">import { cn } from "cn"</w:t>
+      </w:r>
+      <w:r>
+        <w:t xml:space="preserve">, nên </w:t>
+      </w:r>
+      <w:r>
+        <w:rPr>
+          <w:rFonts w:ascii="Consolas" w:eastAsia="Consolas" w:hAnsi="Consolas" w:cs="Consolas"/>
+        </w:rPr>
+        <w:t xml:space="preserve">.oxlintrc.json</w:t>
+      </w:r>
+      <w:r>
+        <w:t xml:space="preserve"> có luật </w:t>
+      </w:r>
+      <w:r>
+        <w:rPr>
+          <w:rFonts w:ascii="Consolas" w:eastAsia="Consolas" w:hAnsi="Consolas" w:cs="Consolas"/>
+        </w:rPr>
+        <w:t xml:space="preserve">no-restricted-imports</w:t>
+      </w:r>
+      <w:r>
+        <w:t xml:space="preserve">: import thẳng </w:t>
+      </w:r>
+      <w:r>
+        <w:rPr>
+          <w:rFonts w:ascii="Consolas" w:eastAsia="Consolas" w:hAnsi="Consolas" w:cs="Consolas"/>
+        </w:rPr>
+        <w:t xml:space="preserve">cn</w:t>
+      </w:r>
+      <w:r>
+        <w:t xml:space="preserve"> là </w:t>
+      </w:r>
+      <w:r>
+        <w:rPr>
+          <w:rFonts w:ascii="Consolas" w:eastAsia="Consolas" w:hAnsi="Consolas" w:cs="Consolas"/>
+        </w:rPr>
+        <w:t xml:space="preserve">pnpm lint</w:t>
+      </w:r>
+      <w:r>
+        <w:t xml:space="preserve"> đỏ. Wrapper còn có lợi phụ: </w:t>
+      </w:r>
+      <w:r>
+        <w:rPr>
+          <w:rFonts w:ascii="Consolas" w:eastAsia="Consolas" w:hAnsi="Consolas" w:cs="Consolas"/>
+        </w:rPr>
+        <w:t xml:space="preserve">cn</w:t>
+      </w:r>
+      <w:r>
+        <w:t xml:space="preserve"> mới ở bản 0.4, nếu bản sau đổi API thì chỉ sửa một chỗ.</w:t>
+      </w:r>
+    </w:p>
+    <w:p>
+      <w:pPr>
+        <w:pStyle w:val="ListParagraph"/>
+        <w:numPr>
+          <w:ilvl w:val="0"/>
+          <w:numId w:val="1"/>
+        </w:numPr>
+      </w:pPr>
+      <w:r>
+        <w:rPr>
+          <w:b/>
+          <w:bCs/>
+        </w:rPr>
+        <w:t xml:space="preserve">Đã chỉnh theo canvas:</w:t>
+      </w:r>
+      <w:r>
+        <w:t xml:space="preserve"> nút cao 44px, bo 10px, chữ 600 14px, viền focus 2px; ô nhập nền </w:t>
+      </w:r>
+      <w:r>
+        <w:rPr>
+          <w:rFonts w:ascii="Consolas" w:eastAsia="Consolas" w:hAnsi="Consolas" w:cs="Consolas"/>
+        </w:rPr>
+        <w:t xml:space="preserve">surface</w:t>
+      </w:r>
+      <w:r>
+        <w:t xml:space="preserve">, focus có vòng 3px; công tắc 40 x 24 với núm 16px; menu nền </w:t>
+      </w:r>
+      <w:r>
+        <w:rPr>
+          <w:rFonts w:ascii="Consolas" w:eastAsia="Consolas" w:hAnsi="Consolas" w:cs="Consolas"/>
+        </w:rPr>
+        <w:t xml:space="preserve">raised</w:t>
+      </w:r>
+      <w:r>
+        <w:t xml:space="preserve">, viền </w:t>
+      </w:r>
+      <w:r>
+        <w:rPr>
+          <w:rFonts w:ascii="Consolas" w:eastAsia="Consolas" w:hAnsi="Consolas" w:cs="Consolas"/>
+        </w:rPr>
+        <w:t xml:space="preserve">border-strong</w:t>
+      </w:r>
+      <w:r>
+        <w:t xml:space="preserve">, bóng </w:t>
+      </w:r>
+      <w:r>
+        <w:rPr>
+          <w:rFonts w:ascii="Consolas" w:eastAsia="Consolas" w:hAnsi="Consolas" w:cs="Consolas"/>
+        </w:rPr>
+        <w:t xml:space="preserve">shadow-pop</w:t>
+      </w:r>
+      <w:r>
+        <w:t xml:space="preserve">.</w:t>
+      </w:r>
+    </w:p>
+    <w:p>
+      <w:pPr>
+        <w:pStyle w:val="ListParagraph"/>
+        <w:numPr>
+          <w:ilvl w:val="0"/>
+          <w:numId w:val="1"/>
+        </w:numPr>
+      </w:pPr>
+      <w:r>
+        <w:rPr>
+          <w:b/>
+          <w:bCs/>
+        </w:rPr>
+        <w:t xml:space="preserve">Bẫy, viền focus biến mất (review bắt được):</w:t>
+      </w:r>
+      <w:r>
+        <w:t xml:space="preserve"> nút có </w:t>
+      </w:r>
+      <w:r>
+        <w:rPr>
+          <w:rFonts w:ascii="Consolas" w:eastAsia="Consolas" w:hAnsi="Consolas" w:cs="Consolas"/>
+        </w:rPr>
+        <w:t xml:space="preserve">outline-none</w:t>
+      </w:r>
+      <w:r>
+        <w:t xml:space="preserve"> (bỏ viền mặc định khi bấm chuột) và </w:t>
+      </w:r>
+      <w:r>
+        <w:rPr>
+          <w:rFonts w:ascii="Consolas" w:eastAsia="Consolas" w:hAnsi="Consolas" w:cs="Consolas"/>
+        </w:rPr>
+        <w:t xml:space="preserve">focus-visible:outline-2</w:t>
+      </w:r>
+      <w:r>
+        <w:t xml:space="preserve"> (viền 2px khi dùng bàn phím). Trong Tailwind 4, </w:t>
+      </w:r>
+      <w:r>
+        <w:rPr>
+          <w:rFonts w:ascii="Consolas" w:eastAsia="Consolas" w:hAnsi="Consolas" w:cs="Consolas"/>
+        </w:rPr>
+        <w:t xml:space="preserve">outline-none</w:t>
+      </w:r>
+      <w:r>
+        <w:t xml:space="preserve"> đặt một biến </w:t>
+      </w:r>
+      <w:r>
+        <w:rPr>
+          <w:rFonts w:ascii="Consolas" w:eastAsia="Consolas" w:hAnsi="Consolas" w:cs="Consolas"/>
+        </w:rPr>
+        <w:t xml:space="preserve">--tw-outline-style: none</w:t>
+      </w:r>
+      <w:r>
+        <w:t xml:space="preserve">, còn </w:t>
+      </w:r>
+      <w:r>
+        <w:rPr>
+          <w:rFonts w:ascii="Consolas" w:eastAsia="Consolas" w:hAnsi="Consolas" w:cs="Consolas"/>
+        </w:rPr>
+        <w:t xml:space="preserve">outline-2</w:t>
+      </w:r>
+      <w:r>
+        <w:t xml:space="preserve"> lấy kiểu viền </w:t>
+      </w:r>
+      <w:r>
+        <w:rPr>
+          <w:b/>
+          <w:bCs/>
+        </w:rPr>
+        <w:t xml:space="preserve">từ chính biến đó</w:t>
+      </w:r>
+      <w:r>
+        <w:t xml:space="preserve">, nên viền dày 2px nhưng kiểu vẫn là </w:t>
+      </w:r>
+      <w:r>
+        <w:rPr>
+          <w:rFonts w:ascii="Consolas" w:eastAsia="Consolas" w:hAnsi="Consolas" w:cs="Consolas"/>
+        </w:rPr>
+        <w:t xml:space="preserve">none</w:t>
+      </w:r>
+      <w:r>
+        <w:t xml:space="preserve">: không hiện gì. Người dùng bàn phím (Tab) không biết mình đang ở nút nào, trái WCAG 2.4.7. Sửa: thêm </w:t>
+      </w:r>
+      <w:r>
+        <w:rPr>
+          <w:rFonts w:ascii="Consolas" w:eastAsia="Consolas" w:hAnsi="Consolas" w:cs="Consolas"/>
+        </w:rPr>
+        <w:t xml:space="preserve">focus-visible:outline-solid</w:t>
+      </w:r>
+      <w:r>
+        <w:t xml:space="preserve">. Đo trên Chrome thật bằng cách bấm Tab: trước khi sửa </w:t>
+      </w:r>
+      <w:r>
+        <w:rPr>
+          <w:rFonts w:ascii="Consolas" w:eastAsia="Consolas" w:hAnsi="Consolas" w:cs="Consolas"/>
+        </w:rPr>
+        <w:t xml:space="preserve">outline-style: none</w:t>
+      </w:r>
+      <w:r>
+        <w:t xml:space="preserve">, sau khi sửa </w:t>
+      </w:r>
+      <w:r>
+        <w:rPr>
+          <w:rFonts w:ascii="Consolas" w:eastAsia="Consolas" w:hAnsi="Consolas" w:cs="Consolas"/>
+        </w:rPr>
+        <w:t xml:space="preserve">solid 2px</w:t>
+      </w:r>
+      <w:r>
+        <w:t xml:space="preserve"> đúng màu </w:t>
+      </w:r>
+      <w:r>
+        <w:rPr>
+          <w:rFonts w:ascii="Consolas" w:eastAsia="Consolas" w:hAnsi="Consolas" w:cs="Consolas"/>
+        </w:rPr>
+        <w:t xml:space="preserve">--ring</w:t>
+      </w:r>
+      <w:r>
+        <w:t xml:space="preserve">. Bài học: kiểm giao diện phải gồm cả </w:t>
+      </w:r>
+      <w:r>
+        <w:rPr>
+          <w:b/>
+          <w:bCs/>
+        </w:rPr>
+        <w:t xml:space="preserve">bàn phím</w:t>
+      </w:r>
+      <w:r>
+        <w:t xml:space="preserve">, không chỉ chuột và ảnh chụp.</w:t>
+      </w:r>
+    </w:p>
+    <w:p>
+      <w:pPr>
+        <w:pStyle w:val="ListParagraph"/>
+        <w:numPr>
+          <w:ilvl w:val="0"/>
+          <w:numId w:val="1"/>
+        </w:numPr>
+      </w:pPr>
+      <w:r>
+        <w:rPr>
+          <w:b/>
+          <w:bCs/>
+        </w:rPr>
+        <w:t xml:space="preserve">Bẫy, variant tự định nghĩa:</w:t>
+      </w:r>
+      <w:r>
+        <w:t xml:space="preserve"> component sinh ra dùng </w:t>
+      </w:r>
+      <w:r>
+        <w:rPr>
+          <w:rFonts w:ascii="Consolas" w:eastAsia="Consolas" w:hAnsi="Consolas" w:cs="Consolas"/>
+        </w:rPr>
+        <w:t xml:space="preserve">data-open:</w:t>
+      </w:r>
+      <w:r>
+        <w:t xml:space="preserve"> và </w:t>
+      </w:r>
+      <w:r>
+        <w:rPr>
+          <w:rFonts w:ascii="Consolas" w:eastAsia="Consolas" w:hAnsi="Consolas" w:cs="Consolas"/>
+        </w:rPr>
+        <w:t xml:space="preserve">data-checked:</w:t>
+      </w:r>
+      <w:r>
+        <w:t xml:space="preserve">, nhưng Radix chỉ gắn </w:t>
+      </w:r>
+      <w:r>
+        <w:rPr>
+          <w:rFonts w:ascii="Consolas" w:eastAsia="Consolas" w:hAnsi="Consolas" w:cs="Consolas"/>
+        </w:rPr>
+        <w:t xml:space="preserve">data-state="open"</w:t>
+      </w:r>
+      <w:r>
+        <w:t xml:space="preserve"> hay </w:t>
+      </w:r>
+      <w:r>
+        <w:rPr>
+          <w:rFonts w:ascii="Consolas" w:eastAsia="Consolas" w:hAnsi="Consolas" w:cs="Consolas"/>
+        </w:rPr>
+        <w:t xml:space="preserve">data-state="checked"</w:t>
+      </w:r>
+      <w:r>
+        <w:t xml:space="preserve">. </w:t>
+      </w:r>
+      <w:r>
+        <w:rPr>
+          <w:rFonts w:ascii="Consolas" w:eastAsia="Consolas" w:hAnsi="Consolas" w:cs="Consolas"/>
+        </w:rPr>
+        <w:t xml:space="preserve">shadcn init</w:t>
+      </w:r>
+      <w:r>
+        <w:t xml:space="preserve"> thường thêm các variant này vào CSS bằng cách cài cả gói CLI </w:t>
+      </w:r>
+      <w:r>
+        <w:rPr>
+          <w:rFonts w:ascii="Consolas" w:eastAsia="Consolas" w:hAnsi="Consolas" w:cs="Consolas"/>
+        </w:rPr>
+        <w:t xml:space="preserve">shadcn</w:t>
+      </w:r>
+      <w:r>
+        <w:t xml:space="preserve"> (khoảng 300 gói con). Ta chỉ chép đúng bốn variant cần dùng vào đầu </w:t>
+      </w:r>
+      <w:r>
+        <w:rPr>
+          <w:rFonts w:ascii="Consolas" w:eastAsia="Consolas" w:hAnsi="Consolas" w:cs="Consolas"/>
+        </w:rPr>
+        <w:t xml:space="preserve">index.css</w:t>
+      </w:r>
+      <w:r>
+        <w:t xml:space="preserve">. Thiếu chúng thì class không có tác dụng gì mà </w:t>
+      </w:r>
+      <w:r>
+        <w:rPr>
+          <w:b/>
+          <w:bCs/>
+        </w:rPr>
+        <w:t xml:space="preserve">cũng không báo lỗi</w:t>
+      </w:r>
+      <w:r>
+        <w:t xml:space="preserve">: công tắc bật mà vẫn xám.</w:t>
+      </w:r>
+    </w:p>
+    <w:p>
+      <w:pPr>
+        <w:pStyle w:val="Heading3"/>
+      </w:pPr>
+      <w:r>
+        <w:t xml:space="preserve">4.7 Font tự host</w:t>
+      </w:r>
+    </w:p>
+    <w:p>
+      <w:pPr>
+        <w:pStyle w:val="ListParagraph"/>
+        <w:numPr>
+          <w:ilvl w:val="0"/>
+          <w:numId w:val="1"/>
+        </w:numPr>
+      </w:pPr>
+      <w:r>
+        <w:rPr>
+          <w:b/>
+          <w:bCs/>
+        </w:rPr>
+        <w:t xml:space="preserve">Ở đâu:</w:t>
+      </w:r>
+      <w:r>
+        <w:t xml:space="preserve"> </w:t>
+      </w:r>
+      <w:r>
+        <w:rPr>
+          <w:rFonts w:ascii="Consolas" w:eastAsia="Consolas" w:hAnsi="Consolas" w:cs="Consolas"/>
+        </w:rPr>
+        <w:t xml:space="preserve">main.tsx</w:t>
+      </w:r>
+      <w:r>
+        <w:t xml:space="preserve"> (</w:t>
+      </w:r>
+      <w:r>
+        <w:rPr>
+          <w:rFonts w:ascii="Consolas" w:eastAsia="Consolas" w:hAnsi="Consolas" w:cs="Consolas"/>
+        </w:rPr>
+        <w:t xml:space="preserve">import '@fontsource-variable/inter'</w:t>
+      </w:r>
+      <w:r>
+        <w:t xml:space="preserve">), </w:t>
+      </w:r>
+      <w:r>
+        <w:rPr>
+          <w:rFonts w:ascii="Consolas" w:eastAsia="Consolas" w:hAnsi="Consolas" w:cs="Consolas"/>
+        </w:rPr>
+        <w:t xml:space="preserve">--font-sans</w:t>
+      </w:r>
+      <w:r>
+        <w:t xml:space="preserve"> trong </w:t>
+      </w:r>
+      <w:r>
+        <w:rPr>
+          <w:rFonts w:ascii="Consolas" w:eastAsia="Consolas" w:hAnsi="Consolas" w:cs="Consolas"/>
+        </w:rPr>
+        <w:t xml:space="preserve">index.css</w:t>
+      </w:r>
+      <w:r>
+        <w:t xml:space="preserve">.</w:t>
+      </w:r>
+    </w:p>
+    <w:p>
+      <w:pPr>
+        <w:pStyle w:val="ListParagraph"/>
+        <w:numPr>
+          <w:ilvl w:val="0"/>
+          <w:numId w:val="1"/>
+        </w:numPr>
+      </w:pPr>
+      <w:r>
+        <w:rPr>
+          <w:b/>
+          <w:bCs/>
+        </w:rPr>
+        <w:t xml:space="preserve">Vì sao không dùng Google Fonts như canvas:</w:t>
+      </w:r>
+      <w:r>
+        <w:t xml:space="preserve"> mỗi lần mở trang, trình duyệt sẽ gửi IP của người dùng cho Google. Sino đọc tin nhắn riêng tư, tự cài trên máy mình, nên không để request nào đi ra bên thứ ba. Gói </w:t>
+      </w:r>
+      <w:r>
+        <w:rPr>
+          <w:rFonts w:ascii="Consolas" w:eastAsia="Consolas" w:hAnsi="Consolas" w:cs="Consolas"/>
+        </w:rPr>
+        <w:t xml:space="preserve">@fontsource-variable</w:t>
+      </w:r>
+      <w:r>
+        <w:t xml:space="preserve"> đóng font vào bản build; nhiều file </w:t>
+      </w:r>
+      <w:r>
+        <w:rPr>
+          <w:rFonts w:ascii="Consolas" w:eastAsia="Consolas" w:hAnsi="Consolas" w:cs="Consolas"/>
+        </w:rPr>
+        <w:t xml:space="preserve">.woff2</w:t>
+      </w:r>
+      <w:r>
+        <w:t xml:space="preserve"> (latin, vietnamese, cyrillic...) nhưng trình duyệt chỉ tải bộ chữ trang thật sự dùng.</w:t>
+      </w:r>
+    </w:p>
+    <w:p>
+      <w:pPr>
+        <w:pStyle w:val="Heading3"/>
+      </w:pPr>
+      <w:r>
+        <w:t xml:space="preserve">4.8 Test frontend</w:t>
+      </w:r>
+    </w:p>
+    <w:p>
+      <w:pPr>
+        <w:pStyle w:val="ListParagraph"/>
+        <w:numPr>
+          <w:ilvl w:val="0"/>
+          <w:numId w:val="1"/>
+        </w:numPr>
+      </w:pPr>
+      <w:r>
+        <w:rPr>
+          <w:b/>
+          <w:bCs/>
+        </w:rPr>
+        <w:t xml:space="preserve">Ở đâu:</w:t>
+      </w:r>
+      <w:r>
+        <w:t xml:space="preserve"> </w:t>
+      </w:r>
+      <w:r>
+        <w:rPr>
+          <w:rFonts w:ascii="Consolas" w:eastAsia="Consolas" w:hAnsi="Consolas" w:cs="Consolas"/>
+        </w:rPr>
+        <w:t xml:space="preserve">src/shared/theme/theme.test.tsx</w:t>
+      </w:r>
+      <w:r>
+        <w:t xml:space="preserve">, </w:t>
+      </w:r>
+      <w:r>
+        <w:rPr>
+          <w:rFonts w:ascii="Consolas" w:eastAsia="Consolas" w:hAnsi="Consolas" w:cs="Consolas"/>
+        </w:rPr>
+        <w:t xml:space="preserve">src/test/setup.ts</w:t>
+      </w:r>
+      <w:r>
+        <w:t xml:space="preserve">, </w:t>
+      </w:r>
+      <w:r>
+        <w:rPr>
+          <w:rFonts w:ascii="Consolas" w:eastAsia="Consolas" w:hAnsi="Consolas" w:cs="Consolas"/>
+        </w:rPr>
+        <w:t xml:space="preserve">src/test/msw/server.ts</w:t>
+      </w:r>
+      <w:r>
+        <w:t xml:space="preserve">, khối </w:t>
+      </w:r>
+      <w:r>
+        <w:rPr>
+          <w:rFonts w:ascii="Consolas" w:eastAsia="Consolas" w:hAnsi="Consolas" w:cs="Consolas"/>
+        </w:rPr>
+        <w:t xml:space="preserve">test</w:t>
+      </w:r>
+      <w:r>
+        <w:t xml:space="preserve"> trong </w:t>
+      </w:r>
+      <w:r>
+        <w:rPr>
+          <w:rFonts w:ascii="Consolas" w:eastAsia="Consolas" w:hAnsi="Consolas" w:cs="Consolas"/>
+        </w:rPr>
+        <w:t xml:space="preserve">vite.config.ts</w:t>
+      </w:r>
+      <w:r>
+        <w:t xml:space="preserve">.</w:t>
+      </w:r>
+    </w:p>
+    <w:p>
+      <w:pPr>
+        <w:shd w:val="clear" w:color="auto" w:fill="F2F3F5"/>
+        <w:ind w:left="0"/>
+      </w:pPr>
+      <w:r>
+        <w:rPr>
+          <w:rFonts w:ascii="Consolas" w:eastAsia="Consolas" w:hAnsi="Consolas" w:cs="Consolas"/>
+          <w:sz w:val="19"/>
+          <w:szCs w:val="19"/>
+        </w:rPr>
+        <w:t xml:space="preserve">pnpm test (Vitest)</w:t>
+        <w:br/>
+        <w:t xml:space="preserve">  môi trường jsdom: một "trình duyệt giả" trong Node (có document, localStorage; không vẽ gì)</w:t>
+        <w:br/>
+        <w:t xml:space="preserve">  setup.ts</w:t>
+        <w:br/>
+        <w:t xml:space="preserve">    - thêm matcher toBeInTheDocument, toHaveClass (jest-dom)</w:t>
+        <w:br/>
+        <w:t xml:space="preserve">    - bật MSW: request nào không có handler -&gt; test ĐỎ (không bao giờ gọi mạng thật)</w:t>
+        <w:br/>
+        <w:t xml:space="preserve">    - sau mỗi test: gỡ component (cleanup), xóa handler đã thêm</w:t>
+        <w:br/>
+        <w:t xml:space="preserve">  test: render(&lt;ThemeProvider&gt;&lt;ThemeToggle/&gt;&lt;/ThemeProvider&gt;)</w:t>
+        <w:br/>
+        <w:t xml:space="preserve">        -&gt; tìm nút như người dùng: getByRole('button', { name: 'Chuyển sang giao diện sáng' })</w:t>
+        <w:br/>
+        <w:t xml:space="preserve">        -&gt; userEvent.click(...) -&gt; kiểm class của &lt;html&gt;</w:t>
+      </w:r>
+    </w:p>
+    <w:p>
+      <w:pPr>
+        <w:pStyle w:val="ListParagraph"/>
+        <w:numPr>
+          <w:ilvl w:val="0"/>
+          <w:numId w:val="1"/>
+        </w:numPr>
+      </w:pPr>
+      <w:r>
+        <w:rPr>
+          <w:b/>
+          <w:bCs/>
+        </w:rPr>
+        <w:t xml:space="preserve">Testing Library tìm phần tử theo vai trò và nhãn</w:t>
+      </w:r>
+      <w:r>
+        <w:t xml:space="preserve">, không theo class hay id: nếu test tìm được nút bằng tên đọc cho trình đọc màn hình, thì người dùng khiếm thị cũng tìm được. Đây là lý do nút đổi theme (chỉ có icon) phải có </w:t>
+      </w:r>
+      <w:r>
+        <w:rPr>
+          <w:rFonts w:ascii="Consolas" w:eastAsia="Consolas" w:hAnsi="Consolas" w:cs="Consolas"/>
+        </w:rPr>
+        <w:t xml:space="preserve">aria-label</w:t>
+      </w:r>
+      <w:r>
+        <w:t xml:space="preserve">.</w:t>
+      </w:r>
+    </w:p>
+    <w:p>
+      <w:pPr>
+        <w:pStyle w:val="ListParagraph"/>
+        <w:numPr>
+          <w:ilvl w:val="0"/>
+          <w:numId w:val="1"/>
+        </w:numPr>
+      </w:pPr>
+      <w:r>
+        <w:rPr>
+          <w:b/>
+          <w:bCs/>
+        </w:rPr>
+        <w:t xml:space="preserve">Giả hệ điều hành và bộ nhớ:</w:t>
+      </w:r>
+      <w:r>
+        <w:t xml:space="preserve"> jsdom không có </w:t>
+      </w:r>
+      <w:r>
+        <w:rPr>
+          <w:rFonts w:ascii="Consolas" w:eastAsia="Consolas" w:hAnsi="Consolas" w:cs="Consolas"/>
+        </w:rPr>
+        <w:t xml:space="preserve">matchMedia</w:t>
+      </w:r>
+      <w:r>
+        <w:t xml:space="preserve">, nên test tự gắn một bản giả trả "tối" hoặc "sáng" (</w:t>
+      </w:r>
+      <w:r>
+        <w:rPr>
+          <w:rFonts w:ascii="Consolas" w:eastAsia="Consolas" w:hAnsi="Consolas" w:cs="Consolas"/>
+        </w:rPr>
+        <w:t xml:space="preserve">vi.stubGlobal</w:t>
+      </w:r>
+      <w:r>
+        <w:t xml:space="preserve">). Để giả trình duyệt chặn bộ nhớ, test cho </w:t>
+      </w:r>
+      <w:r>
+        <w:rPr>
+          <w:rFonts w:ascii="Consolas" w:eastAsia="Consolas" w:hAnsi="Consolas" w:cs="Consolas"/>
+        </w:rPr>
+        <w:t xml:space="preserve">Storage.prototype.getItem/setItem</w:t>
+      </w:r>
+      <w:r>
+        <w:t xml:space="preserve"> ném </w:t>
+      </w:r>
+      <w:r>
+        <w:rPr>
+          <w:rFonts w:ascii="Consolas" w:eastAsia="Consolas" w:hAnsi="Consolas" w:cs="Consolas"/>
+        </w:rPr>
+        <w:t xml:space="preserve">SecurityError</w:t>
+      </w:r>
+      <w:r>
+        <w:t xml:space="preserve"> (</w:t>
+      </w:r>
+      <w:r>
+        <w:rPr>
+          <w:rFonts w:ascii="Consolas" w:eastAsia="Consolas" w:hAnsi="Consolas" w:cs="Consolas"/>
+        </w:rPr>
+        <w:t xml:space="preserve">vi.spyOn</w:t>
+      </w:r>
+      <w:r>
+        <w:t xml:space="preserve">); </w:t>
+      </w:r>
+      <w:r>
+        <w:rPr>
+          <w:rFonts w:ascii="Consolas" w:eastAsia="Consolas" w:hAnsi="Consolas" w:cs="Consolas"/>
+        </w:rPr>
+        <w:t xml:space="preserve">restoreMocks: true</w:t>
+      </w:r>
+      <w:r>
+        <w:t xml:space="preserve"> trả lại như cũ sau mỗi test.</w:t>
+      </w:r>
+    </w:p>
+    <w:p>
+      <w:pPr>
+        <w:pStyle w:val="ListParagraph"/>
+        <w:numPr>
+          <w:ilvl w:val="0"/>
+          <w:numId w:val="1"/>
+        </w:numPr>
+      </w:pPr>
+      <w:r>
+        <w:rPr>
+          <w:b/>
+          <w:bCs/>
+        </w:rPr>
+        <w:t xml:space="preserve">Mô phỏng "tải lại trang":</w:t>
+      </w:r>
+      <w:r>
+        <w:t xml:space="preserve"> </w:t>
+      </w:r>
+      <w:r>
+        <w:rPr>
+          <w:rFonts w:ascii="Consolas" w:eastAsia="Consolas" w:hAnsi="Consolas" w:cs="Consolas"/>
+        </w:rPr>
+        <w:t xml:space="preserve">unmount()</w:t>
+      </w:r>
+      <w:r>
+        <w:t xml:space="preserve"> component, xóa class trên </w:t>
+      </w:r>
+      <w:r>
+        <w:rPr>
+          <w:rFonts w:ascii="Consolas" w:eastAsia="Consolas" w:hAnsi="Consolas" w:cs="Consolas"/>
+        </w:rPr>
+        <w:t xml:space="preserve">&lt;html&gt;</w:t>
+      </w:r>
+      <w:r>
+        <w:t xml:space="preserve">, rồi </w:t>
+      </w:r>
+      <w:r>
+        <w:rPr>
+          <w:rFonts w:ascii="Consolas" w:eastAsia="Consolas" w:hAnsi="Consolas" w:cs="Consolas"/>
+        </w:rPr>
+        <w:t xml:space="preserve">render</w:t>
+      </w:r>
+      <w:r>
+        <w:t xml:space="preserve"> lại một provider mới. Provider mới chỉ còn </w:t>
+      </w:r>
+      <w:r>
+        <w:rPr>
+          <w:rFonts w:ascii="Consolas" w:eastAsia="Consolas" w:hAnsi="Consolas" w:cs="Consolas"/>
+        </w:rPr>
+        <w:t xml:space="preserve">localStorage</w:t>
+      </w:r>
+      <w:r>
+        <w:t xml:space="preserve"> để biết lựa chọn cũ, đúng như khi tải lại thật.</w:t>
+      </w:r>
+    </w:p>
+    <w:p>
+      <w:pPr>
+        <w:pStyle w:val="ListParagraph"/>
+        <w:numPr>
+          <w:ilvl w:val="0"/>
+          <w:numId w:val="1"/>
+        </w:numPr>
+      </w:pPr>
+      <w:r>
+        <w:rPr>
+          <w:b/>
+          <w:bCs/>
+        </w:rPr>
+        <w:t xml:space="preserve">Mặc định cho mọi test:</w:t>
+      </w:r>
+      <w:r>
+        <w:t xml:space="preserve"> </w:t>
+      </w:r>
+      <w:r>
+        <w:rPr>
+          <w:rFonts w:ascii="Consolas" w:eastAsia="Consolas" w:hAnsi="Consolas" w:cs="Consolas"/>
+        </w:rPr>
+        <w:t xml:space="preserve">setup.ts</w:t>
+      </w:r>
+      <w:r>
+        <w:t xml:space="preserve"> giả </w:t>
+      </w:r>
+      <w:r>
+        <w:rPr>
+          <w:rFonts w:ascii="Consolas" w:eastAsia="Consolas" w:hAnsi="Consolas" w:cs="Consolas"/>
+        </w:rPr>
+        <w:t xml:space="preserve">matchMedia</w:t>
+      </w:r>
+      <w:r>
+        <w:t xml:space="preserve"> là "không ưu tiên tối" trước mỗi test, và </w:t>
+      </w:r>
+      <w:r>
+        <w:rPr>
+          <w:rFonts w:ascii="Consolas" w:eastAsia="Consolas" w:hAnsi="Consolas" w:cs="Consolas"/>
+        </w:rPr>
+        <w:t xml:space="preserve">unstubGlobals: true</w:t>
+      </w:r>
+      <w:r>
+        <w:t xml:space="preserve"> gỡ nó sau mỗi test. Nếu không, mọi test sau này dựng </w:t>
+      </w:r>
+      <w:r>
+        <w:rPr>
+          <w:rFonts w:ascii="Consolas" w:eastAsia="Consolas" w:hAnsi="Consolas" w:cs="Consolas"/>
+        </w:rPr>
+        <w:t xml:space="preserve">ThemeProvider</w:t>
+      </w:r>
+      <w:r>
+        <w:t xml:space="preserve"> (trang đăng nhập, khung app) sẽ sập với </w:t>
+      </w:r>
+      <w:r>
+        <w:rPr>
+          <w:rFonts w:ascii="Consolas" w:eastAsia="Consolas" w:hAnsi="Consolas" w:cs="Consolas"/>
+        </w:rPr>
+        <w:t xml:space="preserve">window.matchMedia is not a function</w:t>
+      </w:r>
+      <w:r>
+        <w:t xml:space="preserve">; test </w:t>
+      </w:r>
+      <w:r>
+        <w:rPr>
+          <w:rFonts w:ascii="Consolas" w:eastAsia="Consolas" w:hAnsi="Consolas" w:cs="Consolas"/>
+        </w:rPr>
+        <w:t xml:space="preserve">uses the light theme when the test environment states no OS preference</w:t>
+      </w:r>
+      <w:r>
+        <w:t xml:space="preserve"> canh việc này.</w:t>
+      </w:r>
+    </w:p>
+    <w:p>
+      <w:pPr>
+        <w:pStyle w:val="ListParagraph"/>
+        <w:numPr>
+          <w:ilvl w:val="0"/>
+          <w:numId w:val="1"/>
+        </w:numPr>
+      </w:pPr>
+      <w:r>
+        <w:rPr>
+          <w:b/>
+          <w:bCs/>
+        </w:rPr>
+        <w:t xml:space="preserve">Request quên handler phải làm test đỏ:</w:t>
+      </w:r>
+      <w:r>
+        <w:t xml:space="preserve"> chiến lược </w:t>
+      </w:r>
+      <w:r>
+        <w:rPr>
+          <w:rFonts w:ascii="Consolas" w:eastAsia="Consolas" w:hAnsi="Consolas" w:cs="Consolas"/>
+        </w:rPr>
+        <w:t xml:space="preserve">onUnhandledRequest: 'error'</w:t>
+      </w:r>
+      <w:r>
+        <w:t xml:space="preserve"> của MSW chỉ làm </w:t>
+      </w:r>
+      <w:r>
+        <w:rPr>
+          <w:rFonts w:ascii="Consolas" w:eastAsia="Consolas" w:hAnsi="Consolas" w:cs="Consolas"/>
+        </w:rPr>
+        <w:t xml:space="preserve">fetch</w:t>
+      </w:r>
+      <w:r>
+        <w:t xml:space="preserve"> ném lỗi mạng. Nếu code đang test </w:t>
+      </w:r>
+      <w:r>
+        <w:rPr>
+          <w:b/>
+          <w:bCs/>
+        </w:rPr>
+        <w:t xml:space="preserve">bắt</w:t>
+      </w:r>
+      <w:r>
+        <w:t xml:space="preserve"> lỗi đó (API client của FE-02 đổi nó thành </w:t>
+      </w:r>
+      <w:r>
+        <w:rPr>
+          <w:rFonts w:ascii="Consolas" w:eastAsia="Consolas" w:hAnsi="Consolas" w:cs="Consolas"/>
+        </w:rPr>
+        <w:t xml:space="preserve">NETWORK_ERROR</w:t>
+      </w:r>
+      <w:r>
+        <w:t xml:space="preserve">), test vẫn xanh vì lý do sai. </w:t>
+      </w:r>
+      <w:r>
+        <w:rPr>
+          <w:rFonts w:ascii="Consolas" w:eastAsia="Consolas" w:hAnsi="Consolas" w:cs="Consolas"/>
+        </w:rPr>
+        <w:t xml:space="preserve">setup.ts</w:t>
+      </w:r>
+      <w:r>
+        <w:t xml:space="preserve"> ghi lại mọi request không có handler và làm test đỏ ở </w:t>
+      </w:r>
+      <w:r>
+        <w:rPr>
+          <w:rFonts w:ascii="Consolas" w:eastAsia="Consolas" w:hAnsi="Consolas" w:cs="Consolas"/>
+        </w:rPr>
+        <w:t xml:space="preserve">afterEach</w:t>
+      </w:r>
+      <w:r>
+        <w:t xml:space="preserve"> với thông báo </w:t>
+      </w:r>
+      <w:r>
+        <w:rPr>
+          <w:rFonts w:ascii="Consolas" w:eastAsia="Consolas" w:hAnsi="Consolas" w:cs="Consolas"/>
+        </w:rPr>
+        <w:t xml:space="preserve">Requests without an MSW handler: GET ...</w:t>
+      </w:r>
+      <w:r>
+        <w:t xml:space="preserve">. Đã kiểm bằng một test tạm cố tình nuốt lỗi.</w:t>
+      </w:r>
+    </w:p>
+    <w:p>
+      <w:pPr>
+        <w:pStyle w:val="ListParagraph"/>
+        <w:numPr>
+          <w:ilvl w:val="0"/>
+          <w:numId w:val="1"/>
+        </w:numPr>
+      </w:pPr>
+      <w:r>
+        <w:rPr>
+          <w:b/>
+          <w:bCs/>
+        </w:rPr>
+        <w:t xml:space="preserve">Test viết trước:</w:t>
+      </w:r>
+      <w:r>
+        <w:t xml:space="preserve"> chạy với một </w:t>
+      </w:r>
+      <w:r>
+        <w:rPr>
+          <w:rFonts w:ascii="Consolas" w:eastAsia="Consolas" w:hAnsi="Consolas" w:cs="Consolas"/>
+        </w:rPr>
+        <w:t xml:space="preserve">ThemeProvider</w:t>
+      </w:r>
+      <w:r>
+        <w:t xml:space="preserve"> rỗng thì cả 5 test đỏ (không có class theme nào), viết code xong thì 5/5 xanh. Sau review có thêm 1 test theme và 3 test cho </w:t>
+      </w:r>
+      <w:r>
+        <w:rPr>
+          <w:rFonts w:ascii="Consolas" w:eastAsia="Consolas" w:hAnsi="Consolas" w:cs="Consolas"/>
+        </w:rPr>
+        <w:t xml:space="preserve">cn</w:t>
+      </w:r>
+      <w:r>
+        <w:t xml:space="preserve"> (đỏ trước: </w:t>
+      </w:r>
+      <w:r>
+        <w:rPr>
+          <w:rFonts w:ascii="Consolas" w:eastAsia="Consolas" w:hAnsi="Consolas" w:cs="Consolas"/>
+        </w:rPr>
+        <w:t xml:space="preserve">shadow-popover shadow-none</w:t>
+      </w:r>
+      <w:r>
+        <w:t xml:space="preserve">; xanh sau khi có wrapper), tổng 9/9.</w:t>
+      </w:r>
+    </w:p>
+    <w:p>
+      <w:pPr>
+        <w:pStyle w:val="ListParagraph"/>
+        <w:numPr>
+          <w:ilvl w:val="0"/>
+          <w:numId w:val="1"/>
+        </w:numPr>
+      </w:pPr>
+      <w:r>
+        <w:rPr>
+          <w:b/>
+          <w:bCs/>
+        </w:rPr>
+        <w:t xml:space="preserve">Kiểm tra ngược (8 lỗi cố ý, cả 8 bị bắt):</w:t>
+      </w:r>
+    </w:p>
+    <w:tbl>
+      <w:tblPr>
+        <w:tblW w:w="9360" w:type="dxa"/>
+        <w:tblBorders>
+          <w:top w:val="single" w:sz="4" w:space="0" w:color="auto"/>
+          <w:left w:val="single" w:sz="4" w:space="0" w:color="auto"/>
+          <w:bottom w:val="single" w:sz="4" w:space="0" w:color="auto"/>
+          <w:right w:val="single" w:sz="4" w:space="0" w:color="auto"/>
+          <w:insideH w:val="single" w:sz="4" w:space="0" w:color="auto"/>
+          <w:insideV w:val="single" w:sz="4" w:space="0" w:color="auto"/>
+        </w:tblBorders>
+        <w:tblLayout w:type="fixed"/>
+      </w:tblPr>
+      <w:tblGrid>
+        <w:gridCol w:w="4680"/>
+        <w:gridCol w:w="4680"/>
+      </w:tblGrid>
+      <w:tr>
+        <w:tc>
+          <w:tcPr>
+            <w:tcW w:w="4680" w:type="dxa"/>
+            <w:shd w:val="clear" w:color="auto" w:fill="F2F2F2"/>
+          </w:tcPr>
+          <w:p>
+            <w:r>
+              <w:t xml:space="preserve">Lỗi cố ý</w:t>
+            </w:r>
+          </w:p>
+        </w:tc>
+        <w:tc>
+          <w:tcPr>
+            <w:tcW w:w="4680" w:type="dxa"/>
+            <w:shd w:val="clear" w:color="auto" w:fill="F2F2F2"/>
+          </w:tcPr>
+          <w:p>
+            <w:r>
+              <w:t xml:space="preserve">Test bắt được</w:t>
+            </w:r>
+          </w:p>
+        </w:tc>
+      </w:tr>
+      <w:tr>
+        <w:tc>
+          <w:tcPr>
+            <w:tcW w:w="4680" w:type="dxa"/>
+          </w:tcPr>
+          <w:p>
+            <w:r>
+              <w:t xml:space="preserve">Đọc </w:t>
+            </w:r>
+            <w:r>
+              <w:rPr>
+                <w:rFonts w:ascii="Consolas" w:eastAsia="Consolas" w:hAnsi="Consolas" w:cs="Consolas"/>
+              </w:rPr>
+              <w:t xml:space="preserve">localStorage</w:t>
+            </w:r>
+            <w:r>
+              <w:t xml:space="preserve"> không có </w:t>
+            </w:r>
+            <w:r>
+              <w:rPr>
+                <w:rFonts w:ascii="Consolas" w:eastAsia="Consolas" w:hAnsi="Consolas" w:cs="Consolas"/>
+              </w:rPr>
+              <w:t xml:space="preserve">try/catch</w:t>
+            </w:r>
+          </w:p>
+        </w:tc>
+        <w:tc>
+          <w:tcPr>
+            <w:tcW w:w="4680" w:type="dxa"/>
+          </w:tcPr>
+          <w:p>
+            <w:r>
+              <w:t xml:space="preserve">trình duyệt chặn bộ nhớ vẫn chạy</w:t>
+            </w:r>
+          </w:p>
+        </w:tc>
+      </w:tr>
+      <w:tr>
+        <w:tc>
+          <w:tcPr>
+            <w:tcW w:w="4680" w:type="dxa"/>
+          </w:tcPr>
+          <w:p>
+            <w:r>
+              <w:t xml:space="preserve">Ghi </w:t>
+            </w:r>
+            <w:r>
+              <w:rPr>
+                <w:rFonts w:ascii="Consolas" w:eastAsia="Consolas" w:hAnsi="Consolas" w:cs="Consolas"/>
+              </w:rPr>
+              <w:t xml:space="preserve">localStorage</w:t>
+            </w:r>
+            <w:r>
+              <w:t xml:space="preserve"> không có </w:t>
+            </w:r>
+            <w:r>
+              <w:rPr>
+                <w:rFonts w:ascii="Consolas" w:eastAsia="Consolas" w:hAnsi="Consolas" w:cs="Consolas"/>
+              </w:rPr>
+              <w:t xml:space="preserve">try/catch</w:t>
+            </w:r>
+          </w:p>
+        </w:tc>
+        <w:tc>
+          <w:tcPr>
+            <w:tcW w:w="4680" w:type="dxa"/>
+          </w:tcPr>
+          <w:p>
+            <w:r>
+              <w:t xml:space="preserve">trình duyệt chặn bộ nhớ vẫn chạy</w:t>
+            </w:r>
+          </w:p>
+        </w:tc>
+      </w:tr>
+      <w:tr>
+        <w:tc>
+          <w:tcPr>
+            <w:tcW w:w="4680" w:type="dxa"/>
+          </w:tcPr>
+          <w:p>
+            <w:r>
+              <w:t xml:space="preserve">Bỏ qua lựa chọn đã lưu</w:t>
+            </w:r>
+          </w:p>
+        </w:tc>
+        <w:tc>
+          <w:tcPr>
+            <w:tcW w:w="4680" w:type="dxa"/>
+          </w:tcPr>
+          <w:p>
+            <w:r>
+              <w:t xml:space="preserve">giữ theme sau khi tải lại</w:t>
+            </w:r>
+          </w:p>
+        </w:tc>
+      </w:tr>
+      <w:tr>
+        <w:tc>
+          <w:tcPr>
+            <w:tcW w:w="4680" w:type="dxa"/>
+          </w:tcPr>
+          <w:p>
+            <w:r>
+              <w:t xml:space="preserve">Bỏ qua hệ điều hành (luôn sáng)</w:t>
+            </w:r>
+          </w:p>
+        </w:tc>
+        <w:tc>
+          <w:tcPr>
+            <w:tcW w:w="4680" w:type="dxa"/>
+          </w:tcPr>
+          <w:p>
+            <w:r>
+              <w:t xml:space="preserve">lần đầu theo hệ điều hành tối (4 test đỏ)</w:t>
+            </w:r>
+          </w:p>
+        </w:tc>
+      </w:tr>
+      <w:tr>
+        <w:tc>
+          <w:tcPr>
+            <w:tcW w:w="4680" w:type="dxa"/>
+          </w:tcPr>
+          <w:p>
+            <w:r>
+              <w:t xml:space="preserve">Không bao giờ lưu</w:t>
+            </w:r>
+          </w:p>
+        </w:tc>
+        <w:tc>
+          <w:tcPr>
+            <w:tcW w:w="4680" w:type="dxa"/>
+          </w:tcPr>
+          <w:p>
+            <w:r>
+              <w:t xml:space="preserve">giữ theme sau khi tải lại</w:t>
+            </w:r>
+          </w:p>
+        </w:tc>
+      </w:tr>
+      <w:tr>
+        <w:tc>
+          <w:tcPr>
+            <w:tcW w:w="4680" w:type="dxa"/>
+          </w:tcPr>
+          <w:p>
+            <w:r>
+              <w:t xml:space="preserve">Không gỡ class cũ khi đổi</w:t>
+            </w:r>
+          </w:p>
+        </w:tc>
+        <w:tc>
+          <w:tcPr>
+            <w:tcW w:w="4680" w:type="dxa"/>
+          </w:tcPr>
+          <w:p>
+            <w:r>
+              <w:t xml:space="preserve">sau khi đổi, </w:t>
+            </w:r>
+            <w:r>
+              <w:rPr>
+                <w:rFonts w:ascii="Consolas" w:eastAsia="Consolas" w:hAnsi="Consolas" w:cs="Consolas"/>
+              </w:rPr>
+              <w:t xml:space="preserve">&lt;html&gt;</w:t>
+            </w:r>
+            <w:r>
+              <w:t xml:space="preserve"> không còn </w:t>
+            </w:r>
+            <w:r>
+              <w:rPr>
+                <w:rFonts w:ascii="Consolas" w:eastAsia="Consolas" w:hAnsi="Consolas" w:cs="Consolas"/>
+              </w:rPr>
+              <w:t xml:space="preserve">theme-dark</w:t>
+            </w:r>
+          </w:p>
+        </w:tc>
+      </w:tr>
+      <w:tr>
+        <w:tc>
+          <w:tcPr>
+            <w:tcW w:w="4680" w:type="dxa"/>
+          </w:tcPr>
+          <w:p>
+            <w:r>
+              <w:t xml:space="preserve">Nhận mọi giá trị đã lưu</w:t>
+            </w:r>
+          </w:p>
+        </w:tc>
+        <w:tc>
+          <w:tcPr>
+            <w:tcW w:w="4680" w:type="dxa"/>
+          </w:tcPr>
+          <w:p>
+            <w:r>
+              <w:t xml:space="preserve">bỏ qua giá trị lạ (</w:t>
+            </w:r>
+            <w:r>
+              <w:rPr>
+                <w:rFonts w:ascii="Consolas" w:eastAsia="Consolas" w:hAnsi="Consolas" w:cs="Consolas"/>
+              </w:rPr>
+              <w:t xml:space="preserve">"blue"</w:t>
+            </w:r>
+            <w:r>
+              <w:t xml:space="preserve">)</w:t>
+            </w:r>
+          </w:p>
+        </w:tc>
+      </w:tr>
+      <w:tr>
+        <w:tc>
+          <w:tcPr>
+            <w:tcW w:w="4680" w:type="dxa"/>
+          </w:tcPr>
+          <w:p>
+            <w:r>
+              <w:t xml:space="preserve">Nút đổi theme không gọi lưu</w:t>
+            </w:r>
+          </w:p>
+        </w:tc>
+        <w:tc>
+          <w:tcPr>
+            <w:tcW w:w="4680" w:type="dxa"/>
+          </w:tcPr>
+          <w:p>
+            <w:r>
+              <w:t xml:space="preserve">giữ theme sau khi tải lại</w:t>
+            </w:r>
+          </w:p>
+        </w:tc>
+      </w:tr>
+    </w:tbl>
+    <w:p>
+      <w:pPr>
+        <w:pStyle w:val="ListParagraph"/>
+        <w:numPr>
+          <w:ilvl w:val="0"/>
+          <w:numId w:val="1"/>
+        </w:numPr>
+      </w:pPr>
+      <w:r>
+        <w:rPr>
+          <w:b/>
+          <w:bCs/>
+        </w:rPr>
+        <w:t xml:space="preserve">Kiểm trên trình duyệt thật:</w:t>
+      </w:r>
+      <w:r>
+        <w:t xml:space="preserve"> Chrome headless điều khiển qua DevTools Protocol: hệ điều hành sáng thì nền </w:t>
+      </w:r>
+      <w:r>
+        <w:rPr>
+          <w:rFonts w:ascii="Consolas" w:eastAsia="Consolas" w:hAnsi="Consolas" w:cs="Consolas"/>
+        </w:rPr>
+        <w:t xml:space="preserve">#F2F2EF</w:t>
+      </w:r>
+      <w:r>
+        <w:t xml:space="preserve">; bấm đổi thì tối và lưu </w:t>
+      </w:r>
+      <w:r>
+        <w:rPr>
+          <w:rFonts w:ascii="Consolas" w:eastAsia="Consolas" w:hAnsi="Consolas" w:cs="Consolas"/>
+        </w:rPr>
+        <w:t xml:space="preserve">dark</w:t>
+      </w:r>
+      <w:r>
+        <w:t xml:space="preserve">; tải lại vẫn tối; màn hình 390px không tràn ngang; font Inter đã tải.</w:t>
+      </w:r>
+    </w:p>
+    <w:p>
+      <w:pPr>
+        <w:pStyle w:val="Heading3"/>
+      </w:pPr>
+      <w:r>
+        <w:t xml:space="preserve">4.9 Review độc lập</w:t>
+      </w:r>
+    </w:p>
+    <w:p>
+      <w:pPr>
+        <w:pStyle w:val="ListParagraph"/>
+        <w:numPr>
+          <w:ilvl w:val="0"/>
+          <w:numId w:val="1"/>
+        </w:numPr>
+      </w:pPr>
+      <w:r>
+        <w:t xml:space="preserve">Sau khi code chạy, một agent review chỉ đọc (không sửa code) soi lại toàn bộ thay đổi. Kết quả: không có lỗi nghiêm trọng nhất; 1 lỗi mức cao (viền focus, mục 4.6); 2 lỗi trung bình (</w:t>
+      </w:r>
+      <w:r>
+        <w:rPr>
+          <w:rFonts w:ascii="Consolas" w:eastAsia="Consolas" w:hAnsi="Consolas" w:cs="Consolas"/>
+        </w:rPr>
+        <w:t xml:space="preserve">cn</w:t>
+      </w:r>
+      <w:r>
+        <w:t xml:space="preserve"> với </w:t>
+      </w:r>
+      <w:r>
+        <w:rPr>
+          <w:rFonts w:ascii="Consolas" w:eastAsia="Consolas" w:hAnsi="Consolas" w:cs="Consolas"/>
+        </w:rPr>
+        <w:t xml:space="preserve">shadow-popover</w:t>
+      </w:r>
+      <w:r>
+        <w:t xml:space="preserve">; test thiếu </w:t>
+      </w:r>
+      <w:r>
+        <w:rPr>
+          <w:rFonts w:ascii="Consolas" w:eastAsia="Consolas" w:hAnsi="Consolas" w:cs="Consolas"/>
+        </w:rPr>
+        <w:t xml:space="preserve">matchMedia</w:t>
+      </w:r>
+      <w:r>
+        <w:t xml:space="preserve">); vài lỗi nhỏ: proxy khớp tiền tố, </w:t>
+      </w:r>
+      <w:r>
+        <w:rPr>
+          <w:rFonts w:ascii="Consolas" w:eastAsia="Consolas" w:hAnsi="Consolas" w:cs="Consolas"/>
+        </w:rPr>
+        <w:t xml:space="preserve">data-inset={false}</w:t>
+      </w:r>
+      <w:r>
+        <w:t xml:space="preserve"> vẫn làm menu thụt lề, MSW không làm đỏ test khi lỗi bị bắt, favicon vẫn là logo Vite, </w:t>
+      </w:r>
+      <w:r>
+        <w:rPr>
+          <w:rFonts w:ascii="Consolas" w:eastAsia="Consolas" w:hAnsi="Consolas" w:cs="Consolas"/>
+        </w:rPr>
+        <w:t xml:space="preserve">corepack</w:t>
+      </w:r>
+      <w:r>
+        <w:t xml:space="preserve"> không còn trên Node 26. Tất cả đã sửa và kiểm lại, trừ chuyện chớp theme (mục 4.5), để người dùng quyết.</w:t>
+      </w:r>
+    </w:p>
+    <w:p>
+      <w:pPr>
+        <w:pStyle w:val="ListParagraph"/>
+        <w:numPr>
+          <w:ilvl w:val="0"/>
+          <w:numId w:val="1"/>
+        </w:numPr>
+      </w:pPr>
+      <w:r>
+        <w:rPr>
+          <w:b/>
+          <w:bCs/>
+        </w:rPr>
+        <w:t xml:space="preserve">Bài học:</w:t>
+      </w:r>
+      <w:r>
+        <w:t xml:space="preserve"> mọi lỗi kể trên đều đã qua lint, test và build xanh. Chúng chỉ lộ ra khi có người đọc kỹ cách công cụ thật sự hoạt động (CSS Tailwind sinh ra, cách </w:t>
+      </w:r>
+      <w:r>
+        <w:rPr>
+          <w:rFonts w:ascii="Consolas" w:eastAsia="Consolas" w:hAnsi="Consolas" w:cs="Consolas"/>
+        </w:rPr>
+        <w:t xml:space="preserve">cn</w:t>
+      </w:r>
+      <w:r>
+        <w:t xml:space="preserve"> đoán loại class, chiến lược của MSW). Xanh mới là điều kiện cần.</w:t>
+      </w:r>
+    </w:p>
+    <w:p>
+      <w:pPr>
+        <w:pStyle w:val="Heading3"/>
+      </w:pPr>
+      <w:r>
+        <w:t xml:space="preserve">4.10 CI frontend</w:t>
+      </w:r>
+    </w:p>
+    <w:p>
+      <w:pPr>
+        <w:pStyle w:val="ListParagraph"/>
+        <w:numPr>
+          <w:ilvl w:val="0"/>
+          <w:numId w:val="1"/>
+        </w:numPr>
+      </w:pPr>
+      <w:r>
+        <w:rPr>
+          <w:b/>
+          <w:bCs/>
+        </w:rPr>
+        <w:t xml:space="preserve">Ở đâu:</w:t>
+      </w:r>
+      <w:r>
+        <w:t xml:space="preserve"> </w:t>
+      </w:r>
+      <w:r>
+        <w:rPr>
+          <w:rFonts w:ascii="Consolas" w:eastAsia="Consolas" w:hAnsi="Consolas" w:cs="Consolas"/>
+        </w:rPr>
+        <w:t xml:space="preserve">.github/workflows/frontend-ci.yml</w:t>
+      </w:r>
+      <w:r>
+        <w:t xml:space="preserve">.</w:t>
+      </w:r>
+    </w:p>
+    <w:p>
+      <w:pPr>
+        <w:pStyle w:val="ListParagraph"/>
+        <w:numPr>
+          <w:ilvl w:val="0"/>
+          <w:numId w:val="1"/>
+        </w:numPr>
+      </w:pPr>
+      <w:r>
+        <w:rPr>
+          <w:b/>
+          <w:bCs/>
+        </w:rPr>
+        <w:t xml:space="preserve">Là gì:</w:t>
+      </w:r>
+      <w:r>
+        <w:t xml:space="preserve"> mỗi lần push hay mở pull request có đụng </w:t>
+      </w:r>
+      <w:r>
+        <w:rPr>
+          <w:rFonts w:ascii="Consolas" w:eastAsia="Consolas" w:hAnsi="Consolas" w:cs="Consolas"/>
+        </w:rPr>
+        <w:t xml:space="preserve">apps/sino-web/**</w:t>
+      </w:r>
+      <w:r>
+        <w:t xml:space="preserve">, GitHub chạy: cài đúng pnpm theo </w:t>
+      </w:r>
+      <w:r>
+        <w:rPr>
+          <w:rFonts w:ascii="Consolas" w:eastAsia="Consolas" w:hAnsi="Consolas" w:cs="Consolas"/>
+        </w:rPr>
+        <w:t xml:space="preserve">packageManager</w:t>
+      </w:r>
+      <w:r>
+        <w:t xml:space="preserve">, Node 26, </w:t>
+      </w:r>
+      <w:r>
+        <w:rPr>
+          <w:rFonts w:ascii="Consolas" w:eastAsia="Consolas" w:hAnsi="Consolas" w:cs="Consolas"/>
+        </w:rPr>
+        <w:t xml:space="preserve">pnpm install --frozen-lockfile</w:t>
+      </w:r>
+      <w:r>
+        <w:t xml:space="preserve">, rồi </w:t>
+      </w:r>
+      <w:r>
+        <w:rPr>
+          <w:rFonts w:ascii="Consolas" w:eastAsia="Consolas" w:hAnsi="Consolas" w:cs="Consolas"/>
+        </w:rPr>
+        <w:t xml:space="preserve">lint</w:t>
+      </w:r>
+      <w:r>
+        <w:t xml:space="preserve">, </w:t>
+      </w:r>
+      <w:r>
+        <w:rPr>
+          <w:rFonts w:ascii="Consolas" w:eastAsia="Consolas" w:hAnsi="Consolas" w:cs="Consolas"/>
+        </w:rPr>
+        <w:t xml:space="preserve">test</w:t>
+      </w:r>
+      <w:r>
+        <w:t xml:space="preserve">, </w:t>
+      </w:r>
+      <w:r>
+        <w:rPr>
+          <w:rFonts w:ascii="Consolas" w:eastAsia="Consolas" w:hAnsi="Consolas" w:cs="Consolas"/>
+        </w:rPr>
+        <w:t xml:space="preserve">build</w:t>
+      </w:r>
+      <w:r>
+        <w:t xml:space="preserve">. Giống </w:t>
+      </w:r>
+      <w:r>
+        <w:rPr>
+          <w:rFonts w:ascii="Consolas" w:eastAsia="Consolas" w:hAnsi="Consolas" w:cs="Consolas"/>
+        </w:rPr>
+        <w:t xml:space="preserve">backend-ci.yml</w:t>
+      </w:r>
+      <w:r>
+        <w:t xml:space="preserve"> chạy </w:t>
+      </w:r>
+      <w:r>
+        <w:rPr>
+          <w:rFonts w:ascii="Consolas" w:eastAsia="Consolas" w:hAnsi="Consolas" w:cs="Consolas"/>
+        </w:rPr>
+        <w:t xml:space="preserve">./mvnw verify</w:t>
+      </w:r>
+      <w:r>
+        <w:t xml:space="preserve"> cho backend.</w:t>
+      </w:r>
+    </w:p>
+    <w:p>
+      <w:pPr>
+        <w:pStyle w:val="ListParagraph"/>
+        <w:numPr>
+          <w:ilvl w:val="0"/>
+          <w:numId w:val="1"/>
+        </w:numPr>
+      </w:pPr>
+      <w:r>
+        <w:rPr>
+          <w:b/>
+          <w:bCs/>
+        </w:rPr>
+        <w:t xml:space="preserve">Bẫy:</w:t>
+      </w:r>
+      <w:r>
+        <w:t xml:space="preserve"> CI chỉ thực sự chạy khi code được push, mà push cần bạn cho phép. Trước đó, bằng chứng là ba lệnh chạy trên máy.</w:t>
+      </w:r>
+    </w:p>
+    <w:p>
+      <w:pPr>
+        <w:pBdr>
+          <w:bottom w:val="single" w:sz="4" w:space="0" w:color="auto"/>
+        </w:pBdr>
+        <w:ind w:left="0"/>
+      </w:pPr>
+    </w:p>
+    <w:p>
+      <w:pPr>
+        <w:pStyle w:val="Heading2"/>
+      </w:pPr>
+      <w:r>
         <w:t xml:space="preserve">Tự kiểm tra</w:t>
       </w:r>
     </w:p>
@@ -3894,6 +7907,267 @@
       </w:r>
       <w:r>
         <w:t xml:space="preserve">. Vì sao trước BE-29 điều đó không gây lỗi, còn sau BE-29 thì có?</w:t>
+      </w:r>
+    </w:p>
+    <w:p>
+      <w:pPr>
+        <w:pStyle w:val="ListParagraph"/>
+        <w:numPr>
+          <w:ilvl w:val="0"/>
+          <w:numId w:val="100"/>
+        </w:numPr>
+      </w:pPr>
+      <w:r>
+        <w:t xml:space="preserve">Vì sao đặt proxy ở Vite thay vì bật CORS ở Spring? Hai origin khác nhau ở chỗ nào khi chỉ khác cổng?</w:t>
+      </w:r>
+    </w:p>
+    <w:p>
+      <w:pPr>
+        <w:pStyle w:val="ListParagraph"/>
+        <w:numPr>
+          <w:ilvl w:val="0"/>
+          <w:numId w:val="100"/>
+        </w:numPr>
+      </w:pPr>
+      <w:r>
+        <w:rPr>
+          <w:rFonts w:ascii="Consolas" w:eastAsia="Consolas" w:hAnsi="Consolas" w:cs="Consolas"/>
+        </w:rPr>
+        <w:t xml:space="preserve">pnpm-lock.yaml</w:t>
+      </w:r>
+      <w:r>
+        <w:t xml:space="preserve"> khác </w:t>
+      </w:r>
+      <w:r>
+        <w:rPr>
+          <w:rFonts w:ascii="Consolas" w:eastAsia="Consolas" w:hAnsi="Consolas" w:cs="Consolas"/>
+        </w:rPr>
+        <w:t xml:space="preserve">package.json</w:t>
+      </w:r>
+      <w:r>
+        <w:t xml:space="preserve"> ở đâu, và vì sao CI dùng </w:t>
+      </w:r>
+      <w:r>
+        <w:rPr>
+          <w:rFonts w:ascii="Consolas" w:eastAsia="Consolas" w:hAnsi="Consolas" w:cs="Consolas"/>
+        </w:rPr>
+        <w:t xml:space="preserve">--frozen-lockfile</w:t>
+      </w:r>
+      <w:r>
+        <w:t xml:space="preserve">?</w:t>
+      </w:r>
+    </w:p>
+    <w:p>
+      <w:pPr>
+        <w:pStyle w:val="ListParagraph"/>
+        <w:numPr>
+          <w:ilvl w:val="0"/>
+          <w:numId w:val="100"/>
+        </w:numPr>
+      </w:pPr>
+      <w:r>
+        <w:t xml:space="preserve">Vì sao pnpm chặn script cài đặt của thư viện, và </w:t>
+      </w:r>
+      <w:r>
+        <w:rPr>
+          <w:rFonts w:ascii="Consolas" w:eastAsia="Consolas" w:hAnsi="Consolas" w:cs="Consolas"/>
+        </w:rPr>
+        <w:t xml:space="preserve">allowBuilds: msw: false</w:t>
+      </w:r>
+      <w:r>
+        <w:t xml:space="preserve"> nói điều gì?</w:t>
+      </w:r>
+    </w:p>
+    <w:p>
+      <w:pPr>
+        <w:pStyle w:val="ListParagraph"/>
+        <w:numPr>
+          <w:ilvl w:val="0"/>
+          <w:numId w:val="100"/>
+        </w:numPr>
+      </w:pPr>
+      <w:r>
+        <w:t xml:space="preserve">Design token chia hai lớp (biến của canvas, rồi </w:t>
+      </w:r>
+      <w:r>
+        <w:rPr>
+          <w:rFonts w:ascii="Consolas" w:eastAsia="Consolas" w:hAnsi="Consolas" w:cs="Consolas"/>
+        </w:rPr>
+        <w:t xml:space="preserve">@theme inline</w:t>
+      </w:r>
+      <w:r>
+        <w:t xml:space="preserve">) để được lợi gì?</w:t>
+      </w:r>
+    </w:p>
+    <w:p>
+      <w:pPr>
+        <w:pStyle w:val="ListParagraph"/>
+        <w:numPr>
+          <w:ilvl w:val="0"/>
+          <w:numId w:val="100"/>
+        </w:numPr>
+      </w:pPr>
+      <w:r>
+        <w:t xml:space="preserve">Nếu bỏ </w:t>
+      </w:r>
+      <w:r>
+        <w:rPr>
+          <w:rFonts w:ascii="Consolas" w:eastAsia="Consolas" w:hAnsi="Consolas" w:cs="Consolas"/>
+        </w:rPr>
+        <w:t xml:space="preserve">try/catch</w:t>
+      </w:r>
+      <w:r>
+        <w:t xml:space="preserve"> quanh </w:t>
+      </w:r>
+      <w:r>
+        <w:rPr>
+          <w:rFonts w:ascii="Consolas" w:eastAsia="Consolas" w:hAnsi="Consolas" w:cs="Consolas"/>
+        </w:rPr>
+        <w:t xml:space="preserve">localStorage</w:t>
+      </w:r>
+      <w:r>
+        <w:t xml:space="preserve">, người dùng nào sẽ gặp lỗi và lỗi trông ra sao?</w:t>
+      </w:r>
+    </w:p>
+    <w:p>
+      <w:pPr>
+        <w:pStyle w:val="ListParagraph"/>
+        <w:numPr>
+          <w:ilvl w:val="0"/>
+          <w:numId w:val="100"/>
+        </w:numPr>
+      </w:pPr>
+      <w:r>
+        <w:t xml:space="preserve">Vì sao Testing Library tìm nút theo vai trò và tên (</w:t>
+      </w:r>
+      <w:r>
+        <w:rPr>
+          <w:rFonts w:ascii="Consolas" w:eastAsia="Consolas" w:hAnsi="Consolas" w:cs="Consolas"/>
+        </w:rPr>
+        <w:t xml:space="preserve">getByRole</w:t>
+      </w:r>
+      <w:r>
+        <w:t xml:space="preserve">) thay vì theo class?</w:t>
+      </w:r>
+    </w:p>
+    <w:p>
+      <w:pPr>
+        <w:pStyle w:val="ListParagraph"/>
+        <w:numPr>
+          <w:ilvl w:val="0"/>
+          <w:numId w:val="100"/>
+        </w:numPr>
+      </w:pPr>
+      <w:r>
+        <w:t xml:space="preserve">Component shadcn dùng </w:t>
+      </w:r>
+      <w:r>
+        <w:rPr>
+          <w:rFonts w:ascii="Consolas" w:eastAsia="Consolas" w:hAnsi="Consolas" w:cs="Consolas"/>
+        </w:rPr>
+        <w:t xml:space="preserve">data-checked:</w:t>
+      </w:r>
+      <w:r>
+        <w:t xml:space="preserve"> mà CSS chưa định nghĩa variant đó thì chuyện gì xảy ra, và vì sao khó phát hiện?</w:t>
+      </w:r>
+    </w:p>
+    <w:p>
+      <w:pPr>
+        <w:pStyle w:val="ListParagraph"/>
+        <w:numPr>
+          <w:ilvl w:val="0"/>
+          <w:numId w:val="100"/>
+        </w:numPr>
+      </w:pPr>
+      <w:r>
+        <w:t xml:space="preserve">Vì sao </w:t>
+      </w:r>
+      <w:r>
+        <w:rPr>
+          <w:rFonts w:ascii="Consolas" w:eastAsia="Consolas" w:hAnsi="Consolas" w:cs="Consolas"/>
+        </w:rPr>
+        <w:t xml:space="preserve">pnpm build</w:t>
+      </w:r>
+      <w:r>
+        <w:t xml:space="preserve"> phải chạy </w:t>
+      </w:r>
+      <w:r>
+        <w:rPr>
+          <w:rFonts w:ascii="Consolas" w:eastAsia="Consolas" w:hAnsi="Consolas" w:cs="Consolas"/>
+        </w:rPr>
+        <w:t xml:space="preserve">tsc -b</w:t>
+      </w:r>
+      <w:r>
+        <w:t xml:space="preserve"> trước </w:t>
+      </w:r>
+      <w:r>
+        <w:rPr>
+          <w:rFonts w:ascii="Consolas" w:eastAsia="Consolas" w:hAnsi="Consolas" w:cs="Consolas"/>
+        </w:rPr>
+        <w:t xml:space="preserve">vite build</w:t>
+      </w:r>
+      <w:r>
+        <w:t xml:space="preserve">?</w:t>
+      </w:r>
+    </w:p>
+    <w:p>
+      <w:pPr>
+        <w:pStyle w:val="ListParagraph"/>
+        <w:numPr>
+          <w:ilvl w:val="0"/>
+          <w:numId w:val="100"/>
+        </w:numPr>
+      </w:pPr>
+      <w:r>
+        <w:t xml:space="preserve">Nút có </w:t>
+      </w:r>
+      <w:r>
+        <w:rPr>
+          <w:rFonts w:ascii="Consolas" w:eastAsia="Consolas" w:hAnsi="Consolas" w:cs="Consolas"/>
+        </w:rPr>
+        <w:t xml:space="preserve">outline-none</w:t>
+      </w:r>
+      <w:r>
+        <w:t xml:space="preserve"> và </w:t>
+      </w:r>
+      <w:r>
+        <w:rPr>
+          <w:rFonts w:ascii="Consolas" w:eastAsia="Consolas" w:hAnsi="Consolas" w:cs="Consolas"/>
+        </w:rPr>
+        <w:t xml:space="preserve">focus-visible:outline-2</w:t>
+      </w:r>
+      <w:r>
+        <w:t xml:space="preserve"> mà vẫn không hiện viền khi bấm Tab. Vì sao, và kiểm lỗi này bằng cách nào?</w:t>
+      </w:r>
+    </w:p>
+    <w:p>
+      <w:pPr>
+        <w:pStyle w:val="ListParagraph"/>
+        <w:numPr>
+          <w:ilvl w:val="0"/>
+          <w:numId w:val="100"/>
+        </w:numPr>
+      </w:pPr>
+      <w:r>
+        <w:t xml:space="preserve">Vì sao </w:t>
+      </w:r>
+      <w:r>
+        <w:rPr>
+          <w:rFonts w:ascii="Consolas" w:eastAsia="Consolas" w:hAnsi="Consolas" w:cs="Consolas"/>
+        </w:rPr>
+        <w:t xml:space="preserve">cn('shadow-popover', 'shadow-none')</w:t>
+      </w:r>
+      <w:r>
+        <w:t xml:space="preserve"> giữ cả hai class, và wrapper trong </w:t>
+      </w:r>
+      <w:r>
+        <w:rPr>
+          <w:rFonts w:ascii="Consolas" w:eastAsia="Consolas" w:hAnsi="Consolas" w:cs="Consolas"/>
+        </w:rPr>
+        <w:t xml:space="preserve">src/shared/lib/utils.ts</w:t>
+      </w:r>
+      <w:r>
+        <w:t xml:space="preserve"> sửa điều đó thế nào?</w:t>
       </w:r>
     </w:p>
     <w:p/>

</xml_diff>

<commit_message>
docs(knowledge): add UI-01 (app shell, router) to the Phase 1 guide
Section 5: why the web is now built UI first with sample data (D-42), the
route table and layout route, the responsive shell, ShellData and
useShellData, accessible navigation names, the stale-clock bug and the
pure fix with dataUpdatedAt, and how UI-01 was verified. Word copy
regenerated with GenOffice; docs check clean.

Co-Authored-By: Claude Opus 5.5 (1M context) <noreply@anthropic.com>
</commit_message>
<xml_diff>
--- a/docs/knowledge/phase-1-frontend-foundation.docx
+++ b/docs/knowledge/phase-1-frontend-foundation.docx
@@ -106,7 +106,16 @@
         <w:t xml:space="preserve">openspec/changes/fe-f01-web-foundation</w:t>
       </w:r>
       <w:r>
-        <w:t xml:space="preserve"> (D-22 + F01-FE). Đang làm: xong BE-27, BE-28, BE-29, FE-01.</w:t>
+        <w:t xml:space="preserve"> (D-22 + F01-FE), và change </w:t>
+      </w:r>
+      <w:r>
+        <w:rPr>
+          <w:rFonts w:ascii="Consolas" w:eastAsia="Consolas" w:hAnsi="Consolas" w:cs="Consolas"/>
+        </w:rPr>
+        <w:t xml:space="preserve">openspec/changes/fe-ui-overview</w:t>
+      </w:r>
+      <w:r>
+        <w:t xml:space="preserve"> (dựng giao diện trước với dữ liệu mẫu, D-42). Đang làm: xong BE-27, BE-28, BE-29, FE-01, UI-01.</w:t>
         <w:br/>
       </w:r>
       <w:r>
@@ -600,7 +609,71 @@
           </w:tcPr>
           <w:p>
             <w:r>
-              <w:t xml:space="preserve">API client, trang đăng nhập, khung app, nghiệm thu</w:t>
+              <w:t xml:space="preserve">API client, trang đăng nhập, khung app có xác thực, nghiệm thu</w:t>
+            </w:r>
+          </w:p>
+        </w:tc>
+        <w:tc>
+          <w:tcPr>
+            <w:tcW w:w="3120" w:type="dxa"/>
+          </w:tcPr>
+          <w:p>
+            <w:r>
+              <w:t xml:space="preserve">tạm hoãn (D-44)</w:t>
+            </w:r>
+          </w:p>
+        </w:tc>
+      </w:tr>
+      <w:tr>
+        <w:tc>
+          <w:tcPr>
+            <w:tcW w:w="3120" w:type="dxa"/>
+          </w:tcPr>
+          <w:p>
+            <w:r>
+              <w:t xml:space="preserve">UI-01</w:t>
+            </w:r>
+          </w:p>
+        </w:tc>
+        <w:tc>
+          <w:tcPr>
+            <w:tcW w:w="3120" w:type="dxa"/>
+          </w:tcPr>
+          <w:p>
+            <w:r>
+              <w:t xml:space="preserve">Router, khung app co giãn (sidebar / rail / thanh dưới), trang "đang được dựng", 404</w:t>
+            </w:r>
+          </w:p>
+        </w:tc>
+        <w:tc>
+          <w:tcPr>
+            <w:tcW w:w="3120" w:type="dxa"/>
+          </w:tcPr>
+          <w:p>
+            <w:r>
+              <w:t xml:space="preserve">xong</w:t>
+            </w:r>
+          </w:p>
+        </w:tc>
+      </w:tr>
+      <w:tr>
+        <w:tc>
+          <w:tcPr>
+            <w:tcW w:w="3120" w:type="dxa"/>
+          </w:tcPr>
+          <w:p>
+            <w:r>
+              <w:t xml:space="preserve">UI-02…UI-04</w:t>
+            </w:r>
+          </w:p>
+        </w:tc>
+        <w:tc>
+          <w:tcPr>
+            <w:tcW w:w="3120" w:type="dxa"/>
+          </w:tcPr>
+          <w:p>
+            <w:r>
+              <w:t xml:space="preserve">Hợp đồng dữ liệu Tổng quan, các thẻ, nghiệm thu</w:t>
             </w:r>
           </w:p>
         </w:tc>
@@ -7637,6 +7710,1396 @@
     </w:p>
     <w:p>
       <w:pPr>
+        <w:pStyle w:val="Heading2"/>
+      </w:pPr>
+      <w:r>
+        <w:t xml:space="preserve">5. Dựng giao diện trước với dữ liệu mẫu (fe-ui-overview)</w:t>
+      </w:r>
+    </w:p>
+    <w:p>
+      <w:pPr>
+        <w:pStyle w:val="Heading3"/>
+      </w:pPr>
+      <w:r>
+        <w:t xml:space="preserve">5.0 Bức tranh: vì sao đổi thứ tự</w:t>
+      </w:r>
+    </w:p>
+    <w:p>
+      <w:pPr>
+        <w:pStyle w:val="ListParagraph"/>
+        <w:numPr>
+          <w:ilvl w:val="0"/>
+          <w:numId w:val="1"/>
+        </w:numPr>
+      </w:pPr>
+      <w:r>
+        <w:rPr>
+          <w:b/>
+          <w:bCs/>
+        </w:rPr>
+        <w:t xml:space="preserve">Chuyện gì đổi (D-42, người dùng 2026-10-07):</w:t>
+      </w:r>
+      <w:r>
+        <w:t xml:space="preserve"> thay vì làm API client rồi đăng nhập trước (FE-02…FE-05), web được dựng </w:t>
+      </w:r>
+      <w:r>
+        <w:rPr>
+          <w:b/>
+          <w:bCs/>
+        </w:rPr>
+        <w:t xml:space="preserve">từng màn một với dữ liệu mẫu</w:t>
+      </w:r>
+      <w:r>
+        <w:t xml:space="preserve">, chưa có đăng nhập (D-44). Màn đầu tiên là Tổng quan (D-43). Mỗi màn là một change OpenSpec riêng.</w:t>
+      </w:r>
+    </w:p>
+    <w:p>
+      <w:pPr>
+        <w:pStyle w:val="ListParagraph"/>
+        <w:numPr>
+          <w:ilvl w:val="0"/>
+          <w:numId w:val="1"/>
+        </w:numPr>
+      </w:pPr>
+      <w:r>
+        <w:rPr>
+          <w:b/>
+          <w:bCs/>
+        </w:rPr>
+        <w:t xml:space="preserve">"Hợp đồng dữ liệu" là gì:</w:t>
+      </w:r>
+      <w:r>
+        <w:t xml:space="preserve"> mỗi màn có một kiểu TypeScript mô tả đúng dữ liệu nó cần. Kiểu đó là bản "đặt hàng" giao cho backend: backend làm hoặc chỉnh API sao cho trả đúng hình dạng ấy.</w:t>
+      </w:r>
+    </w:p>
+    <w:p>
+      <w:pPr>
+        <w:shd w:val="clear" w:color="auto" w:fill="F2F3F5"/>
+        <w:ind w:left="0"/>
+      </w:pPr>
+      <w:r>
+        <w:rPr>
+          <w:rFonts w:ascii="Consolas" w:eastAsia="Consolas" w:hAnsi="Consolas" w:cs="Consolas"/>
+          <w:sz w:val="19"/>
+          <w:szCs w:val="19"/>
+        </w:rPr>
+        <w:t xml:space="preserve">TRƯỚC (vertical slice):  API backend -&gt; API client -&gt; màn hình</w:t>
+        <w:br/>
+        <w:t xml:space="preserve">SAU (D-42):              màn hình + dữ liệu mẫu</w:t>
+        <w:br/>
+        <w:t xml:space="preserve">                         -&gt; kiểu dữ liệu (hợp đồng)</w:t>
+        <w:br/>
+        <w:t xml:space="preserve">                         -&gt; backend làm API khớp</w:t>
+        <w:br/>
+        <w:t xml:space="preserve">hook useShellData() / useOverview()</w:t>
+        <w:br/>
+        <w:t xml:space="preserve">  hiện tại: trả dữ liệu mẫu</w:t>
+        <w:br/>
+        <w:t xml:space="preserve">  sau này:  gọi API thật (component không phải sửa)</w:t>
+      </w:r>
+    </w:p>
+    <w:p>
+      <w:pPr>
+        <w:pStyle w:val="ListParagraph"/>
+        <w:numPr>
+          <w:ilvl w:val="0"/>
+          <w:numId w:val="1"/>
+        </w:numPr>
+      </w:pPr>
+      <w:r>
+        <w:rPr>
+          <w:b/>
+          <w:bCs/>
+        </w:rPr>
+        <w:t xml:space="preserve">Nguyên tắc của hợp đồng:</w:t>
+      </w:r>
+      <w:r>
+        <w:t xml:space="preserve"> API trả </w:t>
+      </w:r>
+      <w:r>
+        <w:rPr>
+          <w:b/>
+          <w:bCs/>
+        </w:rPr>
+        <w:t xml:space="preserve">dữ liệu thô</w:t>
+      </w:r>
+      <w:r>
+        <w:t xml:space="preserve"> (thời điểm ISO-8601 UTC, số đếm, mã enum); giao diện tự đổi ra chữ ("2 phút trước", "Hai tài khoản..."). Như vậy API không dính vào ngôn ngữ hay múi giờ hiển thị.</w:t>
+      </w:r>
+    </w:p>
+    <w:p>
+      <w:pPr>
+        <w:pStyle w:val="Heading3"/>
+      </w:pPr>
+      <w:r>
+        <w:t xml:space="preserve">5.1 React Router: bảng route và route bố cục</w:t>
+      </w:r>
+    </w:p>
+    <w:p>
+      <w:pPr>
+        <w:pStyle w:val="ListParagraph"/>
+        <w:numPr>
+          <w:ilvl w:val="0"/>
+          <w:numId w:val="1"/>
+        </w:numPr>
+      </w:pPr>
+      <w:r>
+        <w:rPr>
+          <w:b/>
+          <w:bCs/>
+        </w:rPr>
+        <w:t xml:space="preserve">Ở đâu:</w:t>
+      </w:r>
+      <w:r>
+        <w:t xml:space="preserve"> </w:t>
+      </w:r>
+      <w:r>
+        <w:rPr>
+          <w:rFonts w:ascii="Consolas" w:eastAsia="Consolas" w:hAnsi="Consolas" w:cs="Consolas"/>
+        </w:rPr>
+        <w:t xml:space="preserve">src/app/router.tsx</w:t>
+      </w:r>
+      <w:r>
+        <w:t xml:space="preserve"> (bảng route), </w:t>
+      </w:r>
+      <w:r>
+        <w:rPr>
+          <w:rFonts w:ascii="Consolas" w:eastAsia="Consolas" w:hAnsi="Consolas" w:cs="Consolas"/>
+        </w:rPr>
+        <w:t xml:space="preserve">src/main.tsx</w:t>
+      </w:r>
+      <w:r>
+        <w:t xml:space="preserve"> (tạo router trình duyệt).</w:t>
+      </w:r>
+    </w:p>
+    <w:p>
+      <w:pPr>
+        <w:pStyle w:val="ListParagraph"/>
+        <w:numPr>
+          <w:ilvl w:val="0"/>
+          <w:numId w:val="1"/>
+        </w:numPr>
+      </w:pPr>
+      <w:r>
+        <w:rPr>
+          <w:b/>
+          <w:bCs/>
+        </w:rPr>
+        <w:t xml:space="preserve">Là gì:</w:t>
+      </w:r>
+      <w:r>
+        <w:t xml:space="preserve"> một mảng mô tả "đường dẫn nào hiện cái gì". Route </w:t>
+      </w:r>
+      <w:r>
+        <w:rPr>
+          <w:rFonts w:ascii="Consolas" w:eastAsia="Consolas" w:hAnsi="Consolas" w:cs="Consolas"/>
+        </w:rPr>
+        <w:t xml:space="preserve">/</w:t>
+      </w:r>
+      <w:r>
+        <w:t xml:space="preserve"> có </w:t>
+      </w:r>
+      <w:r>
+        <w:rPr>
+          <w:rFonts w:ascii="Consolas" w:eastAsia="Consolas" w:hAnsi="Consolas" w:cs="Consolas"/>
+        </w:rPr>
+        <w:t xml:space="preserve">element: &lt;AppShell /&gt;</w:t>
+      </w:r>
+      <w:r>
+        <w:t xml:space="preserve"> và các route con; </w:t>
+      </w:r>
+      <w:r>
+        <w:rPr>
+          <w:rFonts w:ascii="Consolas" w:eastAsia="Consolas" w:hAnsi="Consolas" w:cs="Consolas"/>
+        </w:rPr>
+        <w:t xml:space="preserve">AppShell</w:t>
+      </w:r>
+      <w:r>
+        <w:t xml:space="preserve"> đặt </w:t>
+      </w:r>
+      <w:r>
+        <w:rPr>
+          <w:rFonts w:ascii="Consolas" w:eastAsia="Consolas" w:hAnsi="Consolas" w:cs="Consolas"/>
+        </w:rPr>
+        <w:t xml:space="preserve">&lt;Outlet /&gt;</w:t>
+      </w:r>
+      <w:r>
+        <w:t xml:space="preserve"> ở chỗ muốn hiện trang con. Nhờ vậy khung app vẽ một lần, chỉ phần nội dung đổi khi chuyển trang.</w:t>
+      </w:r>
+    </w:p>
+    <w:p>
+      <w:pPr>
+        <w:shd w:val="clear" w:color="auto" w:fill="F2F3F5"/>
+        <w:ind w:left="0"/>
+      </w:pPr>
+      <w:r>
+        <w:rPr>
+          <w:rFonts w:ascii="Consolas" w:eastAsia="Consolas" w:hAnsi="Consolas" w:cs="Consolas"/>
+          <w:sz w:val="19"/>
+          <w:szCs w:val="19"/>
+        </w:rPr>
+        <w:t xml:space="preserve">/                 AppShell (khung app)</w:t>
+        <w:br/>
+        <w:t xml:space="preserve">  (index)         -&gt; chuyển tới /overview (Navigate replace)</w:t>
+        <w:br/>
+        <w:t xml:space="preserve">  overview, inbox, calendar, ..., more</w:t>
+        <w:br/>
+        <w:t xml:space="preserve">                  -&gt; trang "đang được dựng" (UI-03 thay /overview)</w:t>
+        <w:br/>
+        <w:t xml:space="preserve">*                 NotFoundPage (404, NGOÀI khung app)</w:t>
+      </w:r>
+    </w:p>
+    <w:p>
+      <w:pPr>
+        <w:pStyle w:val="ListParagraph"/>
+        <w:numPr>
+          <w:ilvl w:val="0"/>
+          <w:numId w:val="1"/>
+        </w:numPr>
+      </w:pPr>
+      <w:r>
+        <w:rPr>
+          <w:rFonts w:ascii="Consolas" w:eastAsia="Consolas" w:hAnsi="Consolas" w:cs="Consolas"/>
+          <w:b/>
+          <w:bCs/>
+        </w:rPr>
+        <w:t xml:space="preserve">NavLink</w:t>
+      </w:r>
+      <w:r>
+        <w:rPr>
+          <w:b/>
+          <w:bCs/>
+        </w:rPr>
+        <w:t xml:space="preserve">:</w:t>
+      </w:r>
+      <w:r>
+        <w:t xml:space="preserve"> giống </w:t>
+      </w:r>
+      <w:r>
+        <w:rPr>
+          <w:rFonts w:ascii="Consolas" w:eastAsia="Consolas" w:hAnsi="Consolas" w:cs="Consolas"/>
+        </w:rPr>
+        <w:t xml:space="preserve">&lt;a&gt;</w:t>
+      </w:r>
+      <w:r>
+        <w:t xml:space="preserve"> nhưng tự gắn </w:t>
+      </w:r>
+      <w:r>
+        <w:rPr>
+          <w:rFonts w:ascii="Consolas" w:eastAsia="Consolas" w:hAnsi="Consolas" w:cs="Consolas"/>
+        </w:rPr>
+        <w:t xml:space="preserve">aria-current="page"</w:t>
+      </w:r>
+      <w:r>
+        <w:t xml:space="preserve"> khi đường dẫn đang mở. CSS dựa vào thuộc tính đó (</w:t>
+      </w:r>
+      <w:r>
+        <w:rPr>
+          <w:rFonts w:ascii="Consolas" w:eastAsia="Consolas" w:hAnsi="Consolas" w:cs="Consolas"/>
+        </w:rPr>
+        <w:t xml:space="preserve">aria-[current=page]:bg-raised</w:t>
+      </w:r>
+      <w:r>
+        <w:t xml:space="preserve">) để tô mục đang chọn, nên không cần tự viết logic "mục nào đang mở".</w:t>
+      </w:r>
+    </w:p>
+    <w:p>
+      <w:pPr>
+        <w:pStyle w:val="ListParagraph"/>
+        <w:numPr>
+          <w:ilvl w:val="0"/>
+          <w:numId w:val="1"/>
+        </w:numPr>
+      </w:pPr>
+      <w:r>
+        <w:rPr>
+          <w:b/>
+          <w:bCs/>
+        </w:rPr>
+        <w:t xml:space="preserve">Vì sao bảng route tách khỏi việc tạo router:</w:t>
+      </w:r>
+      <w:r>
+        <w:t xml:space="preserve"> test dùng </w:t>
+      </w:r>
+      <w:r>
+        <w:rPr>
+          <w:rFonts w:ascii="Consolas" w:eastAsia="Consolas" w:hAnsi="Consolas" w:cs="Consolas"/>
+        </w:rPr>
+        <w:t xml:space="preserve">createMemoryRouter(routes, { initialEntries: ['/calendar'] })</w:t>
+      </w:r>
+      <w:r>
+        <w:t xml:space="preserve"> (router giữ đường dẫn trong bộ nhớ, không cần thanh địa chỉ); app thật dùng </w:t>
+      </w:r>
+      <w:r>
+        <w:rPr>
+          <w:rFonts w:ascii="Consolas" w:eastAsia="Consolas" w:hAnsi="Consolas" w:cs="Consolas"/>
+        </w:rPr>
+        <w:t xml:space="preserve">createBrowserRouter(routes)</w:t>
+      </w:r>
+      <w:r>
+        <w:t xml:space="preserve"> trong </w:t>
+      </w:r>
+      <w:r>
+        <w:rPr>
+          <w:rFonts w:ascii="Consolas" w:eastAsia="Consolas" w:hAnsi="Consolas" w:cs="Consolas"/>
+        </w:rPr>
+        <w:t xml:space="preserve">main.tsx</w:t>
+      </w:r>
+      <w:r>
+        <w:t xml:space="preserve">. Cùng một bảng route, hai cách chạy.</w:t>
+      </w:r>
+    </w:p>
+    <w:p>
+      <w:pPr>
+        <w:pStyle w:val="ListParagraph"/>
+        <w:numPr>
+          <w:ilvl w:val="0"/>
+          <w:numId w:val="1"/>
+        </w:numPr>
+      </w:pPr>
+      <w:r>
+        <w:rPr>
+          <w:b/>
+          <w:bCs/>
+        </w:rPr>
+        <w:t xml:space="preserve">Bẫy:</w:t>
+      </w:r>
+      <w:r>
+        <w:t xml:space="preserve"> </w:t>
+      </w:r>
+      <w:r>
+        <w:rPr>
+          <w:rFonts w:ascii="Consolas" w:eastAsia="Consolas" w:hAnsi="Consolas" w:cs="Consolas"/>
+        </w:rPr>
+        <w:t xml:space="preserve">replace</w:t>
+      </w:r>
+      <w:r>
+        <w:t xml:space="preserve"> trong </w:t>
+      </w:r>
+      <w:r>
+        <w:rPr>
+          <w:rFonts w:ascii="Consolas" w:eastAsia="Consolas" w:hAnsi="Consolas" w:cs="Consolas"/>
+        </w:rPr>
+        <w:t xml:space="preserve">&lt;Navigate to="/overview" replace /&gt;</w:t>
+      </w:r>
+      <w:r>
+        <w:t xml:space="preserve"> thay mục lịch sử thay vì thêm mục mới; thiếu nó thì bấm "Back" từ </w:t>
+      </w:r>
+      <w:r>
+        <w:rPr>
+          <w:rFonts w:ascii="Consolas" w:eastAsia="Consolas" w:hAnsi="Consolas" w:cs="Consolas"/>
+        </w:rPr>
+        <w:t xml:space="preserve">/overview</w:t>
+      </w:r>
+      <w:r>
+        <w:t xml:space="preserve"> sẽ về </w:t>
+      </w:r>
+      <w:r>
+        <w:rPr>
+          <w:rFonts w:ascii="Consolas" w:eastAsia="Consolas" w:hAnsi="Consolas" w:cs="Consolas"/>
+        </w:rPr>
+        <w:t xml:space="preserve">/</w:t>
+      </w:r>
+      <w:r>
+        <w:t xml:space="preserve"> rồi lại bị đẩy sang </w:t>
+      </w:r>
+      <w:r>
+        <w:rPr>
+          <w:rFonts w:ascii="Consolas" w:eastAsia="Consolas" w:hAnsi="Consolas" w:cs="Consolas"/>
+        </w:rPr>
+        <w:t xml:space="preserve">/overview</w:t>
+      </w:r>
+      <w:r>
+        <w:t xml:space="preserve">, kẹt mãi.</w:t>
+      </w:r>
+    </w:p>
+    <w:p>
+      <w:pPr>
+        <w:pStyle w:val="Heading3"/>
+      </w:pPr>
+      <w:r>
+        <w:t xml:space="preserve">5.2 Khung app co giãn theo kích thước</w:t>
+      </w:r>
+    </w:p>
+    <w:p>
+      <w:pPr>
+        <w:pStyle w:val="ListParagraph"/>
+        <w:numPr>
+          <w:ilvl w:val="0"/>
+          <w:numId w:val="1"/>
+        </w:numPr>
+      </w:pPr>
+      <w:r>
+        <w:rPr>
+          <w:b/>
+          <w:bCs/>
+        </w:rPr>
+        <w:t xml:space="preserve">Ở đâu:</w:t>
+      </w:r>
+      <w:r>
+        <w:t xml:space="preserve"> </w:t>
+      </w:r>
+      <w:r>
+        <w:rPr>
+          <w:rFonts w:ascii="Consolas" w:eastAsia="Consolas" w:hAnsi="Consolas" w:cs="Consolas"/>
+        </w:rPr>
+        <w:t xml:space="preserve">src/app/shell/AppShell.tsx</w:t>
+      </w:r>
+      <w:r>
+        <w:t xml:space="preserve">, </w:t>
+      </w:r>
+      <w:r>
+        <w:rPr>
+          <w:rFonts w:ascii="Consolas" w:eastAsia="Consolas" w:hAnsi="Consolas" w:cs="Consolas"/>
+        </w:rPr>
+        <w:t xml:space="preserve">Sidebar.tsx</w:t>
+      </w:r>
+      <w:r>
+        <w:t xml:space="preserve">, </w:t>
+      </w:r>
+      <w:r>
+        <w:rPr>
+          <w:rFonts w:ascii="Consolas" w:eastAsia="Consolas" w:hAnsi="Consolas" w:cs="Consolas"/>
+        </w:rPr>
+        <w:t xml:space="preserve">Rail.tsx</w:t>
+      </w:r>
+      <w:r>
+        <w:t xml:space="preserve">, </w:t>
+      </w:r>
+      <w:r>
+        <w:rPr>
+          <w:rFonts w:ascii="Consolas" w:eastAsia="Consolas" w:hAnsi="Consolas" w:cs="Consolas"/>
+        </w:rPr>
+        <w:t xml:space="preserve">TabBar.tsx</w:t>
+      </w:r>
+      <w:r>
+        <w:t xml:space="preserve">, </w:t>
+      </w:r>
+      <w:r>
+        <w:rPr>
+          <w:rFonts w:ascii="Consolas" w:eastAsia="Consolas" w:hAnsi="Consolas" w:cs="Consolas"/>
+        </w:rPr>
+        <w:t xml:space="preserve">Topbar.tsx</w:t>
+      </w:r>
+      <w:r>
+        <w:t xml:space="preserve">.</w:t>
+      </w:r>
+    </w:p>
+    <w:p>
+      <w:pPr>
+        <w:pStyle w:val="ListParagraph"/>
+        <w:numPr>
+          <w:ilvl w:val="0"/>
+          <w:numId w:val="1"/>
+        </w:numPr>
+      </w:pPr>
+      <w:r>
+        <w:rPr>
+          <w:b/>
+          <w:bCs/>
+        </w:rPr>
+        <w:t xml:space="preserve">Breakpoint của Tailwind:</w:t>
+      </w:r>
+      <w:r>
+        <w:t xml:space="preserve"> class có tiền tố </w:t>
+      </w:r>
+      <w:r>
+        <w:rPr>
+          <w:rFonts w:ascii="Consolas" w:eastAsia="Consolas" w:hAnsi="Consolas" w:cs="Consolas"/>
+        </w:rPr>
+        <w:t xml:space="preserve">md:</w:t>
+      </w:r>
+      <w:r>
+        <w:t xml:space="preserve"> chỉ áp từ 768px, </w:t>
+      </w:r>
+      <w:r>
+        <w:rPr>
+          <w:rFonts w:ascii="Consolas" w:eastAsia="Consolas" w:hAnsi="Consolas" w:cs="Consolas"/>
+        </w:rPr>
+        <w:t xml:space="preserve">xl:</w:t>
+      </w:r>
+      <w:r>
+        <w:t xml:space="preserve"> từ 1280px, đúng mốc </w:t>
+      </w:r>
+      <w:r>
+        <w:rPr>
+          <w:rFonts w:ascii="Consolas" w:eastAsia="Consolas" w:hAnsi="Consolas" w:cs="Consolas"/>
+        </w:rPr>
+        <w:t xml:space="preserve">Breakpoints</w:t>
+      </w:r>
+      <w:r>
+        <w:t xml:space="preserve"> của canvas. "Mobile trước": class không tiền tố là cho màn nhỏ, rồi ghi đè dần cho màn lớn.</w:t>
+      </w:r>
+    </w:p>
+    <w:p>
+      <w:pPr>
+        <w:shd w:val="clear" w:color="auto" w:fill="F2F3F5"/>
+        <w:ind w:left="0"/>
+      </w:pPr>
+      <w:r>
+        <w:rPr>
+          <w:rFonts w:ascii="Consolas" w:eastAsia="Consolas" w:hAnsi="Consolas" w:cs="Consolas"/>
+          <w:sz w:val="19"/>
+          <w:szCs w:val="19"/>
+        </w:rPr>
+        <w:t xml:space="preserve">                    &lt; 768px         768-1279px        &gt;= 1280px</w:t>
+        <w:br/>
+        <w:t xml:space="preserve">Sidebar 248px       hidden          hidden            xl:flex</w:t>
+        <w:br/>
+        <w:t xml:space="preserve">Rail 72px           hidden          md:flex           xl:hidden</w:t>
+        <w:br/>
+        <w:t xml:space="preserve">TabBar dưới đáy     (hiện)          md:hidden         md:hidden</w:t>
+        <w:br/>
+        <w:t xml:space="preserve">lưới AppShell       2 hàng          md:grid-cols-[72px_1fr]   xl:grid-cols-[248px_1fr]</w:t>
+      </w:r>
+    </w:p>
+    <w:p>
+      <w:pPr>
+        <w:pStyle w:val="ListParagraph"/>
+        <w:numPr>
+          <w:ilvl w:val="0"/>
+          <w:numId w:val="1"/>
+        </w:numPr>
+      </w:pPr>
+      <w:r>
+        <w:rPr>
+          <w:b/>
+          <w:bCs/>
+        </w:rPr>
+        <w:t xml:space="preserve">Vì sao dựng cả ba ngay:</w:t>
+      </w:r>
+      <w:r>
+        <w:t xml:space="preserve"> khung app dùng chung cho mọi màn; sửa bố cục về sau tốn công và dễ hỏng hơn làm đúng từ đầu.</w:t>
+      </w:r>
+    </w:p>
+    <w:p>
+      <w:pPr>
+        <w:pStyle w:val="ListParagraph"/>
+        <w:numPr>
+          <w:ilvl w:val="0"/>
+          <w:numId w:val="1"/>
+        </w:numPr>
+      </w:pPr>
+      <w:r>
+        <w:rPr>
+          <w:b/>
+          <w:bCs/>
+        </w:rPr>
+        <w:t xml:space="preserve">Bẫy, test không thấy CSS:</w:t>
+      </w:r>
+      <w:r>
+        <w:t xml:space="preserve"> jsdom không chạy CSS, nên trong test cả sidebar, rail lẫn thanh dưới đều "hiện" cùng lúc. Test tìm trong từng phần bằng </w:t>
+      </w:r>
+      <w:r>
+        <w:rPr>
+          <w:rFonts w:ascii="Consolas" w:eastAsia="Consolas" w:hAnsi="Consolas" w:cs="Consolas"/>
+        </w:rPr>
+        <w:t xml:space="preserve">data-slot</w:t>
+      </w:r>
+      <w:r>
+        <w:t xml:space="preserve"> (</w:t>
+      </w:r>
+      <w:r>
+        <w:rPr>
+          <w:rFonts w:ascii="Consolas" w:eastAsia="Consolas" w:hAnsi="Consolas" w:cs="Consolas"/>
+        </w:rPr>
+        <w:t xml:space="preserve">shellPart('rail')</w:t>
+      </w:r>
+      <w:r>
+        <w:t xml:space="preserve">). Việc phần nào thật sự hiện ở bề rộng nào thì kiểm trên Chrome thật (mục 5.6).</w:t>
+      </w:r>
+    </w:p>
+    <w:p>
+      <w:pPr>
+        <w:pStyle w:val="Heading3"/>
+      </w:pPr>
+      <w:r>
+        <w:t xml:space="preserve">5.3 Dữ liệu của khung app: </w:t>
+      </w:r>
+      <w:r>
+        <w:rPr>
+          <w:rFonts w:ascii="Consolas" w:eastAsia="Consolas" w:hAnsi="Consolas" w:cs="Consolas"/>
+        </w:rPr>
+        <w:t xml:space="preserve">ShellData</w:t>
+      </w:r>
+      <w:r>
+        <w:t xml:space="preserve">, dữ liệu mẫu, </w:t>
+      </w:r>
+      <w:r>
+        <w:rPr>
+          <w:rFonts w:ascii="Consolas" w:eastAsia="Consolas" w:hAnsi="Consolas" w:cs="Consolas"/>
+        </w:rPr>
+        <w:t xml:space="preserve">useShellData</w:t>
+      </w:r>
+    </w:p>
+    <w:p>
+      <w:pPr>
+        <w:pStyle w:val="ListParagraph"/>
+        <w:numPr>
+          <w:ilvl w:val="0"/>
+          <w:numId w:val="1"/>
+        </w:numPr>
+      </w:pPr>
+      <w:r>
+        <w:rPr>
+          <w:b/>
+          <w:bCs/>
+        </w:rPr>
+        <w:t xml:space="preserve">Ở đâu:</w:t>
+      </w:r>
+      <w:r>
+        <w:t xml:space="preserve"> </w:t>
+      </w:r>
+      <w:r>
+        <w:rPr>
+          <w:rFonts w:ascii="Consolas" w:eastAsia="Consolas" w:hAnsi="Consolas" w:cs="Consolas"/>
+        </w:rPr>
+        <w:t xml:space="preserve">src/app/shell/shell.types.ts</w:t>
+      </w:r>
+      <w:r>
+        <w:t xml:space="preserve">, </w:t>
+      </w:r>
+      <w:r>
+        <w:rPr>
+          <w:rFonts w:ascii="Consolas" w:eastAsia="Consolas" w:hAnsi="Consolas" w:cs="Consolas"/>
+        </w:rPr>
+        <w:t xml:space="preserve">shell.sample.ts</w:t>
+      </w:r>
+      <w:r>
+        <w:t xml:space="preserve">, </w:t>
+      </w:r>
+      <w:r>
+        <w:rPr>
+          <w:rFonts w:ascii="Consolas" w:eastAsia="Consolas" w:hAnsi="Consolas" w:cs="Consolas"/>
+        </w:rPr>
+        <w:t xml:space="preserve">useShellData.ts</w:t>
+      </w:r>
+      <w:r>
+        <w:t xml:space="preserve">.</w:t>
+      </w:r>
+    </w:p>
+    <w:p>
+      <w:pPr>
+        <w:pStyle w:val="ListParagraph"/>
+        <w:numPr>
+          <w:ilvl w:val="0"/>
+          <w:numId w:val="1"/>
+        </w:numPr>
+      </w:pPr>
+      <w:r>
+        <w:rPr>
+          <w:b/>
+          <w:bCs/>
+        </w:rPr>
+        <w:t xml:space="preserve">Là gì:</w:t>
+      </w:r>
+      <w:r>
+        <w:t xml:space="preserve"> </w:t>
+      </w:r>
+      <w:r>
+        <w:rPr>
+          <w:rFonts w:ascii="Consolas" w:eastAsia="Consolas" w:hAnsi="Consolas" w:cs="Consolas"/>
+        </w:rPr>
+        <w:t xml:space="preserve">ShellData</w:t>
+      </w:r>
+      <w:r>
+        <w:t xml:space="preserve"> gồm tên owner, số tài khoản, các số đếm trên điều hướng, số thông báo chưa đọc, trạng thái đồng bộ. </w:t>
+      </w:r>
+      <w:r>
+        <w:rPr>
+          <w:rFonts w:ascii="Consolas" w:eastAsia="Consolas" w:hAnsi="Consolas" w:cs="Consolas"/>
+        </w:rPr>
+        <w:t xml:space="preserve">createShellSample(now)</w:t>
+      </w:r>
+      <w:r>
+        <w:t xml:space="preserve"> sinh dữ liệu mẫu theo canvas, mốc thời gian tính theo </w:t>
+      </w:r>
+      <w:r>
+        <w:rPr>
+          <w:rFonts w:ascii="Consolas" w:eastAsia="Consolas" w:hAnsi="Consolas" w:cs="Consolas"/>
+        </w:rPr>
+        <w:t xml:space="preserve">now</w:t>
+      </w:r>
+      <w:r>
+        <w:t xml:space="preserve"> ("2 phút trước" lúc nào mở cũng đúng). </w:t>
+      </w:r>
+      <w:r>
+        <w:rPr>
+          <w:rFonts w:ascii="Consolas" w:eastAsia="Consolas" w:hAnsi="Consolas" w:cs="Consolas"/>
+        </w:rPr>
+        <w:t xml:space="preserve">useShellData()</w:t>
+      </w:r>
+      <w:r>
+        <w:t xml:space="preserve"> lấy dữ liệu qua TanStack Query.</w:t>
+      </w:r>
+    </w:p>
+    <w:p>
+      <w:pPr>
+        <w:pStyle w:val="ListParagraph"/>
+        <w:numPr>
+          <w:ilvl w:val="0"/>
+          <w:numId w:val="1"/>
+        </w:numPr>
+      </w:pPr>
+      <w:r>
+        <w:rPr>
+          <w:b/>
+          <w:bCs/>
+        </w:rPr>
+        <w:t xml:space="preserve">Vì sao đi qua TanStack Query dù chỉ là dữ liệu mẫu:</w:t>
+      </w:r>
+      <w:r>
+        <w:t xml:space="preserve"> khi có API, chỉ đổi </w:t>
+      </w:r>
+      <w:r>
+        <w:rPr>
+          <w:rFonts w:ascii="Consolas" w:eastAsia="Consolas" w:hAnsi="Consolas" w:cs="Consolas"/>
+        </w:rPr>
+        <w:t xml:space="preserve">queryFn</w:t>
+      </w:r>
+      <w:r>
+        <w:t xml:space="preserve"> từ "trả mẫu" sang "gọi </w:t>
+      </w:r>
+      <w:r>
+        <w:rPr>
+          <w:rFonts w:ascii="Consolas" w:eastAsia="Consolas" w:hAnsi="Consolas" w:cs="Consolas"/>
+        </w:rPr>
+        <w:t xml:space="preserve">/api/...</w:t>
+      </w:r>
+      <w:r>
+        <w:t xml:space="preserve">"; cache, trạng thái đang tải và việc tải lại đã có sẵn. </w:t>
+      </w:r>
+      <w:r>
+        <w:rPr>
+          <w:rFonts w:ascii="Consolas" w:eastAsia="Consolas" w:hAnsi="Consolas" w:cs="Consolas"/>
+        </w:rPr>
+        <w:t xml:space="preserve">staleTime: Infinity</w:t>
+      </w:r>
+      <w:r>
+        <w:t xml:space="preserve"> để dữ liệu mẫu không bị tải lại.</w:t>
+      </w:r>
+    </w:p>
+    <w:p>
+      <w:pPr>
+        <w:pStyle w:val="ListParagraph"/>
+        <w:numPr>
+          <w:ilvl w:val="0"/>
+          <w:numId w:val="1"/>
+        </w:numPr>
+      </w:pPr>
+      <w:r>
+        <w:rPr>
+          <w:b/>
+          <w:bCs/>
+        </w:rPr>
+        <w:t xml:space="preserve">Vì sao tách khỏi dữ liệu màn Tổng quan (chốt khi làm):</w:t>
+      </w:r>
+      <w:r>
+        <w:t xml:space="preserve"> khung app hiện ở </w:t>
+      </w:r>
+      <w:r>
+        <w:rPr>
+          <w:b/>
+          <w:bCs/>
+        </w:rPr>
+        <w:t xml:space="preserve">mọi</w:t>
+      </w:r>
+      <w:r>
+        <w:t xml:space="preserve"> màn. Nếu số đếm nằm trong dữ liệu Tổng quan, màn nào cũng phải tải dữ liệu Tổng quan chỉ để vẽ khung.</w:t>
+      </w:r>
+    </w:p>
+    <w:p>
+      <w:pPr>
+        <w:pStyle w:val="ListParagraph"/>
+        <w:numPr>
+          <w:ilvl w:val="0"/>
+          <w:numId w:val="1"/>
+        </w:numPr>
+      </w:pPr>
+      <w:r>
+        <w:rPr>
+          <w:b/>
+          <w:bCs/>
+        </w:rPr>
+        <w:t xml:space="preserve">Test nạp sẵn dữ liệu:</w:t>
+      </w:r>
+      <w:r>
+        <w:t xml:space="preserve"> </w:t>
+      </w:r>
+      <w:r>
+        <w:rPr>
+          <w:rFonts w:ascii="Consolas" w:eastAsia="Consolas" w:hAnsi="Consolas" w:cs="Consolas"/>
+        </w:rPr>
+        <w:t xml:space="preserve">renderApp(path, { shell })</w:t>
+      </w:r>
+      <w:r>
+        <w:t xml:space="preserve"> tạo một </w:t>
+      </w:r>
+      <w:r>
+        <w:rPr>
+          <w:rFonts w:ascii="Consolas" w:eastAsia="Consolas" w:hAnsi="Consolas" w:cs="Consolas"/>
+        </w:rPr>
+        <w:t xml:space="preserve">QueryClient</w:t>
+      </w:r>
+      <w:r>
+        <w:t xml:space="preserve"> mới rồi </w:t>
+      </w:r>
+      <w:r>
+        <w:rPr>
+          <w:rFonts w:ascii="Consolas" w:eastAsia="Consolas" w:hAnsi="Consolas" w:cs="Consolas"/>
+        </w:rPr>
+        <w:t xml:space="preserve">setQueryData(SHELL_QUERY_KEY, shell)</w:t>
+      </w:r>
+      <w:r>
+        <w:t xml:space="preserve"> trước khi vẽ, nên test đổi được số đếm, tên, trạng thái mà không phải giả hàm nào.</w:t>
+      </w:r>
+    </w:p>
+    <w:p>
+      <w:pPr>
+        <w:pStyle w:val="Heading3"/>
+      </w:pPr>
+      <w:r>
+        <w:t xml:space="preserve">5.4 Điều hướng đọc được bằng trình đọc màn hình</w:t>
+      </w:r>
+    </w:p>
+    <w:p>
+      <w:pPr>
+        <w:pStyle w:val="ListParagraph"/>
+        <w:numPr>
+          <w:ilvl w:val="0"/>
+          <w:numId w:val="1"/>
+        </w:numPr>
+      </w:pPr>
+      <w:r>
+        <w:rPr>
+          <w:b/>
+          <w:bCs/>
+        </w:rPr>
+        <w:t xml:space="preserve">Ở đâu:</w:t>
+      </w:r>
+      <w:r>
+        <w:t xml:space="preserve"> </w:t>
+      </w:r>
+      <w:r>
+        <w:rPr>
+          <w:rFonts w:ascii="Consolas" w:eastAsia="Consolas" w:hAnsi="Consolas" w:cs="Consolas"/>
+        </w:rPr>
+        <w:t xml:space="preserve">navItems.ts</w:t>
+      </w:r>
+      <w:r>
+        <w:t xml:space="preserve"> (</w:t>
+      </w:r>
+      <w:r>
+        <w:rPr>
+          <w:rFonts w:ascii="Consolas" w:eastAsia="Consolas" w:hAnsi="Consolas" w:cs="Consolas"/>
+        </w:rPr>
+        <w:t xml:space="preserve">badgeOf</w:t>
+      </w:r>
+      <w:r>
+        <w:t xml:space="preserve">), các link trong </w:t>
+      </w:r>
+      <w:r>
+        <w:rPr>
+          <w:rFonts w:ascii="Consolas" w:eastAsia="Consolas" w:hAnsi="Consolas" w:cs="Consolas"/>
+        </w:rPr>
+        <w:t xml:space="preserve">Sidebar</w:t>
+      </w:r>
+      <w:r>
+        <w:t xml:space="preserve">, </w:t>
+      </w:r>
+      <w:r>
+        <w:rPr>
+          <w:rFonts w:ascii="Consolas" w:eastAsia="Consolas" w:hAnsi="Consolas" w:cs="Consolas"/>
+        </w:rPr>
+        <w:t xml:space="preserve">Rail</w:t>
+      </w:r>
+      <w:r>
+        <w:t xml:space="preserve">, </w:t>
+      </w:r>
+      <w:r>
+        <w:rPr>
+          <w:rFonts w:ascii="Consolas" w:eastAsia="Consolas" w:hAnsi="Consolas" w:cs="Consolas"/>
+        </w:rPr>
+        <w:t xml:space="preserve">TabBar</w:t>
+      </w:r>
+      <w:r>
+        <w:t xml:space="preserve">.</w:t>
+      </w:r>
+    </w:p>
+    <w:p>
+      <w:pPr>
+        <w:pStyle w:val="ListParagraph"/>
+        <w:numPr>
+          <w:ilvl w:val="0"/>
+          <w:numId w:val="1"/>
+        </w:numPr>
+      </w:pPr>
+      <w:r>
+        <w:rPr>
+          <w:b/>
+          <w:bCs/>
+        </w:rPr>
+        <w:t xml:space="preserve">Vấn đề:</w:t>
+      </w:r>
+      <w:r>
+        <w:t xml:space="preserve"> link "Hộp thư" với con số 12 đặt cạnh nhau sẽ được đọc thành "Hộp thư12", vô nghĩa. Trên rail chỉ có icon, không có chữ nào để đọc.</w:t>
+      </w:r>
+    </w:p>
+    <w:p>
+      <w:pPr>
+        <w:pStyle w:val="ListParagraph"/>
+        <w:numPr>
+          <w:ilvl w:val="0"/>
+          <w:numId w:val="1"/>
+        </w:numPr>
+      </w:pPr>
+      <w:r>
+        <w:rPr>
+          <w:b/>
+          <w:bCs/>
+        </w:rPr>
+        <w:t xml:space="preserve">Cách làm:</w:t>
+      </w:r>
+      <w:r>
+        <w:t xml:space="preserve"> con số hiện ra nhưng có </w:t>
+      </w:r>
+      <w:r>
+        <w:rPr>
+          <w:rFonts w:ascii="Consolas" w:eastAsia="Consolas" w:hAnsi="Consolas" w:cs="Consolas"/>
+        </w:rPr>
+        <w:t xml:space="preserve">aria-hidden="true"</w:t>
+      </w:r>
+      <w:r>
+        <w:t xml:space="preserve"> (trình đọc màn hình bỏ qua); thêm một đoạn chữ </w:t>
+      </w:r>
+      <w:r>
+        <w:rPr>
+          <w:rFonts w:ascii="Consolas" w:eastAsia="Consolas" w:hAnsi="Consolas" w:cs="Consolas"/>
+        </w:rPr>
+        <w:t xml:space="preserve">sr-only</w:t>
+      </w:r>
+      <w:r>
+        <w:t xml:space="preserve"> (ẩn với mắt, vẫn được đọc): ", 12 chưa đọc". Rail dùng </w:t>
+      </w:r>
+      <w:r>
+        <w:rPr>
+          <w:rFonts w:ascii="Consolas" w:eastAsia="Consolas" w:hAnsi="Consolas" w:cs="Consolas"/>
+        </w:rPr>
+        <w:t xml:space="preserve">aria-label="Hộp thư, 12 chưa đọc"</w:t>
+      </w:r>
+      <w:r>
+        <w:t xml:space="preserve">. Số 0 thì không đọc gì thêm.</w:t>
+      </w:r>
+    </w:p>
+    <w:p>
+      <w:pPr>
+        <w:pStyle w:val="ListParagraph"/>
+        <w:numPr>
+          <w:ilvl w:val="0"/>
+          <w:numId w:val="1"/>
+        </w:numPr>
+      </w:pPr>
+      <w:r>
+        <w:rPr>
+          <w:b/>
+          <w:bCs/>
+        </w:rPr>
+        <w:t xml:space="preserve">Landmark:</w:t>
+      </w:r>
+      <w:r>
+        <w:t xml:space="preserve"> </w:t>
+      </w:r>
+      <w:r>
+        <w:rPr>
+          <w:rFonts w:ascii="Consolas" w:eastAsia="Consolas" w:hAnsi="Consolas" w:cs="Consolas"/>
+        </w:rPr>
+        <w:t xml:space="preserve">&lt;nav aria-label="Điều hướng chính"&gt;</w:t>
+      </w:r>
+      <w:r>
+        <w:t xml:space="preserve"> cho trình đọc màn hình nhảy thẳng tới vùng điều hướng. Ba bản (sidebar, rail, thanh dưới) cùng tên vẫn ổn, vì phần bị </w:t>
+      </w:r>
+      <w:r>
+        <w:rPr>
+          <w:rFonts w:ascii="Consolas" w:eastAsia="Consolas" w:hAnsi="Consolas" w:cs="Consolas"/>
+        </w:rPr>
+        <w:t xml:space="preserve">display: none</w:t>
+      </w:r>
+      <w:r>
+        <w:t xml:space="preserve"> thì cũng biến khỏi cây trợ năng, lúc nào cũng chỉ còn một.</w:t>
+      </w:r>
+    </w:p>
+    <w:p>
+      <w:pPr>
+        <w:pStyle w:val="Heading3"/>
+      </w:pPr>
+      <w:r>
+        <w:t xml:space="preserve">5.5 Thời gian: "2 phút trước" và cái bẫy đồng hồ cũ</w:t>
+      </w:r>
+    </w:p>
+    <w:p>
+      <w:pPr>
+        <w:pStyle w:val="ListParagraph"/>
+        <w:numPr>
+          <w:ilvl w:val="0"/>
+          <w:numId w:val="1"/>
+        </w:numPr>
+      </w:pPr>
+      <w:r>
+        <w:rPr>
+          <w:b/>
+          <w:bCs/>
+        </w:rPr>
+        <w:t xml:space="preserve">Ở đâu:</w:t>
+      </w:r>
+      <w:r>
+        <w:t xml:space="preserve"> </w:t>
+      </w:r>
+      <w:r>
+        <w:rPr>
+          <w:rFonts w:ascii="Consolas" w:eastAsia="Consolas" w:hAnsi="Consolas" w:cs="Consolas"/>
+        </w:rPr>
+        <w:t xml:space="preserve">src/shared/time/relative.ts</w:t>
+      </w:r>
+      <w:r>
+        <w:t xml:space="preserve"> (</w:t>
+      </w:r>
+      <w:r>
+        <w:rPr>
+          <w:rFonts w:ascii="Consolas" w:eastAsia="Consolas" w:hAnsi="Consolas" w:cs="Consolas"/>
+        </w:rPr>
+        <w:t xml:space="preserve">formatAgo</w:t>
+      </w:r>
+      <w:r>
+        <w:t xml:space="preserve">), </w:t>
+      </w:r>
+      <w:r>
+        <w:rPr>
+          <w:rFonts w:ascii="Consolas" w:eastAsia="Consolas" w:hAnsi="Consolas" w:cs="Consolas"/>
+        </w:rPr>
+        <w:t xml:space="preserve">useNow.ts</w:t>
+      </w:r>
+      <w:r>
+        <w:t xml:space="preserve">, </w:t>
+      </w:r>
+      <w:r>
+        <w:rPr>
+          <w:rFonts w:ascii="Consolas" w:eastAsia="Consolas" w:hAnsi="Consolas" w:cs="Consolas"/>
+        </w:rPr>
+        <w:t xml:space="preserve">Topbar.tsx</w:t>
+      </w:r>
+      <w:r>
+        <w:t xml:space="preserve">.</w:t>
+      </w:r>
+    </w:p>
+    <w:p>
+      <w:pPr>
+        <w:pStyle w:val="ListParagraph"/>
+        <w:numPr>
+          <w:ilvl w:val="0"/>
+          <w:numId w:val="1"/>
+        </w:numPr>
+      </w:pPr>
+      <w:r>
+        <w:rPr>
+          <w:rFonts w:ascii="Consolas" w:eastAsia="Consolas" w:hAnsi="Consolas" w:cs="Consolas"/>
+          <w:b/>
+          <w:bCs/>
+        </w:rPr>
+        <w:t xml:space="preserve">formatAgo(from, now)</w:t>
+      </w:r>
+      <w:r>
+        <w:rPr>
+          <w:b/>
+          <w:bCs/>
+        </w:rPr>
+        <w:t xml:space="preserve">:</w:t>
+      </w:r>
+      <w:r>
+        <w:t xml:space="preserve"> dưới 1 phút "vừa xong", dưới 1 giờ "N phút trước", dưới 1 ngày "N giờ trước", còn lại "N ngày trước"; giờ ở tương lai (đồng hồ hai máy lệch nhau) cũng là "vừa xong". Nhận </w:t>
+      </w:r>
+      <w:r>
+        <w:rPr>
+          <w:rFonts w:ascii="Consolas" w:eastAsia="Consolas" w:hAnsi="Consolas" w:cs="Consolas"/>
+        </w:rPr>
+        <w:t xml:space="preserve">now</w:t>
+      </w:r>
+      <w:r>
+        <w:t xml:space="preserve"> từ ngoài để test truyền một thời điểm cố định.</w:t>
+      </w:r>
+    </w:p>
+    <w:p>
+      <w:pPr>
+        <w:pStyle w:val="ListParagraph"/>
+        <w:numPr>
+          <w:ilvl w:val="0"/>
+          <w:numId w:val="1"/>
+        </w:numPr>
+      </w:pPr>
+      <w:r>
+        <w:rPr>
+          <w:rFonts w:ascii="Consolas" w:eastAsia="Consolas" w:hAnsi="Consolas" w:cs="Consolas"/>
+          <w:b/>
+          <w:bCs/>
+        </w:rPr>
+        <w:t xml:space="preserve">useNow()</w:t>
+      </w:r>
+      <w:r>
+        <w:rPr>
+          <w:b/>
+          <w:bCs/>
+        </w:rPr>
+        <w:t xml:space="preserve">:</w:t>
+      </w:r>
+      <w:r>
+        <w:t xml:space="preserve"> giữ giờ hiện tại trong state và cập nhật mỗi phút, để chữ "2 phút trước" tự thành "3 phút trước".</w:t>
+      </w:r>
+    </w:p>
+    <w:p>
+      <w:pPr>
+        <w:pStyle w:val="ListParagraph"/>
+        <w:numPr>
+          <w:ilvl w:val="0"/>
+          <w:numId w:val="1"/>
+        </w:numPr>
+      </w:pPr>
+      <w:r>
+        <w:rPr>
+          <w:b/>
+          <w:bCs/>
+        </w:rPr>
+        <w:t xml:space="preserve">Lỗi thật, ảnh chụp bắt được:</w:t>
+      </w:r>
+      <w:r>
+        <w:t xml:space="preserve"> thanh trên hiện "1 phút trước" cho dữ liệu 2 phút. Lý do: </w:t>
+      </w:r>
+      <w:r>
+        <w:rPr>
+          <w:rFonts w:ascii="Consolas" w:eastAsia="Consolas" w:hAnsi="Consolas" w:cs="Consolas"/>
+        </w:rPr>
+        <w:t xml:space="preserve">useNow</w:t>
+      </w:r>
+      <w:r>
+        <w:t xml:space="preserve"> chốt giờ lúc khung app vừa hiện, còn dữ liệu đến sau đó một chút; phép trừ dùng một "bây giờ" đã cũ, nên sai tới gần một phút (với API thật cũng vậy).</w:t>
+      </w:r>
+    </w:p>
+    <w:p>
+      <w:pPr>
+        <w:pStyle w:val="ListParagraph"/>
+        <w:numPr>
+          <w:ilvl w:val="0"/>
+          <w:numId w:val="1"/>
+        </w:numPr>
+      </w:pPr>
+      <w:r>
+        <w:rPr>
+          <w:b/>
+          <w:bCs/>
+        </w:rPr>
+        <w:t xml:space="preserve">Cách sửa sai đầu tiên, và vì sao bỏ:</w:t>
+      </w:r>
+      <w:r>
+        <w:t xml:space="preserve"> đọc </w:t>
+      </w:r>
+      <w:r>
+        <w:rPr>
+          <w:rFonts w:ascii="Consolas" w:eastAsia="Consolas" w:hAnsi="Consolas" w:cs="Consolas"/>
+        </w:rPr>
+        <w:t xml:space="preserve">new Date()</w:t>
+      </w:r>
+      <w:r>
+        <w:t xml:space="preserve"> ngay trong lúc render. Lint báo </w:t>
+      </w:r>
+      <w:r>
+        <w:rPr>
+          <w:rFonts w:ascii="Consolas" w:eastAsia="Consolas" w:hAnsi="Consolas" w:cs="Consolas"/>
+        </w:rPr>
+        <w:t xml:space="preserve">react(purity)</w:t>
+      </w:r>
+      <w:r>
+        <w:t xml:space="preserve">: hàm render của React phải </w:t>
+      </w:r>
+      <w:r>
+        <w:rPr>
+          <w:b/>
+          <w:bCs/>
+        </w:rPr>
+        <w:t xml:space="preserve">thuần</w:t>
+      </w:r>
+      <w:r>
+        <w:t xml:space="preserve">, cùng đầu vào thì cùng kết quả; React (và React Compiler) dựa vào điều đó để vẽ lại đúng.</w:t>
+      </w:r>
+    </w:p>
+    <w:p>
+      <w:pPr>
+        <w:pStyle w:val="ListParagraph"/>
+        <w:numPr>
+          <w:ilvl w:val="0"/>
+          <w:numId w:val="1"/>
+        </w:numPr>
+      </w:pPr>
+      <w:r>
+        <w:rPr>
+          <w:b/>
+          <w:bCs/>
+        </w:rPr>
+        <w:t xml:space="preserve">Cách sửa đúng:</w:t>
+      </w:r>
+      <w:r>
+        <w:t xml:space="preserve"> TanStack Query ghi lại thời điểm nhận dữ liệu (</w:t>
+      </w:r>
+      <w:r>
+        <w:rPr>
+          <w:rFonts w:ascii="Consolas" w:eastAsia="Consolas" w:hAnsi="Consolas" w:cs="Consolas"/>
+        </w:rPr>
+        <w:t xml:space="preserve">dataUpdatedAt</w:t>
+      </w:r>
+      <w:r>
+        <w:t xml:space="preserve">). Thanh trên lấy mốc </w:t>
+      </w:r>
+      <w:r>
+        <w:rPr>
+          <w:b/>
+          <w:bCs/>
+        </w:rPr>
+        <w:t xml:space="preserve">muộn hơn</w:t>
+      </w:r>
+      <w:r>
+        <w:t xml:space="preserve"> giữa nhịp đồng hồ và lúc nhận dữ liệu: </w:t>
+      </w:r>
+      <w:r>
+        <w:rPr>
+          <w:rFonts w:ascii="Consolas" w:eastAsia="Consolas" w:hAnsi="Consolas" w:cs="Consolas"/>
+        </w:rPr>
+        <w:t xml:space="preserve">new Date(Math.max(clock.getTime(), receivedAt))</w:t>
+      </w:r>
+      <w:r>
+        <w:t xml:space="preserve">. Vừa thuần, vừa đúng.</w:t>
+      </w:r>
+    </w:p>
+    <w:p>
+      <w:pPr>
+        <w:pStyle w:val="ListParagraph"/>
+        <w:numPr>
+          <w:ilvl w:val="0"/>
+          <w:numId w:val="1"/>
+        </w:numPr>
+      </w:pPr>
+      <w:r>
+        <w:rPr>
+          <w:b/>
+          <w:bCs/>
+        </w:rPr>
+        <w:t xml:space="preserve">Test tái hiện:</w:t>
+      </w:r>
+      <w:r>
+        <w:t xml:space="preserve"> dùng </w:t>
+      </w:r>
+      <w:r>
+        <w:rPr>
+          <w:rFonts w:ascii="Consolas" w:eastAsia="Consolas" w:hAnsi="Consolas" w:cs="Consolas"/>
+        </w:rPr>
+        <w:t xml:space="preserve">vi.useFakeTimers({ toFake: ['Date'] })</w:t>
+      </w:r>
+      <w:r>
+        <w:t xml:space="preserve"> để điều khiển giờ: khung app hiện lúc 07:00:00, dữ liệu đến lúc 07:00:50 với lần đồng bộ lúc 06:58:50. Bản lỗi hiện "1 phút trước", test đỏ; bản sửa hiện "2 phút trước". </w:t>
+      </w:r>
+      <w:r>
+        <w:rPr>
+          <w:b/>
+          <w:bCs/>
+        </w:rPr>
+        <w:t xml:space="preserve">Bẫy trong chính test:</w:t>
+      </w:r>
+      <w:r>
+        <w:t xml:space="preserve"> lần viết đầu, dữ liệu nạp sẵn đã hiện đúng chữ "2 phút trước" nên test xanh mà không chứng minh gì; phải cho trạng thái ban đầu hiện chữ khác.</w:t>
+      </w:r>
+    </w:p>
+    <w:p>
+      <w:pPr>
+        <w:pStyle w:val="Heading3"/>
+      </w:pPr>
+      <w:r>
+        <w:t xml:space="preserve">5.6 Kiểm chứng UI-01</w:t>
+      </w:r>
+    </w:p>
+    <w:p>
+      <w:pPr>
+        <w:pStyle w:val="ListParagraph"/>
+        <w:numPr>
+          <w:ilvl w:val="0"/>
+          <w:numId w:val="1"/>
+        </w:numPr>
+      </w:pPr>
+      <w:r>
+        <w:rPr>
+          <w:b/>
+          <w:bCs/>
+        </w:rPr>
+        <w:t xml:space="preserve">Test viết trước:</w:t>
+      </w:r>
+      <w:r>
+        <w:t xml:space="preserve"> 20 test mới đỏ đúng lý do (chưa có sidebar, rail, thanh dưới, thanh trên, tiêu đề trang), viết code xong thì xanh; cuối cùng 32/32.</w:t>
+      </w:r>
+    </w:p>
+    <w:p>
+      <w:pPr>
+        <w:pStyle w:val="ListParagraph"/>
+        <w:numPr>
+          <w:ilvl w:val="0"/>
+          <w:numId w:val="1"/>
+        </w:numPr>
+      </w:pPr>
+      <w:r>
+        <w:rPr>
+          <w:b/>
+          <w:bCs/>
+        </w:rPr>
+        <w:t xml:space="preserve">Kiểm tra ngược:</w:t>
+      </w:r>
+      <w:r>
+        <w:t xml:space="preserve"> 13 lỗi cố ý, 11 bị bắt ngay. Hai lỗi sống sót đều là </w:t>
+      </w:r>
+      <w:r>
+        <w:rPr>
+          <w:b/>
+          <w:bCs/>
+        </w:rPr>
+        <w:t xml:space="preserve">test còn hở</w:t>
+      </w:r>
+      <w:r>
+        <w:t xml:space="preserve">, không phải code tương đương: (1) số 0 vẫn được đọc ", 0 chưa đọc" trên rail và thanh dưới (sidebar vô tình che lỗi vì nó không vẽ số 0); (2) trạng thái IDLE nhưng còn mốc đồng bộ cũ (đã xóa hết tài khoản). Thêm hai test, chạy lại thì cả hai bị bắt. Lần cuối 14/14.</w:t>
+      </w:r>
+    </w:p>
+    <w:p>
+      <w:pPr>
+        <w:pStyle w:val="ListParagraph"/>
+        <w:numPr>
+          <w:ilvl w:val="0"/>
+          <w:numId w:val="1"/>
+        </w:numPr>
+      </w:pPr>
+      <w:r>
+        <w:rPr>
+          <w:b/>
+          <w:bCs/>
+        </w:rPr>
+        <w:t xml:space="preserve">Chrome thật</w:t>
+      </w:r>
+      <w:r>
+        <w:t xml:space="preserve"> (DevTools Protocol, bản build), 1440 / 1024 / 390px × sáng / tối: mỗi bề rộng chỉ hiện đúng một loại điều hướng, không tràn ngang, Tab qua điều hướng có viền focus, </w:t>
+      </w:r>
+      <w:r>
+        <w:rPr>
+          <w:rFonts w:ascii="Consolas" w:eastAsia="Consolas" w:hAnsi="Consolas" w:cs="Consolas"/>
+        </w:rPr>
+        <w:t xml:space="preserve">/calendar</w:t>
+      </w:r>
+      <w:r>
+        <w:t xml:space="preserve"> hiện trang "đang được dựng", đường dẫn lạ hiện 404.</w:t>
+      </w:r>
+    </w:p>
+    <w:p>
+      <w:pPr>
         <w:pBdr>
           <w:bottom w:val="single" w:sz="4" w:space="0" w:color="auto"/>
         </w:pBdr>
@@ -8168,6 +9631,153 @@
       </w:r>
       <w:r>
         <w:t xml:space="preserve"> sửa điều đó thế nào?</w:t>
+      </w:r>
+    </w:p>
+    <w:p>
+      <w:pPr>
+        <w:pStyle w:val="ListParagraph"/>
+        <w:numPr>
+          <w:ilvl w:val="0"/>
+          <w:numId w:val="100"/>
+        </w:numPr>
+      </w:pPr>
+      <w:r>
+        <w:t xml:space="preserve">"Hợp đồng dữ liệu" của một màn là gì, và vì sao API nên trả dữ liệu thô thay vì chữ đã định dạng?</w:t>
+      </w:r>
+    </w:p>
+    <w:p>
+      <w:pPr>
+        <w:pStyle w:val="ListParagraph"/>
+        <w:numPr>
+          <w:ilvl w:val="0"/>
+          <w:numId w:val="100"/>
+        </w:numPr>
+      </w:pPr>
+      <w:r>
+        <w:t xml:space="preserve">Route bố cục với </w:t>
+      </w:r>
+      <w:r>
+        <w:rPr>
+          <w:rFonts w:ascii="Consolas" w:eastAsia="Consolas" w:hAnsi="Consolas" w:cs="Consolas"/>
+        </w:rPr>
+        <w:t xml:space="preserve">&lt;Outlet /&gt;</w:t>
+      </w:r>
+      <w:r>
+        <w:t xml:space="preserve"> giúp gì? Vì sao 404 nằm ngoài khung app?</w:t>
+      </w:r>
+    </w:p>
+    <w:p>
+      <w:pPr>
+        <w:pStyle w:val="ListParagraph"/>
+        <w:numPr>
+          <w:ilvl w:val="0"/>
+          <w:numId w:val="100"/>
+        </w:numPr>
+      </w:pPr>
+      <w:r>
+        <w:t xml:space="preserve">Vì sao </w:t>
+      </w:r>
+      <w:r>
+        <w:rPr>
+          <w:rFonts w:ascii="Consolas" w:eastAsia="Consolas" w:hAnsi="Consolas" w:cs="Consolas"/>
+        </w:rPr>
+        <w:t xml:space="preserve">&lt;Navigate to="/overview" replace /&gt;</w:t>
+      </w:r>
+      <w:r>
+        <w:t xml:space="preserve"> cần </w:t>
+      </w:r>
+      <w:r>
+        <w:rPr>
+          <w:rFonts w:ascii="Consolas" w:eastAsia="Consolas" w:hAnsi="Consolas" w:cs="Consolas"/>
+        </w:rPr>
+        <w:t xml:space="preserve">replace</w:t>
+      </w:r>
+      <w:r>
+        <w:t xml:space="preserve">?</w:t>
+      </w:r>
+    </w:p>
+    <w:p>
+      <w:pPr>
+        <w:pStyle w:val="ListParagraph"/>
+        <w:numPr>
+          <w:ilvl w:val="0"/>
+          <w:numId w:val="100"/>
+        </w:numPr>
+      </w:pPr>
+      <w:r>
+        <w:t xml:space="preserve">Vì sao trong test cả sidebar, rail và thanh dưới đều "hiện", và test xử lý chuyện đó thế nào?</w:t>
+      </w:r>
+    </w:p>
+    <w:p>
+      <w:pPr>
+        <w:pStyle w:val="ListParagraph"/>
+        <w:numPr>
+          <w:ilvl w:val="0"/>
+          <w:numId w:val="100"/>
+        </w:numPr>
+      </w:pPr>
+      <w:r>
+        <w:t xml:space="preserve">Con số 12 cạnh chữ "Hộp thư" được trình đọc màn hình đọc ra sao nếu không làm gì, và </w:t>
+      </w:r>
+      <w:r>
+        <w:rPr>
+          <w:rFonts w:ascii="Consolas" w:eastAsia="Consolas" w:hAnsi="Consolas" w:cs="Consolas"/>
+        </w:rPr>
+        <w:t xml:space="preserve">aria-hidden</w:t>
+      </w:r>
+      <w:r>
+        <w:t xml:space="preserve"> + </w:t>
+      </w:r>
+      <w:r>
+        <w:rPr>
+          <w:rFonts w:ascii="Consolas" w:eastAsia="Consolas" w:hAnsi="Consolas" w:cs="Consolas"/>
+        </w:rPr>
+        <w:t xml:space="preserve">sr-only</w:t>
+      </w:r>
+      <w:r>
+        <w:t xml:space="preserve"> sửa thế nào?</w:t>
+      </w:r>
+    </w:p>
+    <w:p>
+      <w:pPr>
+        <w:pStyle w:val="ListParagraph"/>
+        <w:numPr>
+          <w:ilvl w:val="0"/>
+          <w:numId w:val="100"/>
+        </w:numPr>
+      </w:pPr>
+      <w:r>
+        <w:t xml:space="preserve">Vì sao đọc </w:t>
+      </w:r>
+      <w:r>
+        <w:rPr>
+          <w:rFonts w:ascii="Consolas" w:eastAsia="Consolas" w:hAnsi="Consolas" w:cs="Consolas"/>
+        </w:rPr>
+        <w:t xml:space="preserve">new Date()</w:t>
+      </w:r>
+      <w:r>
+        <w:t xml:space="preserve"> ngay trong render là sai, và </w:t>
+      </w:r>
+      <w:r>
+        <w:rPr>
+          <w:rFonts w:ascii="Consolas" w:eastAsia="Consolas" w:hAnsi="Consolas" w:cs="Consolas"/>
+        </w:rPr>
+        <w:t xml:space="preserve">dataUpdatedAt</w:t>
+      </w:r>
+      <w:r>
+        <w:t xml:space="preserve"> giải quyết lỗi "1 phút trước" thế nào?</w:t>
+      </w:r>
+    </w:p>
+    <w:p>
+      <w:pPr>
+        <w:pStyle w:val="ListParagraph"/>
+        <w:numPr>
+          <w:ilvl w:val="0"/>
+          <w:numId w:val="100"/>
+        </w:numPr>
+      </w:pPr>
+      <w:r>
+        <w:t xml:space="preserve">Một lỗi cố ý sống sót nói lên điều gì? Hai lỗi sống sót ở UI-01 là gì?</w:t>
       </w:r>
     </w:p>
     <w:p/>

</xml_diff>

<commit_message>
docs: add UI-02 and UI-03 to the Phase 1 guide and the project state
Knowledge guide sections 5.7-5.10: the Tổng quan data contract and its
null sections, dates in a time zone and the fixed test time zone, one set
of components for three card layouts, labelled regions and described
charts, and how UI-02/UI-03 were verified (mutations, frozen browser
clock). Word copy regenerated with GenOffice; docs check clean.

Project state: UI-01..UI-03 done with evidence; next UI-04 (fe-ui lines
only).

Co-Authored-By: Claude Opus 5.5 (1M context) <noreply@anthropic.com>
</commit_message>
<xml_diff>
--- a/docs/knowledge/phase-1-frontend-foundation.docx
+++ b/docs/knowledge/phase-1-frontend-foundation.docx
@@ -115,7 +115,7 @@
         <w:t xml:space="preserve">openspec/changes/fe-ui-overview</w:t>
       </w:r>
       <w:r>
-        <w:t xml:space="preserve"> (dựng giao diện trước với dữ liệu mẫu, D-42). Đang làm: xong BE-27, BE-28, BE-29, FE-01, UI-01.</w:t>
+        <w:t xml:space="preserve"> (dựng giao diện trước với dữ liệu mẫu, D-42). Đang làm: xong BE-27, BE-28, BE-29, FE-01, UI-01, UI-02, UI-03.</w:t>
         <w:br/>
       </w:r>
       <w:r>
@@ -663,7 +663,7 @@
           </w:tcPr>
           <w:p>
             <w:r>
-              <w:t xml:space="preserve">UI-02…UI-04</w:t>
+              <w:t xml:space="preserve">UI-02</w:t>
             </w:r>
           </w:p>
         </w:tc>
@@ -673,7 +673,71 @@
           </w:tcPr>
           <w:p>
             <w:r>
-              <w:t xml:space="preserve">Hợp đồng dữ liệu Tổng quan, các thẻ, nghiệm thu</w:t>
+              <w:t xml:space="preserve">Hợp đồng dữ liệu Tổng quan, dữ liệu mẫu, hàm định dạng giờ và chữ</w:t>
+            </w:r>
+          </w:p>
+        </w:tc>
+        <w:tc>
+          <w:tcPr>
+            <w:tcW w:w="3120" w:type="dxa"/>
+          </w:tcPr>
+          <w:p>
+            <w:r>
+              <w:t xml:space="preserve">xong</w:t>
+            </w:r>
+          </w:p>
+        </w:tc>
+      </w:tr>
+      <w:tr>
+        <w:tc>
+          <w:tcPr>
+            <w:tcW w:w="3120" w:type="dxa"/>
+          </w:tcPr>
+          <w:p>
+            <w:r>
+              <w:t xml:space="preserve">UI-03</w:t>
+            </w:r>
+          </w:p>
+        </w:tc>
+        <w:tc>
+          <w:tcPr>
+            <w:tcW w:w="3120" w:type="dxa"/>
+          </w:tcPr>
+          <w:p>
+            <w:r>
+              <w:t xml:space="preserve">Màn Tổng quan: phần đầu trang và 7 thẻ, co giãn theo canvas; thanh trên sửa theo canvas</w:t>
+            </w:r>
+          </w:p>
+        </w:tc>
+        <w:tc>
+          <w:tcPr>
+            <w:tcW w:w="3120" w:type="dxa"/>
+          </w:tcPr>
+          <w:p>
+            <w:r>
+              <w:t xml:space="preserve">xong</w:t>
+            </w:r>
+          </w:p>
+        </w:tc>
+      </w:tr>
+      <w:tr>
+        <w:tc>
+          <w:tcPr>
+            <w:tcW w:w="3120" w:type="dxa"/>
+          </w:tcPr>
+          <w:p>
+            <w:r>
+              <w:t xml:space="preserve">UI-04</w:t>
+            </w:r>
+          </w:p>
+        </w:tc>
+        <w:tc>
+          <w:tcPr>
+            <w:tcW w:w="3120" w:type="dxa"/>
+          </w:tcPr>
+          <w:p>
+            <w:r>
+              <w:t xml:space="preserve">Nghiệm thu, chốt hợp đồng dữ liệu, archive</w:t>
             </w:r>
           </w:p>
         </w:tc>
@@ -9100,6 +9164,1032 @@
     </w:p>
     <w:p>
       <w:pPr>
+        <w:pStyle w:val="Heading3"/>
+      </w:pPr>
+      <w:r>
+        <w:t xml:space="preserve">5.7 Hợp đồng dữ liệu Tổng quan và dữ liệu mẫu (UI-02)</w:t>
+      </w:r>
+    </w:p>
+    <w:p>
+      <w:pPr>
+        <w:pStyle w:val="ListParagraph"/>
+        <w:numPr>
+          <w:ilvl w:val="0"/>
+          <w:numId w:val="1"/>
+        </w:numPr>
+      </w:pPr>
+      <w:r>
+        <w:rPr>
+          <w:b/>
+          <w:bCs/>
+        </w:rPr>
+        <w:t xml:space="preserve">Ở đâu:</w:t>
+      </w:r>
+      <w:r>
+        <w:t xml:space="preserve"> </w:t>
+      </w:r>
+      <w:r>
+        <w:rPr>
+          <w:rFonts w:ascii="Consolas" w:eastAsia="Consolas" w:hAnsi="Consolas" w:cs="Consolas"/>
+        </w:rPr>
+        <w:t xml:space="preserve">src/features/overview/overview.types.ts</w:t>
+      </w:r>
+      <w:r>
+        <w:t xml:space="preserve"> (</w:t>
+      </w:r>
+      <w:r>
+        <w:rPr>
+          <w:rFonts w:ascii="Consolas" w:eastAsia="Consolas" w:hAnsi="Consolas" w:cs="Consolas"/>
+        </w:rPr>
+        <w:t xml:space="preserve">OverviewData</w:t>
+      </w:r>
+      <w:r>
+        <w:t xml:space="preserve">), </w:t>
+      </w:r>
+      <w:r>
+        <w:rPr>
+          <w:rFonts w:ascii="Consolas" w:eastAsia="Consolas" w:hAnsi="Consolas" w:cs="Consolas"/>
+        </w:rPr>
+        <w:t xml:space="preserve">overview.sample.ts</w:t>
+      </w:r>
+      <w:r>
+        <w:t xml:space="preserve">, </w:t>
+      </w:r>
+      <w:r>
+        <w:rPr>
+          <w:rFonts w:ascii="Consolas" w:eastAsia="Consolas" w:hAnsi="Consolas" w:cs="Consolas"/>
+        </w:rPr>
+        <w:t xml:space="preserve">useOverview.ts</w:t>
+      </w:r>
+      <w:r>
+        <w:t xml:space="preserve">; bản chép trong </w:t>
+      </w:r>
+      <w:r>
+        <w:rPr>
+          <w:rFonts w:ascii="Consolas" w:eastAsia="Consolas" w:hAnsi="Consolas" w:cs="Consolas"/>
+        </w:rPr>
+        <w:t xml:space="preserve">openspec/changes/fe-ui-overview/design.md</w:t>
+      </w:r>
+      <w:r>
+        <w:t xml:space="preserve"> kèm bảng "đã có / cần thêm / API mới".</w:t>
+      </w:r>
+    </w:p>
+    <w:p>
+      <w:pPr>
+        <w:pStyle w:val="ListParagraph"/>
+        <w:numPr>
+          <w:ilvl w:val="0"/>
+          <w:numId w:val="1"/>
+        </w:numPr>
+      </w:pPr>
+      <w:r>
+        <w:rPr>
+          <w:b/>
+          <w:bCs/>
+        </w:rPr>
+        <w:t xml:space="preserve">Cấu trúc:</w:t>
+      </w:r>
+      <w:r>
+        <w:t xml:space="preserve"> </w:t>
+      </w:r>
+      <w:r>
+        <w:rPr>
+          <w:rFonts w:ascii="Consolas" w:eastAsia="Consolas" w:hAnsi="Consolas" w:cs="Consolas"/>
+        </w:rPr>
+        <w:t xml:space="preserve">providers</w:t>
+      </w:r>
+      <w:r>
+        <w:t xml:space="preserve"> (danh mục provider, lấy từ </w:t>
+      </w:r>
+      <w:r>
+        <w:rPr>
+          <w:rFonts w:ascii="Consolas" w:eastAsia="Consolas" w:hAnsi="Consolas" w:cs="Consolas"/>
+        </w:rPr>
+        <w:t xml:space="preserve">GET /api/providers</w:t>
+      </w:r>
+      <w:r>
+        <w:t xml:space="preserve"> đã có), </w:t>
+      </w:r>
+      <w:r>
+        <w:rPr>
+          <w:rFonts w:ascii="Consolas" w:eastAsia="Consolas" w:hAnsi="Consolas" w:cs="Consolas"/>
+        </w:rPr>
+        <w:t xml:space="preserve">accounts</w:t>
+      </w:r>
+      <w:r>
+        <w:t xml:space="preserve">, rồi năm phần </w:t>
+      </w:r>
+      <w:r>
+        <w:rPr>
+          <w:rFonts w:ascii="Consolas" w:eastAsia="Consolas" w:hAnsi="Consolas" w:cs="Consolas"/>
+        </w:rPr>
+        <w:t xml:space="preserve">inbox</w:t>
+      </w:r>
+      <w:r>
+        <w:t xml:space="preserve">, </w:t>
+      </w:r>
+      <w:r>
+        <w:rPr>
+          <w:rFonts w:ascii="Consolas" w:eastAsia="Consolas" w:hAnsi="Consolas" w:cs="Consolas"/>
+        </w:rPr>
+        <w:t xml:space="preserve">today</w:t>
+      </w:r>
+      <w:r>
+        <w:t xml:space="preserve">, </w:t>
+      </w:r>
+      <w:r>
+        <w:rPr>
+          <w:rFonts w:ascii="Consolas" w:eastAsia="Consolas" w:hAnsi="Consolas" w:cs="Consolas"/>
+        </w:rPr>
+        <w:t xml:space="preserve">syncActivity</w:t>
+      </w:r>
+      <w:r>
+        <w:t xml:space="preserve">, </w:t>
+      </w:r>
+      <w:r>
+        <w:rPr>
+          <w:rFonts w:ascii="Consolas" w:eastAsia="Consolas" w:hAnsi="Consolas" w:cs="Consolas"/>
+        </w:rPr>
+        <w:t xml:space="preserve">registrations</w:t>
+      </w:r>
+      <w:r>
+        <w:t xml:space="preserve">, </w:t>
+      </w:r>
+      <w:r>
+        <w:rPr>
+          <w:rFonts w:ascii="Consolas" w:eastAsia="Consolas" w:hAnsi="Consolas" w:cs="Consolas"/>
+        </w:rPr>
+        <w:t xml:space="preserve">activity</w:t>
+      </w:r>
+      <w:r>
+        <w:t xml:space="preserve">. Năm phần này </w:t>
+      </w:r>
+      <w:r>
+        <w:rPr>
+          <w:b/>
+          <w:bCs/>
+        </w:rPr>
+        <w:t xml:space="preserve">được phép là </w:t>
+      </w:r>
+      <w:r>
+        <w:rPr>
+          <w:rFonts w:ascii="Consolas" w:eastAsia="Consolas" w:hAnsi="Consolas" w:cs="Consolas"/>
+          <w:b/>
+          <w:bCs/>
+        </w:rPr>
+        <w:t xml:space="preserve">null</w:t>
+      </w:r>
+      <w:r>
+        <w:t xml:space="preserve">: backend chưa làm phần nào thì trả </w:t>
+      </w:r>
+      <w:r>
+        <w:rPr>
+          <w:rFonts w:ascii="Consolas" w:eastAsia="Consolas" w:hAnsi="Consolas" w:cs="Consolas"/>
+        </w:rPr>
+        <w:t xml:space="preserve">null</w:t>
+      </w:r>
+      <w:r>
+        <w:t xml:space="preserve">, thẻ đó hiện "Chưa có dữ liệu", các thẻ khác vẫn chạy. Nhờ vậy backend làm </w:t>
+      </w:r>
+      <w:r>
+        <w:rPr>
+          <w:rFonts w:ascii="Consolas" w:eastAsia="Consolas" w:hAnsi="Consolas" w:cs="Consolas"/>
+        </w:rPr>
+        <w:t xml:space="preserve">GET /api/overview</w:t>
+      </w:r>
+      <w:r>
+        <w:t xml:space="preserve"> được từng phần.</w:t>
+      </w:r>
+    </w:p>
+    <w:p>
+      <w:pPr>
+        <w:pStyle w:val="ListParagraph"/>
+        <w:numPr>
+          <w:ilvl w:val="0"/>
+          <w:numId w:val="1"/>
+        </w:numPr>
+      </w:pPr>
+      <w:r>
+        <w:rPr>
+          <w:b/>
+          <w:bCs/>
+        </w:rPr>
+        <w:t xml:space="preserve">Vì sao có </w:t>
+      </w:r>
+      <w:r>
+        <w:rPr>
+          <w:rFonts w:ascii="Consolas" w:eastAsia="Consolas" w:hAnsi="Consolas" w:cs="Consolas"/>
+          <w:b/>
+          <w:bCs/>
+        </w:rPr>
+        <w:t xml:space="preserve">providers</w:t>
+      </w:r>
+      <w:r>
+        <w:rPr>
+          <w:b/>
+          <w:bCs/>
+        </w:rPr>
+        <w:t xml:space="preserve"> trong dữ liệu:</w:t>
+      </w:r>
+      <w:r>
+        <w:t xml:space="preserve"> để giao diện gọi tên "Gmail", "Zalo" theo dữ liệu, không viết cứng. Provider lạ (ví dụ </w:t>
+      </w:r>
+      <w:r>
+        <w:rPr>
+          <w:rFonts w:ascii="Consolas" w:eastAsia="Consolas" w:hAnsi="Consolas" w:cs="Consolas"/>
+        </w:rPr>
+        <w:t xml:space="preserve">telegram</w:t>
+      </w:r>
+      <w:r>
+        <w:t xml:space="preserve">) thì viết hoa chữ đầu.</w:t>
+      </w:r>
+    </w:p>
+    <w:p>
+      <w:pPr>
+        <w:pStyle w:val="ListParagraph"/>
+        <w:numPr>
+          <w:ilvl w:val="0"/>
+          <w:numId w:val="1"/>
+        </w:numPr>
+      </w:pPr>
+      <w:r>
+        <w:rPr>
+          <w:b/>
+          <w:bCs/>
+        </w:rPr>
+        <w:t xml:space="preserve">Kiểu "hoặc cái này hoặc cái kia" của TypeScript:</w:t>
+      </w:r>
+      <w:r>
+        <w:t xml:space="preserve"> </w:t>
+      </w:r>
+      <w:r>
+        <w:rPr>
+          <w:rFonts w:ascii="Consolas" w:eastAsia="Consolas" w:hAnsi="Consolas" w:cs="Consolas"/>
+        </w:rPr>
+        <w:t xml:space="preserve">ActivityItem</w:t>
+      </w:r>
+      <w:r>
+        <w:t xml:space="preserve"> là một </w:t>
+      </w:r>
+      <w:r>
+        <w:rPr>
+          <w:i/>
+          <w:iCs/>
+        </w:rPr>
+        <w:t xml:space="preserve">discriminated union</w:t>
+      </w:r>
+      <w:r>
+        <w:t xml:space="preserve">: mỗi loại hoạt động (</w:t>
+      </w:r>
+      <w:r>
+        <w:rPr>
+          <w:rFonts w:ascii="Consolas" w:eastAsia="Consolas" w:hAnsi="Consolas" w:cs="Consolas"/>
+        </w:rPr>
+        <w:t xml:space="preserve">kind</w:t>
+      </w:r>
+      <w:r>
+        <w:t xml:space="preserve">) có trường riêng (</w:t>
+      </w:r>
+      <w:r>
+        <w:rPr>
+          <w:rFonts w:ascii="Consolas" w:eastAsia="Consolas" w:hAnsi="Consolas" w:cs="Consolas"/>
+        </w:rPr>
+        <w:t xml:space="preserve">SYNC_RECOVERED</w:t>
+      </w:r>
+      <w:r>
+        <w:t xml:space="preserve"> có </w:t>
+      </w:r>
+      <w:r>
+        <w:rPr>
+          <w:rFonts w:ascii="Consolas" w:eastAsia="Consolas" w:hAnsi="Consolas" w:cs="Consolas"/>
+        </w:rPr>
+        <w:t xml:space="preserve">downtimeMinutes</w:t>
+      </w:r>
+      <w:r>
+        <w:t xml:space="preserve">, </w:t>
+      </w:r>
+      <w:r>
+        <w:rPr>
+          <w:rFonts w:ascii="Consolas" w:eastAsia="Consolas" w:hAnsi="Consolas" w:cs="Consolas"/>
+        </w:rPr>
+        <w:t xml:space="preserve">ACCOUNT_CONNECTED</w:t>
+      </w:r>
+      <w:r>
+        <w:t xml:space="preserve"> có </w:t>
+      </w:r>
+      <w:r>
+        <w:rPr>
+          <w:rFonts w:ascii="Consolas" w:eastAsia="Consolas" w:hAnsi="Consolas" w:cs="Consolas"/>
+        </w:rPr>
+        <w:t xml:space="preserve">externalAccountId</w:t>
+      </w:r>
+      <w:r>
+        <w:t xml:space="preserve">). Trong </w:t>
+      </w:r>
+      <w:r>
+        <w:rPr>
+          <w:rFonts w:ascii="Consolas" w:eastAsia="Consolas" w:hAnsi="Consolas" w:cs="Consolas"/>
+        </w:rPr>
+        <w:t xml:space="preserve">switch (item.kind)</w:t>
+      </w:r>
+      <w:r>
+        <w:t xml:space="preserve">, TypeScript tự biết trường nào có mặt; thêm một loại mới mà quên xử lý thì </w:t>
+      </w:r>
+      <w:r>
+        <w:rPr>
+          <w:rFonts w:ascii="Consolas" w:eastAsia="Consolas" w:hAnsi="Consolas" w:cs="Consolas"/>
+        </w:rPr>
+        <w:t xml:space="preserve">tsc</w:t>
+      </w:r>
+      <w:r>
+        <w:t xml:space="preserve"> báo lỗi.</w:t>
+      </w:r>
+    </w:p>
+    <w:p>
+      <w:pPr>
+        <w:pStyle w:val="ListParagraph"/>
+        <w:numPr>
+          <w:ilvl w:val="0"/>
+          <w:numId w:val="1"/>
+        </w:numPr>
+      </w:pPr>
+      <w:r>
+        <w:rPr>
+          <w:b/>
+          <w:bCs/>
+        </w:rPr>
+        <w:t xml:space="preserve">Dữ liệu mẫu đi theo đồng hồ:</w:t>
+      </w:r>
+      <w:r>
+        <w:t xml:space="preserve"> </w:t>
+      </w:r>
+      <w:r>
+        <w:rPr>
+          <w:rFonts w:ascii="Consolas" w:eastAsia="Consolas" w:hAnsi="Consolas" w:cs="Consolas"/>
+        </w:rPr>
+        <w:t xml:space="preserve">createOverviewSample(now)</w:t>
+      </w:r>
+      <w:r>
+        <w:t xml:space="preserve"> tính mọi mốc thời gian lùi hoặc tiến từ </w:t>
+      </w:r>
+      <w:r>
+        <w:rPr>
+          <w:rFonts w:ascii="Consolas" w:eastAsia="Consolas" w:hAnsi="Consolas" w:cs="Consolas"/>
+        </w:rPr>
+        <w:t xml:space="preserve">now</w:t>
+      </w:r>
+      <w:r>
+        <w:t xml:space="preserve"> (ví dụ tin nhắn "4 giờ 24 phút trước"). Mở lúc 14:05 thì ra đúng giờ của canvas (09:41, 16:00, "15:00 hôm qua"); mở lúc khác vẫn hợp lý. Test kiểm các ràng buộc: tổng chưa đọc bằng tổng theo nguồn, số trên điều hướng khớp màn Tổng quan, 24 ô cách nhau đúng một giờ.</w:t>
+      </w:r>
+    </w:p>
+    <w:p>
+      <w:pPr>
+        <w:pStyle w:val="Heading3"/>
+      </w:pPr>
+      <w:r>
+        <w:t xml:space="preserve">5.8 Giờ và ngày theo múi giờ</w:t>
+      </w:r>
+    </w:p>
+    <w:p>
+      <w:pPr>
+        <w:pStyle w:val="ListParagraph"/>
+        <w:numPr>
+          <w:ilvl w:val="0"/>
+          <w:numId w:val="1"/>
+        </w:numPr>
+      </w:pPr>
+      <w:r>
+        <w:rPr>
+          <w:b/>
+          <w:bCs/>
+        </w:rPr>
+        <w:t xml:space="preserve">Ở đâu:</w:t>
+      </w:r>
+      <w:r>
+        <w:t xml:space="preserve"> </w:t>
+      </w:r>
+      <w:r>
+        <w:rPr>
+          <w:rFonts w:ascii="Consolas" w:eastAsia="Consolas" w:hAnsi="Consolas" w:cs="Consolas"/>
+        </w:rPr>
+        <w:t xml:space="preserve">src/shared/time/local.ts</w:t>
+      </w:r>
+      <w:r>
+        <w:t xml:space="preserve">, các hàm trong </w:t>
+      </w:r>
+      <w:r>
+        <w:rPr>
+          <w:rFonts w:ascii="Consolas" w:eastAsia="Consolas" w:hAnsi="Consolas" w:cs="Consolas"/>
+        </w:rPr>
+        <w:t xml:space="preserve">src/features/overview/format.ts</w:t>
+      </w:r>
+      <w:r>
+        <w:t xml:space="preserve">.</w:t>
+      </w:r>
+    </w:p>
+    <w:p>
+      <w:pPr>
+        <w:pStyle w:val="ListParagraph"/>
+        <w:numPr>
+          <w:ilvl w:val="0"/>
+          <w:numId w:val="1"/>
+        </w:numPr>
+      </w:pPr>
+      <w:r>
+        <w:rPr>
+          <w:rFonts w:ascii="Consolas" w:eastAsia="Consolas" w:hAnsi="Consolas" w:cs="Consolas"/>
+          <w:b/>
+          <w:bCs/>
+        </w:rPr>
+        <w:t xml:space="preserve">Intl.DateTimeFormat</w:t>
+      </w:r>
+      <w:r>
+        <w:rPr>
+          <w:b/>
+          <w:bCs/>
+        </w:rPr>
+        <w:t xml:space="preserve">:</w:t>
+      </w:r>
+      <w:r>
+        <w:t xml:space="preserve"> công cụ có sẵn của trình duyệt (và Node) để đọc một thời điểm theo </w:t>
+      </w:r>
+      <w:r>
+        <w:rPr>
+          <w:b/>
+          <w:bCs/>
+        </w:rPr>
+        <w:t xml:space="preserve">múi giờ</w:t>
+      </w:r>
+      <w:r>
+        <w:t xml:space="preserve"> bất kỳ: </w:t>
+      </w:r>
+      <w:r>
+        <w:rPr>
+          <w:rFonts w:ascii="Consolas" w:eastAsia="Consolas" w:hAnsi="Consolas" w:cs="Consolas"/>
+        </w:rPr>
+        <w:t xml:space="preserve">formatToParts</w:t>
+      </w:r>
+      <w:r>
+        <w:t xml:space="preserve"> trả ra năm, tháng, ngày, giờ, phút, thứ của thời điểm đó tại múi giờ ấy. API gửi giờ UTC; giao diện đổi ra giờ của người dùng.</w:t>
+      </w:r>
+    </w:p>
+    <w:p>
+      <w:pPr>
+        <w:pStyle w:val="ListParagraph"/>
+        <w:numPr>
+          <w:ilvl w:val="0"/>
+          <w:numId w:val="1"/>
+        </w:numPr>
+      </w:pPr>
+      <w:r>
+        <w:rPr>
+          <w:b/>
+          <w:bCs/>
+        </w:rPr>
+        <w:t xml:space="preserve">"Ngày lịch" khác "24 giờ":</w:t>
+      </w:r>
+      <w:r>
+        <w:t xml:space="preserve"> 23:30 hôm nay và 00:30 ngày mai chỉ cách nhau một giờ nhưng là hai ngày khác nhau. Vì vậy "Hôm qua", "Quá hạn 2 ngày" tính bằng hiệu số ngày lịch tại múi giờ của người dùng (</w:t>
+      </w:r>
+      <w:r>
+        <w:rPr>
+          <w:rFonts w:ascii="Consolas" w:eastAsia="Consolas" w:hAnsi="Consolas" w:cs="Consolas"/>
+        </w:rPr>
+        <w:t xml:space="preserve">calendarDaysBetween</w:t>
+      </w:r>
+      <w:r>
+        <w:t xml:space="preserve">), không chia số mili giây cho 86 400 000. Có test riêng cho ca 23:30 / 00:30.</w:t>
+      </w:r>
+    </w:p>
+    <w:p>
+      <w:pPr>
+        <w:pStyle w:val="ListParagraph"/>
+        <w:numPr>
+          <w:ilvl w:val="0"/>
+          <w:numId w:val="1"/>
+        </w:numPr>
+      </w:pPr>
+      <w:r>
+        <w:rPr>
+          <w:b/>
+          <w:bCs/>
+        </w:rPr>
+        <w:t xml:space="preserve">Làm tròn có chủ ý:</w:t>
+      </w:r>
+      <w:r>
+        <w:t xml:space="preserve"> "N phút trước" làm tròn </w:t>
+      </w:r>
+      <w:r>
+        <w:rPr>
+          <w:b/>
+          <w:bCs/>
+        </w:rPr>
+        <w:t xml:space="preserve">xuống</w:t>
+      </w:r>
+      <w:r>
+        <w:t xml:space="preserve"> (chưa đủ 2 phút thì vẫn là 1 phút); "sau N giờ" làm tròn </w:t>
+      </w:r>
+      <w:r>
+        <w:rPr>
+          <w:b/>
+          <w:bCs/>
+        </w:rPr>
+        <w:t xml:space="preserve">gần nhất</w:t>
+      </w:r>
+      <w:r>
+        <w:t xml:space="preserve"> (1 giờ 55 phút là "sau 2 giờ", như canvas).</w:t>
+      </w:r>
+    </w:p>
+    <w:p>
+      <w:pPr>
+        <w:pStyle w:val="ListParagraph"/>
+        <w:numPr>
+          <w:ilvl w:val="0"/>
+          <w:numId w:val="1"/>
+        </w:numPr>
+      </w:pPr>
+      <w:r>
+        <w:rPr>
+          <w:b/>
+          <w:bCs/>
+        </w:rPr>
+        <w:t xml:space="preserve">Bẫy, test phụ thuộc múi giờ máy chạy:</w:t>
+      </w:r>
+      <w:r>
+        <w:t xml:space="preserve"> máy bạn ở giờ Việt Nam, còn máy CI của GitHub ở UTC; cùng một test sẽ thấy "09:41" ở máy này và "02:41" ở máy kia. </w:t>
+      </w:r>
+      <w:r>
+        <w:rPr>
+          <w:rFonts w:ascii="Consolas" w:eastAsia="Consolas" w:hAnsi="Consolas" w:cs="Consolas"/>
+        </w:rPr>
+        <w:t xml:space="preserve">vite.config.ts</w:t>
+      </w:r>
+      <w:r>
+        <w:t xml:space="preserve"> đặt </w:t>
+      </w:r>
+      <w:r>
+        <w:rPr>
+          <w:rFonts w:ascii="Consolas" w:eastAsia="Consolas" w:hAnsi="Consolas" w:cs="Consolas"/>
+        </w:rPr>
+        <w:t xml:space="preserve">test.env.TZ = 'Asia/Ho_Chi_Minh'</w:t>
+      </w:r>
+      <w:r>
+        <w:t xml:space="preserve"> để mọi nơi chạy test cùng một múi giờ. Các hàm định dạng cũng nhận múi giờ làm tham số, nên unit test truyền thẳng vào.</w:t>
+      </w:r>
+    </w:p>
+    <w:p>
+      <w:pPr>
+        <w:pStyle w:val="ListParagraph"/>
+        <w:numPr>
+          <w:ilvl w:val="0"/>
+          <w:numId w:val="1"/>
+        </w:numPr>
+      </w:pPr>
+      <w:r>
+        <w:rPr>
+          <w:b/>
+          <w:bCs/>
+        </w:rPr>
+        <w:t xml:space="preserve">Số kiểu Việt Nam:</w:t>
+      </w:r>
+      <w:r>
+        <w:t xml:space="preserve"> </w:t>
+      </w:r>
+      <w:r>
+        <w:rPr>
+          <w:rFonts w:ascii="Consolas" w:eastAsia="Consolas" w:hAnsi="Consolas" w:cs="Consolas"/>
+        </w:rPr>
+        <w:t xml:space="preserve">(1284).toLocaleString('vi-VN')</w:t>
+      </w:r>
+      <w:r>
+        <w:t xml:space="preserve"> cho "1.284" (dấu chấm ngăn hàng nghìn).</w:t>
+      </w:r>
+    </w:p>
+    <w:p>
+      <w:pPr>
+        <w:pStyle w:val="Heading3"/>
+      </w:pPr>
+      <w:r>
+        <w:t xml:space="preserve">5.9 Màn Tổng quan: lưới thẻ co giãn (UI-03)</w:t>
+      </w:r>
+    </w:p>
+    <w:p>
+      <w:pPr>
+        <w:pStyle w:val="ListParagraph"/>
+        <w:numPr>
+          <w:ilvl w:val="0"/>
+          <w:numId w:val="1"/>
+        </w:numPr>
+      </w:pPr>
+      <w:r>
+        <w:rPr>
+          <w:b/>
+          <w:bCs/>
+        </w:rPr>
+        <w:t xml:space="preserve">Ở đâu:</w:t>
+      </w:r>
+      <w:r>
+        <w:t xml:space="preserve"> </w:t>
+      </w:r>
+      <w:r>
+        <w:rPr>
+          <w:rFonts w:ascii="Consolas" w:eastAsia="Consolas" w:hAnsi="Consolas" w:cs="Consolas"/>
+        </w:rPr>
+        <w:t xml:space="preserve">src/features/overview/OverviewPage.tsx</w:t>
+      </w:r>
+      <w:r>
+        <w:t xml:space="preserve">, </w:t>
+      </w:r>
+      <w:r>
+        <w:rPr>
+          <w:rFonts w:ascii="Consolas" w:eastAsia="Consolas" w:hAnsi="Consolas" w:cs="Consolas"/>
+        </w:rPr>
+        <w:t xml:space="preserve">cards/*.tsx</w:t>
+      </w:r>
+      <w:r>
+        <w:t xml:space="preserve">.</w:t>
+      </w:r>
+    </w:p>
+    <w:p>
+      <w:pPr>
+        <w:pStyle w:val="ListParagraph"/>
+        <w:numPr>
+          <w:ilvl w:val="0"/>
+          <w:numId w:val="1"/>
+        </w:numPr>
+      </w:pPr>
+      <w:r>
+        <w:rPr>
+          <w:b/>
+          <w:bCs/>
+        </w:rPr>
+        <w:t xml:space="preserve">Một bộ component, ba bố cục:</w:t>
+      </w:r>
+      <w:r>
+        <w:t xml:space="preserve"> canvas có ba artboard (</w:t>
+      </w:r>
+      <w:r>
+        <w:rPr>
+          <w:rFonts w:ascii="Consolas" w:eastAsia="Consolas" w:hAnsi="Consolas" w:cs="Consolas"/>
+        </w:rPr>
+        <w:t xml:space="preserve">Dashboard</w:t>
+      </w:r>
+      <w:r>
+        <w:t xml:space="preserve">, </w:t>
+      </w:r>
+      <w:r>
+        <w:rPr>
+          <w:rFonts w:ascii="Consolas" w:eastAsia="Consolas" w:hAnsi="Consolas" w:cs="Consolas"/>
+        </w:rPr>
+        <w:t xml:space="preserve">TabletDashboard</w:t>
+      </w:r>
+      <w:r>
+        <w:t xml:space="preserve">, </w:t>
+      </w:r>
+      <w:r>
+        <w:rPr>
+          <w:rFonts w:ascii="Consolas" w:eastAsia="Consolas" w:hAnsi="Consolas" w:cs="Consolas"/>
+        </w:rPr>
+        <w:t xml:space="preserve">MobileDashboard</w:t>
+      </w:r>
+      <w:r>
+        <w:t xml:space="preserve">) với bộ thẻ khác nhau. Không viết ba trang riêng; mỗi thẻ nhận class theo breakpoint:</w:t>
+      </w:r>
+    </w:p>
+    <w:p>
+      <w:pPr>
+        <w:shd w:val="clear" w:color="auto" w:fill="F2F3F5"/>
+        <w:ind w:left="0"/>
+      </w:pPr>
+      <w:r>
+        <w:rPr>
+          <w:rFonts w:ascii="Consolas" w:eastAsia="Consolas" w:hAnsi="Consolas" w:cs="Consolas"/>
+          <w:sz w:val="19"/>
+          <w:szCs w:val="19"/>
+        </w:rPr>
+        <w:t xml:space="preserve">thẻ               mobile (&lt;768)   tablet (768-1279)   desktop (&gt;=1280, 12 cột)</w:t>
+        <w:br/>
+        <w:t xml:space="preserve">Hộp thư hợp nhất  có               2 cột               7 cột, cao 2 hàng</w:t>
+        <w:br/>
+        <w:t xml:space="preserve">Hôm nay           có, LÊN ĐẦU      ẩn                  5 cột, cao 2 hàng</w:t>
+        <w:br/>
+        <w:t xml:space="preserve">Tài khoản         có               1 cột               4 cột</w:t>
+        <w:br/>
+        <w:t xml:space="preserve">Dịch vụ 24 giờ    ẩn               1 cột               4 cột</w:t>
+        <w:br/>
+        <w:t xml:space="preserve">Đăng ký           có (thu gọn)     1 cột               4 cột</w:t>
+        <w:br/>
+        <w:t xml:space="preserve">Hoạt động         ẩn               1 cột               8 cột</w:t>
+        <w:br/>
+        <w:t xml:space="preserve">Lối tắt           ẩn               ẩn                  4 cột</w:t>
+      </w:r>
+    </w:p>
+    <w:p>
+      <w:pPr>
+        <w:pStyle w:val="ListParagraph"/>
+        <w:numPr>
+          <w:ilvl w:val="0"/>
+          <w:numId w:val="1"/>
+        </w:numPr>
+      </w:pPr>
+      <w:r>
+        <w:rPr>
+          <w:rFonts w:ascii="Consolas" w:eastAsia="Consolas" w:hAnsi="Consolas" w:cs="Consolas"/>
+          <w:b/>
+          <w:bCs/>
+        </w:rPr>
+        <w:t xml:space="preserve">order</w:t>
+      </w:r>
+      <w:r>
+        <w:rPr>
+          <w:b/>
+          <w:bCs/>
+        </w:rPr>
+        <w:t xml:space="preserve"> của CSS:</w:t>
+      </w:r>
+      <w:r>
+        <w:t xml:space="preserve"> trên mobile thẻ Hôm nay lên trước Hộp thư mà không cần đổi thứ tự trong code: class </w:t>
+      </w:r>
+      <w:r>
+        <w:rPr>
+          <w:rFonts w:ascii="Consolas" w:eastAsia="Consolas" w:hAnsi="Consolas" w:cs="Consolas"/>
+        </w:rPr>
+        <w:t xml:space="preserve">-order-1 md:order-none</w:t>
+      </w:r>
+      <w:r>
+        <w:t xml:space="preserve"> đẩy nó lên đầu lưới chỉ ở màn nhỏ.</w:t>
+      </w:r>
+    </w:p>
+    <w:p>
+      <w:pPr>
+        <w:pStyle w:val="ListParagraph"/>
+        <w:numPr>
+          <w:ilvl w:val="0"/>
+          <w:numId w:val="1"/>
+        </w:numPr>
+      </w:pPr>
+      <w:r>
+        <w:rPr>
+          <w:b/>
+          <w:bCs/>
+        </w:rPr>
+        <w:t xml:space="preserve">Mỗi thẻ là một vùng có tên:</w:t>
+      </w:r>
+      <w:r>
+        <w:t xml:space="preserve"> </w:t>
+      </w:r>
+      <w:r>
+        <w:rPr>
+          <w:rFonts w:ascii="Consolas" w:eastAsia="Consolas" w:hAnsi="Consolas" w:cs="Consolas"/>
+        </w:rPr>
+        <w:t xml:space="preserve">&lt;section aria-labelledby&gt;</w:t>
+      </w:r>
+      <w:r>
+        <w:t xml:space="preserve"> trỏ tới tiêu đề </w:t>
+      </w:r>
+      <w:r>
+        <w:rPr>
+          <w:rFonts w:ascii="Consolas" w:eastAsia="Consolas" w:hAnsi="Consolas" w:cs="Consolas"/>
+        </w:rPr>
+        <w:t xml:space="preserve">&lt;h2&gt;</w:t>
+      </w:r>
+      <w:r>
+        <w:t xml:space="preserve"> của thẻ. Trình đọc màn hình liệt kê được các vùng ("Hộp thư hợp nhất", "Tài khoản"…), và test tìm thẻ đúng cách người dùng tìm: </w:t>
+      </w:r>
+      <w:r>
+        <w:rPr>
+          <w:rFonts w:ascii="Consolas" w:eastAsia="Consolas" w:hAnsi="Consolas" w:cs="Consolas"/>
+        </w:rPr>
+        <w:t xml:space="preserve">getByRole('region', { name: 'Tài khoản' })</w:t>
+      </w:r>
+      <w:r>
+        <w:t xml:space="preserve">.</w:t>
+      </w:r>
+    </w:p>
+    <w:p>
+      <w:pPr>
+        <w:pStyle w:val="ListParagraph"/>
+        <w:numPr>
+          <w:ilvl w:val="0"/>
+          <w:numId w:val="1"/>
+        </w:numPr>
+      </w:pPr>
+      <w:r>
+        <w:rPr>
+          <w:b/>
+          <w:bCs/>
+        </w:rPr>
+        <w:t xml:space="preserve">Biểu đồ đọc được:</w:t>
+      </w:r>
+      <w:r>
+        <w:t xml:space="preserve"> thanh tỷ lệ và biểu đồ cột không có chữ, nên mỗi cái là </w:t>
+      </w:r>
+      <w:r>
+        <w:rPr>
+          <w:rFonts w:ascii="Consolas" w:eastAsia="Consolas" w:hAnsi="Consolas" w:cs="Consolas"/>
+        </w:rPr>
+        <w:t xml:space="preserve">role="img"</w:t>
+      </w:r>
+      <w:r>
+        <w:t xml:space="preserve"> kèm </w:t>
+      </w:r>
+      <w:r>
+        <w:rPr>
+          <w:rFonts w:ascii="Consolas" w:eastAsia="Consolas" w:hAnsi="Consolas" w:cs="Consolas"/>
+        </w:rPr>
+        <w:t xml:space="preserve">aria-label</w:t>
+      </w:r>
+      <w:r>
+        <w:t xml:space="preserve"> mô tả bằng lời ("Gmail: 7 chưa đọc, 58%", "Số thư đồng bộ mỗi giờ trong 24 giờ qua. Messenger lỗi lúc 21 giờ, Zalo chậm lúc 13 giờ."). Màu không phải cách duy nhất để biết giờ nào có lỗi.</w:t>
+      </w:r>
+    </w:p>
+    <w:p>
+      <w:pPr>
+        <w:pStyle w:val="ListParagraph"/>
+        <w:numPr>
+          <w:ilvl w:val="0"/>
+          <w:numId w:val="1"/>
+        </w:numPr>
+      </w:pPr>
+      <w:r>
+        <w:rPr>
+          <w:b/>
+          <w:bCs/>
+        </w:rPr>
+        <w:t xml:space="preserve">Nút chưa có chức năng:</w:t>
+      </w:r>
+      <w:r>
+        <w:t xml:space="preserve"> "Đồng bộ ngay", "Kết nối tài khoản", "Đăng nhập lại", "Xem lại", các lối tắt vẫn là </w:t>
+      </w:r>
+      <w:r>
+        <w:rPr>
+          <w:rFonts w:ascii="Consolas" w:eastAsia="Consolas" w:hAnsi="Consolas" w:cs="Consolas"/>
+        </w:rPr>
+        <w:t xml:space="preserve">&lt;button type="button"&gt;</w:t>
+      </w:r>
+      <w:r>
+        <w:t xml:space="preserve"> thật (bấm Tab tới được, có viền focus), chỉ chưa gắn hành động. Nút dẫn sang màn khác ("Mở hộp thư", "Mở lịch", "Xem tất cả") là </w:t>
+      </w:r>
+      <w:r>
+        <w:rPr>
+          <w:rFonts w:ascii="Consolas" w:eastAsia="Consolas" w:hAnsi="Consolas" w:cs="Consolas"/>
+        </w:rPr>
+        <w:t xml:space="preserve">Link</w:t>
+      </w:r>
+      <w:r>
+        <w:t xml:space="preserve"> của React Router.</w:t>
+      </w:r>
+    </w:p>
+    <w:p>
+      <w:pPr>
+        <w:pStyle w:val="ListParagraph"/>
+        <w:numPr>
+          <w:ilvl w:val="0"/>
+          <w:numId w:val="1"/>
+        </w:numPr>
+      </w:pPr>
+      <w:r>
+        <w:rPr>
+          <w:b/>
+          <w:bCs/>
+        </w:rPr>
+        <w:t xml:space="preserve">Bám canvas, sửa cả phần đã làm:</w:t>
+      </w:r>
+      <w:r>
+        <w:t xml:space="preserve"> khi người dùng chốt canvas là thiết kế cuối cùng (2026-10-08), thanh trên của UI-01 được sửa lại: thêm nút "VI" (chưa có chức năng), nút đổi sáng/tối chỉ còn ở desktop, đúng như từng artboard.</w:t>
+      </w:r>
+    </w:p>
+    <w:p>
+      <w:pPr>
+        <w:pStyle w:val="Heading3"/>
+      </w:pPr>
+      <w:r>
+        <w:t xml:space="preserve">5.10 Kiểm chứng UI-02 và UI-03</w:t>
+      </w:r>
+    </w:p>
+    <w:p>
+      <w:pPr>
+        <w:pStyle w:val="ListParagraph"/>
+        <w:numPr>
+          <w:ilvl w:val="0"/>
+          <w:numId w:val="1"/>
+        </w:numPr>
+      </w:pPr>
+      <w:r>
+        <w:rPr>
+          <w:b/>
+          <w:bCs/>
+        </w:rPr>
+        <w:t xml:space="preserve">Test viết trước:</w:t>
+      </w:r>
+      <w:r>
+        <w:t xml:space="preserve"> 29 test định dạng và 6 test dữ liệu mẫu đỏ trước; 11 test của màn Tổng quan đỏ trước (chưa có vùng nào). Cuối cùng 79/79.</w:t>
+      </w:r>
+    </w:p>
+    <w:p>
+      <w:pPr>
+        <w:pStyle w:val="ListParagraph"/>
+        <w:numPr>
+          <w:ilvl w:val="0"/>
+          <w:numId w:val="1"/>
+        </w:numPr>
+      </w:pPr>
+      <w:r>
+        <w:rPr>
+          <w:b/>
+          <w:bCs/>
+        </w:rPr>
+        <w:t xml:space="preserve">Kiểm tra ngược:</w:t>
+      </w:r>
+      <w:r>
+        <w:t xml:space="preserve"> UI-02, 19 lỗi cố ý, 18 bị bắt ngay; lỗi sống sót ("Hôm qua" cho cả 2 ngày trước) chỉ ra test thiếu ca 2 ngày, thêm vào thì bị bắt. Trước đó tự soát và thêm 2 ca ranh giới mà một lỗi làm tròn sẽ lọt qua (7/4/1 trên 12 làm tròn hay làm tròn xuống đều ra 58/33/8). UI-03, 15 lỗi, 14 bị bắt; lỗi sống sót là do </w:t>
+      </w:r>
+      <w:r>
+        <w:rPr>
+          <w:b/>
+          <w:bCs/>
+        </w:rPr>
+        <w:t xml:space="preserve">chính lỗi cố ý viết sai</w:t>
+      </w:r>
+      <w:r>
+        <w:t xml:space="preserve"> (</w:t>
+      </w:r>
+      <w:r>
+        <w:rPr>
+          <w:rFonts w:ascii="Consolas" w:eastAsia="Consolas" w:hAnsi="Consolas" w:cs="Consolas"/>
+        </w:rPr>
+        <w:t xml:space="preserve">history.pushState</w:t>
+      </w:r>
+      <w:r>
+        <w:t xml:space="preserve"> không đi qua React Router nên ở app thật cũng không chuyển trang); viết lại bằng </w:t>
+      </w:r>
+      <w:r>
+        <w:rPr>
+          <w:rFonts w:ascii="Consolas" w:eastAsia="Consolas" w:hAnsi="Consolas" w:cs="Consolas"/>
+        </w:rPr>
+        <w:t xml:space="preserve">useNavigate</w:t>
+      </w:r>
+      <w:r>
+        <w:t xml:space="preserve"> thì bị bắt. Bài học: trước khi kết luận "test hở", kiểm xem lỗi cố ý có thực tế không.</w:t>
+      </w:r>
+    </w:p>
+    <w:p>
+      <w:pPr>
+        <w:pStyle w:val="ListParagraph"/>
+        <w:numPr>
+          <w:ilvl w:val="0"/>
+          <w:numId w:val="1"/>
+        </w:numPr>
+      </w:pPr>
+      <w:r>
+        <w:rPr>
+          <w:b/>
+          <w:bCs/>
+        </w:rPr>
+        <w:t xml:space="preserve">Đồng hồ cố định trên Chrome thật:</w:t>
+      </w:r>
+      <w:r>
+        <w:t xml:space="preserve"> qua DevTools Protocol, đặt múi giờ </w:t>
+      </w:r>
+      <w:r>
+        <w:rPr>
+          <w:rFonts w:ascii="Consolas" w:eastAsia="Consolas" w:hAnsi="Consolas" w:cs="Consolas"/>
+        </w:rPr>
+        <w:t xml:space="preserve">Asia/Ho_Chi_Minh</w:t>
+      </w:r>
+      <w:r>
+        <w:t xml:space="preserve"> (</w:t>
+      </w:r>
+      <w:r>
+        <w:rPr>
+          <w:rFonts w:ascii="Consolas" w:eastAsia="Consolas" w:hAnsi="Consolas" w:cs="Consolas"/>
+        </w:rPr>
+        <w:t xml:space="preserve">Emulation.setTimezoneOverride</w:t>
+      </w:r>
+      <w:r>
+        <w:t xml:space="preserve">) và chèn một đoạn script chạy trước trang (</w:t>
+      </w:r>
+      <w:r>
+        <w:rPr>
+          <w:rFonts w:ascii="Consolas" w:eastAsia="Consolas" w:hAnsi="Consolas" w:cs="Consolas"/>
+        </w:rPr>
+        <w:t xml:space="preserve">Page.addScriptToEvaluateOnNewDocument</w:t>
+      </w:r>
+      <w:r>
+        <w:t xml:space="preserve">) làm </w:t>
+      </w:r>
+      <w:r>
+        <w:rPr>
+          <w:rFonts w:ascii="Consolas" w:eastAsia="Consolas" w:hAnsi="Consolas" w:cs="Consolas"/>
+        </w:rPr>
+        <w:t xml:space="preserve">Date</w:t>
+      </w:r>
+      <w:r>
+        <w:t xml:space="preserve"> luôn bắt đầu từ 14:05 thứ Sáu 02/10/2026. Dữ liệu mẫu vì thế ra đúng giờ của canvas, và ảnh chụp so được trực tiếp với ảnh artboard người dùng gửi: cùng giờ, cùng nội dung, cùng bố cục, ở 1440px tối và sáng, 1024px và 390px.</w:t>
+      </w:r>
+    </w:p>
+    <w:p>
+      <w:pPr>
         <w:pBdr>
           <w:bottom w:val="single" w:sz="4" w:space="0" w:color="auto"/>
         </w:pBdr>
@@ -9778,6 +10868,141 @@
       </w:pPr>
       <w:r>
         <w:t xml:space="preserve">Một lỗi cố ý sống sót nói lên điều gì? Hai lỗi sống sót ở UI-01 là gì?</w:t>
+      </w:r>
+    </w:p>
+    <w:p>
+      <w:pPr>
+        <w:pStyle w:val="ListParagraph"/>
+        <w:numPr>
+          <w:ilvl w:val="0"/>
+          <w:numId w:val="100"/>
+        </w:numPr>
+      </w:pPr>
+      <w:r>
+        <w:t xml:space="preserve">Vì sao các phần của </w:t>
+      </w:r>
+      <w:r>
+        <w:rPr>
+          <w:rFonts w:ascii="Consolas" w:eastAsia="Consolas" w:hAnsi="Consolas" w:cs="Consolas"/>
+        </w:rPr>
+        <w:t xml:space="preserve">OverviewData</w:t>
+      </w:r>
+      <w:r>
+        <w:t xml:space="preserve"> được phép là </w:t>
+      </w:r>
+      <w:r>
+        <w:rPr>
+          <w:rFonts w:ascii="Consolas" w:eastAsia="Consolas" w:hAnsi="Consolas" w:cs="Consolas"/>
+        </w:rPr>
+        <w:t xml:space="preserve">null</w:t>
+      </w:r>
+      <w:r>
+        <w:t xml:space="preserve">, và màn hiện gì khi một phần là </w:t>
+      </w:r>
+      <w:r>
+        <w:rPr>
+          <w:rFonts w:ascii="Consolas" w:eastAsia="Consolas" w:hAnsi="Consolas" w:cs="Consolas"/>
+        </w:rPr>
+        <w:t xml:space="preserve">null</w:t>
+      </w:r>
+      <w:r>
+        <w:t xml:space="preserve">?</w:t>
+      </w:r>
+    </w:p>
+    <w:p>
+      <w:pPr>
+        <w:pStyle w:val="ListParagraph"/>
+        <w:numPr>
+          <w:ilvl w:val="0"/>
+          <w:numId w:val="100"/>
+        </w:numPr>
+      </w:pPr>
+      <w:r>
+        <w:t xml:space="preserve">Vì sao "Hôm qua" phải tính bằng ngày lịch theo múi giờ, không phải "cách đây 24 giờ"?</w:t>
+      </w:r>
+    </w:p>
+    <w:p>
+      <w:pPr>
+        <w:pStyle w:val="ListParagraph"/>
+        <w:numPr>
+          <w:ilvl w:val="0"/>
+          <w:numId w:val="100"/>
+        </w:numPr>
+      </w:pPr>
+      <w:r>
+        <w:t xml:space="preserve">Vì sao test đặt </w:t>
+      </w:r>
+      <w:r>
+        <w:rPr>
+          <w:rFonts w:ascii="Consolas" w:eastAsia="Consolas" w:hAnsi="Consolas" w:cs="Consolas"/>
+        </w:rPr>
+        <w:t xml:space="preserve">TZ = Asia/Ho_Chi_Minh</w:t>
+      </w:r>
+      <w:r>
+        <w:t xml:space="preserve">? Không đặt thì chuyện gì xảy ra trên CI?</w:t>
+      </w:r>
+    </w:p>
+    <w:p>
+      <w:pPr>
+        <w:pStyle w:val="ListParagraph"/>
+        <w:numPr>
+          <w:ilvl w:val="0"/>
+          <w:numId w:val="100"/>
+        </w:numPr>
+      </w:pPr>
+      <w:r>
+        <w:t xml:space="preserve">Làm sao một bộ component hiện ba bộ thẻ khác nhau cho desktop, tablet, mobile, và đưa thẻ Hôm nay lên đầu trên mobile?</w:t>
+      </w:r>
+    </w:p>
+    <w:p>
+      <w:pPr>
+        <w:pStyle w:val="ListParagraph"/>
+        <w:numPr>
+          <w:ilvl w:val="0"/>
+          <w:numId w:val="100"/>
+        </w:numPr>
+      </w:pPr>
+      <w:r>
+        <w:t xml:space="preserve">Vì sao biểu đồ cột có </w:t>
+      </w:r>
+      <w:r>
+        <w:rPr>
+          <w:rFonts w:ascii="Consolas" w:eastAsia="Consolas" w:hAnsi="Consolas" w:cs="Consolas"/>
+        </w:rPr>
+        <w:t xml:space="preserve">role="img"</w:t>
+      </w:r>
+      <w:r>
+        <w:t xml:space="preserve"> và </w:t>
+      </w:r>
+      <w:r>
+        <w:rPr>
+          <w:rFonts w:ascii="Consolas" w:eastAsia="Consolas" w:hAnsi="Consolas" w:cs="Consolas"/>
+        </w:rPr>
+        <w:t xml:space="preserve">aria-label</w:t>
+      </w:r>
+      <w:r>
+        <w:t xml:space="preserve">?</w:t>
+      </w:r>
+    </w:p>
+    <w:p>
+      <w:pPr>
+        <w:pStyle w:val="ListParagraph"/>
+        <w:numPr>
+          <w:ilvl w:val="0"/>
+          <w:numId w:val="100"/>
+        </w:numPr>
+      </w:pPr>
+      <w:r>
+        <w:t xml:space="preserve">Ở UI-03, lỗi cố ý "lối tắt chuyển trang bằng </w:t>
+      </w:r>
+      <w:r>
+        <w:rPr>
+          <w:rFonts w:ascii="Consolas" w:eastAsia="Consolas" w:hAnsi="Consolas" w:cs="Consolas"/>
+        </w:rPr>
+        <w:t xml:space="preserve">history.pushState</w:t>
+      </w:r>
+      <w:r>
+        <w:t xml:space="preserve">" sống sót. Vì sao đó không phải lỗ hổng của test?</w:t>
       </w:r>
     </w:p>
     <w:p/>

</xml_diff>

<commit_message>
docs(fe-ui-accounts): Phase 1 guide section 6 for AC-01 to AC-04
Co-Authored-By: Claude Opus 5.5 (1M context) <noreply@anthropic.com>
</commit_message>
<xml_diff>
--- a/docs/knowledge/phase-1-frontend-foundation.docx
+++ b/docs/knowledge/phase-1-frontend-foundation.docx
@@ -106,7 +106,7 @@
         <w:t xml:space="preserve">openspec/changes/fe-f01-web-foundation</w:t>
       </w:r>
       <w:r>
-        <w:t xml:space="preserve"> (D-22 + F01-FE), và change </w:t>
+        <w:t xml:space="preserve"> (D-22 + F01-FE), change </w:t>
       </w:r>
       <w:r>
         <w:rPr>
@@ -115,7 +115,16 @@
         <w:t xml:space="preserve">openspec/changes/fe-ui-overview</w:t>
       </w:r>
       <w:r>
-        <w:t xml:space="preserve"> (dựng giao diện trước với dữ liệu mẫu, D-42). Đang làm: xong BE-27, BE-28, BE-29, FE-01, UI-01, UI-02, UI-03.</w:t>
+        <w:t xml:space="preserve"> (dựng giao diện trước với dữ liệu mẫu, D-42) và change </w:t>
+      </w:r>
+      <w:r>
+        <w:rPr>
+          <w:rFonts w:ascii="Consolas" w:eastAsia="Consolas" w:hAnsi="Consolas" w:cs="Consolas"/>
+        </w:rPr>
+        <w:t xml:space="preserve">openspec/changes/fe-ui-accounts</w:t>
+      </w:r>
+      <w:r>
+        <w:t xml:space="preserve"> (màn Tài khoản). Đã xong: BE-27, BE-28, BE-29, FE-01, UI-01, UI-02, UI-03, AC-01, AC-02, AC-03, AC-04.</w:t>
         <w:br/>
       </w:r>
       <w:r>
@@ -126,7 +135,7 @@
         <w:t xml:space="preserve">Cập nhật:</w:t>
       </w:r>
       <w:r>
-        <w:t xml:space="preserve"> 2026-10-07. Đường dẫn backend tính từ </w:t>
+        <w:t xml:space="preserve"> 2026-10-08. Đường dẫn backend tính từ </w:t>
       </w:r>
       <w:r>
         <w:rPr>
@@ -10190,6 +10199,2849 @@
     </w:p>
     <w:p>
       <w:pPr>
+        <w:pStyle w:val="Heading2"/>
+      </w:pPr>
+      <w:r>
+        <w:t xml:space="preserve">6. Màn Tài khoản (fe-ui-accounts)</w:t>
+      </w:r>
+    </w:p>
+    <w:p>
+      <w:pPr>
+        <w:pStyle w:val="Heading3"/>
+      </w:pPr>
+      <w:r>
+        <w:t xml:space="preserve">6.0 Bức tranh: hai trang, một nguồn dữ liệu</w:t>
+      </w:r>
+    </w:p>
+    <w:p>
+      <w:pPr>
+        <w:pStyle w:val="ListParagraph"/>
+        <w:numPr>
+          <w:ilvl w:val="0"/>
+          <w:numId w:val="1"/>
+        </w:numPr>
+      </w:pPr>
+      <w:r>
+        <w:rPr>
+          <w:b/>
+          <w:bCs/>
+        </w:rPr>
+        <w:t xml:space="preserve">Phạm vi (D-45, D-46, người dùng 2026-10-08):</w:t>
+      </w:r>
+      <w:r>
+        <w:t xml:space="preserve"> trang danh sách </w:t>
+      </w:r>
+      <w:r>
+        <w:rPr>
+          <w:rFonts w:ascii="Consolas" w:eastAsia="Consolas" w:hAnsi="Consolas" w:cs="Consolas"/>
+        </w:rPr>
+        <w:t xml:space="preserve">/accounts</w:t>
+      </w:r>
+      <w:r>
+        <w:t xml:space="preserve"> và trang chi tiết </w:t>
+      </w:r>
+      <w:r>
+        <w:rPr>
+          <w:rFonts w:ascii="Consolas" w:eastAsia="Consolas" w:hAnsi="Consolas" w:cs="Consolas"/>
+        </w:rPr>
+        <w:t xml:space="preserve">/accounts/:accountId</w:t>
+      </w:r>
+      <w:r>
+        <w:t xml:space="preserve">, trên desktop, tablet và mobile. Tìm, lọc, mở chi tiết, bật/tắt kênh và ngắt kết nối </w:t>
+      </w:r>
+      <w:r>
+        <w:rPr>
+          <w:b/>
+          <w:bCs/>
+        </w:rPr>
+        <w:t xml:space="preserve">chạy thật trên dữ liệu mẫu</w:t>
+      </w:r>
+      <w:r>
+        <w:t xml:space="preserve"> trong cache của TanStack Query (tải lại trang thì mất). Luồng kết nối 5 bước làm sau, cùng API bắt đầu kết nối (BE-31).</w:t>
+      </w:r>
+    </w:p>
+    <w:p>
+      <w:pPr>
+        <w:pStyle w:val="ListParagraph"/>
+        <w:numPr>
+          <w:ilvl w:val="0"/>
+          <w:numId w:val="1"/>
+        </w:numPr>
+      </w:pPr>
+      <w:r>
+        <w:rPr>
+          <w:b/>
+          <w:bCs/>
+        </w:rPr>
+        <w:t xml:space="preserve">Dữ liệu nằm ở đâu:</w:t>
+      </w:r>
+      <w:r>
+        <w:t xml:space="preserve"> mỗi mục trong cache có một "khóa" (query key). Trang nào cần gì thì đọc khóa đó; mỗi thay đổi đi qua một mutation và sửa đúng các khóa liên quan.</w:t>
+      </w:r>
+    </w:p>
+    <w:p>
+      <w:pPr>
+        <w:shd w:val="clear" w:color="auto" w:fill="F2F3F5"/>
+        <w:ind w:left="0"/>
+      </w:pPr>
+      <w:r>
+        <w:rPr>
+          <w:rFonts w:ascii="Consolas" w:eastAsia="Consolas" w:hAnsi="Consolas" w:cs="Consolas"/>
+          <w:sz w:val="19"/>
+          <w:szCs w:val="19"/>
+        </w:rPr>
+        <w:t xml:space="preserve">cache (TanStack Query)</w:t>
+        <w:br/>
+        <w:t xml:space="preserve">  ['accounts']                  danh sách: AccountsData</w:t>
+        <w:br/>
+        <w:t xml:space="preserve">  ['accounts', id, 'extras']    phần thêm của 1 tài khoản: quyền, website, lịch sử, hoạt động</w:t>
+        <w:br/>
+        <w:t xml:space="preserve">  ['shell']                     số đếm trên điều hướng</w:t>
+        <w:br/>
+        <w:t xml:space="preserve">  ['overview']                  màn Tổng quan</w:t>
+        <w:br/>
+        <w:br/>
+        <w:t xml:space="preserve">trang danh sách  đọc ['accounts']</w:t>
+        <w:br/>
+        <w:t xml:space="preserve">trang chi tiết   đọc ['accounts'] (hàng của tài khoản) + ['accounts', id, 'extras']</w:t>
+        <w:br/>
+        <w:br/>
+        <w:t xml:space="preserve">useSetChannel        sửa ['accounts']</w:t>
+        <w:br/>
+        <w:t xml:space="preserve">useDisconnectAccount sửa ['accounts'], ['shell'], ['overview'], xóa ['accounts', id, 'extras']</w:t>
+      </w:r>
+    </w:p>
+    <w:p>
+      <w:pPr>
+        <w:pStyle w:val="Heading3"/>
+      </w:pPr>
+      <w:r>
+        <w:t xml:space="preserve">6.1 Tab "Thêm" và trang con trên mobile: </w:t>
+      </w:r>
+      <w:r>
+        <w:rPr>
+          <w:rFonts w:ascii="Consolas" w:eastAsia="Consolas" w:hAnsi="Consolas" w:cs="Consolas"/>
+        </w:rPr>
+        <w:t xml:space="preserve">handle</w:t>
+      </w:r>
+      <w:r>
+        <w:t xml:space="preserve"> của route (AC-01)</w:t>
+      </w:r>
+    </w:p>
+    <w:p>
+      <w:pPr>
+        <w:pStyle w:val="ListParagraph"/>
+        <w:numPr>
+          <w:ilvl w:val="0"/>
+          <w:numId w:val="1"/>
+        </w:numPr>
+      </w:pPr>
+      <w:r>
+        <w:rPr>
+          <w:b/>
+          <w:bCs/>
+        </w:rPr>
+        <w:t xml:space="preserve">Ở đâu:</w:t>
+      </w:r>
+      <w:r>
+        <w:t xml:space="preserve"> </w:t>
+      </w:r>
+      <w:r>
+        <w:rPr>
+          <w:rFonts w:ascii="Consolas" w:eastAsia="Consolas" w:hAnsi="Consolas" w:cs="Consolas"/>
+        </w:rPr>
+        <w:t xml:space="preserve">src/app/shell/navItems.ts</w:t>
+      </w:r>
+      <w:r>
+        <w:t xml:space="preserve"> (</w:t>
+      </w:r>
+      <w:r>
+        <w:rPr>
+          <w:rFonts w:ascii="Consolas" w:eastAsia="Consolas" w:hAnsi="Consolas" w:cs="Consolas"/>
+        </w:rPr>
+        <w:t xml:space="preserve">MORE_PATHS</w:t>
+      </w:r>
+      <w:r>
+        <w:t xml:space="preserve">), </w:t>
+      </w:r>
+      <w:r>
+        <w:rPr>
+          <w:rFonts w:ascii="Consolas" w:eastAsia="Consolas" w:hAnsi="Consolas" w:cs="Consolas"/>
+        </w:rPr>
+        <w:t xml:space="preserve">TabBar.tsx</w:t>
+      </w:r>
+      <w:r>
+        <w:t xml:space="preserve">, </w:t>
+      </w:r>
+      <w:r>
+        <w:rPr>
+          <w:rFonts w:ascii="Consolas" w:eastAsia="Consolas" w:hAnsi="Consolas" w:cs="Consolas"/>
+        </w:rPr>
+        <w:t xml:space="preserve">AppShell.tsx</w:t>
+      </w:r>
+      <w:r>
+        <w:t xml:space="preserve"> (</w:t>
+      </w:r>
+      <w:r>
+        <w:rPr>
+          <w:rFonts w:ascii="Consolas" w:eastAsia="Consolas" w:hAnsi="Consolas" w:cs="Consolas"/>
+        </w:rPr>
+        <w:t xml:space="preserve">ShellHandle</w:t>
+      </w:r>
+      <w:r>
+        <w:t xml:space="preserve">), </w:t>
+      </w:r>
+      <w:r>
+        <w:rPr>
+          <w:rFonts w:ascii="Consolas" w:eastAsia="Consolas" w:hAnsi="Consolas" w:cs="Consolas"/>
+        </w:rPr>
+        <w:t xml:space="preserve">MobilePageHeader.tsx</w:t>
+      </w:r>
+      <w:r>
+        <w:t xml:space="preserve">, </w:t>
+      </w:r>
+      <w:r>
+        <w:rPr>
+          <w:rFonts w:ascii="Consolas" w:eastAsia="Consolas" w:hAnsi="Consolas" w:cs="Consolas"/>
+        </w:rPr>
+        <w:t xml:space="preserve">src/app/router.tsx</w:t>
+      </w:r>
+      <w:r>
+        <w:t xml:space="preserve">.</w:t>
+      </w:r>
+    </w:p>
+    <w:p>
+      <w:pPr>
+        <w:pStyle w:val="ListParagraph"/>
+        <w:numPr>
+          <w:ilvl w:val="0"/>
+          <w:numId w:val="1"/>
+        </w:numPr>
+      </w:pPr>
+      <w:r>
+        <w:rPr>
+          <w:b/>
+          <w:bCs/>
+        </w:rPr>
+        <w:t xml:space="preserve">Tab "Thêm":</w:t>
+      </w:r>
+      <w:r>
+        <w:t xml:space="preserve"> trên mobile, Tài khoản, Ghi chú, Dịch vụ, Cài đặt… nằm dưới tab "Thêm" (canvas </w:t>
+      </w:r>
+      <w:r>
+        <w:rPr>
+          <w:rFonts w:ascii="Consolas" w:eastAsia="Consolas" w:hAnsi="Consolas" w:cs="Consolas"/>
+        </w:rPr>
+        <w:t xml:space="preserve">MobileMore</w:t>
+      </w:r>
+      <w:r>
+        <w:t xml:space="preserve">). Tab này sáng khi đường dẫn </w:t>
+      </w:r>
+      <w:r>
+        <w:rPr>
+          <w:b/>
+          <w:bCs/>
+        </w:rPr>
+        <w:t xml:space="preserve">bằng hoặc bắt đầu bằng</w:t>
+      </w:r>
+      <w:r>
+        <w:t xml:space="preserve"> một đường dẫn trong </w:t>
+      </w:r>
+      <w:r>
+        <w:rPr>
+          <w:rFonts w:ascii="Consolas" w:eastAsia="Consolas" w:hAnsi="Consolas" w:cs="Consolas"/>
+        </w:rPr>
+        <w:t xml:space="preserve">MORE_PATHS</w:t>
+      </w:r>
+      <w:r>
+        <w:t xml:space="preserve"> (</w:t>
+      </w:r>
+      <w:r>
+        <w:rPr>
+          <w:rFonts w:ascii="Consolas" w:eastAsia="Consolas" w:hAnsi="Consolas" w:cs="Consolas"/>
+        </w:rPr>
+        <w:t xml:space="preserve">/accounts</w:t>
+      </w:r>
+      <w:r>
+        <w:t xml:space="preserve"> và </w:t>
+      </w:r>
+      <w:r>
+        <w:rPr>
+          <w:rFonts w:ascii="Consolas" w:eastAsia="Consolas" w:hAnsi="Consolas" w:cs="Consolas"/>
+        </w:rPr>
+        <w:t xml:space="preserve">/accounts/acc-gmail</w:t>
+      </w:r>
+      <w:r>
+        <w:t xml:space="preserve"> đều tính).</w:t>
+      </w:r>
+    </w:p>
+    <w:p>
+      <w:pPr>
+        <w:pStyle w:val="ListParagraph"/>
+        <w:numPr>
+          <w:ilvl w:val="0"/>
+          <w:numId w:val="1"/>
+        </w:numPr>
+      </w:pPr>
+      <w:r>
+        <w:rPr>
+          <w:rFonts w:ascii="Consolas" w:eastAsia="Consolas" w:hAnsi="Consolas" w:cs="Consolas"/>
+          <w:b/>
+          <w:bCs/>
+        </w:rPr>
+        <w:t xml:space="preserve">handle</w:t>
+      </w:r>
+      <w:r>
+        <w:rPr>
+          <w:b/>
+          <w:bCs/>
+        </w:rPr>
+        <w:t xml:space="preserve"> là gì:</w:t>
+      </w:r>
+      <w:r>
+        <w:t xml:space="preserve"> một object tùy ý gắn vào route trong bảng route. Khung app đọc </w:t>
+      </w:r>
+      <w:r>
+        <w:rPr>
+          <w:rFonts w:ascii="Consolas" w:eastAsia="Consolas" w:hAnsi="Consolas" w:cs="Consolas"/>
+        </w:rPr>
+        <w:t xml:space="preserve">handle</w:t>
+      </w:r>
+      <w:r>
+        <w:t xml:space="preserve"> của mọi route đang khớp bằng </w:t>
+      </w:r>
+      <w:r>
+        <w:rPr>
+          <w:rFonts w:ascii="Consolas" w:eastAsia="Consolas" w:hAnsi="Consolas" w:cs="Consolas"/>
+        </w:rPr>
+        <w:t xml:space="preserve">useMatches()</w:t>
+      </w:r>
+      <w:r>
+        <w:t xml:space="preserve"> và gộp lại. Trang danh sách khai báo </w:t>
+      </w:r>
+      <w:r>
+        <w:rPr>
+          <w:rFonts w:ascii="Consolas" w:eastAsia="Consolas" w:hAnsi="Consolas" w:cs="Consolas"/>
+        </w:rPr>
+        <w:t xml:space="preserve">{ mobilePageHeader: true }</w:t>
+      </w:r>
+      <w:r>
+        <w:t xml:space="preserve">: khung app ẩn thanh trên của mobile, vì trang tự vẽ đầu trang có nút quay lại. Trang chi tiết thêm </w:t>
+      </w:r>
+      <w:r>
+        <w:rPr>
+          <w:rFonts w:ascii="Consolas" w:eastAsia="Consolas" w:hAnsi="Consolas" w:cs="Consolas"/>
+        </w:rPr>
+        <w:t xml:space="preserve">hideTabBar: true</w:t>
+      </w:r>
+      <w:r>
+        <w:t xml:space="preserve">: không có thanh dưới, đúng như canvas </w:t>
+      </w:r>
+      <w:r>
+        <w:rPr>
+          <w:rFonts w:ascii="Consolas" w:eastAsia="Consolas" w:hAnsi="Consolas" w:cs="Consolas"/>
+        </w:rPr>
+        <w:t xml:space="preserve">MobileAccountDetail</w:t>
+      </w:r>
+      <w:r>
+        <w:t xml:space="preserve">.</w:t>
+      </w:r>
+    </w:p>
+    <w:p>
+      <w:pPr>
+        <w:shd w:val="clear" w:color="auto" w:fill="F2F3F5"/>
+        <w:ind w:left="0"/>
+      </w:pPr>
+      <w:r>
+        <w:rPr>
+          <w:rFonts w:ascii="Consolas" w:eastAsia="Consolas" w:hAnsi="Consolas" w:cs="Consolas"/>
+          <w:sz w:val="19"/>
+          <w:szCs w:val="19"/>
+        </w:rPr>
+        <w:t xml:space="preserve">route /accounts            handle { mobilePageHeader }</w:t>
+        <w:br/>
+        <w:t xml:space="preserve">route /accounts/:accountId handle { mobilePageHeader, hideTabBar }</w:t>
+        <w:br/>
+        <w:t xml:space="preserve">        |</w:t>
+        <w:br/>
+        <w:t xml:space="preserve">AppShell: useMatches() -&gt; gộp handle</w:t>
+        <w:br/>
+        <w:t xml:space="preserve">  mobilePageHeader -&gt; thanh trên của khung app: max-md:hidden</w:t>
+        <w:br/>
+        <w:t xml:space="preserve">  hideTabBar       -&gt; không vẽ TabBar</w:t>
+      </w:r>
+    </w:p>
+    <w:p>
+      <w:pPr>
+        <w:pStyle w:val="ListParagraph"/>
+        <w:numPr>
+          <w:ilvl w:val="0"/>
+          <w:numId w:val="1"/>
+        </w:numPr>
+      </w:pPr>
+      <w:r>
+        <w:rPr>
+          <w:b/>
+          <w:bCs/>
+        </w:rPr>
+        <w:t xml:space="preserve">Vì sao không để trang tự ẩn khung app:</w:t>
+      </w:r>
+      <w:r>
+        <w:t xml:space="preserve"> trang nằm </w:t>
+      </w:r>
+      <w:r>
+        <w:rPr>
+          <w:b/>
+          <w:bCs/>
+        </w:rPr>
+        <w:t xml:space="preserve">bên trong</w:t>
+      </w:r>
+      <w:r>
+        <w:t xml:space="preserve"> khung app (</w:t>
+      </w:r>
+      <w:r>
+        <w:rPr>
+          <w:rFonts w:ascii="Consolas" w:eastAsia="Consolas" w:hAnsi="Consolas" w:cs="Consolas"/>
+        </w:rPr>
+        <w:t xml:space="preserve">&lt;Outlet /&gt;</w:t>
+      </w:r>
+      <w:r>
+        <w:t xml:space="preserve">), không với ra ngoài được. </w:t>
+      </w:r>
+      <w:r>
+        <w:rPr>
+          <w:rFonts w:ascii="Consolas" w:eastAsia="Consolas" w:hAnsi="Consolas" w:cs="Consolas"/>
+        </w:rPr>
+        <w:t xml:space="preserve">handle</w:t>
+      </w:r>
+      <w:r>
+        <w:t xml:space="preserve"> để trang "khai báo nhu cầu", còn khung app quyết định, nên dòng chảy vẫn một chiều từ ngoài vào trong.</w:t>
+      </w:r>
+    </w:p>
+    <w:p>
+      <w:pPr>
+        <w:pStyle w:val="ListParagraph"/>
+        <w:numPr>
+          <w:ilvl w:val="0"/>
+          <w:numId w:val="1"/>
+        </w:numPr>
+      </w:pPr>
+      <w:r>
+        <w:rPr>
+          <w:b/>
+          <w:bCs/>
+        </w:rPr>
+        <w:t xml:space="preserve">Đầu trang con dính ở mép trên:</w:t>
+      </w:r>
+      <w:r>
+        <w:t xml:space="preserve"> </w:t>
+      </w:r>
+      <w:r>
+        <w:rPr>
+          <w:rFonts w:ascii="Consolas" w:eastAsia="Consolas" w:hAnsi="Consolas" w:cs="Consolas"/>
+        </w:rPr>
+        <w:t xml:space="preserve">sticky top-0</w:t>
+      </w:r>
+      <w:r>
+        <w:t xml:space="preserve"> giữ nó đứng yên khi danh sách cuộn, như </w:t>
+      </w:r>
+      <w:r>
+        <w:rPr>
+          <w:rFonts w:ascii="Consolas" w:eastAsia="Consolas" w:hAnsi="Consolas" w:cs="Consolas"/>
+        </w:rPr>
+        <w:t xml:space="preserve">mob-top</w:t>
+      </w:r>
+      <w:r>
+        <w:t xml:space="preserve"> của canvas.</w:t>
+      </w:r>
+    </w:p>
+    <w:p>
+      <w:pPr>
+        <w:pStyle w:val="ListParagraph"/>
+        <w:numPr>
+          <w:ilvl w:val="0"/>
+          <w:numId w:val="1"/>
+        </w:numPr>
+      </w:pPr>
+      <w:r>
+        <w:rPr>
+          <w:b/>
+          <w:bCs/>
+        </w:rPr>
+        <w:t xml:space="preserve">Bẫy, landmark:</w:t>
+      </w:r>
+      <w:r>
+        <w:t xml:space="preserve"> </w:t>
+      </w:r>
+      <w:r>
+        <w:rPr>
+          <w:rFonts w:ascii="Consolas" w:eastAsia="Consolas" w:hAnsi="Consolas" w:cs="Consolas"/>
+        </w:rPr>
+        <w:t xml:space="preserve">&lt;header&gt;</w:t>
+      </w:r>
+      <w:r>
+        <w:t xml:space="preserve"> nằm trong </w:t>
+      </w:r>
+      <w:r>
+        <w:rPr>
+          <w:rFonts w:ascii="Consolas" w:eastAsia="Consolas" w:hAnsi="Consolas" w:cs="Consolas"/>
+        </w:rPr>
+        <w:t xml:space="preserve">&lt;main&gt;</w:t>
+      </w:r>
+      <w:r>
+        <w:t xml:space="preserve"> không phải landmark "banner" (chỉ </w:t>
+      </w:r>
+      <w:r>
+        <w:rPr>
+          <w:rFonts w:ascii="Consolas" w:eastAsia="Consolas" w:hAnsi="Consolas" w:cs="Consolas"/>
+        </w:rPr>
+        <w:t xml:space="preserve">&lt;header&gt;</w:t>
+      </w:r>
+      <w:r>
+        <w:t xml:space="preserve"> cấp trang mới là banner). Test không tìm được nó bằng </w:t>
+      </w:r>
+      <w:r>
+        <w:rPr>
+          <w:rFonts w:ascii="Consolas" w:eastAsia="Consolas" w:hAnsi="Consolas" w:cs="Consolas"/>
+        </w:rPr>
+        <w:t xml:space="preserve">getByRole('banner')</w:t>
+      </w:r>
+      <w:r>
+        <w:t xml:space="preserve">, nên tìm qua tiêu đề </w:t>
+      </w:r>
+      <w:r>
+        <w:rPr>
+          <w:rFonts w:ascii="Consolas" w:eastAsia="Consolas" w:hAnsi="Consolas" w:cs="Consolas"/>
+        </w:rPr>
+        <w:t xml:space="preserve">h1</w:t>
+      </w:r>
+      <w:r>
+        <w:t xml:space="preserve"> của nó rồi </w:t>
+      </w:r>
+      <w:r>
+        <w:rPr>
+          <w:rFonts w:ascii="Consolas" w:eastAsia="Consolas" w:hAnsi="Consolas" w:cs="Consolas"/>
+        </w:rPr>
+        <w:t xml:space="preserve">closest('header')</w:t>
+      </w:r>
+      <w:r>
+        <w:t xml:space="preserve">.</w:t>
+      </w:r>
+    </w:p>
+    <w:p>
+      <w:pPr>
+        <w:pStyle w:val="Heading3"/>
+      </w:pPr>
+      <w:r>
+        <w:t xml:space="preserve">6.2 Hộp thoại dùng chung </w:t>
+      </w:r>
+      <w:r>
+        <w:rPr>
+          <w:rFonts w:ascii="Consolas" w:eastAsia="Consolas" w:hAnsi="Consolas" w:cs="Consolas"/>
+        </w:rPr>
+        <w:t xml:space="preserve">Dialog</w:t>
+      </w:r>
+      <w:r>
+        <w:t xml:space="preserve"> (AC-01, dùng ở AC-04)</w:t>
+      </w:r>
+    </w:p>
+    <w:p>
+      <w:pPr>
+        <w:pStyle w:val="ListParagraph"/>
+        <w:numPr>
+          <w:ilvl w:val="0"/>
+          <w:numId w:val="1"/>
+        </w:numPr>
+      </w:pPr>
+      <w:r>
+        <w:rPr>
+          <w:b/>
+          <w:bCs/>
+        </w:rPr>
+        <w:t xml:space="preserve">Ở đâu:</w:t>
+      </w:r>
+      <w:r>
+        <w:t xml:space="preserve"> </w:t>
+      </w:r>
+      <w:r>
+        <w:rPr>
+          <w:rFonts w:ascii="Consolas" w:eastAsia="Consolas" w:hAnsi="Consolas" w:cs="Consolas"/>
+        </w:rPr>
+        <w:t xml:space="preserve">src/shared/ui/dialog.tsx</w:t>
+      </w:r>
+      <w:r>
+        <w:t xml:space="preserve">, </w:t>
+      </w:r>
+      <w:r>
+        <w:rPr>
+          <w:rFonts w:ascii="Consolas" w:eastAsia="Consolas" w:hAnsi="Consolas" w:cs="Consolas"/>
+        </w:rPr>
+        <w:t xml:space="preserve">src/features/accounts/components/DisconnectDialog.tsx</w:t>
+      </w:r>
+      <w:r>
+        <w:t xml:space="preserve">.</w:t>
+      </w:r>
+    </w:p>
+    <w:p>
+      <w:pPr>
+        <w:pStyle w:val="ListParagraph"/>
+        <w:numPr>
+          <w:ilvl w:val="0"/>
+          <w:numId w:val="1"/>
+        </w:numPr>
+      </w:pPr>
+      <w:r>
+        <w:rPr>
+          <w:b/>
+          <w:bCs/>
+        </w:rPr>
+        <w:t xml:space="preserve">Radix Dialog tự làm gì:</w:t>
+      </w:r>
+      <w:r>
+        <w:t xml:space="preserve"> vẽ hộp thoại vào cuối </w:t>
+      </w:r>
+      <w:r>
+        <w:rPr>
+          <w:rFonts w:ascii="Consolas" w:eastAsia="Consolas" w:hAnsi="Consolas" w:cs="Consolas"/>
+        </w:rPr>
+        <w:t xml:space="preserve">&lt;body&gt;</w:t>
+      </w:r>
+      <w:r>
+        <w:t xml:space="preserve"> (portal) để không bị khung cha cắt; </w:t>
+      </w:r>
+      <w:r>
+        <w:rPr>
+          <w:b/>
+          <w:bCs/>
+        </w:rPr>
+        <w:t xml:space="preserve">giữ focus bên trong</w:t>
+      </w:r>
+      <w:r>
+        <w:t xml:space="preserve"> (Tab đi vòng giữa các nút của hộp, không lọt ra trang phía sau); Esc đóng; gắn tên cho hộp từ </w:t>
+      </w:r>
+      <w:r>
+        <w:rPr>
+          <w:rFonts w:ascii="Consolas" w:eastAsia="Consolas" w:hAnsi="Consolas" w:cs="Consolas"/>
+        </w:rPr>
+        <w:t xml:space="preserve">DialogTitle</w:t>
+      </w:r>
+      <w:r>
+        <w:t xml:space="preserve">; đóng xong thì </w:t>
+      </w:r>
+      <w:r>
+        <w:rPr>
+          <w:b/>
+          <w:bCs/>
+        </w:rPr>
+        <w:t xml:space="preserve">trả focus về nút đã mở nó</w:t>
+      </w:r>
+      <w:r>
+        <w:t xml:space="preserve">.</w:t>
+      </w:r>
+    </w:p>
+    <w:p>
+      <w:pPr>
+        <w:pStyle w:val="ListParagraph"/>
+        <w:numPr>
+          <w:ilvl w:val="0"/>
+          <w:numId w:val="1"/>
+        </w:numPr>
+      </w:pPr>
+      <w:r>
+        <w:rPr>
+          <w:b/>
+          <w:bCs/>
+        </w:rPr>
+        <w:t xml:space="preserve">Vì sao viết tay thay vì </w:t>
+      </w:r>
+      <w:r>
+        <w:rPr>
+          <w:rFonts w:ascii="Consolas" w:eastAsia="Consolas" w:hAnsi="Consolas" w:cs="Consolas"/>
+          <w:b/>
+          <w:bCs/>
+        </w:rPr>
+        <w:t xml:space="preserve">shadcn add dialog</w:t>
+      </w:r>
+      <w:r>
+        <w:rPr>
+          <w:b/>
+          <w:bCs/>
+        </w:rPr>
+        <w:t xml:space="preserve">:</w:t>
+      </w:r>
+      <w:r>
+        <w:t xml:space="preserve"> lệnh đó đòi ghi đè </w:t>
+      </w:r>
+      <w:r>
+        <w:rPr>
+          <w:rFonts w:ascii="Consolas" w:eastAsia="Consolas" w:hAnsi="Consolas" w:cs="Consolas"/>
+        </w:rPr>
+        <w:t xml:space="preserve">button.tsx</w:t>
+      </w:r>
+      <w:r>
+        <w:t xml:space="preserve"> (Dialog dùng Button) và sẽ xóa phần đã chỉnh theo canvas. Mã được lấy từ </w:t>
+      </w:r>
+      <w:r>
+        <w:rPr>
+          <w:rFonts w:ascii="Consolas" w:eastAsia="Consolas" w:hAnsi="Consolas" w:cs="Consolas"/>
+        </w:rPr>
+        <w:t xml:space="preserve">--dry-run --view</w:t>
+      </w:r>
+      <w:r>
+        <w:t xml:space="preserve"> rồi viết lại, giữ Button đã chỉnh.</w:t>
+      </w:r>
+    </w:p>
+    <w:p>
+      <w:pPr>
+        <w:pStyle w:val="ListParagraph"/>
+        <w:numPr>
+          <w:ilvl w:val="0"/>
+          <w:numId w:val="1"/>
+        </w:numPr>
+      </w:pPr>
+      <w:r>
+        <w:rPr>
+          <w:b/>
+          <w:bCs/>
+        </w:rPr>
+        <w:t xml:space="preserve">Vì sao trang chi tiết có hai hộp thoại:</w:t>
+      </w:r>
+      <w:r>
+        <w:t xml:space="preserve"> có hai nút mở, một của desktop, một của mobile; luôn có một nút bị ẩn bằng CSS. Mỗi nút gắn một hộp riêng (</w:t>
+      </w:r>
+      <w:r>
+        <w:rPr>
+          <w:rFonts w:ascii="Consolas" w:eastAsia="Consolas" w:hAnsi="Consolas" w:cs="Consolas"/>
+        </w:rPr>
+        <w:t xml:space="preserve">DialogTrigger</w:t>
+      </w:r>
+      <w:r>
+        <w:t xml:space="preserve"> của nó). Nếu dùng chung một hộp, Radix có thể ghi nhớ nút đang bị ẩn làm "nút mở", và lúc đóng không trả focus về đâu được, người dùng bàn phím mất chỗ đứng.</w:t>
+      </w:r>
+    </w:p>
+    <w:p>
+      <w:pPr>
+        <w:pStyle w:val="ListParagraph"/>
+        <w:numPr>
+          <w:ilvl w:val="0"/>
+          <w:numId w:val="1"/>
+        </w:numPr>
+      </w:pPr>
+      <w:r>
+        <w:rPr>
+          <w:b/>
+          <w:bCs/>
+        </w:rPr>
+        <w:t xml:space="preserve">An toàn khi xóa:</w:t>
+      </w:r>
+      <w:r>
+        <w:t xml:space="preserve"> công tắc "Xóa luôn tin nhắn đã lưu" về </w:t>
+      </w:r>
+      <w:r>
+        <w:rPr>
+          <w:b/>
+          <w:bCs/>
+        </w:rPr>
+        <w:t xml:space="preserve">tắt</w:t>
+      </w:r>
+      <w:r>
+        <w:t xml:space="preserve"> mỗi khi hộp đóng mà không xác nhận, để lần mở sau không mang theo một lựa chọn nguy hiểm đã hủy.</w:t>
+      </w:r>
+    </w:p>
+    <w:p>
+      <w:pPr>
+        <w:pStyle w:val="Heading3"/>
+      </w:pPr>
+      <w:r>
+        <w:t xml:space="preserve">6.3 Gom phần dùng chung trước khi viết màn thứ hai (AC-02)</w:t>
+      </w:r>
+    </w:p>
+    <w:p>
+      <w:pPr>
+        <w:pStyle w:val="ListParagraph"/>
+        <w:numPr>
+          <w:ilvl w:val="0"/>
+          <w:numId w:val="1"/>
+        </w:numPr>
+      </w:pPr>
+      <w:r>
+        <w:rPr>
+          <w:b/>
+          <w:bCs/>
+        </w:rPr>
+        <w:t xml:space="preserve">Ở đâu:</w:t>
+      </w:r>
+      <w:r>
+        <w:t xml:space="preserve"> </w:t>
+      </w:r>
+      <w:r>
+        <w:rPr>
+          <w:rFonts w:ascii="Consolas" w:eastAsia="Consolas" w:hAnsi="Consolas" w:cs="Consolas"/>
+        </w:rPr>
+        <w:t xml:space="preserve">src/shared/domain.ts</w:t>
+      </w:r>
+      <w:r>
+        <w:t xml:space="preserve"> (</w:t>
+      </w:r>
+      <w:r>
+        <w:rPr>
+          <w:rFonts w:ascii="Consolas" w:eastAsia="Consolas" w:hAnsi="Consolas" w:cs="Consolas"/>
+        </w:rPr>
+        <w:t xml:space="preserve">Instant</w:t>
+      </w:r>
+      <w:r>
+        <w:t xml:space="preserve">, </w:t>
+      </w:r>
+      <w:r>
+        <w:rPr>
+          <w:rFonts w:ascii="Consolas" w:eastAsia="Consolas" w:hAnsi="Consolas" w:cs="Consolas"/>
+        </w:rPr>
+        <w:t xml:space="preserve">ProviderType</w:t>
+      </w:r>
+      <w:r>
+        <w:t xml:space="preserve">, </w:t>
+      </w:r>
+      <w:r>
+        <w:rPr>
+          <w:rFonts w:ascii="Consolas" w:eastAsia="Consolas" w:hAnsi="Consolas" w:cs="Consolas"/>
+        </w:rPr>
+        <w:t xml:space="preserve">AccountStatus</w:t>
+      </w:r>
+      <w:r>
+        <w:t xml:space="preserve">, </w:t>
+      </w:r>
+      <w:r>
+        <w:rPr>
+          <w:rFonts w:ascii="Consolas" w:eastAsia="Consolas" w:hAnsi="Consolas" w:cs="Consolas"/>
+        </w:rPr>
+        <w:t xml:space="preserve">ProviderInfo</w:t>
+      </w:r>
+      <w:r>
+        <w:t xml:space="preserve">), </w:t>
+      </w:r>
+      <w:r>
+        <w:rPr>
+          <w:rFonts w:ascii="Consolas" w:eastAsia="Consolas" w:hAnsi="Consolas" w:cs="Consolas"/>
+        </w:rPr>
+        <w:t xml:space="preserve">src/shared/format.ts</w:t>
+      </w:r>
+      <w:r>
+        <w:t xml:space="preserve"> (</w:t>
+      </w:r>
+      <w:r>
+        <w:rPr>
+          <w:rFonts w:ascii="Consolas" w:eastAsia="Consolas" w:hAnsi="Consolas" w:cs="Consolas"/>
+        </w:rPr>
+        <w:t xml:space="preserve">formatCount</w:t>
+      </w:r>
+      <w:r>
+        <w:t xml:space="preserve">, </w:t>
+      </w:r>
+      <w:r>
+        <w:rPr>
+          <w:rFonts w:ascii="Consolas" w:eastAsia="Consolas" w:hAnsi="Consolas" w:cs="Consolas"/>
+        </w:rPr>
+        <w:t xml:space="preserve">foldText</w:t>
+      </w:r>
+      <w:r>
+        <w:t xml:space="preserve">, </w:t>
+      </w:r>
+      <w:r>
+        <w:rPr>
+          <w:rFonts w:ascii="Consolas" w:eastAsia="Consolas" w:hAnsi="Consolas" w:cs="Consolas"/>
+        </w:rPr>
+        <w:t xml:space="preserve">providerNameOf</w:t>
+      </w:r>
+      <w:r>
+        <w:t xml:space="preserve">, </w:t>
+      </w:r>
+      <w:r>
+        <w:rPr>
+          <w:rFonts w:ascii="Consolas" w:eastAsia="Consolas" w:hAnsi="Consolas" w:cs="Consolas"/>
+        </w:rPr>
+        <w:t xml:space="preserve">methodLabel</w:t>
+      </w:r>
+      <w:r>
+        <w:t xml:space="preserve">), </w:t>
+      </w:r>
+      <w:r>
+        <w:rPr>
+          <w:rFonts w:ascii="Consolas" w:eastAsia="Consolas" w:hAnsi="Consolas" w:cs="Consolas"/>
+        </w:rPr>
+        <w:t xml:space="preserve">src/shared/time/local.ts</w:t>
+      </w:r>
+      <w:r>
+        <w:t xml:space="preserve"> (</w:t>
+      </w:r>
+      <w:r>
+        <w:rPr>
+          <w:rFonts w:ascii="Consolas" w:eastAsia="Consolas" w:hAnsi="Consolas" w:cs="Consolas"/>
+        </w:rPr>
+        <w:t xml:space="preserve">formatDate</w:t>
+      </w:r>
+      <w:r>
+        <w:t xml:space="preserve">, </w:t>
+      </w:r>
+      <w:r>
+        <w:rPr>
+          <w:rFonts w:ascii="Consolas" w:eastAsia="Consolas" w:hAnsi="Consolas" w:cs="Consolas"/>
+        </w:rPr>
+        <w:t xml:space="preserve">formatSince</w:t>
+      </w:r>
+      <w:r>
+        <w:t xml:space="preserve">).</w:t>
+      </w:r>
+    </w:p>
+    <w:p>
+      <w:pPr>
+        <w:pStyle w:val="ListParagraph"/>
+        <w:numPr>
+          <w:ilvl w:val="0"/>
+          <w:numId w:val="1"/>
+        </w:numPr>
+      </w:pPr>
+      <w:r>
+        <w:rPr>
+          <w:b/>
+          <w:bCs/>
+        </w:rPr>
+        <w:t xml:space="preserve">Vì sao:</w:t>
+      </w:r>
+      <w:r>
+        <w:t xml:space="preserve"> kiểu trạng thái tài khoản, tên provider, số kiểu "1.284" là của </w:t>
+      </w:r>
+      <w:r>
+        <w:rPr>
+          <w:b/>
+          <w:bCs/>
+        </w:rPr>
+        <w:t xml:space="preserve">cả hai</w:t>
+      </w:r>
+      <w:r>
+        <w:t xml:space="preserve"> màn Tổng quan và Tài khoản. Để trong </w:t>
+      </w:r>
+      <w:r>
+        <w:rPr>
+          <w:rFonts w:ascii="Consolas" w:eastAsia="Consolas" w:hAnsi="Consolas" w:cs="Consolas"/>
+        </w:rPr>
+        <w:t xml:space="preserve">features/overview</w:t>
+      </w:r>
+      <w:r>
+        <w:t xml:space="preserve"> thì màn Tài khoản phải phụ thuộc màn Tổng quan, hoặc chép lại. Chép thì hai bản sẽ lệch nhau.</w:t>
+      </w:r>
+    </w:p>
+    <w:p>
+      <w:pPr>
+        <w:pStyle w:val="ListParagraph"/>
+        <w:numPr>
+          <w:ilvl w:val="0"/>
+          <w:numId w:val="1"/>
+        </w:numPr>
+      </w:pPr>
+      <w:r>
+        <w:rPr>
+          <w:b/>
+          <w:bCs/>
+        </w:rPr>
+        <w:t xml:space="preserve">Kiểm chứng "không đổi hành vi":</w:t>
+      </w:r>
+      <w:r>
+        <w:t xml:space="preserve"> tách xong, toàn bộ 86 test cũ vẫn xanh trước khi viết dòng nào của màn mới.</w:t>
+      </w:r>
+    </w:p>
+    <w:p>
+      <w:pPr>
+        <w:pStyle w:val="ListParagraph"/>
+        <w:numPr>
+          <w:ilvl w:val="0"/>
+          <w:numId w:val="1"/>
+        </w:numPr>
+      </w:pPr>
+      <w:r>
+        <w:rPr>
+          <w:rFonts w:ascii="Consolas" w:eastAsia="Consolas" w:hAnsi="Consolas" w:cs="Consolas"/>
+          <w:b/>
+          <w:bCs/>
+        </w:rPr>
+        <w:t xml:space="preserve">foldText</w:t>
+      </w:r>
+      <w:r>
+        <w:rPr>
+          <w:b/>
+          <w:bCs/>
+        </w:rPr>
+        <w:t xml:space="preserve"> (tìm không dấu):</w:t>
+      </w:r>
+      <w:r>
+        <w:t xml:space="preserve"> </w:t>
+      </w:r>
+      <w:r>
+        <w:rPr>
+          <w:rFonts w:ascii="Consolas" w:eastAsia="Consolas" w:hAnsi="Consolas" w:cs="Consolas"/>
+        </w:rPr>
+        <w:t xml:space="preserve">"Nguyễn Đức"</w:t>
+      </w:r>
+      <w:r>
+        <w:t xml:space="preserve"> thành </w:t>
+      </w:r>
+      <w:r>
+        <w:rPr>
+          <w:rFonts w:ascii="Consolas" w:eastAsia="Consolas" w:hAnsi="Consolas" w:cs="Consolas"/>
+        </w:rPr>
+        <w:t xml:space="preserve">"nguyen duc"</w:t>
+      </w:r>
+      <w:r>
+        <w:t xml:space="preserve">. </w:t>
+      </w:r>
+      <w:r>
+        <w:rPr>
+          <w:rFonts w:ascii="Consolas" w:eastAsia="Consolas" w:hAnsi="Consolas" w:cs="Consolas"/>
+        </w:rPr>
+        <w:t xml:space="preserve">normalize('NFD')</w:t>
+      </w:r>
+      <w:r>
+        <w:t xml:space="preserve"> tách chữ có dấu thành chữ gốc cộng dấu rời (</w:t>
+      </w:r>
+      <w:r>
+        <w:rPr>
+          <w:rFonts w:ascii="Consolas" w:eastAsia="Consolas" w:hAnsi="Consolas" w:cs="Consolas"/>
+        </w:rPr>
+        <w:t xml:space="preserve">ễ</w:t>
+      </w:r>
+      <w:r>
+        <w:t xml:space="preserve"> = </w:t>
+      </w:r>
+      <w:r>
+        <w:rPr>
+          <w:rFonts w:ascii="Consolas" w:eastAsia="Consolas" w:hAnsi="Consolas" w:cs="Consolas"/>
+        </w:rPr>
+        <w:t xml:space="preserve">e</w:t>
+      </w:r>
+      <w:r>
+        <w:t xml:space="preserve"> + dấu mũ + dấu ngã); bỏ mọi dấu rời bằng </w:t>
+      </w:r>
+      <w:r>
+        <w:rPr>
+          <w:rFonts w:ascii="Consolas" w:eastAsia="Consolas" w:hAnsi="Consolas" w:cs="Consolas"/>
+        </w:rPr>
+        <w:t xml:space="preserve">/\p{M}/gu</w:t>
+      </w:r>
+      <w:r>
+        <w:t xml:space="preserve">; rồi viết thường. </w:t>
+      </w:r>
+      <w:r>
+        <w:rPr>
+          <w:b/>
+          <w:bCs/>
+        </w:rPr>
+        <w:t xml:space="preserve">Bẫy:</w:t>
+      </w:r>
+      <w:r>
+        <w:t xml:space="preserve"> </w:t>
+      </w:r>
+      <w:r>
+        <w:rPr>
+          <w:rFonts w:ascii="Consolas" w:eastAsia="Consolas" w:hAnsi="Consolas" w:cs="Consolas"/>
+        </w:rPr>
+        <w:t xml:space="preserve">đ</w:t>
+      </w:r>
+      <w:r>
+        <w:t xml:space="preserve"> không phải "d + dấu" trong Unicode mà là một chữ riêng, NFD không tách được, nên phải thay riêng </w:t>
+      </w:r>
+      <w:r>
+        <w:rPr>
+          <w:rFonts w:ascii="Consolas" w:eastAsia="Consolas" w:hAnsi="Consolas" w:cs="Consolas"/>
+        </w:rPr>
+        <w:t xml:space="preserve">đ</w:t>
+      </w:r>
+      <w:r>
+        <w:t xml:space="preserve">/</w:t>
+      </w:r>
+      <w:r>
+        <w:rPr>
+          <w:rFonts w:ascii="Consolas" w:eastAsia="Consolas" w:hAnsi="Consolas" w:cs="Consolas"/>
+        </w:rPr>
+        <w:t xml:space="preserve">Đ</w:t>
+      </w:r>
+      <w:r>
+        <w:t xml:space="preserve"> thành </w:t>
+      </w:r>
+      <w:r>
+        <w:rPr>
+          <w:rFonts w:ascii="Consolas" w:eastAsia="Consolas" w:hAnsi="Consolas" w:cs="Consolas"/>
+        </w:rPr>
+        <w:t xml:space="preserve">d</w:t>
+      </w:r>
+      <w:r>
+        <w:t xml:space="preserve">/</w:t>
+      </w:r>
+      <w:r>
+        <w:rPr>
+          <w:rFonts w:ascii="Consolas" w:eastAsia="Consolas" w:hAnsi="Consolas" w:cs="Consolas"/>
+        </w:rPr>
+        <w:t xml:space="preserve">D</w:t>
+      </w:r>
+      <w:r>
+        <w:t xml:space="preserve">.</w:t>
+      </w:r>
+    </w:p>
+    <w:p>
+      <w:pPr>
+        <w:pStyle w:val="Heading3"/>
+      </w:pPr>
+      <w:r>
+        <w:t xml:space="preserve">6.4 Một tài khoản chỉ nằm một chỗ trong cache (AC-02)</w:t>
+      </w:r>
+    </w:p>
+    <w:p>
+      <w:pPr>
+        <w:pStyle w:val="ListParagraph"/>
+        <w:numPr>
+          <w:ilvl w:val="0"/>
+          <w:numId w:val="1"/>
+        </w:numPr>
+      </w:pPr>
+      <w:r>
+        <w:rPr>
+          <w:b/>
+          <w:bCs/>
+        </w:rPr>
+        <w:t xml:space="preserve">Ở đâu:</w:t>
+      </w:r>
+      <w:r>
+        <w:t xml:space="preserve"> </w:t>
+      </w:r>
+      <w:r>
+        <w:rPr>
+          <w:rFonts w:ascii="Consolas" w:eastAsia="Consolas" w:hAnsi="Consolas" w:cs="Consolas"/>
+        </w:rPr>
+        <w:t xml:space="preserve">src/features/accounts/useAccounts.ts</w:t>
+      </w:r>
+      <w:r>
+        <w:t xml:space="preserve"> (</w:t>
+      </w:r>
+      <w:r>
+        <w:rPr>
+          <w:rFonts w:ascii="Consolas" w:eastAsia="Consolas" w:hAnsi="Consolas" w:cs="Consolas"/>
+        </w:rPr>
+        <w:t xml:space="preserve">useAccounts</w:t>
+      </w:r>
+      <w:r>
+        <w:t xml:space="preserve">, </w:t>
+      </w:r>
+      <w:r>
+        <w:rPr>
+          <w:rFonts w:ascii="Consolas" w:eastAsia="Consolas" w:hAnsi="Consolas" w:cs="Consolas"/>
+        </w:rPr>
+        <w:t xml:space="preserve">useAccount</w:t>
+      </w:r>
+      <w:r>
+        <w:t xml:space="preserve">), </w:t>
+      </w:r>
+      <w:r>
+        <w:rPr>
+          <w:rFonts w:ascii="Consolas" w:eastAsia="Consolas" w:hAnsi="Consolas" w:cs="Consolas"/>
+        </w:rPr>
+        <w:t xml:space="preserve">accounts.types.ts</w:t>
+      </w:r>
+      <w:r>
+        <w:t xml:space="preserve"> (</w:t>
+      </w:r>
+      <w:r>
+        <w:rPr>
+          <w:rFonts w:ascii="Consolas" w:eastAsia="Consolas" w:hAnsi="Consolas" w:cs="Consolas"/>
+        </w:rPr>
+        <w:t xml:space="preserve">AccountsData</w:t>
+      </w:r>
+      <w:r>
+        <w:t xml:space="preserve">, </w:t>
+      </w:r>
+      <w:r>
+        <w:rPr>
+          <w:rFonts w:ascii="Consolas" w:eastAsia="Consolas" w:hAnsi="Consolas" w:cs="Consolas"/>
+        </w:rPr>
+        <w:t xml:space="preserve">AccountItem</w:t>
+      </w:r>
+      <w:r>
+        <w:t xml:space="preserve">, </w:t>
+      </w:r>
+      <w:r>
+        <w:rPr>
+          <w:rFonts w:ascii="Consolas" w:eastAsia="Consolas" w:hAnsi="Consolas" w:cs="Consolas"/>
+        </w:rPr>
+        <w:t xml:space="preserve">AccountExtras</w:t>
+      </w:r>
+      <w:r>
+        <w:t xml:space="preserve">).</w:t>
+      </w:r>
+    </w:p>
+    <w:p>
+      <w:pPr>
+        <w:pStyle w:val="ListParagraph"/>
+        <w:numPr>
+          <w:ilvl w:val="0"/>
+          <w:numId w:val="1"/>
+        </w:numPr>
+      </w:pPr>
+      <w:r>
+        <w:rPr>
+          <w:b/>
+          <w:bCs/>
+        </w:rPr>
+        <w:t xml:space="preserve">Là gì:</w:t>
+      </w:r>
+      <w:r>
+        <w:t xml:space="preserve"> trang chi tiết </w:t>
+      </w:r>
+      <w:r>
+        <w:rPr>
+          <w:b/>
+          <w:bCs/>
+        </w:rPr>
+        <w:t xml:space="preserve">không</w:t>
+      </w:r>
+      <w:r>
+        <w:t xml:space="preserve"> tải lại tài khoản. Nó lấy hàng của tài khoản từ danh sách đã có, và chỉ tải riêng phần thêm (</w:t>
+      </w:r>
+      <w:r>
+        <w:rPr>
+          <w:rFonts w:ascii="Consolas" w:eastAsia="Consolas" w:hAnsi="Consolas" w:cs="Consolas"/>
+        </w:rPr>
+        <w:t xml:space="preserve">AccountExtras</w:t>
+      </w:r>
+      <w:r>
+        <w:t xml:space="preserve">).</w:t>
+      </w:r>
+    </w:p>
+    <w:p>
+      <w:pPr>
+        <w:pStyle w:val="ListParagraph"/>
+        <w:numPr>
+          <w:ilvl w:val="0"/>
+          <w:numId w:val="1"/>
+        </w:numPr>
+      </w:pPr>
+      <w:r>
+        <w:rPr>
+          <w:b/>
+          <w:bCs/>
+        </w:rPr>
+        <w:t xml:space="preserve">Để làm gì:</w:t>
+      </w:r>
+      <w:r>
+        <w:t xml:space="preserve"> bật/tắt một kênh ở trang chi tiết chỉ sửa </w:t>
+      </w:r>
+      <w:r>
+        <w:rPr>
+          <w:b/>
+          <w:bCs/>
+        </w:rPr>
+        <w:t xml:space="preserve">một chỗ</w:t>
+      </w:r>
+      <w:r>
+        <w:t xml:space="preserve">, và cột "Dịch vụ" ngoài danh sách tự đổi theo. Nếu chi tiết giữ bản sao riêng, mỗi thay đổi phải sửa hai bản, quên một bản là hai trang hiện hai số khác nhau.</w:t>
+      </w:r>
+    </w:p>
+    <w:p>
+      <w:pPr>
+        <w:pStyle w:val="ListParagraph"/>
+        <w:numPr>
+          <w:ilvl w:val="0"/>
+          <w:numId w:val="1"/>
+        </w:numPr>
+      </w:pPr>
+      <w:r>
+        <w:rPr>
+          <w:b/>
+          <w:bCs/>
+        </w:rPr>
+        <w:t xml:space="preserve">Làm khác kế hoạch:</w:t>
+      </w:r>
+      <w:r>
+        <w:t xml:space="preserve"> thiết kế ban đầu có </w:t>
+      </w:r>
+      <w:r>
+        <w:rPr>
+          <w:rFonts w:ascii="Consolas" w:eastAsia="Consolas" w:hAnsi="Consolas" w:cs="Consolas"/>
+        </w:rPr>
+        <w:t xml:space="preserve">AccountDetailData</w:t>
+      </w:r>
+      <w:r>
+        <w:t xml:space="preserve"> chứa cả tài khoản; đã đổi và ghi lý do trong </w:t>
+      </w:r>
+      <w:r>
+        <w:rPr>
+          <w:rFonts w:ascii="Consolas" w:eastAsia="Consolas" w:hAnsi="Consolas" w:cs="Consolas"/>
+        </w:rPr>
+        <w:t xml:space="preserve">tasks.md</w:t>
+      </w:r>
+      <w:r>
+        <w:t xml:space="preserve">.</w:t>
+      </w:r>
+    </w:p>
+    <w:p>
+      <w:pPr>
+        <w:pStyle w:val="ListParagraph"/>
+        <w:numPr>
+          <w:ilvl w:val="0"/>
+          <w:numId w:val="1"/>
+        </w:numPr>
+      </w:pPr>
+      <w:r>
+        <w:rPr>
+          <w:b/>
+          <w:bCs/>
+        </w:rPr>
+        <w:t xml:space="preserve">Bẫy 1, "không tìm thấy" quá sớm:</w:t>
+      </w:r>
+      <w:r>
+        <w:t xml:space="preserve"> lúc danh sách còn đang tải, </w:t>
+      </w:r>
+      <w:r>
+        <w:rPr>
+          <w:rFonts w:ascii="Consolas" w:eastAsia="Consolas" w:hAnsi="Consolas" w:cs="Consolas"/>
+        </w:rPr>
+        <w:t xml:space="preserve">account</w:t>
+      </w:r>
+      <w:r>
+        <w:t xml:space="preserve"> cũng là </w:t>
+      </w:r>
+      <w:r>
+        <w:rPr>
+          <w:rFonts w:ascii="Consolas" w:eastAsia="Consolas" w:hAnsi="Consolas" w:cs="Consolas"/>
+        </w:rPr>
+        <w:t xml:space="preserve">undefined</w:t>
+      </w:r>
+      <w:r>
+        <w:t xml:space="preserve">. Nếu kết luận "không tìm thấy" ngay, trang sẽ chớp thông báo lỗi trước khi hiện đúng. Vì vậy </w:t>
+      </w:r>
+      <w:r>
+        <w:rPr>
+          <w:rFonts w:ascii="Consolas" w:eastAsia="Consolas" w:hAnsi="Consolas" w:cs="Consolas"/>
+        </w:rPr>
+        <w:t xml:space="preserve">notFound = list !== undefined &amp;&amp; account === undefined</w:t>
+      </w:r>
+      <w:r>
+        <w:t xml:space="preserve">.</w:t>
+      </w:r>
+    </w:p>
+    <w:p>
+      <w:pPr>
+        <w:pStyle w:val="ListParagraph"/>
+        <w:numPr>
+          <w:ilvl w:val="0"/>
+          <w:numId w:val="1"/>
+        </w:numPr>
+      </w:pPr>
+      <w:r>
+        <w:rPr>
+          <w:b/>
+          <w:bCs/>
+        </w:rPr>
+        <w:t xml:space="preserve">Bẫy 2, gọi API vô ích:</w:t>
+      </w:r>
+      <w:r>
+        <w:t xml:space="preserve"> phần thêm chỉ tải khi tài khoản có thật (</w:t>
+      </w:r>
+      <w:r>
+        <w:rPr>
+          <w:rFonts w:ascii="Consolas" w:eastAsia="Consolas" w:hAnsi="Consolas" w:cs="Consolas"/>
+        </w:rPr>
+        <w:t xml:space="preserve">enabled: account !== undefined</w:t>
+      </w:r>
+      <w:r>
+        <w:t xml:space="preserve">); với </w:t>
+      </w:r>
+      <w:r>
+        <w:rPr>
+          <w:rFonts w:ascii="Consolas" w:eastAsia="Consolas" w:hAnsi="Consolas" w:cs="Consolas"/>
+        </w:rPr>
+        <w:t xml:space="preserve">id</w:t>
+      </w:r>
+      <w:r>
+        <w:t xml:space="preserve"> lạ thì không gửi yêu cầu nào.</w:t>
+      </w:r>
+    </w:p>
+    <w:p>
+      <w:pPr>
+        <w:pStyle w:val="Heading3"/>
+      </w:pPr>
+      <w:r>
+        <w:t xml:space="preserve">6.5 Mutation: cập nhật lạc quan và trả lại khi lỗi (AC-02)</w:t>
+      </w:r>
+    </w:p>
+    <w:p>
+      <w:pPr>
+        <w:pStyle w:val="ListParagraph"/>
+        <w:numPr>
+          <w:ilvl w:val="0"/>
+          <w:numId w:val="1"/>
+        </w:numPr>
+      </w:pPr>
+      <w:r>
+        <w:rPr>
+          <w:b/>
+          <w:bCs/>
+        </w:rPr>
+        <w:t xml:space="preserve">Ở đâu:</w:t>
+      </w:r>
+      <w:r>
+        <w:t xml:space="preserve"> </w:t>
+      </w:r>
+      <w:r>
+        <w:rPr>
+          <w:rFonts w:ascii="Consolas" w:eastAsia="Consolas" w:hAnsi="Consolas" w:cs="Consolas"/>
+        </w:rPr>
+        <w:t xml:space="preserve">useAccounts.ts</w:t>
+      </w:r>
+      <w:r>
+        <w:t xml:space="preserve"> (</w:t>
+      </w:r>
+      <w:r>
+        <w:rPr>
+          <w:rFonts w:ascii="Consolas" w:eastAsia="Consolas" w:hAnsi="Consolas" w:cs="Consolas"/>
+        </w:rPr>
+        <w:t xml:space="preserve">useSetChannel</w:t>
+      </w:r>
+      <w:r>
+        <w:t xml:space="preserve">, </w:t>
+      </w:r>
+      <w:r>
+        <w:rPr>
+          <w:rFonts w:ascii="Consolas" w:eastAsia="Consolas" w:hAnsi="Consolas" w:cs="Consolas"/>
+        </w:rPr>
+        <w:t xml:space="preserve">useDisconnectAccount</w:t>
+      </w:r>
+      <w:r>
+        <w:t xml:space="preserve">, </w:t>
+      </w:r>
+      <w:r>
+        <w:rPr>
+          <w:rFonts w:ascii="Consolas" w:eastAsia="Consolas" w:hAnsi="Consolas" w:cs="Consolas"/>
+        </w:rPr>
+        <w:t xml:space="preserve">withChannel</w:t>
+      </w:r>
+      <w:r>
+        <w:t xml:space="preserve">, </w:t>
+      </w:r>
+      <w:r>
+        <w:rPr>
+          <w:rFonts w:ascii="Consolas" w:eastAsia="Consolas" w:hAnsi="Consolas" w:cs="Consolas"/>
+        </w:rPr>
+        <w:t xml:space="preserve">withoutAccount</w:t>
+      </w:r>
+      <w:r>
+        <w:t xml:space="preserve">), </w:t>
+      </w:r>
+      <w:r>
+        <w:rPr>
+          <w:rFonts w:ascii="Consolas" w:eastAsia="Consolas" w:hAnsi="Consolas" w:cs="Consolas"/>
+        </w:rPr>
+        <w:t xml:space="preserve">accounts.api.ts</w:t>
+      </w:r>
+      <w:r>
+        <w:t xml:space="preserve">.</w:t>
+      </w:r>
+    </w:p>
+    <w:p>
+      <w:pPr>
+        <w:pStyle w:val="ListParagraph"/>
+        <w:numPr>
+          <w:ilvl w:val="0"/>
+          <w:numId w:val="1"/>
+        </w:numPr>
+      </w:pPr>
+      <w:r>
+        <w:rPr>
+          <w:b/>
+          <w:bCs/>
+        </w:rPr>
+        <w:t xml:space="preserve">Cập nhật lạc quan (optimistic update):</w:t>
+      </w:r>
+      <w:r>
+        <w:t xml:space="preserve"> công tắc đổi </w:t>
+      </w:r>
+      <w:r>
+        <w:rPr>
+          <w:b/>
+          <w:bCs/>
+        </w:rPr>
+        <w:t xml:space="preserve">ngay khi bấm</w:t>
+      </w:r>
+      <w:r>
+        <w:t xml:space="preserve">, không chờ server trả lời; nếu lưu lỗi thì trả về chỗ cũ. Với TanStack Query:</w:t>
+      </w:r>
+    </w:p>
+    <w:p>
+      <w:pPr>
+        <w:shd w:val="clear" w:color="auto" w:fill="F2F3F5"/>
+        <w:ind w:left="0"/>
+      </w:pPr>
+      <w:r>
+        <w:rPr>
+          <w:rFonts w:ascii="Consolas" w:eastAsia="Consolas" w:hAnsi="Consolas" w:cs="Consolas"/>
+          <w:sz w:val="19"/>
+          <w:szCs w:val="19"/>
+        </w:rPr>
+        <w:t xml:space="preserve">bấm công tắc</w:t>
+        <w:br/>
+        <w:t xml:space="preserve">  onMutate:   chụp lại danh sách hiện tại (previous)</w:t>
+        <w:br/>
+        <w:t xml:space="preserve">              ghi danh sách mới vào cache  -&gt; giao diện đổi ngay</w:t>
+        <w:br/>
+        <w:t xml:space="preserve">  mutationFn: gửi lên server (hiện tại: dữ liệu mẫu, không gửi gì)</w:t>
+        <w:br/>
+        <w:t xml:space="preserve">  onError:    ghi lại previous vào cache   -&gt; công tắc về chỗ cũ</w:t>
+      </w:r>
+    </w:p>
+    <w:p>
+      <w:pPr>
+        <w:pStyle w:val="ListParagraph"/>
+        <w:numPr>
+          <w:ilvl w:val="0"/>
+          <w:numId w:val="1"/>
+        </w:numPr>
+      </w:pPr>
+      <w:r>
+        <w:rPr>
+          <w:b/>
+          <w:bCs/>
+        </w:rPr>
+        <w:t xml:space="preserve">Vì sao với công tắc thì lạc quan, còn ngắt kết nối thì không:</w:t>
+      </w:r>
+      <w:r>
+        <w:t xml:space="preserve"> công tắc sai thì trả lại được, người dùng thấy ngay; ngắt kết nối là việc lớn, phải chờ server xác nhận rồi mới bỏ tài khoản và chuyển trang.</w:t>
+      </w:r>
+    </w:p>
+    <w:p>
+      <w:pPr>
+        <w:pStyle w:val="ListParagraph"/>
+        <w:numPr>
+          <w:ilvl w:val="0"/>
+          <w:numId w:val="1"/>
+        </w:numPr>
+      </w:pPr>
+      <w:r>
+        <w:rPr>
+          <w:b/>
+          <w:bCs/>
+        </w:rPr>
+        <w:t xml:space="preserve">Hàm thuần </w:t>
+      </w:r>
+      <w:r>
+        <w:rPr>
+          <w:rFonts w:ascii="Consolas" w:eastAsia="Consolas" w:hAnsi="Consolas" w:cs="Consolas"/>
+          <w:b/>
+          <w:bCs/>
+        </w:rPr>
+        <w:t xml:space="preserve">withChannel</w:t>
+      </w:r>
+      <w:r>
+        <w:rPr>
+          <w:b/>
+          <w:bCs/>
+        </w:rPr>
+        <w:t xml:space="preserve">, </w:t>
+      </w:r>
+      <w:r>
+        <w:rPr>
+          <w:rFonts w:ascii="Consolas" w:eastAsia="Consolas" w:hAnsi="Consolas" w:cs="Consolas"/>
+          <w:b/>
+          <w:bCs/>
+        </w:rPr>
+        <w:t xml:space="preserve">withoutAccount</w:t>
+      </w:r>
+      <w:r>
+        <w:rPr>
+          <w:b/>
+          <w:bCs/>
+        </w:rPr>
+        <w:t xml:space="preserve">:</w:t>
+      </w:r>
+      <w:r>
+        <w:t xml:space="preserve"> nhận dữ liệu cũ, </w:t>
+      </w:r>
+      <w:r>
+        <w:rPr>
+          <w:b/>
+          <w:bCs/>
+        </w:rPr>
+        <w:t xml:space="preserve">trả object mới</w:t>
+      </w:r>
+      <w:r>
+        <w:t xml:space="preserve">, không sửa object cũ. React và TanStack Query so sánh bằng tham chiếu: sửa thẳng object cũ thì "trước" và "sau" là cùng một object, màn hình có thể không vẽ lại, và bản chụp </w:t>
+      </w:r>
+      <w:r>
+        <w:rPr>
+          <w:rFonts w:ascii="Consolas" w:eastAsia="Consolas" w:hAnsi="Consolas" w:cs="Consolas"/>
+        </w:rPr>
+        <w:t xml:space="preserve">previous</w:t>
+      </w:r>
+      <w:r>
+        <w:t xml:space="preserve"> để trả lại cũng bị sửa theo. Test kiểm cả việc dữ liệu đầu vào còn nguyên.</w:t>
+      </w:r>
+    </w:p>
+    <w:p>
+      <w:pPr>
+        <w:pStyle w:val="ListParagraph"/>
+        <w:numPr>
+          <w:ilvl w:val="0"/>
+          <w:numId w:val="1"/>
+        </w:numPr>
+      </w:pPr>
+      <w:r>
+        <w:rPr>
+          <w:rFonts w:ascii="Consolas" w:eastAsia="Consolas" w:hAnsi="Consolas" w:cs="Consolas"/>
+          <w:b/>
+          <w:bCs/>
+        </w:rPr>
+        <w:t xml:space="preserve">accounts.api.ts</w:t>
+      </w:r>
+      <w:r>
+        <w:rPr>
+          <w:b/>
+          <w:bCs/>
+        </w:rPr>
+        <w:t xml:space="preserve">, chỗ duy nhất đổi khi nối API:</w:t>
+      </w:r>
+      <w:r>
+        <w:t xml:space="preserve"> bốn hàm </w:t>
+      </w:r>
+      <w:r>
+        <w:rPr>
+          <w:rFonts w:ascii="Consolas" w:eastAsia="Consolas" w:hAnsi="Consolas" w:cs="Consolas"/>
+        </w:rPr>
+        <w:t xml:space="preserve">fetchAccounts</w:t>
+      </w:r>
+      <w:r>
+        <w:t xml:space="preserve">, </w:t>
+      </w:r>
+      <w:r>
+        <w:rPr>
+          <w:rFonts w:ascii="Consolas" w:eastAsia="Consolas" w:hAnsi="Consolas" w:cs="Consolas"/>
+        </w:rPr>
+        <w:t xml:space="preserve">fetchAccountExtras</w:t>
+      </w:r>
+      <w:r>
+        <w:t xml:space="preserve">, </w:t>
+      </w:r>
+      <w:r>
+        <w:rPr>
+          <w:rFonts w:ascii="Consolas" w:eastAsia="Consolas" w:hAnsi="Consolas" w:cs="Consolas"/>
+        </w:rPr>
+        <w:t xml:space="preserve">saveChannel</w:t>
+      </w:r>
+      <w:r>
+        <w:t xml:space="preserve">, </w:t>
+      </w:r>
+      <w:r>
+        <w:rPr>
+          <w:rFonts w:ascii="Consolas" w:eastAsia="Consolas" w:hAnsi="Consolas" w:cs="Consolas"/>
+        </w:rPr>
+        <w:t xml:space="preserve">deleteAccount</w:t>
+      </w:r>
+      <w:r>
+        <w:t xml:space="preserve">, hiện trả dữ liệu mẫu. Nối API thật thì chỉ sửa thân bốn hàm này.</w:t>
+      </w:r>
+    </w:p>
+    <w:p>
+      <w:pPr>
+        <w:pStyle w:val="ListParagraph"/>
+        <w:numPr>
+          <w:ilvl w:val="0"/>
+          <w:numId w:val="1"/>
+        </w:numPr>
+      </w:pPr>
+      <w:r>
+        <w:rPr>
+          <w:b/>
+          <w:bCs/>
+        </w:rPr>
+        <w:t xml:space="preserve">Test giả lỗi mạng:</w:t>
+      </w:r>
+      <w:r>
+        <w:t xml:space="preserve"> </w:t>
+      </w:r>
+      <w:r>
+        <w:rPr>
+          <w:rFonts w:ascii="Consolas" w:eastAsia="Consolas" w:hAnsi="Consolas" w:cs="Consolas"/>
+        </w:rPr>
+        <w:t xml:space="preserve">vi.mock('./accounts.api', ...)</w:t>
+      </w:r>
+      <w:r>
+        <w:t xml:space="preserve"> thay riêng </w:t>
+      </w:r>
+      <w:r>
+        <w:rPr>
+          <w:rFonts w:ascii="Consolas" w:eastAsia="Consolas" w:hAnsi="Consolas" w:cs="Consolas"/>
+        </w:rPr>
+        <w:t xml:space="preserve">saveChannel</w:t>
+      </w:r>
+      <w:r>
+        <w:t xml:space="preserve"> bằng một hàm giả, rồi </w:t>
+      </w:r>
+      <w:r>
+        <w:rPr>
+          <w:rFonts w:ascii="Consolas" w:eastAsia="Consolas" w:hAnsi="Consolas" w:cs="Consolas"/>
+        </w:rPr>
+        <w:t xml:space="preserve">mockRejectedValueOnce(new Error('offline'))</w:t>
+      </w:r>
+      <w:r>
+        <w:t xml:space="preserve"> cho lần gọi đầu thất bại. Test kiểm công tắc trở về bật.</w:t>
+      </w:r>
+    </w:p>
+    <w:p>
+      <w:pPr>
+        <w:pStyle w:val="Heading3"/>
+      </w:pPr>
+      <w:r>
+        <w:t xml:space="preserve">6.6 Trang danh sách: bảng ARIA và liên kết phủ cả hàng (AC-03)</w:t>
+      </w:r>
+    </w:p>
+    <w:p>
+      <w:pPr>
+        <w:pStyle w:val="ListParagraph"/>
+        <w:numPr>
+          <w:ilvl w:val="0"/>
+          <w:numId w:val="1"/>
+        </w:numPr>
+      </w:pPr>
+      <w:r>
+        <w:rPr>
+          <w:b/>
+          <w:bCs/>
+        </w:rPr>
+        <w:t xml:space="preserve">Ở đâu:</w:t>
+      </w:r>
+      <w:r>
+        <w:t xml:space="preserve"> </w:t>
+      </w:r>
+      <w:r>
+        <w:rPr>
+          <w:rFonts w:ascii="Consolas" w:eastAsia="Consolas" w:hAnsi="Consolas" w:cs="Consolas"/>
+        </w:rPr>
+        <w:t xml:space="preserve">src/features/accounts/AccountsPage.tsx</w:t>
+      </w:r>
+      <w:r>
+        <w:t xml:space="preserve">, </w:t>
+      </w:r>
+      <w:r>
+        <w:rPr>
+          <w:rFonts w:ascii="Consolas" w:eastAsia="Consolas" w:hAnsi="Consolas" w:cs="Consolas"/>
+        </w:rPr>
+        <w:t xml:space="preserve">components/AccountsTable.tsx</w:t>
+      </w:r>
+      <w:r>
+        <w:t xml:space="preserve">, </w:t>
+      </w:r>
+      <w:r>
+        <w:rPr>
+          <w:rFonts w:ascii="Consolas" w:eastAsia="Consolas" w:hAnsi="Consolas" w:cs="Consolas"/>
+        </w:rPr>
+        <w:t xml:space="preserve">components/MobileAccountList.tsx</w:t>
+      </w:r>
+      <w:r>
+        <w:t xml:space="preserve">, </w:t>
+      </w:r>
+      <w:r>
+        <w:rPr>
+          <w:rFonts w:ascii="Consolas" w:eastAsia="Consolas" w:hAnsi="Consolas" w:cs="Consolas"/>
+        </w:rPr>
+        <w:t xml:space="preserve">src/shared/ui/segmented.tsx</w:t>
+      </w:r>
+      <w:r>
+        <w:t xml:space="preserve">.</w:t>
+      </w:r>
+    </w:p>
+    <w:p>
+      <w:pPr>
+        <w:pStyle w:val="ListParagraph"/>
+        <w:numPr>
+          <w:ilvl w:val="0"/>
+          <w:numId w:val="1"/>
+        </w:numPr>
+      </w:pPr>
+      <w:r>
+        <w:rPr>
+          <w:b/>
+          <w:bCs/>
+        </w:rPr>
+        <w:t xml:space="preserve">Bảng bằng vai trò ARIA:</w:t>
+      </w:r>
+      <w:r>
+        <w:t xml:space="preserve"> canvas vẽ bảng bằng </w:t>
+      </w:r>
+      <w:r>
+        <w:rPr>
+          <w:rFonts w:ascii="Consolas" w:eastAsia="Consolas" w:hAnsi="Consolas" w:cs="Consolas"/>
+        </w:rPr>
+        <w:t xml:space="preserve">div</w:t>
+      </w:r>
+      <w:r>
+        <w:t xml:space="preserve"> lưới CSS. Thêm </w:t>
+      </w:r>
+      <w:r>
+        <w:rPr>
+          <w:rFonts w:ascii="Consolas" w:eastAsia="Consolas" w:hAnsi="Consolas" w:cs="Consolas"/>
+        </w:rPr>
+        <w:t xml:space="preserve">role="table"</w:t>
+      </w:r>
+      <w:r>
+        <w:t xml:space="preserve">, </w:t>
+      </w:r>
+      <w:r>
+        <w:rPr>
+          <w:rFonts w:ascii="Consolas" w:eastAsia="Consolas" w:hAnsi="Consolas" w:cs="Consolas"/>
+        </w:rPr>
+        <w:t xml:space="preserve">row</w:t>
+      </w:r>
+      <w:r>
+        <w:t xml:space="preserve">, </w:t>
+      </w:r>
+      <w:r>
+        <w:rPr>
+          <w:rFonts w:ascii="Consolas" w:eastAsia="Consolas" w:hAnsi="Consolas" w:cs="Consolas"/>
+        </w:rPr>
+        <w:t xml:space="preserve">columnheader</w:t>
+      </w:r>
+      <w:r>
+        <w:t xml:space="preserve">, </w:t>
+      </w:r>
+      <w:r>
+        <w:rPr>
+          <w:rFonts w:ascii="Consolas" w:eastAsia="Consolas" w:hAnsi="Consolas" w:cs="Consolas"/>
+        </w:rPr>
+        <w:t xml:space="preserve">cell</w:t>
+      </w:r>
+      <w:r>
+        <w:t xml:space="preserve"> để trình đọc màn hình biết đây là bảng, đi được theo hàng và cột, đọc tên cột kèm từng ô. Test cũng tìm "hàng có </w:t>
+      </w:r>
+      <w:r>
+        <w:rPr>
+          <w:rFonts w:ascii="Consolas" w:eastAsia="Consolas" w:hAnsi="Consolas" w:cs="Consolas"/>
+        </w:rPr>
+        <w:t xml:space="preserve">an.nguyen@gmail.com</w:t>
+      </w:r>
+      <w:r>
+        <w:t xml:space="preserve">" bằng </w:t>
+      </w:r>
+      <w:r>
+        <w:rPr>
+          <w:rFonts w:ascii="Consolas" w:eastAsia="Consolas" w:hAnsi="Consolas" w:cs="Consolas"/>
+        </w:rPr>
+        <w:t xml:space="preserve">getByRole('row', { name: /an\.nguyen@gmail\.com/ })</w:t>
+      </w:r>
+      <w:r>
+        <w:t xml:space="preserve">.</w:t>
+      </w:r>
+    </w:p>
+    <w:p>
+      <w:pPr>
+        <w:pStyle w:val="ListParagraph"/>
+        <w:numPr>
+          <w:ilvl w:val="0"/>
+          <w:numId w:val="1"/>
+        </w:numPr>
+      </w:pPr>
+      <w:r>
+        <w:rPr>
+          <w:b/>
+          <w:bCs/>
+        </w:rPr>
+        <w:t xml:space="preserve">Liên kết phủ cả hàng (stretched link):</w:t>
+      </w:r>
+    </w:p>
+    <w:p>
+      <w:pPr>
+        <w:shd w:val="clear" w:color="auto" w:fill="F2F3F5"/>
+        <w:ind w:left="0"/>
+      </w:pPr>
+      <w:r>
+        <w:rPr>
+          <w:rFonts w:ascii="Consolas" w:eastAsia="Consolas" w:hAnsi="Consolas" w:cs="Consolas"/>
+          <w:sz w:val="19"/>
+          <w:szCs w:val="19"/>
+        </w:rPr>
+        <w:t xml:space="preserve">&lt;div role="row" class="relative ..."&gt;       &lt;- hàng là mốc định vị</w:t>
+        <w:br/>
+        <w:t xml:space="preserve">  ... các ô ...</w:t>
+        <w:br/>
+        <w:t xml:space="preserve">  &lt;a href="/accounts/acc-gmail"</w:t>
+        <w:br/>
+        <w:t xml:space="preserve">     aria-label="Mở chi tiết tài khoản Gmail an.nguyen@gmail.com"</w:t>
+        <w:br/>
+        <w:t xml:space="preserve">     class="after:absolute after:inset-0"&gt;  &lt;- lớp ::after phủ kín hàng</w:t>
+        <w:br/>
+        <w:t xml:space="preserve">    (mũi tên)</w:t>
+        <w:br/>
+        <w:t xml:space="preserve">  &lt;/a&gt;</w:t>
+        <w:br/>
+        <w:t xml:space="preserve">&lt;/div&gt;</w:t>
+      </w:r>
+    </w:p>
+    <w:p>
+      <w:r>
+        <w:t xml:space="preserve">  Bấm vào đâu trên hàng cũng trúng lớp phủ của liên kết. Phím Tab chỉ dừng </w:t>
+      </w:r>
+      <w:r>
+        <w:rPr>
+          <w:b/>
+          <w:bCs/>
+        </w:rPr>
+        <w:t xml:space="preserve">một lần</w:t>
+      </w:r>
+      <w:r>
+        <w:t xml:space="preserve"> mỗi hàng, tên đọc ra rõ ràng. Gắn </w:t>
+      </w:r>
+      <w:r>
+        <w:rPr>
+          <w:rFonts w:ascii="Consolas" w:eastAsia="Consolas" w:hAnsi="Consolas" w:cs="Consolas"/>
+        </w:rPr>
+        <w:t xml:space="preserve">onClick</w:t>
+      </w:r>
+      <w:r>
+        <w:t xml:space="preserve"> cho cả hàng thì chuột bấm được nhưng bàn phím và trình đọc màn hình không biết hàng bấm được.</w:t>
+      </w:r>
+    </w:p>
+    <w:p>
+      <w:pPr>
+        <w:pStyle w:val="ListParagraph"/>
+        <w:numPr>
+          <w:ilvl w:val="0"/>
+          <w:numId w:val="1"/>
+        </w:numPr>
+      </w:pPr>
+      <w:r>
+        <w:rPr>
+          <w:b/>
+          <w:bCs/>
+        </w:rPr>
+        <w:t xml:space="preserve">Tìm và lọc:</w:t>
+      </w:r>
+      <w:r>
+        <w:t xml:space="preserve"> chữ đang gõ và nút lọc là </w:t>
+      </w:r>
+      <w:r>
+        <w:rPr>
+          <w:rFonts w:ascii="Consolas" w:eastAsia="Consolas" w:hAnsi="Consolas" w:cs="Consolas"/>
+        </w:rPr>
+        <w:t xml:space="preserve">useState</w:t>
+      </w:r>
+      <w:r>
+        <w:t xml:space="preserve"> của trang; danh sách hiện ra là </w:t>
+      </w:r>
+      <w:r>
+        <w:rPr>
+          <w:rFonts w:ascii="Consolas" w:eastAsia="Consolas" w:hAnsi="Consolas" w:cs="Consolas"/>
+        </w:rPr>
+        <w:t xml:space="preserve">filterAccounts(accounts, { query, filter }, nameOf)</w:t>
+      </w:r>
+      <w:r>
+        <w:t xml:space="preserve">, một hàm thuần đã có test riêng. Dòng đầu "TÀI KHOẢN · 3 ĐÃ KẾT NỐI" luôn đếm </w:t>
+      </w:r>
+      <w:r>
+        <w:rPr>
+          <w:b/>
+          <w:bCs/>
+        </w:rPr>
+        <w:t xml:space="preserve">tất cả</w:t>
+      </w:r>
+      <w:r>
+        <w:t xml:space="preserve">, không đếm theo kết quả lọc.</w:t>
+      </w:r>
+    </w:p>
+    <w:p>
+      <w:pPr>
+        <w:pStyle w:val="ListParagraph"/>
+        <w:numPr>
+          <w:ilvl w:val="0"/>
+          <w:numId w:val="1"/>
+        </w:numPr>
+      </w:pPr>
+      <w:r>
+        <w:rPr>
+          <w:b/>
+          <w:bCs/>
+        </w:rPr>
+        <w:t xml:space="preserve">Nút lọc </w:t>
+      </w:r>
+      <w:r>
+        <w:rPr>
+          <w:rFonts w:ascii="Consolas" w:eastAsia="Consolas" w:hAnsi="Consolas" w:cs="Consolas"/>
+          <w:b/>
+          <w:bCs/>
+        </w:rPr>
+        <w:t xml:space="preserve">Segmented</w:t>
+      </w:r>
+      <w:r>
+        <w:rPr>
+          <w:b/>
+          <w:bCs/>
+        </w:rPr>
+        <w:t xml:space="preserve"> (canvas </w:t>
+      </w:r>
+      <w:r>
+        <w:rPr>
+          <w:rFonts w:ascii="Consolas" w:eastAsia="Consolas" w:hAnsi="Consolas" w:cs="Consolas"/>
+          <w:b/>
+          <w:bCs/>
+        </w:rPr>
+        <w:t xml:space="preserve">.seg</w:t>
+      </w:r>
+      <w:r>
+        <w:rPr>
+          <w:b/>
+          <w:bCs/>
+        </w:rPr>
+        <w:t xml:space="preserve">):</w:t>
+      </w:r>
+      <w:r>
+        <w:t xml:space="preserve"> mỗi nút có </w:t>
+      </w:r>
+      <w:r>
+        <w:rPr>
+          <w:rFonts w:ascii="Consolas" w:eastAsia="Consolas" w:hAnsi="Consolas" w:cs="Consolas"/>
+        </w:rPr>
+        <w:t xml:space="preserve">aria-pressed="true|false"</w:t>
+      </w:r>
+      <w:r>
+        <w:t xml:space="preserve">, trình đọc màn hình đọc "đã nhấn" cho nút đang chọn.</w:t>
+      </w:r>
+    </w:p>
+    <w:p>
+      <w:pPr>
+        <w:pStyle w:val="ListParagraph"/>
+        <w:numPr>
+          <w:ilvl w:val="0"/>
+          <w:numId w:val="1"/>
+        </w:numPr>
+      </w:pPr>
+      <w:r>
+        <w:rPr>
+          <w:b/>
+          <w:bCs/>
+        </w:rPr>
+        <w:t xml:space="preserve">Mobile dùng lại trạng thái của thẻ Tổng quan:</w:t>
+      </w:r>
+      <w:r>
+        <w:t xml:space="preserve"> "Ổn định", thanh 64%, "Quyền hết hạn từ 21:04 hôm qua" do cùng hàm </w:t>
+      </w:r>
+      <w:r>
+        <w:rPr>
+          <w:rFonts w:ascii="Consolas" w:eastAsia="Consolas" w:hAnsi="Consolas" w:cs="Consolas"/>
+        </w:rPr>
+        <w:t xml:space="preserve">accountStatusView</w:t>
+      </w:r>
+      <w:r>
+        <w:t xml:space="preserve"> tạo ra, nên hai màn luôn nói giống nhau.</w:t>
+      </w:r>
+    </w:p>
+    <w:p>
+      <w:pPr>
+        <w:pStyle w:val="ListParagraph"/>
+        <w:numPr>
+          <w:ilvl w:val="0"/>
+          <w:numId w:val="1"/>
+        </w:numPr>
+      </w:pPr>
+      <w:r>
+        <w:rPr>
+          <w:b/>
+          <w:bCs/>
+        </w:rPr>
+        <w:t xml:space="preserve">Tablet (canvas không vẽ):</w:t>
+      </w:r>
+      <w:r>
+        <w:t xml:space="preserve"> giữ đủ 7 cột; bảng rộng tối thiểu 896px, hẹp hơn thì bảng </w:t>
+      </w:r>
+      <w:r>
+        <w:rPr>
+          <w:b/>
+          <w:bCs/>
+        </w:rPr>
+        <w:t xml:space="preserve">cuộn ngang trong khung của nó</w:t>
+      </w:r>
+      <w:r>
+        <w:t xml:space="preserve">, cả trang không cuộn.</w:t>
+      </w:r>
+    </w:p>
+    <w:p>
+      <w:pPr>
+        <w:pStyle w:val="Heading3"/>
+      </w:pPr>
+      <w:r>
+        <w:t xml:space="preserve">6.7 Bẫy </w:t>
+      </w:r>
+      <w:r>
+        <w:rPr>
+          <w:rFonts w:ascii="Consolas" w:eastAsia="Consolas" w:hAnsi="Consolas" w:cs="Consolas"/>
+        </w:rPr>
+        <w:t xml:space="preserve">position: absolute</w:t>
+      </w:r>
+      <w:r>
+        <w:t xml:space="preserve"> thoát khỏi khung cuộn (AC-03)</w:t>
+      </w:r>
+    </w:p>
+    <w:p>
+      <w:pPr>
+        <w:pStyle w:val="ListParagraph"/>
+        <w:numPr>
+          <w:ilvl w:val="0"/>
+          <w:numId w:val="1"/>
+        </w:numPr>
+      </w:pPr>
+      <w:r>
+        <w:rPr>
+          <w:b/>
+          <w:bCs/>
+        </w:rPr>
+        <w:t xml:space="preserve">Triệu chứng:</w:t>
+      </w:r>
+      <w:r>
+        <w:t xml:space="preserve"> ở 768px cả trang cuộn ngang được, dù bảng đã có khung </w:t>
+      </w:r>
+      <w:r>
+        <w:rPr>
+          <w:rFonts w:ascii="Consolas" w:eastAsia="Consolas" w:hAnsi="Consolas" w:cs="Consolas"/>
+        </w:rPr>
+        <w:t xml:space="preserve">overflow-x-auto</w:t>
+      </w:r>
+      <w:r>
+        <w:t xml:space="preserve">. Test trong jsdom không thấy (jsdom không tính bố cục); chỉ Chrome thật mới lộ ra.</w:t>
+      </w:r>
+    </w:p>
+    <w:p>
+      <w:pPr>
+        <w:pStyle w:val="ListParagraph"/>
+        <w:numPr>
+          <w:ilvl w:val="0"/>
+          <w:numId w:val="1"/>
+        </w:numPr>
+      </w:pPr>
+      <w:r>
+        <w:rPr>
+          <w:b/>
+          <w:bCs/>
+        </w:rPr>
+        <w:t xml:space="preserve">Nguyên nhân:</w:t>
+      </w:r>
+      <w:r>
+        <w:t xml:space="preserve"> tiêu đề cột cuối có chữ ẩn "Chi tiết" với class </w:t>
+      </w:r>
+      <w:r>
+        <w:rPr>
+          <w:rFonts w:ascii="Consolas" w:eastAsia="Consolas" w:hAnsi="Consolas" w:cs="Consolas"/>
+        </w:rPr>
+        <w:t xml:space="preserve">sr-only</w:t>
+      </w:r>
+      <w:r>
+        <w:t xml:space="preserve">, mà </w:t>
+      </w:r>
+      <w:r>
+        <w:rPr>
+          <w:rFonts w:ascii="Consolas" w:eastAsia="Consolas" w:hAnsi="Consolas" w:cs="Consolas"/>
+        </w:rPr>
+        <w:t xml:space="preserve">sr-only</w:t>
+      </w:r>
+      <w:r>
+        <w:t xml:space="preserve"> dùng </w:t>
+      </w:r>
+      <w:r>
+        <w:rPr>
+          <w:rFonts w:ascii="Consolas" w:eastAsia="Consolas" w:hAnsi="Consolas" w:cs="Consolas"/>
+        </w:rPr>
+        <w:t xml:space="preserve">position: absolute</w:t>
+      </w:r>
+      <w:r>
+        <w:t xml:space="preserve">. Một phần tử absolute chỉ bị khung cha </w:t>
+      </w:r>
+      <w:r>
+        <w:rPr>
+          <w:b/>
+          <w:bCs/>
+        </w:rPr>
+        <w:t xml:space="preserve">cắt</w:t>
+      </w:r>
+      <w:r>
+        <w:t xml:space="preserve"> khi khung đó (hoặc một cha nằm giữa) có </w:t>
+      </w:r>
+      <w:r>
+        <w:rPr>
+          <w:rFonts w:ascii="Consolas" w:eastAsia="Consolas" w:hAnsi="Consolas" w:cs="Consolas"/>
+        </w:rPr>
+        <w:t xml:space="preserve">position</w:t>
+      </w:r>
+      <w:r>
+        <w:t xml:space="preserve">. Khung cuộn của bảng chưa có, nên chữ ẩn "thoát" ra, nằm ngoài mép phải và kéo giãn cả trang.</w:t>
+      </w:r>
+    </w:p>
+    <w:p>
+      <w:pPr>
+        <w:pStyle w:val="ListParagraph"/>
+        <w:numPr>
+          <w:ilvl w:val="0"/>
+          <w:numId w:val="1"/>
+        </w:numPr>
+      </w:pPr>
+      <w:r>
+        <w:rPr>
+          <w:b/>
+          <w:bCs/>
+        </w:rPr>
+        <w:t xml:space="preserve">Cách tìm:</w:t>
+      </w:r>
+      <w:r>
+        <w:t xml:space="preserve"> liệt kê mọi phần tử có mép phải vượt bề rộng cửa sổ; trong danh sách có </w:t>
+      </w:r>
+      <w:r>
+        <w:rPr>
+          <w:rFonts w:ascii="Consolas" w:eastAsia="Consolas" w:hAnsi="Consolas" w:cs="Consolas"/>
+        </w:rPr>
+        <w:t xml:space="preserve">SPAN.sr-only</w:t>
+      </w:r>
+      <w:r>
+        <w:t xml:space="preserve">.</w:t>
+      </w:r>
+    </w:p>
+    <w:p>
+      <w:pPr>
+        <w:pStyle w:val="ListParagraph"/>
+        <w:numPr>
+          <w:ilvl w:val="0"/>
+          <w:numId w:val="1"/>
+        </w:numPr>
+      </w:pPr>
+      <w:r>
+        <w:rPr>
+          <w:b/>
+          <w:bCs/>
+        </w:rPr>
+        <w:t xml:space="preserve">Cách sửa:</w:t>
+      </w:r>
+      <w:r>
+        <w:t xml:space="preserve"> thêm </w:t>
+      </w:r>
+      <w:r>
+        <w:rPr>
+          <w:rFonts w:ascii="Consolas" w:eastAsia="Consolas" w:hAnsi="Consolas" w:cs="Consolas"/>
+        </w:rPr>
+        <w:t xml:space="preserve">relative</w:t>
+      </w:r>
+      <w:r>
+        <w:t xml:space="preserve"> cho khung cuộn. Bài học: </w:t>
+      </w:r>
+      <w:r>
+        <w:rPr>
+          <w:rFonts w:ascii="Consolas" w:eastAsia="Consolas" w:hAnsi="Consolas" w:cs="Consolas"/>
+        </w:rPr>
+        <w:t xml:space="preserve">overflow</w:t>
+      </w:r>
+      <w:r>
+        <w:t xml:space="preserve"> cắt con thường, nhưng con </w:t>
+      </w:r>
+      <w:r>
+        <w:rPr>
+          <w:rFonts w:ascii="Consolas" w:eastAsia="Consolas" w:hAnsi="Consolas" w:cs="Consolas"/>
+        </w:rPr>
+        <w:t xml:space="preserve">absolute</w:t>
+      </w:r>
+      <w:r>
+        <w:t xml:space="preserve"> thì còn tùy "khối chứa" của nó.</w:t>
+      </w:r>
+    </w:p>
+    <w:p>
+      <w:pPr>
+        <w:pStyle w:val="Heading3"/>
+      </w:pPr>
+      <w:r>
+        <w:t xml:space="preserve">6.8 Test chập chờn: đo trước khi sửa (AC-03)</w:t>
+      </w:r>
+    </w:p>
+    <w:p>
+      <w:pPr>
+        <w:pStyle w:val="ListParagraph"/>
+        <w:numPr>
+          <w:ilvl w:val="0"/>
+          <w:numId w:val="1"/>
+        </w:numPr>
+      </w:pPr>
+      <w:r>
+        <w:rPr>
+          <w:b/>
+          <w:bCs/>
+        </w:rPr>
+        <w:t xml:space="preserve">Triệu chứng:</w:t>
+      </w:r>
+      <w:r>
+        <w:t xml:space="preserve"> test "opens the inbox, the calendar and the notifications" của màn Tổng quan thỉnh thoảng đỏ (3 trên 27 lần chạy cả bộ), không đổi dòng code nào. Lỗi: không tìm thấy liên kết "Mở lịch" sau khi quay về </w:t>
+      </w:r>
+      <w:r>
+        <w:rPr>
+          <w:rFonts w:ascii="Consolas" w:eastAsia="Consolas" w:hAnsi="Consolas" w:cs="Consolas"/>
+        </w:rPr>
+        <w:t xml:space="preserve">/overview</w:t>
+      </w:r>
+      <w:r>
+        <w:t xml:space="preserve">.</w:t>
+      </w:r>
+    </w:p>
+    <w:p>
+      <w:pPr>
+        <w:pStyle w:val="ListParagraph"/>
+        <w:numPr>
+          <w:ilvl w:val="0"/>
+          <w:numId w:val="1"/>
+        </w:numPr>
+      </w:pPr>
+      <w:r>
+        <w:rPr>
+          <w:b/>
+          <w:bCs/>
+        </w:rPr>
+        <w:t xml:space="preserve">Giả thuyết đầu tiên:</w:t>
+      </w:r>
+      <w:r>
+        <w:t xml:space="preserve"> truy vấn </w:t>
+      </w:r>
+      <w:r>
+        <w:rPr>
+          <w:rFonts w:ascii="Consolas" w:eastAsia="Consolas" w:hAnsi="Consolas" w:cs="Consolas"/>
+        </w:rPr>
+        <w:t xml:space="preserve">findByRole</w:t>
+      </w:r>
+      <w:r>
+        <w:t xml:space="preserve"> chậm vì phải tính tên đọc được của mọi phần tử. </w:t>
+      </w:r>
+      <w:r>
+        <w:rPr>
+          <w:b/>
+          <w:bCs/>
+        </w:rPr>
+        <w:t xml:space="preserve">Số đo nói khác:</w:t>
+      </w:r>
+      <w:r>
+        <w:t xml:space="preserve"> truy vấn cả màn chỉ mất khoảng 26ms; thứ tốn thời gian là React </w:t>
+      </w:r>
+      <w:r>
+        <w:rPr>
+          <w:b/>
+          <w:bCs/>
+        </w:rPr>
+        <w:t xml:space="preserve">vẽ lại cả màn</w:t>
+      </w:r>
+      <w:r>
+        <w:t xml:space="preserve"> sau khi điều hướng: 260–380ms, và lâu hơn khi 15 file test chạy song song làm máy bận. Khi vượt 1 giây (mức chờ mặc định của </w:t>
+      </w:r>
+      <w:r>
+        <w:rPr>
+          <w:rFonts w:ascii="Consolas" w:eastAsia="Consolas" w:hAnsi="Consolas" w:cs="Consolas"/>
+        </w:rPr>
+        <w:t xml:space="preserve">findBy…</w:t>
+      </w:r>
+      <w:r>
+        <w:t xml:space="preserve">), test đỏ.</w:t>
+      </w:r>
+    </w:p>
+    <w:p>
+      <w:pPr>
+        <w:pStyle w:val="ListParagraph"/>
+        <w:numPr>
+          <w:ilvl w:val="0"/>
+          <w:numId w:val="1"/>
+        </w:numPr>
+      </w:pPr>
+      <w:r>
+        <w:rPr>
+          <w:b/>
+          <w:bCs/>
+        </w:rPr>
+        <w:t xml:space="preserve">Cách sửa:</w:t>
+      </w:r>
+      <w:r>
+        <w:t xml:space="preserve"> </w:t>
+      </w:r>
+      <w:r>
+        <w:rPr>
+          <w:rFonts w:ascii="Consolas" w:eastAsia="Consolas" w:hAnsi="Consolas" w:cs="Consolas"/>
+        </w:rPr>
+        <w:t xml:space="preserve">configure({ asyncUtilTimeout: 3000 })</w:t>
+      </w:r>
+      <w:r>
+        <w:t xml:space="preserve"> trong </w:t>
+      </w:r>
+      <w:r>
+        <w:rPr>
+          <w:rFonts w:ascii="Consolas" w:eastAsia="Consolas" w:hAnsi="Consolas" w:cs="Consolas"/>
+        </w:rPr>
+        <w:t xml:space="preserve">src/test/setup.ts</w:t>
+      </w:r>
+      <w:r>
+        <w:t xml:space="preserve">. Không che lỗi thật: phần tử không bao giờ xuất hiện thì test vẫn đỏ, chỉ đỏ sau 3 giây thay vì 1 giây. Sau khi sửa: 0/12 lần đỏ.</w:t>
+      </w:r>
+    </w:p>
+    <w:p>
+      <w:pPr>
+        <w:pStyle w:val="ListParagraph"/>
+        <w:numPr>
+          <w:ilvl w:val="0"/>
+          <w:numId w:val="1"/>
+        </w:numPr>
+      </w:pPr>
+      <w:r>
+        <w:rPr>
+          <w:b/>
+          <w:bCs/>
+        </w:rPr>
+        <w:t xml:space="preserve">Bài học:</w:t>
+      </w:r>
+      <w:r>
+        <w:t xml:space="preserve"> với lỗi chập chờn, đo trước rồi mới sửa. Nếu tin giả thuyết đầu, cách sửa sẽ là "thu hẹp truy vấn", vừa tốn công vừa không chữa được.</w:t>
+      </w:r>
+    </w:p>
+    <w:p>
+      <w:pPr>
+        <w:pStyle w:val="Heading3"/>
+      </w:pPr>
+      <w:r>
+        <w:t xml:space="preserve">6.9 Trang chi tiết: thẻ có tên, công tắc, phần rỗng (AC-04)</w:t>
+      </w:r>
+    </w:p>
+    <w:p>
+      <w:pPr>
+        <w:pStyle w:val="ListParagraph"/>
+        <w:numPr>
+          <w:ilvl w:val="0"/>
+          <w:numId w:val="1"/>
+        </w:numPr>
+      </w:pPr>
+      <w:r>
+        <w:rPr>
+          <w:b/>
+          <w:bCs/>
+        </w:rPr>
+        <w:t xml:space="preserve">Ở đâu:</w:t>
+      </w:r>
+      <w:r>
+        <w:t xml:space="preserve"> </w:t>
+      </w:r>
+      <w:r>
+        <w:rPr>
+          <w:rFonts w:ascii="Consolas" w:eastAsia="Consolas" w:hAnsi="Consolas" w:cs="Consolas"/>
+        </w:rPr>
+        <w:t xml:space="preserve">src/features/accounts/AccountDetailPage.tsx</w:t>
+      </w:r>
+      <w:r>
+        <w:t xml:space="preserve">, </w:t>
+      </w:r>
+      <w:r>
+        <w:rPr>
+          <w:rFonts w:ascii="Consolas" w:eastAsia="Consolas" w:hAnsi="Consolas" w:cs="Consolas"/>
+        </w:rPr>
+        <w:t xml:space="preserve">components/SectionCard.tsx</w:t>
+      </w:r>
+      <w:r>
+        <w:t xml:space="preserve">, </w:t>
+      </w:r>
+      <w:r>
+        <w:rPr>
+          <w:rFonts w:ascii="Consolas" w:eastAsia="Consolas" w:hAnsi="Consolas" w:cs="Consolas"/>
+        </w:rPr>
+        <w:t xml:space="preserve">components/Channels.tsx</w:t>
+      </w:r>
+      <w:r>
+        <w:t xml:space="preserve">, </w:t>
+      </w:r>
+      <w:r>
+        <w:rPr>
+          <w:rFonts w:ascii="Consolas" w:eastAsia="Consolas" w:hAnsi="Consolas" w:cs="Consolas"/>
+        </w:rPr>
+        <w:t xml:space="preserve">components/DetailCards.tsx</w:t>
+      </w:r>
+      <w:r>
+        <w:t xml:space="preserve">, </w:t>
+      </w:r>
+      <w:r>
+        <w:rPr>
+          <w:rFonts w:ascii="Consolas" w:eastAsia="Consolas" w:hAnsi="Consolas" w:cs="Consolas"/>
+        </w:rPr>
+        <w:t xml:space="preserve">components/MobileAccountDetail.tsx</w:t>
+      </w:r>
+      <w:r>
+        <w:t xml:space="preserve">.</w:t>
+      </w:r>
+    </w:p>
+    <w:p>
+      <w:pPr>
+        <w:pStyle w:val="ListParagraph"/>
+        <w:numPr>
+          <w:ilvl w:val="0"/>
+          <w:numId w:val="1"/>
+        </w:numPr>
+      </w:pPr>
+      <w:r>
+        <w:rPr>
+          <w:b/>
+          <w:bCs/>
+        </w:rPr>
+        <w:t xml:space="preserve">Lưới 12 cột, thẻ 7/5 như canvas:</w:t>
+      </w:r>
+      <w:r>
+        <w:t xml:space="preserve"> </w:t>
+      </w:r>
+      <w:r>
+        <w:rPr>
+          <w:rFonts w:ascii="Consolas" w:eastAsia="Consolas" w:hAnsi="Consolas" w:cs="Consolas"/>
+        </w:rPr>
+        <w:t xml:space="preserve">grid-cols-12</w:t>
+      </w:r>
+      <w:r>
+        <w:t xml:space="preserve">, thẻ </w:t>
+      </w:r>
+      <w:r>
+        <w:rPr>
+          <w:rFonts w:ascii="Consolas" w:eastAsia="Consolas" w:hAnsi="Consolas" w:cs="Consolas"/>
+        </w:rPr>
+        <w:t xml:space="preserve">col-span-7</w:t>
+      </w:r>
+      <w:r>
+        <w:t xml:space="preserve"> và </w:t>
+      </w:r>
+      <w:r>
+        <w:rPr>
+          <w:rFonts w:ascii="Consolas" w:eastAsia="Consolas" w:hAnsi="Consolas" w:cs="Consolas"/>
+        </w:rPr>
+        <w:t xml:space="preserve">col-span-5</w:t>
+      </w:r>
+      <w:r>
+        <w:t xml:space="preserve"> xen nhau. Mỗi thẻ là </w:t>
+      </w:r>
+      <w:r>
+        <w:rPr>
+          <w:rFonts w:ascii="Consolas" w:eastAsia="Consolas" w:hAnsi="Consolas" w:cs="Consolas"/>
+        </w:rPr>
+        <w:t xml:space="preserve">&lt;section aria-labelledby&gt;</w:t>
+      </w:r>
+      <w:r>
+        <w:t xml:space="preserve"> trỏ tới </w:t>
+      </w:r>
+      <w:r>
+        <w:rPr>
+          <w:rFonts w:ascii="Consolas" w:eastAsia="Consolas" w:hAnsi="Consolas" w:cs="Consolas"/>
+        </w:rPr>
+        <w:t xml:space="preserve">&lt;h2&gt;</w:t>
+      </w:r>
+      <w:r>
+        <w:t xml:space="preserve"> của nó, nên là một vùng có tên ("Kênh đã kết nối", "Quyền đã cấp"…).</w:t>
+      </w:r>
+    </w:p>
+    <w:p>
+      <w:pPr>
+        <w:pStyle w:val="ListParagraph"/>
+        <w:numPr>
+          <w:ilvl w:val="0"/>
+          <w:numId w:val="1"/>
+        </w:numPr>
+      </w:pPr>
+      <w:r>
+        <w:rPr>
+          <w:b/>
+          <w:bCs/>
+        </w:rPr>
+        <w:t xml:space="preserve">Công tắc kênh:</w:t>
+      </w:r>
+      <w:r>
+        <w:t xml:space="preserve"> </w:t>
+      </w:r>
+      <w:r>
+        <w:rPr>
+          <w:rFonts w:ascii="Consolas" w:eastAsia="Consolas" w:hAnsi="Consolas" w:cs="Consolas"/>
+        </w:rPr>
+        <w:t xml:space="preserve">Switch</w:t>
+      </w:r>
+      <w:r>
+        <w:t xml:space="preserve"> của Radix có </w:t>
+      </w:r>
+      <w:r>
+        <w:rPr>
+          <w:rFonts w:ascii="Consolas" w:eastAsia="Consolas" w:hAnsi="Consolas" w:cs="Consolas"/>
+        </w:rPr>
+        <w:t xml:space="preserve">role="switch"</w:t>
+      </w:r>
+      <w:r>
+        <w:t xml:space="preserve"> và </w:t>
+      </w:r>
+      <w:r>
+        <w:rPr>
+          <w:rFonts w:ascii="Consolas" w:eastAsia="Consolas" w:hAnsi="Consolas" w:cs="Consolas"/>
+        </w:rPr>
+        <w:t xml:space="preserve">aria-checked</w:t>
+      </w:r>
+      <w:r>
+        <w:t xml:space="preserve">; trình đọc màn hình đọc "Thư đến, công tắc, bật". Kênh cần thêm quyền thì </w:t>
+      </w:r>
+      <w:r>
+        <w:rPr>
+          <w:rFonts w:ascii="Consolas" w:eastAsia="Consolas" w:hAnsi="Consolas" w:cs="Consolas"/>
+        </w:rPr>
+        <w:t xml:space="preserve">disabled</w:t>
+      </w:r>
+      <w:r>
+        <w:t xml:space="preserve">. Kênh của tài khoản hết quyền mà đang bật thì hiện nhãn "Tạm dừng" thay cho công tắc (canvas mobile).</w:t>
+      </w:r>
+    </w:p>
+    <w:p>
+      <w:pPr>
+        <w:pStyle w:val="ListParagraph"/>
+        <w:numPr>
+          <w:ilvl w:val="0"/>
+          <w:numId w:val="1"/>
+        </w:numPr>
+      </w:pPr>
+      <w:r>
+        <w:rPr>
+          <w:b/>
+          <w:bCs/>
+        </w:rPr>
+        <w:t xml:space="preserve">Phần chưa có dữ liệu:</w:t>
+      </w:r>
+      <w:r>
+        <w:t xml:space="preserve"> </w:t>
+      </w:r>
+      <w:r>
+        <w:rPr>
+          <w:rFonts w:ascii="Consolas" w:eastAsia="Consolas" w:hAnsi="Consolas" w:cs="Consolas"/>
+        </w:rPr>
+        <w:t xml:space="preserve">scopes</w:t>
+      </w:r>
+      <w:r>
+        <w:t xml:space="preserve">, </w:t>
+      </w:r>
+      <w:r>
+        <w:rPr>
+          <w:rFonts w:ascii="Consolas" w:eastAsia="Consolas" w:hAnsi="Consolas" w:cs="Consolas"/>
+        </w:rPr>
+        <w:t xml:space="preserve">sites</w:t>
+      </w:r>
+      <w:r>
+        <w:t xml:space="preserve">, </w:t>
+      </w:r>
+      <w:r>
+        <w:rPr>
+          <w:rFonts w:ascii="Consolas" w:eastAsia="Consolas" w:hAnsi="Consolas" w:cs="Consolas"/>
+        </w:rPr>
+        <w:t xml:space="preserve">syncRuns</w:t>
+      </w:r>
+      <w:r>
+        <w:t xml:space="preserve">, </w:t>
+      </w:r>
+      <w:r>
+        <w:rPr>
+          <w:rFonts w:ascii="Consolas" w:eastAsia="Consolas" w:hAnsi="Consolas" w:cs="Consolas"/>
+        </w:rPr>
+        <w:t xml:space="preserve">activity</w:t>
+      </w:r>
+      <w:r>
+        <w:t xml:space="preserve"> có thể là </w:t>
+      </w:r>
+      <w:r>
+        <w:rPr>
+          <w:rFonts w:ascii="Consolas" w:eastAsia="Consolas" w:hAnsi="Consolas" w:cs="Consolas"/>
+        </w:rPr>
+        <w:t xml:space="preserve">null</w:t>
+      </w:r>
+      <w:r>
+        <w:t xml:space="preserve">; thẻ tương ứng ghi "Chưa có dữ liệu", các thẻ khác vẫn hiện. Mở Zalo (dữ liệu mẫu để trống cả bốn phần) để xem.</w:t>
+      </w:r>
+    </w:p>
+    <w:p>
+      <w:pPr>
+        <w:pStyle w:val="ListParagraph"/>
+        <w:numPr>
+          <w:ilvl w:val="0"/>
+          <w:numId w:val="1"/>
+        </w:numPr>
+      </w:pPr>
+      <w:r>
+        <w:rPr>
+          <w:b/>
+          <w:bCs/>
+        </w:rPr>
+        <w:t xml:space="preserve">Tiêu đề thanh trên ở tablet:</w:t>
+      </w:r>
+      <w:r>
+        <w:t xml:space="preserve"> khung app tìm tiêu đề theo </w:t>
+      </w:r>
+      <w:r>
+        <w:rPr>
+          <w:b/>
+          <w:bCs/>
+        </w:rPr>
+        <w:t xml:space="preserve">tiền tố</w:t>
+      </w:r>
+      <w:r>
+        <w:t xml:space="preserve"> đường dẫn, nên </w:t>
+      </w:r>
+      <w:r>
+        <w:rPr>
+          <w:rFonts w:ascii="Consolas" w:eastAsia="Consolas" w:hAnsi="Consolas" w:cs="Consolas"/>
+        </w:rPr>
+        <w:t xml:space="preserve">/accounts/acc-gmail</w:t>
+      </w:r>
+      <w:r>
+        <w:t xml:space="preserve"> vẫn ghi "Tài khoản".</w:t>
+      </w:r>
+    </w:p>
+    <w:p>
+      <w:pPr>
+        <w:pStyle w:val="ListParagraph"/>
+        <w:numPr>
+          <w:ilvl w:val="0"/>
+          <w:numId w:val="1"/>
+        </w:numPr>
+      </w:pPr>
+      <w:r>
+        <w:rPr>
+          <w:b/>
+          <w:bCs/>
+        </w:rPr>
+        <w:t xml:space="preserve">Bẫy trong test, dữ liệu tải sau:</w:t>
+      </w:r>
+      <w:r>
+        <w:t xml:space="preserve"> phần thêm đến </w:t>
+      </w:r>
+      <w:r>
+        <w:rPr>
+          <w:b/>
+          <w:bCs/>
+        </w:rPr>
+        <w:t xml:space="preserve">sau</w:t>
+      </w:r>
+      <w:r>
+        <w:t xml:space="preserve"> lần vẽ đầu (một </w:t>
+      </w:r>
+      <w:r>
+        <w:rPr>
+          <w:rFonts w:ascii="Consolas" w:eastAsia="Consolas" w:hAnsi="Consolas" w:cs="Consolas"/>
+        </w:rPr>
+        <w:t xml:space="preserve">Promise</w:t>
+      </w:r>
+      <w:r>
+        <w:t xml:space="preserve">). Đọc ngay bằng </w:t>
+      </w:r>
+      <w:r>
+        <w:rPr>
+          <w:rFonts w:ascii="Consolas" w:eastAsia="Consolas" w:hAnsi="Consolas" w:cs="Consolas"/>
+        </w:rPr>
+        <w:t xml:space="preserve">getByText</w:t>
+      </w:r>
+      <w:r>
+        <w:t xml:space="preserve"> thì chưa có gì; phải dùng </w:t>
+      </w:r>
+      <w:r>
+        <w:rPr>
+          <w:rFonts w:ascii="Consolas" w:eastAsia="Consolas" w:hAnsi="Consolas" w:cs="Consolas"/>
+        </w:rPr>
+        <w:t xml:space="preserve">findByText</w:t>
+      </w:r>
+      <w:r>
+        <w:t xml:space="preserve"> để chờ.</w:t>
+      </w:r>
+    </w:p>
+    <w:p>
+      <w:pPr>
+        <w:pStyle w:val="Heading3"/>
+      </w:pPr>
+      <w:r>
+        <w:t xml:space="preserve">6.10 Kiểm chứng AC-01…AC-04</w:t>
+      </w:r>
+    </w:p>
+    <w:p>
+      <w:pPr>
+        <w:pStyle w:val="ListParagraph"/>
+        <w:numPr>
+          <w:ilvl w:val="0"/>
+          <w:numId w:val="1"/>
+        </w:numPr>
+      </w:pPr>
+      <w:r>
+        <w:rPr>
+          <w:b/>
+          <w:bCs/>
+        </w:rPr>
+        <w:t xml:space="preserve">Test viết trước, mỗi task:</w:t>
+      </w:r>
+      <w:r>
+        <w:t xml:space="preserve"> AC-01 3 test khung app đỏ trước; AC-02 16 test hàm chữ cộng 11 test dữ liệu mẫu và hook đỏ trước; AC-03 10/10 test trang đỏ trên trang rỗng; AC-04 4 test hàm chữ cộng 12/12 test trang đỏ trước. Cuối cùng 148/148.</w:t>
+      </w:r>
+    </w:p>
+    <w:p>
+      <w:pPr>
+        <w:pStyle w:val="ListParagraph"/>
+        <w:numPr>
+          <w:ilvl w:val="0"/>
+          <w:numId w:val="1"/>
+        </w:numPr>
+      </w:pPr>
+      <w:r>
+        <w:rPr>
+          <w:b/>
+          <w:bCs/>
+        </w:rPr>
+        <w:t xml:space="preserve">Kiểm tra ngược:</w:t>
+      </w:r>
+      <w:r>
+        <w:t xml:space="preserve"> AC-01 8/8 bị bắt; AC-02 60/60; AC-03 25 lỗi, 23 bị bắt, 2 lọt (dòng đầu đếm theo kết quả lọc; danh sách mobile bị lọc theo), thêm kiểm tra thì bị bắt; AC-04 42 lỗi, 41 bị bắt, 1 lọt (công tắc nào cũng gửi kênh "Thư đến", vì test chỉ bấm đúng "Thư đến"), thêm test bấm "Gửi thư" thì bị bắt.</w:t>
+      </w:r>
+    </w:p>
+    <w:p>
+      <w:pPr>
+        <w:pStyle w:val="ListParagraph"/>
+        <w:numPr>
+          <w:ilvl w:val="0"/>
+          <w:numId w:val="1"/>
+        </w:numPr>
+      </w:pPr>
+      <w:r>
+        <w:rPr>
+          <w:b/>
+          <w:bCs/>
+        </w:rPr>
+        <w:t xml:space="preserve">Chrome thật</w:t>
+      </w:r>
+      <w:r>
+        <w:t xml:space="preserve"> (đồng hồ cố định 14:05): 1440 / 1024 / 768 / 390px × sáng / tối cho cả hai trang; không trang nào cuộn ngang; Tab tới nút mở chi tiết có viền 2px; bấm giữa hàng mở chi tiết; hộp thoại giữ focus, Esc trả focus về nút mở; xác nhận ngắt kết nối về danh sách còn 2 tài khoản.</w:t>
+      </w:r>
+    </w:p>
+    <w:p>
+      <w:pPr>
+        <w:pStyle w:val="ListParagraph"/>
+        <w:numPr>
+          <w:ilvl w:val="0"/>
+          <w:numId w:val="1"/>
+        </w:numPr>
+      </w:pPr>
+      <w:r>
+        <w:rPr>
+          <w:b/>
+          <w:bCs/>
+        </w:rPr>
+        <w:t xml:space="preserve">Bẫy của script kiểm tra:</w:t>
+      </w:r>
+      <w:r>
+        <w:t xml:space="preserve"> gửi phím Enter qua DevTools Protocol mà thiếu </w:t>
+      </w:r>
+      <w:r>
+        <w:rPr>
+          <w:rFonts w:ascii="Consolas" w:eastAsia="Consolas" w:hAnsi="Consolas" w:cs="Consolas"/>
+        </w:rPr>
+        <w:t xml:space="preserve">text: '\r'</w:t>
+      </w:r>
+      <w:r>
+        <w:t xml:space="preserve"> thì Chrome không coi là bấm nút, hộp thoại không mở. Lỗi nằm ở script, không phải ở trang: trước khi sửa trang, kiểm xem công cụ đo có đúng không.</w:t>
+      </w:r>
+    </w:p>
+    <w:p>
+      <w:pPr>
         <w:pBdr>
           <w:bottom w:val="single" w:sz="4" w:space="0" w:color="auto"/>
         </w:pBdr>
@@ -11003,6 +13855,237 @@
       </w:r>
       <w:r>
         <w:t xml:space="preserve">" sống sót. Vì sao đó không phải lỗ hổng của test?</w:t>
+      </w:r>
+    </w:p>
+    <w:p>
+      <w:pPr>
+        <w:pStyle w:val="ListParagraph"/>
+        <w:numPr>
+          <w:ilvl w:val="0"/>
+          <w:numId w:val="100"/>
+        </w:numPr>
+      </w:pPr>
+      <w:r>
+        <w:t xml:space="preserve">Route </w:t>
+      </w:r>
+      <w:r>
+        <w:rPr>
+          <w:rFonts w:ascii="Consolas" w:eastAsia="Consolas" w:hAnsi="Consolas" w:cs="Consolas"/>
+        </w:rPr>
+        <w:t xml:space="preserve">handle</w:t>
+      </w:r>
+      <w:r>
+        <w:t xml:space="preserve"> dùng để làm gì, và vì sao khung app gộp </w:t>
+      </w:r>
+      <w:r>
+        <w:rPr>
+          <w:rFonts w:ascii="Consolas" w:eastAsia="Consolas" w:hAnsi="Consolas" w:cs="Consolas"/>
+        </w:rPr>
+        <w:t xml:space="preserve">handle</w:t>
+      </w:r>
+      <w:r>
+        <w:t xml:space="preserve"> của mọi route đang khớp thay vì để trang tự ẩn thanh trên?</w:t>
+      </w:r>
+    </w:p>
+    <w:p>
+      <w:pPr>
+        <w:pStyle w:val="ListParagraph"/>
+        <w:numPr>
+          <w:ilvl w:val="0"/>
+          <w:numId w:val="100"/>
+        </w:numPr>
+      </w:pPr>
+      <w:r>
+        <w:t xml:space="preserve">Vì sao </w:t>
+      </w:r>
+      <w:r>
+        <w:rPr>
+          <w:rFonts w:ascii="Consolas" w:eastAsia="Consolas" w:hAnsi="Consolas" w:cs="Consolas"/>
+        </w:rPr>
+        <w:t xml:space="preserve">&lt;header&gt;</w:t>
+      </w:r>
+      <w:r>
+        <w:t xml:space="preserve"> của trang con nằm trong </w:t>
+      </w:r>
+      <w:r>
+        <w:rPr>
+          <w:rFonts w:ascii="Consolas" w:eastAsia="Consolas" w:hAnsi="Consolas" w:cs="Consolas"/>
+        </w:rPr>
+        <w:t xml:space="preserve">&lt;main&gt;</w:t>
+      </w:r>
+      <w:r>
+        <w:t xml:space="preserve"> không phải landmark "banner", và test tìm nó bằng cách nào?</w:t>
+      </w:r>
+    </w:p>
+    <w:p>
+      <w:pPr>
+        <w:pStyle w:val="ListParagraph"/>
+        <w:numPr>
+          <w:ilvl w:val="0"/>
+          <w:numId w:val="100"/>
+        </w:numPr>
+      </w:pPr>
+      <w:r>
+        <w:t xml:space="preserve">Radix Dialog tự làm những gì cho người dùng bàn phím? Vì sao trang chi tiết có hai hộp thoại thay vì một?</w:t>
+      </w:r>
+    </w:p>
+    <w:p>
+      <w:pPr>
+        <w:pStyle w:val="ListParagraph"/>
+        <w:numPr>
+          <w:ilvl w:val="0"/>
+          <w:numId w:val="100"/>
+        </w:numPr>
+      </w:pPr>
+      <w:r>
+        <w:rPr>
+          <w:rFonts w:ascii="Consolas" w:eastAsia="Consolas" w:hAnsi="Consolas" w:cs="Consolas"/>
+        </w:rPr>
+        <w:t xml:space="preserve">foldText("Nguyễn Đức")</w:t>
+      </w:r>
+      <w:r>
+        <w:t xml:space="preserve"> ra gì? Vì sao phải thay riêng chữ "đ"?</w:t>
+      </w:r>
+    </w:p>
+    <w:p>
+      <w:pPr>
+        <w:pStyle w:val="ListParagraph"/>
+        <w:numPr>
+          <w:ilvl w:val="0"/>
+          <w:numId w:val="100"/>
+        </w:numPr>
+      </w:pPr>
+      <w:r>
+        <w:t xml:space="preserve">Vì sao trang chi tiết lấy tài khoản từ cache của danh sách thay vì tải riêng? Lợi gì khi bật/tắt kênh?</w:t>
+      </w:r>
+    </w:p>
+    <w:p>
+      <w:pPr>
+        <w:pStyle w:val="ListParagraph"/>
+        <w:numPr>
+          <w:ilvl w:val="0"/>
+          <w:numId w:val="100"/>
+        </w:numPr>
+      </w:pPr>
+      <w:r>
+        <w:t xml:space="preserve">Vì sao </w:t>
+      </w:r>
+      <w:r>
+        <w:rPr>
+          <w:rFonts w:ascii="Consolas" w:eastAsia="Consolas" w:hAnsi="Consolas" w:cs="Consolas"/>
+        </w:rPr>
+        <w:t xml:space="preserve">notFound</w:t>
+      </w:r>
+      <w:r>
+        <w:t xml:space="preserve"> chỉ được đúng khi danh sách đã tải xong?</w:t>
+      </w:r>
+    </w:p>
+    <w:p>
+      <w:pPr>
+        <w:pStyle w:val="ListParagraph"/>
+        <w:numPr>
+          <w:ilvl w:val="0"/>
+          <w:numId w:val="100"/>
+        </w:numPr>
+      </w:pPr>
+      <w:r>
+        <w:t xml:space="preserve">Cập nhật lạc quan là gì? Nếu lưu lỗi thì chuyện gì xảy ra, và test giả lỗi mạng thế nào?</w:t>
+      </w:r>
+    </w:p>
+    <w:p>
+      <w:pPr>
+        <w:pStyle w:val="ListParagraph"/>
+        <w:numPr>
+          <w:ilvl w:val="0"/>
+          <w:numId w:val="100"/>
+        </w:numPr>
+      </w:pPr>
+      <w:r>
+        <w:t xml:space="preserve">Vì sao </w:t>
+      </w:r>
+      <w:r>
+        <w:rPr>
+          <w:rFonts w:ascii="Consolas" w:eastAsia="Consolas" w:hAnsi="Consolas" w:cs="Consolas"/>
+        </w:rPr>
+        <w:t xml:space="preserve">withChannel</w:t>
+      </w:r>
+      <w:r>
+        <w:t xml:space="preserve"> phải trả object mới thay vì sửa thẳng object cũ?</w:t>
+      </w:r>
+    </w:p>
+    <w:p>
+      <w:pPr>
+        <w:pStyle w:val="ListParagraph"/>
+        <w:numPr>
+          <w:ilvl w:val="0"/>
+          <w:numId w:val="100"/>
+        </w:numPr>
+      </w:pPr>
+      <w:r>
+        <w:t xml:space="preserve">Liên kết phủ cả hàng hoạt động thế nào, và vì sao tốt hơn gắn </w:t>
+      </w:r>
+      <w:r>
+        <w:rPr>
+          <w:rFonts w:ascii="Consolas" w:eastAsia="Consolas" w:hAnsi="Consolas" w:cs="Consolas"/>
+        </w:rPr>
+        <w:t xml:space="preserve">onClick</w:t>
+      </w:r>
+      <w:r>
+        <w:t xml:space="preserve"> cho cả hàng?</w:t>
+      </w:r>
+    </w:p>
+    <w:p>
+      <w:pPr>
+        <w:pStyle w:val="ListParagraph"/>
+        <w:numPr>
+          <w:ilvl w:val="0"/>
+          <w:numId w:val="100"/>
+        </w:numPr>
+      </w:pPr>
+      <w:r>
+        <w:t xml:space="preserve">Vì sao chữ ẩn </w:t>
+      </w:r>
+      <w:r>
+        <w:rPr>
+          <w:rFonts w:ascii="Consolas" w:eastAsia="Consolas" w:hAnsi="Consolas" w:cs="Consolas"/>
+        </w:rPr>
+        <w:t xml:space="preserve">sr-only</w:t>
+      </w:r>
+      <w:r>
+        <w:t xml:space="preserve"> làm cả trang cuộn ngang ở 768px, và vì sao thêm </w:t>
+      </w:r>
+      <w:r>
+        <w:rPr>
+          <w:rFonts w:ascii="Consolas" w:eastAsia="Consolas" w:hAnsi="Consolas" w:cs="Consolas"/>
+        </w:rPr>
+        <w:t xml:space="preserve">relative</w:t>
+      </w:r>
+      <w:r>
+        <w:t xml:space="preserve"> cho khung cuộn thì hết?</w:t>
+      </w:r>
+    </w:p>
+    <w:p>
+      <w:pPr>
+        <w:pStyle w:val="ListParagraph"/>
+        <w:numPr>
+          <w:ilvl w:val="0"/>
+          <w:numId w:val="100"/>
+        </w:numPr>
+      </w:pPr>
+      <w:r>
+        <w:t xml:space="preserve">Test chập chờn ở màn Tổng quan: giả thuyết đầu là gì, số đo nói gì, và vì sao nâng thời gian chờ không che lỗi thật?</w:t>
+      </w:r>
+    </w:p>
+    <w:p>
+      <w:pPr>
+        <w:pStyle w:val="ListParagraph"/>
+        <w:numPr>
+          <w:ilvl w:val="0"/>
+          <w:numId w:val="100"/>
+        </w:numPr>
+      </w:pPr>
+      <w:r>
+        <w:t xml:space="preserve">Ở AC-04, lỗi cố ý "công tắc nào cũng gửi kênh Thư đến" sống sót. Test đã hở chỗ nào, và sửa thế nào?</w:t>
       </w:r>
     </w:p>
     <w:p/>

</xml_diff>

<commit_message>
docs(fe-ui-connect): Phase 1 guide section 7 and project state for CN-01 to CN-03
Co-Authored-By: Claude Opus 5.5 (1M context) <noreply@anthropic.com>
</commit_message>
<xml_diff>
--- a/docs/knowledge/phase-1-frontend-foundation.docx
+++ b/docs/knowledge/phase-1-frontend-foundation.docx
@@ -115,7 +115,7 @@
         <w:t xml:space="preserve">openspec/changes/fe-ui-overview</w:t>
       </w:r>
       <w:r>
-        <w:t xml:space="preserve"> (dựng giao diện trước với dữ liệu mẫu, D-42) và change </w:t>
+        <w:t xml:space="preserve"> (dựng giao diện trước với dữ liệu mẫu, D-42) change </w:t>
       </w:r>
       <w:r>
         <w:rPr>
@@ -124,7 +124,16 @@
         <w:t xml:space="preserve">openspec/changes/fe-ui-accounts</w:t>
       </w:r>
       <w:r>
-        <w:t xml:space="preserve"> (màn Tài khoản). Đã xong: BE-27, BE-28, BE-29, FE-01, UI-01, UI-02, UI-03, AC-01, AC-02, AC-03, AC-04.</w:t>
+        <w:t xml:space="preserve"> (màn Tài khoản) và change </w:t>
+      </w:r>
+      <w:r>
+        <w:rPr>
+          <w:rFonts w:ascii="Consolas" w:eastAsia="Consolas" w:hAnsi="Consolas" w:cs="Consolas"/>
+        </w:rPr>
+        <w:t xml:space="preserve">openspec/changes/fe-ui-connect</w:t>
+      </w:r>
+      <w:r>
+        <w:t xml:space="preserve"> (luồng kết nối tài khoản). Đã xong: BE-27, BE-28, BE-29, FE-01, UI-01, UI-02, UI-03, AC-01, AC-02, AC-03, AC-04, CN-01, CN-02, CN-03.</w:t>
         <w:br/>
       </w:r>
       <w:r>
@@ -13042,6 +13051,1229 @@
     </w:p>
     <w:p>
       <w:pPr>
+        <w:pStyle w:val="Heading2"/>
+      </w:pPr>
+      <w:r>
+        <w:t xml:space="preserve">7. Luồng kết nối tài khoản (fe-ui-connect)</w:t>
+      </w:r>
+    </w:p>
+    <w:p>
+      <w:pPr>
+        <w:pStyle w:val="Heading3"/>
+      </w:pPr>
+      <w:r>
+        <w:t xml:space="preserve">7.0 Bức tranh: đi rồi về</w:t>
+      </w:r>
+    </w:p>
+    <w:p>
+      <w:pPr>
+        <w:pStyle w:val="ListParagraph"/>
+        <w:numPr>
+          <w:ilvl w:val="0"/>
+          <w:numId w:val="1"/>
+        </w:numPr>
+      </w:pPr>
+      <w:r>
+        <w:rPr>
+          <w:b/>
+          <w:bCs/>
+        </w:rPr>
+        <w:t xml:space="preserve">Ở đâu:</w:t>
+      </w:r>
+      <w:r>
+        <w:t xml:space="preserve"> </w:t>
+      </w:r>
+      <w:r>
+        <w:rPr>
+          <w:rFonts w:ascii="Consolas" w:eastAsia="Consolas" w:hAnsi="Consolas" w:cs="Consolas"/>
+        </w:rPr>
+        <w:t xml:space="preserve">src/features/accounts/components/ConnectWizard.tsx</w:t>
+      </w:r>
+      <w:r>
+        <w:t xml:space="preserve">, </w:t>
+      </w:r>
+      <w:r>
+        <w:rPr>
+          <w:rFonts w:ascii="Consolas" w:eastAsia="Consolas" w:hAnsi="Consolas" w:cs="Consolas"/>
+        </w:rPr>
+        <w:t xml:space="preserve">ConnectError.tsx</w:t>
+      </w:r>
+      <w:r>
+        <w:t xml:space="preserve">, </w:t>
+      </w:r>
+      <w:r>
+        <w:rPr>
+          <w:rFonts w:ascii="Consolas" w:eastAsia="Consolas" w:hAnsi="Consolas" w:cs="Consolas"/>
+        </w:rPr>
+        <w:t xml:space="preserve">connect.types.ts</w:t>
+      </w:r>
+      <w:r>
+        <w:t xml:space="preserve">, </w:t>
+      </w:r>
+      <w:r>
+        <w:rPr>
+          <w:rFonts w:ascii="Consolas" w:eastAsia="Consolas" w:hAnsi="Consolas" w:cs="Consolas"/>
+        </w:rPr>
+        <w:t xml:space="preserve">connect.format.ts</w:t>
+      </w:r>
+      <w:r>
+        <w:t xml:space="preserve">, </w:t>
+      </w:r>
+      <w:r>
+        <w:rPr>
+          <w:rFonts w:ascii="Consolas" w:eastAsia="Consolas" w:hAnsi="Consolas" w:cs="Consolas"/>
+        </w:rPr>
+        <w:t xml:space="preserve">connect.sample.ts</w:t>
+      </w:r>
+      <w:r>
+        <w:t xml:space="preserve">, </w:t>
+      </w:r>
+      <w:r>
+        <w:rPr>
+          <w:rFonts w:ascii="Consolas" w:eastAsia="Consolas" w:hAnsi="Consolas" w:cs="Consolas"/>
+        </w:rPr>
+        <w:t xml:space="preserve">useConnect.ts</w:t>
+      </w:r>
+      <w:r>
+        <w:t xml:space="preserve">, </w:t>
+      </w:r>
+      <w:r>
+        <w:rPr>
+          <w:rFonts w:ascii="Consolas" w:eastAsia="Consolas" w:hAnsi="Consolas" w:cs="Consolas"/>
+        </w:rPr>
+        <w:t xml:space="preserve">accounts.api.ts</w:t>
+      </w:r>
+      <w:r>
+        <w:t xml:space="preserve">, </w:t>
+      </w:r>
+      <w:r>
+        <w:rPr>
+          <w:rFonts w:ascii="Consolas" w:eastAsia="Consolas" w:hAnsi="Consolas" w:cs="Consolas"/>
+        </w:rPr>
+        <w:t xml:space="preserve">AccountsPage.tsx</w:t>
+      </w:r>
+      <w:r>
+        <w:t xml:space="preserve">.</w:t>
+      </w:r>
+    </w:p>
+    <w:p>
+      <w:pPr>
+        <w:pStyle w:val="ListParagraph"/>
+        <w:numPr>
+          <w:ilvl w:val="0"/>
+          <w:numId w:val="1"/>
+        </w:numPr>
+      </w:pPr>
+      <w:r>
+        <w:rPr>
+          <w:b/>
+          <w:bCs/>
+        </w:rPr>
+        <w:t xml:space="preserve">Là gì:</w:t>
+      </w:r>
+      <w:r>
+        <w:t xml:space="preserve"> hộp thoại 5 bước của canvas </w:t>
+      </w:r>
+      <w:r>
+        <w:rPr>
+          <w:rFonts w:ascii="Consolas" w:eastAsia="Consolas" w:hAnsi="Consolas" w:cs="Consolas"/>
+        </w:rPr>
+        <w:t xml:space="preserve">ConnectWizard</w:t>
+      </w:r>
+      <w:r>
+        <w:t xml:space="preserve">, mở từ "Kết nối tài khoản" và "Đăng nhập lại". Phần giữa của luồng </w:t>
+      </w:r>
+      <w:r>
+        <w:rPr>
+          <w:b/>
+          <w:bCs/>
+        </w:rPr>
+        <w:t xml:space="preserve">không</w:t>
+      </w:r>
+      <w:r>
+        <w:t xml:space="preserve"> nằm trong Sino: người dùng rời Sino sang trang của Google, rồi Google gửi họ về.</w:t>
+      </w:r>
+    </w:p>
+    <w:p>
+      <w:pPr>
+        <w:shd w:val="clear" w:color="auto" w:fill="F2F3F5"/>
+        <w:ind w:left="0"/>
+      </w:pPr>
+      <w:r>
+        <w:rPr>
+          <w:rFonts w:ascii="Consolas" w:eastAsia="Consolas" w:hAnsi="Consolas" w:cs="Consolas"/>
+          <w:sz w:val="19"/>
+          <w:szCs w:val="19"/>
+        </w:rPr>
+        <w:t xml:space="preserve">"Kết nối tài khoản" -&gt; 1 Nhà cung cấp -&gt; 2 Quyền -&gt; 3 Đăng nhập</w:t>
+        <w:br/>
+        <w:t xml:space="preserve">"Đăng nhập lại"     -&gt; /accounts?reconnect=id -----&gt; 2 Quyền (kèm accountId)</w:t>
+        <w:br/>
+        <w:t xml:space="preserve">                                   3: POST /api/accounts/connect/{provider} -&gt; { authorizationUrl }</w:t>
+        <w:br/>
+        <w:t xml:space="preserve">                                      window.location.assign(authorizationUrl)   (rời Sino)</w:t>
+        <w:br/>
+        <w:t xml:space="preserve">                         ... trang của Google: chọn tài khoản, đồng ý quyền ...</w:t>
+        <w:br/>
+        <w:t xml:space="preserve">backend callback -&gt; 302 /accounts?connected=id      -&gt; 4 Đồng bộ -&gt; 5 Xong</w:t>
+        <w:br/>
+        <w:t xml:space="preserve">                 -&gt; 302 /accounts?connectError=CODE -&gt; cảnh báo + "Thử lại"</w:t>
+      </w:r>
+    </w:p>
+    <w:p>
+      <w:pPr>
+        <w:pStyle w:val="ListParagraph"/>
+        <w:numPr>
+          <w:ilvl w:val="0"/>
+          <w:numId w:val="1"/>
+        </w:numPr>
+      </w:pPr>
+      <w:r>
+        <w:rPr>
+          <w:b/>
+          <w:bCs/>
+        </w:rPr>
+        <w:t xml:space="preserve">Dữ liệu mẫu đóng vai cả Google:</w:t>
+      </w:r>
+      <w:r>
+        <w:t xml:space="preserve"> </w:t>
+      </w:r>
+      <w:r>
+        <w:rPr>
+          <w:rFonts w:ascii="Consolas" w:eastAsia="Consolas" w:hAnsi="Consolas" w:cs="Consolas"/>
+        </w:rPr>
+        <w:t xml:space="preserve">startConnect</w:t>
+      </w:r>
+      <w:r>
+        <w:t xml:space="preserve"> mẫu trả </w:t>
+      </w:r>
+      <w:r>
+        <w:rPr>
+          <w:rFonts w:ascii="Consolas" w:eastAsia="Consolas" w:hAnsi="Consolas" w:cs="Consolas"/>
+        </w:rPr>
+        <w:t xml:space="preserve">authorizationUrl = /accounts?connected=acc-gmail</w:t>
+      </w:r>
+      <w:r>
+        <w:t xml:space="preserve">, nên trên trình duyệt thật vòng "đi rồi về" chạy đủ mà không cần Google. Khi nối API (FE-30 của F04a), chỉ đổi thân các hàm trong </w:t>
+      </w:r>
+      <w:r>
+        <w:rPr>
+          <w:rFonts w:ascii="Consolas" w:eastAsia="Consolas" w:hAnsi="Consolas" w:cs="Consolas"/>
+        </w:rPr>
+        <w:t xml:space="preserve">accounts.api.ts</w:t>
+      </w:r>
+      <w:r>
+        <w:t xml:space="preserve">.</w:t>
+      </w:r>
+    </w:p>
+    <w:p>
+      <w:pPr>
+        <w:pStyle w:val="Heading3"/>
+      </w:pPr>
+      <w:r>
+        <w:t xml:space="preserve">7.1 Khi canvas và backend vênh nhau (D-47…D-50)</w:t>
+      </w:r>
+    </w:p>
+    <w:p>
+      <w:pPr>
+        <w:pStyle w:val="ListParagraph"/>
+        <w:numPr>
+          <w:ilvl w:val="0"/>
+          <w:numId w:val="1"/>
+        </w:numPr>
+      </w:pPr>
+      <w:r>
+        <w:rPr>
+          <w:b/>
+          <w:bCs/>
+        </w:rPr>
+        <w:t xml:space="preserve">Chuyện gì:</w:t>
+      </w:r>
+      <w:r>
+        <w:t xml:space="preserve"> canvas vẽ cửa sổ bật lên (popup) của Google, xem lại quyền </w:t>
+      </w:r>
+      <w:r>
+        <w:rPr>
+          <w:b/>
+          <w:bCs/>
+        </w:rPr>
+        <w:t xml:space="preserve">sau</w:t>
+      </w:r>
+      <w:r>
+        <w:t xml:space="preserve"> khi đăng nhập, có công tắc "Gửi thư · tùy chọn" và bước chọn khoảng đồng bộ. Backend F04a (người dùng đã duyệt) chuyển </w:t>
+      </w:r>
+      <w:r>
+        <w:rPr>
+          <w:b/>
+          <w:bCs/>
+        </w:rPr>
+        <w:t xml:space="preserve">cả trang</w:t>
+      </w:r>
+      <w:r>
+        <w:t xml:space="preserve">, xin quyền </w:t>
+      </w:r>
+      <w:r>
+        <w:rPr>
+          <w:b/>
+          <w:bCs/>
+        </w:rPr>
+        <w:t xml:space="preserve">ngay trong</w:t>
+      </w:r>
+      <w:r>
+        <w:t xml:space="preserve"> yêu cầu gửi sang Google, chỉ xin quyền đọc (gửi để F10), và để F04b chốt cửa sổ nhập thư.</w:t>
+      </w:r>
+    </w:p>
+    <w:p>
+      <w:pPr>
+        <w:pStyle w:val="ListParagraph"/>
+        <w:numPr>
+          <w:ilvl w:val="0"/>
+          <w:numId w:val="1"/>
+        </w:numPr>
+      </w:pPr>
+      <w:r>
+        <w:rPr>
+          <w:b/>
+          <w:bCs/>
+        </w:rPr>
+        <w:t xml:space="preserve">Cách chọn (agent chốt theo ủy quyền, ghi ở </w:t>
+      </w:r>
+      <w:r>
+        <w:rPr>
+          <w:rFonts w:ascii="Consolas" w:eastAsia="Consolas" w:hAnsi="Consolas" w:cs="Consolas"/>
+          <w:b/>
+          <w:bCs/>
+        </w:rPr>
+        <w:t xml:space="preserve">design.md</w:t>
+      </w:r>
+      <w:r>
+        <w:rPr>
+          <w:b/>
+          <w:bCs/>
+        </w:rPr>
+        <w:t xml:space="preserve"> để người dùng xem lại):</w:t>
+      </w:r>
+      <w:r>
+        <w:t xml:space="preserve"> giữ luồng backend, giao diện theo canvas nhiều nhất có thể.</w:t>
+      </w:r>
+    </w:p>
+    <w:p>
+      <w:pPr>
+        <w:pStyle w:val="ListParagraph"/>
+        <w:numPr>
+          <w:ilvl w:val="1"/>
+          <w:numId w:val="1"/>
+        </w:numPr>
+      </w:pPr>
+      <w:r>
+        <w:rPr>
+          <w:b/>
+          <w:bCs/>
+        </w:rPr>
+        <w:t xml:space="preserve">D-47:</w:t>
+      </w:r>
+      <w:r>
+        <w:t xml:space="preserve"> đổi thứ tự: Quyền lên trước Đăng nhập. Quyền đã cấp ở Google rồi thì "xem lại" không còn quyết định được gì.</w:t>
+      </w:r>
+    </w:p>
+    <w:p>
+      <w:pPr>
+        <w:pStyle w:val="ListParagraph"/>
+        <w:numPr>
+          <w:ilvl w:val="1"/>
+          <w:numId w:val="1"/>
+        </w:numPr>
+      </w:pPr>
+      <w:r>
+        <w:rPr>
+          <w:b/>
+          <w:bCs/>
+        </w:rPr>
+        <w:t xml:space="preserve">D-48:</w:t>
+      </w:r>
+      <w:r>
+        <w:t xml:space="preserve"> bỏ công tắc "Gửi thư": hiện một lựa chọn không có thật còn tệ hơn không hiện.</w:t>
+      </w:r>
+    </w:p>
+    <w:p>
+      <w:pPr>
+        <w:pStyle w:val="ListParagraph"/>
+        <w:numPr>
+          <w:ilvl w:val="1"/>
+          <w:numId w:val="1"/>
+        </w:numPr>
+      </w:pPr>
+      <w:r>
+        <w:rPr>
+          <w:b/>
+          <w:bCs/>
+        </w:rPr>
+        <w:t xml:space="preserve">D-49:</w:t>
+      </w:r>
+      <w:r>
+        <w:t xml:space="preserve"> giữ bước Đồng bộ như một </w:t>
+      </w:r>
+      <w:r>
+        <w:rPr>
+          <w:b/>
+          <w:bCs/>
+        </w:rPr>
+        <w:t xml:space="preserve">đề xuất có hình dạng cụ thể</w:t>
+      </w:r>
+      <w:r>
+        <w:t xml:space="preserve"> cho F04b (khoảng 30 / 90 / toàn bộ, ước tính số thư).</w:t>
+      </w:r>
+    </w:p>
+    <w:p>
+      <w:pPr>
+        <w:pStyle w:val="ListParagraph"/>
+        <w:numPr>
+          <w:ilvl w:val="1"/>
+          <w:numId w:val="1"/>
+        </w:numPr>
+      </w:pPr>
+      <w:r>
+        <w:rPr>
+          <w:b/>
+          <w:bCs/>
+        </w:rPr>
+        <w:t xml:space="preserve">D-50:</w:t>
+      </w:r>
+      <w:r>
+        <w:t xml:space="preserve"> provider chưa có luồng kết nối hiện "Sắp có" theo dữ liệu </w:t>
+      </w:r>
+      <w:r>
+        <w:rPr>
+          <w:rFonts w:ascii="Consolas" w:eastAsia="Consolas" w:hAnsi="Consolas" w:cs="Consolas"/>
+        </w:rPr>
+        <w:t xml:space="preserve">connectable</w:t>
+      </w:r>
+      <w:r>
+        <w:t xml:space="preserve">, không viết cứng.</w:t>
+      </w:r>
+    </w:p>
+    <w:p>
+      <w:pPr>
+        <w:pStyle w:val="ListParagraph"/>
+        <w:numPr>
+          <w:ilvl w:val="0"/>
+          <w:numId w:val="1"/>
+        </w:numPr>
+      </w:pPr>
+      <w:r>
+        <w:rPr>
+          <w:b/>
+          <w:bCs/>
+        </w:rPr>
+        <w:t xml:space="preserve">Bài học:</w:t>
+      </w:r>
+      <w:r>
+        <w:t xml:space="preserve"> khi bản vẽ và hợp đồng đã duyệt mâu thuẫn, không âm thầm làm theo một bên. Ghi rõ chỗ khác, phương án bị loại, và cái giá nếu đổi ý (ở đây: chỉ phần web phải sửa).</w:t>
+      </w:r>
+    </w:p>
+    <w:p>
+      <w:pPr>
+        <w:pStyle w:val="Heading3"/>
+      </w:pPr>
+      <w:r>
+        <w:t xml:space="preserve">7.2 Rời trang và quay về</w:t>
+      </w:r>
+    </w:p>
+    <w:p>
+      <w:pPr>
+        <w:pStyle w:val="ListParagraph"/>
+        <w:numPr>
+          <w:ilvl w:val="0"/>
+          <w:numId w:val="1"/>
+        </w:numPr>
+      </w:pPr>
+      <w:r>
+        <w:rPr>
+          <w:rFonts w:ascii="Consolas" w:eastAsia="Consolas" w:hAnsi="Consolas" w:cs="Consolas"/>
+          <w:b/>
+          <w:bCs/>
+        </w:rPr>
+        <w:t xml:space="preserve">leaveTo(url)</w:t>
+      </w:r>
+      <w:r>
+        <w:t xml:space="preserve"> (</w:t>
+      </w:r>
+      <w:r>
+        <w:rPr>
+          <w:rFonts w:ascii="Consolas" w:eastAsia="Consolas" w:hAnsi="Consolas" w:cs="Consolas"/>
+        </w:rPr>
+        <w:t xml:space="preserve">accounts.api.ts</w:t>
+      </w:r>
+      <w:r>
+        <w:t xml:space="preserve">) gọi </w:t>
+      </w:r>
+      <w:r>
+        <w:rPr>
+          <w:rFonts w:ascii="Consolas" w:eastAsia="Consolas" w:hAnsi="Consolas" w:cs="Consolas"/>
+        </w:rPr>
+        <w:t xml:space="preserve">window.location.assign(url)</w:t>
+      </w:r>
+      <w:r>
+        <w:t xml:space="preserve">: trình duyệt tải trang mới, toàn bộ state của React mất. Vì vậy mọi thứ cần biết khi quay về phải nằm </w:t>
+      </w:r>
+      <w:r>
+        <w:rPr>
+          <w:b/>
+          <w:bCs/>
+        </w:rPr>
+        <w:t xml:space="preserve">trong URL</w:t>
+      </w:r>
+      <w:r>
+        <w:t xml:space="preserve"> (</w:t>
+      </w:r>
+      <w:r>
+        <w:rPr>
+          <w:rFonts w:ascii="Consolas" w:eastAsia="Consolas" w:hAnsi="Consolas" w:cs="Consolas"/>
+        </w:rPr>
+        <w:t xml:space="preserve">?connected=id</w:t>
+      </w:r>
+      <w:r>
+        <w:t xml:space="preserve">) hoặc ở server, không nằm trong bộ nhớ.</w:t>
+      </w:r>
+    </w:p>
+    <w:p>
+      <w:pPr>
+        <w:pStyle w:val="ListParagraph"/>
+        <w:numPr>
+          <w:ilvl w:val="0"/>
+          <w:numId w:val="1"/>
+        </w:numPr>
+      </w:pPr>
+      <w:r>
+        <w:rPr>
+          <w:b/>
+          <w:bCs/>
+        </w:rPr>
+        <w:t xml:space="preserve">Vì sao bọc trong một hàm riêng:</w:t>
+      </w:r>
+      <w:r>
+        <w:t xml:space="preserve"> jsdom không chuyển trang được; test thay </w:t>
+      </w:r>
+      <w:r>
+        <w:rPr>
+          <w:rFonts w:ascii="Consolas" w:eastAsia="Consolas" w:hAnsi="Consolas" w:cs="Consolas"/>
+        </w:rPr>
+        <w:t xml:space="preserve">leaveTo</w:t>
+      </w:r>
+      <w:r>
+        <w:t xml:space="preserve"> bằng hàm giả (</w:t>
+      </w:r>
+      <w:r>
+        <w:rPr>
+          <w:rFonts w:ascii="Consolas" w:eastAsia="Consolas" w:hAnsi="Consolas" w:cs="Consolas"/>
+        </w:rPr>
+        <w:t xml:space="preserve">vi.mock</w:t>
+      </w:r>
+      <w:r>
+        <w:t xml:space="preserve">) rồi kiểm nó được gọi với đúng địa chỉ.</w:t>
+      </w:r>
+    </w:p>
+    <w:p>
+      <w:pPr>
+        <w:pStyle w:val="ListParagraph"/>
+        <w:numPr>
+          <w:ilvl w:val="0"/>
+          <w:numId w:val="1"/>
+        </w:numPr>
+      </w:pPr>
+      <w:r>
+        <w:rPr>
+          <w:b/>
+          <w:bCs/>
+        </w:rPr>
+        <w:t xml:space="preserve">Xóa tham số sau khi đọc:</w:t>
+      </w:r>
+      <w:r>
+        <w:t xml:space="preserve"> </w:t>
+      </w:r>
+      <w:r>
+        <w:rPr>
+          <w:rFonts w:ascii="Consolas" w:eastAsia="Consolas" w:hAnsi="Consolas" w:cs="Consolas"/>
+        </w:rPr>
+        <w:t xml:space="preserve">setSearchParams(..., { replace: true })</w:t>
+      </w:r>
+      <w:r>
+        <w:t xml:space="preserve">. </w:t>
+      </w:r>
+      <w:r>
+        <w:rPr>
+          <w:rFonts w:ascii="Consolas" w:eastAsia="Consolas" w:hAnsi="Consolas" w:cs="Consolas"/>
+        </w:rPr>
+        <w:t xml:space="preserve">replace</w:t>
+      </w:r>
+      <w:r>
+        <w:t xml:space="preserve"> thay mục lịch sử hiện tại thay vì thêm mục mới. Nếu không xóa, tải lại trang sẽ mở lại hộp thoại hoặc hiện lại lỗi; nếu xóa mà không </w:t>
+      </w:r>
+      <w:r>
+        <w:rPr>
+          <w:rFonts w:ascii="Consolas" w:eastAsia="Consolas" w:hAnsi="Consolas" w:cs="Consolas"/>
+        </w:rPr>
+        <w:t xml:space="preserve">replace</w:t>
+      </w:r>
+      <w:r>
+        <w:t xml:space="preserve">, nút "Back" sẽ đưa người dùng về đúng địa chỉ có tham số và mọi chuyện lặp lại.</w:t>
+      </w:r>
+    </w:p>
+    <w:p>
+      <w:pPr>
+        <w:pStyle w:val="Heading3"/>
+      </w:pPr>
+      <w:r>
+        <w:t xml:space="preserve">7.3 State của hộp thoại là union theo bước</w:t>
+      </w:r>
+    </w:p>
+    <w:p>
+      <w:pPr>
+        <w:pStyle w:val="ListParagraph"/>
+        <w:numPr>
+          <w:ilvl w:val="0"/>
+          <w:numId w:val="1"/>
+        </w:numPr>
+      </w:pPr>
+      <w:r>
+        <w:rPr>
+          <w:b/>
+          <w:bCs/>
+        </w:rPr>
+        <w:t xml:space="preserve">Ở đâu:</w:t>
+      </w:r>
+      <w:r>
+        <w:t xml:space="preserve"> </w:t>
+      </w:r>
+      <w:r>
+        <w:rPr>
+          <w:rFonts w:ascii="Consolas" w:eastAsia="Consolas" w:hAnsi="Consolas" w:cs="Consolas"/>
+        </w:rPr>
+        <w:t xml:space="preserve">WizardState</w:t>
+      </w:r>
+      <w:r>
+        <w:t xml:space="preserve"> trong </w:t>
+      </w:r>
+      <w:r>
+        <w:rPr>
+          <w:rFonts w:ascii="Consolas" w:eastAsia="Consolas" w:hAnsi="Consolas" w:cs="Consolas"/>
+        </w:rPr>
+        <w:t xml:space="preserve">ConnectWizard.tsx</w:t>
+      </w:r>
+      <w:r>
+        <w:t xml:space="preserve">.</w:t>
+      </w:r>
+    </w:p>
+    <w:p>
+      <w:pPr>
+        <w:shd w:val="clear" w:color="auto" w:fill="F2F3F5"/>
+        <w:ind w:left="0"/>
+      </w:pPr>
+      <w:r>
+        <w:rPr>
+          <w:rFonts w:ascii="Consolas" w:eastAsia="Consolas" w:hAnsi="Consolas" w:cs="Consolas"/>
+          <w:sz w:val="19"/>
+          <w:szCs w:val="19"/>
+        </w:rPr>
+        <w:t xml:space="preserve">{ step: 1 | 2 | 3, provider, accountId }   trước khi rời Sino</w:t>
+        <w:br/>
+        <w:t xml:space="preserve">{ step: 4, accountId, options }            sau khi về: tùy chọn đồng bộ</w:t>
+        <w:br/>
+        <w:t xml:space="preserve">{ step: 5, accountId, status }             đã bắt đầu đồng bộ: tiến độ</w:t>
+      </w:r>
+    </w:p>
+    <w:p>
+      <w:pPr>
+        <w:pStyle w:val="ListParagraph"/>
+        <w:numPr>
+          <w:ilvl w:val="0"/>
+          <w:numId w:val="1"/>
+        </w:numPr>
+      </w:pPr>
+      <w:r>
+        <w:rPr>
+          <w:b/>
+          <w:bCs/>
+        </w:rPr>
+        <w:t xml:space="preserve">Vì sao không gom hết vào một object nhiều trường tùy chọn:</w:t>
+      </w:r>
+      <w:r>
+        <w:t xml:space="preserve"> mỗi bước chỉ có đúng những trường nó cần; TypeScript báo lỗi nếu bước 5 thiếu </w:t>
+      </w:r>
+      <w:r>
+        <w:rPr>
+          <w:rFonts w:ascii="Consolas" w:eastAsia="Consolas" w:hAnsi="Consolas" w:cs="Consolas"/>
+        </w:rPr>
+        <w:t xml:space="preserve">status</w:t>
+      </w:r>
+      <w:r>
+        <w:t xml:space="preserve">, hay bước 4 lỡ đọc </w:t>
+      </w:r>
+      <w:r>
+        <w:rPr>
+          <w:rFonts w:ascii="Consolas" w:eastAsia="Consolas" w:hAnsi="Consolas" w:cs="Consolas"/>
+        </w:rPr>
+        <w:t xml:space="preserve">provider</w:t>
+      </w:r>
+      <w:r>
+        <w:t xml:space="preserve">.</w:t>
+      </w:r>
+    </w:p>
+    <w:p>
+      <w:pPr>
+        <w:pStyle w:val="ListParagraph"/>
+        <w:numPr>
+          <w:ilvl w:val="0"/>
+          <w:numId w:val="1"/>
+        </w:numPr>
+      </w:pPr>
+      <w:r>
+        <w:rPr>
+          <w:b/>
+          <w:bCs/>
+        </w:rPr>
+        <w:t xml:space="preserve">Bẫy, thu hẹp kiểu:</w:t>
+      </w:r>
+      <w:r>
+        <w:t xml:space="preserve"> </w:t>
+      </w:r>
+      <w:r>
+        <w:rPr>
+          <w:rFonts w:ascii="Consolas" w:eastAsia="Consolas" w:hAnsi="Consolas" w:cs="Consolas"/>
+        </w:rPr>
+        <w:t xml:space="preserve">state.step &lt;= 3 ? state.provider : ...</w:t>
+      </w:r>
+      <w:r>
+        <w:t xml:space="preserve"> bị </w:t>
+      </w:r>
+      <w:r>
+        <w:rPr>
+          <w:rFonts w:ascii="Consolas" w:eastAsia="Consolas" w:hAnsi="Consolas" w:cs="Consolas"/>
+        </w:rPr>
+        <w:t xml:space="preserve">tsc</w:t>
+      </w:r>
+      <w:r>
+        <w:t xml:space="preserve"> báo lỗi, vì TypeScript chỉ thu hẹp union qua so sánh </w:t>
+      </w:r>
+      <w:r>
+        <w:rPr>
+          <w:b/>
+          <w:bCs/>
+        </w:rPr>
+        <w:t xml:space="preserve">bằng</w:t>
+      </w:r>
+      <w:r>
+        <w:t xml:space="preserve"> (</w:t>
+      </w:r>
+      <w:r>
+        <w:rPr>
+          <w:rFonts w:ascii="Consolas" w:eastAsia="Consolas" w:hAnsi="Consolas" w:cs="Consolas"/>
+        </w:rPr>
+        <w:t xml:space="preserve">===</w:t>
+      </w:r>
+      <w:r>
+        <w:t xml:space="preserve">) hoặc kiểm thuộc tính, không qua </w:t>
+      </w:r>
+      <w:r>
+        <w:rPr>
+          <w:rFonts w:ascii="Consolas" w:eastAsia="Consolas" w:hAnsi="Consolas" w:cs="Consolas"/>
+        </w:rPr>
+        <w:t xml:space="preserve">&lt;=</w:t>
+      </w:r>
+      <w:r>
+        <w:t xml:space="preserve">. Sửa: </w:t>
+      </w:r>
+      <w:r>
+        <w:rPr>
+          <w:rFonts w:ascii="Consolas" w:eastAsia="Consolas" w:hAnsi="Consolas" w:cs="Consolas"/>
+        </w:rPr>
+        <w:t xml:space="preserve">'provider' in state</w:t>
+      </w:r>
+      <w:r>
+        <w:t xml:space="preserve">.</w:t>
+      </w:r>
+    </w:p>
+    <w:p>
+      <w:pPr>
+        <w:pStyle w:val="Heading3"/>
+      </w:pPr>
+      <w:r>
+        <w:t xml:space="preserve">7.4 Đặt state theo URL mà không dùng effect</w:t>
+      </w:r>
+    </w:p>
+    <w:p>
+      <w:pPr>
+        <w:pStyle w:val="ListParagraph"/>
+        <w:numPr>
+          <w:ilvl w:val="0"/>
+          <w:numId w:val="1"/>
+        </w:numPr>
+      </w:pPr>
+      <w:r>
+        <w:rPr>
+          <w:b/>
+          <w:bCs/>
+        </w:rPr>
+        <w:t xml:space="preserve">Cách đầu và vì sao bỏ:</w:t>
+      </w:r>
+      <w:r>
+        <w:t xml:space="preserve"> đọc </w:t>
+      </w:r>
+      <w:r>
+        <w:rPr>
+          <w:rFonts w:ascii="Consolas" w:eastAsia="Consolas" w:hAnsi="Consolas" w:cs="Consolas"/>
+        </w:rPr>
+        <w:t xml:space="preserve">?reconnect</w:t>
+      </w:r>
+      <w:r>
+        <w:t xml:space="preserve"> trong </w:t>
+      </w:r>
+      <w:r>
+        <w:rPr>
+          <w:rFonts w:ascii="Consolas" w:eastAsia="Consolas" w:hAnsi="Consolas" w:cs="Consolas"/>
+        </w:rPr>
+        <w:t xml:space="preserve">useEffect</w:t>
+      </w:r>
+      <w:r>
+        <w:t xml:space="preserve"> rồi </w:t>
+      </w:r>
+      <w:r>
+        <w:rPr>
+          <w:rFonts w:ascii="Consolas" w:eastAsia="Consolas" w:hAnsi="Consolas" w:cs="Consolas"/>
+        </w:rPr>
+        <w:t xml:space="preserve">setWizard(...)</w:t>
+      </w:r>
+      <w:r>
+        <w:t xml:space="preserve">. Lint </w:t>
+      </w:r>
+      <w:r>
+        <w:rPr>
+          <w:rFonts w:ascii="Consolas" w:eastAsia="Consolas" w:hAnsi="Consolas" w:cs="Consolas"/>
+        </w:rPr>
+        <w:t xml:space="preserve">react(set-state-in-effect)</w:t>
+      </w:r>
+      <w:r>
+        <w:t xml:space="preserve"> báo: effect chạy </w:t>
+      </w:r>
+      <w:r>
+        <w:rPr>
+          <w:b/>
+          <w:bCs/>
+        </w:rPr>
+        <w:t xml:space="preserve">sau</w:t>
+      </w:r>
+      <w:r>
+        <w:t xml:space="preserve"> khi vẽ, đặt state xong React phải vẽ lại thêm một lần (vẽ dây chuyền); effect nên dành cho việc đồng bộ với hệ thống bên ngoài.</w:t>
+      </w:r>
+    </w:p>
+    <w:p>
+      <w:pPr>
+        <w:pStyle w:val="ListParagraph"/>
+        <w:numPr>
+          <w:ilvl w:val="0"/>
+          <w:numId w:val="1"/>
+        </w:numPr>
+      </w:pPr>
+      <w:r>
+        <w:rPr>
+          <w:b/>
+          <w:bCs/>
+        </w:rPr>
+        <w:t xml:space="preserve">Cách đúng, "điều chỉnh state khi đầu vào đổi":</w:t>
+      </w:r>
+      <w:r>
+        <w:t xml:space="preserve"> mỗi lượt điều hướng có một </w:t>
+      </w:r>
+      <w:r>
+        <w:rPr>
+          <w:rFonts w:ascii="Consolas" w:eastAsia="Consolas" w:hAnsi="Consolas" w:cs="Consolas"/>
+        </w:rPr>
+        <w:t xml:space="preserve">location.key</w:t>
+      </w:r>
+      <w:r>
+        <w:t xml:space="preserve"> riêng. Trang nhớ key đã xử lý; gặp key mới thì </w:t>
+      </w:r>
+      <w:r>
+        <w:rPr>
+          <w:b/>
+          <w:bCs/>
+        </w:rPr>
+        <w:t xml:space="preserve">ngay lúc render</w:t>
+      </w:r>
+      <w:r>
+        <w:t xml:space="preserve"> đọc tham số và đặt state (React cho phép gọi </w:t>
+      </w:r>
+      <w:r>
+        <w:rPr>
+          <w:rFonts w:ascii="Consolas" w:eastAsia="Consolas" w:hAnsi="Consolas" w:cs="Consolas"/>
+        </w:rPr>
+        <w:t xml:space="preserve">setState</w:t>
+      </w:r>
+      <w:r>
+        <w:t xml:space="preserve"> trong render nếu có điều kiện chặn như vậy). Effect chỉ còn làm việc với hệ thống bên ngoài: xóa tham số khỏi URL.</w:t>
+      </w:r>
+    </w:p>
+    <w:p>
+      <w:pPr>
+        <w:pStyle w:val="ListParagraph"/>
+        <w:numPr>
+          <w:ilvl w:val="0"/>
+          <w:numId w:val="1"/>
+        </w:numPr>
+      </w:pPr>
+      <w:r>
+        <w:rPr>
+          <w:b/>
+          <w:bCs/>
+        </w:rPr>
+        <w:t xml:space="preserve">Lợi thêm:</w:t>
+      </w:r>
+      <w:r>
+        <w:t xml:space="preserve"> bấm "Đăng nhập lại" của cùng một tài khoản lần thứ hai vẫn mở hộp thoại, vì đó là một lượt điều hướng mới (key mới). Có test cho đúng ca này.</w:t>
+      </w:r>
+    </w:p>
+    <w:p>
+      <w:pPr>
+        <w:pStyle w:val="Heading3"/>
+      </w:pPr>
+      <w:r>
+        <w:t xml:space="preserve">7.5 Nút chọn và ô chọn theo canvas, vẫn là phần tử gốc</w:t>
+      </w:r>
+    </w:p>
+    <w:p>
+      <w:pPr>
+        <w:pStyle w:val="ListParagraph"/>
+        <w:numPr>
+          <w:ilvl w:val="0"/>
+          <w:numId w:val="1"/>
+        </w:numPr>
+      </w:pPr>
+      <w:r>
+        <w:rPr>
+          <w:b/>
+          <w:bCs/>
+        </w:rPr>
+        <w:t xml:space="preserve">Nhóm nút chọn nhà cung cấp:</w:t>
+      </w:r>
+      <w:r>
+        <w:t xml:space="preserve"> </w:t>
+      </w:r>
+      <w:r>
+        <w:rPr>
+          <w:rFonts w:ascii="Consolas" w:eastAsia="Consolas" w:hAnsi="Consolas" w:cs="Consolas"/>
+        </w:rPr>
+        <w:t xml:space="preserve">&lt;input type="radio"&gt;</w:t>
+      </w:r>
+      <w:r>
+        <w:t xml:space="preserve"> thật, </w:t>
+      </w:r>
+      <w:r>
+        <w:rPr>
+          <w:rFonts w:ascii="Consolas" w:eastAsia="Consolas" w:hAnsi="Consolas" w:cs="Consolas"/>
+        </w:rPr>
+        <w:t xml:space="preserve">appearance-none</w:t>
+      </w:r>
+      <w:r>
+        <w:t xml:space="preserve"> để tự vẽ vòng tròn, </w:t>
+      </w:r>
+      <w:r>
+        <w:rPr>
+          <w:rFonts w:ascii="Consolas" w:eastAsia="Consolas" w:hAnsi="Consolas" w:cs="Consolas"/>
+        </w:rPr>
+        <w:t xml:space="preserve">checked:border-[5px]</w:t>
+      </w:r>
+      <w:r>
+        <w:t xml:space="preserve"> cho chấm đặc; thẻ bao ngoài đổi viền bằng </w:t>
+      </w:r>
+      <w:r>
+        <w:rPr>
+          <w:rFonts w:ascii="Consolas" w:eastAsia="Consolas" w:hAnsi="Consolas" w:cs="Consolas"/>
+        </w:rPr>
+        <w:t xml:space="preserve">has-checked:</w:t>
+      </w:r>
+      <w:r>
+        <w:t xml:space="preserve"> (CSS </w:t>
+      </w:r>
+      <w:r>
+        <w:rPr>
+          <w:rFonts w:ascii="Consolas" w:eastAsia="Consolas" w:hAnsi="Consolas" w:cs="Consolas"/>
+        </w:rPr>
+        <w:t xml:space="preserve">:has()</w:t>
+      </w:r>
+      <w:r>
+        <w:t xml:space="preserve">). Nhờ là radio thật: cả nhóm chỉ là </w:t>
+      </w:r>
+      <w:r>
+        <w:rPr>
+          <w:b/>
+          <w:bCs/>
+        </w:rPr>
+        <w:t xml:space="preserve">một điểm dừng</w:t>
+      </w:r>
+      <w:r>
+        <w:t xml:space="preserve"> của phím Tab, mũi tên lên/xuống đổi lựa chọn, </w:t>
+      </w:r>
+      <w:r>
+        <w:rPr>
+          <w:rFonts w:ascii="Consolas" w:eastAsia="Consolas" w:hAnsi="Consolas" w:cs="Consolas"/>
+        </w:rPr>
+        <w:t xml:space="preserve">disabled</w:t>
+      </w:r>
+      <w:r>
+        <w:t xml:space="preserve"> làm "Sắp có" không chọn được, trình đọc màn hình đọc đúng "nút chọn, 1 trên 5".</w:t>
+      </w:r>
+    </w:p>
+    <w:p>
+      <w:pPr>
+        <w:pStyle w:val="ListParagraph"/>
+        <w:numPr>
+          <w:ilvl w:val="0"/>
+          <w:numId w:val="1"/>
+        </w:numPr>
+      </w:pPr>
+      <w:r>
+        <w:rPr>
+          <w:b/>
+          <w:bCs/>
+        </w:rPr>
+        <w:t xml:space="preserve">Ô "Đồng bộ thư từ":</w:t>
+      </w:r>
+      <w:r>
+        <w:t xml:space="preserve"> </w:t>
+      </w:r>
+      <w:r>
+        <w:rPr>
+          <w:rFonts w:ascii="Consolas" w:eastAsia="Consolas" w:hAnsi="Consolas" w:cs="Consolas"/>
+        </w:rPr>
+        <w:t xml:space="preserve">&lt;select&gt;</w:t>
+      </w:r>
+      <w:r>
+        <w:t xml:space="preserve"> thật với </w:t>
+      </w:r>
+      <w:r>
+        <w:rPr>
+          <w:rFonts w:ascii="Consolas" w:eastAsia="Consolas" w:hAnsi="Consolas" w:cs="Consolas"/>
+        </w:rPr>
+        <w:t xml:space="preserve">appearance-none</w:t>
+      </w:r>
+      <w:r>
+        <w:t xml:space="preserve"> và mũi tên vẽ thêm; nhãn gắn bằng </w:t>
+      </w:r>
+      <w:r>
+        <w:rPr>
+          <w:rFonts w:ascii="Consolas" w:eastAsia="Consolas" w:hAnsi="Consolas" w:cs="Consolas"/>
+        </w:rPr>
+        <w:t xml:space="preserve">htmlFor</w:t>
+      </w:r>
+      <w:r>
+        <w:t xml:space="preserve"> + </w:t>
+      </w:r>
+      <w:r>
+        <w:rPr>
+          <w:rFonts w:ascii="Consolas" w:eastAsia="Consolas" w:hAnsi="Consolas" w:cs="Consolas"/>
+        </w:rPr>
+        <w:t xml:space="preserve">useId</w:t>
+      </w:r>
+      <w:r>
+        <w:t xml:space="preserve"> nên test tìm được </w:t>
+      </w:r>
+      <w:r>
+        <w:rPr>
+          <w:rFonts w:ascii="Consolas" w:eastAsia="Consolas" w:hAnsi="Consolas" w:cs="Consolas"/>
+        </w:rPr>
+        <w:t xml:space="preserve">getByRole('combobox', { name: 'Đồng bộ thư từ' })</w:t>
+      </w:r>
+      <w:r>
+        <w:t xml:space="preserve">.</w:t>
+      </w:r>
+    </w:p>
+    <w:p>
+      <w:pPr>
+        <w:pStyle w:val="ListParagraph"/>
+        <w:numPr>
+          <w:ilvl w:val="0"/>
+          <w:numId w:val="1"/>
+        </w:numPr>
+      </w:pPr>
+      <w:r>
+        <w:rPr>
+          <w:b/>
+          <w:bCs/>
+        </w:rPr>
+        <w:t xml:space="preserve">Công tắc có nhãn:</w:t>
+      </w:r>
+      <w:r>
+        <w:t xml:space="preserve"> </w:t>
+      </w:r>
+      <w:r>
+        <w:rPr>
+          <w:rFonts w:ascii="Consolas" w:eastAsia="Consolas" w:hAnsi="Consolas" w:cs="Consolas"/>
+        </w:rPr>
+        <w:t xml:space="preserve">&lt;label&gt;</w:t>
+      </w:r>
+      <w:r>
+        <w:t xml:space="preserve"> bọc </w:t>
+      </w:r>
+      <w:r>
+        <w:rPr>
+          <w:rFonts w:ascii="Consolas" w:eastAsia="Consolas" w:hAnsi="Consolas" w:cs="Consolas"/>
+        </w:rPr>
+        <w:t xml:space="preserve">Switch</w:t>
+      </w:r>
+      <w:r>
+        <w:t xml:space="preserve">; nút </w:t>
+      </w:r>
+      <w:r>
+        <w:rPr>
+          <w:rFonts w:ascii="Consolas" w:eastAsia="Consolas" w:hAnsi="Consolas" w:cs="Consolas"/>
+        </w:rPr>
+        <w:t xml:space="preserve">role="switch"</w:t>
+      </w:r>
+      <w:r>
+        <w:t xml:space="preserve"> lấy tên từ chữ trong nhãn, bấm vào chữ cũng gạt được.</w:t>
+      </w:r>
+    </w:p>
+    <w:p>
+      <w:pPr>
+        <w:pStyle w:val="Heading3"/>
+      </w:pPr>
+      <w:r>
+        <w:t xml:space="preserve">7.6 Kiểm chứng CN-01…CN-03</w:t>
+      </w:r>
+    </w:p>
+    <w:p>
+      <w:pPr>
+        <w:pStyle w:val="ListParagraph"/>
+        <w:numPr>
+          <w:ilvl w:val="0"/>
+          <w:numId w:val="1"/>
+        </w:numPr>
+      </w:pPr>
+      <w:r>
+        <w:rPr>
+          <w:b/>
+          <w:bCs/>
+        </w:rPr>
+        <w:t xml:space="preserve">Test viết trước:</w:t>
+      </w:r>
+      <w:r>
+        <w:t xml:space="preserve"> CN-01 16 test đỏ; CN-02 10 test đỏ (8 mới, 2 test cũ phải đổi vì "Đăng nhập lại" thành liên kết); CN-03 7 test đỏ. Cuối cùng 180/180.</w:t>
+      </w:r>
+    </w:p>
+    <w:p>
+      <w:pPr>
+        <w:pStyle w:val="ListParagraph"/>
+        <w:numPr>
+          <w:ilvl w:val="0"/>
+          <w:numId w:val="1"/>
+        </w:numPr>
+      </w:pPr>
+      <w:r>
+        <w:rPr>
+          <w:b/>
+          <w:bCs/>
+        </w:rPr>
+        <w:t xml:space="preserve">Kiểm tra ngược:</w:t>
+      </w:r>
+      <w:r>
+        <w:t xml:space="preserve"> CN-01 28 lỗi, 25 bị bắt ngay, 2 lọt do thiếu ca (chữ bước 3 với danh tính khác "Google"; khoảng đồng bộ khác 90 ngày), 1 lỗi gài viết sai cú pháp làm cả file test không chạy (script tưởng là "lọt"; đọc kỹ thì số test chạy bị hụt). CN-02 25 lỗi, 24 bị bắt, 1 lọt ("Quay lại" ở bước 3). CN-03 23 lỗi, 22 bị bắt; lỗi lọt nằm ở một đoạn chặn </w:t>
+      </w:r>
+      <w:r>
+        <w:rPr>
+          <w:b/>
+          <w:bCs/>
+        </w:rPr>
+        <w:t xml:space="preserve">không bao giờ chạy tới</w:t>
+      </w:r>
+      <w:r>
+        <w:t xml:space="preserve">, nên đoạn đó bị bỏ thay vì viết test cho một tình huống không có thật.</w:t>
+      </w:r>
+    </w:p>
+    <w:p>
+      <w:pPr>
+        <w:pStyle w:val="ListParagraph"/>
+        <w:numPr>
+          <w:ilvl w:val="0"/>
+          <w:numId w:val="1"/>
+        </w:numPr>
+      </w:pPr>
+      <w:r>
+        <w:rPr>
+          <w:b/>
+          <w:bCs/>
+        </w:rPr>
+        <w:t xml:space="preserve">Chrome thật:</w:t>
+      </w:r>
+      <w:r>
+        <w:t xml:space="preserve"> vòng đầy đủ: bước 1–3, </w:t>
+      </w:r>
+      <w:r>
+        <w:rPr>
+          <w:rFonts w:ascii="Consolas" w:eastAsia="Consolas" w:hAnsi="Consolas" w:cs="Consolas"/>
+        </w:rPr>
+        <w:t xml:space="preserve">window.location.assign</w:t>
+      </w:r>
+      <w:r>
+        <w:t xml:space="preserve"> thật, quay về </w:t>
+      </w:r>
+      <w:r>
+        <w:rPr>
+          <w:rFonts w:ascii="Consolas" w:eastAsia="Consolas" w:hAnsi="Consolas" w:cs="Consolas"/>
+        </w:rPr>
+        <w:t xml:space="preserve">/accounts</w:t>
+      </w:r>
+      <w:r>
+        <w:t xml:space="preserve"> không còn tham số, hộp thoại tự mở ở bước 4, chọn 30 ngày thì ước tính đổi, bước 5 có tiến độ và danh sách phía sau đổi theo; 1440 / 390px × sáng / tối; Tab đi vòng trong hộp thoại.</w:t>
+      </w:r>
+    </w:p>
+    <w:p>
+      <w:pPr>
+        <w:pStyle w:val="ListParagraph"/>
+        <w:numPr>
+          <w:ilvl w:val="0"/>
+          <w:numId w:val="1"/>
+        </w:numPr>
+      </w:pPr>
+      <w:r>
+        <w:rPr>
+          <w:b/>
+          <w:bCs/>
+        </w:rPr>
+        <w:t xml:space="preserve">Bẫy lint "fast refresh":</w:t>
+      </w:r>
+      <w:r>
+        <w:t xml:space="preserve"> file component export thêm một hằng số (</w:t>
+      </w:r>
+      <w:r>
+        <w:rPr>
+          <w:rFonts w:ascii="Consolas" w:eastAsia="Consolas" w:hAnsi="Consolas" w:cs="Consolas"/>
+        </w:rPr>
+        <w:t xml:space="preserve">DEFAULT_SYNC_OPTIONS</w:t>
+      </w:r>
+      <w:r>
+        <w:t xml:space="preserve">) thì Vite không tải lại nóng component được (</w:t>
+      </w:r>
+      <w:r>
+        <w:rPr>
+          <w:rFonts w:ascii="Consolas" w:eastAsia="Consolas" w:hAnsi="Consolas" w:cs="Consolas"/>
+        </w:rPr>
+        <w:t xml:space="preserve">react(only-export-components)</w:t>
+      </w:r>
+      <w:r>
+        <w:t xml:space="preserve">); hằng số chuyển sang </w:t>
+      </w:r>
+      <w:r>
+        <w:rPr>
+          <w:rFonts w:ascii="Consolas" w:eastAsia="Consolas" w:hAnsi="Consolas" w:cs="Consolas"/>
+        </w:rPr>
+        <w:t xml:space="preserve">connect.types.ts</w:t>
+      </w:r>
+      <w:r>
+        <w:t xml:space="preserve">.</w:t>
+      </w:r>
+    </w:p>
+    <w:p>
+      <w:pPr>
         <w:pBdr>
           <w:bottom w:val="single" w:sz="4" w:space="0" w:color="auto"/>
         </w:pBdr>
@@ -14086,6 +15318,180 @@
       </w:pPr>
       <w:r>
         <w:t xml:space="preserve">Ở AC-04, lỗi cố ý "công tắc nào cũng gửi kênh Thư đến" sống sót. Test đã hở chỗ nào, và sửa thế nào?</w:t>
+      </w:r>
+    </w:p>
+    <w:p>
+      <w:pPr>
+        <w:pStyle w:val="ListParagraph"/>
+        <w:numPr>
+          <w:ilvl w:val="0"/>
+          <w:numId w:val="100"/>
+        </w:numPr>
+      </w:pPr>
+      <w:r>
+        <w:t xml:space="preserve">Vì sao bước "Quyền" phải đứng trước bước "Đăng nhập" trong luồng chuyển trang của F04a?</w:t>
+      </w:r>
+    </w:p>
+    <w:p>
+      <w:pPr>
+        <w:pStyle w:val="ListParagraph"/>
+        <w:numPr>
+          <w:ilvl w:val="0"/>
+          <w:numId w:val="100"/>
+        </w:numPr>
+      </w:pPr>
+      <w:r>
+        <w:rPr>
+          <w:rFonts w:ascii="Consolas" w:eastAsia="Consolas" w:hAnsi="Consolas" w:cs="Consolas"/>
+        </w:rPr>
+        <w:t xml:space="preserve">window.location.assign</w:t>
+      </w:r>
+      <w:r>
+        <w:t xml:space="preserve"> khác điều hướng của React Router ở chỗ nào? Vì sao thông tin cần khi quay về phải nằm trong URL?</w:t>
+      </w:r>
+    </w:p>
+    <w:p>
+      <w:pPr>
+        <w:pStyle w:val="ListParagraph"/>
+        <w:numPr>
+          <w:ilvl w:val="0"/>
+          <w:numId w:val="100"/>
+        </w:numPr>
+      </w:pPr>
+      <w:r>
+        <w:t xml:space="preserve">Vì sao xóa </w:t>
+      </w:r>
+      <w:r>
+        <w:rPr>
+          <w:rFonts w:ascii="Consolas" w:eastAsia="Consolas" w:hAnsi="Consolas" w:cs="Consolas"/>
+        </w:rPr>
+        <w:t xml:space="preserve">?connected</w:t>
+      </w:r>
+      <w:r>
+        <w:t xml:space="preserve"> khỏi URL phải dùng </w:t>
+      </w:r>
+      <w:r>
+        <w:rPr>
+          <w:rFonts w:ascii="Consolas" w:eastAsia="Consolas" w:hAnsi="Consolas" w:cs="Consolas"/>
+        </w:rPr>
+        <w:t xml:space="preserve">replace: true</w:t>
+      </w:r>
+      <w:r>
+        <w:t xml:space="preserve">? Không xóa, hoặc xóa mà không </w:t>
+      </w:r>
+      <w:r>
+        <w:rPr>
+          <w:rFonts w:ascii="Consolas" w:eastAsia="Consolas" w:hAnsi="Consolas" w:cs="Consolas"/>
+        </w:rPr>
+        <w:t xml:space="preserve">replace</w:t>
+      </w:r>
+      <w:r>
+        <w:t xml:space="preserve">, thì chuyện gì xảy ra?</w:t>
+      </w:r>
+    </w:p>
+    <w:p>
+      <w:pPr>
+        <w:pStyle w:val="ListParagraph"/>
+        <w:numPr>
+          <w:ilvl w:val="0"/>
+          <w:numId w:val="100"/>
+        </w:numPr>
+      </w:pPr>
+      <w:r>
+        <w:rPr>
+          <w:rFonts w:ascii="Consolas" w:eastAsia="Consolas" w:hAnsi="Consolas" w:cs="Consolas"/>
+        </w:rPr>
+        <w:t xml:space="preserve">WizardState</w:t>
+      </w:r>
+      <w:r>
+        <w:t xml:space="preserve"> là union theo bước. Vì sao </w:t>
+      </w:r>
+      <w:r>
+        <w:rPr>
+          <w:rFonts w:ascii="Consolas" w:eastAsia="Consolas" w:hAnsi="Consolas" w:cs="Consolas"/>
+        </w:rPr>
+        <w:t xml:space="preserve">state.step &lt;= 3 ? state.provider : …</w:t>
+      </w:r>
+      <w:r>
+        <w:t xml:space="preserve"> bị </w:t>
+      </w:r>
+      <w:r>
+        <w:rPr>
+          <w:rFonts w:ascii="Consolas" w:eastAsia="Consolas" w:hAnsi="Consolas" w:cs="Consolas"/>
+        </w:rPr>
+        <w:t xml:space="preserve">tsc</w:t>
+      </w:r>
+      <w:r>
+        <w:t xml:space="preserve"> báo lỗi, và sửa thế nào?</w:t>
+      </w:r>
+    </w:p>
+    <w:p>
+      <w:pPr>
+        <w:pStyle w:val="ListParagraph"/>
+        <w:numPr>
+          <w:ilvl w:val="0"/>
+          <w:numId w:val="100"/>
+        </w:numPr>
+      </w:pPr>
+      <w:r>
+        <w:t xml:space="preserve">Vì sao đọc tham số URL rồi </w:t>
+      </w:r>
+      <w:r>
+        <w:rPr>
+          <w:rFonts w:ascii="Consolas" w:eastAsia="Consolas" w:hAnsi="Consolas" w:cs="Consolas"/>
+        </w:rPr>
+        <w:t xml:space="preserve">setState</w:t>
+      </w:r>
+      <w:r>
+        <w:t xml:space="preserve"> trong </w:t>
+      </w:r>
+      <w:r>
+        <w:rPr>
+          <w:rFonts w:ascii="Consolas" w:eastAsia="Consolas" w:hAnsi="Consolas" w:cs="Consolas"/>
+        </w:rPr>
+        <w:t xml:space="preserve">useEffect</w:t>
+      </w:r>
+      <w:r>
+        <w:t xml:space="preserve"> bị lint báo? Cách dùng </w:t>
+      </w:r>
+      <w:r>
+        <w:rPr>
+          <w:rFonts w:ascii="Consolas" w:eastAsia="Consolas" w:hAnsi="Consolas" w:cs="Consolas"/>
+        </w:rPr>
+        <w:t xml:space="preserve">location.key</w:t>
+      </w:r>
+      <w:r>
+        <w:t xml:space="preserve"> khác gì, và vì sao nó còn đúng khi bấm cùng một liên kết hai lần?</w:t>
+      </w:r>
+    </w:p>
+    <w:p>
+      <w:pPr>
+        <w:pStyle w:val="ListParagraph"/>
+        <w:numPr>
+          <w:ilvl w:val="0"/>
+          <w:numId w:val="100"/>
+        </w:numPr>
+      </w:pPr>
+      <w:r>
+        <w:t xml:space="preserve">Vì sao nhóm chọn nhà cung cấp dùng </w:t>
+      </w:r>
+      <w:r>
+        <w:rPr>
+          <w:rFonts w:ascii="Consolas" w:eastAsia="Consolas" w:hAnsi="Consolas" w:cs="Consolas"/>
+        </w:rPr>
+        <w:t xml:space="preserve">&lt;input type="radio"&gt;</w:t>
+      </w:r>
+      <w:r>
+        <w:t xml:space="preserve"> thật thay vì </w:t>
+      </w:r>
+      <w:r>
+        <w:rPr>
+          <w:rFonts w:ascii="Consolas" w:eastAsia="Consolas" w:hAnsi="Consolas" w:cs="Consolas"/>
+        </w:rPr>
+        <w:t xml:space="preserve">div</w:t>
+      </w:r>
+      <w:r>
+        <w:t xml:space="preserve"> bấm được? Kể ba thứ người dùng bàn phím và trình đọc màn hình được hưởng.</w:t>
       </w:r>
     </w:p>
     <w:p/>

</xml_diff>

<commit_message>
docs(knowledge): Phase 1 section 8, the Hộp thư screen (IN-01…IN-06)
Filters in the address, one mutation fixing three caches, sending with
an optimistic message and the IME guard, display: contents for the
phone reply box, the grid column that grew past the screen, the inbox
states and TanStack's paused mutations offline, and the bfddcd3
correction. Questions 57-66. Word file regenerated, docs check clean.

Co-Authored-By: Claude Opus 5.5 (1M context) <noreply@anthropic.com>
</commit_message>
<xml_diff>
--- a/docs/knowledge/phase-1-frontend-foundation.docx
+++ b/docs/knowledge/phase-1-frontend-foundation.docx
@@ -115,7 +115,7 @@
         <w:t xml:space="preserve">openspec/changes/fe-ui-overview</w:t>
       </w:r>
       <w:r>
-        <w:t xml:space="preserve"> (dựng giao diện trước với dữ liệu mẫu, D-42) change </w:t>
+        <w:t xml:space="preserve"> (dựng giao diện trước với dữ liệu mẫu, D-42), change </w:t>
       </w:r>
       <w:r>
         <w:rPr>
@@ -124,7 +124,7 @@
         <w:t xml:space="preserve">openspec/changes/fe-ui-accounts</w:t>
       </w:r>
       <w:r>
-        <w:t xml:space="preserve"> (màn Tài khoản) và change </w:t>
+        <w:t xml:space="preserve"> (màn Tài khoản), change </w:t>
       </w:r>
       <w:r>
         <w:rPr>
@@ -133,7 +133,16 @@
         <w:t xml:space="preserve">openspec/changes/fe-ui-connect</w:t>
       </w:r>
       <w:r>
-        <w:t xml:space="preserve"> (luồng kết nối tài khoản). Đã xong: BE-27, BE-28, BE-29, FE-01, UI-01, UI-02, UI-03, AC-01, AC-02, AC-03, AC-04, CN-01, CN-02, CN-03.</w:t>
+        <w:t xml:space="preserve"> (luồng kết nối tài khoản) và change </w:t>
+      </w:r>
+      <w:r>
+        <w:rPr>
+          <w:rFonts w:ascii="Consolas" w:eastAsia="Consolas" w:hAnsi="Consolas" w:cs="Consolas"/>
+        </w:rPr>
+        <w:t xml:space="preserve">openspec/changes/fe-ui-inbox</w:t>
+      </w:r>
+      <w:r>
+        <w:t xml:space="preserve"> (màn Hộp thư). Đã xong: BE-27, BE-28, BE-29, FE-01, UI-01, UI-02, UI-03, AC-01, AC-02, AC-03, AC-04, CN-01, CN-02, CN-03, IN-01…IN-06.</w:t>
         <w:br/>
       </w:r>
       <w:r>
@@ -14274,6 +14283,1349 @@
     </w:p>
     <w:p>
       <w:pPr>
+        <w:pStyle w:val="Heading2"/>
+      </w:pPr>
+      <w:r>
+        <w:t xml:space="preserve">8. Màn Hộp thư (fe-ui-inbox)</w:t>
+      </w:r>
+    </w:p>
+    <w:p>
+      <w:pPr>
+        <w:pStyle w:val="Heading3"/>
+      </w:pPr>
+      <w:r>
+        <w:t xml:space="preserve">8.0 Bức tranh: một hộp thư, ba cỡ màn hình</w:t>
+      </w:r>
+    </w:p>
+    <w:p>
+      <w:pPr>
+        <w:pStyle w:val="ListParagraph"/>
+        <w:numPr>
+          <w:ilvl w:val="0"/>
+          <w:numId w:val="1"/>
+        </w:numPr>
+      </w:pPr>
+      <w:r>
+        <w:rPr>
+          <w:b/>
+          <w:bCs/>
+        </w:rPr>
+        <w:t xml:space="preserve">Ở đâu:</w:t>
+      </w:r>
+      <w:r>
+        <w:t xml:space="preserve"> </w:t>
+      </w:r>
+      <w:r>
+        <w:rPr>
+          <w:rFonts w:ascii="Consolas" w:eastAsia="Consolas" w:hAnsi="Consolas" w:cs="Consolas"/>
+        </w:rPr>
+        <w:t xml:space="preserve">src/features/inbox/</w:t>
+      </w:r>
+      <w:r>
+        <w:t xml:space="preserve"> (</w:t>
+      </w:r>
+      <w:r>
+        <w:rPr>
+          <w:rFonts w:ascii="Consolas" w:eastAsia="Consolas" w:hAnsi="Consolas" w:cs="Consolas"/>
+        </w:rPr>
+        <w:t xml:space="preserve">inbox.types.ts</w:t>
+      </w:r>
+      <w:r>
+        <w:t xml:space="preserve">, </w:t>
+      </w:r>
+      <w:r>
+        <w:rPr>
+          <w:rFonts w:ascii="Consolas" w:eastAsia="Consolas" w:hAnsi="Consolas" w:cs="Consolas"/>
+        </w:rPr>
+        <w:t xml:space="preserve">inbox.sample.ts</w:t>
+      </w:r>
+      <w:r>
+        <w:t xml:space="preserve">, </w:t>
+      </w:r>
+      <w:r>
+        <w:rPr>
+          <w:rFonts w:ascii="Consolas" w:eastAsia="Consolas" w:hAnsi="Consolas" w:cs="Consolas"/>
+        </w:rPr>
+        <w:t xml:space="preserve">inbox.api.ts</w:t>
+      </w:r>
+      <w:r>
+        <w:t xml:space="preserve">, </w:t>
+      </w:r>
+      <w:r>
+        <w:rPr>
+          <w:rFonts w:ascii="Consolas" w:eastAsia="Consolas" w:hAnsi="Consolas" w:cs="Consolas"/>
+        </w:rPr>
+        <w:t xml:space="preserve">useInbox.ts</w:t>
+      </w:r>
+      <w:r>
+        <w:t xml:space="preserve">, </w:t>
+      </w:r>
+      <w:r>
+        <w:rPr>
+          <w:rFonts w:ascii="Consolas" w:eastAsia="Consolas" w:hAnsi="Consolas" w:cs="Consolas"/>
+        </w:rPr>
+        <w:t xml:space="preserve">useInboxFilter.ts</w:t>
+      </w:r>
+      <w:r>
+        <w:t xml:space="preserve">, </w:t>
+      </w:r>
+      <w:r>
+        <w:rPr>
+          <w:rFonts w:ascii="Consolas" w:eastAsia="Consolas" w:hAnsi="Consolas" w:cs="Consolas"/>
+        </w:rPr>
+        <w:t xml:space="preserve">format.ts</w:t>
+      </w:r>
+      <w:r>
+        <w:t xml:space="preserve">, </w:t>
+      </w:r>
+      <w:r>
+        <w:rPr>
+          <w:rFonts w:ascii="Consolas" w:eastAsia="Consolas" w:hAnsi="Consolas" w:cs="Consolas"/>
+        </w:rPr>
+        <w:t xml:space="preserve">InboxPage.tsx</w:t>
+      </w:r>
+      <w:r>
+        <w:t xml:space="preserve">, </w:t>
+      </w:r>
+      <w:r>
+        <w:rPr>
+          <w:rFonts w:ascii="Consolas" w:eastAsia="Consolas" w:hAnsi="Consolas" w:cs="Consolas"/>
+        </w:rPr>
+        <w:t xml:space="preserve">components/*</w:t>
+      </w:r>
+      <w:r>
+        <w:t xml:space="preserve">).</w:t>
+      </w:r>
+    </w:p>
+    <w:p>
+      <w:pPr>
+        <w:pStyle w:val="ListParagraph"/>
+        <w:numPr>
+          <w:ilvl w:val="0"/>
+          <w:numId w:val="1"/>
+        </w:numPr>
+      </w:pPr>
+      <w:r>
+        <w:rPr>
+          <w:b/>
+          <w:bCs/>
+        </w:rPr>
+        <w:t xml:space="preserve">Là gì:</w:t>
+      </w:r>
+      <w:r>
+        <w:t xml:space="preserve"> mọi thư và tin nhắn của mọi tài khoản trong một danh sách; mở một thư email hay một hội thoại chat; đánh dấu đã đọc; soạn và gửi. Thao tác trên thư (nhắc tôi, tạm ẩn, gửi lúc…, tạo task) để change sau (D-52); nội dung tin là chữ thuần, không HTML (D-53).</w:t>
+      </w:r>
+    </w:p>
+    <w:p>
+      <w:pPr>
+        <w:shd w:val="clear" w:color="auto" w:fill="F2F3F5"/>
+        <w:ind w:left="0"/>
+      </w:pPr>
+      <w:r>
+        <w:rPr>
+          <w:rFonts w:ascii="Consolas" w:eastAsia="Consolas" w:hAnsi="Consolas" w:cs="Consolas"/>
+          <w:sz w:val="19"/>
+          <w:szCs w:val="19"/>
+        </w:rPr>
+        <w:t xml:space="preserve">&gt;= 1280px   [Nguồn 232][Danh sách 400][Thư đang mở .........]</w:t>
+        <w:br/>
+        <w:t xml:space="preserve">            chat: [Hội thoại ..................][Thông tin 320]</w:t>
+        <w:br/>
+        <w:t xml:space="preserve">768-1279px  [Danh sách 320][Thư hoặc hội thoại ...............]</w:t>
+        <w:br/>
+        <w:t xml:space="preserve">&lt; 768px     /inbox      [Đầu trang + chip nguồn][Danh sách]</w:t>
+        <w:br/>
+        <w:t xml:space="preserve">            /inbox/:id  [&lt; Quay lại | tên][Hội thoại][Ô soạn]</w:t>
+      </w:r>
+    </w:p>
+    <w:p>
+      <w:pPr>
+        <w:pStyle w:val="ListParagraph"/>
+        <w:numPr>
+          <w:ilvl w:val="0"/>
+          <w:numId w:val="1"/>
+        </w:numPr>
+      </w:pPr>
+      <w:r>
+        <w:rPr>
+          <w:b/>
+          <w:bCs/>
+        </w:rPr>
+        <w:t xml:space="preserve">Dữ liệu đi đâu:</w:t>
+      </w:r>
+      <w:r>
+        <w:t xml:space="preserve"> danh sách nằm một chỗ trong cache, chi tiết chỉ tải phần thêm (như màn Tài khoản, mục 6.4).</w:t>
+      </w:r>
+    </w:p>
+    <w:p>
+      <w:pPr>
+        <w:shd w:val="clear" w:color="auto" w:fill="F2F3F5"/>
+        <w:ind w:left="0"/>
+      </w:pPr>
+      <w:r>
+        <w:rPr>
+          <w:rFonts w:ascii="Consolas" w:eastAsia="Consolas" w:hAnsi="Consolas" w:cs="Consolas"/>
+          <w:sz w:val="19"/>
+          <w:szCs w:val="19"/>
+        </w:rPr>
+        <w:t xml:space="preserve">useInbox()          -&gt; ['inbox']        danh sách, số đếm, tài khoản</w:t>
+        <w:br/>
+        <w:t xml:space="preserve">useConversation(id) -&gt; dòng lấy từ ['inbox'] + ['inbox', id] tin nhắn</w:t>
+        <w:br/>
+        <w:t xml:space="preserve">useMarkRead()       -&gt; sửa ['inbox'], ['shell'], ['overview']</w:t>
+        <w:br/>
+        <w:t xml:space="preserve">useSendMessage(id)  -&gt; onMutate:  thêm tin "Đang gửi" vào ['inbox', id]</w:t>
+        <w:br/>
+        <w:t xml:space="preserve">                       onSuccess: thay bằng tin máy chủ trả, đổi xem trước của dòng</w:t>
+        <w:br/>
+        <w:t xml:space="preserve">                       onError:   đánh dấu "Không gửi được"</w:t>
+      </w:r>
+    </w:p>
+    <w:p>
+      <w:pPr>
+        <w:pStyle w:val="Heading3"/>
+      </w:pPr>
+      <w:r>
+        <w:t xml:space="preserve">8.1 Bộ lọc nằm trong URL (IN-02)</w:t>
+      </w:r>
+    </w:p>
+    <w:p>
+      <w:pPr>
+        <w:pStyle w:val="ListParagraph"/>
+        <w:numPr>
+          <w:ilvl w:val="0"/>
+          <w:numId w:val="1"/>
+        </w:numPr>
+      </w:pPr>
+      <w:r>
+        <w:rPr>
+          <w:b/>
+          <w:bCs/>
+        </w:rPr>
+        <w:t xml:space="preserve">Ở đâu:</w:t>
+      </w:r>
+      <w:r>
+        <w:t xml:space="preserve"> </w:t>
+      </w:r>
+      <w:r>
+        <w:rPr>
+          <w:rFonts w:ascii="Consolas" w:eastAsia="Consolas" w:hAnsi="Consolas" w:cs="Consolas"/>
+        </w:rPr>
+        <w:t xml:space="preserve">useInboxFilter.ts</w:t>
+      </w:r>
+      <w:r>
+        <w:t xml:space="preserve">. </w:t>
+      </w:r>
+      <w:r>
+        <w:rPr>
+          <w:rFonts w:ascii="Consolas" w:eastAsia="Consolas" w:hAnsi="Consolas" w:cs="Consolas"/>
+        </w:rPr>
+        <w:t xml:space="preserve">?source=zalo&amp;view=unread</w:t>
+      </w:r>
+      <w:r>
+        <w:t xml:space="preserve">; giá trị mặc định (mọi nguồn, cả hộp thư) thì địa chỉ để trống; giá trị lạ (</w:t>
+      </w:r>
+      <w:r>
+        <w:rPr>
+          <w:rFonts w:ascii="Consolas" w:eastAsia="Consolas" w:hAnsi="Consolas" w:cs="Consolas"/>
+        </w:rPr>
+        <w:t xml:space="preserve">?view=abc</w:t>
+      </w:r>
+      <w:r>
+        <w:t xml:space="preserve">) về mặc định.</w:t>
+      </w:r>
+    </w:p>
+    <w:p>
+      <w:pPr>
+        <w:pStyle w:val="ListParagraph"/>
+        <w:numPr>
+          <w:ilvl w:val="0"/>
+          <w:numId w:val="1"/>
+        </w:numPr>
+      </w:pPr>
+      <w:r>
+        <w:rPr>
+          <w:b/>
+          <w:bCs/>
+        </w:rPr>
+        <w:t xml:space="preserve">Vì sao không để trong </w:t>
+      </w:r>
+      <w:r>
+        <w:rPr>
+          <w:rFonts w:ascii="Consolas" w:eastAsia="Consolas" w:hAnsi="Consolas" w:cs="Consolas"/>
+          <w:b/>
+          <w:bCs/>
+        </w:rPr>
+        <w:t xml:space="preserve">useState</w:t>
+      </w:r>
+      <w:r>
+        <w:rPr>
+          <w:b/>
+          <w:bCs/>
+        </w:rPr>
+        <w:t xml:space="preserve">:</w:t>
+      </w:r>
+      <w:r>
+        <w:t xml:space="preserve"> tải lại trang vẫn giữ bộ lọc; nút Back quay về bộ lọc trước; cột nguồn, nút trên đầu danh sách, chip của tablet và mobile cùng đọc một chỗ nên không bao giờ lệch nhau. Mở một hội thoại cũng giữ bộ lọc: liên kết của dòng mang theo </w:t>
+      </w:r>
+      <w:r>
+        <w:rPr>
+          <w:rFonts w:ascii="Consolas" w:eastAsia="Consolas" w:hAnsi="Consolas" w:cs="Consolas"/>
+        </w:rPr>
+        <w:t xml:space="preserve">search</w:t>
+      </w:r>
+      <w:r>
+        <w:t xml:space="preserve">, nút "Quay lại Hộp thư" cũng vậy.</w:t>
+      </w:r>
+    </w:p>
+    <w:p>
+      <w:pPr>
+        <w:pStyle w:val="Heading3"/>
+      </w:pPr>
+      <w:r>
+        <w:t xml:space="preserve">8.2 Hàm chữ thuần và khi canvas tự mâu thuẫn (IN-01)</w:t>
+      </w:r>
+    </w:p>
+    <w:p>
+      <w:pPr>
+        <w:pStyle w:val="ListParagraph"/>
+        <w:numPr>
+          <w:ilvl w:val="0"/>
+          <w:numId w:val="1"/>
+        </w:numPr>
+      </w:pPr>
+      <w:r>
+        <w:rPr>
+          <w:b/>
+          <w:bCs/>
+        </w:rPr>
+        <w:t xml:space="preserve">Hàm chữ:</w:t>
+      </w:r>
+      <w:r>
+        <w:t xml:space="preserve"> nhóm ngày ("HÔM NAY", "HÔM QUA", "TUẦN NÀY"), giờ của dòng, dòng dấu ("Task · hạn T4 07/10"), xem trước ("Hà: …") đều là hàm thuần trong </w:t>
+      </w:r>
+      <w:r>
+        <w:rPr>
+          <w:rFonts w:ascii="Consolas" w:eastAsia="Consolas" w:hAnsi="Consolas" w:cs="Consolas"/>
+        </w:rPr>
+        <w:t xml:space="preserve">format.ts</w:t>
+      </w:r>
+      <w:r>
+        <w:t xml:space="preserve">, nhận </w:t>
+      </w:r>
+      <w:r>
+        <w:rPr>
+          <w:rFonts w:ascii="Consolas" w:eastAsia="Consolas" w:hAnsi="Consolas" w:cs="Consolas"/>
+        </w:rPr>
+        <w:t xml:space="preserve">now</w:t>
+      </w:r>
+      <w:r>
+        <w:t xml:space="preserve"> làm tham số, nên test được từng ca mà không cần vẽ trang.</w:t>
+      </w:r>
+    </w:p>
+    <w:p>
+      <w:pPr>
+        <w:pStyle w:val="ListParagraph"/>
+        <w:numPr>
+          <w:ilvl w:val="0"/>
+          <w:numId w:val="1"/>
+        </w:numPr>
+      </w:pPr>
+      <w:r>
+        <w:rPr>
+          <w:b/>
+          <w:bCs/>
+        </w:rPr>
+        <w:t xml:space="preserve">Canvas vẽ hai hội thoại cùng loại bằng hai kiểu dòng dấu.</w:t>
+      </w:r>
+      <w:r>
+        <w:t xml:space="preserve"> Agent chọn một quy tắc khớp nhiều chỗ nhất và nói điều có ích nhất (việc </w:t>
+      </w:r>
+      <w:r>
+        <w:rPr>
+          <w:b/>
+          <w:bCs/>
+        </w:rPr>
+        <w:t xml:space="preserve">gần nhất sắp tới</w:t>
+      </w:r>
+      <w:r>
+        <w:t xml:space="preserve">), rồi ghi vào </w:t>
+      </w:r>
+      <w:r>
+        <w:rPr>
+          <w:rFonts w:ascii="Consolas" w:eastAsia="Consolas" w:hAnsi="Consolas" w:cs="Consolas"/>
+        </w:rPr>
+        <w:t xml:space="preserve">tasks.md</w:t>
+      </w:r>
+      <w:r>
+        <w:t xml:space="preserve"> kèm LÝ DO. Ghi lại để sáu tháng sau không ai tưởng đó là lỗi.</w:t>
+      </w:r>
+    </w:p>
+    <w:p>
+      <w:pPr>
+        <w:pStyle w:val="Heading3"/>
+      </w:pPr>
+      <w:r>
+        <w:t xml:space="preserve">8.3 Một mutation, ba cache (IN-02)</w:t>
+      </w:r>
+    </w:p>
+    <w:p>
+      <w:pPr>
+        <w:pStyle w:val="ListParagraph"/>
+        <w:numPr>
+          <w:ilvl w:val="0"/>
+          <w:numId w:val="1"/>
+        </w:numPr>
+      </w:pPr>
+      <w:r>
+        <w:rPr>
+          <w:b/>
+          <w:bCs/>
+        </w:rPr>
+        <w:t xml:space="preserve">Chuyện gì:</w:t>
+      </w:r>
+      <w:r>
+        <w:t xml:space="preserve"> mở "Phòng khám" (1 thư chưa đọc) thì "12 chưa đọc" thành 11 ở đầu danh sách, Gmail ở cột nguồn bớt 1, số cạnh "Hộp thư" ở thanh bên bớt 1, thẻ Hộp thư của Tổng quan cũng bớt.</w:t>
+      </w:r>
+    </w:p>
+    <w:p>
+      <w:pPr>
+        <w:pStyle w:val="ListParagraph"/>
+        <w:numPr>
+          <w:ilvl w:val="0"/>
+          <w:numId w:val="1"/>
+        </w:numPr>
+      </w:pPr>
+      <w:r>
+        <w:rPr>
+          <w:b/>
+          <w:bCs/>
+        </w:rPr>
+        <w:t xml:space="preserve">Cách làm:</w:t>
+      </w:r>
+      <w:r>
+        <w:t xml:space="preserve"> </w:t>
+      </w:r>
+      <w:r>
+        <w:rPr>
+          <w:rFonts w:ascii="Consolas" w:eastAsia="Consolas" w:hAnsi="Consolas" w:cs="Consolas"/>
+        </w:rPr>
+        <w:t xml:space="preserve">useMarkRead</w:t>
+      </w:r>
+      <w:r>
+        <w:t xml:space="preserve"> cập nhật lạc quan (mục 6.5) cả ba cache </w:t>
+      </w:r>
+      <w:r>
+        <w:rPr>
+          <w:rFonts w:ascii="Consolas" w:eastAsia="Consolas" w:hAnsi="Consolas" w:cs="Consolas"/>
+        </w:rPr>
+        <w:t xml:space="preserve">['inbox']</w:t>
+      </w:r>
+      <w:r>
+        <w:t xml:space="preserve">, </w:t>
+      </w:r>
+      <w:r>
+        <w:rPr>
+          <w:rFonts w:ascii="Consolas" w:eastAsia="Consolas" w:hAnsi="Consolas" w:cs="Consolas"/>
+        </w:rPr>
+        <w:t xml:space="preserve">['shell']</w:t>
+      </w:r>
+      <w:r>
+        <w:t xml:space="preserve">, </w:t>
+      </w:r>
+      <w:r>
+        <w:rPr>
+          <w:rFonts w:ascii="Consolas" w:eastAsia="Consolas" w:hAnsi="Consolas" w:cs="Consolas"/>
+        </w:rPr>
+        <w:t xml:space="preserve">['overview']</w:t>
+      </w:r>
+      <w:r>
+        <w:t xml:space="preserve"> trong </w:t>
+      </w:r>
+      <w:r>
+        <w:rPr>
+          <w:rFonts w:ascii="Consolas" w:eastAsia="Consolas" w:hAnsi="Consolas" w:cs="Consolas"/>
+        </w:rPr>
+        <w:t xml:space="preserve">onMutate</w:t>
+      </w:r>
+      <w:r>
+        <w:t xml:space="preserve">. Mỗi màn có hợp đồng dữ liệu riêng nên con số nằm ở ba chỗ; một hành động phải sửa đủ ba, nếu không người dùng thấy hai con số khác nhau cùng lúc.</w:t>
+      </w:r>
+    </w:p>
+    <w:p>
+      <w:pPr>
+        <w:pStyle w:val="Heading3"/>
+      </w:pPr>
+      <w:r>
+        <w:t xml:space="preserve">8.4 Soạn và gửi (IN-04)</w:t>
+      </w:r>
+    </w:p>
+    <w:p>
+      <w:pPr>
+        <w:pStyle w:val="ListParagraph"/>
+        <w:numPr>
+          <w:ilvl w:val="0"/>
+          <w:numId w:val="1"/>
+        </w:numPr>
+      </w:pPr>
+      <w:r>
+        <w:rPr>
+          <w:b/>
+          <w:bCs/>
+        </w:rPr>
+        <w:t xml:space="preserve">Tin hiện ngay:</w:t>
+      </w:r>
+      <w:r>
+        <w:t xml:space="preserve"> </w:t>
+      </w:r>
+      <w:r>
+        <w:rPr>
+          <w:rFonts w:ascii="Consolas" w:eastAsia="Consolas" w:hAnsi="Consolas" w:cs="Consolas"/>
+        </w:rPr>
+        <w:t xml:space="preserve">onMutate</w:t>
+      </w:r>
+      <w:r>
+        <w:t xml:space="preserve"> thêm một tin có </w:t>
+      </w:r>
+      <w:r>
+        <w:rPr>
+          <w:rFonts w:ascii="Consolas" w:eastAsia="Consolas" w:hAnsi="Consolas" w:cs="Consolas"/>
+        </w:rPr>
+        <w:t xml:space="preserve">status: 'SENDING'</w:t>
+      </w:r>
+      <w:r>
+        <w:t xml:space="preserve"> vào cuối hội thoại ("14:05 · Đang gửi"); </w:t>
+      </w:r>
+      <w:r>
+        <w:rPr>
+          <w:rFonts w:ascii="Consolas" w:eastAsia="Consolas" w:hAnsi="Consolas" w:cs="Consolas"/>
+        </w:rPr>
+        <w:t xml:space="preserve">onSuccess</w:t>
+      </w:r>
+      <w:r>
+        <w:t xml:space="preserve"> thay nó bằng tin máy chủ trả và đổi xem trước của dòng ("Bạn: Con về lúc 6 giờ"); </w:t>
+      </w:r>
+      <w:r>
+        <w:rPr>
+          <w:rFonts w:ascii="Consolas" w:eastAsia="Consolas" w:hAnsi="Consolas" w:cs="Consolas"/>
+        </w:rPr>
+        <w:t xml:space="preserve">onError</w:t>
+      </w:r>
+      <w:r>
+        <w:t xml:space="preserve"> đổi thành "Không gửi được". Danh sách chỉ lấy tin </w:t>
+      </w:r>
+      <w:r>
+        <w:rPr>
+          <w:b/>
+          <w:bCs/>
+        </w:rPr>
+        <w:t xml:space="preserve">đã gửi xong</w:t>
+      </w:r>
+      <w:r>
+        <w:t xml:space="preserve"> làm xem trước.</w:t>
+      </w:r>
+    </w:p>
+    <w:p>
+      <w:pPr>
+        <w:pStyle w:val="ListParagraph"/>
+        <w:numPr>
+          <w:ilvl w:val="0"/>
+          <w:numId w:val="1"/>
+        </w:numPr>
+      </w:pPr>
+      <w:r>
+        <w:rPr>
+          <w:b/>
+          <w:bCs/>
+        </w:rPr>
+        <w:t xml:space="preserve">Phím:</w:t>
+      </w:r>
+      <w:r>
+        <w:t xml:space="preserve"> chat gửi bằng Enter (Shift Enter xuống dòng), email gửi bằng Ctrl Enter (Enter xuống dòng). Nội dung bỏ khoảng trắng hai đầu; rỗng thì không gửi và nút "Gửi" mờ.</w:t>
+      </w:r>
+    </w:p>
+    <w:p>
+      <w:pPr>
+        <w:pStyle w:val="ListParagraph"/>
+        <w:numPr>
+          <w:ilvl w:val="0"/>
+          <w:numId w:val="1"/>
+        </w:numPr>
+      </w:pPr>
+      <w:r>
+        <w:rPr>
+          <w:b/>
+          <w:bCs/>
+        </w:rPr>
+        <w:t xml:space="preserve">Bộ gõ tiếng Việt:</w:t>
+      </w:r>
+      <w:r>
+        <w:t xml:space="preserve"> Telex, VNI dùng Enter để chốt một chữ đang ghép. Lúc đó </w:t>
+      </w:r>
+      <w:r>
+        <w:rPr>
+          <w:rFonts w:ascii="Consolas" w:eastAsia="Consolas" w:hAnsi="Consolas" w:cs="Consolas"/>
+        </w:rPr>
+        <w:t xml:space="preserve">event.nativeEvent.isComposing</w:t>
+      </w:r>
+      <w:r>
+        <w:t xml:space="preserve"> là </w:t>
+      </w:r>
+      <w:r>
+        <w:rPr>
+          <w:rFonts w:ascii="Consolas" w:eastAsia="Consolas" w:hAnsi="Consolas" w:cs="Consolas"/>
+        </w:rPr>
+        <w:t xml:space="preserve">true</w:t>
+      </w:r>
+      <w:r>
+        <w:t xml:space="preserve">, và Enter ấy không được gửi tin. Test bắn một </w:t>
+      </w:r>
+      <w:r>
+        <w:rPr>
+          <w:rFonts w:ascii="Consolas" w:eastAsia="Consolas" w:hAnsi="Consolas" w:cs="Consolas"/>
+        </w:rPr>
+        <w:t xml:space="preserve">KeyboardEvent</w:t>
+      </w:r>
+      <w:r>
+        <w:t xml:space="preserve"> có </w:t>
+      </w:r>
+      <w:r>
+        <w:rPr>
+          <w:rFonts w:ascii="Consolas" w:eastAsia="Consolas" w:hAnsi="Consolas" w:cs="Consolas"/>
+        </w:rPr>
+        <w:t xml:space="preserve">isComposing: true</w:t>
+      </w:r>
+      <w:r>
+        <w:t xml:space="preserve"> rồi kiểm </w:t>
+      </w:r>
+      <w:r>
+        <w:rPr>
+          <w:rFonts w:ascii="Consolas" w:eastAsia="Consolas" w:hAnsi="Consolas" w:cs="Consolas"/>
+        </w:rPr>
+        <w:t xml:space="preserve">sendMessage</w:t>
+      </w:r>
+      <w:r>
+        <w:t xml:space="preserve"> không được gọi.</w:t>
+      </w:r>
+    </w:p>
+    <w:p>
+      <w:pPr>
+        <w:pStyle w:val="Heading3"/>
+      </w:pPr>
+      <w:r>
+        <w:t xml:space="preserve">8.5 Tablet và mobile (IN-05)</w:t>
+      </w:r>
+    </w:p>
+    <w:p>
+      <w:pPr>
+        <w:pStyle w:val="ListParagraph"/>
+        <w:numPr>
+          <w:ilvl w:val="0"/>
+          <w:numId w:val="1"/>
+        </w:numPr>
+      </w:pPr>
+      <w:r>
+        <w:rPr>
+          <w:b/>
+          <w:bCs/>
+        </w:rPr>
+        <w:t xml:space="preserve">Chip lọc:</w:t>
+      </w:r>
+      <w:r>
+        <w:t xml:space="preserve"> mobile có hàng chip "Nguồn" ("Tất cả · 12", "Gmail · 7"…); tablet có ô chọn nguồn (</w:t>
+      </w:r>
+      <w:r>
+        <w:rPr>
+          <w:rFonts w:ascii="Consolas" w:eastAsia="Consolas" w:hAnsi="Consolas" w:cs="Consolas"/>
+        </w:rPr>
+        <w:t xml:space="preserve">&lt;select&gt;</w:t>
+      </w:r>
+      <w:r>
+        <w:t xml:space="preserve"> thật trong dáng chip) và chip "Chưa đọc", "Cần trả lời". Số chưa đọc từng nguồn lấy từ một hàm </w:t>
+      </w:r>
+      <w:r>
+        <w:rPr>
+          <w:rFonts w:ascii="Consolas" w:eastAsia="Consolas" w:hAnsi="Consolas" w:cs="Consolas"/>
+        </w:rPr>
+        <w:t xml:space="preserve">sourceCounts</w:t>
+      </w:r>
+      <w:r>
+        <w:t xml:space="preserve"> dùng chung cho cột nguồn và hai hàng chip.</w:t>
+      </w:r>
+    </w:p>
+    <w:p>
+      <w:pPr>
+        <w:pStyle w:val="ListParagraph"/>
+        <w:numPr>
+          <w:ilvl w:val="0"/>
+          <w:numId w:val="1"/>
+        </w:numPr>
+      </w:pPr>
+      <w:r>
+        <w:rPr>
+          <w:b/>
+          <w:bCs/>
+        </w:rPr>
+        <w:t xml:space="preserve">Trang con trên mobile:</w:t>
+      </w:r>
+      <w:r>
+        <w:t xml:space="preserve"> route </w:t>
+      </w:r>
+      <w:r>
+        <w:rPr>
+          <w:rFonts w:ascii="Consolas" w:eastAsia="Consolas" w:hAnsi="Consolas" w:cs="Consolas"/>
+        </w:rPr>
+        <w:t xml:space="preserve">inbox/:conversationId</w:t>
+      </w:r>
+      <w:r>
+        <w:t xml:space="preserve"> khai </w:t>
+      </w:r>
+      <w:r>
+        <w:rPr>
+          <w:rFonts w:ascii="Consolas" w:eastAsia="Consolas" w:hAnsi="Consolas" w:cs="Consolas"/>
+        </w:rPr>
+        <w:t xml:space="preserve">handle: { mobilePageHeader: true, hideTabBar: true }</w:t>
+      </w:r>
+      <w:r>
+        <w:t xml:space="preserve"> (mục 6.1): khung app ẩn thanh trên và thanh dưới, trang tự vẽ đầu trang với "Quay lại Hộp thư".</w:t>
+      </w:r>
+    </w:p>
+    <w:p>
+      <w:pPr>
+        <w:pStyle w:val="ListParagraph"/>
+        <w:numPr>
+          <w:ilvl w:val="0"/>
+          <w:numId w:val="1"/>
+        </w:numPr>
+      </w:pPr>
+      <w:r>
+        <w:rPr>
+          <w:rFonts w:ascii="Consolas" w:eastAsia="Consolas" w:hAnsi="Consolas" w:cs="Consolas"/>
+          <w:b/>
+          <w:bCs/>
+        </w:rPr>
+        <w:t xml:space="preserve">display: contents</w:t>
+      </w:r>
+      <w:r>
+        <w:rPr>
+          <w:b/>
+          <w:bCs/>
+        </w:rPr>
+        <w:t xml:space="preserve"> cho ô soạn:</w:t>
+      </w:r>
+      <w:r>
+        <w:t xml:space="preserve"> trên mobile ô soạn là một hàng (đính kèm, ô tròn, nút gửi), trên desktop là một hộp có thanh công cụ bên dưới. Vẽ hai ô nhập thì trạng thái gõ, nhãn và test đều nhân đôi. Thay vào đó, dưới 768px hộp và thanh công cụ có </w:t>
+      </w:r>
+      <w:r>
+        <w:rPr>
+          <w:rFonts w:ascii="Consolas" w:eastAsia="Consolas" w:hAnsi="Consolas" w:cs="Consolas"/>
+        </w:rPr>
+        <w:t xml:space="preserve">display: contents</w:t>
+      </w:r>
+      <w:r>
+        <w:t xml:space="preserve">: hai thẻ đó "biến mất" khỏi bố cục, các con của chúng xếp thẳng vào hàng ngoài; </w:t>
+      </w:r>
+      <w:r>
+        <w:rPr>
+          <w:rFonts w:ascii="Consolas" w:eastAsia="Consolas" w:hAnsi="Consolas" w:cs="Consolas"/>
+        </w:rPr>
+        <w:t xml:space="preserve">order-first</w:t>
+      </w:r>
+      <w:r>
+        <w:t xml:space="preserve"> đưa nút đính kèm lên đầu.</w:t>
+      </w:r>
+    </w:p>
+    <w:p>
+      <w:pPr>
+        <w:pStyle w:val="ListParagraph"/>
+        <w:numPr>
+          <w:ilvl w:val="0"/>
+          <w:numId w:val="1"/>
+        </w:numPr>
+      </w:pPr>
+      <w:r>
+        <w:rPr>
+          <w:b/>
+          <w:bCs/>
+        </w:rPr>
+        <w:t xml:space="preserve">Bẫy: cột lưới nở theo nội dung.</w:t>
+      </w:r>
+      <w:r>
+        <w:t xml:space="preserve"> Ở 1024px ô trả lời kết thúc ở x=1060 trong cột chỉ tới 1024. Lý do: thẻ </w:t>
+      </w:r>
+      <w:r>
+        <w:rPr>
+          <w:rFonts w:ascii="Consolas" w:eastAsia="Consolas" w:hAnsi="Consolas" w:cs="Consolas"/>
+        </w:rPr>
+        <w:t xml:space="preserve">section</w:t>
+      </w:r>
+      <w:r>
+        <w:t xml:space="preserve"> đã có </w:t>
+      </w:r>
+      <w:r>
+        <w:rPr>
+          <w:rFonts w:ascii="Consolas" w:eastAsia="Consolas" w:hAnsi="Consolas" w:cs="Consolas"/>
+        </w:rPr>
+        <w:t xml:space="preserve">min-w-0</w:t>
+      </w:r>
+      <w:r>
+        <w:t xml:space="preserve">, nhưng </w:t>
+      </w:r>
+      <w:r>
+        <w:rPr>
+          <w:b/>
+          <w:bCs/>
+        </w:rPr>
+        <w:t xml:space="preserve">cột bên trong</w:t>
+      </w:r>
+      <w:r>
+        <w:t xml:space="preserve"> lưới của nó là </w:t>
+      </w:r>
+      <w:r>
+        <w:rPr>
+          <w:rFonts w:ascii="Consolas" w:eastAsia="Consolas" w:hAnsi="Consolas" w:cs="Consolas"/>
+        </w:rPr>
+        <w:t xml:space="preserve">auto</w:t>
+      </w:r>
+      <w:r>
+        <w:t xml:space="preserve">, mà </w:t>
+      </w:r>
+      <w:r>
+        <w:rPr>
+          <w:rFonts w:ascii="Consolas" w:eastAsia="Consolas" w:hAnsi="Consolas" w:cs="Consolas"/>
+        </w:rPr>
+        <w:t xml:space="preserve">auto</w:t>
+      </w:r>
+      <w:r>
+        <w:t xml:space="preserve"> không nhỏ hơn bề rộng tối thiểu của nội dung (thanh gửi có chữ không xuống dòng). Sửa: </w:t>
+      </w:r>
+      <w:r>
+        <w:rPr>
+          <w:rFonts w:ascii="Consolas" w:eastAsia="Consolas" w:hAnsi="Consolas" w:cs="Consolas"/>
+        </w:rPr>
+        <w:t xml:space="preserve">grid-cols-[minmax(0,1fr)]</w:t>
+      </w:r>
+      <w:r>
+        <w:t xml:space="preserve"> cho phép cột co lại; nội dung dài thì cắt bằng </w:t>
+      </w:r>
+      <w:r>
+        <w:rPr>
+          <w:rFonts w:ascii="Consolas" w:eastAsia="Consolas" w:hAnsi="Consolas" w:cs="Consolas"/>
+        </w:rPr>
+        <w:t xml:space="preserve">truncate</w:t>
+      </w:r>
+      <w:r>
+        <w:t xml:space="preserve">. Kiểm tra cũ chỉ đo </w:t>
+      </w:r>
+      <w:r>
+        <w:rPr>
+          <w:rFonts w:ascii="Consolas" w:eastAsia="Consolas" w:hAnsi="Consolas" w:cs="Consolas"/>
+        </w:rPr>
+        <w:t xml:space="preserve">document</w:t>
+      </w:r>
+      <w:r>
+        <w:t xml:space="preserve"> nên không thấy; giờ đo cả </w:t>
+      </w:r>
+      <w:r>
+        <w:rPr>
+          <w:rFonts w:ascii="Consolas" w:eastAsia="Consolas" w:hAnsi="Consolas" w:cs="Consolas"/>
+        </w:rPr>
+        <w:t xml:space="preserve">main</w:t>
+      </w:r>
+      <w:r>
+        <w:t xml:space="preserve">.</w:t>
+      </w:r>
+    </w:p>
+    <w:p>
+      <w:pPr>
+        <w:pStyle w:val="ListParagraph"/>
+        <w:numPr>
+          <w:ilvl w:val="0"/>
+          <w:numId w:val="1"/>
+        </w:numPr>
+      </w:pPr>
+      <w:r>
+        <w:rPr>
+          <w:b/>
+          <w:bCs/>
+        </w:rPr>
+        <w:t xml:space="preserve">Canvas tablet rút gọn:</w:t>
+      </w:r>
+      <w:r>
+        <w:t xml:space="preserve"> ở 768–1279px đầu hội thoại chỉ còn "Lưu trữ" và "Thêm thao tác", ô trả lời bỏ "Gửi từ …" và phím tắt, đúng như </w:t>
+      </w:r>
+      <w:r>
+        <w:rPr>
+          <w:rFonts w:ascii="Consolas" w:eastAsia="Consolas" w:hAnsi="Consolas" w:cs="Consolas"/>
+        </w:rPr>
+        <w:t xml:space="preserve">TabletInbox</w:t>
+      </w:r>
+      <w:r>
+        <w:t xml:space="preserve">.</w:t>
+      </w:r>
+    </w:p>
+    <w:p>
+      <w:pPr>
+        <w:pStyle w:val="Heading3"/>
+      </w:pPr>
+      <w:r>
+        <w:t xml:space="preserve">8.6 Các trạng thái của hộp thư (IN-06, D-55)</w:t>
+      </w:r>
+    </w:p>
+    <w:p>
+      <w:pPr>
+        <w:shd w:val="clear" w:color="auto" w:fill="F2F3F5"/>
+        <w:ind w:left="0"/>
+      </w:pPr>
+      <w:r>
+        <w:rPr>
+          <w:rFonts w:ascii="Consolas" w:eastAsia="Consolas" w:hAnsi="Consolas" w:cs="Consolas"/>
+          <w:sz w:val="19"/>
+          <w:szCs w:val="19"/>
+        </w:rPr>
+        <w:t xml:space="preserve">chưa có dữ liệu, chưa lỗi     -&gt; khung xương, "đang tải"</w:t>
+        <w:br/>
+        <w:t xml:space="preserve">chưa có dữ liệu, lỗi          -&gt; "Không tải được hộp thư" + "Thử lại"</w:t>
+        <w:br/>
+        <w:t xml:space="preserve">accounts rỗng                 -&gt; "Hộp thư đang trống." + "Kết nối"</w:t>
+        <w:br/>
+        <w:t xml:space="preserve">chưa có hội thoại, có tài</w:t>
+        <w:br/>
+        <w:t xml:space="preserve">  khoản đang đồng bộ          -&gt; thẻ "Đồng bộ lần đầu" + khung xương</w:t>
+        <w:br/>
+        <w:t xml:space="preserve">mất mạng (lúc nào cũng được)  -&gt; dải báo + ô soạn "Xếp hàng gửi"</w:t>
+        <w:br/>
+        <w:t xml:space="preserve">tài khoản AUTH_EXPIRED        -&gt; báo đỏ + "Kết nối lại" thay ô soạn</w:t>
+        <w:br/>
+        <w:t xml:space="preserve">canSend = false               -&gt; báo vàng + "Cấp lại quyền gửi"</w:t>
+      </w:r>
+    </w:p>
+    <w:p>
+      <w:pPr>
+        <w:pStyle w:val="ListParagraph"/>
+        <w:numPr>
+          <w:ilvl w:val="0"/>
+          <w:numId w:val="1"/>
+        </w:numPr>
+      </w:pPr>
+      <w:r>
+        <w:rPr>
+          <w:b/>
+          <w:bCs/>
+        </w:rPr>
+        <w:t xml:space="preserve">Ngoại tuyến:</w:t>
+      </w:r>
+      <w:r>
+        <w:t xml:space="preserve"> TanStack Query có </w:t>
+      </w:r>
+      <w:r>
+        <w:rPr>
+          <w:rFonts w:ascii="Consolas" w:eastAsia="Consolas" w:hAnsi="Consolas" w:cs="Consolas"/>
+        </w:rPr>
+        <w:t xml:space="preserve">onlineManager</w:t>
+      </w:r>
+      <w:r>
+        <w:t xml:space="preserve"> theo dõi mạng. Khi mất mạng, query không gọi và mutation </w:t>
+      </w:r>
+      <w:r>
+        <w:rPr>
+          <w:b/>
+          <w:bCs/>
+        </w:rPr>
+        <w:t xml:space="preserve">tạm dừng</w:t>
+      </w:r>
+      <w:r>
+        <w:t xml:space="preserve">: </w:t>
+      </w:r>
+      <w:r>
+        <w:rPr>
+          <w:rFonts w:ascii="Consolas" w:eastAsia="Consolas" w:hAnsi="Consolas" w:cs="Consolas"/>
+        </w:rPr>
+        <w:t xml:space="preserve">onMutate</w:t>
+      </w:r>
+      <w:r>
+        <w:t xml:space="preserve"> vẫn chạy (tin "Đang gửi" vẫn hiện), còn </w:t>
+      </w:r>
+      <w:r>
+        <w:rPr>
+          <w:rFonts w:ascii="Consolas" w:eastAsia="Consolas" w:hAnsi="Consolas" w:cs="Consolas"/>
+        </w:rPr>
+        <w:t xml:space="preserve">mutationFn</w:t>
+      </w:r>
+      <w:r>
+        <w:t xml:space="preserve"> chờ tới khi có mạng mới chạy. Vì vậy "Xếp hàng gửi" không cần tự viết hàng đợi.</w:t>
+      </w:r>
+    </w:p>
+    <w:p>
+      <w:pPr>
+        <w:pStyle w:val="ListParagraph"/>
+        <w:numPr>
+          <w:ilvl w:val="0"/>
+          <w:numId w:val="1"/>
+        </w:numPr>
+      </w:pPr>
+      <w:r>
+        <w:rPr>
+          <w:rFonts w:ascii="Consolas" w:eastAsia="Consolas" w:hAnsi="Consolas" w:cs="Consolas"/>
+          <w:b/>
+          <w:bCs/>
+        </w:rPr>
+        <w:t xml:space="preserve">useOnline</w:t>
+      </w:r>
+      <w:r>
+        <w:t xml:space="preserve"> (</w:t>
+      </w:r>
+      <w:r>
+        <w:rPr>
+          <w:rFonts w:ascii="Consolas" w:eastAsia="Consolas" w:hAnsi="Consolas" w:cs="Consolas"/>
+        </w:rPr>
+        <w:t xml:space="preserve">src/shared/lib/useOnline.ts</w:t>
+      </w:r>
+      <w:r>
+        <w:t xml:space="preserve">) đọc chính </w:t>
+      </w:r>
+      <w:r>
+        <w:rPr>
+          <w:rFonts w:ascii="Consolas" w:eastAsia="Consolas" w:hAnsi="Consolas" w:cs="Consolas"/>
+        </w:rPr>
+        <w:t xml:space="preserve">onlineManager</w:t>
+      </w:r>
+      <w:r>
+        <w:t xml:space="preserve"> qua </w:t>
+      </w:r>
+      <w:r>
+        <w:rPr>
+          <w:rFonts w:ascii="Consolas" w:eastAsia="Consolas" w:hAnsi="Consolas" w:cs="Consolas"/>
+        </w:rPr>
+        <w:t xml:space="preserve">useSyncExternalStore</w:t>
+      </w:r>
+      <w:r>
+        <w:t xml:space="preserve">, hook của React để đọc một nguồn bên ngoài React và vẽ lại khi nguồn đó đổi. Tự nghe </w:t>
+      </w:r>
+      <w:r>
+        <w:rPr>
+          <w:rFonts w:ascii="Consolas" w:eastAsia="Consolas" w:hAnsi="Consolas" w:cs="Consolas"/>
+        </w:rPr>
+        <w:t xml:space="preserve">navigator.onLine</w:t>
+      </w:r>
+      <w:r>
+        <w:t xml:space="preserve"> thì có lúc dải báo nói "có mạng" mà request vẫn đang dừng, hoặc ngược lại.</w:t>
+      </w:r>
+    </w:p>
+    <w:p>
+      <w:pPr>
+        <w:pStyle w:val="ListParagraph"/>
+        <w:numPr>
+          <w:ilvl w:val="0"/>
+          <w:numId w:val="1"/>
+        </w:numPr>
+      </w:pPr>
+      <w:r>
+        <w:rPr>
+          <w:b/>
+          <w:bCs/>
+        </w:rPr>
+        <w:t xml:space="preserve">Lỗi tải:</w:t>
+      </w:r>
+      <w:r>
+        <w:t xml:space="preserve"> </w:t>
+      </w:r>
+      <w:r>
+        <w:rPr>
+          <w:rFonts w:ascii="Consolas" w:eastAsia="Consolas" w:hAnsi="Consolas" w:cs="Consolas"/>
+        </w:rPr>
+        <w:t xml:space="preserve">useInbox</w:t>
+      </w:r>
+      <w:r>
+        <w:t xml:space="preserve"> trả thêm </w:t>
+      </w:r>
+      <w:r>
+        <w:rPr>
+          <w:rFonts w:ascii="Consolas" w:eastAsia="Consolas" w:hAnsi="Consolas" w:cs="Consolas"/>
+        </w:rPr>
+        <w:t xml:space="preserve">error</w:t>
+      </w:r>
+      <w:r>
+        <w:t xml:space="preserve">, </w:t>
+      </w:r>
+      <w:r>
+        <w:rPr>
+          <w:rFonts w:ascii="Consolas" w:eastAsia="Consolas" w:hAnsi="Consolas" w:cs="Consolas"/>
+        </w:rPr>
+        <w:t xml:space="preserve">failedAt</w:t>
+      </w:r>
+      <w:r>
+        <w:t xml:space="preserve">, </w:t>
+      </w:r>
+      <w:r>
+        <w:rPr>
+          <w:rFonts w:ascii="Consolas" w:eastAsia="Consolas" w:hAnsi="Consolas" w:cs="Consolas"/>
+        </w:rPr>
+        <w:t xml:space="preserve">retry</w:t>
+      </w:r>
+      <w:r>
+        <w:t xml:space="preserve"> (gọi </w:t>
+      </w:r>
+      <w:r>
+        <w:rPr>
+          <w:rFonts w:ascii="Consolas" w:eastAsia="Consolas" w:hAnsi="Consolas" w:cs="Consolas"/>
+        </w:rPr>
+        <w:t xml:space="preserve">refetch</w:t>
+      </w:r>
+      <w:r>
+        <w:t xml:space="preserve">). Dòng chi tiết ghi </w:t>
+      </w:r>
+      <w:r>
+        <w:rPr>
+          <w:rFonts w:ascii="Consolas" w:eastAsia="Consolas" w:hAnsi="Consolas" w:cs="Consolas"/>
+        </w:rPr>
+        <w:t xml:space="preserve">code</w:t>
+      </w:r>
+      <w:r>
+        <w:t xml:space="preserve"> và </w:t>
+      </w:r>
+      <w:r>
+        <w:rPr>
+          <w:rFonts w:ascii="Consolas" w:eastAsia="Consolas" w:hAnsi="Consolas" w:cs="Consolas"/>
+        </w:rPr>
+        <w:t xml:space="preserve">requestId</w:t>
+      </w:r>
+      <w:r>
+        <w:t xml:space="preserve"> nếu lỗi có hai trường đó, rồi giờ. Khi có API client (FE-02), lỗi của nó chỉ cần mang hai trường này.</w:t>
+      </w:r>
+    </w:p>
+    <w:p>
+      <w:pPr>
+        <w:pStyle w:val="ListParagraph"/>
+        <w:numPr>
+          <w:ilvl w:val="0"/>
+          <w:numId w:val="1"/>
+        </w:numPr>
+      </w:pPr>
+      <w:r>
+        <w:rPr>
+          <w:b/>
+          <w:bCs/>
+        </w:rPr>
+        <w:t xml:space="preserve">Không hứa điều chưa có:</w:t>
+      </w:r>
+      <w:r>
+        <w:t xml:space="preserve"> canvas có "Bấm N ở bất cứ đâu để kết nối nhanh" và "Chưa tải · cần có mạng" dưới tệp; phím tắt và bộ nhớ tệp ngoại tuyến chưa làm nên hai câu đó bị bỏ, ghi lý do ở </w:t>
+      </w:r>
+      <w:r>
+        <w:rPr>
+          <w:rFonts w:ascii="Consolas" w:eastAsia="Consolas" w:hAnsi="Consolas" w:cs="Consolas"/>
+        </w:rPr>
+        <w:t xml:space="preserve">tasks.md</w:t>
+      </w:r>
+      <w:r>
+        <w:t xml:space="preserve">.</w:t>
+      </w:r>
+    </w:p>
+    <w:p>
+      <w:pPr>
+        <w:pStyle w:val="Heading3"/>
+      </w:pPr>
+      <w:r>
+        <w:t xml:space="preserve">8.7 Kiểm chứng IN-01…IN-06</w:t>
+      </w:r>
+    </w:p>
+    <w:p>
+      <w:pPr>
+        <w:pStyle w:val="ListParagraph"/>
+        <w:numPr>
+          <w:ilvl w:val="0"/>
+          <w:numId w:val="1"/>
+        </w:numPr>
+      </w:pPr>
+      <w:r>
+        <w:rPr>
+          <w:b/>
+          <w:bCs/>
+        </w:rPr>
+        <w:t xml:space="preserve">Test viết trước, mỗi task:</w:t>
+      </w:r>
+      <w:r>
+        <w:t xml:space="preserve"> IN-01 31/33 đỏ trên stub; IN-02 9/9; IN-03 6/6; IN-04 4/6; IN-05 5/5; IN-06 7/7 cộng 3 test hàm chữ. Cuối cùng 253/253.</w:t>
+      </w:r>
+    </w:p>
+    <w:p>
+      <w:pPr>
+        <w:pStyle w:val="ListParagraph"/>
+        <w:numPr>
+          <w:ilvl w:val="0"/>
+          <w:numId w:val="1"/>
+        </w:numPr>
+      </w:pPr>
+      <w:r>
+        <w:rPr>
+          <w:b/>
+          <w:bCs/>
+        </w:rPr>
+        <w:t xml:space="preserve">Kiểm tra ngược:</w:t>
+      </w:r>
+      <w:r>
+        <w:t xml:space="preserve"> IN-01 43 lỗi, 40 bị bắt; IN-02 33/33; IN-03 25 lỗi, 23 bị bắt ("vạch chưa đọc ở chỗ khác" được thêm kiểm tra thứ tự trong DOM rồi bị bắt; "tin của mình nằm bên trái" chỉ là CSS, jsdom không tính bố cục, kiểm bằng ảnh Chrome); IN-04 13 lỗi, 10 bị bắt, 3 test được làm chặt rồi bắt đủ; IN-05 16/16; IN-06 27/27.</w:t>
+      </w:r>
+    </w:p>
+    <w:p>
+      <w:pPr>
+        <w:pStyle w:val="ListParagraph"/>
+        <w:numPr>
+          <w:ilvl w:val="0"/>
+          <w:numId w:val="1"/>
+        </w:numPr>
+      </w:pPr>
+      <w:r>
+        <w:rPr>
+          <w:b/>
+          <w:bCs/>
+        </w:rPr>
+        <w:t xml:space="preserve">Chrome thật:</w:t>
+      </w:r>
+      <w:r>
+        <w:t xml:space="preserve"> 1440 / 1024 / 768 / 390px × sáng / tối, đồng hồ cố định 14:05. Các trạng thái lấy từ dữ liệu mẫu bình thường không có, nên kiểm tra IN-06 chạy </w:t>
+      </w:r>
+      <w:r>
+        <w:rPr>
+          <w:rFonts w:ascii="Consolas" w:eastAsia="Consolas" w:hAnsi="Consolas" w:cs="Consolas"/>
+        </w:rPr>
+        <w:t xml:space="preserve">vite</w:t>
+      </w:r>
+      <w:r>
+        <w:t xml:space="preserve"> dev và dùng DevTools Protocol thay file </w:t>
+      </w:r>
+      <w:r>
+        <w:rPr>
+          <w:rFonts w:ascii="Consolas" w:eastAsia="Consolas" w:hAnsi="Consolas" w:cs="Consolas"/>
+        </w:rPr>
+        <w:t xml:space="preserve">inbox.api.ts</w:t>
+      </w:r>
+      <w:r>
+        <w:t xml:space="preserve"> bằng bản chọn trạng thái theo </w:t>
+      </w:r>
+      <w:r>
+        <w:rPr>
+          <w:rFonts w:ascii="Consolas" w:eastAsia="Consolas" w:hAnsi="Consolas" w:cs="Consolas"/>
+        </w:rPr>
+        <w:t xml:space="preserve">#state=…</w:t>
+      </w:r>
+      <w:r>
+        <w:t xml:space="preserve"> (</w:t>
+      </w:r>
+      <w:r>
+        <w:rPr>
+          <w:rFonts w:ascii="Consolas" w:eastAsia="Consolas" w:hAnsi="Consolas" w:cs="Consolas"/>
+        </w:rPr>
+        <w:t xml:space="preserve">Fetch.fulfillRequest</w:t>
+      </w:r>
+      <w:r>
+        <w:t xml:space="preserve">); mã của app không đổi. Ngoại tuyến thì cắt mạng thật bằng </w:t>
+      </w:r>
+      <w:r>
+        <w:rPr>
+          <w:rFonts w:ascii="Consolas" w:eastAsia="Consolas" w:hAnsi="Consolas" w:cs="Consolas"/>
+        </w:rPr>
+        <w:t xml:space="preserve">Network.emulateNetworkConditions</w:t>
+      </w:r>
+      <w:r>
+        <w:t xml:space="preserve">: tin xếp hàng, có mạng lại thì gửi.</w:t>
+      </w:r>
+    </w:p>
+    <w:p>
+      <w:pPr>
+        <w:pStyle w:val="ListParagraph"/>
+        <w:numPr>
+          <w:ilvl w:val="0"/>
+          <w:numId w:val="1"/>
+        </w:numPr>
+      </w:pPr>
+      <w:r>
+        <w:rPr>
+          <w:b/>
+          <w:bCs/>
+        </w:rPr>
+        <w:t xml:space="preserve">Đính chính, bài học lớn nhất của change này:</w:t>
+      </w:r>
+      <w:r>
+        <w:t xml:space="preserve"> commit </w:t>
+      </w:r>
+      <w:r>
+        <w:rPr>
+          <w:rFonts w:ascii="Consolas" w:eastAsia="Consolas" w:hAnsi="Consolas" w:cs="Consolas"/>
+        </w:rPr>
+        <w:t xml:space="preserve">bfddcd3</w:t>
+      </w:r>
+      <w:r>
+        <w:t xml:space="preserve"> (IN-04) ghi "238/238" trong khi một test đỏ. Chuỗi lệnh là </w:t>
+      </w:r>
+      <w:r>
+        <w:rPr>
+          <w:rFonts w:ascii="Consolas" w:eastAsia="Consolas" w:hAnsi="Consolas" w:cs="Consolas"/>
+        </w:rPr>
+        <w:t xml:space="preserve">pnpm test | grep … &amp;&amp; git commit</w:t>
+      </w:r>
+      <w:r>
+        <w:t xml:space="preserve">: mã thoát của cả chuỗi là của </w:t>
+      </w:r>
+      <w:r>
+        <w:rPr>
+          <w:rFonts w:ascii="Consolas" w:eastAsia="Consolas" w:hAnsi="Consolas" w:cs="Consolas"/>
+        </w:rPr>
+        <w:t xml:space="preserve">grep</w:t>
+      </w:r>
+      <w:r>
+        <w:t xml:space="preserve">, không phải của </w:t>
+      </w:r>
+      <w:r>
+        <w:rPr>
+          <w:rFonts w:ascii="Consolas" w:eastAsia="Consolas" w:hAnsi="Consolas" w:cs="Consolas"/>
+        </w:rPr>
+        <w:t xml:space="preserve">pnpm test</w:t>
+      </w:r>
+      <w:r>
+        <w:t xml:space="preserve">, nên test đỏ vẫn commit. Giờ mỗi lệnh kiểm (lint, test, build) chạy riêng và in mã thoát của chính nó trước khi commit.</w:t>
+      </w:r>
+    </w:p>
+    <w:p>
+      <w:pPr>
+        <w:pStyle w:val="ListParagraph"/>
+        <w:numPr>
+          <w:ilvl w:val="0"/>
+          <w:numId w:val="1"/>
+        </w:numPr>
+      </w:pPr>
+      <w:r>
+        <w:rPr>
+          <w:b/>
+          <w:bCs/>
+        </w:rPr>
+        <w:t xml:space="preserve">Bẫy của script kiểm tra:</w:t>
+      </w:r>
+      <w:r>
+        <w:t xml:space="preserve"> truyền thư mục hồ sơ Chrome bằng đường dẫn tương đối thì Chrome không mở cổng điều khiển (hai lần "timed out"); thử tay với đường dẫn tuyệt đối thì lên sau 1 giây. Đổi </w:t>
+      </w:r>
+      <w:r>
+        <w:rPr>
+          <w:rFonts w:ascii="Consolas" w:eastAsia="Consolas" w:hAnsi="Consolas" w:cs="Consolas"/>
+        </w:rPr>
+        <w:t xml:space="preserve">#state=</w:t>
+      </w:r>
+      <w:r>
+        <w:t xml:space="preserve"> trong cùng trang chỉ đổi hash, trang không tải lại nên file thay thế giữ trạng thái cũ; đi qua </w:t>
+      </w:r>
+      <w:r>
+        <w:rPr>
+          <w:rFonts w:ascii="Consolas" w:eastAsia="Consolas" w:hAnsi="Consolas" w:cs="Consolas"/>
+        </w:rPr>
+        <w:t xml:space="preserve">about:blank</w:t>
+      </w:r>
+      <w:r>
+        <w:t xml:space="preserve"> giữa hai lần.</w:t>
+      </w:r>
+    </w:p>
+    <w:p>
+      <w:pPr>
         <w:pBdr>
           <w:bottom w:val="single" w:sz="4" w:space="0" w:color="auto"/>
         </w:pBdr>
@@ -15492,6 +16844,213 @@
       </w:r>
       <w:r>
         <w:t xml:space="preserve"> bấm được? Kể ba thứ người dùng bàn phím và trình đọc màn hình được hưởng.</w:t>
+      </w:r>
+    </w:p>
+    <w:p>
+      <w:pPr>
+        <w:pStyle w:val="ListParagraph"/>
+        <w:numPr>
+          <w:ilvl w:val="0"/>
+          <w:numId w:val="100"/>
+        </w:numPr>
+      </w:pPr>
+      <w:r>
+        <w:t xml:space="preserve">Vì sao bộ lọc của Hộp thư nằm trong URL thay vì trong </w:t>
+      </w:r>
+      <w:r>
+        <w:rPr>
+          <w:rFonts w:ascii="Consolas" w:eastAsia="Consolas" w:hAnsi="Consolas" w:cs="Consolas"/>
+        </w:rPr>
+        <w:t xml:space="preserve">useState</w:t>
+      </w:r>
+      <w:r>
+        <w:t xml:space="preserve">? Kể ba lợi.</w:t>
+      </w:r>
+    </w:p>
+    <w:p>
+      <w:pPr>
+        <w:pStyle w:val="ListParagraph"/>
+        <w:numPr>
+          <w:ilvl w:val="0"/>
+          <w:numId w:val="100"/>
+        </w:numPr>
+      </w:pPr>
+      <w:r>
+        <w:t xml:space="preserve">Canvas vẽ dòng dấu khác nhau cho hai hội thoại cùng loại. Agent chọn quy tắc nào, và vì sao phải ghi lại ở </w:t>
+      </w:r>
+      <w:r>
+        <w:rPr>
+          <w:rFonts w:ascii="Consolas" w:eastAsia="Consolas" w:hAnsi="Consolas" w:cs="Consolas"/>
+        </w:rPr>
+        <w:t xml:space="preserve">tasks.md</w:t>
+      </w:r>
+      <w:r>
+        <w:t xml:space="preserve">?</w:t>
+      </w:r>
+    </w:p>
+    <w:p>
+      <w:pPr>
+        <w:pStyle w:val="ListParagraph"/>
+        <w:numPr>
+          <w:ilvl w:val="0"/>
+          <w:numId w:val="100"/>
+        </w:numPr>
+      </w:pPr>
+      <w:r>
+        <w:t xml:space="preserve">Mở một hội thoại chưa đọc thì những con số nào đổi? Vì sao một mutation phải sửa ba cache?</w:t>
+      </w:r>
+    </w:p>
+    <w:p>
+      <w:pPr>
+        <w:pStyle w:val="ListParagraph"/>
+        <w:numPr>
+          <w:ilvl w:val="0"/>
+          <w:numId w:val="100"/>
+        </w:numPr>
+      </w:pPr>
+      <w:r>
+        <w:t xml:space="preserve">Tin "Đang gửi" hiện ngay nhờ đâu? Khi máy chủ trả lời thì tin đó được thay thế ra sao, và khi lỗi thì sao?</w:t>
+      </w:r>
+    </w:p>
+    <w:p>
+      <w:pPr>
+        <w:pStyle w:val="ListParagraph"/>
+        <w:numPr>
+          <w:ilvl w:val="0"/>
+          <w:numId w:val="100"/>
+        </w:numPr>
+      </w:pPr>
+      <w:r>
+        <w:t xml:space="preserve">Vì sao Enter không được gửi tin khi bộ gõ tiếng Việt đang ghép chữ? Kiểm bằng thuộc tính nào?</w:t>
+      </w:r>
+    </w:p>
+    <w:p>
+      <w:pPr>
+        <w:pStyle w:val="ListParagraph"/>
+        <w:numPr>
+          <w:ilvl w:val="0"/>
+          <w:numId w:val="100"/>
+        </w:numPr>
+      </w:pPr>
+      <w:r>
+        <w:rPr>
+          <w:rFonts w:ascii="Consolas" w:eastAsia="Consolas" w:hAnsi="Consolas" w:cs="Consolas"/>
+        </w:rPr>
+        <w:t xml:space="preserve">display: contents</w:t>
+      </w:r>
+      <w:r>
+        <w:t xml:space="preserve"> làm gì, và vì sao ô soạn trên mobile dùng nó thay vì vẽ thêm một ô nhập thứ hai?</w:t>
+      </w:r>
+    </w:p>
+    <w:p>
+      <w:pPr>
+        <w:pStyle w:val="ListParagraph"/>
+        <w:numPr>
+          <w:ilvl w:val="0"/>
+          <w:numId w:val="100"/>
+        </w:numPr>
+      </w:pPr>
+      <w:r>
+        <w:t xml:space="preserve">Ở 1024px ô trả lời tràn khỏi cột dù thẻ </w:t>
+      </w:r>
+      <w:r>
+        <w:rPr>
+          <w:rFonts w:ascii="Consolas" w:eastAsia="Consolas" w:hAnsi="Consolas" w:cs="Consolas"/>
+        </w:rPr>
+        <w:t xml:space="preserve">section</w:t>
+      </w:r>
+      <w:r>
+        <w:t xml:space="preserve"> có </w:t>
+      </w:r>
+      <w:r>
+        <w:rPr>
+          <w:rFonts w:ascii="Consolas" w:eastAsia="Consolas" w:hAnsi="Consolas" w:cs="Consolas"/>
+        </w:rPr>
+        <w:t xml:space="preserve">min-w-0</w:t>
+      </w:r>
+      <w:r>
+        <w:t xml:space="preserve">. Vì sao, và </w:t>
+      </w:r>
+      <w:r>
+        <w:rPr>
+          <w:rFonts w:ascii="Consolas" w:eastAsia="Consolas" w:hAnsi="Consolas" w:cs="Consolas"/>
+        </w:rPr>
+        <w:t xml:space="preserve">grid-cols-[minmax(0,1fr)]</w:t>
+      </w:r>
+      <w:r>
+        <w:t xml:space="preserve"> sửa thế nào?</w:t>
+      </w:r>
+    </w:p>
+    <w:p>
+      <w:pPr>
+        <w:pStyle w:val="ListParagraph"/>
+        <w:numPr>
+          <w:ilvl w:val="0"/>
+          <w:numId w:val="100"/>
+        </w:numPr>
+      </w:pPr>
+      <w:r>
+        <w:t xml:space="preserve">Khi mất mạng, TanStack Query làm gì với một mutation? Vì sao </w:t>
+      </w:r>
+      <w:r>
+        <w:rPr>
+          <w:rFonts w:ascii="Consolas" w:eastAsia="Consolas" w:hAnsi="Consolas" w:cs="Consolas"/>
+        </w:rPr>
+        <w:t xml:space="preserve">useOnline</w:t>
+      </w:r>
+      <w:r>
+        <w:t xml:space="preserve"> đọc </w:t>
+      </w:r>
+      <w:r>
+        <w:rPr>
+          <w:rFonts w:ascii="Consolas" w:eastAsia="Consolas" w:hAnsi="Consolas" w:cs="Consolas"/>
+        </w:rPr>
+        <w:t xml:space="preserve">onlineManager</w:t>
+      </w:r>
+      <w:r>
+        <w:t xml:space="preserve"> thay vì tự nghe </w:t>
+      </w:r>
+      <w:r>
+        <w:rPr>
+          <w:rFonts w:ascii="Consolas" w:eastAsia="Consolas" w:hAnsi="Consolas" w:cs="Consolas"/>
+        </w:rPr>
+        <w:t xml:space="preserve">navigator.onLine</w:t>
+      </w:r>
+      <w:r>
+        <w:t xml:space="preserve">?</w:t>
+      </w:r>
+    </w:p>
+    <w:p>
+      <w:pPr>
+        <w:pStyle w:val="ListParagraph"/>
+        <w:numPr>
+          <w:ilvl w:val="0"/>
+          <w:numId w:val="100"/>
+        </w:numPr>
+      </w:pPr>
+      <w:r>
+        <w:t xml:space="preserve">Vì sao không hiện câu "Bấm N ở bất cứ đâu để kết nối nhanh" dù canvas có?</w:t>
+      </w:r>
+    </w:p>
+    <w:p>
+      <w:pPr>
+        <w:pStyle w:val="ListParagraph"/>
+        <w:numPr>
+          <w:ilvl w:val="0"/>
+          <w:numId w:val="100"/>
+        </w:numPr>
+      </w:pPr>
+      <w:r>
+        <w:t xml:space="preserve">Commit </w:t>
+      </w:r>
+      <w:r>
+        <w:rPr>
+          <w:rFonts w:ascii="Consolas" w:eastAsia="Consolas" w:hAnsi="Consolas" w:cs="Consolas"/>
+        </w:rPr>
+        <w:t xml:space="preserve">bfddcd3</w:t>
+      </w:r>
+      <w:r>
+        <w:t xml:space="preserve"> ghi 238/238 trong khi một test đỏ. Chuỗi lệnh sai ở đâu, và giờ kiểm thế nào trước khi commit?</w:t>
       </w:r>
     </w:p>
     <w:p/>

</xml_diff>

<commit_message>
docs(fe-05): web README for sign-in and the API, Phase 1 guide section 9
The README says the web now needs the backend to sign in, how requests
go through the API client, and which screens use the API or sample
data (D-56). The Phase 1 guide gets section 9 on wiring the web to the
API (FE-02…FE-04, AC-06, FE-30) with questions 67-76; Word file
regenerated, docs check clean. The FE-05 real run waits for a complete
.env.

Co-Authored-By: Claude Opus 5.5 (1M context) <noreply@anthropic.com>
</commit_message>
<xml_diff>
--- a/docs/knowledge/phase-1-frontend-foundation.docx
+++ b/docs/knowledge/phase-1-frontend-foundation.docx
@@ -133,7 +133,7 @@
         <w:t xml:space="preserve">openspec/changes/fe-ui-connect</w:t>
       </w:r>
       <w:r>
-        <w:t xml:space="preserve"> (luồng kết nối tài khoản) và change </w:t>
+        <w:t xml:space="preserve"> (luồng kết nối tài khoản) change </w:t>
       </w:r>
       <w:r>
         <w:rPr>
@@ -142,7 +142,7 @@
         <w:t xml:space="preserve">openspec/changes/fe-ui-inbox</w:t>
       </w:r>
       <w:r>
-        <w:t xml:space="preserve"> (màn Hộp thư). Đã xong: BE-27, BE-28, BE-29, FE-01, UI-01, UI-02, UI-03, AC-01, AC-02, AC-03, AC-04, CN-01, CN-02, CN-03, IN-01…IN-06.</w:t>
+        <w:t xml:space="preserve"> (màn Hộp thư), rồi nối web vào API (FE-02…FE-04, AC-06, FE-30 = CN-05; D-56). Đã xong: BE-27, BE-28, BE-29, FE-01, FE-02, FE-03, FE-04, UI-01, UI-02, UI-03, AC-01…AC-04, AC-06, CN-01…CN-03, CN-05, IN-01…IN-06.</w:t>
         <w:br/>
       </w:r>
       <w:r>
@@ -15626,6 +15626,1748 @@
     </w:p>
     <w:p>
       <w:pPr>
+        <w:pStyle w:val="Heading2"/>
+      </w:pPr>
+      <w:r>
+        <w:t xml:space="preserve">9. Nối web vào API (FE-02, FE-03, FE-04, AC-06, FE-30)</w:t>
+      </w:r>
+    </w:p>
+    <w:p>
+      <w:pPr>
+        <w:pStyle w:val="Heading3"/>
+      </w:pPr>
+      <w:r>
+        <w:t xml:space="preserve">9.0 Bức tranh: một request đi qua những đâu</w:t>
+      </w:r>
+    </w:p>
+    <w:p>
+      <w:pPr>
+        <w:pStyle w:val="ListParagraph"/>
+        <w:numPr>
+          <w:ilvl w:val="0"/>
+          <w:numId w:val="1"/>
+        </w:numPr>
+      </w:pPr>
+      <w:r>
+        <w:rPr>
+          <w:b/>
+          <w:bCs/>
+        </w:rPr>
+        <w:t xml:space="preserve">Ở đâu:</w:t>
+      </w:r>
+      <w:r>
+        <w:t xml:space="preserve"> </w:t>
+      </w:r>
+      <w:r>
+        <w:rPr>
+          <w:rFonts w:ascii="Consolas" w:eastAsia="Consolas" w:hAnsi="Consolas" w:cs="Consolas"/>
+        </w:rPr>
+        <w:t xml:space="preserve">src/shared/api/client.ts</w:t>
+      </w:r>
+      <w:r>
+        <w:t xml:space="preserve">, </w:t>
+      </w:r>
+      <w:r>
+        <w:rPr>
+          <w:rFonts w:ascii="Consolas" w:eastAsia="Consolas" w:hAnsi="Consolas" w:cs="Consolas"/>
+        </w:rPr>
+        <w:t xml:space="preserve">problem.ts</w:t>
+      </w:r>
+      <w:r>
+        <w:t xml:space="preserve">; </w:t>
+      </w:r>
+      <w:r>
+        <w:rPr>
+          <w:rFonts w:ascii="Consolas" w:eastAsia="Consolas" w:hAnsi="Consolas" w:cs="Consolas"/>
+        </w:rPr>
+        <w:t xml:space="preserve">src/features/auth/</w:t>
+      </w:r>
+      <w:r>
+        <w:t xml:space="preserve">; </w:t>
+      </w:r>
+      <w:r>
+        <w:rPr>
+          <w:rFonts w:ascii="Consolas" w:eastAsia="Consolas" w:hAnsi="Consolas" w:cs="Consolas"/>
+        </w:rPr>
+        <w:t xml:space="preserve">src/app/queryClient.ts</w:t>
+      </w:r>
+      <w:r>
+        <w:t xml:space="preserve">; </w:t>
+      </w:r>
+      <w:r>
+        <w:rPr>
+          <w:rFonts w:ascii="Consolas" w:eastAsia="Consolas" w:hAnsi="Consolas" w:cs="Consolas"/>
+        </w:rPr>
+        <w:t xml:space="preserve">src/app/shell/UserMenu.tsx</w:t>
+      </w:r>
+      <w:r>
+        <w:t xml:space="preserve">, </w:t>
+      </w:r>
+      <w:r>
+        <w:rPr>
+          <w:rFonts w:ascii="Consolas" w:eastAsia="Consolas" w:hAnsi="Consolas" w:cs="Consolas"/>
+        </w:rPr>
+        <w:t xml:space="preserve">MorePage.tsx</w:t>
+      </w:r>
+      <w:r>
+        <w:t xml:space="preserve">; </w:t>
+      </w:r>
+      <w:r>
+        <w:rPr>
+          <w:rFonts w:ascii="Consolas" w:eastAsia="Consolas" w:hAnsi="Consolas" w:cs="Consolas"/>
+        </w:rPr>
+        <w:t xml:space="preserve">src/features/accounts/accounts.api.ts</w:t>
+      </w:r>
+      <w:r>
+        <w:t xml:space="preserve">.</w:t>
+      </w:r>
+    </w:p>
+    <w:p>
+      <w:pPr>
+        <w:pStyle w:val="ListParagraph"/>
+        <w:numPr>
+          <w:ilvl w:val="0"/>
+          <w:numId w:val="1"/>
+        </w:numPr>
+      </w:pPr>
+      <w:r>
+        <w:rPr>
+          <w:b/>
+          <w:bCs/>
+        </w:rPr>
+        <w:t xml:space="preserve">Là gì:</w:t>
+      </w:r>
+      <w:r>
+        <w:t xml:space="preserve"> web thôi chạy hoàn toàn bằng dữ liệu mẫu. Đăng nhập, menu người dùng, màn Tài khoản và luồng kết nối gọi backend thật; Tổng quan, Hộp thư và các con số của khung app vẫn là dữ liệu mẫu vì backend chưa có (D-56).</w:t>
+      </w:r>
+    </w:p>
+    <w:p>
+      <w:pPr>
+        <w:shd w:val="clear" w:color="auto" w:fill="F2F3F5"/>
+        <w:ind w:left="0"/>
+      </w:pPr>
+      <w:r>
+        <w:rPr>
+          <w:rFonts w:ascii="Consolas" w:eastAsia="Consolas" w:hAnsi="Consolas" w:cs="Consolas"/>
+          <w:sz w:val="19"/>
+          <w:szCs w:val="19"/>
+        </w:rPr>
+        <w:t xml:space="preserve">component -&gt; hook (TanStack) -&gt; *.api.ts -&gt; shared/api/client.ts -&gt; /api/...</w:t>
+        <w:br/>
+        <w:t xml:space="preserve">                                   |   (Vite chuyển sang :8080 khi dev)</w:t>
+        <w:br/>
+        <w:t xml:space="preserve">                                   +-&gt; đổi câu trả lời sang hợp đồng của màn</w:t>
+        <w:br/>
+        <w:t xml:space="preserve">                                       (trường API chưa có = null, màn bỏ qua)</w:t>
+        <w:br/>
+        <w:t xml:space="preserve">lỗi: Problem Details -&gt; ApiError { status, code, detail, errors, extra }</w:t>
+        <w:br/>
+        <w:t xml:space="preserve">403 CSRF_TOKEN_INVALID -&gt; GET /api/auth/me -&gt; gửi lại đúng 1 lần</w:t>
+        <w:br/>
+        <w:t xml:space="preserve">401 ngoài /api/auth/* -&gt; forgetSession -&gt; /login?returnTo=&lt;trang&gt;</w:t>
+      </w:r>
+    </w:p>
+    <w:p>
+      <w:pPr>
+        <w:pStyle w:val="ListParagraph"/>
+        <w:numPr>
+          <w:ilvl w:val="0"/>
+          <w:numId w:val="1"/>
+        </w:numPr>
+      </w:pPr>
+      <w:r>
+        <w:rPr>
+          <w:b/>
+          <w:bCs/>
+        </w:rPr>
+        <w:t xml:space="preserve">D-56 (người dùng chốt A):</w:t>
+      </w:r>
+      <w:r>
+        <w:t xml:space="preserve"> mỗi màn tự đổi dữ liệu trong </w:t>
+      </w:r>
+      <w:r>
+        <w:rPr>
+          <w:rFonts w:ascii="Consolas" w:eastAsia="Consolas" w:hAnsi="Consolas" w:cs="Consolas"/>
+        </w:rPr>
+        <w:t xml:space="preserve">*.api.ts</w:t>
+      </w:r>
+      <w:r>
+        <w:t xml:space="preserve"> của nó; backend thêm trường khi có feature. </w:t>
+      </w:r>
+      <w:r>
+        <w:rPr>
+          <w:b/>
+          <w:bCs/>
+        </w:rPr>
+        <w:t xml:space="preserve">Phương án bị loại:</w:t>
+      </w:r>
+      <w:r>
+        <w:t xml:space="preserve"> bắt backend trả đủ hợp đồng ngay, trong khi nhiều trường chưa có nguồn dữ liệu (số tin đã lưu cần module tin nhắn, tiến độ đồng bộ cần F04b/F07): như thế là bịa số.</w:t>
+      </w:r>
+    </w:p>
+    <w:p>
+      <w:pPr>
+        <w:pStyle w:val="Heading3"/>
+      </w:pPr>
+      <w:r>
+        <w:t xml:space="preserve">9.1 API client (FE-02)</w:t>
+      </w:r>
+    </w:p>
+    <w:p>
+      <w:pPr>
+        <w:pStyle w:val="ListParagraph"/>
+        <w:numPr>
+          <w:ilvl w:val="0"/>
+          <w:numId w:val="1"/>
+        </w:numPr>
+      </w:pPr>
+      <w:r>
+        <w:rPr>
+          <w:b/>
+          <w:bCs/>
+        </w:rPr>
+        <w:t xml:space="preserve">CSRF kiểu "cookie gửi đôi":</w:t>
+      </w:r>
+      <w:r>
+        <w:t xml:space="preserve"> backend đặt cookie </w:t>
+      </w:r>
+      <w:r>
+        <w:rPr>
+          <w:rFonts w:ascii="Consolas" w:eastAsia="Consolas" w:hAnsi="Consolas" w:cs="Consolas"/>
+        </w:rPr>
+        <w:t xml:space="preserve">XSRF-TOKEN</w:t>
+      </w:r>
+      <w:r>
+        <w:t xml:space="preserve"> mà JavaScript đọc được; mỗi request thay đổi dữ liệu (</w:t>
+      </w:r>
+      <w:r>
+        <w:rPr>
+          <w:rFonts w:ascii="Consolas" w:eastAsia="Consolas" w:hAnsi="Consolas" w:cs="Consolas"/>
+        </w:rPr>
+        <w:t xml:space="preserve">POST</w:t>
+      </w:r>
+      <w:r>
+        <w:t xml:space="preserve">, </w:t>
+      </w:r>
+      <w:r>
+        <w:rPr>
+          <w:rFonts w:ascii="Consolas" w:eastAsia="Consolas" w:hAnsi="Consolas" w:cs="Consolas"/>
+        </w:rPr>
+        <w:t xml:space="preserve">PATCH</w:t>
+      </w:r>
+      <w:r>
+        <w:t xml:space="preserve">, </w:t>
+      </w:r>
+      <w:r>
+        <w:rPr>
+          <w:rFonts w:ascii="Consolas" w:eastAsia="Consolas" w:hAnsi="Consolas" w:cs="Consolas"/>
+        </w:rPr>
+        <w:t xml:space="preserve">DELETE</w:t>
+      </w:r>
+      <w:r>
+        <w:t xml:space="preserve">) gửi lại giá trị đó trong header </w:t>
+      </w:r>
+      <w:r>
+        <w:rPr>
+          <w:rFonts w:ascii="Consolas" w:eastAsia="Consolas" w:hAnsi="Consolas" w:cs="Consolas"/>
+        </w:rPr>
+        <w:t xml:space="preserve">X-XSRF-TOKEN</w:t>
+      </w:r>
+      <w:r>
+        <w:t xml:space="preserve">. Trang lạ có thể khiến trình duyệt gửi cookie đi kèm, nhưng không đọc được cookie của Sino nên không viết được header đúng (mục 2 của file này). </w:t>
+      </w:r>
+      <w:r>
+        <w:rPr>
+          <w:rFonts w:ascii="Consolas" w:eastAsia="Consolas" w:hAnsi="Consolas" w:cs="Consolas"/>
+        </w:rPr>
+        <w:t xml:space="preserve">GET</w:t>
+      </w:r>
+      <w:r>
+        <w:t xml:space="preserve"> không gửi header.</w:t>
+      </w:r>
+    </w:p>
+    <w:p>
+      <w:pPr>
+        <w:pStyle w:val="ListParagraph"/>
+        <w:numPr>
+          <w:ilvl w:val="0"/>
+          <w:numId w:val="1"/>
+        </w:numPr>
+      </w:pPr>
+      <w:r>
+        <w:rPr>
+          <w:b/>
+          <w:bCs/>
+        </w:rPr>
+        <w:t xml:space="preserve">Token cũ:</w:t>
+      </w:r>
+      <w:r>
+        <w:t xml:space="preserve"> sau khi đăng nhập hay đăng xuất, token đổi. Gặp </w:t>
+      </w:r>
+      <w:r>
+        <w:rPr>
+          <w:rFonts w:ascii="Consolas" w:eastAsia="Consolas" w:hAnsi="Consolas" w:cs="Consolas"/>
+        </w:rPr>
+        <w:t xml:space="preserve">403 CSRF_TOKEN_INVALID</w:t>
+      </w:r>
+      <w:r>
+        <w:t xml:space="preserve"> thì client gọi </w:t>
+      </w:r>
+      <w:r>
+        <w:rPr>
+          <w:rFonts w:ascii="Consolas" w:eastAsia="Consolas" w:hAnsi="Consolas" w:cs="Consolas"/>
+        </w:rPr>
+        <w:t xml:space="preserve">GET /api/auth/me</w:t>
+      </w:r>
+      <w:r>
+        <w:t xml:space="preserve"> (câu trả lời nào cũng đặt cookie mới, kể cả 401) rồi gửi lại </w:t>
+      </w:r>
+      <w:r>
+        <w:rPr>
+          <w:b/>
+          <w:bCs/>
+        </w:rPr>
+        <w:t xml:space="preserve">một</w:t>
+      </w:r>
+      <w:r>
+        <w:t xml:space="preserve"> lần. Thử lại vô hạn thì một token hỏng sẽ thành vòng lặp không dừng.</w:t>
+      </w:r>
+    </w:p>
+    <w:p>
+      <w:pPr>
+        <w:pStyle w:val="ListParagraph"/>
+        <w:numPr>
+          <w:ilvl w:val="0"/>
+          <w:numId w:val="1"/>
+        </w:numPr>
+      </w:pPr>
+      <w:r>
+        <w:rPr>
+          <w:b/>
+          <w:bCs/>
+        </w:rPr>
+        <w:t xml:space="preserve">Một kiểu lỗi chung:</w:t>
+      </w:r>
+      <w:r>
+        <w:t xml:space="preserve"> mọi lỗi thành </w:t>
+      </w:r>
+      <w:r>
+        <w:rPr>
+          <w:rFonts w:ascii="Consolas" w:eastAsia="Consolas" w:hAnsi="Consolas" w:cs="Consolas"/>
+        </w:rPr>
+        <w:t xml:space="preserve">ApiError</w:t>
+      </w:r>
+      <w:r>
+        <w:t xml:space="preserve"> với </w:t>
+      </w:r>
+      <w:r>
+        <w:rPr>
+          <w:rFonts w:ascii="Consolas" w:eastAsia="Consolas" w:hAnsi="Consolas" w:cs="Consolas"/>
+        </w:rPr>
+        <w:t xml:space="preserve">status</w:t>
+      </w:r>
+      <w:r>
+        <w:t xml:space="preserve">, </w:t>
+      </w:r>
+      <w:r>
+        <w:rPr>
+          <w:rFonts w:ascii="Consolas" w:eastAsia="Consolas" w:hAnsi="Consolas" w:cs="Consolas"/>
+        </w:rPr>
+        <w:t xml:space="preserve">code</w:t>
+      </w:r>
+      <w:r>
+        <w:t xml:space="preserve"> (mã ổn định trong catalog của backend), </w:t>
+      </w:r>
+      <w:r>
+        <w:rPr>
+          <w:rFonts w:ascii="Consolas" w:eastAsia="Consolas" w:hAnsi="Consolas" w:cs="Consolas"/>
+        </w:rPr>
+        <w:t xml:space="preserve">detail</w:t>
+      </w:r>
+      <w:r>
+        <w:t xml:space="preserve">, </w:t>
+      </w:r>
+      <w:r>
+        <w:rPr>
+          <w:rFonts w:ascii="Consolas" w:eastAsia="Consolas" w:hAnsi="Consolas" w:cs="Consolas"/>
+        </w:rPr>
+        <w:t xml:space="preserve">errors</w:t>
+      </w:r>
+      <w:r>
+        <w:t xml:space="preserve"> (lỗi từng trường của validation) và </w:t>
+      </w:r>
+      <w:r>
+        <w:rPr>
+          <w:rFonts w:ascii="Consolas" w:eastAsia="Consolas" w:hAnsi="Consolas" w:cs="Consolas"/>
+        </w:rPr>
+        <w:t xml:space="preserve">extra</w:t>
+      </w:r>
+      <w:r>
+        <w:t xml:space="preserve"> (thành viên khác như </w:t>
+      </w:r>
+      <w:r>
+        <w:rPr>
+          <w:rFonts w:ascii="Consolas" w:eastAsia="Consolas" w:hAnsi="Consolas" w:cs="Consolas"/>
+        </w:rPr>
+        <w:t xml:space="preserve">remainingAttempts</w:t>
+      </w:r>
+      <w:r>
+        <w:t xml:space="preserve">). Không ai trả lời (mạng, máy chủ tắt) thì </w:t>
+      </w:r>
+      <w:r>
+        <w:rPr>
+          <w:rFonts w:ascii="Consolas" w:eastAsia="Consolas" w:hAnsi="Consolas" w:cs="Consolas"/>
+        </w:rPr>
+        <w:t xml:space="preserve">status</w:t>
+      </w:r>
+      <w:r>
+        <w:t xml:space="preserve"> 0, </w:t>
+      </w:r>
+      <w:r>
+        <w:rPr>
+          <w:rFonts w:ascii="Consolas" w:eastAsia="Consolas" w:hAnsi="Consolas" w:cs="Consolas"/>
+        </w:rPr>
+        <w:t xml:space="preserve">code</w:t>
+      </w:r>
+      <w:r>
+        <w:t xml:space="preserve"> </w:t>
+      </w:r>
+      <w:r>
+        <w:rPr>
+          <w:rFonts w:ascii="Consolas" w:eastAsia="Consolas" w:hAnsi="Consolas" w:cs="Consolas"/>
+        </w:rPr>
+        <w:t xml:space="preserve">NETWORK_ERROR</w:t>
+      </w:r>
+      <w:r>
+        <w:t xml:space="preserve">. Trang lỗi của proxy (không phải Problem Details) thì </w:t>
+      </w:r>
+      <w:r>
+        <w:rPr>
+          <w:rFonts w:ascii="Consolas" w:eastAsia="Consolas" w:hAnsi="Consolas" w:cs="Consolas"/>
+        </w:rPr>
+        <w:t xml:space="preserve">code</w:t>
+      </w:r>
+      <w:r>
+        <w:t xml:space="preserve"> là </w:t>
+      </w:r>
+      <w:r>
+        <w:rPr>
+          <w:rFonts w:ascii="Consolas" w:eastAsia="Consolas" w:hAnsi="Consolas" w:cs="Consolas"/>
+        </w:rPr>
+        <w:t xml:space="preserve">HTTP_502</w:t>
+      </w:r>
+      <w:r>
+        <w:t xml:space="preserve">…</w:t>
+      </w:r>
+    </w:p>
+    <w:p>
+      <w:pPr>
+        <w:pStyle w:val="ListParagraph"/>
+        <w:numPr>
+          <w:ilvl w:val="0"/>
+          <w:numId w:val="1"/>
+        </w:numPr>
+      </w:pPr>
+      <w:r>
+        <w:rPr>
+          <w:b/>
+          <w:bCs/>
+        </w:rPr>
+        <w:t xml:space="preserve">Bẫy, </w:t>
+      </w:r>
+      <w:r>
+        <w:rPr>
+          <w:rFonts w:ascii="Consolas" w:eastAsia="Consolas" w:hAnsi="Consolas" w:cs="Consolas"/>
+          <w:b/>
+          <w:bCs/>
+        </w:rPr>
+        <w:t xml:space="preserve">erasableSyntaxOnly</w:t>
+      </w:r>
+      <w:r>
+        <w:rPr>
+          <w:b/>
+          <w:bCs/>
+        </w:rPr>
+        <w:t xml:space="preserve">:</w:t>
+      </w:r>
+      <w:r>
+        <w:t xml:space="preserve"> </w:t>
+      </w:r>
+      <w:r>
+        <w:rPr>
+          <w:rFonts w:ascii="Consolas" w:eastAsia="Consolas" w:hAnsi="Consolas" w:cs="Consolas"/>
+        </w:rPr>
+        <w:t xml:space="preserve">constructor(readonly status: number)</w:t>
+      </w:r>
+      <w:r>
+        <w:t xml:space="preserve"> bị </w:t>
+      </w:r>
+      <w:r>
+        <w:rPr>
+          <w:rFonts w:ascii="Consolas" w:eastAsia="Consolas" w:hAnsi="Consolas" w:cs="Consolas"/>
+        </w:rPr>
+        <w:t xml:space="preserve">tsc -b</w:t>
+      </w:r>
+      <w:r>
+        <w:t xml:space="preserve"> báo TS1294. Cờ này chỉ cho cú pháp TypeScript "xóa đi là thành JavaScript"; thuộc tính khai trong tham số constructor lại sinh ra code gán, nên phải khai field rồi gán tay.</w:t>
+      </w:r>
+    </w:p>
+    <w:p>
+      <w:pPr>
+        <w:pStyle w:val="ListParagraph"/>
+        <w:numPr>
+          <w:ilvl w:val="0"/>
+          <w:numId w:val="1"/>
+        </w:numPr>
+      </w:pPr>
+      <w:r>
+        <w:rPr>
+          <w:b/>
+          <w:bCs/>
+        </w:rPr>
+        <w:t xml:space="preserve">Bẫy, địa chỉ tương đối trong test:</w:t>
+      </w:r>
+      <w:r>
+        <w:t xml:space="preserve"> </w:t>
+      </w:r>
+      <w:r>
+        <w:rPr>
+          <w:rFonts w:ascii="Consolas" w:eastAsia="Consolas" w:hAnsi="Consolas" w:cs="Consolas"/>
+        </w:rPr>
+        <w:t xml:space="preserve">fetch('/api/...')</w:t>
+      </w:r>
+      <w:r>
+        <w:t xml:space="preserve"> chạy được trên trình duyệt nhưng </w:t>
+      </w:r>
+      <w:r>
+        <w:rPr>
+          <w:rFonts w:ascii="Consolas" w:eastAsia="Consolas" w:hAnsi="Consolas" w:cs="Consolas"/>
+        </w:rPr>
+        <w:t xml:space="preserve">fetch</w:t>
+      </w:r>
+      <w:r>
+        <w:t xml:space="preserve"> của Node (môi trường test) không tự hiểu đường dẫn tương đối; client dùng </w:t>
+      </w:r>
+      <w:r>
+        <w:rPr>
+          <w:rFonts w:ascii="Consolas" w:eastAsia="Consolas" w:hAnsi="Consolas" w:cs="Consolas"/>
+        </w:rPr>
+        <w:t xml:space="preserve">new URL(path, window.location.origin)</w:t>
+      </w:r>
+      <w:r>
+        <w:t xml:space="preserve">.</w:t>
+      </w:r>
+    </w:p>
+    <w:p>
+      <w:pPr>
+        <w:pStyle w:val="Heading3"/>
+      </w:pPr>
+      <w:r>
+        <w:t xml:space="preserve">9.2 Đăng nhập (FE-03)</w:t>
+      </w:r>
+    </w:p>
+    <w:p>
+      <w:pPr>
+        <w:pStyle w:val="ListParagraph"/>
+        <w:numPr>
+          <w:ilvl w:val="0"/>
+          <w:numId w:val="1"/>
+        </w:numPr>
+      </w:pPr>
+      <w:r>
+        <w:rPr>
+          <w:b/>
+          <w:bCs/>
+        </w:rPr>
+        <w:t xml:space="preserve">Chốt chặn là một route bố cục:</w:t>
+      </w:r>
+      <w:r>
+        <w:t xml:space="preserve"> </w:t>
+      </w:r>
+      <w:r>
+        <w:rPr>
+          <w:rFonts w:ascii="Consolas" w:eastAsia="Consolas" w:hAnsi="Consolas" w:cs="Consolas"/>
+        </w:rPr>
+        <w:t xml:space="preserve">RequireAuth</w:t>
+      </w:r>
+      <w:r>
+        <w:t xml:space="preserve"> bọc mọi trang của khung app; </w:t>
+      </w:r>
+      <w:r>
+        <w:rPr>
+          <w:rFonts w:ascii="Consolas" w:eastAsia="Consolas" w:hAnsi="Consolas" w:cs="Consolas"/>
+        </w:rPr>
+        <w:t xml:space="preserve">/login</w:t>
+      </w:r>
+      <w:r>
+        <w:t xml:space="preserve"> và trang 404 nằm ngoài. Nó hỏi </w:t>
+      </w:r>
+      <w:r>
+        <w:rPr>
+          <w:rFonts w:ascii="Consolas" w:eastAsia="Consolas" w:hAnsi="Consolas" w:cs="Consolas"/>
+        </w:rPr>
+        <w:t xml:space="preserve">GET /api/auth/me</w:t>
+      </w:r>
+      <w:r>
+        <w:t xml:space="preserve"> một lần: đang hỏi thì hiện màn chờ, </w:t>
+      </w:r>
+      <w:r>
+        <w:rPr>
+          <w:rFonts w:ascii="Consolas" w:eastAsia="Consolas" w:hAnsi="Consolas" w:cs="Consolas"/>
+        </w:rPr>
+        <w:t xml:space="preserve">401</w:t>
+      </w:r>
+      <w:r>
+        <w:t xml:space="preserve"> thì chuyển </w:t>
+      </w:r>
+      <w:r>
+        <w:rPr>
+          <w:rFonts w:ascii="Consolas" w:eastAsia="Consolas" w:hAnsi="Consolas" w:cs="Consolas"/>
+        </w:rPr>
+        <w:t xml:space="preserve">/login?returnTo=&lt;trang + query&gt;</w:t>
+      </w:r>
+      <w:r>
+        <w:t xml:space="preserve">, không gọi được máy chủ thì "Không mở được Sino" và "Thử lại".</w:t>
+      </w:r>
+    </w:p>
+    <w:p>
+      <w:pPr>
+        <w:pStyle w:val="ListParagraph"/>
+        <w:numPr>
+          <w:ilvl w:val="0"/>
+          <w:numId w:val="1"/>
+        </w:numPr>
+      </w:pPr>
+      <w:r>
+        <w:rPr>
+          <w:rFonts w:ascii="Consolas" w:eastAsia="Consolas" w:hAnsi="Consolas" w:cs="Consolas"/>
+          <w:b/>
+          <w:bCs/>
+        </w:rPr>
+        <w:t xml:space="preserve">401</w:t>
+      </w:r>
+      <w:r>
+        <w:rPr>
+          <w:b/>
+          <w:bCs/>
+        </w:rPr>
+        <w:t xml:space="preserve"> ở </w:t>
+      </w:r>
+      <w:r>
+        <w:rPr>
+          <w:rFonts w:ascii="Consolas" w:eastAsia="Consolas" w:hAnsi="Consolas" w:cs="Consolas"/>
+          <w:b/>
+          <w:bCs/>
+        </w:rPr>
+        <w:t xml:space="preserve">/me</w:t>
+      </w:r>
+      <w:r>
+        <w:rPr>
+          <w:b/>
+          <w:bCs/>
+        </w:rPr>
+        <w:t xml:space="preserve"> là câu trả lời, không phải lỗi:</w:t>
+      </w:r>
+      <w:r>
+        <w:t xml:space="preserve"> </w:t>
+      </w:r>
+      <w:r>
+        <w:rPr>
+          <w:rFonts w:ascii="Consolas" w:eastAsia="Consolas" w:hAnsi="Consolas" w:cs="Consolas"/>
+        </w:rPr>
+        <w:t xml:space="preserve">fetchMe</w:t>
+      </w:r>
+      <w:r>
+        <w:t xml:space="preserve"> trả </w:t>
+      </w:r>
+      <w:r>
+        <w:rPr>
+          <w:rFonts w:ascii="Consolas" w:eastAsia="Consolas" w:hAnsi="Consolas" w:cs="Consolas"/>
+        </w:rPr>
+        <w:t xml:space="preserve">null</w:t>
+      </w:r>
+      <w:r>
+        <w:t xml:space="preserve"> ("chưa ai đăng nhập"), nên TanStack Query không coi đó là thất bại.</w:t>
+      </w:r>
+    </w:p>
+    <w:p>
+      <w:pPr>
+        <w:pStyle w:val="ListParagraph"/>
+        <w:numPr>
+          <w:ilvl w:val="0"/>
+          <w:numId w:val="1"/>
+        </w:numPr>
+      </w:pPr>
+      <w:r>
+        <w:rPr>
+          <w:rFonts w:ascii="Consolas" w:eastAsia="Consolas" w:hAnsi="Consolas" w:cs="Consolas"/>
+          <w:b/>
+          <w:bCs/>
+        </w:rPr>
+        <w:t xml:space="preserve">returnTo</w:t>
+      </w:r>
+      <w:r>
+        <w:rPr>
+          <w:b/>
+          <w:bCs/>
+        </w:rPr>
+        <w:t xml:space="preserve"> an toàn:</w:t>
+      </w:r>
+      <w:r>
+        <w:t xml:space="preserve"> chỉ nhận đường dẫn của app. </w:t>
+      </w:r>
+      <w:r>
+        <w:rPr>
+          <w:rFonts w:ascii="Consolas" w:eastAsia="Consolas" w:hAnsi="Consolas" w:cs="Consolas"/>
+        </w:rPr>
+        <w:t xml:space="preserve">//evil.example</w:t>
+      </w:r>
+      <w:r>
+        <w:t xml:space="preserve"> bắt đầu bằng </w:t>
+      </w:r>
+      <w:r>
+        <w:rPr>
+          <w:rFonts w:ascii="Consolas" w:eastAsia="Consolas" w:hAnsi="Consolas" w:cs="Consolas"/>
+        </w:rPr>
+        <w:t xml:space="preserve">/</w:t>
+      </w:r>
+      <w:r>
+        <w:t xml:space="preserve"> nhưng trình duyệt hiểu là một trang khác (đường dẫn "không giao thức"); </w:t>
+      </w:r>
+      <w:r>
+        <w:rPr>
+          <w:rFonts w:ascii="Consolas" w:eastAsia="Consolas" w:hAnsi="Consolas" w:cs="Consolas"/>
+        </w:rPr>
+        <w:t xml:space="preserve">/\evil.example</w:t>
+      </w:r>
+      <w:r>
+        <w:t xml:space="preserve"> cũng vậy với vài trình duyệt; còn </w:t>
+      </w:r>
+      <w:r>
+        <w:rPr>
+          <w:rFonts w:ascii="Consolas" w:eastAsia="Consolas" w:hAnsi="Consolas" w:cs="Consolas"/>
+        </w:rPr>
+        <w:t xml:space="preserve">returnTo=/login</w:t>
+      </w:r>
+      <w:r>
+        <w:t xml:space="preserve"> sẽ thành vòng lặp. Mọi trường hợp đó về </w:t>
+      </w:r>
+      <w:r>
+        <w:rPr>
+          <w:rFonts w:ascii="Consolas" w:eastAsia="Consolas" w:hAnsi="Consolas" w:cs="Consolas"/>
+        </w:rPr>
+        <w:t xml:space="preserve">/overview</w:t>
+      </w:r>
+      <w:r>
+        <w:t xml:space="preserve">.</w:t>
+      </w:r>
+    </w:p>
+    <w:p>
+      <w:pPr>
+        <w:pStyle w:val="ListParagraph"/>
+        <w:numPr>
+          <w:ilvl w:val="0"/>
+          <w:numId w:val="1"/>
+        </w:numPr>
+      </w:pPr>
+      <w:r>
+        <w:rPr>
+          <w:b/>
+          <w:bCs/>
+        </w:rPr>
+        <w:t xml:space="preserve">Sai mật khẩu:</w:t>
+      </w:r>
+      <w:r>
+        <w:t xml:space="preserve"> xóa và focus lại ô mật khẩu, giữ email, </w:t>
+      </w:r>
+      <w:r>
+        <w:rPr>
+          <w:rFonts w:ascii="Consolas" w:eastAsia="Consolas" w:hAnsi="Consolas" w:cs="Consolas"/>
+        </w:rPr>
+        <w:t xml:space="preserve">aria-invalid</w:t>
+      </w:r>
+      <w:r>
+        <w:t xml:space="preserve"> cho ô mật khẩu; câu báo đọc </w:t>
+      </w:r>
+      <w:r>
+        <w:rPr>
+          <w:rFonts w:ascii="Consolas" w:eastAsia="Consolas" w:hAnsi="Consolas" w:cs="Consolas"/>
+        </w:rPr>
+        <w:t xml:space="preserve">remainingAttempts</w:t>
+      </w:r>
+      <w:r>
+        <w:t xml:space="preserve"> ("Còn 4 lần thử trước khi phải đợi 15 phút."), bị khóa thì đọc </w:t>
+      </w:r>
+      <w:r>
+        <w:rPr>
+          <w:rFonts w:ascii="Consolas" w:eastAsia="Consolas" w:hAnsi="Consolas" w:cs="Consolas"/>
+        </w:rPr>
+        <w:t xml:space="preserve">retryAfterSeconds</w:t>
+      </w:r>
+      <w:r>
+        <w:t xml:space="preserve"> (làm tròn lên phút).</w:t>
+      </w:r>
+    </w:p>
+    <w:p>
+      <w:pPr>
+        <w:pStyle w:val="ListParagraph"/>
+        <w:numPr>
+          <w:ilvl w:val="0"/>
+          <w:numId w:val="1"/>
+        </w:numPr>
+      </w:pPr>
+      <w:r>
+        <w:rPr>
+          <w:b/>
+          <w:bCs/>
+        </w:rPr>
+        <w:t xml:space="preserve">Bẫy, </w:t>
+      </w:r>
+      <w:r>
+        <w:rPr>
+          <w:rFonts w:ascii="Consolas" w:eastAsia="Consolas" w:hAnsi="Consolas" w:cs="Consolas"/>
+          <w:b/>
+          <w:bCs/>
+        </w:rPr>
+        <w:t xml:space="preserve">Switch</w:t>
+      </w:r>
+      <w:r>
+        <w:rPr>
+          <w:b/>
+          <w:bCs/>
+        </w:rPr>
+        <w:t xml:space="preserve"> trong </w:t>
+      </w:r>
+      <w:r>
+        <w:rPr>
+          <w:rFonts w:ascii="Consolas" w:eastAsia="Consolas" w:hAnsi="Consolas" w:cs="Consolas"/>
+          <w:b/>
+          <w:bCs/>
+        </w:rPr>
+        <w:t xml:space="preserve">&lt;form&gt;</w:t>
+      </w:r>
+      <w:r>
+        <w:rPr>
+          <w:b/>
+          <w:bCs/>
+        </w:rPr>
+        <w:t xml:space="preserve">:</w:t>
+      </w:r>
+      <w:r>
+        <w:t xml:space="preserve"> radix vẽ thêm một ô input ẩn để form gửi được giá trị và đo nó bằng </w:t>
+      </w:r>
+      <w:r>
+        <w:rPr>
+          <w:rFonts w:ascii="Consolas" w:eastAsia="Consolas" w:hAnsi="Consolas" w:cs="Consolas"/>
+        </w:rPr>
+        <w:t xml:space="preserve">ResizeObserver</w:t>
+      </w:r>
+      <w:r>
+        <w:t xml:space="preserve">. jsdom không có </w:t>
+      </w:r>
+      <w:r>
+        <w:rPr>
+          <w:rFonts w:ascii="Consolas" w:eastAsia="Consolas" w:hAnsi="Consolas" w:cs="Consolas"/>
+        </w:rPr>
+        <w:t xml:space="preserve">ResizeObserver</w:t>
+      </w:r>
+      <w:r>
+        <w:t xml:space="preserve"> (trình duyệt nào cũng có), nên </w:t>
+      </w:r>
+      <w:r>
+        <w:rPr>
+          <w:rFonts w:ascii="Consolas" w:eastAsia="Consolas" w:hAnsi="Consolas" w:cs="Consolas"/>
+        </w:rPr>
+        <w:t xml:space="preserve">src/test/setup.ts</w:t>
+      </w:r>
+      <w:r>
+        <w:t xml:space="preserve"> thêm một bản rỗng.</w:t>
+      </w:r>
+    </w:p>
+    <w:p>
+      <w:pPr>
+        <w:pStyle w:val="Heading3"/>
+      </w:pPr>
+      <w:r>
+        <w:t xml:space="preserve">9.3 Đăng xuất và hết phiên (FE-04)</w:t>
+      </w:r>
+    </w:p>
+    <w:p>
+      <w:pPr>
+        <w:pStyle w:val="ListParagraph"/>
+        <w:numPr>
+          <w:ilvl w:val="0"/>
+          <w:numId w:val="1"/>
+        </w:numPr>
+      </w:pPr>
+      <w:r>
+        <w:rPr>
+          <w:b/>
+          <w:bCs/>
+        </w:rPr>
+        <w:t xml:space="preserve">Menu người dùng</w:t>
+      </w:r>
+      <w:r>
+        <w:t xml:space="preserve"> mở từ nút "…" của thanh bên và avatar của rail; trên mobile nằm ở trang "Thêm" (dựng theo </w:t>
+      </w:r>
+      <w:r>
+        <w:rPr>
+          <w:rFonts w:ascii="Consolas" w:eastAsia="Consolas" w:hAnsi="Consolas" w:cs="Consolas"/>
+        </w:rPr>
+        <w:t xml:space="preserve">MobileMore</w:t>
+      </w:r>
+      <w:r>
+        <w:t xml:space="preserve">). Canvas vẽ nút mà không vẽ menu; spec đòi tên, email, đổi sáng/tối và đăng xuất.</w:t>
+      </w:r>
+    </w:p>
+    <w:p>
+      <w:pPr>
+        <w:pStyle w:val="ListParagraph"/>
+        <w:numPr>
+          <w:ilvl w:val="0"/>
+          <w:numId w:val="1"/>
+        </w:numPr>
+      </w:pPr>
+      <w:r>
+        <w:rPr>
+          <w:rFonts w:ascii="Consolas" w:eastAsia="Consolas" w:hAnsi="Consolas" w:cs="Consolas"/>
+          <w:b/>
+          <w:bCs/>
+        </w:rPr>
+        <w:t xml:space="preserve">forgetSession</w:t>
+      </w:r>
+      <w:r>
+        <w:rPr>
+          <w:b/>
+          <w:bCs/>
+        </w:rPr>
+        <w:t xml:space="preserve">:</w:t>
+      </w:r>
+      <w:r>
+        <w:t xml:space="preserve"> bỏ mọi dữ liệu đã cache rồi đặt </w:t>
+      </w:r>
+      <w:r>
+        <w:rPr>
+          <w:rFonts w:ascii="Consolas" w:eastAsia="Consolas" w:hAnsi="Consolas" w:cs="Consolas"/>
+        </w:rPr>
+        <w:t xml:space="preserve">me = null</w:t>
+      </w:r>
+      <w:r>
+        <w:t xml:space="preserve">. Không dùng </w:t>
+      </w:r>
+      <w:r>
+        <w:rPr>
+          <w:rFonts w:ascii="Consolas" w:eastAsia="Consolas" w:hAnsi="Consolas" w:cs="Consolas"/>
+        </w:rPr>
+        <w:t xml:space="preserve">queryClient.clear()</w:t>
+      </w:r>
+      <w:r>
+        <w:t xml:space="preserve">: nó xóa luôn query </w:t>
+      </w:r>
+      <w:r>
+        <w:rPr>
+          <w:rFonts w:ascii="Consolas" w:eastAsia="Consolas" w:hAnsi="Consolas" w:cs="Consolas"/>
+        </w:rPr>
+        <w:t xml:space="preserve">me</w:t>
+      </w:r>
+      <w:r>
+        <w:t xml:space="preserve">, mà component đang đọc vẫn bám query cũ đã bị xóa nên không nhận được giá trị mới.</w:t>
+      </w:r>
+    </w:p>
+    <w:p>
+      <w:pPr>
+        <w:pStyle w:val="ListParagraph"/>
+        <w:numPr>
+          <w:ilvl w:val="0"/>
+          <w:numId w:val="1"/>
+        </w:numPr>
+      </w:pPr>
+      <w:r>
+        <w:rPr>
+          <w:b/>
+          <w:bCs/>
+        </w:rPr>
+        <w:t xml:space="preserve">Hết phiên:</w:t>
+      </w:r>
+      <w:r>
+        <w:t xml:space="preserve"> </w:t>
+      </w:r>
+      <w:r>
+        <w:rPr>
+          <w:rFonts w:ascii="Consolas" w:eastAsia="Consolas" w:hAnsi="Consolas" w:cs="Consolas"/>
+        </w:rPr>
+        <w:t xml:space="preserve">RequireAuth</w:t>
+      </w:r>
+      <w:r>
+        <w:t xml:space="preserve"> đăng ký </w:t>
+      </w:r>
+      <w:r>
+        <w:rPr>
+          <w:rFonts w:ascii="Consolas" w:eastAsia="Consolas" w:hAnsi="Consolas" w:cs="Consolas"/>
+        </w:rPr>
+        <w:t xml:space="preserve">onSessionExpired</w:t>
+      </w:r>
+      <w:r>
+        <w:t xml:space="preserve">; một request bất kỳ trả </w:t>
+      </w:r>
+      <w:r>
+        <w:rPr>
+          <w:rFonts w:ascii="Consolas" w:eastAsia="Consolas" w:hAnsi="Consolas" w:cs="Consolas"/>
+        </w:rPr>
+        <w:t xml:space="preserve">401</w:t>
+      </w:r>
+      <w:r>
+        <w:t xml:space="preserve"> thì cache bị xóa và chốt chặn tự đưa về </w:t>
+      </w:r>
+      <w:r>
+        <w:rPr>
+          <w:rFonts w:ascii="Consolas" w:eastAsia="Consolas" w:hAnsi="Consolas" w:cs="Consolas"/>
+        </w:rPr>
+        <w:t xml:space="preserve">/login?returnTo=&lt;trang đang mở&gt;</w:t>
+      </w:r>
+      <w:r>
+        <w:t xml:space="preserve">.</w:t>
+      </w:r>
+    </w:p>
+    <w:p>
+      <w:pPr>
+        <w:pStyle w:val="ListParagraph"/>
+        <w:numPr>
+          <w:ilvl w:val="0"/>
+          <w:numId w:val="1"/>
+        </w:numPr>
+      </w:pPr>
+      <w:r>
+        <w:rPr>
+          <w:b/>
+          <w:bCs/>
+        </w:rPr>
+        <w:t xml:space="preserve">Lỗi khó nhất của change, và cách tìm:</w:t>
+      </w:r>
+      <w:r>
+        <w:t xml:space="preserve"> đăng xuất ra </w:t>
+      </w:r>
+      <w:r>
+        <w:rPr>
+          <w:rFonts w:ascii="Consolas" w:eastAsia="Consolas" w:hAnsi="Consolas" w:cs="Consolas"/>
+        </w:rPr>
+        <w:t xml:space="preserve">/login?returnTo=%2Finbox</w:t>
+      </w:r>
+      <w:r>
+        <w:t xml:space="preserve"> thay vì </w:t>
+      </w:r>
+      <w:r>
+        <w:rPr>
+          <w:rFonts w:ascii="Consolas" w:eastAsia="Consolas" w:hAnsi="Consolas" w:cs="Consolas"/>
+        </w:rPr>
+        <w:t xml:space="preserve">/login</w:t>
+      </w:r>
+      <w:r>
+        <w:t xml:space="preserve">. Hai lần sửa theo phỏng đoán (đổi thứ tự, thêm </w:t>
+      </w:r>
+      <w:r>
+        <w:rPr>
+          <w:rFonts w:ascii="Consolas" w:eastAsia="Consolas" w:hAnsi="Consolas" w:cs="Consolas"/>
+        </w:rPr>
+        <w:t xml:space="preserve">flushSync</w:t>
+      </w:r>
+      <w:r>
+        <w:t xml:space="preserve">) đều không ăn thua, nên dừng đoán và ghi log từng sự kiện của router và cache:</w:t>
+      </w:r>
+    </w:p>
+    <w:p>
+      <w:pPr>
+        <w:shd w:val="clear" w:color="auto" w:fill="F2F3F5"/>
+        <w:ind w:left="0"/>
+      </w:pPr>
+      <w:r>
+        <w:rPr>
+          <w:rFonts w:ascii="Consolas" w:eastAsia="Consolas" w:hAnsi="Consolas" w:cs="Consolas"/>
+          <w:sz w:val="19"/>
+          <w:szCs w:val="19"/>
+        </w:rPr>
+        <w:t xml:space="preserve">cache updated me=null              &lt;- forgetSession</w:t>
+        <w:br/>
+        <w:t xml:space="preserve">router /login                      &lt;- lần chuyển của useLogout</w:t>
+        <w:br/>
+        <w:t xml:space="preserve">router /login?returnTo=%2Finbox    &lt;- chốt chặn, vẫn ở /inbox, thấy me=null</w:t>
+      </w:r>
+    </w:p>
+    <w:p>
+      <w:r>
+        <w:t xml:space="preserve">  TanStack báo cho component </w:t>
+      </w:r>
+      <w:r>
+        <w:rPr>
+          <w:b/>
+          <w:bCs/>
+        </w:rPr>
+        <w:t xml:space="preserve">đồng bộ</w:t>
+      </w:r>
+      <w:r>
+        <w:t xml:space="preserve">, còn React Router chuyển trang trong một transition (ưu tiên thấp), nên chốt chặn kịp vẽ lại trước. </w:t>
+      </w:r>
+      <w:r>
+        <w:rPr>
+          <w:rFonts w:ascii="Consolas" w:eastAsia="Consolas" w:hAnsi="Consolas" w:cs="Consolas"/>
+        </w:rPr>
+        <w:t xml:space="preserve">flushSync</w:t>
+      </w:r>
+      <w:r>
+        <w:t xml:space="preserve"> của React Router chỉ chạy khi dùng </w:t>
+      </w:r>
+      <w:r>
+        <w:rPr>
+          <w:rFonts w:ascii="Consolas" w:eastAsia="Consolas" w:hAnsi="Consolas" w:cs="Consolas"/>
+        </w:rPr>
+        <w:t xml:space="preserve">RouterProvider</w:t>
+      </w:r>
+      <w:r>
+        <w:t xml:space="preserve"> của </w:t>
+      </w:r>
+      <w:r>
+        <w:rPr>
+          <w:rFonts w:ascii="Consolas" w:eastAsia="Consolas" w:hAnsi="Consolas" w:cs="Consolas"/>
+        </w:rPr>
+        <w:t xml:space="preserve">react-router/dom</w:t>
+      </w:r>
+      <w:r>
+        <w:t xml:space="preserve">; bản của </w:t>
+      </w:r>
+      <w:r>
+        <w:rPr>
+          <w:rFonts w:ascii="Consolas" w:eastAsia="Consolas" w:hAnsi="Consolas" w:cs="Consolas"/>
+        </w:rPr>
+        <w:t xml:space="preserve">react-router</w:t>
+      </w:r>
+      <w:r>
+        <w:t xml:space="preserve"> bỏ qua (thư viện có cảnh báo đúng chuyện này). Sửa: </w:t>
+      </w:r>
+      <w:r>
+        <w:rPr>
+          <w:rFonts w:ascii="Consolas" w:eastAsia="Consolas" w:hAnsi="Consolas" w:cs="Consolas"/>
+        </w:rPr>
+        <w:t xml:space="preserve">RouterProvider</w:t>
+      </w:r>
+      <w:r>
+        <w:t xml:space="preserve"> từ </w:t>
+      </w:r>
+      <w:r>
+        <w:rPr>
+          <w:rFonts w:ascii="Consolas" w:eastAsia="Consolas" w:hAnsi="Consolas" w:cs="Consolas"/>
+        </w:rPr>
+        <w:t xml:space="preserve">react-router/dom</w:t>
+      </w:r>
+      <w:r>
+        <w:t xml:space="preserve">, chuyển tới </w:t>
+      </w:r>
+      <w:r>
+        <w:rPr>
+          <w:rFonts w:ascii="Consolas" w:eastAsia="Consolas" w:hAnsi="Consolas" w:cs="Consolas"/>
+        </w:rPr>
+        <w:t xml:space="preserve">/login</w:t>
+      </w:r>
+      <w:r>
+        <w:t xml:space="preserve"> với </w:t>
+      </w:r>
+      <w:r>
+        <w:rPr>
+          <w:rFonts w:ascii="Consolas" w:eastAsia="Consolas" w:hAnsi="Consolas" w:cs="Consolas"/>
+        </w:rPr>
+        <w:t xml:space="preserve">flushSync</w:t>
+      </w:r>
+      <w:r>
+        <w:t xml:space="preserve"> rồi mới xóa phiên, và trang đăng nhập không tự đi tiếp khi mutation đăng xuất đang chạy (</w:t>
+      </w:r>
+      <w:r>
+        <w:rPr>
+          <w:rFonts w:ascii="Consolas" w:eastAsia="Consolas" w:hAnsi="Consolas" w:cs="Consolas"/>
+        </w:rPr>
+        <w:t xml:space="preserve">useIsMutating</w:t>
+      </w:r>
+      <w:r>
+        <w:t xml:space="preserve">).</w:t>
+      </w:r>
+    </w:p>
+    <w:p>
+      <w:pPr>
+        <w:pStyle w:val="Heading3"/>
+      </w:pPr>
+      <w:r>
+        <w:t xml:space="preserve">9.4 Khi nào thử lại một request (FE-04)</w:t>
+      </w:r>
+    </w:p>
+    <w:p>
+      <w:pPr>
+        <w:pStyle w:val="ListParagraph"/>
+        <w:numPr>
+          <w:ilvl w:val="0"/>
+          <w:numId w:val="1"/>
+        </w:numPr>
+      </w:pPr>
+      <w:r>
+        <w:rPr>
+          <w:rFonts w:ascii="Consolas" w:eastAsia="Consolas" w:hAnsi="Consolas" w:cs="Consolas"/>
+        </w:rPr>
+        <w:t xml:space="preserve">shouldRetry</w:t>
+      </w:r>
+      <w:r>
+        <w:t xml:space="preserve"> (</w:t>
+      </w:r>
+      <w:r>
+        <w:rPr>
+          <w:rFonts w:ascii="Consolas" w:eastAsia="Consolas" w:hAnsi="Consolas" w:cs="Consolas"/>
+        </w:rPr>
+        <w:t xml:space="preserve">src/app/queryClient.ts</w:t>
+      </w:r>
+      <w:r>
+        <w:t xml:space="preserve">): lỗi 4xx (máy chủ đã trả lời về chính request) không thử lại; lỗi mạng và 5xx thử lại hai lần. Mặc định của TanStack thử lại mọi lỗi ba lần: một </w:t>
+      </w:r>
+      <w:r>
+        <w:rPr>
+          <w:rFonts w:ascii="Consolas" w:eastAsia="Consolas" w:hAnsi="Consolas" w:cs="Consolas"/>
+        </w:rPr>
+        <w:t xml:space="preserve">401</w:t>
+      </w:r>
+      <w:r>
+        <w:t xml:space="preserve"> sẽ báo hết phiên bốn lần, một </w:t>
+      </w:r>
+      <w:r>
+        <w:rPr>
+          <w:rFonts w:ascii="Consolas" w:eastAsia="Consolas" w:hAnsi="Consolas" w:cs="Consolas"/>
+        </w:rPr>
+        <w:t xml:space="preserve">404</w:t>
+      </w:r>
+      <w:r>
+        <w:t xml:space="preserve"> phải chờ vài giây mới hiện.</w:t>
+      </w:r>
+    </w:p>
+    <w:p>
+      <w:pPr>
+        <w:pStyle w:val="Heading3"/>
+      </w:pPr>
+      <w:r>
+        <w:t xml:space="preserve">9.5 Tài khoản trên API (AC-06)</w:t>
+      </w:r>
+    </w:p>
+    <w:p>
+      <w:pPr>
+        <w:pStyle w:val="ListParagraph"/>
+        <w:numPr>
+          <w:ilvl w:val="0"/>
+          <w:numId w:val="1"/>
+        </w:numPr>
+      </w:pPr>
+      <w:r>
+        <w:rPr>
+          <w:b/>
+          <w:bCs/>
+        </w:rPr>
+        <w:t xml:space="preserve">Đổi dữ liệu:</w:t>
+      </w:r>
+      <w:r>
+        <w:t xml:space="preserve"> </w:t>
+      </w:r>
+      <w:r>
+        <w:rPr>
+          <w:rFonts w:ascii="Consolas" w:eastAsia="Consolas" w:hAnsi="Consolas" w:cs="Consolas"/>
+        </w:rPr>
+        <w:t xml:space="preserve">GET /api/accounts</w:t>
+      </w:r>
+      <w:r>
+        <w:t xml:space="preserve"> + </w:t>
+      </w:r>
+      <w:r>
+        <w:rPr>
+          <w:rFonts w:ascii="Consolas" w:eastAsia="Consolas" w:hAnsi="Consolas" w:cs="Consolas"/>
+        </w:rPr>
+        <w:t xml:space="preserve">GET /api/providers</w:t>
+      </w:r>
+      <w:r>
+        <w:t xml:space="preserve"> thành </w:t>
+      </w:r>
+      <w:r>
+        <w:rPr>
+          <w:rFonts w:ascii="Consolas" w:eastAsia="Consolas" w:hAnsi="Consolas" w:cs="Consolas"/>
+        </w:rPr>
+        <w:t xml:space="preserve">AccountsData</w:t>
+      </w:r>
+      <w:r>
+        <w:t xml:space="preserve">. Trường API chưa có là </w:t>
+      </w:r>
+      <w:r>
+        <w:rPr>
+          <w:rFonts w:ascii="Consolas" w:eastAsia="Consolas" w:hAnsi="Consolas" w:cs="Consolas"/>
+        </w:rPr>
+        <w:t xml:space="preserve">null</w:t>
+      </w:r>
+      <w:r>
+        <w:t xml:space="preserve">: tổng tin đã lưu, số tin từng tài khoản, hạn quyền, tiến độ và chu kỳ đồng bộ, bốn mục chi tiết.</w:t>
+      </w:r>
+    </w:p>
+    <w:p>
+      <w:pPr>
+        <w:pStyle w:val="ListParagraph"/>
+        <w:numPr>
+          <w:ilvl w:val="0"/>
+          <w:numId w:val="1"/>
+        </w:numPr>
+      </w:pPr>
+      <w:r>
+        <w:rPr>
+          <w:b/>
+          <w:bCs/>
+        </w:rPr>
+        <w:t xml:space="preserve">Câu chữ không bịa số:</w:t>
+      </w:r>
+      <w:r>
+        <w:t xml:space="preserve"> </w:t>
+      </w:r>
+      <w:r>
+        <w:rPr>
+          <w:rFonts w:ascii="Consolas" w:eastAsia="Consolas" w:hAnsi="Consolas" w:cs="Consolas"/>
+        </w:rPr>
+        <w:t xml:space="preserve">stored(count, noun)</w:t>
+      </w:r>
+      <w:r>
+        <w:t xml:space="preserve"> trả "1.284 thư" hoặc chỉ "thư" khi chưa biết; dòng "Đã lưu … thư và tin nhắn" và hàng "Đã lưu" trên mobile ẩn đi.</w:t>
+      </w:r>
+    </w:p>
+    <w:p>
+      <w:pPr>
+        <w:pStyle w:val="ListParagraph"/>
+        <w:numPr>
+          <w:ilvl w:val="0"/>
+          <w:numId w:val="1"/>
+        </w:numPr>
+      </w:pPr>
+      <w:r>
+        <w:rPr>
+          <w:b/>
+          <w:bCs/>
+        </w:rPr>
+        <w:t xml:space="preserve">Kênh duy nhất API biết:</w:t>
+      </w:r>
+      <w:r>
+        <w:t xml:space="preserve"> nhận tin = đồng bộ tự động. Công tắc "Thư đến" gửi </w:t>
+      </w:r>
+      <w:r>
+        <w:rPr>
+          <w:rFonts w:ascii="Consolas" w:eastAsia="Consolas" w:hAnsi="Consolas" w:cs="Consolas"/>
+        </w:rPr>
+        <w:t xml:space="preserve">PATCH /api/accounts/{id}</w:t>
+      </w:r>
+      <w:r>
+        <w:t xml:space="preserve"> </w:t>
+      </w:r>
+      <w:r>
+        <w:rPr>
+          <w:rFonts w:ascii="Consolas" w:eastAsia="Consolas" w:hAnsi="Consolas" w:cs="Consolas"/>
+        </w:rPr>
+        <w:t xml:space="preserve">{ syncEnabled }</w:t>
+      </w:r>
+      <w:r>
+        <w:t xml:space="preserve">.</w:t>
+      </w:r>
+    </w:p>
+    <w:p>
+      <w:pPr>
+        <w:pStyle w:val="ListParagraph"/>
+        <w:numPr>
+          <w:ilvl w:val="0"/>
+          <w:numId w:val="1"/>
+        </w:numPr>
+      </w:pPr>
+      <w:r>
+        <w:rPr>
+          <w:b/>
+          <w:bCs/>
+        </w:rPr>
+        <w:t xml:space="preserve">Bỏ công tắc "Xóa luôn … đã lưu":</w:t>
+      </w:r>
+      <w:r>
+        <w:t xml:space="preserve"> </w:t>
+      </w:r>
+      <w:r>
+        <w:rPr>
+          <w:rFonts w:ascii="Consolas" w:eastAsia="Consolas" w:hAnsi="Consolas" w:cs="Consolas"/>
+        </w:rPr>
+        <w:t xml:space="preserve">DELETE</w:t>
+      </w:r>
+      <w:r>
+        <w:t xml:space="preserve"> của backend không xóa tin và roadmap để F05 chốt chuyện giữ / xóa lịch sử. Một công tắc không làm gì trên một thao tác phá hủy là nói dối người dùng.</w:t>
+      </w:r>
+    </w:p>
+    <w:p>
+      <w:pPr>
+        <w:pStyle w:val="ListParagraph"/>
+        <w:numPr>
+          <w:ilvl w:val="0"/>
+          <w:numId w:val="1"/>
+        </w:numPr>
+      </w:pPr>
+      <w:r>
+        <w:rPr>
+          <w:b/>
+          <w:bCs/>
+        </w:rPr>
+        <w:t xml:space="preserve">Hai lớp test:</w:t>
+      </w:r>
+      <w:r>
+        <w:t xml:space="preserve"> test cũ của màn mock request về dữ liệu mẫu đầy đủ, để vẫn kiểm các phần backend chưa có (website, lịch sử đồng bộ…); đường đi qua API có test riêng với MSW và dữ liệu API giả trong </w:t>
+      </w:r>
+      <w:r>
+        <w:rPr>
+          <w:rFonts w:ascii="Consolas" w:eastAsia="Consolas" w:hAnsi="Consolas" w:cs="Consolas"/>
+        </w:rPr>
+        <w:t xml:space="preserve">src/test/fixtures/</w:t>
+      </w:r>
+      <w:r>
+        <w:t xml:space="preserve">.</w:t>
+      </w:r>
+    </w:p>
+    <w:p>
+      <w:pPr>
+        <w:pStyle w:val="Heading3"/>
+      </w:pPr>
+      <w:r>
+        <w:t xml:space="preserve">9.6 Kết nối trên API (FE-30)</w:t>
+      </w:r>
+    </w:p>
+    <w:p>
+      <w:pPr>
+        <w:pStyle w:val="ListParagraph"/>
+        <w:numPr>
+          <w:ilvl w:val="0"/>
+          <w:numId w:val="1"/>
+        </w:numPr>
+      </w:pPr>
+      <w:r>
+        <w:rPr>
+          <w:b/>
+          <w:bCs/>
+        </w:rPr>
+        <w:t xml:space="preserve">Danh sách provider:</w:t>
+      </w:r>
+      <w:r>
+        <w:t xml:space="preserve"> </w:t>
+      </w:r>
+      <w:r>
+        <w:rPr>
+          <w:rFonts w:ascii="Consolas" w:eastAsia="Consolas" w:hAnsi="Consolas" w:cs="Consolas"/>
+        </w:rPr>
+        <w:t xml:space="preserve">GET /api/providers</w:t>
+      </w:r>
+      <w:r>
+        <w:t xml:space="preserve"> chỉ liệt kê provider máy chủ đã bật (Gmail cần Google client trong cấu hình). API chưa có danh sách quyền xin (</w:t>
+      </w:r>
+      <w:r>
+        <w:rPr>
+          <w:rFonts w:ascii="Consolas" w:eastAsia="Consolas" w:hAnsi="Consolas" w:cs="Consolas"/>
+        </w:rPr>
+        <w:t xml:space="preserve">scopes</w:t>
+      </w:r>
+      <w:r>
+        <w:t xml:space="preserve"> = </w:t>
+      </w:r>
+      <w:r>
+        <w:rPr>
+          <w:rFonts w:ascii="Consolas" w:eastAsia="Consolas" w:hAnsi="Consolas" w:cs="Consolas"/>
+        </w:rPr>
+        <w:t xml:space="preserve">null</w:t>
+      </w:r>
+      <w:r>
+        <w:t xml:space="preserve">): bước "Quyền" nói trang của Google sẽ liệt kê. Không có provider nào thì bước 1 nói rõ và khóa "Tiếp tục".</w:t>
+      </w:r>
+    </w:p>
+    <w:p>
+      <w:pPr>
+        <w:pStyle w:val="ListParagraph"/>
+        <w:numPr>
+          <w:ilvl w:val="0"/>
+          <w:numId w:val="1"/>
+        </w:numPr>
+      </w:pPr>
+      <w:r>
+        <w:rPr>
+          <w:b/>
+          <w:bCs/>
+        </w:rPr>
+        <w:t xml:space="preserve">Bắt đầu:</w:t>
+      </w:r>
+      <w:r>
+        <w:t xml:space="preserve"> </w:t>
+      </w:r>
+      <w:r>
+        <w:rPr>
+          <w:rFonts w:ascii="Consolas" w:eastAsia="Consolas" w:hAnsi="Consolas" w:cs="Consolas"/>
+        </w:rPr>
+        <w:t xml:space="preserve">POST /api/accounts/connect/{provider}</w:t>
+      </w:r>
+      <w:r>
+        <w:t xml:space="preserve">, kèm </w:t>
+      </w:r>
+      <w:r>
+        <w:rPr>
+          <w:rFonts w:ascii="Consolas" w:eastAsia="Consolas" w:hAnsi="Consolas" w:cs="Consolas"/>
+        </w:rPr>
+        <w:t xml:space="preserve">accountId</w:t>
+      </w:r>
+      <w:r>
+        <w:t xml:space="preserve"> khi đăng nhập lại, rồi </w:t>
+      </w:r>
+      <w:r>
+        <w:rPr>
+          <w:rFonts w:ascii="Consolas" w:eastAsia="Consolas" w:hAnsi="Consolas" w:cs="Consolas"/>
+        </w:rPr>
+        <w:t xml:space="preserve">window.location.assign(authorizationUrl)</w:t>
+      </w:r>
+      <w:r>
+        <w:t xml:space="preserve">.</w:t>
+      </w:r>
+    </w:p>
+    <w:p>
+      <w:pPr>
+        <w:pStyle w:val="ListParagraph"/>
+        <w:numPr>
+          <w:ilvl w:val="0"/>
+          <w:numId w:val="1"/>
+        </w:numPr>
+      </w:pPr>
+      <w:r>
+        <w:rPr>
+          <w:b/>
+          <w:bCs/>
+        </w:rPr>
+        <w:t xml:space="preserve">Quay về khi chưa có đồng bộ lần đầu (F04b):</w:t>
+      </w:r>
+      <w:r>
+        <w:t xml:space="preserve"> </w:t>
+      </w:r>
+      <w:r>
+        <w:rPr>
+          <w:rFonts w:ascii="Consolas" w:eastAsia="Consolas" w:hAnsi="Consolas" w:cs="Consolas"/>
+        </w:rPr>
+        <w:t xml:space="preserve">INITIAL_SYNC_READY = false</w:t>
+      </w:r>
+      <w:r>
+        <w:t xml:space="preserve">, hộp kết nối đi thẳng tới "Đã kết nối …" và nói chưa đồng bộ, thay vì hiện tùy chọn đồng bộ mà không gì thực hiện được.</w:t>
+      </w:r>
+    </w:p>
+    <w:p>
+      <w:pPr>
+        <w:pStyle w:val="ListParagraph"/>
+        <w:numPr>
+          <w:ilvl w:val="0"/>
+          <w:numId w:val="1"/>
+        </w:numPr>
+      </w:pPr>
+      <w:r>
+        <w:rPr>
+          <w:b/>
+          <w:bCs/>
+        </w:rPr>
+        <w:t xml:space="preserve">Lỗi ngủ quên từ CN-03:</w:t>
+      </w:r>
+      <w:r>
+        <w:t xml:space="preserve"> effect xóa </w:t>
+      </w:r>
+      <w:r>
+        <w:rPr>
+          <w:rFonts w:ascii="Consolas" w:eastAsia="Consolas" w:hAnsi="Consolas" w:cs="Consolas"/>
+        </w:rPr>
+        <w:t xml:space="preserve">?connected</w:t>
+      </w:r>
+      <w:r>
+        <w:t xml:space="preserve"> khỏi URL chạy ngay lần vẽ đầu, trước khi danh sách về, nên lúc đọc thì tham số đã mất. Dữ liệu mẫu về gần như tức thì nên không ai thấy; API thật (có độ trễ) làm lộ ra. </w:t>
+      </w:r>
+      <w:r>
+        <w:rPr>
+          <w:b/>
+          <w:bCs/>
+        </w:rPr>
+        <w:t xml:space="preserve">Bài học:</w:t>
+      </w:r>
+      <w:r>
+        <w:t xml:space="preserve"> dữ liệu mẫu đồng bộ che lỗi thời gian; test nên có ca dữ liệu đến muộn (MSW).</w:t>
+      </w:r>
+    </w:p>
+    <w:p>
+      <w:pPr>
+        <w:pStyle w:val="Heading3"/>
+      </w:pPr>
+      <w:r>
+        <w:t xml:space="preserve">9.7 Kiểm chứng</w:t>
+      </w:r>
+    </w:p>
+    <w:p>
+      <w:pPr>
+        <w:pStyle w:val="ListParagraph"/>
+        <w:numPr>
+          <w:ilvl w:val="0"/>
+          <w:numId w:val="1"/>
+        </w:numPr>
+      </w:pPr>
+      <w:r>
+        <w:rPr>
+          <w:b/>
+          <w:bCs/>
+        </w:rPr>
+        <w:t xml:space="preserve">Test viết trước, kiểm tra ngược:</w:t>
+      </w:r>
+      <w:r>
+        <w:t xml:space="preserve"> FE-02 RED 8/8, 12/12 lỗi gài bị bắt; FE-03 RED 10/11, 19/19; FE-04 RED 5/5 + 3, 17/17; AC-06 RED 11, 18/18; FE-30 RED 8, 12/12. Cuối cùng 304/304.</w:t>
+      </w:r>
+    </w:p>
+    <w:p>
+      <w:pPr>
+        <w:pStyle w:val="ListParagraph"/>
+        <w:numPr>
+          <w:ilvl w:val="0"/>
+          <w:numId w:val="1"/>
+        </w:numPr>
+      </w:pPr>
+      <w:r>
+        <w:rPr>
+          <w:b/>
+          <w:bCs/>
+        </w:rPr>
+        <w:t xml:space="preserve">Chrome thật không cần backend:</w:t>
+      </w:r>
+      <w:r>
+        <w:t xml:space="preserve"> chạy </w:t>
+      </w:r>
+      <w:r>
+        <w:rPr>
+          <w:rFonts w:ascii="Consolas" w:eastAsia="Consolas" w:hAnsi="Consolas" w:cs="Consolas"/>
+        </w:rPr>
+        <w:t xml:space="preserve">vite</w:t>
+      </w:r>
+      <w:r>
+        <w:t xml:space="preserve"> dev, dùng DevTools Protocol (</w:t>
+      </w:r>
+      <w:r>
+        <w:rPr>
+          <w:rFonts w:ascii="Consolas" w:eastAsia="Consolas" w:hAnsi="Consolas" w:cs="Consolas"/>
+        </w:rPr>
+        <w:t xml:space="preserve">Fetch.enable</w:t>
+      </w:r>
+      <w:r>
+        <w:t xml:space="preserve"> + </w:t>
+      </w:r>
+      <w:r>
+        <w:rPr>
+          <w:rFonts w:ascii="Consolas" w:eastAsia="Consolas" w:hAnsi="Consolas" w:cs="Consolas"/>
+        </w:rPr>
+        <w:t xml:space="preserve">Fetch.fulfillRequest</w:t>
+      </w:r>
+      <w:r>
+        <w:t xml:space="preserve">) trả lời thay backend cho đăng nhập, danh sách, </w:t>
+      </w:r>
+      <w:r>
+        <w:rPr>
+          <w:rFonts w:ascii="Consolas" w:eastAsia="Consolas" w:hAnsi="Consolas" w:cs="Consolas"/>
+        </w:rPr>
+        <w:t xml:space="preserve">PATCH</w:t>
+      </w:r>
+      <w:r>
+        <w:t xml:space="preserve">, </w:t>
+      </w:r>
+      <w:r>
+        <w:rPr>
+          <w:rFonts w:ascii="Consolas" w:eastAsia="Consolas" w:hAnsi="Consolas" w:cs="Consolas"/>
+        </w:rPr>
+        <w:t xml:space="preserve">DELETE</w:t>
+      </w:r>
+      <w:r>
+        <w:t xml:space="preserve">, bắt đầu kết nối; mã của app không đổi. Bẫy: mẫu </w:t>
+      </w:r>
+      <w:r>
+        <w:rPr>
+          <w:rFonts w:ascii="Consolas" w:eastAsia="Consolas" w:hAnsi="Consolas" w:cs="Consolas"/>
+        </w:rPr>
+        <w:t xml:space="preserve">*/api/*</w:t>
+      </w:r>
+      <w:r>
+        <w:t xml:space="preserve"> khớp cả file </w:t>
+      </w:r>
+      <w:r>
+        <w:rPr>
+          <w:rFonts w:ascii="Consolas" w:eastAsia="Consolas" w:hAnsi="Consolas" w:cs="Consolas"/>
+        </w:rPr>
+        <w:t xml:space="preserve">/src/shared/api/client.ts</w:t>
+      </w:r>
+      <w:r>
+        <w:t xml:space="preserve"> mà Vite phục vụ, app không tải được; phải ghi đủ </w:t>
+      </w:r>
+      <w:r>
+        <w:rPr>
+          <w:rFonts w:ascii="Consolas" w:eastAsia="Consolas" w:hAnsi="Consolas" w:cs="Consolas"/>
+        </w:rPr>
+        <w:t xml:space="preserve">http://localhost:5174/api/*</w:t>
+      </w:r>
+      <w:r>
+        <w:t xml:space="preserve">.</w:t>
+      </w:r>
+    </w:p>
+    <w:p>
+      <w:pPr>
+        <w:pStyle w:val="ListParagraph"/>
+        <w:numPr>
+          <w:ilvl w:val="0"/>
+          <w:numId w:val="1"/>
+        </w:numPr>
+      </w:pPr>
+      <w:r>
+        <w:rPr>
+          <w:b/>
+          <w:bCs/>
+        </w:rPr>
+        <w:t xml:space="preserve">Test chập chờn, đo trước khi sửa:</w:t>
+      </w:r>
+      <w:r>
+        <w:t xml:space="preserve"> chạy cả bộ 37 file song song thì 1–2 test dài hết giờ ở 5 s, mỗi lần một test khác; chạy riêng thì 1,6–2,3 s. Không có gì treo, nên </w:t>
+      </w:r>
+      <w:r>
+        <w:rPr>
+          <w:rFonts w:ascii="Consolas" w:eastAsia="Consolas" w:hAnsi="Consolas" w:cs="Consolas"/>
+        </w:rPr>
+        <w:t xml:space="preserve">testTimeout</w:t>
+      </w:r>
+      <w:r>
+        <w:t xml:space="preserve"> lên 15 s.</w:t>
+      </w:r>
+    </w:p>
+    <w:p>
+      <w:pPr>
+        <w:pStyle w:val="ListParagraph"/>
+        <w:numPr>
+          <w:ilvl w:val="0"/>
+          <w:numId w:val="1"/>
+        </w:numPr>
+      </w:pPr>
+      <w:r>
+        <w:rPr>
+          <w:b/>
+          <w:bCs/>
+        </w:rPr>
+        <w:t xml:space="preserve">Chưa kiểm chứng:</w:t>
+      </w:r>
+      <w:r>
+        <w:t xml:space="preserve"> chạy với backend thật (FE-05) cần </w:t>
+      </w:r>
+      <w:r>
+        <w:rPr>
+          <w:rFonts w:ascii="Consolas" w:eastAsia="Consolas" w:hAnsi="Consolas" w:cs="Consolas"/>
+        </w:rPr>
+        <w:t xml:space="preserve">.env</w:t>
+      </w:r>
+      <w:r>
+        <w:t xml:space="preserve"> đủ biến; kết nối với Google thật cần Google project (BE-34).</w:t>
+      </w:r>
+    </w:p>
+    <w:p>
+      <w:pPr>
         <w:pBdr>
           <w:bottom w:val="single" w:sz="4" w:space="0" w:color="auto"/>
         </w:pBdr>
@@ -17051,6 +18793,249 @@
       </w:r>
       <w:r>
         <w:t xml:space="preserve"> ghi 238/238 trong khi một test đỏ. Chuỗi lệnh sai ở đâu, và giờ kiểm thế nào trước khi commit?</w:t>
+      </w:r>
+    </w:p>
+    <w:p>
+      <w:pPr>
+        <w:pStyle w:val="ListParagraph"/>
+        <w:numPr>
+          <w:ilvl w:val="0"/>
+          <w:numId w:val="100"/>
+        </w:numPr>
+      </w:pPr>
+      <w:r>
+        <w:t xml:space="preserve">Cookie </w:t>
+      </w:r>
+      <w:r>
+        <w:rPr>
+          <w:rFonts w:ascii="Consolas" w:eastAsia="Consolas" w:hAnsi="Consolas" w:cs="Consolas"/>
+        </w:rPr>
+        <w:t xml:space="preserve">XSRF-TOKEN</w:t>
+      </w:r>
+      <w:r>
+        <w:t xml:space="preserve"> đọc được bằng JavaScript thì có nguy hiểm không? Vì sao trang lạ vẫn không gửi được header </w:t>
+      </w:r>
+      <w:r>
+        <w:rPr>
+          <w:rFonts w:ascii="Consolas" w:eastAsia="Consolas" w:hAnsi="Consolas" w:cs="Consolas"/>
+        </w:rPr>
+        <w:t xml:space="preserve">X-XSRF-TOKEN</w:t>
+      </w:r>
+      <w:r>
+        <w:t xml:space="preserve"> đúng?</w:t>
+      </w:r>
+    </w:p>
+    <w:p>
+      <w:pPr>
+        <w:pStyle w:val="ListParagraph"/>
+        <w:numPr>
+          <w:ilvl w:val="0"/>
+          <w:numId w:val="100"/>
+        </w:numPr>
+      </w:pPr>
+      <w:r>
+        <w:t xml:space="preserve">Vì sao client chỉ thử lại đúng một lần khi gặp </w:t>
+      </w:r>
+      <w:r>
+        <w:rPr>
+          <w:rFonts w:ascii="Consolas" w:eastAsia="Consolas" w:hAnsi="Consolas" w:cs="Consolas"/>
+        </w:rPr>
+        <w:t xml:space="preserve">403 CSRF_TOKEN_INVALID</w:t>
+      </w:r>
+      <w:r>
+        <w:t xml:space="preserve">?</w:t>
+      </w:r>
+    </w:p>
+    <w:p>
+      <w:pPr>
+        <w:pStyle w:val="ListParagraph"/>
+        <w:numPr>
+          <w:ilvl w:val="0"/>
+          <w:numId w:val="100"/>
+        </w:numPr>
+      </w:pPr>
+      <w:r>
+        <w:t xml:space="preserve">Vì sao </w:t>
+      </w:r>
+      <w:r>
+        <w:rPr>
+          <w:rFonts w:ascii="Consolas" w:eastAsia="Consolas" w:hAnsi="Consolas" w:cs="Consolas"/>
+        </w:rPr>
+        <w:t xml:space="preserve">401</w:t>
+      </w:r>
+      <w:r>
+        <w:t xml:space="preserve"> của </w:t>
+      </w:r>
+      <w:r>
+        <w:rPr>
+          <w:rFonts w:ascii="Consolas" w:eastAsia="Consolas" w:hAnsi="Consolas" w:cs="Consolas"/>
+        </w:rPr>
+        <w:t xml:space="preserve">GET /api/auth/me</w:t>
+      </w:r>
+      <w:r>
+        <w:t xml:space="preserve"> được đổi thành </w:t>
+      </w:r>
+      <w:r>
+        <w:rPr>
+          <w:rFonts w:ascii="Consolas" w:eastAsia="Consolas" w:hAnsi="Consolas" w:cs="Consolas"/>
+        </w:rPr>
+        <w:t xml:space="preserve">null</w:t>
+      </w:r>
+      <w:r>
+        <w:t xml:space="preserve"> thay vì để TanStack Query coi là lỗi?</w:t>
+      </w:r>
+    </w:p>
+    <w:p>
+      <w:pPr>
+        <w:pStyle w:val="ListParagraph"/>
+        <w:numPr>
+          <w:ilvl w:val="0"/>
+          <w:numId w:val="100"/>
+        </w:numPr>
+      </w:pPr>
+      <w:r>
+        <w:rPr>
+          <w:rFonts w:ascii="Consolas" w:eastAsia="Consolas" w:hAnsi="Consolas" w:cs="Consolas"/>
+        </w:rPr>
+        <w:t xml:space="preserve">returnTo=//evil.example</w:t>
+      </w:r>
+      <w:r>
+        <w:t xml:space="preserve"> bắt đầu bằng </w:t>
+      </w:r>
+      <w:r>
+        <w:rPr>
+          <w:rFonts w:ascii="Consolas" w:eastAsia="Consolas" w:hAnsi="Consolas" w:cs="Consolas"/>
+        </w:rPr>
+        <w:t xml:space="preserve">/</w:t>
+      </w:r>
+      <w:r>
+        <w:t xml:space="preserve">. Vì sao vẫn bị từ chối, và còn trường hợp nào nữa?</w:t>
+      </w:r>
+    </w:p>
+    <w:p>
+      <w:pPr>
+        <w:pStyle w:val="ListParagraph"/>
+        <w:numPr>
+          <w:ilvl w:val="0"/>
+          <w:numId w:val="100"/>
+        </w:numPr>
+      </w:pPr>
+      <w:r>
+        <w:t xml:space="preserve">Vì sao </w:t>
+      </w:r>
+      <w:r>
+        <w:rPr>
+          <w:rFonts w:ascii="Consolas" w:eastAsia="Consolas" w:hAnsi="Consolas" w:cs="Consolas"/>
+        </w:rPr>
+        <w:t xml:space="preserve">forgetSession</w:t>
+      </w:r>
+      <w:r>
+        <w:t xml:space="preserve"> không dùng </w:t>
+      </w:r>
+      <w:r>
+        <w:rPr>
+          <w:rFonts w:ascii="Consolas" w:eastAsia="Consolas" w:hAnsi="Consolas" w:cs="Consolas"/>
+        </w:rPr>
+        <w:t xml:space="preserve">queryClient.clear()</w:t>
+      </w:r>
+      <w:r>
+        <w:t xml:space="preserve">?</w:t>
+      </w:r>
+    </w:p>
+    <w:p>
+      <w:pPr>
+        <w:pStyle w:val="ListParagraph"/>
+        <w:numPr>
+          <w:ilvl w:val="0"/>
+          <w:numId w:val="100"/>
+        </w:numPr>
+      </w:pPr>
+      <w:r>
+        <w:t xml:space="preserve">Đăng xuất từng ra </w:t>
+      </w:r>
+      <w:r>
+        <w:rPr>
+          <w:rFonts w:ascii="Consolas" w:eastAsia="Consolas" w:hAnsi="Consolas" w:cs="Consolas"/>
+        </w:rPr>
+        <w:t xml:space="preserve">/login?returnTo=%2Finbox</w:t>
+      </w:r>
+      <w:r>
+        <w:t xml:space="preserve">. Log cho thấy gì, và vì sao phải dùng </w:t>
+      </w:r>
+      <w:r>
+        <w:rPr>
+          <w:rFonts w:ascii="Consolas" w:eastAsia="Consolas" w:hAnsi="Consolas" w:cs="Consolas"/>
+        </w:rPr>
+        <w:t xml:space="preserve">RouterProvider</w:t>
+      </w:r>
+      <w:r>
+        <w:t xml:space="preserve"> của </w:t>
+      </w:r>
+      <w:r>
+        <w:rPr>
+          <w:rFonts w:ascii="Consolas" w:eastAsia="Consolas" w:hAnsi="Consolas" w:cs="Consolas"/>
+        </w:rPr>
+        <w:t xml:space="preserve">react-router/dom</w:t>
+      </w:r>
+      <w:r>
+        <w:t xml:space="preserve">?</w:t>
+      </w:r>
+    </w:p>
+    <w:p>
+      <w:pPr>
+        <w:pStyle w:val="ListParagraph"/>
+        <w:numPr>
+          <w:ilvl w:val="0"/>
+          <w:numId w:val="100"/>
+        </w:numPr>
+      </w:pPr>
+      <w:r>
+        <w:t xml:space="preserve">Vì sao lỗi 4xx không được thử lại, còn lỗi mạng và 5xx thì có?</w:t>
+      </w:r>
+    </w:p>
+    <w:p>
+      <w:pPr>
+        <w:pStyle w:val="ListParagraph"/>
+        <w:numPr>
+          <w:ilvl w:val="0"/>
+          <w:numId w:val="100"/>
+        </w:numPr>
+      </w:pPr>
+      <w:r>
+        <w:t xml:space="preserve">D-56 nói "trường API chưa có là null". Màn Tài khoản xử lý câu "1.284 thư đã lưu vẫn còn" thế nào khi chưa biết số?</w:t>
+      </w:r>
+    </w:p>
+    <w:p>
+      <w:pPr>
+        <w:pStyle w:val="ListParagraph"/>
+        <w:numPr>
+          <w:ilvl w:val="0"/>
+          <w:numId w:val="100"/>
+        </w:numPr>
+      </w:pPr>
+      <w:r>
+        <w:t xml:space="preserve">Vì sao bỏ công tắc "Xóa luôn tin nhắn đã lưu" thay vì để nó hiện mà không làm gì?</w:t>
+      </w:r>
+    </w:p>
+    <w:p>
+      <w:pPr>
+        <w:pStyle w:val="ListParagraph"/>
+        <w:numPr>
+          <w:ilvl w:val="0"/>
+          <w:numId w:val="100"/>
+        </w:numPr>
+      </w:pPr>
+      <w:r>
+        <w:t xml:space="preserve">Lỗi "tham số </w:t>
+      </w:r>
+      <w:r>
+        <w:rPr>
+          <w:rFonts w:ascii="Consolas" w:eastAsia="Consolas" w:hAnsi="Consolas" w:cs="Consolas"/>
+        </w:rPr>
+        <w:t xml:space="preserve">?connected</w:t>
+      </w:r>
+      <w:r>
+        <w:t xml:space="preserve"> mất trước khi đọc" có từ CN-03. Vì sao dữ liệu mẫu che được nó, và test thế nào thì bắt được?</w:t>
       </w:r>
     </w:p>
     <w:p/>

</xml_diff>

<commit_message>
fix(in-08): say the server answered with an error, not that it did not answer
On the real backend (no BE-44 yet) the inbox got 404 RESOURCE_NOT_FOUND and
said "Máy chủ Sino không phản hồi", a sentence written while sample data never
failed. failureReason picks the sentence from the status: an HTTP error is
"Máy chủ Sino trả lỗi khi lấy hộp thư."; no answer (status 0) keeps
"Máy chủ Sino không phản hồi.".

Co-Authored-By: Claude Opus 5.5 (1M context) <noreply@anthropic.com>
</commit_message>
<xml_diff>
--- a/docs/knowledge/phase-1-frontend-foundation.docx
+++ b/docs/knowledge/phase-1-frontend-foundation.docx
@@ -18384,6 +18384,61 @@
           <w:b/>
           <w:bCs/>
         </w:rPr>
+        <w:t xml:space="preserve">Lần chạy đầu với backend thật dạy thêm một điều:</w:t>
+      </w:r>
+      <w:r>
+        <w:t xml:space="preserve"> backend chưa có BE-44 nên trả </w:t>
+      </w:r>
+      <w:r>
+        <w:rPr>
+          <w:rFonts w:ascii="Consolas" w:eastAsia="Consolas" w:hAnsi="Consolas" w:cs="Consolas"/>
+        </w:rPr>
+        <w:t xml:space="preserve">404 RESOURCE_NOT_FOUND</w:t>
+      </w:r>
+      <w:r>
+        <w:t xml:space="preserve">, còn màn ghi "Máy chủ Sino không phản hồi", câu viết từ lúc dữ liệu mẫu chưa bao giờ lỗi thật. Máy chủ trả lỗi (có mã HTTP) và máy chủ không trả lời (</w:t>
+      </w:r>
+      <w:r>
+        <w:rPr>
+          <w:rFonts w:ascii="Consolas" w:eastAsia="Consolas" w:hAnsi="Consolas" w:cs="Consolas"/>
+        </w:rPr>
+        <w:t xml:space="preserve">status</w:t>
+      </w:r>
+      <w:r>
+        <w:t xml:space="preserve"> 0) là hai chuyện khác nhau, người dùng xử lý khác nhau; </w:t>
+      </w:r>
+      <w:r>
+        <w:rPr>
+          <w:rFonts w:ascii="Consolas" w:eastAsia="Consolas" w:hAnsi="Consolas" w:cs="Consolas"/>
+        </w:rPr>
+        <w:t xml:space="preserve">failureReason</w:t>
+      </w:r>
+      <w:r>
+        <w:t xml:space="preserve"> chọn câu theo </w:t>
+      </w:r>
+      <w:r>
+        <w:rPr>
+          <w:rFonts w:ascii="Consolas" w:eastAsia="Consolas" w:hAnsi="Consolas" w:cs="Consolas"/>
+        </w:rPr>
+        <w:t xml:space="preserve">status</w:t>
+      </w:r>
+      <w:r>
+        <w:t xml:space="preserve">.</w:t>
+      </w:r>
+    </w:p>
+    <w:p>
+      <w:pPr>
+        <w:pStyle w:val="ListParagraph"/>
+        <w:numPr>
+          <w:ilvl w:val="0"/>
+          <w:numId w:val="1"/>
+        </w:numPr>
+      </w:pPr>
+      <w:r>
+        <w:rPr>
+          <w:b/>
+          <w:bCs/>
+        </w:rPr>
         <w:t xml:space="preserve">Chưa kiểm chứng:</w:t>
       </w:r>
       <w:r>

</xml_diff>

<commit_message>
feat(tk-01): data, sample, text and hooks of the Việc cần làm screen
The contract handed to the backend for F16 (dueAt or dueDate, D-81), ten
sample tasks as on the canvas, the Vietnamese text of rows, groups and the
detail, and the hooks: add, done / reopen at once (the server gives the
next occurrence of a repeating task, D-84; back on failure), notes. The
navigation counts due tasks: NavCounts.tasksOpen becomes tasksDue, read
"tới hạn" (D-83). Shared: LocalDate, shared/time/localDate.ts, dayClockFrom.

Co-Authored-By: Claude Opus 5.5 (1M context) <noreply@anthropic.com>
</commit_message>
<xml_diff>
--- a/docs/knowledge/phase-1-frontend-foundation.docx
+++ b/docs/knowledge/phase-1-frontend-foundation.docx
@@ -18450,6 +18450,515 @@
         <w:pStyle w:val="Heading2"/>
       </w:pPr>
       <w:r>
+        <w:t xml:space="preserve">11. Màn Việc cần làm (fe-ui-tasks)</w:t>
+      </w:r>
+    </w:p>
+    <w:p>
+      <w:pPr>
+        <w:pStyle w:val="Heading3"/>
+      </w:pPr>
+      <w:r>
+        <w:t xml:space="preserve">11.0 Bức tranh</w:t>
+      </w:r>
+    </w:p>
+    <w:p>
+      <w:pPr>
+        <w:pStyle w:val="ListParagraph"/>
+        <w:numPr>
+          <w:ilvl w:val="0"/>
+          <w:numId w:val="1"/>
+        </w:numPr>
+      </w:pPr>
+      <w:r>
+        <w:rPr>
+          <w:b/>
+          <w:bCs/>
+        </w:rPr>
+        <w:t xml:space="preserve">Ở đâu:</w:t>
+      </w:r>
+      <w:r>
+        <w:t xml:space="preserve"> </w:t>
+      </w:r>
+      <w:r>
+        <w:rPr>
+          <w:rFonts w:ascii="Consolas" w:eastAsia="Consolas" w:hAnsi="Consolas" w:cs="Consolas"/>
+        </w:rPr>
+        <w:t xml:space="preserve">src/features/tasks/</w:t>
+      </w:r>
+      <w:r>
+        <w:t xml:space="preserve">; </w:t>
+      </w:r>
+      <w:r>
+        <w:rPr>
+          <w:rFonts w:ascii="Consolas" w:eastAsia="Consolas" w:hAnsi="Consolas" w:cs="Consolas"/>
+        </w:rPr>
+        <w:t xml:space="preserve">src/shared/time/localDate.ts</w:t>
+      </w:r>
+      <w:r>
+        <w:t xml:space="preserve">; </w:t>
+      </w:r>
+      <w:r>
+        <w:rPr>
+          <w:rFonts w:ascii="Consolas" w:eastAsia="Consolas" w:hAnsi="Consolas" w:cs="Consolas"/>
+        </w:rPr>
+        <w:t xml:space="preserve">src/app/shell/{navItems,shell.types,shell.sample}.ts</w:t>
+      </w:r>
+      <w:r>
+        <w:t xml:space="preserve">.</w:t>
+      </w:r>
+    </w:p>
+    <w:p>
+      <w:pPr>
+        <w:pStyle w:val="ListParagraph"/>
+        <w:numPr>
+          <w:ilvl w:val="0"/>
+          <w:numId w:val="1"/>
+        </w:numPr>
+      </w:pPr>
+      <w:r>
+        <w:rPr>
+          <w:b/>
+          <w:bCs/>
+        </w:rPr>
+        <w:t xml:space="preserve">Là gì:</w:t>
+      </w:r>
+      <w:r>
+        <w:t xml:space="preserve"> màn </w:t>
+      </w:r>
+      <w:r>
+        <w:rPr>
+          <w:rFonts w:ascii="Consolas" w:eastAsia="Consolas" w:hAnsi="Consolas" w:cs="Consolas"/>
+        </w:rPr>
+        <w:t xml:space="preserve">/tasks</w:t>
+      </w:r>
+      <w:r>
+        <w:t xml:space="preserve"> dựng trước với dữ liệu mẫu (D-42), hợp đồng giao backend F16. Phạm vi sản phẩm đã chốt từ trước ở </w:t>
+      </w:r>
+      <w:r>
+        <w:rPr>
+          <w:rFonts w:ascii="Consolas" w:eastAsia="Consolas" w:hAnsi="Consolas" w:cs="Consolas"/>
+        </w:rPr>
+        <w:t xml:space="preserve">planner-from-messages</w:t>
+      </w:r>
+      <w:r>
+        <w:t xml:space="preserve"> (D-25, D-27); change này chốt phần giao diện (D-80…D-84, agent chốt, người dùng xem lại).</w:t>
+      </w:r>
+    </w:p>
+    <w:p>
+      <w:pPr>
+        <w:pStyle w:val="Heading3"/>
+      </w:pPr>
+      <w:r>
+        <w:t xml:space="preserve">11.1 Ngày lịch không phải thời điểm (TK-01, D-81)</w:t>
+      </w:r>
+    </w:p>
+    <w:p>
+      <w:pPr>
+        <w:pStyle w:val="ListParagraph"/>
+        <w:numPr>
+          <w:ilvl w:val="0"/>
+          <w:numId w:val="1"/>
+        </w:numPr>
+      </w:pPr>
+      <w:r>
+        <w:rPr>
+          <w:rFonts w:ascii="Consolas" w:eastAsia="Consolas" w:hAnsi="Consolas" w:cs="Consolas"/>
+          <w:b/>
+          <w:bCs/>
+        </w:rPr>
+        <w:t xml:space="preserve">Instant</w:t>
+      </w:r>
+      <w:r>
+        <w:rPr>
+          <w:b/>
+          <w:bCs/>
+        </w:rPr>
+        <w:t xml:space="preserve"> và </w:t>
+      </w:r>
+      <w:r>
+        <w:rPr>
+          <w:rFonts w:ascii="Consolas" w:eastAsia="Consolas" w:hAnsi="Consolas" w:cs="Consolas"/>
+          <w:b/>
+          <w:bCs/>
+        </w:rPr>
+        <w:t xml:space="preserve">LocalDate</w:t>
+      </w:r>
+      <w:r>
+        <w:rPr>
+          <w:b/>
+          <w:bCs/>
+        </w:rPr>
+        <w:t xml:space="preserve">:</w:t>
+      </w:r>
+      <w:r>
+        <w:t xml:space="preserve"> "hạn 17:00 thứ Tư" là một thời điểm (</w:t>
+      </w:r>
+      <w:r>
+        <w:rPr>
+          <w:rFonts w:ascii="Consolas" w:eastAsia="Consolas" w:hAnsi="Consolas" w:cs="Consolas"/>
+        </w:rPr>
+        <w:t xml:space="preserve">2026-10-07T10:00:00Z</w:t>
+      </w:r>
+      <w:r>
+        <w:t xml:space="preserve">). "Hạn cả ngày 15/10" là một </w:t>
+      </w:r>
+      <w:r>
+        <w:rPr>
+          <w:b/>
+          <w:bCs/>
+        </w:rPr>
+        <w:t xml:space="preserve">ngày lịch</w:t>
+      </w:r>
+      <w:r>
+        <w:t xml:space="preserve"> (</w:t>
+      </w:r>
+      <w:r>
+        <w:rPr>
+          <w:rFonts w:ascii="Consolas" w:eastAsia="Consolas" w:hAnsi="Consolas" w:cs="Consolas"/>
+        </w:rPr>
+        <w:t xml:space="preserve">"2026-10-15"</w:t>
+      </w:r>
+      <w:r>
+        <w:t xml:space="preserve">): ở Việt Nam hay ở Paris thì vẫn là ngày 15. Viết ngày cả-ngày thành thời điểm thì phải chọn nửa đêm của múi giờ nào, và đọc ở múi giờ khác sẽ thành ngày 14. Hợp đồng có hai trường riêng, </w:t>
+      </w:r>
+      <w:r>
+        <w:rPr>
+          <w:rFonts w:ascii="Consolas" w:eastAsia="Consolas" w:hAnsi="Consolas" w:cs="Consolas"/>
+        </w:rPr>
+        <w:t xml:space="preserve">dueAt</w:t>
+      </w:r>
+      <w:r>
+        <w:t xml:space="preserve"> và </w:t>
+      </w:r>
+      <w:r>
+        <w:rPr>
+          <w:rFonts w:ascii="Consolas" w:eastAsia="Consolas" w:hAnsi="Consolas" w:cs="Consolas"/>
+        </w:rPr>
+        <w:t xml:space="preserve">dueDate</w:t>
+      </w:r>
+      <w:r>
+        <w:t xml:space="preserve">, giống hai cột </w:t>
+      </w:r>
+      <w:r>
+        <w:rPr>
+          <w:rFonts w:ascii="Consolas" w:eastAsia="Consolas" w:hAnsi="Consolas" w:cs="Consolas"/>
+        </w:rPr>
+        <w:t xml:space="preserve">due_at</w:t>
+      </w:r>
+      <w:r>
+        <w:t xml:space="preserve">, </w:t>
+      </w:r>
+      <w:r>
+        <w:rPr>
+          <w:rFonts w:ascii="Consolas" w:eastAsia="Consolas" w:hAnsi="Consolas" w:cs="Consolas"/>
+        </w:rPr>
+        <w:t xml:space="preserve">due_date</w:t>
+      </w:r>
+      <w:r>
+        <w:t xml:space="preserve"> của backend.</w:t>
+      </w:r>
+    </w:p>
+    <w:p>
+      <w:pPr>
+        <w:pStyle w:val="ListParagraph"/>
+        <w:numPr>
+          <w:ilvl w:val="0"/>
+          <w:numId w:val="1"/>
+        </w:numPr>
+      </w:pPr>
+      <w:r>
+        <w:rPr>
+          <w:b/>
+          <w:bCs/>
+        </w:rPr>
+        <w:t xml:space="preserve">Tính trên ngày lịch không cần múi giờ:</w:t>
+      </w:r>
+      <w:r>
+        <w:t xml:space="preserve"> </w:t>
+      </w:r>
+      <w:r>
+        <w:rPr>
+          <w:rFonts w:ascii="Consolas" w:eastAsia="Consolas" w:hAnsi="Consolas" w:cs="Consolas"/>
+        </w:rPr>
+        <w:t xml:space="preserve">localDate.ts</w:t>
+      </w:r>
+      <w:r>
+        <w:t xml:space="preserve"> đổi </w:t>
+      </w:r>
+      <w:r>
+        <w:rPr>
+          <w:rFonts w:ascii="Consolas" w:eastAsia="Consolas" w:hAnsi="Consolas" w:cs="Consolas"/>
+        </w:rPr>
+        <w:t xml:space="preserve">"2026-10-15"</w:t>
+      </w:r>
+      <w:r>
+        <w:t xml:space="preserve"> thành nửa đêm UTC chỉ để đếm và cộng ngày; so sánh hai ngày là so sánh chuỗi (</w:t>
+      </w:r>
+      <w:r>
+        <w:rPr>
+          <w:rFonts w:ascii="Consolas" w:eastAsia="Consolas" w:hAnsi="Consolas" w:cs="Consolas"/>
+        </w:rPr>
+        <w:t xml:space="preserve">"2026-09-30" &lt; "2026-10-02"</w:t>
+      </w:r>
+      <w:r>
+        <w:t xml:space="preserve">), vì dạng năm-tháng-ngày xếp theo chữ cũng đúng theo thời gian.</w:t>
+      </w:r>
+    </w:p>
+    <w:p>
+      <w:pPr>
+        <w:pStyle w:val="ListParagraph"/>
+        <w:numPr>
+          <w:ilvl w:val="0"/>
+          <w:numId w:val="1"/>
+        </w:numPr>
+      </w:pPr>
+      <w:r>
+        <w:rPr>
+          <w:b/>
+          <w:bCs/>
+        </w:rPr>
+        <w:t xml:space="preserve">"Quá hạn" khác nhau cho hai loại hạn:</w:t>
+      </w:r>
+      <w:r>
+        <w:t xml:space="preserve"> hạn có giờ quá hạn ngay khi qua giờ đó (09:00 hôm nay, bây giờ 14:05 → "Hạn 09:00 · trễ 5 giờ"); hạn cả ngày chỉ quá hạn khi ngày đó hết.</w:t>
+      </w:r>
+    </w:p>
+    <w:p>
+      <w:pPr>
+        <w:pStyle w:val="Heading3"/>
+      </w:pPr>
+      <w:r>
+        <w:t xml:space="preserve">11.2 Ai tính lần kế tiếp của việc lặp (D-84)</w:t>
+      </w:r>
+    </w:p>
+    <w:p>
+      <w:pPr>
+        <w:pStyle w:val="ListParagraph"/>
+        <w:numPr>
+          <w:ilvl w:val="0"/>
+          <w:numId w:val="1"/>
+        </w:numPr>
+      </w:pPr>
+      <w:r>
+        <w:t xml:space="preserve">Đánh dấu xong một việc lặp thì máy chủ tạo lần kế tiếp và trả về </w:t>
+      </w:r>
+      <w:r>
+        <w:rPr>
+          <w:rFonts w:ascii="Consolas" w:eastAsia="Consolas" w:hAnsi="Consolas" w:cs="Consolas"/>
+        </w:rPr>
+        <w:t xml:space="preserve">{ task, next }</w:t>
+      </w:r>
+      <w:r>
+        <w:t xml:space="preserve">. Web không tự tính: quy tắc lặp có nhiều ca biên (ngày 31 sang tháng 30 ngày rồi quay lại 31, 29/02, xong trễ nhiều tuần thì bỏ các lần đã lỡ), viết ở hai nơi thì sẽ có lúc lệch. Dữ liệu mẫu có </w:t>
+      </w:r>
+      <w:r>
+        <w:rPr>
+          <w:rFonts w:ascii="Consolas" w:eastAsia="Consolas" w:hAnsi="Consolas" w:cs="Consolas"/>
+        </w:rPr>
+        <w:t xml:space="preserve">nextOccurrenceSample</w:t>
+      </w:r>
+      <w:r>
+        <w:t xml:space="preserve"> chỉ đủ cho bốn việc mẫu, và nói rõ điều đó.</w:t>
+      </w:r>
+    </w:p>
+    <w:p>
+      <w:pPr>
+        <w:pStyle w:val="ListParagraph"/>
+        <w:numPr>
+          <w:ilvl w:val="0"/>
+          <w:numId w:val="1"/>
+        </w:numPr>
+      </w:pPr>
+      <w:r>
+        <w:rPr>
+          <w:b/>
+          <w:bCs/>
+        </w:rPr>
+        <w:t xml:space="preserve">Bẫy, tạo hai lần:</w:t>
+      </w:r>
+      <w:r>
+        <w:t xml:space="preserve"> xong → mở lại → xong lần nữa thì máy chủ mẫu trả lại cùng một lần kế tiếp; hook bỏ qua lần đã có (cùng chuỗi, cùng hạn), như máy chủ thật sẽ làm.</w:t>
+      </w:r>
+    </w:p>
+    <w:p>
+      <w:pPr>
+        <w:pStyle w:val="Heading3"/>
+      </w:pPr>
+      <w:r>
+        <w:t xml:space="preserve">11.3 Con số trên điều hướng là gì (D-83)</w:t>
+      </w:r>
+    </w:p>
+    <w:p>
+      <w:pPr>
+        <w:pStyle w:val="ListParagraph"/>
+        <w:numPr>
+          <w:ilvl w:val="0"/>
+          <w:numId w:val="1"/>
+        </w:numPr>
+      </w:pPr>
+      <w:r>
+        <w:t xml:space="preserve">Canvas ghi "Việc cần làm 3" ở thanh bên nhưng "8 việc đang mở" trong màn. 3 = 1 quá hạn + 2 hôm nay, nên con số là việc </w:t>
+      </w:r>
+      <w:r>
+        <w:rPr>
+          <w:b/>
+          <w:bCs/>
+        </w:rPr>
+        <w:t xml:space="preserve">tới hạn</w:t>
+      </w:r>
+      <w:r>
+        <w:t xml:space="preserve">. Đổi tên trường </w:t>
+      </w:r>
+      <w:r>
+        <w:rPr>
+          <w:rFonts w:ascii="Consolas" w:eastAsia="Consolas" w:hAnsi="Consolas" w:cs="Consolas"/>
+        </w:rPr>
+        <w:t xml:space="preserve">tasksOpen</w:t>
+      </w:r>
+      <w:r>
+        <w:t xml:space="preserve"> → </w:t>
+      </w:r>
+      <w:r>
+        <w:rPr>
+          <w:rFonts w:ascii="Consolas" w:eastAsia="Consolas" w:hAnsi="Consolas" w:cs="Consolas"/>
+        </w:rPr>
+        <w:t xml:space="preserve">tasksDue</w:t>
+      </w:r>
+      <w:r>
+        <w:t xml:space="preserve"> để tên nói đúng nghĩa (tên sai sẽ dẫn người sau đếm sai), chữ đọc "Việc cần làm, 3 tới hạn".</w:t>
+      </w:r>
+    </w:p>
+    <w:p>
+      <w:pPr>
+        <w:pStyle w:val="ListParagraph"/>
+        <w:numPr>
+          <w:ilvl w:val="0"/>
+          <w:numId w:val="1"/>
+        </w:numPr>
+      </w:pPr>
+      <w:r>
+        <w:t xml:space="preserve">Trên dữ liệu mẫu, mỗi thay đổi tính lại hai số từ danh sách (không cộng trừ), nên không bao giờ lệch.</w:t>
+      </w:r>
+    </w:p>
+    <w:p>
+      <w:pPr>
+        <w:pStyle w:val="Heading3"/>
+      </w:pPr>
+      <w:r>
+        <w:t xml:space="preserve">11.4 Kiểm chứng TK-01</w:t>
+      </w:r>
+    </w:p>
+    <w:p>
+      <w:pPr>
+        <w:pStyle w:val="ListParagraph"/>
+        <w:numPr>
+          <w:ilvl w:val="0"/>
+          <w:numId w:val="1"/>
+        </w:numPr>
+      </w:pPr>
+      <w:r>
+        <w:t xml:space="preserve">36 lỗi gài, 27 bị bắt ngay. Chín lỗi sống dạy ba điều:</w:t>
+      </w:r>
+    </w:p>
+    <w:p>
+      <w:pPr>
+        <w:pStyle w:val="ListParagraph"/>
+        <w:numPr>
+          <w:ilvl w:val="1"/>
+          <w:numId w:val="1"/>
+        </w:numPr>
+      </w:pPr>
+      <w:r>
+        <w:rPr>
+          <w:b/>
+          <w:bCs/>
+        </w:rPr>
+        <w:t xml:space="preserve">Điều kiện thừa:</w:t>
+      </w:r>
+      <w:r>
+        <w:t xml:space="preserve"> một kiểm tra mà mọi nơi gọi đã làm trước → bỏ.</w:t>
+      </w:r>
+    </w:p>
+    <w:p>
+      <w:pPr>
+        <w:pStyle w:val="ListParagraph"/>
+        <w:numPr>
+          <w:ilvl w:val="1"/>
+          <w:numId w:val="1"/>
+        </w:numPr>
+      </w:pPr>
+      <w:r>
+        <w:rPr>
+          <w:b/>
+          <w:bCs/>
+        </w:rPr>
+        <w:t xml:space="preserve">Ca biên chưa có test (7):</w:t>
+      </w:r>
+      <w:r>
+        <w:t xml:space="preserve"> hạn đúng bằng bây giờ, trễ 45 phút, ngày 31… → thêm test.</w:t>
+      </w:r>
+    </w:p>
+    <w:p>
+      <w:pPr>
+        <w:pStyle w:val="ListParagraph"/>
+        <w:numPr>
+          <w:ilvl w:val="1"/>
+          <w:numId w:val="1"/>
+        </w:numPr>
+      </w:pPr>
+      <w:r>
+        <w:rPr>
+          <w:b/>
+          <w:bCs/>
+        </w:rPr>
+        <w:t xml:space="preserve">Lỗi chỉ lộ ở múi giờ khác:</w:t>
+      </w:r>
+      <w:r>
+        <w:t xml:space="preserve"> </w:t>
+      </w:r>
+      <w:r>
+        <w:rPr>
+          <w:rFonts w:ascii="Consolas" w:eastAsia="Consolas" w:hAnsi="Consolas" w:cs="Consolas"/>
+        </w:rPr>
+        <w:t xml:space="preserve">getUTCDay()</w:t>
+      </w:r>
+      <w:r>
+        <w:t xml:space="preserve"> → </w:t>
+      </w:r>
+      <w:r>
+        <w:rPr>
+          <w:rFonts w:ascii="Consolas" w:eastAsia="Consolas" w:hAnsi="Consolas" w:cs="Consolas"/>
+        </w:rPr>
+        <w:t xml:space="preserve">getDay()</w:t>
+      </w:r>
+      <w:r>
+        <w:t xml:space="preserve"> cho cùng kết quả ở múi giờ dương như Việt Nam (nửa đêm UTC là 07:00 cùng ngày) nhưng sai ở múi giờ âm. Test chạy cố định </w:t>
+      </w:r>
+      <w:r>
+        <w:rPr>
+          <w:rFonts w:ascii="Consolas" w:eastAsia="Consolas" w:hAnsi="Consolas" w:cs="Consolas"/>
+        </w:rPr>
+        <w:t xml:space="preserve">Asia/Ho_Chi_Minh</w:t>
+      </w:r>
+      <w:r>
+        <w:t xml:space="preserve"> nên không thấy. </w:t>
+      </w:r>
+      <w:r>
+        <w:rPr>
+          <w:b/>
+          <w:bCs/>
+        </w:rPr>
+        <w:t xml:space="preserve">Bài học:</w:t>
+      </w:r>
+      <w:r>
+        <w:t xml:space="preserve"> một lỗi gài sống không luôn nghĩa là thiếu test; có khi là môi trường test không đủ rộng. Ghi lại là đủ, không đổi cấu hình test chỉ vì một dòng.</w:t>
+      </w:r>
+    </w:p>
+    <w:p>
+      <w:pPr>
+        <w:pStyle w:val="Heading2"/>
+      </w:pPr>
+      <w:r>
         <w:t xml:space="preserve">Tự kiểm tra</w:t>
       </w:r>
     </w:p>
@@ -20218,6 +20727,108 @@
       </w:pPr>
       <w:r>
         <w:t xml:space="preserve">Vì sao test "máy chủ từ chối đọc" phải cho máy chủ giả trả lời chậm 50 ms mới bắt được lỗi "đọc lại vô tận"?</w:t>
+      </w:r>
+    </w:p>
+    <w:p>
+      <w:pPr>
+        <w:pStyle w:val="ListParagraph"/>
+        <w:numPr>
+          <w:ilvl w:val="0"/>
+          <w:numId w:val="100"/>
+        </w:numPr>
+      </w:pPr>
+      <w:r>
+        <w:t xml:space="preserve">D-81: vì sao hạn cả ngày là </w:t>
+      </w:r>
+      <w:r>
+        <w:rPr>
+          <w:rFonts w:ascii="Consolas" w:eastAsia="Consolas" w:hAnsi="Consolas" w:cs="Consolas"/>
+        </w:rPr>
+        <w:t xml:space="preserve">"2026-10-15"</w:t>
+      </w:r>
+      <w:r>
+        <w:t xml:space="preserve"> chứ không phải một </w:t>
+      </w:r>
+      <w:r>
+        <w:rPr>
+          <w:rFonts w:ascii="Consolas" w:eastAsia="Consolas" w:hAnsi="Consolas" w:cs="Consolas"/>
+        </w:rPr>
+        <w:t xml:space="preserve">Instant</w:t>
+      </w:r>
+      <w:r>
+        <w:t xml:space="preserve"> lúc nửa đêm?</w:t>
+      </w:r>
+    </w:p>
+    <w:p>
+      <w:pPr>
+        <w:pStyle w:val="ListParagraph"/>
+        <w:numPr>
+          <w:ilvl w:val="0"/>
+          <w:numId w:val="100"/>
+        </w:numPr>
+      </w:pPr>
+      <w:r>
+        <w:t xml:space="preserve">Vì sao web không tự tính lần kế tiếp của việc lặp, dù dữ liệu mẫu có tính?</w:t>
+      </w:r>
+    </w:p>
+    <w:p>
+      <w:pPr>
+        <w:pStyle w:val="ListParagraph"/>
+        <w:numPr>
+          <w:ilvl w:val="0"/>
+          <w:numId w:val="100"/>
+        </w:numPr>
+      </w:pPr>
+      <w:r>
+        <w:t xml:space="preserve">Con số "3" cạnh "Việc cần làm" đếm gì, và vì sao đổi tên </w:t>
+      </w:r>
+      <w:r>
+        <w:rPr>
+          <w:rFonts w:ascii="Consolas" w:eastAsia="Consolas" w:hAnsi="Consolas" w:cs="Consolas"/>
+        </w:rPr>
+        <w:t xml:space="preserve">tasksOpen</w:t>
+      </w:r>
+      <w:r>
+        <w:t xml:space="preserve"> thành </w:t>
+      </w:r>
+      <w:r>
+        <w:rPr>
+          <w:rFonts w:ascii="Consolas" w:eastAsia="Consolas" w:hAnsi="Consolas" w:cs="Consolas"/>
+        </w:rPr>
+        <w:t xml:space="preserve">tasksDue</w:t>
+      </w:r>
+      <w:r>
+        <w:t xml:space="preserve">?</w:t>
+      </w:r>
+    </w:p>
+    <w:p>
+      <w:pPr>
+        <w:pStyle w:val="ListParagraph"/>
+        <w:numPr>
+          <w:ilvl w:val="0"/>
+          <w:numId w:val="100"/>
+        </w:numPr>
+      </w:pPr>
+      <w:r>
+        <w:t xml:space="preserve">Lỗi gài </w:t>
+      </w:r>
+      <w:r>
+        <w:rPr>
+          <w:rFonts w:ascii="Consolas" w:eastAsia="Consolas" w:hAnsi="Consolas" w:cs="Consolas"/>
+        </w:rPr>
+        <w:t xml:space="preserve">getUTCDay()</w:t>
+      </w:r>
+      <w:r>
+        <w:t xml:space="preserve"> → </w:t>
+      </w:r>
+      <w:r>
+        <w:rPr>
+          <w:rFonts w:ascii="Consolas" w:eastAsia="Consolas" w:hAnsi="Consolas" w:cs="Consolas"/>
+        </w:rPr>
+        <w:t xml:space="preserve">getDay()</w:t>
+      </w:r>
+      <w:r>
+        <w:t xml:space="preserve"> sống. Vì sao, và vì sao không đổi cấu hình test để bắt nó?</w:t>
       </w:r>
     </w:p>
     <w:p/>

</xml_diff>

<commit_message>
feat(tk-02): Việc cần làm on desktop: groups, filter, quick add, detail
/tasks and /tasks/:taskId from the canvas Tasks: the list in its groups
with the filter in the address, the quick add (Enter, no spaces-only,
200 characters), rows whose done box is a real checkbox beside the link
that opens the task, and the detail column (due, reminder, repeat, the
source message, notes saved on blur, related items). Below 1280 px an
open task takes the place of the list (D-82). TasksData also carries the
provider names.

Co-Authored-By: Claude Opus 5.5 (1M context) <noreply@anthropic.com>
</commit_message>
<xml_diff>
--- a/docs/knowledge/phase-1-frontend-foundation.docx
+++ b/docs/knowledge/phase-1-frontend-foundation.docx
@@ -18956,6 +18956,162 @@
     </w:p>
     <w:p>
       <w:pPr>
+        <w:pStyle w:val="Heading3"/>
+      </w:pPr>
+      <w:r>
+        <w:t xml:space="preserve">11.5 Desktop (TK-02)</w:t>
+      </w:r>
+    </w:p>
+    <w:p>
+      <w:pPr>
+        <w:pStyle w:val="ListParagraph"/>
+        <w:numPr>
+          <w:ilvl w:val="0"/>
+          <w:numId w:val="1"/>
+        </w:numPr>
+      </w:pPr>
+      <w:r>
+        <w:rPr>
+          <w:b/>
+          <w:bCs/>
+        </w:rPr>
+        <w:t xml:space="preserve">Hai thứ bấm được không lồng nhau:</w:t>
+      </w:r>
+      <w:r>
+        <w:t xml:space="preserve"> một dòng vừa có ô xong vừa mở được việc. Đặt nút trong liên kết là HTML sai (trình duyệt và trình đọc màn hình xử lý khác nhau). Dòng là lưới hai cột: ô xong, rồi một liên kết gồm tiêu đề và các dòng.</w:t>
+      </w:r>
+    </w:p>
+    <w:p>
+      <w:pPr>
+        <w:pStyle w:val="ListParagraph"/>
+        <w:numPr>
+          <w:ilvl w:val="0"/>
+          <w:numId w:val="1"/>
+        </w:numPr>
+      </w:pPr>
+      <w:r>
+        <w:rPr>
+          <w:b/>
+          <w:bCs/>
+        </w:rPr>
+        <w:t xml:space="preserve">Checkbox thật cho ô xong:</w:t>
+      </w:r>
+      <w:r>
+        <w:t xml:space="preserve"> canvas viết </w:t>
+      </w:r>
+      <w:r>
+        <w:rPr>
+          <w:rFonts w:ascii="Consolas" w:eastAsia="Consolas" w:hAnsi="Consolas" w:cs="Consolas"/>
+        </w:rPr>
+        <w:t xml:space="preserve">.check { appearance: none }</w:t>
+      </w:r>
+      <w:r>
+        <w:t xml:space="preserve">, tức là một checkbox được vẽ lại. Dùng </w:t>
+      </w:r>
+      <w:r>
+        <w:rPr>
+          <w:rFonts w:ascii="Consolas" w:eastAsia="Consolas" w:hAnsi="Consolas" w:cs="Consolas"/>
+        </w:rPr>
+        <w:t xml:space="preserve">&lt;input type="checkbox"&gt;</w:t>
+      </w:r>
+      <w:r>
+        <w:t xml:space="preserve"> thì trình đọc màn hình nói được "đã chọn", phím cách đánh dấu được, không phải tự viết.</w:t>
+      </w:r>
+    </w:p>
+    <w:p>
+      <w:pPr>
+        <w:pStyle w:val="ListParagraph"/>
+        <w:numPr>
+          <w:ilvl w:val="0"/>
+          <w:numId w:val="1"/>
+        </w:numPr>
+      </w:pPr>
+      <w:r>
+        <w:rPr>
+          <w:b/>
+          <w:bCs/>
+        </w:rPr>
+        <w:t xml:space="preserve">Bẫy, cột flex có cuộn co phần tử con:</w:t>
+      </w:r>
+      <w:r>
+        <w:t xml:space="preserve"> danh sách là </w:t>
+      </w:r>
+      <w:r>
+        <w:rPr>
+          <w:rFonts w:ascii="Consolas" w:eastAsia="Consolas" w:hAnsi="Consolas" w:cs="Consolas"/>
+        </w:rPr>
+        <w:t xml:space="preserve">flex-col</w:t>
+      </w:r>
+      <w:r>
+        <w:t xml:space="preserve"> + </w:t>
+      </w:r>
+      <w:r>
+        <w:rPr>
+          <w:rFonts w:ascii="Consolas" w:eastAsia="Consolas" w:hAnsi="Consolas" w:cs="Consolas"/>
+        </w:rPr>
+        <w:t xml:space="preserve">overflow-auto</w:t>
+      </w:r>
+      <w:r>
+        <w:t xml:space="preserve">. Khi nội dung dài hơn khung, các phần tử con được phép co (</w:t>
+      </w:r>
+      <w:r>
+        <w:rPr>
+          <w:rFonts w:ascii="Consolas" w:eastAsia="Consolas" w:hAnsi="Consolas" w:cs="Consolas"/>
+        </w:rPr>
+        <w:t xml:space="preserve">flex-shrink: 1</w:t>
+      </w:r>
+      <w:r>
+        <w:t xml:space="preserve">) tới chiều cao tối thiểu của nội dung. Ô thêm việc đặt </w:t>
+      </w:r>
+      <w:r>
+        <w:rPr>
+          <w:rFonts w:ascii="Consolas" w:eastAsia="Consolas" w:hAnsi="Consolas" w:cs="Consolas"/>
+        </w:rPr>
+        <w:t xml:space="preserve">h-13</w:t>
+      </w:r>
+      <w:r>
+        <w:t xml:space="preserve"> (52 px) nhưng nội dung chỉ cao 20 px, nên bị ép còn 25 px. Test không thấy (jsdom không tính bố cục); ảnh Chrome thấy. Sửa: </w:t>
+      </w:r>
+      <w:r>
+        <w:rPr>
+          <w:rFonts w:ascii="Consolas" w:eastAsia="Consolas" w:hAnsi="Consolas" w:cs="Consolas"/>
+        </w:rPr>
+        <w:t xml:space="preserve">*:shrink-0</w:t>
+      </w:r>
+      <w:r>
+        <w:t xml:space="preserve"> cho con của cột.</w:t>
+      </w:r>
+    </w:p>
+    <w:p>
+      <w:pPr>
+        <w:pStyle w:val="ListParagraph"/>
+        <w:numPr>
+          <w:ilvl w:val="0"/>
+          <w:numId w:val="1"/>
+        </w:numPr>
+      </w:pPr>
+      <w:r>
+        <w:rPr>
+          <w:b/>
+          <w:bCs/>
+        </w:rPr>
+        <w:t xml:space="preserve">Bẫy, test "không lưu" bằng so sánh object:</w:t>
+      </w:r>
+      <w:r>
+        <w:t xml:space="preserve"> TanStack Query giữ nguyên object khi dữ liệu mới bằng dữ liệu cũ (chia sẻ cấu trúc), nên "object không đổi" không chứng minh được là không có lần lưu nào. Test theo dõi chính lời gọi </w:t>
+      </w:r>
+      <w:r>
+        <w:rPr>
+          <w:rFonts w:ascii="Consolas" w:eastAsia="Consolas" w:hAnsi="Consolas" w:cs="Consolas"/>
+        </w:rPr>
+        <w:t xml:space="preserve">saveTaskNotes</w:t>
+      </w:r>
+      <w:r>
+        <w:t xml:space="preserve">.</w:t>
+      </w:r>
+    </w:p>
+    <w:p>
+      <w:pPr>
         <w:pStyle w:val="Heading2"/>
       </w:pPr>
       <w:r>
@@ -20829,6 +20985,30 @@
       </w:r>
       <w:r>
         <w:t xml:space="preserve"> sống. Vì sao, và vì sao không đổi cấu hình test để bắt nó?</w:t>
+      </w:r>
+    </w:p>
+    <w:p>
+      <w:pPr>
+        <w:pStyle w:val="ListParagraph"/>
+        <w:numPr>
+          <w:ilvl w:val="0"/>
+          <w:numId w:val="100"/>
+        </w:numPr>
+      </w:pPr>
+      <w:r>
+        <w:t xml:space="preserve">Vì sao ô đánh dấu xong là một checkbox thật, và vì sao nó không nằm trong liên kết mở việc?</w:t>
+      </w:r>
+    </w:p>
+    <w:p>
+      <w:pPr>
+        <w:pStyle w:val="ListParagraph"/>
+        <w:numPr>
+          <w:ilvl w:val="0"/>
+          <w:numId w:val="100"/>
+        </w:numPr>
+      </w:pPr>
+      <w:r>
+        <w:t xml:space="preserve">Ô thêm việc bị ép còn 25 px trong Chrome mà test vẫn xanh. Vì sao bị ép, và vì sao test không thấy?</w:t>
       </w:r>
     </w:p>
     <w:p/>

</xml_diff>

<commit_message>
feat(tk-03): Việc cần làm on a phone and a tablet, and its states
Below 768 px the list has its own header as in MobileTasks ("8 đang mở",
a "Lọc" menu of radio items) and full-width rows; an open task below
1280 px is a sub-page with a way back that keeps the filter and no tab
bar. Loading, cannot load (with "Thử lại"), no task yet and no match for
the filter. Shared: radio items in the dropdown menu, useMediaQuery for
the one text CSS cannot switch (the quick add placeholder).

Co-Authored-By: Claude Opus 5.5 (1M context) <noreply@anthropic.com>
</commit_message>
<xml_diff>
--- a/docs/knowledge/phase-1-frontend-foundation.docx
+++ b/docs/knowledge/phase-1-frontend-foundation.docx
@@ -19112,6 +19112,189 @@
     </w:p>
     <w:p>
       <w:pPr>
+        <w:pStyle w:val="Heading3"/>
+      </w:pPr>
+      <w:r>
+        <w:t xml:space="preserve">11.6 Điện thoại và trạng thái (TK-03)</w:t>
+      </w:r>
+    </w:p>
+    <w:p>
+      <w:pPr>
+        <w:pStyle w:val="ListParagraph"/>
+        <w:numPr>
+          <w:ilvl w:val="0"/>
+          <w:numId w:val="1"/>
+        </w:numPr>
+      </w:pPr>
+      <w:r>
+        <w:rPr>
+          <w:b/>
+          <w:bCs/>
+        </w:rPr>
+        <w:t xml:space="preserve">Bố cục theo CSS, chữ theo JavaScript:</w:t>
+      </w:r>
+      <w:r>
+        <w:t xml:space="preserve"> ẩn/hiện và đổi bố cục theo cỡ màn đều là lớp </w:t>
+      </w:r>
+      <w:r>
+        <w:rPr>
+          <w:rFonts w:ascii="Consolas" w:eastAsia="Consolas" w:hAnsi="Consolas" w:cs="Consolas"/>
+        </w:rPr>
+        <w:t xml:space="preserve">md:</w:t>
+      </w:r>
+      <w:r>
+        <w:t xml:space="preserve">, </w:t>
+      </w:r>
+      <w:r>
+        <w:rPr>
+          <w:rFonts w:ascii="Consolas" w:eastAsia="Consolas" w:hAnsi="Consolas" w:cs="Consolas"/>
+        </w:rPr>
+        <w:t xml:space="preserve">xl:</w:t>
+      </w:r>
+      <w:r>
+        <w:t xml:space="preserve">. Riêng chữ gợi ý của ô nhập ("Thêm việc mới" trên điện thoại, cả câu trên màn lớn) CSS không đổi được, nên dùng </w:t>
+      </w:r>
+      <w:r>
+        <w:rPr>
+          <w:rFonts w:ascii="Consolas" w:eastAsia="Consolas" w:hAnsi="Consolas" w:cs="Consolas"/>
+        </w:rPr>
+        <w:t xml:space="preserve">useMediaQuery</w:t>
+      </w:r>
+      <w:r>
+        <w:t xml:space="preserve">, viết bằng </w:t>
+      </w:r>
+      <w:r>
+        <w:rPr>
+          <w:rFonts w:ascii="Consolas" w:eastAsia="Consolas" w:hAnsi="Consolas" w:cs="Consolas"/>
+        </w:rPr>
+        <w:t xml:space="preserve">useSyncExternalStore</w:t>
+      </w:r>
+      <w:r>
+        <w:t xml:space="preserve">: React đọc </w:t>
+      </w:r>
+      <w:r>
+        <w:rPr>
+          <w:rFonts w:ascii="Consolas" w:eastAsia="Consolas" w:hAnsi="Consolas" w:cs="Consolas"/>
+        </w:rPr>
+        <w:t xml:space="preserve">matchMedia(...).matches</w:t>
+      </w:r>
+      <w:r>
+        <w:t xml:space="preserve"> và vẽ lại khi trình duyệt báo đổi.</w:t>
+      </w:r>
+    </w:p>
+    <w:p>
+      <w:pPr>
+        <w:pStyle w:val="ListParagraph"/>
+        <w:numPr>
+          <w:ilvl w:val="0"/>
+          <w:numId w:val="1"/>
+        </w:numPr>
+      </w:pPr>
+      <w:r>
+        <w:rPr>
+          <w:b/>
+          <w:bCs/>
+        </w:rPr>
+        <w:t xml:space="preserve">Một trang chi tiết, ba cách hiện:</w:t>
+      </w:r>
+      <w:r>
+        <w:t xml:space="preserve"> cùng một khối chi tiết là cột phải từ 1280 px, là trang thay chỗ danh sách ở tablet, và có thêm đầu trang con (nút quay lại) trên điện thoại. Khung app biết trang muốn gì qua </w:t>
+      </w:r>
+      <w:r>
+        <w:rPr>
+          <w:rFonts w:ascii="Consolas" w:eastAsia="Consolas" w:hAnsi="Consolas" w:cs="Consolas"/>
+        </w:rPr>
+        <w:t xml:space="preserve">handle</w:t>
+      </w:r>
+      <w:r>
+        <w:t xml:space="preserve"> của route: </w:t>
+      </w:r>
+      <w:r>
+        <w:rPr>
+          <w:rFonts w:ascii="Consolas" w:eastAsia="Consolas" w:hAnsi="Consolas" w:cs="Consolas"/>
+        </w:rPr>
+        <w:t xml:space="preserve">mobilePageHeader</w:t>
+      </w:r>
+      <w:r>
+        <w:t xml:space="preserve"> (ẩn thanh trên của khung), </w:t>
+      </w:r>
+      <w:r>
+        <w:rPr>
+          <w:rFonts w:ascii="Consolas" w:eastAsia="Consolas" w:hAnsi="Consolas" w:cs="Consolas"/>
+        </w:rPr>
+        <w:t xml:space="preserve">hideTabBar</w:t>
+      </w:r>
+      <w:r>
+        <w:t xml:space="preserve"> (bỏ thanh tab ở trang con).</w:t>
+      </w:r>
+    </w:p>
+    <w:p>
+      <w:pPr>
+        <w:pStyle w:val="ListParagraph"/>
+        <w:numPr>
+          <w:ilvl w:val="0"/>
+          <w:numId w:val="1"/>
+        </w:numPr>
+      </w:pPr>
+      <w:r>
+        <w:rPr>
+          <w:b/>
+          <w:bCs/>
+        </w:rPr>
+        <w:t xml:space="preserve">Menu chọn một trong nhiều:</w:t>
+      </w:r>
+      <w:r>
+        <w:t xml:space="preserve"> </w:t>
+      </w:r>
+      <w:r>
+        <w:rPr>
+          <w:rFonts w:ascii="Consolas" w:eastAsia="Consolas" w:hAnsi="Consolas" w:cs="Consolas"/>
+        </w:rPr>
+        <w:t xml:space="preserve">menuitemradio</w:t>
+      </w:r>
+      <w:r>
+        <w:t xml:space="preserve"> + </w:t>
+      </w:r>
+      <w:r>
+        <w:rPr>
+          <w:rFonts w:ascii="Consolas" w:eastAsia="Consolas" w:hAnsi="Consolas" w:cs="Consolas"/>
+        </w:rPr>
+        <w:t xml:space="preserve">aria-checked</w:t>
+      </w:r>
+      <w:r>
+        <w:t xml:space="preserve">, không phải các </w:t>
+      </w:r>
+      <w:r>
+        <w:rPr>
+          <w:rFonts w:ascii="Consolas" w:eastAsia="Consolas" w:hAnsi="Consolas" w:cs="Consolas"/>
+        </w:rPr>
+        <w:t xml:space="preserve">menuitem</w:t>
+      </w:r>
+      <w:r>
+        <w:t xml:space="preserve"> thường, để trình đọc màn hình nói "đã chọn".</w:t>
+      </w:r>
+    </w:p>
+    <w:p>
+      <w:pPr>
+        <w:pStyle w:val="ListParagraph"/>
+        <w:numPr>
+          <w:ilvl w:val="0"/>
+          <w:numId w:val="1"/>
+        </w:numPr>
+      </w:pPr>
+      <w:r>
+        <w:rPr>
+          <w:b/>
+          <w:bCs/>
+        </w:rPr>
+        <w:t xml:space="preserve">Bẫy, lỗi gài sai cú pháp:</w:t>
+      </w:r>
+      <w:r>
+        <w:t xml:space="preserve"> đổi thẻ mở mà quên thẻ đóng làm file không biên dịch; các file test dùng nó không chạy, và script báo "sống" vì không có test nào đỏ. Con số test chạy (28 thay vì 50) là dấu hiệu.</w:t>
+      </w:r>
+    </w:p>
+    <w:p>
+      <w:pPr>
         <w:pStyle w:val="Heading2"/>
       </w:pPr>
       <w:r>
@@ -21009,6 +21192,39 @@
       </w:pPr>
       <w:r>
         <w:t xml:space="preserve">Ô thêm việc bị ép còn 25 px trong Chrome mà test vẫn xanh. Vì sao bị ép, và vì sao test không thấy?</w:t>
+      </w:r>
+    </w:p>
+    <w:p>
+      <w:pPr>
+        <w:pStyle w:val="ListParagraph"/>
+        <w:numPr>
+          <w:ilvl w:val="0"/>
+          <w:numId w:val="100"/>
+        </w:numPr>
+      </w:pPr>
+      <w:r>
+        <w:t xml:space="preserve">Vì sao chữ gợi ý của ô thêm việc phải chọn bằng </w:t>
+      </w:r>
+      <w:r>
+        <w:rPr>
+          <w:rFonts w:ascii="Consolas" w:eastAsia="Consolas" w:hAnsi="Consolas" w:cs="Consolas"/>
+        </w:rPr>
+        <w:t xml:space="preserve">useMediaQuery</w:t>
+      </w:r>
+      <w:r>
+        <w:t xml:space="preserve">, còn ẩn/hiện các khối thì không?</w:t>
+      </w:r>
+    </w:p>
+    <w:p>
+      <w:pPr>
+        <w:pStyle w:val="ListParagraph"/>
+        <w:numPr>
+          <w:ilvl w:val="0"/>
+          <w:numId w:val="100"/>
+        </w:numPr>
+      </w:pPr>
+      <w:r>
+        <w:t xml:space="preserve">Một lỗi gài báo "sống" nhưng chỉ 28/50 test chạy. Chuyện gì đã xảy ra?</w:t>
       </w:r>
     </w:p>
     <w:p/>

</xml_diff>

<commit_message>
feat(ca-01): data, sample, ranges and layout of the Lịch screen
The contract handed to the backend for F17 (every occurrence of a range from
the server, D-86), the canvas appointments with the Sunday run, and the
tasks and reminders taken from the tasks sample so both screens agree. The
days of each view (weeks from Monday, ISO weeks), the week grid (46 px an
hour, cut at the ends of the day, appointments that meet side by side), the
month cells, the agenda notes, the appointment detail text, and the view and
day kept in the address (D-87). Shared: addMonths. The bill of the tasks
sample is due at 17:00, as the Calendar canvas places it.

Co-Authored-By: Claude Opus 5.5 (1M context) <noreply@anthropic.com>
</commit_message>
<xml_diff>
--- a/docs/knowledge/phase-1-frontend-foundation.docx
+++ b/docs/knowledge/phase-1-frontend-foundation.docx
@@ -19298,6 +19298,282 @@
         <w:pStyle w:val="Heading2"/>
       </w:pPr>
       <w:r>
+        <w:t xml:space="preserve">12. Màn Lịch (fe-ui-calendar)</w:t>
+      </w:r>
+    </w:p>
+    <w:p>
+      <w:pPr>
+        <w:pStyle w:val="Heading3"/>
+      </w:pPr>
+      <w:r>
+        <w:t xml:space="preserve">12.0 Bức tranh</w:t>
+      </w:r>
+    </w:p>
+    <w:p>
+      <w:pPr>
+        <w:pStyle w:val="ListParagraph"/>
+        <w:numPr>
+          <w:ilvl w:val="0"/>
+          <w:numId w:val="1"/>
+        </w:numPr>
+      </w:pPr>
+      <w:r>
+        <w:rPr>
+          <w:b/>
+          <w:bCs/>
+        </w:rPr>
+        <w:t xml:space="preserve">Ở đâu:</w:t>
+      </w:r>
+      <w:r>
+        <w:t xml:space="preserve"> </w:t>
+      </w:r>
+      <w:r>
+        <w:rPr>
+          <w:rFonts w:ascii="Consolas" w:eastAsia="Consolas" w:hAnsi="Consolas" w:cs="Consolas"/>
+        </w:rPr>
+        <w:t xml:space="preserve">src/features/calendar/</w:t>
+      </w:r>
+      <w:r>
+        <w:t xml:space="preserve">.</w:t>
+      </w:r>
+    </w:p>
+    <w:p>
+      <w:pPr>
+        <w:pStyle w:val="ListParagraph"/>
+        <w:numPr>
+          <w:ilvl w:val="0"/>
+          <w:numId w:val="1"/>
+        </w:numPr>
+      </w:pPr>
+      <w:r>
+        <w:rPr>
+          <w:b/>
+          <w:bCs/>
+        </w:rPr>
+        <w:t xml:space="preserve">Là gì:</w:t>
+      </w:r>
+      <w:r>
+        <w:t xml:space="preserve"> màn </w:t>
+      </w:r>
+      <w:r>
+        <w:rPr>
+          <w:rFonts w:ascii="Consolas" w:eastAsia="Consolas" w:hAnsi="Consolas" w:cs="Consolas"/>
+        </w:rPr>
+        <w:t xml:space="preserve">/calendar</w:t>
+      </w:r>
+      <w:r>
+        <w:t xml:space="preserve"> dựng trước với dữ liệu mẫu (D-42), hợp đồng giao backend F17 (</w:t>
+      </w:r>
+      <w:r>
+        <w:rPr>
+          <w:rFonts w:ascii="Consolas" w:eastAsia="Consolas" w:hAnsi="Consolas" w:cs="Consolas"/>
+        </w:rPr>
+        <w:t xml:space="preserve">GET /api/calendar?from=&amp;to=</w:t>
+      </w:r>
+      <w:r>
+        <w:t xml:space="preserve">). Ba chế độ: Tuần, Tháng, Lịch trình. Quyết định D-85…D-89 (agent chốt, người dùng xem lại).</w:t>
+      </w:r>
+    </w:p>
+    <w:p>
+      <w:pPr>
+        <w:pStyle w:val="Heading3"/>
+      </w:pPr>
+      <w:r>
+        <w:t xml:space="preserve">12.1 Một khoảng ngày, mọi lần lặp từ máy chủ (CA-01, D-86)</w:t>
+      </w:r>
+    </w:p>
+    <w:p>
+      <w:pPr>
+        <w:pStyle w:val="ListParagraph"/>
+        <w:numPr>
+          <w:ilvl w:val="0"/>
+          <w:numId w:val="1"/>
+        </w:numPr>
+      </w:pPr>
+      <w:r>
+        <w:rPr>
+          <w:b/>
+          <w:bCs/>
+        </w:rPr>
+        <w:t xml:space="preserve">Khoảng của từng chế độ:</w:t>
+      </w:r>
+      <w:r>
+        <w:t xml:space="preserve"> Tuần là thứ Hai → Chủ nhật; Tháng là các tuần chạm tháng (tháng 10/2026 từ thứ Hai 28/9 tới Chủ nhật 1/11: 5 hàng; tháng 11/2026: 6 hàng); Lịch trình là 14 ngày từ ngày đang xem. </w:t>
+      </w:r>
+      <w:r>
+        <w:rPr>
+          <w:rFonts w:ascii="Consolas" w:eastAsia="Consolas" w:hAnsi="Consolas" w:cs="Consolas"/>
+        </w:rPr>
+        <w:t xml:space="preserve">to</w:t>
+      </w:r>
+      <w:r>
+        <w:t xml:space="preserve"> không gồm: </w:t>
+      </w:r>
+      <w:r>
+        <w:rPr>
+          <w:rFonts w:ascii="Consolas" w:eastAsia="Consolas" w:hAnsi="Consolas" w:cs="Consolas"/>
+        </w:rPr>
+        <w:t xml:space="preserve">[28/09, 05/10)</w:t>
+      </w:r>
+      <w:r>
+        <w:t xml:space="preserve"> là đúng 7 ngày, khỏi cộng trừ 1 ở mọi chỗ.</w:t>
+      </w:r>
+    </w:p>
+    <w:p>
+      <w:pPr>
+        <w:pStyle w:val="ListParagraph"/>
+        <w:numPr>
+          <w:ilvl w:val="0"/>
+          <w:numId w:val="1"/>
+        </w:numPr>
+      </w:pPr>
+      <w:r>
+        <w:rPr>
+          <w:b/>
+          <w:bCs/>
+        </w:rPr>
+        <w:t xml:space="preserve">Lần lặp:</w:t>
+      </w:r>
+      <w:r>
+        <w:t xml:space="preserve"> "Chạy bộ mỗi Chủ nhật" chỉ có một dòng trong database; máy chủ tính ra từng lần giao với khoảng đang xem và đặt id riêng cho mỗi lần (</w:t>
+      </w:r>
+      <w:r>
+        <w:rPr>
+          <w:rFonts w:ascii="Consolas" w:eastAsia="Consolas" w:hAnsi="Consolas" w:cs="Consolas"/>
+        </w:rPr>
+        <w:t xml:space="preserve">event-run@2026-10-04</w:t>
+      </w:r>
+      <w:r>
+        <w:t xml:space="preserve">). Web không tính, như D-84.</w:t>
+      </w:r>
+    </w:p>
+    <w:p>
+      <w:pPr>
+        <w:pStyle w:val="ListParagraph"/>
+        <w:numPr>
+          <w:ilvl w:val="0"/>
+          <w:numId w:val="1"/>
+        </w:numPr>
+      </w:pPr>
+      <w:r>
+        <w:rPr>
+          <w:b/>
+          <w:bCs/>
+        </w:rPr>
+        <w:t xml:space="preserve">Tuần ISO:</w:t>
+      </w:r>
+      <w:r>
+        <w:t xml:space="preserve"> tuần là của năm chứa </w:t>
+      </w:r>
+      <w:r>
+        <w:rPr>
+          <w:b/>
+          <w:bCs/>
+        </w:rPr>
+        <w:t xml:space="preserve">thứ Năm</w:t>
+      </w:r>
+      <w:r>
+        <w:t xml:space="preserve"> của nó. Tuần chứa 01/01/2026 bắt đầu thứ Hai 29/12/2025 nhưng thứ Năm là 01/01/2026, nên là "TUẦN 1 · 2026".</w:t>
+      </w:r>
+    </w:p>
+    <w:p>
+      <w:pPr>
+        <w:pStyle w:val="Heading3"/>
+      </w:pPr>
+      <w:r>
+        <w:t xml:space="preserve">12.2 Vẽ lưới tuần (CA-01, D-88)</w:t>
+      </w:r>
+    </w:p>
+    <w:p>
+      <w:pPr>
+        <w:pStyle w:val="ListParagraph"/>
+        <w:numPr>
+          <w:ilvl w:val="0"/>
+          <w:numId w:val="1"/>
+        </w:numPr>
+      </w:pPr>
+      <w:r>
+        <w:rPr>
+          <w:b/>
+          <w:bCs/>
+        </w:rPr>
+        <w:t xml:space="preserve">Giờ thành pixel:</w:t>
+      </w:r>
+      <w:r>
+        <w:t xml:space="preserve"> 46 px một giờ, nên vị trí = số phút từ 00:00 × 46 / 60. 18:30 → 851 px; 14:05 (vạch "bây giờ") → 647,8 px.</w:t>
+      </w:r>
+    </w:p>
+    <w:p>
+      <w:pPr>
+        <w:pStyle w:val="ListParagraph"/>
+        <w:numPr>
+          <w:ilvl w:val="0"/>
+          <w:numId w:val="1"/>
+        </w:numPr>
+      </w:pPr>
+      <w:r>
+        <w:rPr>
+          <w:b/>
+          <w:bCs/>
+        </w:rPr>
+        <w:t xml:space="preserve">Cắt ở hai đầu ngày:</w:t>
+      </w:r>
+      <w:r>
+        <w:t xml:space="preserve"> lịch hẹn 22:00 → 01:00 hôm sau vẽ 22:00–24:00 ở ngày đầu và 00:00–01:00 ở ngày sau; số phút được tính tương đối với ngày đang vẽ (âm trước ngày, quá 1440 sau ngày) rồi kẹp vào 0–1440.</w:t>
+      </w:r>
+    </w:p>
+    <w:p>
+      <w:pPr>
+        <w:pStyle w:val="ListParagraph"/>
+        <w:numPr>
+          <w:ilvl w:val="0"/>
+          <w:numId w:val="1"/>
+        </w:numPr>
+      </w:pPr>
+      <w:r>
+        <w:rPr>
+          <w:b/>
+          <w:bCs/>
+        </w:rPr>
+        <w:t xml:space="preserve">Chia cột khi trùng giờ:</w:t>
+      </w:r>
+      <w:r>
+        <w:t xml:space="preserve"> xếp theo giờ bắt đầu; mỗi lịch hẹn vào cột trống đầu tiên (cột mà lịch hẹn trước đã kết thúc); một "nhóm" là chuỗi lịch hẹn chạm nhau, cả nhóm chia đều số cột lớn nhất của nhóm.</w:t>
+      </w:r>
+    </w:p>
+    <w:p>
+      <w:pPr>
+        <w:pStyle w:val="ListParagraph"/>
+        <w:numPr>
+          <w:ilvl w:val="0"/>
+          <w:numId w:val="1"/>
+        </w:numPr>
+      </w:pPr>
+      <w:r>
+        <w:rPr>
+          <w:b/>
+          <w:bCs/>
+        </w:rPr>
+        <w:t xml:space="preserve">Bẫy, điều kiện thừa vì sort ổn định:</w:t>
+      </w:r>
+      <w:r>
+        <w:t xml:space="preserve"> "cùng giờ thì lịch hẹn trước, task sau, nhắc nhở cuối" không cần so sánh phụ: danh sách được dựng đúng thứ tự đó và </w:t>
+      </w:r>
+      <w:r>
+        <w:rPr>
+          <w:rFonts w:ascii="Consolas" w:eastAsia="Consolas" w:hAnsi="Consolas" w:cs="Consolas"/>
+        </w:rPr>
+        <w:t xml:space="preserve">Array.prototype.sort</w:t>
+      </w:r>
+      <w:r>
+        <w:t xml:space="preserve"> giữ nguyên thứ tự các phần tử bằng nhau (bắt buộc từ ES2019). Lỗi gài xóa so sánh phụ vẫn xanh là dấu hiệu.</w:t>
+      </w:r>
+    </w:p>
+    <w:p>
+      <w:pPr>
+        <w:pStyle w:val="Heading2"/>
+      </w:pPr>
+      <w:r>
         <w:t xml:space="preserve">Tự kiểm tra</w:t>
       </w:r>
     </w:p>
@@ -21225,6 +21501,60 @@
       </w:pPr>
       <w:r>
         <w:t xml:space="preserve">Một lỗi gài báo "sống" nhưng chỉ 28/50 test chạy. Chuyện gì đã xảy ra?</w:t>
+      </w:r>
+    </w:p>
+    <w:p>
+      <w:pPr>
+        <w:pStyle w:val="ListParagraph"/>
+        <w:numPr>
+          <w:ilvl w:val="0"/>
+          <w:numId w:val="100"/>
+        </w:numPr>
+      </w:pPr>
+      <w:r>
+        <w:t xml:space="preserve">Vì sao khoảng ngày </w:t>
+      </w:r>
+      <w:r>
+        <w:rPr>
+          <w:rFonts w:ascii="Consolas" w:eastAsia="Consolas" w:hAnsi="Consolas" w:cs="Consolas"/>
+        </w:rPr>
+        <w:t xml:space="preserve">to</w:t>
+      </w:r>
+      <w:r>
+        <w:t xml:space="preserve"> không gồm (</w:t>
+      </w:r>
+      <w:r>
+        <w:rPr>
+          <w:rFonts w:ascii="Consolas" w:eastAsia="Consolas" w:hAnsi="Consolas" w:cs="Consolas"/>
+        </w:rPr>
+        <w:t xml:space="preserve">[28/09, 05/10)</w:t>
+      </w:r>
+      <w:r>
+        <w:t xml:space="preserve">), và một tháng hiện mấy hàng?</w:t>
+      </w:r>
+    </w:p>
+    <w:p>
+      <w:pPr>
+        <w:pStyle w:val="ListParagraph"/>
+        <w:numPr>
+          <w:ilvl w:val="0"/>
+          <w:numId w:val="100"/>
+        </w:numPr>
+      </w:pPr>
+      <w:r>
+        <w:t xml:space="preserve">Lịch hẹn 22:00 → 01:00 hôm sau được vẽ thế nào trên hai cột ngày?</w:t>
+      </w:r>
+    </w:p>
+    <w:p>
+      <w:pPr>
+        <w:pStyle w:val="ListParagraph"/>
+        <w:numPr>
+          <w:ilvl w:val="0"/>
+          <w:numId w:val="100"/>
+        </w:numPr>
+      </w:pPr>
+      <w:r>
+        <w:t xml:space="preserve">Tuần chứa 01/01/2026 là tuần mấy của năm nào, theo ISO 8601? Vì sao?</w:t>
       </w:r>
     </w:p>
     <w:p/>

</xml_diff>

<commit_message>
feat(ca-02): Lịch on desktop: head, legend, week, appointment detail
/calendar and /calendar/:itemId from the canvas Calendar: the head of the
range with "Hôm nay", before / after and the views, the legend with the
time zone, and the week: days, whole-day row, the whole-day grid opened at
06:00 with appointment blocks side by side when they meet, task chips and
reminder marks that open the task, the line of now. The appointment detail
column (when, reminder, repeat, place, source message, notes, related).
Month and agenda bodies follow in CA-03.

Co-Authored-By: Claude Opus 5.5 (1M context) <noreply@anthropic.com>
</commit_message>
<xml_diff>
--- a/docs/knowledge/phase-1-frontend-foundation.docx
+++ b/docs/knowledge/phase-1-frontend-foundation.docx
@@ -19571,6 +19571,195 @@
     </w:p>
     <w:p>
       <w:pPr>
+        <w:pStyle w:val="Heading3"/>
+      </w:pPr>
+      <w:r>
+        <w:t xml:space="preserve">12.3 Lưới tuần trên trình duyệt (CA-02)</w:t>
+      </w:r>
+    </w:p>
+    <w:p>
+      <w:pPr>
+        <w:pStyle w:val="ListParagraph"/>
+        <w:numPr>
+          <w:ilvl w:val="0"/>
+          <w:numId w:val="1"/>
+        </w:numPr>
+      </w:pPr>
+      <w:r>
+        <w:rPr>
+          <w:b/>
+          <w:bCs/>
+        </w:rPr>
+        <w:t xml:space="preserve">Mở ở 06:00:</w:t>
+      </w:r>
+      <w:r>
+        <w:t xml:space="preserve"> lưới cao 24 × 46 px, nằm trong một khung cuộn; </w:t>
+      </w:r>
+      <w:r>
+        <w:rPr>
+          <w:rFonts w:ascii="Consolas" w:eastAsia="Consolas" w:hAnsi="Consolas" w:cs="Consolas"/>
+        </w:rPr>
+        <w:t xml:space="preserve">useLayoutEffect</w:t>
+      </w:r>
+      <w:r>
+        <w:t xml:space="preserve"> đặt </w:t>
+      </w:r>
+      <w:r>
+        <w:rPr>
+          <w:rFonts w:ascii="Consolas" w:eastAsia="Consolas" w:hAnsi="Consolas" w:cs="Consolas"/>
+        </w:rPr>
+        <w:t xml:space="preserve">scrollTop</w:t>
+      </w:r>
+      <w:r>
+        <w:t xml:space="preserve"> một lần khi màn vừa vẽ (trước khi trình duyệt hiện ra), nên người dùng không thấy lưới nhảy từ 00:00 xuống.</w:t>
+      </w:r>
+    </w:p>
+    <w:p>
+      <w:pPr>
+        <w:pStyle w:val="ListParagraph"/>
+        <w:numPr>
+          <w:ilvl w:val="0"/>
+          <w:numId w:val="1"/>
+        </w:numPr>
+      </w:pPr>
+      <w:r>
+        <w:rPr>
+          <w:b/>
+          <w:bCs/>
+        </w:rPr>
+        <w:t xml:space="preserve">Khối chia cột:</w:t>
+      </w:r>
+      <w:r>
+        <w:t xml:space="preserve"> </w:t>
+      </w:r>
+      <w:r>
+        <w:rPr>
+          <w:rFonts w:ascii="Consolas" w:eastAsia="Consolas" w:hAnsi="Consolas" w:cs="Consolas"/>
+        </w:rPr>
+        <w:t xml:space="preserve">left = cột × 100% / số cột + 4px</w:t>
+      </w:r>
+      <w:r>
+        <w:t xml:space="preserve">, </w:t>
+      </w:r>
+      <w:r>
+        <w:rPr>
+          <w:rFonts w:ascii="Consolas" w:eastAsia="Consolas" w:hAnsi="Consolas" w:cs="Consolas"/>
+        </w:rPr>
+        <w:t xml:space="preserve">width = 100% / số cột − 8px</w:t>
+      </w:r>
+      <w:r>
+        <w:t xml:space="preserve">, tính bằng </w:t>
+      </w:r>
+      <w:r>
+        <w:rPr>
+          <w:rFonts w:ascii="Consolas" w:eastAsia="Consolas" w:hAnsi="Consolas" w:cs="Consolas"/>
+        </w:rPr>
+        <w:t xml:space="preserve">calc()</w:t>
+      </w:r>
+      <w:r>
+        <w:t xml:space="preserve"> nên tự co theo bề ngang cột ngày.</w:t>
+      </w:r>
+    </w:p>
+    <w:p>
+      <w:pPr>
+        <w:pStyle w:val="ListParagraph"/>
+        <w:numPr>
+          <w:ilvl w:val="0"/>
+          <w:numId w:val="1"/>
+        </w:numPr>
+      </w:pPr>
+      <w:r>
+        <w:rPr>
+          <w:b/>
+          <w:bCs/>
+        </w:rPr>
+        <w:t xml:space="preserve">Bẫy lần thứ hai, cột flex co dòng </w:t>
+      </w:r>
+      <w:r>
+        <w:rPr>
+          <w:rFonts w:ascii="Consolas" w:eastAsia="Consolas" w:hAnsi="Consolas" w:cs="Consolas"/>
+          <w:b/>
+          <w:bCs/>
+        </w:rPr>
+        <w:t xml:space="preserve">overflow: hidden</w:t>
+      </w:r>
+      <w:r>
+        <w:rPr>
+          <w:b/>
+          <w:bCs/>
+        </w:rPr>
+        <w:t xml:space="preserve">:</w:t>
+      </w:r>
+      <w:r>
+        <w:t xml:space="preserve"> khối một giờ (46 px) không đủ chỗ cho tiêu đề, giờ và nguồn; dòng tiêu đề có </w:t>
+      </w:r>
+      <w:r>
+        <w:rPr>
+          <w:rFonts w:ascii="Consolas" w:eastAsia="Consolas" w:hAnsi="Consolas" w:cs="Consolas"/>
+        </w:rPr>
+        <w:t xml:space="preserve">overflow: hidden</w:t>
+      </w:r>
+      <w:r>
+        <w:t xml:space="preserve"> nên chiều cao tối thiểu là 0 và bị co mất trước tiên, trong khi canvas muốn giữ tiêu đề và cắt phần thừa ở dưới. </w:t>
+      </w:r>
+      <w:r>
+        <w:rPr>
+          <w:rFonts w:ascii="Consolas" w:eastAsia="Consolas" w:hAnsi="Consolas" w:cs="Consolas"/>
+        </w:rPr>
+        <w:t xml:space="preserve">*:shrink-0</w:t>
+      </w:r>
+      <w:r>
+        <w:t xml:space="preserve"> cho các dòng giữ chiều cao của mình; khối </w:t>
+      </w:r>
+      <w:r>
+        <w:rPr>
+          <w:rFonts w:ascii="Consolas" w:eastAsia="Consolas" w:hAnsi="Consolas" w:cs="Consolas"/>
+        </w:rPr>
+        <w:t xml:space="preserve">overflow: hidden</w:t>
+      </w:r>
+      <w:r>
+        <w:t xml:space="preserve"> cắt phần không vừa.</w:t>
+      </w:r>
+    </w:p>
+    <w:p>
+      <w:pPr>
+        <w:pStyle w:val="ListParagraph"/>
+        <w:numPr>
+          <w:ilvl w:val="0"/>
+          <w:numId w:val="1"/>
+        </w:numPr>
+      </w:pPr>
+      <w:r>
+        <w:rPr>
+          <w:b/>
+          <w:bCs/>
+        </w:rPr>
+        <w:t xml:space="preserve">Chip của lần lặp sắp tới:</w:t>
+      </w:r>
+      <w:r>
+        <w:t xml:space="preserve"> "Báo cáo tuần" ngày 12/10 chưa có trong database (chỉ có lần 05/10 đang mở); chip mở </w:t>
+      </w:r>
+      <w:r>
+        <w:rPr>
+          <w:rFonts w:ascii="Consolas" w:eastAsia="Consolas" w:hAnsi="Consolas" w:cs="Consolas"/>
+        </w:rPr>
+        <w:t xml:space="preserve">task-weekly</w:t>
+      </w:r>
+      <w:r>
+        <w:t xml:space="preserve">, task đang mở của chuỗi (</w:t>
+      </w:r>
+      <w:r>
+        <w:rPr>
+          <w:rFonts w:ascii="Consolas" w:eastAsia="Consolas" w:hAnsi="Consolas" w:cs="Consolas"/>
+        </w:rPr>
+        <w:t xml:space="preserve">taskId</w:t>
+      </w:r>
+      <w:r>
+        <w:t xml:space="preserve">), không phải id của lần đó.</w:t>
+      </w:r>
+    </w:p>
+    <w:p>
+      <w:pPr>
         <w:pStyle w:val="Heading2"/>
       </w:pPr>
       <w:r>
@@ -21555,6 +21744,66 @@
       </w:pPr>
       <w:r>
         <w:t xml:space="preserve">Tuần chứa 01/01/2026 là tuần mấy của năm nào, theo ISO 8601? Vì sao?</w:t>
+      </w:r>
+    </w:p>
+    <w:p>
+      <w:pPr>
+        <w:pStyle w:val="ListParagraph"/>
+        <w:numPr>
+          <w:ilvl w:val="0"/>
+          <w:numId w:val="100"/>
+        </w:numPr>
+      </w:pPr>
+      <w:r>
+        <w:t xml:space="preserve">Vì sao lưới tuần đặt </w:t>
+      </w:r>
+      <w:r>
+        <w:rPr>
+          <w:rFonts w:ascii="Consolas" w:eastAsia="Consolas" w:hAnsi="Consolas" w:cs="Consolas"/>
+        </w:rPr>
+        <w:t xml:space="preserve">scrollTop</w:t>
+      </w:r>
+      <w:r>
+        <w:t xml:space="preserve"> trong </w:t>
+      </w:r>
+      <w:r>
+        <w:rPr>
+          <w:rFonts w:ascii="Consolas" w:eastAsia="Consolas" w:hAnsi="Consolas" w:cs="Consolas"/>
+        </w:rPr>
+        <w:t xml:space="preserve">useLayoutEffect</w:t>
+      </w:r>
+      <w:r>
+        <w:t xml:space="preserve"> chứ không phải </w:t>
+      </w:r>
+      <w:r>
+        <w:rPr>
+          <w:rFonts w:ascii="Consolas" w:eastAsia="Consolas" w:hAnsi="Consolas" w:cs="Consolas"/>
+        </w:rPr>
+        <w:t xml:space="preserve">useEffect</w:t>
+      </w:r>
+      <w:r>
+        <w:t xml:space="preserve">?</w:t>
+      </w:r>
+    </w:p>
+    <w:p>
+      <w:pPr>
+        <w:pStyle w:val="ListParagraph"/>
+        <w:numPr>
+          <w:ilvl w:val="0"/>
+          <w:numId w:val="100"/>
+        </w:numPr>
+      </w:pPr>
+      <w:r>
+        <w:t xml:space="preserve">Khối một giờ từng mất dòng tiêu đề. Vì sao, và </w:t>
+      </w:r>
+      <w:r>
+        <w:rPr>
+          <w:rFonts w:ascii="Consolas" w:eastAsia="Consolas" w:hAnsi="Consolas" w:cs="Consolas"/>
+        </w:rPr>
+        <w:t xml:space="preserve">*:shrink-0</w:t>
+      </w:r>
+      <w:r>
+        <w:t xml:space="preserve"> sửa thế nào?</w:t>
       </w:r>
     </w:p>
     <w:p/>

</xml_diff>

<commit_message>
feat(ca-04): Lịch on a phone, its appointment page and its states
Below 768 px the page draws the canvas MobileCalendar: "Lịch" with the
month, "Hôm nay", the seven days of the week with a dot per item, and the
agenda from the picked day in the phone's own compact form (start time,
"30/09" for a late task, only the late note under the title). The page
picks this layout with useMediaQuery because a phone asks for other days:
its week for the strip and two weeks of agenda from the picked day. An
appointment opens on a page of its own with a way back that keeps the
view. The whole screen shows a skeleton while it loads and "Không tải
được lịch" with "Thử lại" when it cannot.

The shell now pins main to its second row: when a page hid the top bar on
a phone, main fell into the auto row and was only as tall as its content,
so sub-pages such as the task detail ended mid-screen.

Co-Authored-By: Claude Opus 5.5 (1M context) <noreply@anthropic.com>
</commit_message>
<xml_diff>
--- a/docs/knowledge/phase-1-frontend-foundation.docx
+++ b/docs/knowledge/phase-1-frontend-foundation.docx
@@ -19760,6 +19760,401 @@
     </w:p>
     <w:p>
       <w:pPr>
+        <w:pStyle w:val="Heading3"/>
+      </w:pPr>
+      <w:r>
+        <w:t xml:space="preserve">12.4 Điện thoại, trạng thái, và một lỗi của khung app (CA-04)</w:t>
+      </w:r>
+    </w:p>
+    <w:p>
+      <w:pPr>
+        <w:pStyle w:val="ListParagraph"/>
+        <w:numPr>
+          <w:ilvl w:val="0"/>
+          <w:numId w:val="1"/>
+        </w:numPr>
+      </w:pPr>
+      <w:r>
+        <w:rPr>
+          <w:b/>
+          <w:bCs/>
+        </w:rPr>
+        <w:t xml:space="preserve">Lần này chọn cả bố cục bằng JavaScript:</w:t>
+      </w:r>
+      <w:r>
+        <w:t xml:space="preserve"> màn Việc cần làm chỉ dùng </w:t>
+      </w:r>
+      <w:r>
+        <w:rPr>
+          <w:rFonts w:ascii="Consolas" w:eastAsia="Consolas" w:hAnsi="Consolas" w:cs="Consolas"/>
+        </w:rPr>
+        <w:t xml:space="preserve">useMediaQuery</w:t>
+      </w:r>
+      <w:r>
+        <w:t xml:space="preserve"> cho một câu chữ (11). Màn Lịch dưới 768 px không chỉ vẽ khác mà còn cần </w:t>
+      </w:r>
+      <w:r>
+        <w:rPr>
+          <w:b/>
+          <w:bCs/>
+        </w:rPr>
+        <w:t xml:space="preserve">dữ liệu khác</w:t>
+      </w:r>
+      <w:r>
+        <w:t xml:space="preserve">: dải bảy ngày đếm mục của cả tuần, lịch trình chạy 14 ngày từ ngày chọn. Nếu vẽ cả hai rồi ẩn một bằng </w:t>
+      </w:r>
+      <w:r>
+        <w:rPr>
+          <w:rFonts w:ascii="Consolas" w:eastAsia="Consolas" w:hAnsi="Consolas" w:cs="Consolas"/>
+        </w:rPr>
+        <w:t xml:space="preserve">md:hidden</w:t>
+      </w:r>
+      <w:r>
+        <w:t xml:space="preserve">, trang sẽ có hai lịch trình, hai nút "Hôm nay", và phải tải dữ liệu cho cả hai. </w:t>
+      </w:r>
+      <w:r>
+        <w:rPr>
+          <w:rFonts w:ascii="Consolas" w:eastAsia="Consolas" w:hAnsi="Consolas" w:cs="Consolas"/>
+        </w:rPr>
+        <w:t xml:space="preserve">CalendarPage</w:t>
+      </w:r>
+      <w:r>
+        <w:t xml:space="preserve"> đọc </w:t>
+      </w:r>
+      <w:r>
+        <w:rPr>
+          <w:rFonts w:ascii="Consolas" w:eastAsia="Consolas" w:hAnsi="Consolas" w:cs="Consolas"/>
+        </w:rPr>
+        <w:t xml:space="preserve">useMediaQuery('(min-width: 768px)')</w:t>
+      </w:r>
+      <w:r>
+        <w:t xml:space="preserve"> một lần rồi chọn một nhánh.</w:t>
+      </w:r>
+    </w:p>
+    <w:p>
+      <w:pPr>
+        <w:pStyle w:val="ListParagraph"/>
+        <w:numPr>
+          <w:ilvl w:val="0"/>
+          <w:numId w:val="1"/>
+        </w:numPr>
+      </w:pPr>
+      <w:r>
+        <w:rPr>
+          <w:b/>
+          <w:bCs/>
+        </w:rPr>
+        <w:t xml:space="preserve">Test phải nói bề ngang:</w:t>
+      </w:r>
+      <w:r>
+        <w:t xml:space="preserve"> jsdom không có </w:t>
+      </w:r>
+      <w:r>
+        <w:rPr>
+          <w:rFonts w:ascii="Consolas" w:eastAsia="Consolas" w:hAnsi="Consolas" w:cs="Consolas"/>
+        </w:rPr>
+        <w:t xml:space="preserve">matchMedia</w:t>
+      </w:r>
+      <w:r>
+        <w:t xml:space="preserve"> và không tính CSS. </w:t>
+      </w:r>
+      <w:r>
+        <w:rPr>
+          <w:rFonts w:ascii="Consolas" w:eastAsia="Consolas" w:hAnsi="Consolas" w:cs="Consolas"/>
+        </w:rPr>
+        <w:t xml:space="preserve">stubViewport(390)</w:t>
+      </w:r>
+      <w:r>
+        <w:t xml:space="preserve"> trong </w:t>
+      </w:r>
+      <w:r>
+        <w:rPr>
+          <w:rFonts w:ascii="Consolas" w:eastAsia="Consolas" w:hAnsi="Consolas" w:cs="Consolas"/>
+        </w:rPr>
+        <w:t xml:space="preserve">test/matchMedia.ts</w:t>
+      </w:r>
+      <w:r>
+        <w:t xml:space="preserve"> làm </w:t>
+      </w:r>
+      <w:r>
+        <w:rPr>
+          <w:rFonts w:ascii="Consolas" w:eastAsia="Consolas" w:hAnsi="Consolas" w:cs="Consolas"/>
+        </w:rPr>
+        <w:t xml:space="preserve">(min-width: Npx)</w:t>
+      </w:r>
+      <w:r>
+        <w:t xml:space="preserve"> khớp khi 390 &gt;= N; test desktop đặt </w:t>
+      </w:r>
+      <w:r>
+        <w:rPr>
+          <w:rFonts w:ascii="Consolas" w:eastAsia="Consolas" w:hAnsi="Consolas" w:cs="Consolas"/>
+        </w:rPr>
+        <w:t xml:space="preserve">stubViewport(1440)</w:t>
+      </w:r>
+      <w:r>
+        <w:t xml:space="preserve">.</w:t>
+      </w:r>
+    </w:p>
+    <w:p>
+      <w:pPr>
+        <w:pStyle w:val="ListParagraph"/>
+        <w:numPr>
+          <w:ilvl w:val="0"/>
+          <w:numId w:val="1"/>
+        </w:numPr>
+      </w:pPr>
+      <w:r>
+        <w:rPr>
+          <w:b/>
+          <w:bCs/>
+        </w:rPr>
+        <w:t xml:space="preserve">Khoảng dữ liệu của điện thoại:</w:t>
+      </w:r>
+      <w:r>
+        <w:t xml:space="preserve"> từ thứ Hai của tuần tới 14 ngày sau ngày chọn. Chọn Chủ nhật 04/10 thì hỏi </w:t>
+      </w:r>
+      <w:r>
+        <w:rPr>
+          <w:rFonts w:ascii="Consolas" w:eastAsia="Consolas" w:hAnsi="Consolas" w:cs="Consolas"/>
+        </w:rPr>
+        <w:t xml:space="preserve">[28/09, 18/10)</w:t>
+      </w:r>
+      <w:r>
+        <w:t xml:space="preserve">; </w:t>
+      </w:r>
+      <w:r>
+        <w:rPr>
+          <w:rFonts w:ascii="Consolas" w:eastAsia="Consolas" w:hAnsi="Consolas" w:cs="Consolas"/>
+        </w:rPr>
+        <w:t xml:space="preserve">agendaDays(..., from)</w:t>
+      </w:r>
+      <w:r>
+        <w:t xml:space="preserve"> bỏ các ngày trước 04/10, còn dải ngày vẫn đếm được thứ Hai 28/09.</w:t>
+      </w:r>
+    </w:p>
+    <w:p>
+      <w:pPr>
+        <w:pStyle w:val="ListParagraph"/>
+        <w:numPr>
+          <w:ilvl w:val="0"/>
+          <w:numId w:val="1"/>
+        </w:numPr>
+      </w:pPr>
+      <w:r>
+        <w:rPr>
+          <w:b/>
+          <w:bCs/>
+        </w:rPr>
+        <w:t xml:space="preserve">Cùng dữ liệu, chữ ngắn hơn:</w:t>
+      </w:r>
+      <w:r>
+        <w:t xml:space="preserve"> cột giờ của điện thoại chỉ rộng 48 px, nên "16:00 – 17:00" thành "16:00", "Hạn 30/09" thành "30/09"; ngày "Chủ nhật" đi với "04/10" chứ không lặp "CHỦ NHẬT 04/10". Hai chữ ngắn (</w:t>
+      </w:r>
+      <w:r>
+        <w:rPr>
+          <w:rFonts w:ascii="Consolas" w:eastAsia="Consolas" w:hAnsi="Consolas" w:cs="Consolas"/>
+        </w:rPr>
+        <w:t xml:space="preserve">shortTime</w:t>
+      </w:r>
+      <w:r>
+        <w:t xml:space="preserve">, </w:t>
+      </w:r>
+      <w:r>
+        <w:rPr>
+          <w:rFonts w:ascii="Consolas" w:eastAsia="Consolas" w:hAnsi="Consolas" w:cs="Consolas"/>
+        </w:rPr>
+        <w:t xml:space="preserve">shortSpec</w:t>
+      </w:r>
+      <w:r>
+        <w:t xml:space="preserve">) tính trong </w:t>
+      </w:r>
+      <w:r>
+        <w:rPr>
+          <w:rFonts w:ascii="Consolas" w:eastAsia="Consolas" w:hAnsi="Consolas" w:cs="Consolas"/>
+        </w:rPr>
+        <w:t xml:space="preserve">format.ts</w:t>
+      </w:r>
+      <w:r>
+        <w:t xml:space="preserve"> cạnh chữ dài: luật nằm trong hàm thuần, test không cần vẽ màn.</w:t>
+      </w:r>
+    </w:p>
+    <w:p>
+      <w:pPr>
+        <w:pStyle w:val="ListParagraph"/>
+        <w:numPr>
+          <w:ilvl w:val="0"/>
+          <w:numId w:val="1"/>
+        </w:numPr>
+      </w:pPr>
+      <w:r>
+        <w:rPr>
+          <w:b/>
+          <w:bCs/>
+        </w:rPr>
+        <w:t xml:space="preserve">Trạng thái tải:</w:t>
+      </w:r>
+      <w:r>
+        <w:t xml:space="preserve"> chưa có dữ liệu thì cả màn là khung xương; lỗi mà chưa có dữ liệu thì hiện "Không tải được lịch", "Thử lại" gọi </w:t>
+      </w:r>
+      <w:r>
+        <w:rPr>
+          <w:rFonts w:ascii="Consolas" w:eastAsia="Consolas" w:hAnsi="Consolas" w:cs="Consolas"/>
+        </w:rPr>
+        <w:t xml:space="preserve">refetch</w:t>
+      </w:r>
+      <w:r>
+        <w:t xml:space="preserve">. Sang tuần khác thì </w:t>
+      </w:r>
+      <w:r>
+        <w:rPr>
+          <w:rFonts w:ascii="Consolas" w:eastAsia="Consolas" w:hAnsi="Consolas" w:cs="Consolas"/>
+        </w:rPr>
+        <w:t xml:space="preserve">keepPreviousData</w:t>
+      </w:r>
+      <w:r>
+        <w:t xml:space="preserve"> giữ tuần cũ trên màn tới khi tuần mới về, nên không nháy khung xương.</w:t>
+      </w:r>
+    </w:p>
+    <w:p>
+      <w:pPr>
+        <w:pStyle w:val="ListParagraph"/>
+        <w:numPr>
+          <w:ilvl w:val="0"/>
+          <w:numId w:val="1"/>
+        </w:numPr>
+      </w:pPr>
+      <w:r>
+        <w:rPr>
+          <w:b/>
+          <w:bCs/>
+        </w:rPr>
+        <w:t xml:space="preserve">Bẫy, ô lưới bị ẩn nhường hàng của nó:</w:t>
+      </w:r>
+      <w:r>
+        <w:t xml:space="preserve"> khung app là lưới hai hàng, thanh trên ở hàng </w:t>
+      </w:r>
+      <w:r>
+        <w:rPr>
+          <w:rFonts w:ascii="Consolas" w:eastAsia="Consolas" w:hAnsi="Consolas" w:cs="Consolas"/>
+        </w:rPr>
+        <w:t xml:space="preserve">auto</w:t>
+      </w:r>
+      <w:r>
+        <w:t xml:space="preserve">, </w:t>
+      </w:r>
+      <w:r>
+        <w:rPr>
+          <w:rFonts w:ascii="Consolas" w:eastAsia="Consolas" w:hAnsi="Consolas" w:cs="Consolas"/>
+        </w:rPr>
+        <w:t xml:space="preserve">main</w:t>
+      </w:r>
+      <w:r>
+        <w:t xml:space="preserve"> ở hàng </w:t>
+      </w:r>
+      <w:r>
+        <w:rPr>
+          <w:rFonts w:ascii="Consolas" w:eastAsia="Consolas" w:hAnsi="Consolas" w:cs="Consolas"/>
+        </w:rPr>
+        <w:t xml:space="preserve">1fr</w:t>
+      </w:r>
+      <w:r>
+        <w:t xml:space="preserve">. Trên điện thoại, trang con ẩn thanh trên bằng </w:t>
+      </w:r>
+      <w:r>
+        <w:rPr>
+          <w:rFonts w:ascii="Consolas" w:eastAsia="Consolas" w:hAnsi="Consolas" w:cs="Consolas"/>
+        </w:rPr>
+        <w:t xml:space="preserve">max-md:hidden</w:t>
+      </w:r>
+      <w:r>
+        <w:t xml:space="preserve">, tức </w:t>
+      </w:r>
+      <w:r>
+        <w:rPr>
+          <w:rFonts w:ascii="Consolas" w:eastAsia="Consolas" w:hAnsi="Consolas" w:cs="Consolas"/>
+        </w:rPr>
+        <w:t xml:space="preserve">display: none</w:t>
+      </w:r>
+      <w:r>
+        <w:t xml:space="preserve">. Ô </w:t>
+      </w:r>
+      <w:r>
+        <w:rPr>
+          <w:rFonts w:ascii="Consolas" w:eastAsia="Consolas" w:hAnsi="Consolas" w:cs="Consolas"/>
+        </w:rPr>
+        <w:t xml:space="preserve">display: none</w:t>
+      </w:r>
+      <w:r>
+        <w:t xml:space="preserve"> không chiếm ô lưới nào, nên </w:t>
+      </w:r>
+      <w:r>
+        <w:rPr>
+          <w:rFonts w:ascii="Consolas" w:eastAsia="Consolas" w:hAnsi="Consolas" w:cs="Consolas"/>
+        </w:rPr>
+        <w:t xml:space="preserve">main</w:t>
+      </w:r>
+      <w:r>
+        <w:t xml:space="preserve"> được xếp vào ô trống đầu tiên: hàng </w:t>
+      </w:r>
+      <w:r>
+        <w:rPr>
+          <w:rFonts w:ascii="Consolas" w:eastAsia="Consolas" w:hAnsi="Consolas" w:cs="Consolas"/>
+        </w:rPr>
+        <w:t xml:space="preserve">auto</w:t>
+      </w:r>
+      <w:r>
+        <w:t xml:space="preserve">, cao bằng nội dung.</w:t>
+      </w:r>
+    </w:p>
+    <w:p>
+      <w:pPr>
+        <w:shd w:val="clear" w:color="auto" w:fill="F2F3F5"/>
+        <w:ind w:left="0"/>
+      </w:pPr>
+      <w:r>
+        <w:rPr>
+          <w:rFonts w:ascii="Consolas" w:eastAsia="Consolas" w:hAnsi="Consolas" w:cs="Consolas"/>
+          <w:sz w:val="19"/>
+          <w:szCs w:val="19"/>
+        </w:rPr>
+        <w:t xml:space="preserve">  màn lớn                          điện thoại, thanh trên display:none</w:t>
+        <w:br/>
+        <w:t xml:space="preserve">  +----------------------+         +----------------------+</w:t>
+        <w:br/>
+        <w:t xml:space="preserve">  | thanh trên           | auto    | main (rơi lên đây)   | auto: cao bằng nội dung</w:t>
+        <w:br/>
+        <w:t xml:space="preserve">  +----------------------+         +----------------------+</w:t>
+        <w:br/>
+        <w:t xml:space="preserve">  | main                 | 1fr     | (trống)              | 1fr</w:t>
+        <w:br/>
+        <w:t xml:space="preserve">  +----------------------+         +----------------------+</w:t>
+      </w:r>
+    </w:p>
+    <w:p>
+      <w:r>
+        <w:t xml:space="preserve">  </w:t>
+      </w:r>
+      <w:r>
+        <w:rPr>
+          <w:rFonts w:ascii="Consolas" w:eastAsia="Consolas" w:hAnsi="Consolas" w:cs="Consolas"/>
+        </w:rPr>
+        <w:t xml:space="preserve">row-start-2</w:t>
+      </w:r>
+      <w:r>
+        <w:t xml:space="preserve"> ghim </w:t>
+      </w:r>
+      <w:r>
+        <w:rPr>
+          <w:rFonts w:ascii="Consolas" w:eastAsia="Consolas" w:hAnsi="Consolas" w:cs="Consolas"/>
+        </w:rPr>
+        <w:t xml:space="preserve">main</w:t>
+      </w:r>
+      <w:r>
+        <w:t xml:space="preserve"> vào hàng 2 dù hàng 1 có gì. Trước khi sửa, trên màn 844 px: chi tiết lịch hẹn 675 px, chi tiết việc 515 px, hội thoại 172 px, hàng nút nổi giữa màn. Test không thấy vì jsdom không tính bố cục; chỉ đo trên trình duyệt thật mới ra.</w:t>
+      </w:r>
+    </w:p>
+    <w:p>
+      <w:pPr>
         <w:pStyle w:val="Heading2"/>
       </w:pPr>
       <w:r>
@@ -21804,6 +22199,69 @@
       </w:r>
       <w:r>
         <w:t xml:space="preserve"> sửa thế nào?</w:t>
+      </w:r>
+    </w:p>
+    <w:p>
+      <w:pPr>
+        <w:pStyle w:val="ListParagraph"/>
+        <w:numPr>
+          <w:ilvl w:val="0"/>
+          <w:numId w:val="100"/>
+        </w:numPr>
+      </w:pPr>
+      <w:r>
+        <w:t xml:space="preserve">Vì sao màn Lịch chọn bố cục điện thoại bằng </w:t>
+      </w:r>
+      <w:r>
+        <w:rPr>
+          <w:rFonts w:ascii="Consolas" w:eastAsia="Consolas" w:hAnsi="Consolas" w:cs="Consolas"/>
+        </w:rPr>
+        <w:t xml:space="preserve">useMediaQuery</w:t>
+      </w:r>
+      <w:r>
+        <w:t xml:space="preserve">, trong khi màn Việc cần làm đổi bố cục bằng lớp </w:t>
+      </w:r>
+      <w:r>
+        <w:rPr>
+          <w:rFonts w:ascii="Consolas" w:eastAsia="Consolas" w:hAnsi="Consolas" w:cs="Consolas"/>
+        </w:rPr>
+        <w:t xml:space="preserve">md:</w:t>
+      </w:r>
+      <w:r>
+        <w:t xml:space="preserve">?</w:t>
+      </w:r>
+    </w:p>
+    <w:p>
+      <w:pPr>
+        <w:pStyle w:val="ListParagraph"/>
+        <w:numPr>
+          <w:ilvl w:val="0"/>
+          <w:numId w:val="100"/>
+        </w:numPr>
+      </w:pPr>
+      <w:r>
+        <w:t xml:space="preserve">Trên điện thoại chọn Chủ nhật 04/10 thì web hỏi khoảng ngày nào, và lịch trình bắt đầu từ đâu? Vì sao không hỏi từ 04/10?</w:t>
+      </w:r>
+    </w:p>
+    <w:p>
+      <w:pPr>
+        <w:pStyle w:val="ListParagraph"/>
+        <w:numPr>
+          <w:ilvl w:val="0"/>
+          <w:numId w:val="100"/>
+        </w:numPr>
+      </w:pPr>
+      <w:r>
+        <w:t xml:space="preserve">Trang con trên điện thoại từng chỉ cao bằng nội dung. Vì sao ẩn thanh trên làm </w:t>
+      </w:r>
+      <w:r>
+        <w:rPr>
+          <w:rFonts w:ascii="Consolas" w:eastAsia="Consolas" w:hAnsi="Consolas" w:cs="Consolas"/>
+        </w:rPr>
+        <w:t xml:space="preserve">main</w:t>
+      </w:r>
+      <w:r>
+        <w:t xml:space="preserve"> thấp đi, và vì sao test không phát hiện?</w:t>
       </w:r>
     </w:p>
     <w:p/>

</xml_diff>

<commit_message>
fix(tk-03b, ca-04b): open the detail column only when something is picked
From 1280 px the Việc cần làm and Lịch screens kept a right column with
"Chọn một ... để xem chi tiết." while nothing was open. At the user's
request the column now exists only while a task or an appointment is
open, and the list or the calendar takes the whole width otherwise;
"Đóng" closes it again.

Co-Authored-By: Claude Opus 5.5 (1M context) <noreply@anthropic.com>
</commit_message>
<xml_diff>
--- a/docs/knowledge/phase-1-frontend-foundation.docx
+++ b/docs/knowledge/phase-1-frontend-foundation.docx
@@ -20155,6 +20155,180 @@
     </w:p>
     <w:p>
       <w:pPr>
+        <w:pStyle w:val="Heading3"/>
+      </w:pPr>
+      <w:r>
+        <w:t xml:space="preserve">12.5 Cột chi tiết chỉ mở khi chọn (TK-03b, CA-04b, góp ý của người dùng)</w:t>
+      </w:r>
+    </w:p>
+    <w:p>
+      <w:pPr>
+        <w:pStyle w:val="ListParagraph"/>
+        <w:numPr>
+          <w:ilvl w:val="0"/>
+          <w:numId w:val="1"/>
+        </w:numPr>
+      </w:pPr>
+      <w:r>
+        <w:rPr>
+          <w:b/>
+          <w:bCs/>
+        </w:rPr>
+        <w:t xml:space="preserve">Đổi gì:</w:t>
+      </w:r>
+      <w:r>
+        <w:t xml:space="preserve"> từ 1280 px, Lịch và Việc cần làm từng luôn có cột phải, trống thì ghi "Chọn một ... để xem chi tiết.". Giờ cột chỉ có khi đường dẫn có id (</w:t>
+      </w:r>
+      <w:r>
+        <w:rPr>
+          <w:rFonts w:ascii="Consolas" w:eastAsia="Consolas" w:hAnsi="Consolas" w:cs="Consolas"/>
+        </w:rPr>
+        <w:t xml:space="preserve">/tasks/:taskId</w:t>
+      </w:r>
+      <w:r>
+        <w:t xml:space="preserve">, </w:t>
+      </w:r>
+      <w:r>
+        <w:rPr>
+          <w:rFonts w:ascii="Consolas" w:eastAsia="Consolas" w:hAnsi="Consolas" w:cs="Consolas"/>
+        </w:rPr>
+        <w:t xml:space="preserve">/calendar/:itemId</w:t>
+      </w:r>
+      <w:r>
+        <w:t xml:space="preserve">); chưa chọn thì danh sách và lịch dùng hết bề ngang (1192 px thay vì 792 hoặc 852 px ở màn 1440 px).</w:t>
+      </w:r>
+    </w:p>
+    <w:p>
+      <w:pPr>
+        <w:pStyle w:val="ListParagraph"/>
+        <w:numPr>
+          <w:ilvl w:val="0"/>
+          <w:numId w:val="1"/>
+        </w:numPr>
+      </w:pPr>
+      <w:r>
+        <w:rPr>
+          <w:b/>
+          <w:bCs/>
+        </w:rPr>
+        <w:t xml:space="preserve">Hai chỗ cùng đổi theo id:</w:t>
+      </w:r>
+      <w:r>
+        <w:t xml:space="preserve"> lưới chỉ có hai cột khi có id (</w:t>
+      </w:r>
+      <w:r>
+        <w:rPr>
+          <w:rFonts w:ascii="Consolas" w:eastAsia="Consolas" w:hAnsi="Consolas" w:cs="Consolas"/>
+        </w:rPr>
+        <w:t xml:space="preserve">taskId &amp;&amp; 'xl:grid-cols-[...]'</w:t>
+      </w:r>
+      <w:r>
+        <w:t xml:space="preserve">), và </w:t>
+      </w:r>
+      <w:r>
+        <w:rPr>
+          <w:rFonts w:ascii="Consolas" w:eastAsia="Consolas" w:hAnsi="Consolas" w:cs="Consolas"/>
+        </w:rPr>
+        <w:t xml:space="preserve">&lt;aside&gt;</w:t>
+      </w:r>
+      <w:r>
+        <w:t xml:space="preserve"> chỉ được vẽ khi có id (</w:t>
+      </w:r>
+      <w:r>
+        <w:rPr>
+          <w:rFonts w:ascii="Consolas" w:eastAsia="Consolas" w:hAnsi="Consolas" w:cs="Consolas"/>
+        </w:rPr>
+        <w:t xml:space="preserve">{taskId &amp;&amp; &lt;aside&gt;}</w:t>
+      </w:r>
+      <w:r>
+        <w:t xml:space="preserve">). Chỉ bỏ </w:t>
+      </w:r>
+      <w:r>
+        <w:rPr>
+          <w:rFonts w:ascii="Consolas" w:eastAsia="Consolas" w:hAnsi="Consolas" w:cs="Consolas"/>
+        </w:rPr>
+        <w:t xml:space="preserve">&lt;aside&gt;</w:t>
+      </w:r>
+      <w:r>
+        <w:t xml:space="preserve"> mà giữ lưới hai cột thì còn lại một cột trống 400 px; chỉ đổi lưới mà vẫn vẽ </w:t>
+      </w:r>
+      <w:r>
+        <w:rPr>
+          <w:rFonts w:ascii="Consolas" w:eastAsia="Consolas" w:hAnsi="Consolas" w:cs="Consolas"/>
+        </w:rPr>
+        <w:t xml:space="preserve">&lt;aside&gt;</w:t>
+      </w:r>
+      <w:r>
+        <w:t xml:space="preserve"> thì nó rơi xuống dưới danh sách.</w:t>
+      </w:r>
+    </w:p>
+    <w:p>
+      <w:pPr>
+        <w:pStyle w:val="ListParagraph"/>
+        <w:numPr>
+          <w:ilvl w:val="0"/>
+          <w:numId w:val="1"/>
+        </w:numPr>
+      </w:pPr>
+      <w:r>
+        <w:rPr>
+          <w:b/>
+          <w:bCs/>
+        </w:rPr>
+        <w:t xml:space="preserve">Không vẽ, chứ không ẩn:</w:t>
+      </w:r>
+      <w:r>
+        <w:t xml:space="preserve"> khi chưa chọn, cột không có trong trang (không phải </w:t>
+      </w:r>
+      <w:r>
+        <w:rPr>
+          <w:rFonts w:ascii="Consolas" w:eastAsia="Consolas" w:hAnsi="Consolas" w:cs="Consolas"/>
+        </w:rPr>
+        <w:t xml:space="preserve">hidden</w:t>
+      </w:r>
+      <w:r>
+        <w:t xml:space="preserve">), nên trình đọc màn hình không gặp một vùng "Chi tiết việc" rỗng, và test kiểm được bằng </w:t>
+      </w:r>
+      <w:r>
+        <w:rPr>
+          <w:rFonts w:ascii="Consolas" w:eastAsia="Consolas" w:hAnsi="Consolas" w:cs="Consolas"/>
+        </w:rPr>
+        <w:t xml:space="preserve">queryByRole('complementary')</w:t>
+      </w:r>
+      <w:r>
+        <w:t xml:space="preserve"> trả về </w:t>
+      </w:r>
+      <w:r>
+        <w:rPr>
+          <w:rFonts w:ascii="Consolas" w:eastAsia="Consolas" w:hAnsi="Consolas" w:cs="Consolas"/>
+        </w:rPr>
+        <w:t xml:space="preserve">null</w:t>
+      </w:r>
+      <w:r>
+        <w:t xml:space="preserve">.</w:t>
+      </w:r>
+    </w:p>
+    <w:p>
+      <w:pPr>
+        <w:pStyle w:val="ListParagraph"/>
+        <w:numPr>
+          <w:ilvl w:val="0"/>
+          <w:numId w:val="1"/>
+        </w:numPr>
+      </w:pPr>
+      <w:r>
+        <w:rPr>
+          <w:b/>
+          <w:bCs/>
+        </w:rPr>
+        <w:t xml:space="preserve">Đánh đổi:</w:t>
+      </w:r>
+      <w:r>
+        <w:t xml:space="preserve"> mở một lịch hẹn thì lịch hẹp lại (1192 → 852 px), các cột ngày co theo. Đổi lại, lúc chỉ xem lịch thì có thêm chỗ cho tên lịch hẹn.</w:t>
+      </w:r>
+    </w:p>
+    <w:p>
+      <w:pPr>
         <w:pStyle w:val="Heading2"/>
       </w:pPr>
       <w:r>
@@ -22262,6 +22436,18 @@
       </w:r>
       <w:r>
         <w:t xml:space="preserve"> thấp đi, và vì sao test không phát hiện?</w:t>
+      </w:r>
+    </w:p>
+    <w:p>
+      <w:pPr>
+        <w:pStyle w:val="ListParagraph"/>
+        <w:numPr>
+          <w:ilvl w:val="0"/>
+          <w:numId w:val="100"/>
+        </w:numPr>
+      </w:pPr>
+      <w:r>
+        <w:t xml:space="preserve">Muốn cột chi tiết chỉ mở khi chọn, phải đổi hai chỗ nào? Chỉ đổi một chỗ thì màn trông ra sao?</w:t>
       </w:r>
     </w:p>
     <w:p/>

</xml_diff>

<commit_message>
fix(ca-02b): line the week's days up with the hour grid
The hour grid scrolls inside its own box, and on Windows its scrollbar
took 15 px from the seven columns below while the day row and the
whole-day row above kept their full width, so the columns drifted apart
up to 13 px by Sunday. Both rows now keep room for that scrollbar.

Co-Authored-By: Claude Opus 5.5 (1M context) <noreply@anthropic.com>
</commit_message>
<xml_diff>
--- a/docs/knowledge/phase-1-frontend-foundation.docx
+++ b/docs/knowledge/phase-1-frontend-foundation.docx
@@ -20329,6 +20329,116 @@
     </w:p>
     <w:p>
       <w:pPr>
+        <w:pStyle w:val="Heading3"/>
+      </w:pPr>
+      <w:r>
+        <w:t xml:space="preserve">12.6 Thanh cuộn làm lệch cột (CA-02b)</w:t>
+      </w:r>
+    </w:p>
+    <w:p>
+      <w:pPr>
+        <w:pStyle w:val="ListParagraph"/>
+        <w:numPr>
+          <w:ilvl w:val="0"/>
+          <w:numId w:val="1"/>
+        </w:numPr>
+      </w:pPr>
+      <w:r>
+        <w:rPr>
+          <w:b/>
+          <w:bCs/>
+        </w:rPr>
+        <w:t xml:space="preserve">Lỗi:</w:t>
+      </w:r>
+      <w:r>
+        <w:t xml:space="preserve"> dải ngày và hàng "cả ngày" nằm ngoài khung cuộn, lưới giờ nằm trong. Trên Windows thanh cuộn chiếm 15 px trong khung, nên bảy cột của lưới hẹp hơn bảy cột phía trên một chút, và càng sang phải càng lệch (Chủ nhật 13 px). Trên macOS thanh cuộn nổi trên nội dung, không chiếm chỗ, nên không thấy lỗi.</w:t>
+      </w:r>
+    </w:p>
+    <w:p>
+      <w:pPr>
+        <w:pStyle w:val="ListParagraph"/>
+        <w:numPr>
+          <w:ilvl w:val="0"/>
+          <w:numId w:val="1"/>
+        </w:numPr>
+      </w:pPr>
+      <w:r>
+        <w:rPr>
+          <w:b/>
+          <w:bCs/>
+        </w:rPr>
+        <w:t xml:space="preserve">Sửa:</w:t>
+      </w:r>
+      <w:r>
+        <w:t xml:space="preserve"> </w:t>
+      </w:r>
+      <w:r>
+        <w:rPr>
+          <w:rFonts w:ascii="Consolas" w:eastAsia="Consolas" w:hAnsi="Consolas" w:cs="Consolas"/>
+        </w:rPr>
+        <w:t xml:space="preserve">scrollbar-gutter: stable</w:t>
+      </w:r>
+      <w:r>
+        <w:t xml:space="preserve"> bảo trình duyệt chừa chỗ cho thanh cuộn dù chưa cần cuộn. Thuộc tính này chỉ có tác dụng với khối có </w:t>
+      </w:r>
+      <w:r>
+        <w:rPr>
+          <w:rFonts w:ascii="Consolas" w:eastAsia="Consolas" w:hAnsi="Consolas" w:cs="Consolas"/>
+        </w:rPr>
+        <w:t xml:space="preserve">overflow</w:t>
+      </w:r>
+      <w:r>
+        <w:t xml:space="preserve"> khác </w:t>
+      </w:r>
+      <w:r>
+        <w:rPr>
+          <w:rFonts w:ascii="Consolas" w:eastAsia="Consolas" w:hAnsi="Consolas" w:cs="Consolas"/>
+        </w:rPr>
+        <w:t xml:space="preserve">visible</w:t>
+      </w:r>
+      <w:r>
+        <w:t xml:space="preserve">, nên hai hàng trên được thêm </w:t>
+      </w:r>
+      <w:r>
+        <w:rPr>
+          <w:rFonts w:ascii="Consolas" w:eastAsia="Consolas" w:hAnsi="Consolas" w:cs="Consolas"/>
+        </w:rPr>
+        <w:t xml:space="preserve">overflow-hidden</w:t>
+      </w:r>
+      <w:r>
+        <w:t xml:space="preserve">. Ở máy có thanh cuộn nổi, cả hai bên đều không chừa gì, vẫn khớp.</w:t>
+      </w:r>
+    </w:p>
+    <w:p>
+      <w:pPr>
+        <w:pStyle w:val="ListParagraph"/>
+        <w:numPr>
+          <w:ilvl w:val="0"/>
+          <w:numId w:val="1"/>
+        </w:numPr>
+      </w:pPr>
+      <w:r>
+        <w:rPr>
+          <w:b/>
+          <w:bCs/>
+        </w:rPr>
+        <w:t xml:space="preserve">Bài học kiểm tra:</w:t>
+      </w:r>
+      <w:r>
+        <w:t xml:space="preserve"> ảnh chụp lúc CA-02 có lỗi này nhưng mắt không thấy được 2–13 px. Với bảng nhiều cột, đo mép trái của từng cột ở mỗi hàng (</w:t>
+      </w:r>
+      <w:r>
+        <w:rPr>
+          <w:rFonts w:ascii="Consolas" w:eastAsia="Consolas" w:hAnsi="Consolas" w:cs="Consolas"/>
+        </w:rPr>
+        <w:t xml:space="preserve">getBoundingClientRect().left</w:t>
+      </w:r>
+      <w:r>
+        <w:t xml:space="preserve">) rồi so sánh thì chắc hơn nhìn ảnh.</w:t>
+      </w:r>
+    </w:p>
+    <w:p>
+      <w:pPr>
         <w:pStyle w:val="Heading2"/>
       </w:pPr>
       <w:r>
@@ -22448,6 +22558,27 @@
       </w:pPr>
       <w:r>
         <w:t xml:space="preserve">Muốn cột chi tiết chỉ mở khi chọn, phải đổi hai chỗ nào? Chỉ đổi một chỗ thì màn trông ra sao?</w:t>
+      </w:r>
+    </w:p>
+    <w:p>
+      <w:pPr>
+        <w:pStyle w:val="ListParagraph"/>
+        <w:numPr>
+          <w:ilvl w:val="0"/>
+          <w:numId w:val="100"/>
+        </w:numPr>
+      </w:pPr>
+      <w:r>
+        <w:t xml:space="preserve">Vì sao cột của lưới tuần lệch trên Windows mà không lệch trên macOS, và </w:t>
+      </w:r>
+      <w:r>
+        <w:rPr>
+          <w:rFonts w:ascii="Consolas" w:eastAsia="Consolas" w:hAnsi="Consolas" w:cs="Consolas"/>
+        </w:rPr>
+        <w:t xml:space="preserve">scrollbar-gutter: stable</w:t>
+      </w:r>
+      <w:r>
+        <w:t xml:space="preserve"> sửa thế nào?</w:t>
       </w:r>
     </w:p>
     <w:p/>

</xml_diff>

<commit_message>
feat(fe-51): first import of a connected account on the BE-45 API
Back from Google, step 4 asks how far back to import with the estimate of
GET /api/accounts/{id}/initial-sync/estimate, and "Bắt đầu đồng bộ" posts
the range. Step 5 then follows GET /api/accounts/{id}/initial-sync every
2 s while it runs: the progress, "Đã nhập xong · N thư đã lưu" once done
(the inbox is read again), or why it stopped with "Thử lại" or "Đăng
nhập lại". The INITIAL_SYNC_READY flag and the sample estimate and
progress are gone.

Co-Authored-By: Claude Opus 5.5 (1M context) <noreply@anthropic.com>
</commit_message>
<xml_diff>
--- a/docs/knowledge/phase-1-frontend-foundation.docx
+++ b/docs/knowledge/phase-1-frontend-foundation.docx
@@ -20442,6 +20442,385 @@
         <w:pStyle w:val="Heading2"/>
       </w:pPr>
       <w:r>
+        <w:t xml:space="preserve">13. Nhập thư lần đầu trên API (FE-51 của F05)</w:t>
+      </w:r>
+    </w:p>
+    <w:p>
+      <w:pPr>
+        <w:pStyle w:val="Heading3"/>
+      </w:pPr>
+      <w:r>
+        <w:t xml:space="preserve">13.0 Bức tranh</w:t>
+      </w:r>
+    </w:p>
+    <w:p>
+      <w:pPr>
+        <w:pStyle w:val="ListParagraph"/>
+        <w:numPr>
+          <w:ilvl w:val="0"/>
+          <w:numId w:val="1"/>
+        </w:numPr>
+      </w:pPr>
+      <w:r>
+        <w:rPr>
+          <w:b/>
+          <w:bCs/>
+        </w:rPr>
+        <w:t xml:space="preserve">Ở đâu:</w:t>
+      </w:r>
+      <w:r>
+        <w:t xml:space="preserve"> </w:t>
+      </w:r>
+      <w:r>
+        <w:rPr>
+          <w:rFonts w:ascii="Consolas" w:eastAsia="Consolas" w:hAnsi="Consolas" w:cs="Consolas"/>
+        </w:rPr>
+        <w:t xml:space="preserve">src/features/accounts/</w:t>
+      </w:r>
+      <w:r>
+        <w:t xml:space="preserve"> (</w:t>
+      </w:r>
+      <w:r>
+        <w:rPr>
+          <w:rFonts w:ascii="Consolas" w:eastAsia="Consolas" w:hAnsi="Consolas" w:cs="Consolas"/>
+        </w:rPr>
+        <w:t xml:space="preserve">accounts.api.ts</w:t>
+      </w:r>
+      <w:r>
+        <w:t xml:space="preserve">, </w:t>
+      </w:r>
+      <w:r>
+        <w:rPr>
+          <w:rFonts w:ascii="Consolas" w:eastAsia="Consolas" w:hAnsi="Consolas" w:cs="Consolas"/>
+        </w:rPr>
+        <w:t xml:space="preserve">useConnect.ts</w:t>
+      </w:r>
+      <w:r>
+        <w:t xml:space="preserve">, </w:t>
+      </w:r>
+      <w:r>
+        <w:rPr>
+          <w:rFonts w:ascii="Consolas" w:eastAsia="Consolas" w:hAnsi="Consolas" w:cs="Consolas"/>
+        </w:rPr>
+        <w:t xml:space="preserve">components/ConnectWizard.tsx</w:t>
+      </w:r>
+      <w:r>
+        <w:t xml:space="preserve">).</w:t>
+      </w:r>
+    </w:p>
+    <w:p>
+      <w:pPr>
+        <w:pStyle w:val="ListParagraph"/>
+        <w:numPr>
+          <w:ilvl w:val="0"/>
+          <w:numId w:val="1"/>
+        </w:numPr>
+      </w:pPr>
+      <w:r>
+        <w:rPr>
+          <w:b/>
+          <w:bCs/>
+        </w:rPr>
+        <w:t xml:space="preserve">Là gì:</w:t>
+      </w:r>
+      <w:r>
+        <w:t xml:space="preserve"> kết nối Gmail xong, bước 4 hỏi nhập thư từ bao lâu (30 ngày, 90 ngày, toàn bộ) kèm ước tính; bước 5 theo dõi lần nhập do backend chạy nền (BE-45) tới khi xong hoặc dừng. Trước đây hai bước này chạy bằng dữ liệu mẫu sau cờ </w:t>
+      </w:r>
+      <w:r>
+        <w:rPr>
+          <w:rFonts w:ascii="Consolas" w:eastAsia="Consolas" w:hAnsi="Consolas" w:cs="Consolas"/>
+        </w:rPr>
+        <w:t xml:space="preserve">INITIAL_SYNC_READY</w:t>
+      </w:r>
+      <w:r>
+        <w:t xml:space="preserve">; giờ cờ và dữ liệu mẫu đã bỏ.</w:t>
+      </w:r>
+    </w:p>
+    <w:p>
+      <w:pPr>
+        <w:pStyle w:val="Heading3"/>
+      </w:pPr>
+      <w:r>
+        <w:t xml:space="preserve">13.1 Hỏi lại định kỳ (polling) bằng TanStack Query</w:t>
+      </w:r>
+    </w:p>
+    <w:p>
+      <w:pPr>
+        <w:pStyle w:val="ListParagraph"/>
+        <w:numPr>
+          <w:ilvl w:val="0"/>
+          <w:numId w:val="1"/>
+        </w:numPr>
+      </w:pPr>
+      <w:r>
+        <w:rPr>
+          <w:rFonts w:ascii="Consolas" w:eastAsia="Consolas" w:hAnsi="Consolas" w:cs="Consolas"/>
+          <w:b/>
+          <w:bCs/>
+        </w:rPr>
+        <w:t xml:space="preserve">refetchInterval</w:t>
+      </w:r>
+      <w:r>
+        <w:rPr>
+          <w:b/>
+          <w:bCs/>
+        </w:rPr>
+        <w:t xml:space="preserve"> nhận một hàm:</w:t>
+      </w:r>
+      <w:r>
+        <w:t xml:space="preserve"> </w:t>
+      </w:r>
+      <w:r>
+        <w:rPr>
+          <w:rFonts w:ascii="Consolas" w:eastAsia="Consolas" w:hAnsi="Consolas" w:cs="Consolas"/>
+        </w:rPr>
+        <w:t xml:space="preserve">(query) =&gt; query.state.data?.state === 'RUNNING' ? 2000 : false</w:t>
+      </w:r>
+      <w:r>
+        <w:t xml:space="preserve">. Đang chạy thì hỏi lại mỗi 2 s; </w:t>
+      </w:r>
+      <w:r>
+        <w:rPr>
+          <w:rFonts w:ascii="Consolas" w:eastAsia="Consolas" w:hAnsi="Consolas" w:cs="Consolas"/>
+        </w:rPr>
+        <w:t xml:space="preserve">DONE</w:t>
+      </w:r>
+      <w:r>
+        <w:t xml:space="preserve"> hay </w:t>
+      </w:r>
+      <w:r>
+        <w:rPr>
+          <w:rFonts w:ascii="Consolas" w:eastAsia="Consolas" w:hAnsi="Consolas" w:cs="Consolas"/>
+        </w:rPr>
+        <w:t xml:space="preserve">FAILED</w:t>
+      </w:r>
+      <w:r>
+        <w:t xml:space="preserve"> thì thôi hỏi. Không cần tự viết </w:t>
+      </w:r>
+      <w:r>
+        <w:rPr>
+          <w:rFonts w:ascii="Consolas" w:eastAsia="Consolas" w:hAnsi="Consolas" w:cs="Consolas"/>
+        </w:rPr>
+        <w:t xml:space="preserve">setInterval</w:t>
+      </w:r>
+      <w:r>
+        <w:t xml:space="preserve"> rồi nhớ dọn.</w:t>
+      </w:r>
+    </w:p>
+    <w:p>
+      <w:pPr>
+        <w:pStyle w:val="ListParagraph"/>
+        <w:numPr>
+          <w:ilvl w:val="0"/>
+          <w:numId w:val="1"/>
+        </w:numPr>
+      </w:pPr>
+      <w:r>
+        <w:rPr>
+          <w:b/>
+          <w:bCs/>
+        </w:rPr>
+        <w:t xml:space="preserve">Có dữ liệu ngay, rồi hỏi ngay:</w:t>
+      </w:r>
+      <w:r>
+        <w:t xml:space="preserve"> </w:t>
+      </w:r>
+      <w:r>
+        <w:rPr>
+          <w:rFonts w:ascii="Consolas" w:eastAsia="Consolas" w:hAnsi="Consolas" w:cs="Consolas"/>
+        </w:rPr>
+        <w:t xml:space="preserve">POST</w:t>
+      </w:r>
+      <w:r>
+        <w:t xml:space="preserve"> bắt đầu nhập trả về trạng thái; </w:t>
+      </w:r>
+      <w:r>
+        <w:rPr>
+          <w:rFonts w:ascii="Consolas" w:eastAsia="Consolas" w:hAnsi="Consolas" w:cs="Consolas"/>
+        </w:rPr>
+        <w:t xml:space="preserve">setQueryData</w:t>
+      </w:r>
+      <w:r>
+        <w:t xml:space="preserve"> đặt nó vào cache để bước 5 hiện ngay. Query có </w:t>
+      </w:r>
+      <w:r>
+        <w:rPr>
+          <w:rFonts w:ascii="Consolas" w:eastAsia="Consolas" w:hAnsi="Consolas" w:cs="Consolas"/>
+        </w:rPr>
+        <w:t xml:space="preserve">staleTime: 0</w:t>
+      </w:r>
+      <w:r>
+        <w:t xml:space="preserve">, nên khi bước 5 vừa hiện, dữ liệu đó bị coi là cũ và TanStack hỏi </w:t>
+      </w:r>
+      <w:r>
+        <w:rPr>
+          <w:rFonts w:ascii="Consolas" w:eastAsia="Consolas" w:hAnsi="Consolas" w:cs="Consolas"/>
+        </w:rPr>
+        <w:t xml:space="preserve">GET</w:t>
+      </w:r>
+      <w:r>
+        <w:t xml:space="preserve"> một lần luôn.</w:t>
+      </w:r>
+    </w:p>
+    <w:p>
+      <w:pPr>
+        <w:pStyle w:val="ListParagraph"/>
+        <w:numPr>
+          <w:ilvl w:val="0"/>
+          <w:numId w:val="1"/>
+        </w:numPr>
+      </w:pPr>
+      <w:r>
+        <w:rPr>
+          <w:b/>
+          <w:bCs/>
+        </w:rPr>
+        <w:t xml:space="preserve">Xong thì báo cho màn khác:</w:t>
+      </w:r>
+      <w:r>
+        <w:t xml:space="preserve"> khi trạng thái thành </w:t>
+      </w:r>
+      <w:r>
+        <w:rPr>
+          <w:rFonts w:ascii="Consolas" w:eastAsia="Consolas" w:hAnsi="Consolas" w:cs="Consolas"/>
+        </w:rPr>
+        <w:t xml:space="preserve">DONE</w:t>
+      </w:r>
+      <w:r>
+        <w:t xml:space="preserve">, </w:t>
+      </w:r>
+      <w:r>
+        <w:rPr>
+          <w:rFonts w:ascii="Consolas" w:eastAsia="Consolas" w:hAnsi="Consolas" w:cs="Consolas"/>
+        </w:rPr>
+        <w:t xml:space="preserve">invalidateQueries({ queryKey: ['inbox'] })</w:t>
+      </w:r>
+      <w:r>
+        <w:t xml:space="preserve"> đánh dấu mọi query của Hộp thư (khóa bắt đầu bằng </w:t>
+      </w:r>
+      <w:r>
+        <w:rPr>
+          <w:rFonts w:ascii="Consolas" w:eastAsia="Consolas" w:hAnsi="Consolas" w:cs="Consolas"/>
+        </w:rPr>
+        <w:t xml:space="preserve">'inbox'</w:t>
+      </w:r>
+      <w:r>
+        <w:t xml:space="preserve">) là cũ, nên mở Hộp thư là thấy thư vừa nhập.</w:t>
+      </w:r>
+    </w:p>
+    <w:p>
+      <w:pPr>
+        <w:pStyle w:val="Heading3"/>
+      </w:pPr>
+      <w:r>
+        <w:t xml:space="preserve">13.2 Đừng tin con số ước tính</w:t>
+      </w:r>
+    </w:p>
+    <w:p>
+      <w:pPr>
+        <w:pStyle w:val="ListParagraph"/>
+        <w:numPr>
+          <w:ilvl w:val="0"/>
+          <w:numId w:val="1"/>
+        </w:numPr>
+      </w:pPr>
+      <w:r>
+        <w:rPr>
+          <w:rFonts w:ascii="Consolas" w:eastAsia="Consolas" w:hAnsi="Consolas" w:cs="Consolas"/>
+        </w:rPr>
+        <w:t xml:space="preserve">imported</w:t>
+      </w:r>
+      <w:r>
+        <w:t xml:space="preserve"> đếm cả thư mới lẫn thư được cập nhật, còn </w:t>
+      </w:r>
+      <w:r>
+        <w:rPr>
+          <w:rFonts w:ascii="Consolas" w:eastAsia="Consolas" w:hAnsi="Consolas" w:cs="Consolas"/>
+        </w:rPr>
+        <w:t xml:space="preserve">estimated</w:t>
+      </w:r>
+      <w:r>
+        <w:t xml:space="preserve"> chỉ gần đúng. Nhập lại một hộp thư không đổi thì </w:t>
+      </w:r>
+      <w:r>
+        <w:rPr>
+          <w:rFonts w:ascii="Consolas" w:eastAsia="Consolas" w:hAnsi="Consolas" w:cs="Consolas"/>
+        </w:rPr>
+        <w:t xml:space="preserve">imported</w:t>
+      </w:r>
+      <w:r>
+        <w:t xml:space="preserve"> gần bằng 0 dù đã xong. Vì vậy phần trăm dừng ở 99 % tới khi máy chủ báo </w:t>
+      </w:r>
+      <w:r>
+        <w:rPr>
+          <w:rFonts w:ascii="Consolas" w:eastAsia="Consolas" w:hAnsi="Consolas" w:cs="Consolas"/>
+        </w:rPr>
+        <w:t xml:space="preserve">DONE</w:t>
+      </w:r>
+      <w:r>
+        <w:t xml:space="preserve">, và </w:t>
+      </w:r>
+      <w:r>
+        <w:rPr>
+          <w:rFonts w:ascii="Consolas" w:eastAsia="Consolas" w:hAnsi="Consolas" w:cs="Consolas"/>
+        </w:rPr>
+        <w:t xml:space="preserve">DONE</w:t>
+      </w:r>
+      <w:r>
+        <w:t xml:space="preserve"> luôn hiện là xong ("Đã nhập xong · N thư đã lưu").</w:t>
+      </w:r>
+    </w:p>
+    <w:p>
+      <w:pPr>
+        <w:pStyle w:val="ListParagraph"/>
+        <w:numPr>
+          <w:ilvl w:val="0"/>
+          <w:numId w:val="1"/>
+        </w:numPr>
+      </w:pPr>
+      <w:r>
+        <w:rPr>
+          <w:b/>
+          <w:bCs/>
+        </w:rPr>
+        <w:t xml:space="preserve">Từ mã lỗi tới việc người dùng làm được:</w:t>
+      </w:r>
+      <w:r>
+        <w:t xml:space="preserve"> </w:t>
+      </w:r>
+      <w:r>
+        <w:rPr>
+          <w:rFonts w:ascii="Consolas" w:eastAsia="Consolas" w:hAnsi="Consolas" w:cs="Consolas"/>
+        </w:rPr>
+        <w:t xml:space="preserve">errorCode</w:t>
+      </w:r>
+      <w:r>
+        <w:t xml:space="preserve"> (</w:t>
+      </w:r>
+      <w:r>
+        <w:rPr>
+          <w:rFonts w:ascii="Consolas" w:eastAsia="Consolas" w:hAnsi="Consolas" w:cs="Consolas"/>
+        </w:rPr>
+        <w:t xml:space="preserve">RATE_LIMITED</w:t>
+      </w:r>
+      <w:r>
+        <w:t xml:space="preserve">, </w:t>
+      </w:r>
+      <w:r>
+        <w:rPr>
+          <w:rFonts w:ascii="Consolas" w:eastAsia="Consolas" w:hAnsi="Consolas" w:cs="Consolas"/>
+        </w:rPr>
+        <w:t xml:space="preserve">AUTH_EXPIRED</w:t>
+      </w:r>
+      <w:r>
+        <w:t xml:space="preserve">…) được dịch thành câu và một nút: "Thử lại" (backend nhập tiếp từ chỗ dừng nếu cùng khoảng) hoặc "Đăng nhập lại" (mất quyền thì thử lại cũng vô ích).</w:t>
+      </w:r>
+    </w:p>
+    <w:p>
+      <w:pPr>
+        <w:pStyle w:val="Heading2"/>
+      </w:pPr>
+      <w:r>
         <w:t xml:space="preserve">Tự kiểm tra</w:t>
       </w:r>
     </w:p>
@@ -22579,6 +22958,48 @@
       </w:r>
       <w:r>
         <w:t xml:space="preserve"> sửa thế nào?</w:t>
+      </w:r>
+    </w:p>
+    <w:p>
+      <w:pPr>
+        <w:pStyle w:val="ListParagraph"/>
+        <w:numPr>
+          <w:ilvl w:val="0"/>
+          <w:numId w:val="100"/>
+        </w:numPr>
+      </w:pPr>
+      <w:r>
+        <w:t xml:space="preserve">Bước 5 hỏi trạng thái lần nhập mỗi 2 s. Điều gì làm nó thôi hỏi, và vì sao vừa mở bước 5 đã có một </w:t>
+      </w:r>
+      <w:r>
+        <w:rPr>
+          <w:rFonts w:ascii="Consolas" w:eastAsia="Consolas" w:hAnsi="Consolas" w:cs="Consolas"/>
+        </w:rPr>
+        <w:t xml:space="preserve">GET</w:t>
+      </w:r>
+      <w:r>
+        <w:t xml:space="preserve"> ngay?</w:t>
+      </w:r>
+    </w:p>
+    <w:p>
+      <w:pPr>
+        <w:pStyle w:val="ListParagraph"/>
+        <w:numPr>
+          <w:ilvl w:val="0"/>
+          <w:numId w:val="100"/>
+        </w:numPr>
+      </w:pPr>
+      <w:r>
+        <w:t xml:space="preserve">Vì sao phần trăm nhập thư dừng ở 99 % thay vì tính thẳng </w:t>
+      </w:r>
+      <w:r>
+        <w:rPr>
+          <w:rFonts w:ascii="Consolas" w:eastAsia="Consolas" w:hAnsi="Consolas" w:cs="Consolas"/>
+        </w:rPr>
+        <w:t xml:space="preserve">imported / estimated</w:t>
+      </w:r>
+      <w:r>
+        <w:t xml:space="preserve">?</w:t>
       </w:r>
     </w:p>
     <w:p/>

</xml_diff>

<commit_message>
feat(fe-52): first import on the Tài khoản pages
The account list now asks GET /api/accounts/{id}/initial-sync for every
account and keeps the status on the account, so the list, the detail and
the connect wizard read one source; the list is asked again every 2 s
while an import runs, and the inbox is read again once one is done. The
"Đồng bộ" column says "Đang đồng bộ · N%", "Lỗi đồng bộ" or "Chưa đồng
bộ" (on the phone list too). The detail offers "Nhập thư" for an account
with nothing imported, "Nhập tiếp" or "Đăng nhập lại" for a stopped
import, and "Đồng bộ ngay" opens the sync step of the wizard.

Co-Authored-By: Claude Opus 5.5 (1M context) <noreply@anthropic.com>
</commit_message>
<xml_diff>
--- a/docs/knowledge/phase-1-frontend-foundation.docx
+++ b/docs/knowledge/phase-1-frontend-foundation.docx
@@ -20818,6 +20818,171 @@
     </w:p>
     <w:p>
       <w:pPr>
+        <w:pStyle w:val="Heading3"/>
+      </w:pPr>
+      <w:r>
+        <w:t xml:space="preserve">13.3 Một nguồn cho mọi nơi (FE-52)</w:t>
+      </w:r>
+    </w:p>
+    <w:p>
+      <w:pPr>
+        <w:pStyle w:val="ListParagraph"/>
+        <w:numPr>
+          <w:ilvl w:val="0"/>
+          <w:numId w:val="1"/>
+        </w:numPr>
+      </w:pPr>
+      <w:r>
+        <w:rPr>
+          <w:b/>
+          <w:bCs/>
+        </w:rPr>
+        <w:t xml:space="preserve">Đổi hướng sau một task:</w:t>
+      </w:r>
+      <w:r>
+        <w:t xml:space="preserve"> FE-51 hỏi trạng thái bằng query riêng của từng tài khoản. Tới FE-52, danh sách, trang chi tiết và hộp kết nối đều cần trạng thái đó, nên nó chuyển vào query danh sách: </w:t>
+      </w:r>
+      <w:r>
+        <w:rPr>
+          <w:rFonts w:ascii="Consolas" w:eastAsia="Consolas" w:hAnsi="Consolas" w:cs="Consolas"/>
+        </w:rPr>
+        <w:t xml:space="preserve">fetchAccounts</w:t>
+      </w:r>
+      <w:r>
+        <w:t xml:space="preserve"> hỏi </w:t>
+      </w:r>
+      <w:r>
+        <w:rPr>
+          <w:rFonts w:ascii="Consolas" w:eastAsia="Consolas" w:hAnsi="Consolas" w:cs="Consolas"/>
+        </w:rPr>
+        <w:t xml:space="preserve">GET …/initial-sync</w:t>
+      </w:r>
+      <w:r>
+        <w:t xml:space="preserve"> cho từng tài khoản và ghép vào (</w:t>
+      </w:r>
+      <w:r>
+        <w:rPr>
+          <w:rFonts w:ascii="Consolas" w:eastAsia="Consolas" w:hAnsi="Consolas" w:cs="Consolas"/>
+        </w:rPr>
+        <w:t xml:space="preserve">withFirstImport</w:t>
+      </w:r>
+      <w:r>
+        <w:t xml:space="preserve">). Ba nơi đọc cùng một dữ liệu nên không thể lệch nhau.</w:t>
+      </w:r>
+    </w:p>
+    <w:p>
+      <w:pPr>
+        <w:pStyle w:val="ListParagraph"/>
+        <w:numPr>
+          <w:ilvl w:val="0"/>
+          <w:numId w:val="1"/>
+        </w:numPr>
+      </w:pPr>
+      <w:r>
+        <w:rPr>
+          <w:b/>
+          <w:bCs/>
+        </w:rPr>
+        <w:t xml:space="preserve">Hỏi lại có điều kiện cho cả danh sách:</w:t>
+      </w:r>
+      <w:r>
+        <w:t xml:space="preserve"> </w:t>
+      </w:r>
+      <w:r>
+        <w:rPr>
+          <w:rFonts w:ascii="Consolas" w:eastAsia="Consolas" w:hAnsi="Consolas" w:cs="Consolas"/>
+        </w:rPr>
+        <w:t xml:space="preserve">refetchInterval</w:t>
+      </w:r>
+      <w:r>
+        <w:t xml:space="preserve"> của query danh sách là 2 s khi có tài khoản đang nhập, </w:t>
+      </w:r>
+      <w:r>
+        <w:rPr>
+          <w:rFonts w:ascii="Consolas" w:eastAsia="Consolas" w:hAnsi="Consolas" w:cs="Consolas"/>
+        </w:rPr>
+        <w:t xml:space="preserve">false</w:t>
+      </w:r>
+      <w:r>
+        <w:t xml:space="preserve"> khi không. Query này có </w:t>
+      </w:r>
+      <w:r>
+        <w:rPr>
+          <w:rFonts w:ascii="Consolas" w:eastAsia="Consolas" w:hAnsi="Consolas" w:cs="Consolas"/>
+        </w:rPr>
+        <w:t xml:space="preserve">staleTime: Infinity</w:t>
+      </w:r>
+      <w:r>
+        <w:t xml:space="preserve"> (không tự tải lại), nên các test dựng sẵn dữ liệu mẫu không gửi request nào; nếu mỗi tài khoản có query riêng </w:t>
+      </w:r>
+      <w:r>
+        <w:rPr>
+          <w:rFonts w:ascii="Consolas" w:eastAsia="Consolas" w:hAnsi="Consolas" w:cs="Consolas"/>
+        </w:rPr>
+        <w:t xml:space="preserve">staleTime: 0</w:t>
+      </w:r>
+      <w:r>
+        <w:t xml:space="preserve">, mọi test như vậy sẽ phải trả lời thêm request.</w:t>
+      </w:r>
+    </w:p>
+    <w:p>
+      <w:pPr>
+        <w:pStyle w:val="ListParagraph"/>
+        <w:numPr>
+          <w:ilvl w:val="0"/>
+          <w:numId w:val="1"/>
+        </w:numPr>
+      </w:pPr>
+      <w:r>
+        <w:rPr>
+          <w:b/>
+          <w:bCs/>
+        </w:rPr>
+        <w:t xml:space="preserve">Đánh đổi:</w:t>
+      </w:r>
+      <w:r>
+        <w:t xml:space="preserve"> khi đang nhập, mỗi 2 s hỏi lại cả danh sách tài khoản, danh sách provider và trạng thái từng tài khoản. Với vài tài khoản thì không đáng kể; nhiều tài khoản thì nên để backend trả trạng thái nhập ngay trong </w:t>
+      </w:r>
+      <w:r>
+        <w:rPr>
+          <w:rFonts w:ascii="Consolas" w:eastAsia="Consolas" w:hAnsi="Consolas" w:cs="Consolas"/>
+        </w:rPr>
+        <w:t xml:space="preserve">GET /api/accounts</w:t>
+      </w:r>
+      <w:r>
+        <w:t xml:space="preserve">.</w:t>
+      </w:r>
+    </w:p>
+    <w:p>
+      <w:pPr>
+        <w:pStyle w:val="ListParagraph"/>
+        <w:numPr>
+          <w:ilvl w:val="0"/>
+          <w:numId w:val="1"/>
+        </w:numPr>
+      </w:pPr>
+      <w:r>
+        <w:rPr>
+          <w:b/>
+          <w:bCs/>
+        </w:rPr>
+        <w:t xml:space="preserve">Một lỗi đọc không làm hỏng cả danh sách:</w:t>
+      </w:r>
+      <w:r>
+        <w:t xml:space="preserve"> </w:t>
+      </w:r>
+      <w:r>
+        <w:rPr>
+          <w:rFonts w:ascii="Consolas" w:eastAsia="Consolas" w:hAnsi="Consolas" w:cs="Consolas"/>
+        </w:rPr>
+        <w:t xml:space="preserve">fetchInitialSync(id).catch(() =&gt; null)</w:t>
+      </w:r>
+      <w:r>
+        <w:t xml:space="preserve">: không đọc được trạng thái của một tài khoản thì tài khoản đó hiện như cũ.</w:t>
+      </w:r>
+    </w:p>
+    <w:p>
+      <w:pPr>
         <w:pStyle w:val="Heading2"/>
       </w:pPr>
       <w:r>
@@ -23000,6 +23165,18 @@
       </w:r>
       <w:r>
         <w:t xml:space="preserve">?</w:t>
+      </w:r>
+    </w:p>
+    <w:p>
+      <w:pPr>
+        <w:pStyle w:val="ListParagraph"/>
+        <w:numPr>
+          <w:ilvl w:val="0"/>
+          <w:numId w:val="100"/>
+        </w:numPr>
+      </w:pPr>
+      <w:r>
+        <w:t xml:space="preserve">Vì sao trạng thái lần nhập được ghép vào query danh sách tài khoản thay vì mỗi tài khoản một query? Cái giá là gì?</w:t>
       </w:r>
     </w:p>
     <w:p/>

</xml_diff>

<commit_message>
fix(ac-08): name accounts by their address, not the provider's id
With real Gmail the provider's id is Google's account number, so the
inbox and the account pages showed "115758365451560723981" where the
canvas has the email. The web now keeps `address ?? displayName` from
GET /api/accounts (BE-47; an account connected before it has no address
until it signs in again, and its Gmail display name is the email) and
shows it everywhere the id was shown.

Co-Authored-By: Claude Opus 5.5 (1M context) <noreply@anthropic.com>
</commit_message>
<xml_diff>
--- a/docs/knowledge/phase-1-frontend-foundation.docx
+++ b/docs/knowledge/phase-1-frontend-foundation.docx
@@ -20983,6 +20983,152 @@
     </w:p>
     <w:p>
       <w:pPr>
+        <w:pStyle w:val="Heading3"/>
+      </w:pPr>
+      <w:r>
+        <w:t xml:space="preserve">13.4 Mã và tên là hai thứ khác nhau (AC-08)</w:t>
+      </w:r>
+    </w:p>
+    <w:p>
+      <w:pPr>
+        <w:pStyle w:val="ListParagraph"/>
+        <w:numPr>
+          <w:ilvl w:val="0"/>
+          <w:numId w:val="1"/>
+        </w:numPr>
+      </w:pPr>
+      <w:r>
+        <w:rPr>
+          <w:b/>
+          <w:bCs/>
+        </w:rPr>
+        <w:t xml:space="preserve">Lỗi:</w:t>
+      </w:r>
+      <w:r>
+        <w:t xml:space="preserve"> các màn hiện </w:t>
+      </w:r>
+      <w:r>
+        <w:rPr>
+          <w:rFonts w:ascii="Consolas" w:eastAsia="Consolas" w:hAnsi="Consolas" w:cs="Consolas"/>
+        </w:rPr>
+        <w:t xml:space="preserve">externalAccountId</w:t>
+      </w:r>
+      <w:r>
+        <w:t xml:space="preserve"> làm tên tài khoản. Trong dữ liệu mẫu trường này là email nên trông đúng; với Gmail thật nó là mã số Google ("115758365451560723981"). Bài học: dữ liệu mẫu nên giống dữ liệu thật cả ở những trường người ta tưởng là hiển nhiên.</w:t>
+      </w:r>
+    </w:p>
+    <w:p>
+      <w:pPr>
+        <w:pStyle w:val="ListParagraph"/>
+        <w:numPr>
+          <w:ilvl w:val="0"/>
+          <w:numId w:val="1"/>
+        </w:numPr>
+      </w:pPr>
+      <w:r>
+        <w:rPr>
+          <w:b/>
+          <w:bCs/>
+        </w:rPr>
+        <w:t xml:space="preserve">Sửa:</w:t>
+      </w:r>
+      <w:r>
+        <w:t xml:space="preserve"> web có trường </w:t>
+      </w:r>
+      <w:r>
+        <w:rPr>
+          <w:rFonts w:ascii="Consolas" w:eastAsia="Consolas" w:hAnsi="Consolas" w:cs="Consolas"/>
+        </w:rPr>
+        <w:t xml:space="preserve">address</w:t>
+      </w:r>
+      <w:r>
+        <w:t xml:space="preserve"> để hiện, lấy </w:t>
+      </w:r>
+      <w:r>
+        <w:rPr>
+          <w:rFonts w:ascii="Consolas" w:eastAsia="Consolas" w:hAnsi="Consolas" w:cs="Consolas"/>
+        </w:rPr>
+        <w:t xml:space="preserve">address ?? displayName</w:t>
+      </w:r>
+      <w:r>
+        <w:t xml:space="preserve"> ngay ở lớp đọc API (</w:t>
+      </w:r>
+      <w:r>
+        <w:rPr>
+          <w:rFonts w:ascii="Consolas" w:eastAsia="Consolas" w:hAnsi="Consolas" w:cs="Consolas"/>
+        </w:rPr>
+        <w:t xml:space="preserve">??</w:t>
+      </w:r>
+      <w:r>
+        <w:t xml:space="preserve"> chỉ thay khi giá trị là </w:t>
+      </w:r>
+      <w:r>
+        <w:rPr>
+          <w:rFonts w:ascii="Consolas" w:eastAsia="Consolas" w:hAnsi="Consolas" w:cs="Consolas"/>
+        </w:rPr>
+        <w:t xml:space="preserve">null</w:t>
+      </w:r>
+      <w:r>
+        <w:t xml:space="preserve"> hoặc </w:t>
+      </w:r>
+      <w:r>
+        <w:rPr>
+          <w:rFonts w:ascii="Consolas" w:eastAsia="Consolas" w:hAnsi="Consolas" w:cs="Consolas"/>
+        </w:rPr>
+        <w:t xml:space="preserve">undefined</w:t>
+      </w:r>
+      <w:r>
+        <w:t xml:space="preserve">, khác </w:t>
+      </w:r>
+      <w:r>
+        <w:rPr>
+          <w:rFonts w:ascii="Consolas" w:eastAsia="Consolas" w:hAnsi="Consolas" w:cs="Consolas"/>
+        </w:rPr>
+        <w:t xml:space="preserve">||</w:t>
+      </w:r>
+      <w:r>
+        <w:t xml:space="preserve"> thay cả chuỗi rỗng). </w:t>
+      </w:r>
+      <w:r>
+        <w:rPr>
+          <w:rFonts w:ascii="Consolas" w:eastAsia="Consolas" w:hAnsi="Consolas" w:cs="Consolas"/>
+        </w:rPr>
+        <w:t xml:space="preserve">externalAccountId</w:t>
+      </w:r>
+      <w:r>
+        <w:t xml:space="preserve"> giữ đúng nghĩa là mã, không còn được hiện.</w:t>
+      </w:r>
+    </w:p>
+    <w:p>
+      <w:pPr>
+        <w:pStyle w:val="ListParagraph"/>
+        <w:numPr>
+          <w:ilvl w:val="0"/>
+          <w:numId w:val="1"/>
+        </w:numPr>
+      </w:pPr>
+      <w:r>
+        <w:rPr>
+          <w:b/>
+          <w:bCs/>
+        </w:rPr>
+        <w:t xml:space="preserve">Cách test bắt lỗi kiểu này:</w:t>
+      </w:r>
+      <w:r>
+        <w:t xml:space="preserve"> fixture API dùng mã số thật cho </w:t>
+      </w:r>
+      <w:r>
+        <w:rPr>
+          <w:rFonts w:ascii="Consolas" w:eastAsia="Consolas" w:hAnsi="Consolas" w:cs="Consolas"/>
+        </w:rPr>
+        <w:t xml:space="preserve">externalAccountId</w:t>
+      </w:r>
+      <w:r>
+        <w:t xml:space="preserve">; màn nào còn hiện mã thì test tìm email sẽ đỏ.</w:t>
+      </w:r>
+    </w:p>
+    <w:p>
+      <w:pPr>
         <w:pStyle w:val="Heading2"/>
       </w:pPr>
       <w:r>
@@ -23177,6 +23323,33 @@
       </w:pPr>
       <w:r>
         <w:t xml:space="preserve">Vì sao trạng thái lần nhập được ghép vào query danh sách tài khoản thay vì mỗi tài khoản một query? Cái giá là gì?</w:t>
+      </w:r>
+    </w:p>
+    <w:p>
+      <w:pPr>
+        <w:pStyle w:val="ListParagraph"/>
+        <w:numPr>
+          <w:ilvl w:val="0"/>
+          <w:numId w:val="100"/>
+        </w:numPr>
+      </w:pPr>
+      <w:r>
+        <w:rPr>
+          <w:rFonts w:ascii="Consolas" w:eastAsia="Consolas" w:hAnsi="Consolas" w:cs="Consolas"/>
+        </w:rPr>
+        <w:t xml:space="preserve">address ?? displayName</w:t>
+      </w:r>
+      <w:r>
+        <w:t xml:space="preserve"> và </w:t>
+      </w:r>
+      <w:r>
+        <w:rPr>
+          <w:rFonts w:ascii="Consolas" w:eastAsia="Consolas" w:hAnsi="Consolas" w:cs="Consolas"/>
+        </w:rPr>
+        <w:t xml:space="preserve">address || displayName</w:t>
+      </w:r>
+      <w:r>
+        <w:t xml:space="preserve"> khác nhau khi nào?</w:t>
       </w:r>
     </w:p>
     <w:p/>

</xml_diff>

<commit_message>
fix(ac-07): start "Đồng bộ ngay" on the range the account was imported with
Importing an account again reads every message of the range, so the
sync step opened from the detail now starts on the range of the last
import instead of 90 days (suggested by the backend session).

Co-Authored-By: Claude Opus 5.5 (1M context) <noreply@anthropic.com>
</commit_message>
<xml_diff>
--- a/docs/knowledge/phase-1-frontend-foundation.docx
+++ b/docs/knowledge/phase-1-frontend-foundation.docx
@@ -20966,6 +20966,25 @@
           <w:b/>
           <w:bCs/>
         </w:rPr>
+        <w:t xml:space="preserve">Mặc định có giá:</w:t>
+      </w:r>
+      <w:r>
+        <w:t xml:space="preserve"> bước chọn khoảng mở từ "Đồng bộ ngay" chọn sẵn khoảng của lần nhập trước, vì nhập lại đọc mọi thư trong khoảng (hạn mức Gmail, thời gian). Một giá trị mặc định cũng là một quyết định.</w:t>
+      </w:r>
+    </w:p>
+    <w:p>
+      <w:pPr>
+        <w:pStyle w:val="ListParagraph"/>
+        <w:numPr>
+          <w:ilvl w:val="0"/>
+          <w:numId w:val="1"/>
+        </w:numPr>
+      </w:pPr>
+      <w:r>
+        <w:rPr>
+          <w:b/>
+          <w:bCs/>
+        </w:rPr>
         <w:t xml:space="preserve">Một lỗi đọc không làm hỏng cả danh sách:</w:t>
       </w:r>
       <w:r>

</xml_diff>

<commit_message>
feat(fe-53): one event stream for the signed-in web
The shell opens one EventSource on /api/events/stream once signed in.
conversations.changed reads the inbox again, account.changed the account
list and the inbox frame, and a stream that opens again after a loss
reads both again since the stream has no ids. The account list now asks
again every 2 s during an import only while the stream is not open.
Tests get a stand-in EventSource that plays the server.

Co-Authored-By: Claude Opus 5.5 (1M context) <noreply@anthropic.com>
</commit_message>
<xml_diff>
--- a/docs/knowledge/phase-1-frontend-foundation.docx
+++ b/docs/knowledge/phase-1-frontend-foundation.docx
@@ -21151,6 +21151,408 @@
         <w:pStyle w:val="Heading2"/>
       </w:pPr>
       <w:r>
+        <w:t xml:space="preserve">14. Hộp thư realtime: phía web (F08, </w:t>
+      </w:r>
+      <w:r>
+        <w:rPr>
+          <w:rFonts w:ascii="Consolas" w:eastAsia="Consolas" w:hAnsi="Consolas" w:cs="Consolas"/>
+        </w:rPr>
+        <w:t xml:space="preserve">f07-f08-realtime-inbox</w:t>
+      </w:r>
+      <w:r>
+        <w:t xml:space="preserve">)</w:t>
+      </w:r>
+    </w:p>
+    <w:p>
+      <w:pPr>
+        <w:pStyle w:val="Heading3"/>
+      </w:pPr>
+      <w:r>
+        <w:t xml:space="preserve">14.0 Bức tranh</w:t>
+      </w:r>
+    </w:p>
+    <w:p>
+      <w:pPr>
+        <w:pStyle w:val="ListParagraph"/>
+        <w:numPr>
+          <w:ilvl w:val="0"/>
+          <w:numId w:val="1"/>
+        </w:numPr>
+      </w:pPr>
+      <w:r>
+        <w:rPr>
+          <w:b/>
+          <w:bCs/>
+        </w:rPr>
+        <w:t xml:space="preserve">Ở đâu:</w:t>
+      </w:r>
+      <w:r>
+        <w:t xml:space="preserve"> </w:t>
+      </w:r>
+      <w:r>
+        <w:rPr>
+          <w:rFonts w:ascii="Consolas" w:eastAsia="Consolas" w:hAnsi="Consolas" w:cs="Consolas"/>
+        </w:rPr>
+        <w:t xml:space="preserve">src/app/realtime/useEventStream.ts</w:t>
+      </w:r>
+      <w:r>
+        <w:t xml:space="preserve">, </w:t>
+      </w:r>
+      <w:r>
+        <w:rPr>
+          <w:rFonts w:ascii="Consolas" w:eastAsia="Consolas" w:hAnsi="Consolas" w:cs="Consolas"/>
+        </w:rPr>
+        <w:t xml:space="preserve">src/shared/realtime/streamState.ts</w:t>
+      </w:r>
+      <w:r>
+        <w:t xml:space="preserve">, </w:t>
+      </w:r>
+      <w:r>
+        <w:rPr>
+          <w:rFonts w:ascii="Consolas" w:eastAsia="Consolas" w:hAnsi="Consolas" w:cs="Consolas"/>
+        </w:rPr>
+        <w:t xml:space="preserve">src/test/eventSource.ts</w:t>
+      </w:r>
+      <w:r>
+        <w:t xml:space="preserve">.</w:t>
+      </w:r>
+    </w:p>
+    <w:p>
+      <w:pPr>
+        <w:pStyle w:val="ListParagraph"/>
+        <w:numPr>
+          <w:ilvl w:val="0"/>
+          <w:numId w:val="1"/>
+        </w:numPr>
+      </w:pPr>
+      <w:r>
+        <w:rPr>
+          <w:b/>
+          <w:bCs/>
+        </w:rPr>
+        <w:t xml:space="preserve">Là gì:</w:t>
+      </w:r>
+      <w:r>
+        <w:t xml:space="preserve"> backend đẩy sự kiện qua SSE (</w:t>
+      </w:r>
+      <w:r>
+        <w:rPr>
+          <w:rFonts w:ascii="Consolas" w:eastAsia="Consolas" w:hAnsi="Consolas" w:cs="Consolas"/>
+        </w:rPr>
+        <w:t xml:space="preserve">GET /api/events/stream</w:t>
+      </w:r>
+      <w:r>
+        <w:t xml:space="preserve">); web giữ đúng một kết nối cho cả app. Sự kiện không mang nội dung thư, chỉ nói "Hộp thư đổi" hay "tài khoản đổi"; web đánh dấu query tương ứng là cũ và đọc lại từ API như bình thường.</w:t>
+      </w:r>
+    </w:p>
+    <w:p>
+      <w:pPr>
+        <w:pStyle w:val="Heading3"/>
+      </w:pPr>
+      <w:r>
+        <w:t xml:space="preserve">14.1 EventSource (FE-53)</w:t>
+      </w:r>
+    </w:p>
+    <w:p>
+      <w:pPr>
+        <w:pStyle w:val="ListParagraph"/>
+        <w:numPr>
+          <w:ilvl w:val="0"/>
+          <w:numId w:val="1"/>
+        </w:numPr>
+      </w:pPr>
+      <w:r>
+        <w:rPr>
+          <w:b/>
+          <w:bCs/>
+        </w:rPr>
+        <w:t xml:space="preserve">Có sẵn trong trình duyệt:</w:t>
+      </w:r>
+      <w:r>
+        <w:t xml:space="preserve"> </w:t>
+      </w:r>
+      <w:r>
+        <w:rPr>
+          <w:rFonts w:ascii="Consolas" w:eastAsia="Consolas" w:hAnsi="Consolas" w:cs="Consolas"/>
+        </w:rPr>
+        <w:t xml:space="preserve">new EventSource(url)</w:t>
+      </w:r>
+      <w:r>
+        <w:t xml:space="preserve"> mở một request GET kéo dài; server gửi các khối chữ </w:t>
+      </w:r>
+      <w:r>
+        <w:rPr>
+          <w:rFonts w:ascii="Consolas" w:eastAsia="Consolas" w:hAnsi="Consolas" w:cs="Consolas"/>
+        </w:rPr>
+        <w:t xml:space="preserve">event: tên</w:t>
+      </w:r>
+      <w:r>
+        <w:t xml:space="preserve"> + </w:t>
+      </w:r>
+      <w:r>
+        <w:rPr>
+          <w:rFonts w:ascii="Consolas" w:eastAsia="Consolas" w:hAnsi="Consolas" w:cs="Consolas"/>
+        </w:rPr>
+        <w:t xml:space="preserve">data: ...</w:t>
+      </w:r>
+      <w:r>
+        <w:t xml:space="preserve"> cách nhau bởi một dòng trống. Tên sự kiện riêng phải nghe bằng </w:t>
+      </w:r>
+      <w:r>
+        <w:rPr>
+          <w:rFonts w:ascii="Consolas" w:eastAsia="Consolas" w:hAnsi="Consolas" w:cs="Consolas"/>
+        </w:rPr>
+        <w:t xml:space="preserve">addEventListener('tên', ...)</w:t>
+      </w:r>
+      <w:r>
+        <w:t xml:space="preserve">; </w:t>
+      </w:r>
+      <w:r>
+        <w:rPr>
+          <w:rFonts w:ascii="Consolas" w:eastAsia="Consolas" w:hAnsi="Consolas" w:cs="Consolas"/>
+        </w:rPr>
+        <w:t xml:space="preserve">onmessage</w:t>
+      </w:r>
+      <w:r>
+        <w:t xml:space="preserve"> chỉ nhận sự kiện không có tên.</w:t>
+      </w:r>
+    </w:p>
+    <w:p>
+      <w:pPr>
+        <w:pStyle w:val="ListParagraph"/>
+        <w:numPr>
+          <w:ilvl w:val="0"/>
+          <w:numId w:val="1"/>
+        </w:numPr>
+      </w:pPr>
+      <w:r>
+        <w:rPr>
+          <w:b/>
+          <w:bCs/>
+        </w:rPr>
+        <w:t xml:space="preserve">Tự nối lại:</w:t>
+      </w:r>
+      <w:r>
+        <w:t xml:space="preserve"> mất kết nối thì trình duyệt tự mở lại sau khoảng </w:t>
+      </w:r>
+      <w:r>
+        <w:rPr>
+          <w:rFonts w:ascii="Consolas" w:eastAsia="Consolas" w:hAnsi="Consolas" w:cs="Consolas"/>
+        </w:rPr>
+        <w:t xml:space="preserve">retry:</w:t>
+      </w:r>
+      <w:r>
+        <w:t xml:space="preserve"> server đã gửi (Sino: 3000 ms). Server trả lỗi (ví dụ </w:t>
+      </w:r>
+      <w:r>
+        <w:rPr>
+          <w:rFonts w:ascii="Consolas" w:eastAsia="Consolas" w:hAnsi="Consolas" w:cs="Consolas"/>
+        </w:rPr>
+        <w:t xml:space="preserve">401</w:t>
+      </w:r>
+      <w:r>
+        <w:t xml:space="preserve"> khi hết phiên) thì trình duyệt bỏ hẳn: </w:t>
+      </w:r>
+      <w:r>
+        <w:rPr>
+          <w:rFonts w:ascii="Consolas" w:eastAsia="Consolas" w:hAnsi="Consolas" w:cs="Consolas"/>
+        </w:rPr>
+        <w:t xml:space="preserve">readyState</w:t>
+      </w:r>
+      <w:r>
+        <w:t xml:space="preserve"> = </w:t>
+      </w:r>
+      <w:r>
+        <w:rPr>
+          <w:rFonts w:ascii="Consolas" w:eastAsia="Consolas" w:hAnsi="Consolas" w:cs="Consolas"/>
+        </w:rPr>
+        <w:t xml:space="preserve">CLOSED</w:t>
+      </w:r>
+      <w:r>
+        <w:t xml:space="preserve">.</w:t>
+      </w:r>
+    </w:p>
+    <w:p>
+      <w:pPr>
+        <w:pStyle w:val="ListParagraph"/>
+        <w:numPr>
+          <w:ilvl w:val="0"/>
+          <w:numId w:val="1"/>
+        </w:numPr>
+      </w:pPr>
+      <w:r>
+        <w:rPr>
+          <w:b/>
+          <w:bCs/>
+        </w:rPr>
+        <w:t xml:space="preserve">Không gửi được header tự đặt:</w:t>
+      </w:r>
+      <w:r>
+        <w:t xml:space="preserve"> nên xác thực bằng cookie phiên (D-22) là vừa; request GET không cần CSRF.</w:t>
+      </w:r>
+    </w:p>
+    <w:p>
+      <w:pPr>
+        <w:pStyle w:val="ListParagraph"/>
+        <w:numPr>
+          <w:ilvl w:val="0"/>
+          <w:numId w:val="1"/>
+        </w:numPr>
+      </w:pPr>
+      <w:r>
+        <w:rPr>
+          <w:b/>
+          <w:bCs/>
+        </w:rPr>
+        <w:t xml:space="preserve">Bù sự kiện lỡ:</w:t>
+      </w:r>
+      <w:r>
+        <w:t xml:space="preserve"> luồng của Sino không có </w:t>
+      </w:r>
+      <w:r>
+        <w:rPr>
+          <w:rFonts w:ascii="Consolas" w:eastAsia="Consolas" w:hAnsi="Consolas" w:cs="Consolas"/>
+        </w:rPr>
+        <w:t xml:space="preserve">id:</w:t>
+      </w:r>
+      <w:r>
+        <w:t xml:space="preserve">, nên mỗi lần mở lại web đọc lại Hộp thư và tài khoản một lần.</w:t>
+      </w:r>
+    </w:p>
+    <w:p>
+      <w:pPr>
+        <w:pStyle w:val="ListParagraph"/>
+        <w:numPr>
+          <w:ilvl w:val="0"/>
+          <w:numId w:val="1"/>
+        </w:numPr>
+      </w:pPr>
+      <w:r>
+        <w:rPr>
+          <w:b/>
+          <w:bCs/>
+        </w:rPr>
+        <w:t xml:space="preserve">Bẫy, sự kiện tới lúc trang còn đang tải:</w:t>
+      </w:r>
+      <w:r>
+        <w:t xml:space="preserve"> </w:t>
+      </w:r>
+      <w:r>
+        <w:rPr>
+          <w:rFonts w:ascii="Consolas" w:eastAsia="Consolas" w:hAnsi="Consolas" w:cs="Consolas"/>
+        </w:rPr>
+        <w:t xml:space="preserve">invalidateQueries</w:t>
+      </w:r>
+      <w:r>
+        <w:t xml:space="preserve"> của TanStack Query tải lại các query đang hiện; nhưng nếu query đó đang tải lần đầu (chưa có dữ liệu), nó chỉ chờ request đang chạy chứ không gửi thêm. Thấy được trên Chrome thật, không thấy trong test.</w:t>
+      </w:r>
+    </w:p>
+    <w:p>
+      <w:pPr>
+        <w:pStyle w:val="ListParagraph"/>
+        <w:numPr>
+          <w:ilvl w:val="0"/>
+          <w:numId w:val="1"/>
+        </w:numPr>
+      </w:pPr>
+      <w:r>
+        <w:rPr>
+          <w:b/>
+          <w:bCs/>
+        </w:rPr>
+        <w:t xml:space="preserve">Trạng thái dùng chung ngoài React:</w:t>
+      </w:r>
+      <w:r>
+        <w:t xml:space="preserve"> </w:t>
+      </w:r>
+      <w:r>
+        <w:rPr>
+          <w:rFonts w:ascii="Consolas" w:eastAsia="Consolas" w:hAnsi="Consolas" w:cs="Consolas"/>
+        </w:rPr>
+        <w:t xml:space="preserve">streamState.ts</w:t>
+      </w:r>
+      <w:r>
+        <w:t xml:space="preserve"> là một biến của module kèm danh sách người nghe; </w:t>
+      </w:r>
+      <w:r>
+        <w:rPr>
+          <w:rFonts w:ascii="Consolas" w:eastAsia="Consolas" w:hAnsi="Consolas" w:cs="Consolas"/>
+        </w:rPr>
+        <w:t xml:space="preserve">useSyncExternalStore</w:t>
+      </w:r>
+      <w:r>
+        <w:t xml:space="preserve"> cho component vẽ lại khi nó đổi. Trang Tài khoản dùng nó để chỉ hỏi lại mỗi 2 s khi luồng không mở.</w:t>
+      </w:r>
+    </w:p>
+    <w:p>
+      <w:pPr>
+        <w:pStyle w:val="ListParagraph"/>
+        <w:numPr>
+          <w:ilvl w:val="0"/>
+          <w:numId w:val="1"/>
+        </w:numPr>
+      </w:pPr>
+      <w:r>
+        <w:rPr>
+          <w:b/>
+          <w:bCs/>
+        </w:rPr>
+        <w:t xml:space="preserve">Test:</w:t>
+      </w:r>
+      <w:r>
+        <w:t xml:space="preserve"> jsdom không có EventSource; lớp giả trong </w:t>
+      </w:r>
+      <w:r>
+        <w:rPr>
+          <w:rFonts w:ascii="Consolas" w:eastAsia="Consolas" w:hAnsi="Consolas" w:cs="Consolas"/>
+        </w:rPr>
+        <w:t xml:space="preserve">test/eventSource.ts</w:t>
+      </w:r>
+      <w:r>
+        <w:t xml:space="preserve"> ghi lại các luồng app mở và cho test đóng vai server (</w:t>
+      </w:r>
+      <w:r>
+        <w:rPr>
+          <w:rFonts w:ascii="Consolas" w:eastAsia="Consolas" w:hAnsi="Consolas" w:cs="Consolas"/>
+        </w:rPr>
+        <w:t xml:space="preserve">open</w:t>
+      </w:r>
+      <w:r>
+        <w:t xml:space="preserve">, </w:t>
+      </w:r>
+      <w:r>
+        <w:rPr>
+          <w:rFonts w:ascii="Consolas" w:eastAsia="Consolas" w:hAnsi="Consolas" w:cs="Consolas"/>
+        </w:rPr>
+        <w:t xml:space="preserve">emit</w:t>
+      </w:r>
+      <w:r>
+        <w:t xml:space="preserve">, </w:t>
+      </w:r>
+      <w:r>
+        <w:rPr>
+          <w:rFonts w:ascii="Consolas" w:eastAsia="Consolas" w:hAnsi="Consolas" w:cs="Consolas"/>
+        </w:rPr>
+        <w:t xml:space="preserve">drop</w:t>
+      </w:r>
+      <w:r>
+        <w:t xml:space="preserve">, </w:t>
+      </w:r>
+      <w:r>
+        <w:rPr>
+          <w:rFonts w:ascii="Consolas" w:eastAsia="Consolas" w:hAnsi="Consolas" w:cs="Consolas"/>
+        </w:rPr>
+        <w:t xml:space="preserve">fail</w:t>
+      </w:r>
+      <w:r>
+        <w:t xml:space="preserve">).</w:t>
+      </w:r>
+    </w:p>
+    <w:p>
+      <w:pPr>
+        <w:pStyle w:val="Heading2"/>
+      </w:pPr>
+      <w:r>
         <w:t xml:space="preserve">Tự kiểm tra</w:t>
       </w:r>
     </w:p>
@@ -23369,6 +23771,48 @@
       </w:r>
       <w:r>
         <w:t xml:space="preserve"> khác nhau khi nào?</w:t>
+      </w:r>
+    </w:p>
+    <w:p>
+      <w:pPr>
+        <w:pStyle w:val="ListParagraph"/>
+        <w:numPr>
+          <w:ilvl w:val="0"/>
+          <w:numId w:val="100"/>
+        </w:numPr>
+      </w:pPr>
+      <w:r>
+        <w:t xml:space="preserve">Vì sao Sino dùng </w:t>
+      </w:r>
+      <w:r>
+        <w:rPr>
+          <w:rFonts w:ascii="Consolas" w:eastAsia="Consolas" w:hAnsi="Consolas" w:cs="Consolas"/>
+        </w:rPr>
+        <w:t xml:space="preserve">addEventListener('conversations.changed', ...)</w:t>
+      </w:r>
+      <w:r>
+        <w:t xml:space="preserve"> mà không dùng </w:t>
+      </w:r>
+      <w:r>
+        <w:rPr>
+          <w:rFonts w:ascii="Consolas" w:eastAsia="Consolas" w:hAnsi="Consolas" w:cs="Consolas"/>
+        </w:rPr>
+        <w:t xml:space="preserve">onmessage</w:t>
+      </w:r>
+      <w:r>
+        <w:t xml:space="preserve">? Sau khi mất kết nối, ai mở lại luồng, và web làm gì khi luồng mở lại?</w:t>
+      </w:r>
+    </w:p>
+    <w:p>
+      <w:pPr>
+        <w:pStyle w:val="ListParagraph"/>
+        <w:numPr>
+          <w:ilvl w:val="0"/>
+          <w:numId w:val="100"/>
+        </w:numPr>
+      </w:pPr>
+      <w:r>
+        <w:t xml:space="preserve">Một sự kiện tới lúc trang đang tải lần đầu thì vì sao không có request mới? Khi nào điều đó thành vấn đề?</w:t>
       </w:r>
     </w:p>
     <w:p/>

</xml_diff>

<commit_message>
feat(fe-54): new mail slides into the inbox, with "N thư mới"
Rows that arrive above the first row already shown slide in by 6 px and
fade (only fade with reduced motion), up to six at a time as in the canvas
MotionSpec C; a first load or another filter is not counted. Mail brought
by background sync adds up in a small "N thư mới" that hides after 6 s or
scrolls the list to the top. The inbox count of the navigation now comes
from GET /api/conversations/counts in a light query of its own, read again
by the event stream.

Co-Authored-By: Claude Opus 5.5 (1M context) <noreply@anthropic.com>
</commit_message>
<xml_diff>
--- a/docs/knowledge/phase-1-frontend-foundation.docx
+++ b/docs/knowledge/phase-1-frontend-foundation.docx
@@ -21550,6 +21550,200 @@
     </w:p>
     <w:p>
       <w:pPr>
+        <w:pStyle w:val="Heading3"/>
+      </w:pPr>
+      <w:r>
+        <w:t xml:space="preserve">14.2 Hàng mới và "N thư mới" (FE-54)</w:t>
+      </w:r>
+    </w:p>
+    <w:p>
+      <w:pPr>
+        <w:pStyle w:val="ListParagraph"/>
+        <w:numPr>
+          <w:ilvl w:val="0"/>
+          <w:numId w:val="1"/>
+        </w:numPr>
+      </w:pPr>
+      <w:r>
+        <w:rPr>
+          <w:b/>
+          <w:bCs/>
+        </w:rPr>
+        <w:t xml:space="preserve">Hàng nào là mới:</w:t>
+      </w:r>
+      <w:r>
+        <w:t xml:space="preserve"> so danh sách vừa tải với danh sách trước, chỉ lấy các hàng chưa thấy nằm </w:t>
+      </w:r>
+      <w:r>
+        <w:rPr>
+          <w:b/>
+          <w:bCs/>
+        </w:rPr>
+        <w:t xml:space="preserve">trên</w:t>
+      </w:r>
+      <w:r>
+        <w:t xml:space="preserve"> hàng cũ đầu tiên (thư mới luôn lên đầu). Trang cũ tải thêm ở cuối khi cuộn, hay một cuộc trò chuyện cũ được đẩy lên, không tính.</w:t>
+      </w:r>
+    </w:p>
+    <w:p>
+      <w:pPr>
+        <w:pStyle w:val="ListParagraph"/>
+        <w:numPr>
+          <w:ilvl w:val="0"/>
+          <w:numId w:val="1"/>
+        </w:numPr>
+      </w:pPr>
+      <w:r>
+        <w:rPr>
+          <w:b/>
+          <w:bCs/>
+        </w:rPr>
+        <w:t xml:space="preserve">Bẫy, lần tải đầu:</w:t>
+      </w:r>
+      <w:r>
+        <w:t xml:space="preserve"> danh sách đi từ rỗng (đang tải) sang có dữ liệu thì mọi hàng đều "chưa thấy". Test không bắt được vì chỉ kiểm sau khi có sự kiện; Chrome thật cho thấy mọi hàng cùng trượt vào lúc mở trang. Luật thêm: danh sách trước rỗng thì không có gì để so.</w:t>
+      </w:r>
+    </w:p>
+    <w:p>
+      <w:pPr>
+        <w:pStyle w:val="ListParagraph"/>
+        <w:numPr>
+          <w:ilvl w:val="0"/>
+          <w:numId w:val="1"/>
+        </w:numPr>
+      </w:pPr>
+      <w:r>
+        <w:rPr>
+          <w:b/>
+          <w:bCs/>
+        </w:rPr>
+        <w:t xml:space="preserve">Giữ trạng thái theo prop đổi:</w:t>
+      </w:r>
+      <w:r>
+        <w:t xml:space="preserve"> </w:t>
+      </w:r>
+      <w:r>
+        <w:rPr>
+          <w:rFonts w:ascii="Consolas" w:eastAsia="Consolas" w:hAnsi="Consolas" w:cs="Consolas"/>
+        </w:rPr>
+        <w:t xml:space="preserve">useArrivedRows</w:t>
+      </w:r>
+      <w:r>
+        <w:t xml:space="preserve"> so </w:t>
+      </w:r>
+      <w:r>
+        <w:rPr>
+          <w:rFonts w:ascii="Consolas" w:eastAsia="Consolas" w:hAnsi="Consolas" w:cs="Consolas"/>
+        </w:rPr>
+        <w:t xml:space="preserve">idsKey</w:t>
+      </w:r>
+      <w:r>
+        <w:t xml:space="preserve"> mới với cái đã lưu ngay trong lúc vẽ và gọi </w:t>
+      </w:r>
+      <w:r>
+        <w:rPr>
+          <w:rFonts w:ascii="Consolas" w:eastAsia="Consolas" w:hAnsi="Consolas" w:cs="Consolas"/>
+        </w:rPr>
+        <w:t xml:space="preserve">setState</w:t>
+      </w:r>
+      <w:r>
+        <w:t xml:space="preserve"> (cách React khuyên cho "state đi theo một prop"), nên đánh dấu hàng mới còn tới lần danh sách đổi sau, hiệu ứng chạy hết.</w:t>
+      </w:r>
+    </w:p>
+    <w:p>
+      <w:pPr>
+        <w:pStyle w:val="ListParagraph"/>
+        <w:numPr>
+          <w:ilvl w:val="0"/>
+          <w:numId w:val="1"/>
+        </w:numPr>
+      </w:pPr>
+      <w:r>
+        <w:rPr>
+          <w:b/>
+          <w:bCs/>
+        </w:rPr>
+        <w:t xml:space="preserve">Hiệu ứng bằng CSS:</w:t>
+      </w:r>
+      <w:r>
+        <w:t xml:space="preserve"> </w:t>
+      </w:r>
+      <w:r>
+        <w:rPr>
+          <w:rFonts w:ascii="Consolas" w:eastAsia="Consolas" w:hAnsi="Consolas" w:cs="Consolas"/>
+        </w:rPr>
+        <w:t xml:space="preserve">@keyframes row-in</w:t>
+      </w:r>
+      <w:r>
+        <w:t xml:space="preserve"> (lệch 6 px, mờ) khai trong </w:t>
+      </w:r>
+      <w:r>
+        <w:rPr>
+          <w:rFonts w:ascii="Consolas" w:eastAsia="Consolas" w:hAnsi="Consolas" w:cs="Consolas"/>
+        </w:rPr>
+        <w:t xml:space="preserve">@theme</w:t>
+      </w:r>
+      <w:r>
+        <w:t xml:space="preserve"> của Tailwind 4 thành </w:t>
+      </w:r>
+      <w:r>
+        <w:rPr>
+          <w:rFonts w:ascii="Consolas" w:eastAsia="Consolas" w:hAnsi="Consolas" w:cs="Consolas"/>
+        </w:rPr>
+        <w:t xml:space="preserve">animate-row-in</w:t>
+      </w:r>
+      <w:r>
+        <w:t xml:space="preserve">; </w:t>
+      </w:r>
+      <w:r>
+        <w:rPr>
+          <w:rFonts w:ascii="Consolas" w:eastAsia="Consolas" w:hAnsi="Consolas" w:cs="Consolas"/>
+        </w:rPr>
+        <w:t xml:space="preserve">motion-reduce:</w:t>
+      </w:r>
+      <w:r>
+        <w:t xml:space="preserve"> đổi sang chỉ mờ cho người bật giảm chuyển động.</w:t>
+      </w:r>
+    </w:p>
+    <w:p>
+      <w:pPr>
+        <w:pStyle w:val="ListParagraph"/>
+        <w:numPr>
+          <w:ilvl w:val="0"/>
+          <w:numId w:val="1"/>
+        </w:numPr>
+      </w:pPr>
+      <w:r>
+        <w:rPr>
+          <w:b/>
+          <w:bCs/>
+        </w:rPr>
+        <w:t xml:space="preserve">Một query nhẹ cho số trên điều hướng:</w:t>
+      </w:r>
+      <w:r>
+        <w:t xml:space="preserve"> shell có mặt ở mọi trang, nên nó dùng query riêng </w:t>
+      </w:r>
+      <w:r>
+        <w:rPr>
+          <w:rFonts w:ascii="Consolas" w:eastAsia="Consolas" w:hAnsi="Consolas" w:cs="Consolas"/>
+        </w:rPr>
+        <w:t xml:space="preserve">['inbox-unread']</w:t>
+      </w:r>
+      <w:r>
+        <w:t xml:space="preserve"> (một request </w:t>
+      </w:r>
+      <w:r>
+        <w:rPr>
+          <w:rFonts w:ascii="Consolas" w:eastAsia="Consolas" w:hAnsi="Consolas" w:cs="Consolas"/>
+        </w:rPr>
+        <w:t xml:space="preserve">/counts</w:t>
+      </w:r>
+      <w:r>
+        <w:t xml:space="preserve">) thay vì giữ cả khung Hộp thư (3 request mỗi lần bị đánh dấu cũ).</w:t>
+      </w:r>
+    </w:p>
+    <w:p>
+      <w:pPr>
         <w:pStyle w:val="Heading2"/>
       </w:pPr>
       <w:r>
@@ -23813,6 +24007,30 @@
       </w:pPr>
       <w:r>
         <w:t xml:space="preserve">Một sự kiện tới lúc trang đang tải lần đầu thì vì sao không có request mới? Khi nào điều đó thành vấn đề?</w:t>
+      </w:r>
+    </w:p>
+    <w:p>
+      <w:pPr>
+        <w:pStyle w:val="ListParagraph"/>
+        <w:numPr>
+          <w:ilvl w:val="0"/>
+          <w:numId w:val="100"/>
+        </w:numPr>
+      </w:pPr>
+      <w:r>
+        <w:t xml:space="preserve">Vì sao một trang tải thêm ở cuối danh sách không bị coi là thư mới? Lần tải đầu thì sao?</w:t>
+      </w:r>
+    </w:p>
+    <w:p>
+      <w:pPr>
+        <w:pStyle w:val="ListParagraph"/>
+        <w:numPr>
+          <w:ilvl w:val="0"/>
+          <w:numId w:val="100"/>
+        </w:numPr>
+      </w:pPr>
+      <w:r>
+        <w:t xml:space="preserve">Vì sao số "Hộp thư" của thanh điều hướng có query riêng thay vì đọc từ khung Hộp thư?</w:t>
       </w:r>
     </w:p>
     <w:p/>

</xml_diff>

<commit_message>
feat(fe-55): "Đồng bộ ngay" on the sync API, sync status, realtime-down notice
An imported account now syncs what changed with POST /api/accounts/{id}/sync
instead of importing its range again, and its detail tells when it last
synced, whether new mail comes at once (Gmail push) or within a minute, and
its last sync error; IMPORT_NOT_DONE and ACCOUNT_DISABLED have their own
words. The inbox says new mail may come late once the event stream has not
been open for 30 s, and offers to reload when the browser gave up on it.

Co-Authored-By: Claude Opus 5.5 (1M context) <noreply@anthropic.com>
</commit_message>
<xml_diff>
--- a/docs/knowledge/phase-1-frontend-foundation.docx
+++ b/docs/knowledge/phase-1-frontend-foundation.docx
@@ -21744,6 +21744,134 @@
     </w:p>
     <w:p>
       <w:pPr>
+        <w:pStyle w:val="Heading3"/>
+      </w:pPr>
+      <w:r>
+        <w:t xml:space="preserve">14.3 "Đồng bộ ngay" và khi realtime mất kết nối (FE-55)</w:t>
+      </w:r>
+    </w:p>
+    <w:p>
+      <w:pPr>
+        <w:pStyle w:val="ListParagraph"/>
+        <w:numPr>
+          <w:ilvl w:val="0"/>
+          <w:numId w:val="1"/>
+        </w:numPr>
+      </w:pPr>
+      <w:r>
+        <w:rPr>
+          <w:b/>
+          <w:bCs/>
+        </w:rPr>
+        <w:t xml:space="preserve">Khóa query có thứ bậc:</w:t>
+      </w:r>
+      <w:r>
+        <w:t xml:space="preserve"> trạng thái đồng bộ dùng khóa </w:t>
+      </w:r>
+      <w:r>
+        <w:rPr>
+          <w:rFonts w:ascii="Consolas" w:eastAsia="Consolas" w:hAnsi="Consolas" w:cs="Consolas"/>
+        </w:rPr>
+        <w:t xml:space="preserve">['accounts', id, 'sync']</w:t>
+      </w:r>
+      <w:r>
+        <w:t xml:space="preserve">; </w:t>
+      </w:r>
+      <w:r>
+        <w:rPr>
+          <w:rFonts w:ascii="Consolas" w:eastAsia="Consolas" w:hAnsi="Consolas" w:cs="Consolas"/>
+        </w:rPr>
+        <w:t xml:space="preserve">invalidateQueries({ queryKey: ['accounts'] })</w:t>
+      </w:r>
+      <w:r>
+        <w:t xml:space="preserve"> khớp mọi khóa bắt đầu bằng </w:t>
+      </w:r>
+      <w:r>
+        <w:rPr>
+          <w:rFonts w:ascii="Consolas" w:eastAsia="Consolas" w:hAnsi="Consolas" w:cs="Consolas"/>
+        </w:rPr>
+        <w:t xml:space="preserve">'accounts'</w:t>
+      </w:r>
+      <w:r>
+        <w:t xml:space="preserve">, nên sự kiện </w:t>
+      </w:r>
+      <w:r>
+        <w:rPr>
+          <w:rFonts w:ascii="Consolas" w:eastAsia="Consolas" w:hAnsi="Consolas" w:cs="Consolas"/>
+        </w:rPr>
+        <w:t xml:space="preserve">account.changed</w:t>
+      </w:r>
+      <w:r>
+        <w:t xml:space="preserve"> đọc lại cả danh sách lẫn trạng thái này mà không phải liệt kê.</w:t>
+      </w:r>
+    </w:p>
+    <w:p>
+      <w:pPr>
+        <w:pStyle w:val="ListParagraph"/>
+        <w:numPr>
+          <w:ilvl w:val="0"/>
+          <w:numId w:val="1"/>
+        </w:numPr>
+      </w:pPr>
+      <w:r>
+        <w:rPr>
+          <w:b/>
+          <w:bCs/>
+        </w:rPr>
+        <w:t xml:space="preserve">Đợi trước khi báo:</w:t>
+      </w:r>
+      <w:r>
+        <w:t xml:space="preserve"> server đóng mỗi luồng sau 20 phút và trình duyệt nối lại trong vài giây; báo ngay thì dòng báo nhấp nháy vô nghĩa. </w:t>
+      </w:r>
+      <w:r>
+        <w:rPr>
+          <w:rFonts w:ascii="Consolas" w:eastAsia="Consolas" w:hAnsi="Consolas" w:cs="Consolas"/>
+        </w:rPr>
+        <w:t xml:space="preserve">useRealtimeDown</w:t>
+      </w:r>
+      <w:r>
+        <w:t xml:space="preserve"> chỉ báo khi luồng không mở quá 30 s, và mỗi lần trạng thái đổi thì đếm lại từ đầu.</w:t>
+      </w:r>
+    </w:p>
+    <w:p>
+      <w:pPr>
+        <w:pStyle w:val="ListParagraph"/>
+        <w:numPr>
+          <w:ilvl w:val="0"/>
+          <w:numId w:val="1"/>
+        </w:numPr>
+      </w:pPr>
+      <w:r>
+        <w:rPr>
+          <w:b/>
+          <w:bCs/>
+        </w:rPr>
+        <w:t xml:space="preserve">Hai kiểu mất:</w:t>
+      </w:r>
+      <w:r>
+        <w:t xml:space="preserve"> </w:t>
+      </w:r>
+      <w:r>
+        <w:rPr>
+          <w:rFonts w:ascii="Consolas" w:eastAsia="Consolas" w:hAnsi="Consolas" w:cs="Consolas"/>
+        </w:rPr>
+        <w:t xml:space="preserve">connecting</w:t>
+      </w:r>
+      <w:r>
+        <w:t xml:space="preserve"> (trình duyệt còn thử, "đang kết nối lại…") khác </w:t>
+      </w:r>
+      <w:r>
+        <w:rPr>
+          <w:rFonts w:ascii="Consolas" w:eastAsia="Consolas" w:hAnsi="Consolas" w:cs="Consolas"/>
+        </w:rPr>
+        <w:t xml:space="preserve">closed</w:t>
+      </w:r>
+      <w:r>
+        <w:t xml:space="preserve"> (trình duyệt đã bỏ: phiên hết hạn hay server không có luồng; chỉ tải lại trang mới thử lại).</w:t>
+      </w:r>
+    </w:p>
+    <w:p>
+      <w:pPr>
         <w:pStyle w:val="Heading2"/>
       </w:pPr>
       <w:r>
@@ -24031,6 +24159,36 @@
       </w:pPr>
       <w:r>
         <w:t xml:space="preserve">Vì sao số "Hộp thư" của thanh điều hướng có query riêng thay vì đọc từ khung Hộp thư?</w:t>
+      </w:r>
+    </w:p>
+    <w:p>
+      <w:pPr>
+        <w:pStyle w:val="ListParagraph"/>
+        <w:numPr>
+          <w:ilvl w:val="0"/>
+          <w:numId w:val="100"/>
+        </w:numPr>
+      </w:pPr>
+      <w:r>
+        <w:t xml:space="preserve">Vì sao dòng "Thư mới có thể về chậm" đợi 30 giây mới hiện? </w:t>
+      </w:r>
+      <w:r>
+        <w:rPr>
+          <w:rFonts w:ascii="Consolas" w:eastAsia="Consolas" w:hAnsi="Consolas" w:cs="Consolas"/>
+        </w:rPr>
+        <w:t xml:space="preserve">connecting</w:t>
+      </w:r>
+      <w:r>
+        <w:t xml:space="preserve"> và </w:t>
+      </w:r>
+      <w:r>
+        <w:rPr>
+          <w:rFonts w:ascii="Consolas" w:eastAsia="Consolas" w:hAnsi="Consolas" w:cs="Consolas"/>
+        </w:rPr>
+        <w:t xml:space="preserve">closed</w:t>
+      </w:r>
+      <w:r>
+        <w:t xml:space="preserve"> khác nhau thế nào với người dùng?</w:t>
       </w:r>
     </w:p>
     <w:p/>

</xml_diff>

<commit_message>
feat(fe-55b): read along with the backend's minute sync
Since BE-49 the backend stores new mail about every minute, but the web
only read the inbox again on an event: without the event stream (no BE-50
yet, a broken stream) new mail never showed. While the stream is not open
the inbox is now read again every 60 s, and the sync status of an account
detail every 60 s while shown, since the backend sends no event for each
successful sync (D-96).

Co-Authored-By: Claude Opus 5.5 (1M context) <noreply@anthropic.com>
</commit_message>
<xml_diff>
--- a/docs/knowledge/phase-1-frontend-foundation.docx
+++ b/docs/knowledge/phase-1-frontend-foundation.docx
@@ -21872,6 +21872,71 @@
     </w:p>
     <w:p>
       <w:pPr>
+        <w:pStyle w:val="ListParagraph"/>
+        <w:numPr>
+          <w:ilvl w:val="0"/>
+          <w:numId w:val="1"/>
+        </w:numPr>
+      </w:pPr>
+      <w:r>
+        <w:rPr>
+          <w:b/>
+          <w:bCs/>
+        </w:rPr>
+        <w:t xml:space="preserve">Dự phòng khi không có luồng (FE-55b, D-96):</w:t>
+      </w:r>
+      <w:r>
+        <w:t xml:space="preserve"> backend vẫn lưu thư mới mỗi phút dù web không nghe được sự kiện, nên khi luồng không mở web đọc lại Hộp thư mỗi 60 s (</w:t>
+      </w:r>
+      <w:r>
+        <w:rPr>
+          <w:rFonts w:ascii="Consolas" w:eastAsia="Consolas" w:hAnsi="Consolas" w:cs="Consolas"/>
+        </w:rPr>
+        <w:t xml:space="preserve">setInterval</w:t>
+      </w:r>
+      <w:r>
+        <w:t xml:space="preserve"> trong effect phụ thuộc trạng thái luồng; luồng mở thì effect dọn timer). Trạng thái đồng bộ của trang chi tiết dùng </w:t>
+      </w:r>
+      <w:r>
+        <w:rPr>
+          <w:rFonts w:ascii="Consolas" w:eastAsia="Consolas" w:hAnsi="Consolas" w:cs="Consolas"/>
+        </w:rPr>
+        <w:t xml:space="preserve">refetchInterval: 60_000</w:t>
+      </w:r>
+      <w:r>
+        <w:t xml:space="preserve"> vì server không báo mỗi lần đồng bộ thành công.</w:t>
+      </w:r>
+    </w:p>
+    <w:p>
+      <w:pPr>
+        <w:pStyle w:val="ListParagraph"/>
+        <w:numPr>
+          <w:ilvl w:val="0"/>
+          <w:numId w:val="1"/>
+        </w:numPr>
+      </w:pPr>
+      <w:r>
+        <w:rPr>
+          <w:b/>
+          <w:bCs/>
+        </w:rPr>
+        <w:t xml:space="preserve">Test chập chờn, kiểm trước khi đổ lỗi:</w:t>
+      </w:r>
+      <w:r>
+        <w:t xml:space="preserve"> khi một test lúc đỏ lúc xanh sau một thay đổi, chạy lại cả bộ trên code đã commit (</w:t>
+      </w:r>
+      <w:r>
+        <w:rPr>
+          <w:rFonts w:ascii="Consolas" w:eastAsia="Consolas" w:hAnsi="Consolas" w:cs="Consolas"/>
+        </w:rPr>
+        <w:t xml:space="preserve">git stash -u</w:t>
+      </w:r>
+      <w:r>
+        <w:t xml:space="preserve"> để cất cả file mới) để biết lỗi có từ trước hay không, rồi mới sửa.</w:t>
+      </w:r>
+    </w:p>
+    <w:p>
+      <w:pPr>
         <w:pStyle w:val="Heading2"/>
       </w:pPr>
       <w:r>

</xml_diff>

<commit_message>
feat(fe-57): read the whole conversation from the messages API
Opening a conversation now loads its emails from F06's
GET /api/conversations/{id}/messages next to the detail: older ones
folded, the newest open with its recipients and files, and
"Xem thư cũ hơn" for the next page. Web addresses in the text become
links that open in a new tab. The messages sit under the
conversation's query key, so a change the stream reports brings new
mail into the open thread. A backend without the API (404) keeps the
newest preview as before; any other failure says so and can retry.

Sending writes the pending message into the messages cache.

Co-Authored-By: Claude Opus 5.5 (1M context) <noreply@anthropic.com>
</commit_message>
<xml_diff>
--- a/docs/knowledge/phase-1-frontend-foundation.docx
+++ b/docs/knowledge/phase-1-frontend-foundation.docx
@@ -21940,6 +21940,551 @@
         <w:pStyle w:val="Heading2"/>
       </w:pPr>
       <w:r>
+        <w:t xml:space="preserve">15. Đọc cả cuộc trò chuyện (F06, </w:t>
+      </w:r>
+      <w:r>
+        <w:rPr>
+          <w:rFonts w:ascii="Consolas" w:eastAsia="Consolas" w:hAnsi="Consolas" w:cs="Consolas"/>
+        </w:rPr>
+        <w:t xml:space="preserve">f06-message-history</w:t>
+      </w:r>
+      <w:r>
+        <w:t xml:space="preserve">)</w:t>
+      </w:r>
+    </w:p>
+    <w:p>
+      <w:pPr>
+        <w:pStyle w:val="Heading3"/>
+      </w:pPr>
+      <w:r>
+        <w:t xml:space="preserve">15.0 Bức tranh</w:t>
+      </w:r>
+    </w:p>
+    <w:p>
+      <w:r>
+        <w:t xml:space="preserve">Trước F06, mở một cuộc trò chuyện chỉ thấy đoạn đầu thư mới nhất (D-71). F06 thêm </w:t>
+      </w:r>
+      <w:r>
+        <w:rPr>
+          <w:rFonts w:ascii="Consolas" w:eastAsia="Consolas" w:hAnsi="Consolas" w:cs="Consolas"/>
+        </w:rPr>
+        <w:t xml:space="preserve">GET /api/conversations/{id}/messages</w:t>
+      </w:r>
+      <w:r>
+        <w:t xml:space="preserve">: mỗi trang 20 thư, mới nhất trước, có con trỏ. Web làm trước theo hợp đồng trong design (MSW), backend làm song song (BE-54…).</w:t>
+      </w:r>
+    </w:p>
+    <w:p>
+      <w:pPr>
+        <w:shd w:val="clear" w:color="auto" w:fill="F2F3F5"/>
+        <w:ind w:left="0"/>
+      </w:pPr>
+      <w:r>
+        <w:rPr>
+          <w:rFonts w:ascii="Consolas" w:eastAsia="Consolas" w:hAnsi="Consolas" w:cs="Consolas"/>
+          <w:sz w:val="19"/>
+          <w:szCs w:val="19"/>
+        </w:rPr>
+        <w:t xml:space="preserve">mở /inbox/c-1</w:t>
+        <w:br/>
+        <w:t xml:space="preserve">   |-- GET /api/conversations/c-1            -&gt; dòng + người  (query ['inbox','conversation','c-1'])</w:t>
+        <w:br/>
+        <w:t xml:space="preserve">   '-- GET /api/conversations/c-1/messages   -&gt; trang 1       (query [..., 'messages'], cùng lúc)</w:t>
+        <w:br/>
+        <w:t xml:space="preserve">            |</w:t>
+        <w:br/>
+        <w:t xml:space="preserve">            v  các trang ghép lại, đảo thành cũ trước</w:t>
+        <w:br/>
+        <w:t xml:space="preserve">       detail.messages -&gt; EmailThread: thư cũ gập, thư mới nhất mở</w:t>
+        <w:br/>
+        <w:t xml:space="preserve">            |</w:t>
+        <w:br/>
+        <w:t xml:space="preserve">   "Xem thư cũ hơn" -&gt; GET ...?cursor=&lt;nextCursor&gt; -&gt; trang 2 lên trên</w:t>
+      </w:r>
+    </w:p>
+    <w:p>
+      <w:pPr>
+        <w:pStyle w:val="Heading3"/>
+      </w:pPr>
+      <w:r>
+        <w:t xml:space="preserve">15.1 Danh sách thư bằng </w:t>
+      </w:r>
+      <w:r>
+        <w:rPr>
+          <w:rFonts w:ascii="Consolas" w:eastAsia="Consolas" w:hAnsi="Consolas" w:cs="Consolas"/>
+        </w:rPr>
+        <w:t xml:space="preserve">useInfiniteQuery</w:t>
+      </w:r>
+      <w:r>
+        <w:t xml:space="preserve"> (FE-57, D-126)</w:t>
+      </w:r>
+    </w:p>
+    <w:p>
+      <w:pPr>
+        <w:pStyle w:val="ListParagraph"/>
+        <w:numPr>
+          <w:ilvl w:val="0"/>
+          <w:numId w:val="1"/>
+        </w:numPr>
+      </w:pPr>
+      <w:r>
+        <w:rPr>
+          <w:b/>
+          <w:bCs/>
+        </w:rPr>
+        <w:t xml:space="preserve">Hai request song song:</w:t>
+      </w:r>
+      <w:r>
+        <w:t xml:space="preserve"> chi tiết và trang thư đầu đi cùng lúc, không chờ nhau. </w:t>
+      </w:r>
+      <w:r>
+        <w:rPr>
+          <w:rFonts w:ascii="Consolas" w:eastAsia="Consolas" w:hAnsi="Consolas" w:cs="Consolas"/>
+        </w:rPr>
+        <w:t xml:space="preserve">useConversation</w:t>
+      </w:r>
+      <w:r>
+        <w:t xml:space="preserve"> ghép các trang (mới trước) rồi đảo lại thành cũ trước vào </w:t>
+      </w:r>
+      <w:r>
+        <w:rPr>
+          <w:rFonts w:ascii="Consolas" w:eastAsia="Consolas" w:hAnsi="Consolas" w:cs="Consolas"/>
+        </w:rPr>
+        <w:t xml:space="preserve">detail.messages</w:t>
+      </w:r>
+      <w:r>
+        <w:t xml:space="preserve">, nên </w:t>
+      </w:r>
+      <w:r>
+        <w:rPr>
+          <w:rFonts w:ascii="Consolas" w:eastAsia="Consolas" w:hAnsi="Consolas" w:cs="Consolas"/>
+        </w:rPr>
+        <w:t xml:space="preserve">EmailThread</w:t>
+      </w:r>
+      <w:r>
+        <w:t xml:space="preserve"> vẫn đọc đúng chỗ cũ mà dữ liệu mẫu đã dùng.</w:t>
+      </w:r>
+    </w:p>
+    <w:p>
+      <w:pPr>
+        <w:pStyle w:val="ListParagraph"/>
+        <w:numPr>
+          <w:ilvl w:val="0"/>
+          <w:numId w:val="1"/>
+        </w:numPr>
+      </w:pPr>
+      <w:r>
+        <w:rPr>
+          <w:b/>
+          <w:bCs/>
+        </w:rPr>
+        <w:t xml:space="preserve">Khóa có thứ bậc, realtime miễn phí:</w:t>
+      </w:r>
+      <w:r>
+        <w:t xml:space="preserve"> khóa danh sách thư là </w:t>
+      </w:r>
+      <w:r>
+        <w:rPr>
+          <w:rFonts w:ascii="Consolas" w:eastAsia="Consolas" w:hAnsi="Consolas" w:cs="Consolas"/>
+        </w:rPr>
+        <w:t xml:space="preserve">['inbox', 'conversation', id, 'messages']</w:t>
+      </w:r>
+      <w:r>
+        <w:t xml:space="preserve">. Sự kiện </w:t>
+      </w:r>
+      <w:r>
+        <w:rPr>
+          <w:rFonts w:ascii="Consolas" w:eastAsia="Consolas" w:hAnsi="Consolas" w:cs="Consolas"/>
+        </w:rPr>
+        <w:t xml:space="preserve">conversations.changed</w:t>
+      </w:r>
+      <w:r>
+        <w:t xml:space="preserve"> vốn đọc lại mọi thứ dưới </w:t>
+      </w:r>
+      <w:r>
+        <w:rPr>
+          <w:rFonts w:ascii="Consolas" w:eastAsia="Consolas" w:hAnsi="Consolas" w:cs="Consolas"/>
+        </w:rPr>
+        <w:t xml:space="preserve">['inbox']</w:t>
+      </w:r>
+      <w:r>
+        <w:t xml:space="preserve"> (D-90), nên thư mới đến trong lúc đang đọc tự hiện ở cuối mà không thêm dòng code nào.</w:t>
+      </w:r>
+    </w:p>
+    <w:p>
+      <w:pPr>
+        <w:pStyle w:val="ListParagraph"/>
+        <w:numPr>
+          <w:ilvl w:val="0"/>
+          <w:numId w:val="1"/>
+        </w:numPr>
+      </w:pPr>
+      <w:r>
+        <w:rPr>
+          <w:b/>
+          <w:bCs/>
+        </w:rPr>
+        <w:t xml:space="preserve">Đọc lại nhiều trang không hụt thư:</w:t>
+      </w:r>
+      <w:r>
+        <w:t xml:space="preserve"> khi đọc lại, TanStack Query v5 tải lại trang 1 rồi </w:t>
+      </w:r>
+      <w:r>
+        <w:rPr>
+          <w:b/>
+          <w:bCs/>
+        </w:rPr>
+        <w:t xml:space="preserve">tính lại</w:t>
+      </w:r>
+      <w:r>
+        <w:t xml:space="preserve"> con trỏ trang 2 từ trang 1 vừa tải (gọi lại </w:t>
+      </w:r>
+      <w:r>
+        <w:rPr>
+          <w:rFonts w:ascii="Consolas" w:eastAsia="Consolas" w:hAnsi="Consolas" w:cs="Consolas"/>
+        </w:rPr>
+        <w:t xml:space="preserve">getNextPageParam</w:t>
+      </w:r>
+      <w:r>
+        <w:t xml:space="preserve">), không dùng con trỏ cũ. Có một thư mới đẩy thư cuối trang 1 sang trang 2 thì thư đó vẫn có mặt. Một thư có thể xuất hiện hai lần ở chỗ nối trang, nên vẫn bỏ trùng theo </w:t>
+      </w:r>
+      <w:r>
+        <w:rPr>
+          <w:rFonts w:ascii="Consolas" w:eastAsia="Consolas" w:hAnsi="Consolas" w:cs="Consolas"/>
+        </w:rPr>
+        <w:t xml:space="preserve">id</w:t>
+      </w:r>
+      <w:r>
+        <w:t xml:space="preserve">.</w:t>
+      </w:r>
+    </w:p>
+    <w:p>
+      <w:pPr>
+        <w:pStyle w:val="ListParagraph"/>
+        <w:numPr>
+          <w:ilvl w:val="0"/>
+          <w:numId w:val="1"/>
+        </w:numPr>
+      </w:pPr>
+      <w:r>
+        <w:rPr>
+          <w:b/>
+          <w:bCs/>
+        </w:rPr>
+        <w:t xml:space="preserve">Backend cũ, lỗi thật:</w:t>
+      </w:r>
+      <w:r>
+        <w:t xml:space="preserve"> API thư trả </w:t>
+      </w:r>
+      <w:r>
+        <w:rPr>
+          <w:rFonts w:ascii="Consolas" w:eastAsia="Consolas" w:hAnsi="Consolas" w:cs="Consolas"/>
+        </w:rPr>
+        <w:t xml:space="preserve">404</w:t>
+      </w:r>
+      <w:r>
+        <w:t xml:space="preserve"> (backend chưa có F06) thì giữ khung "Thư mới nhất" như trước, không báo lỗi; lỗi khác thì hiện dòng "Không tải được các thư…" có "Thử lại", và vẫn để đoạn đầu thư mới nhất bên dưới.</w:t>
+      </w:r>
+    </w:p>
+    <w:p>
+      <w:pPr>
+        <w:pStyle w:val="ListParagraph"/>
+        <w:numPr>
+          <w:ilvl w:val="0"/>
+          <w:numId w:val="1"/>
+        </w:numPr>
+      </w:pPr>
+      <w:r>
+        <w:rPr>
+          <w:b/>
+          <w:bCs/>
+        </w:rPr>
+        <w:t xml:space="preserve">Thư đang gửi nằm ở đâu:</w:t>
+      </w:r>
+      <w:r>
+        <w:t xml:space="preserve"> </w:t>
+      </w:r>
+      <w:r>
+        <w:rPr>
+          <w:rFonts w:ascii="Consolas" w:eastAsia="Consolas" w:hAnsi="Consolas" w:cs="Consolas"/>
+        </w:rPr>
+        <w:t xml:space="preserve">useSendMessage</w:t>
+      </w:r>
+      <w:r>
+        <w:t xml:space="preserve"> giờ chèn thư "Đang gửi" vào trang đầu của cache danh sách thư (mới trước), và hủy lần đọc đang chạy trước khi chèn (</w:t>
+      </w:r>
+      <w:r>
+        <w:rPr>
+          <w:rFonts w:ascii="Consolas" w:eastAsia="Consolas" w:hAnsi="Consolas" w:cs="Consolas"/>
+        </w:rPr>
+        <w:t xml:space="preserve">cancelQueries</w:t>
+      </w:r>
+      <w:r>
+        <w:t xml:space="preserve">): một lần đọc về sau sẽ ghi đè danh sách và làm mất thư vừa chèn.</w:t>
+      </w:r>
+    </w:p>
+    <w:p>
+      <w:pPr>
+        <w:pStyle w:val="Heading3"/>
+      </w:pPr>
+      <w:r>
+        <w:t xml:space="preserve">15.2 Liên kết trong chữ của thư (FE-57)</w:t>
+      </w:r>
+    </w:p>
+    <w:p>
+      <w:pPr>
+        <w:pStyle w:val="ListParagraph"/>
+        <w:numPr>
+          <w:ilvl w:val="0"/>
+          <w:numId w:val="1"/>
+        </w:numPr>
+      </w:pPr>
+      <w:r>
+        <w:rPr>
+          <w:b/>
+          <w:bCs/>
+        </w:rPr>
+        <w:t xml:space="preserve">Không dùng </w:t>
+      </w:r>
+      <w:r>
+        <w:rPr>
+          <w:rFonts w:ascii="Consolas" w:eastAsia="Consolas" w:hAnsi="Consolas" w:cs="Consolas"/>
+          <w:b/>
+          <w:bCs/>
+        </w:rPr>
+        <w:t xml:space="preserve">innerHTML</w:t>
+      </w:r>
+      <w:r>
+        <w:rPr>
+          <w:b/>
+          <w:bCs/>
+        </w:rPr>
+        <w:t xml:space="preserve">:</w:t>
+      </w:r>
+      <w:r>
+        <w:t xml:space="preserve"> </w:t>
+      </w:r>
+      <w:r>
+        <w:rPr>
+          <w:rFonts w:ascii="Consolas" w:eastAsia="Consolas" w:hAnsi="Consolas" w:cs="Consolas"/>
+        </w:rPr>
+        <w:t xml:space="preserve">linkParts</w:t>
+      </w:r>
+      <w:r>
+        <w:t xml:space="preserve"> cắt một dòng thành chữ và địa chỉ web; React vẽ địa chỉ thành </w:t>
+      </w:r>
+      <w:r>
+        <w:rPr>
+          <w:rFonts w:ascii="Consolas" w:eastAsia="Consolas" w:hAnsi="Consolas" w:cs="Consolas"/>
+        </w:rPr>
+        <w:t xml:space="preserve">&lt;a&gt;</w:t>
+      </w:r>
+      <w:r>
+        <w:t xml:space="preserve">, chữ thành text node. Chỉ </w:t>
+      </w:r>
+      <w:r>
+        <w:rPr>
+          <w:rFonts w:ascii="Consolas" w:eastAsia="Consolas" w:hAnsi="Consolas" w:cs="Consolas"/>
+        </w:rPr>
+        <w:t xml:space="preserve">http://</w:t>
+      </w:r>
+      <w:r>
+        <w:t xml:space="preserve"> và </w:t>
+      </w:r>
+      <w:r>
+        <w:rPr>
+          <w:rFonts w:ascii="Consolas" w:eastAsia="Consolas" w:hAnsi="Consolas" w:cs="Consolas"/>
+        </w:rPr>
+        <w:t xml:space="preserve">https://</w:t>
+      </w:r>
+      <w:r>
+        <w:t xml:space="preserve"> thành liên kết, nên chữ </w:t>
+      </w:r>
+      <w:r>
+        <w:rPr>
+          <w:rFonts w:ascii="Consolas" w:eastAsia="Consolas" w:hAnsi="Consolas" w:cs="Consolas"/>
+        </w:rPr>
+        <w:t xml:space="preserve">javascript:...</w:t>
+      </w:r>
+      <w:r>
+        <w:t xml:space="preserve"> trong thư không bao giờ bấm được.</w:t>
+      </w:r>
+    </w:p>
+    <w:p>
+      <w:pPr>
+        <w:pStyle w:val="ListParagraph"/>
+        <w:numPr>
+          <w:ilvl w:val="0"/>
+          <w:numId w:val="1"/>
+        </w:numPr>
+      </w:pPr>
+      <w:r>
+        <w:rPr>
+          <w:b/>
+          <w:bCs/>
+        </w:rPr>
+        <w:t xml:space="preserve">Dấu câu cuối câu:</w:t>
+      </w:r>
+      <w:r>
+        <w:t xml:space="preserve"> </w:t>
+      </w:r>
+      <w:r>
+        <w:rPr>
+          <w:rFonts w:ascii="Consolas" w:eastAsia="Consolas" w:hAnsi="Consolas" w:cs="Consolas"/>
+        </w:rPr>
+        <w:t xml:space="preserve">.</w:t>
+      </w:r>
+      <w:r>
+        <w:t xml:space="preserve">, </w:t>
+      </w:r>
+      <w:r>
+        <w:rPr>
+          <w:rFonts w:ascii="Consolas" w:eastAsia="Consolas" w:hAnsi="Consolas" w:cs="Consolas"/>
+        </w:rPr>
+        <w:t xml:space="preserve">,</w:t>
+      </w:r>
+      <w:r>
+        <w:t xml:space="preserve">, </w:t>
+      </w:r>
+      <w:r>
+        <w:rPr>
+          <w:rFonts w:ascii="Consolas" w:eastAsia="Consolas" w:hAnsi="Consolas" w:cs="Consolas"/>
+        </w:rPr>
+        <w:t xml:space="preserve">;</w:t>
+      </w:r>
+      <w:r>
+        <w:t xml:space="preserve">, </w:t>
+      </w:r>
+      <w:r>
+        <w:rPr>
+          <w:rFonts w:ascii="Consolas" w:eastAsia="Consolas" w:hAnsi="Consolas" w:cs="Consolas"/>
+        </w:rPr>
+        <w:t xml:space="preserve">:</w:t>
+      </w:r>
+      <w:r>
+        <w:t xml:space="preserve">, </w:t>
+      </w:r>
+      <w:r>
+        <w:rPr>
+          <w:rFonts w:ascii="Consolas" w:eastAsia="Consolas" w:hAnsi="Consolas" w:cs="Consolas"/>
+        </w:rPr>
+        <w:t xml:space="preserve">!</w:t>
+      </w:r>
+      <w:r>
+        <w:t xml:space="preserve">, </w:t>
+      </w:r>
+      <w:r>
+        <w:rPr>
+          <w:rFonts w:ascii="Consolas" w:eastAsia="Consolas" w:hAnsi="Consolas" w:cs="Consolas"/>
+        </w:rPr>
+        <w:t xml:space="preserve">?</w:t>
+      </w:r>
+      <w:r>
+        <w:t xml:space="preserve">, </w:t>
+      </w:r>
+      <w:r>
+        <w:rPr>
+          <w:rFonts w:ascii="Consolas" w:eastAsia="Consolas" w:hAnsi="Consolas" w:cs="Consolas"/>
+        </w:rPr>
+        <w:t xml:space="preserve">)</w:t>
+      </w:r>
+      <w:r>
+        <w:t xml:space="preserve"> đứng cuối địa chỉ thuộc về câu, không thuộc liên kết.</w:t>
+      </w:r>
+    </w:p>
+    <w:p>
+      <w:pPr>
+        <w:pStyle w:val="ListParagraph"/>
+        <w:numPr>
+          <w:ilvl w:val="0"/>
+          <w:numId w:val="1"/>
+        </w:numPr>
+      </w:pPr>
+      <w:r>
+        <w:rPr>
+          <w:rFonts w:ascii="Consolas" w:eastAsia="Consolas" w:hAnsi="Consolas" w:cs="Consolas"/>
+          <w:b/>
+          <w:bCs/>
+        </w:rPr>
+        <w:t xml:space="preserve">target="_blank"</w:t>
+      </w:r>
+      <w:r>
+        <w:rPr>
+          <w:b/>
+          <w:bCs/>
+        </w:rPr>
+        <w:t xml:space="preserve"> đi cùng </w:t>
+      </w:r>
+      <w:r>
+        <w:rPr>
+          <w:rFonts w:ascii="Consolas" w:eastAsia="Consolas" w:hAnsi="Consolas" w:cs="Consolas"/>
+          <w:b/>
+          <w:bCs/>
+        </w:rPr>
+        <w:t xml:space="preserve">rel="noopener noreferrer"</w:t>
+      </w:r>
+      <w:r>
+        <w:rPr>
+          <w:b/>
+          <w:bCs/>
+        </w:rPr>
+        <w:t xml:space="preserve">:</w:t>
+      </w:r>
+      <w:r>
+        <w:t xml:space="preserve"> trang được mở không điều khiển được tab Sino (</w:t>
+      </w:r>
+      <w:r>
+        <w:rPr>
+          <w:rFonts w:ascii="Consolas" w:eastAsia="Consolas" w:hAnsi="Consolas" w:cs="Consolas"/>
+        </w:rPr>
+        <w:t xml:space="preserve">window.opener</w:t>
+      </w:r>
+      <w:r>
+        <w:t xml:space="preserve">) và không biết người đọc đến từ đâu.</w:t>
+      </w:r>
+    </w:p>
+    <w:p>
+      <w:pPr>
+        <w:pStyle w:val="ListParagraph"/>
+        <w:numPr>
+          <w:ilvl w:val="0"/>
+          <w:numId w:val="1"/>
+        </w:numPr>
+      </w:pPr>
+      <w:r>
+        <w:rPr>
+          <w:b/>
+          <w:bCs/>
+        </w:rPr>
+        <w:t xml:space="preserve">Địa chỉ dài trên điện thoại:</w:t>
+      </w:r>
+      <w:r>
+        <w:t xml:space="preserve"> </w:t>
+      </w:r>
+      <w:r>
+        <w:rPr>
+          <w:rFonts w:ascii="Consolas" w:eastAsia="Consolas" w:hAnsi="Consolas" w:cs="Consolas"/>
+        </w:rPr>
+        <w:t xml:space="preserve">break-all</w:t>
+      </w:r>
+      <w:r>
+        <w:t xml:space="preserve"> cho phép xuống dòng giữa địa chỉ; Chrome ở 390 px đo </w:t>
+      </w:r>
+      <w:r>
+        <w:rPr>
+          <w:rFonts w:ascii="Consolas" w:eastAsia="Consolas" w:hAnsi="Consolas" w:cs="Consolas"/>
+        </w:rPr>
+        <w:t xml:space="preserve">scrollWidth - innerWidth = 0</w:t>
+      </w:r>
+      <w:r>
+        <w:t xml:space="preserve">.</w:t>
+      </w:r>
+    </w:p>
+    <w:p>
+      <w:pPr>
+        <w:pStyle w:val="Heading2"/>
+      </w:pPr>
+      <w:r>
         <w:t xml:space="preserve">Tự kiểm tra</w:t>
       </w:r>
     </w:p>
@@ -24254,6 +24799,117 @@
       </w:r>
       <w:r>
         <w:t xml:space="preserve"> khác nhau thế nào với người dùng?</w:t>
+      </w:r>
+    </w:p>
+    <w:p>
+      <w:pPr>
+        <w:pStyle w:val="ListParagraph"/>
+        <w:numPr>
+          <w:ilvl w:val="0"/>
+          <w:numId w:val="100"/>
+        </w:numPr>
+      </w:pPr>
+      <w:r>
+        <w:t xml:space="preserve">Vì sao thư mới đến trong lúc đang đọc tự hiện mà </w:t>
+      </w:r>
+      <w:r>
+        <w:rPr>
+          <w:rFonts w:ascii="Consolas" w:eastAsia="Consolas" w:hAnsi="Consolas" w:cs="Consolas"/>
+        </w:rPr>
+        <w:t xml:space="preserve">useEventStream</w:t>
+      </w:r>
+      <w:r>
+        <w:t xml:space="preserve"> không cần biết khóa của danh sách thư?</w:t>
+      </w:r>
+    </w:p>
+    <w:p>
+      <w:pPr>
+        <w:pStyle w:val="ListParagraph"/>
+        <w:numPr>
+          <w:ilvl w:val="0"/>
+          <w:numId w:val="100"/>
+        </w:numPr>
+      </w:pPr>
+      <w:r>
+        <w:t xml:space="preserve">Đang mở hai trang thư thì có một thư mới đến. Khi đọc lại, vì sao không có thư nào bị hụt ở chỗ nối hai trang?</w:t>
+      </w:r>
+    </w:p>
+    <w:p>
+      <w:pPr>
+        <w:pStyle w:val="ListParagraph"/>
+        <w:numPr>
+          <w:ilvl w:val="0"/>
+          <w:numId w:val="100"/>
+        </w:numPr>
+      </w:pPr>
+      <w:r>
+        <w:t xml:space="preserve">Vì sao API thư trả </w:t>
+      </w:r>
+      <w:r>
+        <w:rPr>
+          <w:rFonts w:ascii="Consolas" w:eastAsia="Consolas" w:hAnsi="Consolas" w:cs="Consolas"/>
+        </w:rPr>
+        <w:t xml:space="preserve">404</w:t>
+      </w:r>
+      <w:r>
+        <w:t xml:space="preserve"> thì web không báo lỗi, còn </w:t>
+      </w:r>
+      <w:r>
+        <w:rPr>
+          <w:rFonts w:ascii="Consolas" w:eastAsia="Consolas" w:hAnsi="Consolas" w:cs="Consolas"/>
+        </w:rPr>
+        <w:t xml:space="preserve">503</w:t>
+      </w:r>
+      <w:r>
+        <w:t xml:space="preserve"> thì có?</w:t>
+      </w:r>
+    </w:p>
+    <w:p>
+      <w:pPr>
+        <w:pStyle w:val="ListParagraph"/>
+        <w:numPr>
+          <w:ilvl w:val="0"/>
+          <w:numId w:val="100"/>
+        </w:numPr>
+      </w:pPr>
+      <w:r>
+        <w:t xml:space="preserve">Vì sao </w:t>
+      </w:r>
+      <w:r>
+        <w:rPr>
+          <w:rFonts w:ascii="Consolas" w:eastAsia="Consolas" w:hAnsi="Consolas" w:cs="Consolas"/>
+        </w:rPr>
+        <w:t xml:space="preserve">linkParts</w:t>
+      </w:r>
+      <w:r>
+        <w:t xml:space="preserve"> chỉ nhận </w:t>
+      </w:r>
+      <w:r>
+        <w:rPr>
+          <w:rFonts w:ascii="Consolas" w:eastAsia="Consolas" w:hAnsi="Consolas" w:cs="Consolas"/>
+        </w:rPr>
+        <w:t xml:space="preserve">http</w:t>
+      </w:r>
+      <w:r>
+        <w:t xml:space="preserve"> và </w:t>
+      </w:r>
+      <w:r>
+        <w:rPr>
+          <w:rFonts w:ascii="Consolas" w:eastAsia="Consolas" w:hAnsi="Consolas" w:cs="Consolas"/>
+        </w:rPr>
+        <w:t xml:space="preserve">https</w:t>
+      </w:r>
+      <w:r>
+        <w:t xml:space="preserve">? Nếu web đặt chữ của thư bằng </w:t>
+      </w:r>
+      <w:r>
+        <w:rPr>
+          <w:rFonts w:ascii="Consolas" w:eastAsia="Consolas" w:hAnsi="Consolas" w:cs="Consolas"/>
+        </w:rPr>
+        <w:t xml:space="preserve">innerHTML</w:t>
+      </w:r>
+      <w:r>
+        <w:t xml:space="preserve"> thì điều gì có thể xảy ra?</w:t>
       </w:r>
     </w:p>
     <w:p/>

</xml_diff>

<commit_message>
feat(fe-58): show HTML email in a sandboxed frame, pictures held back
An email the server keeps as HTML (or has not checked yet) asks for its
cleaned HTML and shows it in an iframe with no allow-scripts and no
allow-forms, and a policy that loads nothing from outside but the
email's styles, data: pictures and pictures from Sino. Pictures of the
web wait for "Hiện ảnh", for that email and that view only. The frame
is as tall as the email's body; the text stays, dimmed while waiting,
and with a line to try again when the HTML cannot load.

Chrome check with unclean HTML: no script ran, a form submitted from
outside made no request.

Co-Authored-By: Claude Opus 5.5 (1M context) <noreply@anthropic.com>
</commit_message>
<xml_diff>
--- a/docs/knowledge/phase-1-frontend-foundation.docx
+++ b/docs/knowledge/phase-1-frontend-foundation.docx
@@ -22482,6 +22482,555 @@
     </w:p>
     <w:p>
       <w:pPr>
+        <w:pStyle w:val="Heading3"/>
+      </w:pPr>
+      <w:r>
+        <w:t xml:space="preserve">15.3 Thư HTML trong iframe sandbox (FE-58, D-120, D-121)</w:t>
+      </w:r>
+    </w:p>
+    <w:p>
+      <w:r>
+        <w:t xml:space="preserve">HTML của thư là nội dung do người lạ viết. Đặt nó vào trang Sino (</w:t>
+      </w:r>
+      <w:r>
+        <w:rPr>
+          <w:rFonts w:ascii="Consolas" w:eastAsia="Consolas" w:hAnsi="Consolas" w:cs="Consolas"/>
+        </w:rPr>
+        <w:t xml:space="preserve">innerHTML</w:t>
+      </w:r>
+      <w:r>
+        <w:t xml:space="preserve">, </w:t>
+      </w:r>
+      <w:r>
+        <w:rPr>
+          <w:rFonts w:ascii="Consolas" w:eastAsia="Consolas" w:hAnsi="Consolas" w:cs="Consolas"/>
+        </w:rPr>
+        <w:t xml:space="preserve">dangerouslySetInnerHTML</w:t>
+      </w:r>
+      <w:r>
+        <w:t xml:space="preserve">) thì một </w:t>
+      </w:r>
+      <w:r>
+        <w:rPr>
+          <w:rFonts w:ascii="Consolas" w:eastAsia="Consolas" w:hAnsi="Consolas" w:cs="Consolas"/>
+        </w:rPr>
+        <w:t xml:space="preserve">&lt;img onerror=...&gt;</w:t>
+      </w:r>
+      <w:r>
+        <w:t xml:space="preserve"> lọt qua bộ lọc là chạy được code với phiên đăng nhập của người dùng (XSS). Sino dùng hai lớp độc lập:</w:t>
+      </w:r>
+    </w:p>
+    <w:p>
+      <w:pPr>
+        <w:shd w:val="clear" w:color="auto" w:fill="F2F3F5"/>
+        <w:ind w:left="0"/>
+      </w:pPr>
+      <w:r>
+        <w:rPr>
+          <w:rFonts w:ascii="Consolas" w:eastAsia="Consolas" w:hAnsi="Consolas" w:cs="Consolas"/>
+          <w:sz w:val="19"/>
+          <w:szCs w:val="19"/>
+        </w:rPr>
+        <w:t xml:space="preserve">HTML gốc (lưu khi nhập)</w:t>
+        <w:br/>
+        <w:t xml:space="preserve">   |  lớp 1: backend làm sạch bằng jsoup mỗi lần trả (bỏ script, on*, form, javascript:)</w:t>
+        <w:br/>
+        <w:t xml:space="preserve">   v</w:t>
+        <w:br/>
+        <w:t xml:space="preserve">HTML đã sạch --&gt; &lt;iframe sandbox="allow-same-origin allow-popups allow-popups-to-escape-sandbox" srcdoc=...&gt;</w:t>
+        <w:br/>
+        <w:t xml:space="preserve">                    lớp 2: không có allow-scripts -&gt; không script nào chạy, kể cả khi lớp 1 sót</w:t>
+        <w:br/>
+        <w:t xml:space="preserve">                           không có allow-forms   -&gt; form không gửi được</w:t>
+        <w:br/>
+        <w:t xml:space="preserve">                           CSP trong srcdoc       -&gt; không tải gì từ ngoài, trừ khi bấm "Hiện ảnh"</w:t>
+      </w:r>
+    </w:p>
+    <w:p>
+      <w:pPr>
+        <w:pStyle w:val="ListParagraph"/>
+        <w:numPr>
+          <w:ilvl w:val="0"/>
+          <w:numId w:val="1"/>
+        </w:numPr>
+      </w:pPr>
+      <w:r>
+        <w:rPr>
+          <w:rFonts w:ascii="Consolas" w:eastAsia="Consolas" w:hAnsi="Consolas" w:cs="Consolas"/>
+          <w:b/>
+          <w:bCs/>
+        </w:rPr>
+        <w:t xml:space="preserve">sandbox</w:t>
+      </w:r>
+      <w:r>
+        <w:rPr>
+          <w:b/>
+          <w:bCs/>
+        </w:rPr>
+        <w:t xml:space="preserve"> là danh sách cho phép:</w:t>
+      </w:r>
+      <w:r>
+        <w:t xml:space="preserve"> iframe có thuộc tính </w:t>
+      </w:r>
+      <w:r>
+        <w:rPr>
+          <w:rFonts w:ascii="Consolas" w:eastAsia="Consolas" w:hAnsi="Consolas" w:cs="Consolas"/>
+        </w:rPr>
+        <w:t xml:space="preserve">sandbox</w:t>
+      </w:r>
+      <w:r>
+        <w:t xml:space="preserve"> thì mặc định bị cấm mọi thứ; chỉ thêm đúng quyền cần. </w:t>
+      </w:r>
+      <w:r>
+        <w:rPr>
+          <w:rFonts w:ascii="Consolas" w:eastAsia="Consolas" w:hAnsi="Consolas" w:cs="Consolas"/>
+        </w:rPr>
+        <w:t xml:space="preserve">allow-same-origin</w:t>
+      </w:r>
+      <w:r>
+        <w:t xml:space="preserve"> cho Sino đo chiều cao nội dung (đọc </w:t>
+      </w:r>
+      <w:r>
+        <w:rPr>
+          <w:rFonts w:ascii="Consolas" w:eastAsia="Consolas" w:hAnsi="Consolas" w:cs="Consolas"/>
+        </w:rPr>
+        <w:t xml:space="preserve">contentDocument</w:t>
+      </w:r>
+      <w:r>
+        <w:t xml:space="preserve">). Quyền này </w:t>
+      </w:r>
+      <w:r>
+        <w:rPr>
+          <w:b/>
+          <w:bCs/>
+        </w:rPr>
+        <w:t xml:space="preserve">chỉ an toàn khi không có </w:t>
+      </w:r>
+      <w:r>
+        <w:rPr>
+          <w:rFonts w:ascii="Consolas" w:eastAsia="Consolas" w:hAnsi="Consolas" w:cs="Consolas"/>
+          <w:b/>
+          <w:bCs/>
+        </w:rPr>
+        <w:t xml:space="preserve">allow-scripts</w:t>
+      </w:r>
+      <w:r>
+        <w:t xml:space="preserve">: có cả hai thì script trong thư xóa được chính </w:t>
+      </w:r>
+      <w:r>
+        <w:rPr>
+          <w:rFonts w:ascii="Consolas" w:eastAsia="Consolas" w:hAnsi="Consolas" w:cs="Consolas"/>
+        </w:rPr>
+        <w:t xml:space="preserve">sandbox</w:t>
+      </w:r>
+      <w:r>
+        <w:t xml:space="preserve"> của nó.</w:t>
+      </w:r>
+    </w:p>
+    <w:p>
+      <w:pPr>
+        <w:pStyle w:val="ListParagraph"/>
+        <w:numPr>
+          <w:ilvl w:val="0"/>
+          <w:numId w:val="1"/>
+        </w:numPr>
+      </w:pPr>
+      <w:r>
+        <w:rPr>
+          <w:rFonts w:ascii="Consolas" w:eastAsia="Consolas" w:hAnsi="Consolas" w:cs="Consolas"/>
+          <w:b/>
+          <w:bCs/>
+        </w:rPr>
+        <w:t xml:space="preserve">srcdoc</w:t>
+      </w:r>
+      <w:r>
+        <w:rPr>
+          <w:b/>
+          <w:bCs/>
+        </w:rPr>
+        <w:t xml:space="preserve"> thay cho </w:t>
+      </w:r>
+      <w:r>
+        <w:rPr>
+          <w:rFonts w:ascii="Consolas" w:eastAsia="Consolas" w:hAnsi="Consolas" w:cs="Consolas"/>
+          <w:b/>
+          <w:bCs/>
+        </w:rPr>
+        <w:t xml:space="preserve">src</w:t>
+      </w:r>
+      <w:r>
+        <w:rPr>
+          <w:b/>
+          <w:bCs/>
+        </w:rPr>
+        <w:t xml:space="preserve">:</w:t>
+      </w:r>
+      <w:r>
+        <w:t xml:space="preserve"> nội dung nằm ngay trong thuộc tính, không cần URL riêng; React đặt nó như một thuộc tính bình thường (đã thoát ký tự).</w:t>
+      </w:r>
+    </w:p>
+    <w:p>
+      <w:pPr>
+        <w:pStyle w:val="ListParagraph"/>
+        <w:numPr>
+          <w:ilvl w:val="0"/>
+          <w:numId w:val="1"/>
+        </w:numPr>
+      </w:pPr>
+      <w:r>
+        <w:rPr>
+          <w:b/>
+          <w:bCs/>
+        </w:rPr>
+        <w:t xml:space="preserve">CSP trong thẻ meta:</w:t>
+      </w:r>
+      <w:r>
+        <w:t xml:space="preserve"> </w:t>
+      </w:r>
+      <w:r>
+        <w:rPr>
+          <w:rFonts w:ascii="Consolas" w:eastAsia="Consolas" w:hAnsi="Consolas" w:cs="Consolas"/>
+        </w:rPr>
+        <w:t xml:space="preserve">default-src 'none'</w:t>
+      </w:r>
+      <w:r>
+        <w:t xml:space="preserve"> cấm mọi tải; </w:t>
+      </w:r>
+      <w:r>
+        <w:rPr>
+          <w:rFonts w:ascii="Consolas" w:eastAsia="Consolas" w:hAnsi="Consolas" w:cs="Consolas"/>
+        </w:rPr>
+        <w:t xml:space="preserve">style-src 'unsafe-inline'</w:t>
+      </w:r>
+      <w:r>
+        <w:t xml:space="preserve"> giữ CSS của thư; </w:t>
+      </w:r>
+      <w:r>
+        <w:rPr>
+          <w:rFonts w:ascii="Consolas" w:eastAsia="Consolas" w:hAnsi="Consolas" w:cs="Consolas"/>
+        </w:rPr>
+        <w:t xml:space="preserve">img-src data: &lt;origin của Sino&gt;</w:t>
+      </w:r>
+      <w:r>
+        <w:t xml:space="preserve"> cho ảnh trong thư và ảnh nhúng </w:t>
+      </w:r>
+      <w:r>
+        <w:rPr>
+          <w:rFonts w:ascii="Consolas" w:eastAsia="Consolas" w:hAnsi="Consolas" w:cs="Consolas"/>
+        </w:rPr>
+        <w:t xml:space="preserve">cid:</w:t>
+      </w:r>
+      <w:r>
+        <w:t xml:space="preserve"> đi qua Sino. "Hiện ảnh" dựng lại </w:t>
+      </w:r>
+      <w:r>
+        <w:rPr>
+          <w:rFonts w:ascii="Consolas" w:eastAsia="Consolas" w:hAnsi="Consolas" w:cs="Consolas"/>
+        </w:rPr>
+        <w:t xml:space="preserve">srcdoc</w:t>
+      </w:r>
+      <w:r>
+        <w:t xml:space="preserve"> với </w:t>
+      </w:r>
+      <w:r>
+        <w:rPr>
+          <w:rFonts w:ascii="Consolas" w:eastAsia="Consolas" w:hAnsi="Consolas" w:cs="Consolas"/>
+        </w:rPr>
+        <w:t xml:space="preserve">https: http:</w:t>
+      </w:r>
+      <w:r>
+        <w:t xml:space="preserve"> thêm vào </w:t>
+      </w:r>
+      <w:r>
+        <w:rPr>
+          <w:rFonts w:ascii="Consolas" w:eastAsia="Consolas" w:hAnsi="Consolas" w:cs="Consolas"/>
+        </w:rPr>
+        <w:t xml:space="preserve">img-src</w:t>
+      </w:r>
+      <w:r>
+        <w:t xml:space="preserve">. CSP chặn cả ảnh nền CSS (</w:t>
+      </w:r>
+      <w:r>
+        <w:rPr>
+          <w:rFonts w:ascii="Consolas" w:eastAsia="Consolas" w:hAnsi="Consolas" w:cs="Consolas"/>
+        </w:rPr>
+        <w:t xml:space="preserve">url(...)</w:t>
+      </w:r>
+      <w:r>
+        <w:t xml:space="preserve">), là đường pixel theo dõi hay dùng.</w:t>
+      </w:r>
+    </w:p>
+    <w:p>
+      <w:pPr>
+        <w:pStyle w:val="ListParagraph"/>
+        <w:numPr>
+          <w:ilvl w:val="0"/>
+          <w:numId w:val="1"/>
+        </w:numPr>
+      </w:pPr>
+      <w:r>
+        <w:rPr>
+          <w:rFonts w:ascii="Consolas" w:eastAsia="Consolas" w:hAnsi="Consolas" w:cs="Consolas"/>
+          <w:b/>
+          <w:bCs/>
+        </w:rPr>
+        <w:t xml:space="preserve">&lt;meta name="referrer" content="no-referrer"&gt;</w:t>
+      </w:r>
+      <w:r>
+        <w:rPr>
+          <w:b/>
+          <w:bCs/>
+        </w:rPr>
+        <w:t xml:space="preserve"> và </w:t>
+      </w:r>
+      <w:r>
+        <w:rPr>
+          <w:rFonts w:ascii="Consolas" w:eastAsia="Consolas" w:hAnsi="Consolas" w:cs="Consolas"/>
+          <w:b/>
+          <w:bCs/>
+        </w:rPr>
+        <w:t xml:space="preserve">referrerPolicy</w:t>
+      </w:r>
+      <w:r>
+        <w:rPr>
+          <w:b/>
+          <w:bCs/>
+        </w:rPr>
+        <w:t xml:space="preserve">:</w:t>
+      </w:r>
+      <w:r>
+        <w:t xml:space="preserve"> trang mở từ liên kết hay máy chủ ảnh không biết người đọc đến từ đâu (URL của Sino có ID cuộc trò chuyện).</w:t>
+      </w:r>
+    </w:p>
+    <w:p>
+      <w:pPr>
+        <w:pStyle w:val="ListParagraph"/>
+        <w:numPr>
+          <w:ilvl w:val="0"/>
+          <w:numId w:val="1"/>
+        </w:numPr>
+      </w:pPr>
+      <w:r>
+        <w:rPr>
+          <w:b/>
+          <w:bCs/>
+        </w:rPr>
+        <w:t xml:space="preserve">Chiều cao bằng nội dung:</w:t>
+      </w:r>
+      <w:r>
+        <w:t xml:space="preserve"> sau sự kiện </w:t>
+      </w:r>
+      <w:r>
+        <w:rPr>
+          <w:rFonts w:ascii="Consolas" w:eastAsia="Consolas" w:hAnsi="Consolas" w:cs="Consolas"/>
+        </w:rPr>
+        <w:t xml:space="preserve">load</w:t>
+      </w:r>
+      <w:r>
+        <w:t xml:space="preserve">, </w:t>
+      </w:r>
+      <w:r>
+        <w:rPr>
+          <w:rFonts w:ascii="Consolas" w:eastAsia="Consolas" w:hAnsi="Consolas" w:cs="Consolas"/>
+        </w:rPr>
+        <w:t xml:space="preserve">ResizeObserver</w:t>
+      </w:r>
+      <w:r>
+        <w:t xml:space="preserve"> theo dõi </w:t>
+      </w:r>
+      <w:r>
+        <w:rPr>
+          <w:rFonts w:ascii="Consolas" w:eastAsia="Consolas" w:hAnsi="Consolas" w:cs="Consolas"/>
+        </w:rPr>
+        <w:t xml:space="preserve">body</w:t>
+      </w:r>
+      <w:r>
+        <w:t xml:space="preserve"> của thư (ảnh tải xong thì cao thêm). Đo </w:t>
+      </w:r>
+      <w:r>
+        <w:rPr>
+          <w:rFonts w:ascii="Consolas" w:eastAsia="Consolas" w:hAnsi="Consolas" w:cs="Consolas"/>
+        </w:rPr>
+        <w:t xml:space="preserve">body</w:t>
+      </w:r>
+      <w:r>
+        <w:t xml:space="preserve"> chứ không đo </w:t>
+      </w:r>
+      <w:r>
+        <w:rPr>
+          <w:rFonts w:ascii="Consolas" w:eastAsia="Consolas" w:hAnsi="Consolas" w:cs="Consolas"/>
+        </w:rPr>
+        <w:t xml:space="preserve">html</w:t>
+      </w:r>
+      <w:r>
+        <w:t xml:space="preserve">: trang trong khung không bao giờ ngắn hơn khung, nên đo </w:t>
+      </w:r>
+      <w:r>
+        <w:rPr>
+          <w:rFonts w:ascii="Consolas" w:eastAsia="Consolas" w:hAnsi="Consolas" w:cs="Consolas"/>
+        </w:rPr>
+        <w:t xml:space="preserve">html</w:t>
+      </w:r>
+      <w:r>
+        <w:t xml:space="preserve"> thì khung chỉ cao lên mà không thấp xuống. Khung tắt cuộn dọc bên trong (</w:t>
+      </w:r>
+      <w:r>
+        <w:rPr>
+          <w:rFonts w:ascii="Consolas" w:eastAsia="Consolas" w:hAnsi="Consolas" w:cs="Consolas"/>
+        </w:rPr>
+        <w:t xml:space="preserve">overflow-y: hidden</w:t>
+      </w:r>
+      <w:r>
+        <w:t xml:space="preserve">) để cả cuộc trò chuyện cuộn như một.</w:t>
+      </w:r>
+    </w:p>
+    <w:p>
+      <w:pPr>
+        <w:pStyle w:val="ListParagraph"/>
+        <w:numPr>
+          <w:ilvl w:val="0"/>
+          <w:numId w:val="1"/>
+        </w:numPr>
+      </w:pPr>
+      <w:r>
+        <w:rPr>
+          <w:b/>
+          <w:bCs/>
+        </w:rPr>
+        <w:t xml:space="preserve">Nền trắng ở theme tối:</w:t>
+      </w:r>
+      <w:r>
+        <w:t xml:space="preserve"> thư HTML luôn viết cho nền sáng (chữ đen, ô màu); đảo màu sẽ làm hỏng chúng, nên khung luôn trắng (</w:t>
+      </w:r>
+      <w:r>
+        <w:rPr>
+          <w:rFonts w:ascii="Consolas" w:eastAsia="Consolas" w:hAnsi="Consolas" w:cs="Consolas"/>
+        </w:rPr>
+        <w:t xml:space="preserve">color-scheme: light</w:t>
+      </w:r>
+      <w:r>
+        <w:t xml:space="preserve">).</w:t>
+      </w:r>
+    </w:p>
+    <w:p>
+      <w:pPr>
+        <w:pStyle w:val="ListParagraph"/>
+        <w:numPr>
+          <w:ilvl w:val="0"/>
+          <w:numId w:val="1"/>
+        </w:numPr>
+      </w:pPr>
+      <w:r>
+        <w:rPr>
+          <w:b/>
+          <w:bCs/>
+        </w:rPr>
+        <w:t xml:space="preserve">Nội dung thư nằm ngoài </w:t>
+      </w:r>
+      <w:r>
+        <w:rPr>
+          <w:rFonts w:ascii="Consolas" w:eastAsia="Consolas" w:hAnsi="Consolas" w:cs="Consolas"/>
+          <w:b/>
+          <w:bCs/>
+        </w:rPr>
+        <w:t xml:space="preserve">['inbox']</w:t>
+      </w:r>
+      <w:r>
+        <w:rPr>
+          <w:b/>
+          <w:bCs/>
+        </w:rPr>
+        <w:t xml:space="preserve">:</w:t>
+      </w:r>
+      <w:r>
+        <w:t xml:space="preserve"> khóa </w:t>
+      </w:r>
+      <w:r>
+        <w:rPr>
+          <w:rFonts w:ascii="Consolas" w:eastAsia="Consolas" w:hAnsi="Consolas" w:cs="Consolas"/>
+        </w:rPr>
+        <w:t xml:space="preserve">['message-body', conversationId, messageId]</w:t>
+      </w:r>
+      <w:r>
+        <w:t xml:space="preserve">. Nội dung không đổi; nếu nằm dưới </w:t>
+      </w:r>
+      <w:r>
+        <w:rPr>
+          <w:rFonts w:ascii="Consolas" w:eastAsia="Consolas" w:hAnsi="Consolas" w:cs="Consolas"/>
+        </w:rPr>
+        <w:t xml:space="preserve">['inbox']</w:t>
+      </w:r>
+      <w:r>
+        <w:t xml:space="preserve"> thì mỗi sự kiện realtime sẽ tải lại mọi thư HTML đang mở.</w:t>
+      </w:r>
+    </w:p>
+    <w:p>
+      <w:pPr>
+        <w:pStyle w:val="ListParagraph"/>
+        <w:numPr>
+          <w:ilvl w:val="0"/>
+          <w:numId w:val="1"/>
+        </w:numPr>
+      </w:pPr>
+      <w:r>
+        <w:rPr>
+          <w:b/>
+          <w:bCs/>
+        </w:rPr>
+        <w:t xml:space="preserve">Chứng minh lớp 2 trên Chrome thật:</w:t>
+      </w:r>
+      <w:r>
+        <w:t xml:space="preserve"> trả HTML </w:t>
+      </w:r>
+      <w:r>
+        <w:rPr>
+          <w:b/>
+          <w:bCs/>
+        </w:rPr>
+        <w:t xml:space="preserve">chưa làm sạch</w:t>
+      </w:r>
+      <w:r>
+        <w:t xml:space="preserve"> có </w:t>
+      </w:r>
+      <w:r>
+        <w:rPr>
+          <w:rFonts w:ascii="Consolas" w:eastAsia="Consolas" w:hAnsi="Consolas" w:cs="Consolas"/>
+        </w:rPr>
+        <w:t xml:space="preserve">&lt;script&gt;</w:t>
+      </w:r>
+      <w:r>
+        <w:t xml:space="preserve">, </w:t>
+      </w:r>
+      <w:r>
+        <w:rPr>
+          <w:rFonts w:ascii="Consolas" w:eastAsia="Consolas" w:hAnsi="Consolas" w:cs="Consolas"/>
+        </w:rPr>
+        <w:t xml:space="preserve">onerror</w:t>
+      </w:r>
+      <w:r>
+        <w:t xml:space="preserve"> và form: tiêu đề trang không đổi, gọi </w:t>
+      </w:r>
+      <w:r>
+        <w:rPr>
+          <w:rFonts w:ascii="Consolas" w:eastAsia="Consolas" w:hAnsi="Consolas" w:cs="Consolas"/>
+        </w:rPr>
+        <w:t xml:space="preserve">form.submit()</w:t>
+      </w:r>
+      <w:r>
+        <w:t xml:space="preserve"> từ ngoài không tạo request nào. jsdom không dựng </w:t>
+      </w:r>
+      <w:r>
+        <w:rPr>
+          <w:rFonts w:ascii="Consolas" w:eastAsia="Consolas" w:hAnsi="Consolas" w:cs="Consolas"/>
+        </w:rPr>
+        <w:t xml:space="preserve">srcdoc</w:t>
+      </w:r>
+      <w:r>
+        <w:t xml:space="preserve">, nên test tự động chỉ kiểm thuộc tính của iframe; phần "không chạy" phải kiểm ở trình duyệt thật.</w:t>
+      </w:r>
+    </w:p>
+    <w:p>
+      <w:pPr>
         <w:pStyle w:val="Heading2"/>
       </w:pPr>
       <w:r>
@@ -24910,6 +25459,126 @@
       </w:r>
       <w:r>
         <w:t xml:space="preserve"> thì điều gì có thể xảy ra?</w:t>
+      </w:r>
+    </w:p>
+    <w:p>
+      <w:pPr>
+        <w:pStyle w:val="ListParagraph"/>
+        <w:numPr>
+          <w:ilvl w:val="0"/>
+          <w:numId w:val="100"/>
+        </w:numPr>
+      </w:pPr>
+      <w:r>
+        <w:t xml:space="preserve">Backend đã làm sạch HTML rồi, vì sao web vẫn cần iframe không có </w:t>
+      </w:r>
+      <w:r>
+        <w:rPr>
+          <w:rFonts w:ascii="Consolas" w:eastAsia="Consolas" w:hAnsi="Consolas" w:cs="Consolas"/>
+        </w:rPr>
+        <w:t xml:space="preserve">allow-scripts</w:t>
+      </w:r>
+      <w:r>
+        <w:t xml:space="preserve">? Vì sao không được thêm </w:t>
+      </w:r>
+      <w:r>
+        <w:rPr>
+          <w:rFonts w:ascii="Consolas" w:eastAsia="Consolas" w:hAnsi="Consolas" w:cs="Consolas"/>
+        </w:rPr>
+        <w:t xml:space="preserve">allow-scripts</w:t>
+      </w:r>
+      <w:r>
+        <w:t xml:space="preserve"> khi đã có </w:t>
+      </w:r>
+      <w:r>
+        <w:rPr>
+          <w:rFonts w:ascii="Consolas" w:eastAsia="Consolas" w:hAnsi="Consolas" w:cs="Consolas"/>
+        </w:rPr>
+        <w:t xml:space="preserve">allow-same-origin</w:t>
+      </w:r>
+      <w:r>
+        <w:t xml:space="preserve">?</w:t>
+      </w:r>
+    </w:p>
+    <w:p>
+      <w:pPr>
+        <w:pStyle w:val="ListParagraph"/>
+        <w:numPr>
+          <w:ilvl w:val="0"/>
+          <w:numId w:val="100"/>
+        </w:numPr>
+      </w:pPr>
+      <w:r>
+        <w:t xml:space="preserve">Pixel theo dõi báo cho người gửi điều gì? CSP nào chặn nó, và vì sao chặn cả </w:t>
+      </w:r>
+      <w:r>
+        <w:rPr>
+          <w:rFonts w:ascii="Consolas" w:eastAsia="Consolas" w:hAnsi="Consolas" w:cs="Consolas"/>
+        </w:rPr>
+        <w:t xml:space="preserve">url(...)</w:t>
+      </w:r>
+      <w:r>
+        <w:t xml:space="preserve"> trong CSS?</w:t>
+      </w:r>
+    </w:p>
+    <w:p>
+      <w:pPr>
+        <w:pStyle w:val="ListParagraph"/>
+        <w:numPr>
+          <w:ilvl w:val="0"/>
+          <w:numId w:val="100"/>
+        </w:numPr>
+      </w:pPr>
+      <w:r>
+        <w:t xml:space="preserve">Vì sao đo chiều cao bằng </w:t>
+      </w:r>
+      <w:r>
+        <w:rPr>
+          <w:rFonts w:ascii="Consolas" w:eastAsia="Consolas" w:hAnsi="Consolas" w:cs="Consolas"/>
+        </w:rPr>
+        <w:t xml:space="preserve">body</w:t>
+      </w:r>
+      <w:r>
+        <w:t xml:space="preserve"> mà không bằng </w:t>
+      </w:r>
+      <w:r>
+        <w:rPr>
+          <w:rFonts w:ascii="Consolas" w:eastAsia="Consolas" w:hAnsi="Consolas" w:cs="Consolas"/>
+        </w:rPr>
+        <w:t xml:space="preserve">html</w:t>
+      </w:r>
+      <w:r>
+        <w:t xml:space="preserve"> của tài liệu trong khung?</w:t>
+      </w:r>
+    </w:p>
+    <w:p>
+      <w:pPr>
+        <w:pStyle w:val="ListParagraph"/>
+        <w:numPr>
+          <w:ilvl w:val="0"/>
+          <w:numId w:val="100"/>
+        </w:numPr>
+      </w:pPr>
+      <w:r>
+        <w:t xml:space="preserve">Vì sao nội dung thư dùng khóa </w:t>
+      </w:r>
+      <w:r>
+        <w:rPr>
+          <w:rFonts w:ascii="Consolas" w:eastAsia="Consolas" w:hAnsi="Consolas" w:cs="Consolas"/>
+        </w:rPr>
+        <w:t xml:space="preserve">['message-body', ...]</w:t>
+      </w:r>
+      <w:r>
+        <w:t xml:space="preserve"> mà không nằm dưới </w:t>
+      </w:r>
+      <w:r>
+        <w:rPr>
+          <w:rFonts w:ascii="Consolas" w:eastAsia="Consolas" w:hAnsi="Consolas" w:cs="Consolas"/>
+        </w:rPr>
+        <w:t xml:space="preserve">['inbox']</w:t>
+      </w:r>
+      <w:r>
+        <w:t xml:space="preserve"> như danh sách thư?</w:t>
       </w:r>
     </w:p>
     <w:p/>

</xml_diff>

<commit_message>
feat(fe-59): download an email's files through Sino
A file from the API is a download link to
/api/conversations/{id}/messages/{messageId}/attachments/{attachmentId};
the sample data keeps the canvas button. The mutation check of the
thread's pure logic (links in the text, the frame's document and
sandbox, when the content is asked for) caught 22 of 23; two missing
tests were added (quoted address, nothing after the scheme), and the
last is equivalent (the scheme check after the pattern rejects any
other scheme).

Co-Authored-By: Claude Opus 5.5 (1M context) <noreply@anthropic.com>
</commit_message>
<xml_diff>
--- a/docs/knowledge/phase-1-frontend-foundation.docx
+++ b/docs/knowledge/phase-1-frontend-foundation.docx
@@ -22977,6 +22977,135 @@
           <w:b/>
           <w:bCs/>
         </w:rPr>
+        <w:t xml:space="preserve">Tệp đính kèm là liên kết tải về (FE-59, D-125):</w:t>
+      </w:r>
+      <w:r>
+        <w:t xml:space="preserve"> </w:t>
+      </w:r>
+      <w:r>
+        <w:rPr>
+          <w:rFonts w:ascii="Consolas" w:eastAsia="Consolas" w:hAnsi="Consolas" w:cs="Consolas"/>
+        </w:rPr>
+        <w:t xml:space="preserve">&lt;a href="/api/conversations/…/attachments/…" download="tên tệp"&gt;</w:t>
+      </w:r>
+      <w:r>
+        <w:t xml:space="preserve">. Cùng origin nên cookie phiên đi theo; server luôn trả </w:t>
+      </w:r>
+      <w:r>
+        <w:rPr>
+          <w:rFonts w:ascii="Consolas" w:eastAsia="Consolas" w:hAnsi="Consolas" w:cs="Consolas"/>
+        </w:rPr>
+        <w:t xml:space="preserve">Content-Disposition: attachment</w:t>
+      </w:r>
+      <w:r>
+        <w:t xml:space="preserve">, nên một tệp </w:t>
+      </w:r>
+      <w:r>
+        <w:rPr>
+          <w:rFonts w:ascii="Consolas" w:eastAsia="Consolas" w:hAnsi="Consolas" w:cs="Consolas"/>
+        </w:rPr>
+        <w:t xml:space="preserve">.html</w:t>
+      </w:r>
+      <w:r>
+        <w:t xml:space="preserve"> hay </w:t>
+      </w:r>
+      <w:r>
+        <w:rPr>
+          <w:rFonts w:ascii="Consolas" w:eastAsia="Consolas" w:hAnsi="Consolas" w:cs="Consolas"/>
+        </w:rPr>
+        <w:t xml:space="preserve">.svg</w:t>
+      </w:r>
+      <w:r>
+        <w:t xml:space="preserve"> không bao giờ được mở như một trang trên origin của Sino.</w:t>
+      </w:r>
+    </w:p>
+    <w:p>
+      <w:pPr>
+        <w:pStyle w:val="ListParagraph"/>
+        <w:numPr>
+          <w:ilvl w:val="0"/>
+          <w:numId w:val="1"/>
+        </w:numPr>
+      </w:pPr>
+      <w:r>
+        <w:rPr>
+          <w:b/>
+          <w:bCs/>
+        </w:rPr>
+        <w:t xml:space="preserve">Lỗi gài tìm ra test thiếu:</w:t>
+      </w:r>
+      <w:r>
+        <w:t xml:space="preserve"> 23 lỗi cố ý cho </w:t>
+      </w:r>
+      <w:r>
+        <w:rPr>
+          <w:rFonts w:ascii="Consolas" w:eastAsia="Consolas" w:hAnsi="Consolas" w:cs="Consolas"/>
+        </w:rPr>
+        <w:t xml:space="preserve">linkParts</w:t>
+      </w:r>
+      <w:r>
+        <w:t xml:space="preserve">, </w:t>
+      </w:r>
+      <w:r>
+        <w:rPr>
+          <w:rFonts w:ascii="Consolas" w:eastAsia="Consolas" w:hAnsi="Consolas" w:cs="Consolas"/>
+        </w:rPr>
+        <w:t xml:space="preserve">mailDocument</w:t>
+      </w:r>
+      <w:r>
+        <w:t xml:space="preserve">, khung và </w:t>
+      </w:r>
+      <w:r>
+        <w:rPr>
+          <w:rFonts w:ascii="Consolas" w:eastAsia="Consolas" w:hAnsi="Consolas" w:cs="Consolas"/>
+        </w:rPr>
+        <w:t xml:space="preserve">MailBody</w:t>
+      </w:r>
+      <w:r>
+        <w:t xml:space="preserve">; 3 cái sống sót lần đầu. Hai cái là test thiếu (địa chỉ trong dấu nháy, </w:t>
+      </w:r>
+      <w:r>
+        <w:rPr>
+          <w:rFonts w:ascii="Consolas" w:eastAsia="Consolas" w:hAnsi="Consolas" w:cs="Consolas"/>
+        </w:rPr>
+        <w:t xml:space="preserve">https://.</w:t>
+      </w:r>
+      <w:r>
+        <w:t xml:space="preserve">), đã thêm test. Cái thứ ba là </w:t>
+      </w:r>
+      <w:r>
+        <w:rPr>
+          <w:b/>
+          <w:bCs/>
+        </w:rPr>
+        <w:t xml:space="preserve">lỗi tương đương</w:t>
+      </w:r>
+      <w:r>
+        <w:t xml:space="preserve">: cho regex nhận mọi scheme nhưng phép kiểm </w:t>
+      </w:r>
+      <w:r>
+        <w:rPr>
+          <w:rFonts w:ascii="Consolas" w:eastAsia="Consolas" w:hAnsi="Consolas" w:cs="Consolas"/>
+        </w:rPr>
+        <w:t xml:space="preserve">^https?://.</w:t>
+      </w:r>
+      <w:r>
+        <w:t xml:space="preserve"> ngay sau đó vẫn loại chúng, nên kết quả không đổi; hai lớp giữ cho nhau, không test nào phân biệt được.</w:t>
+      </w:r>
+    </w:p>
+    <w:p>
+      <w:pPr>
+        <w:pStyle w:val="ListParagraph"/>
+        <w:numPr>
+          <w:ilvl w:val="0"/>
+          <w:numId w:val="1"/>
+        </w:numPr>
+      </w:pPr>
+      <w:r>
+        <w:rPr>
+          <w:b/>
+          <w:bCs/>
+        </w:rPr>
         <w:t xml:space="preserve">Chứng minh lớp 2 trên Chrome thật:</w:t>
       </w:r>
       <w:r>
@@ -25579,6 +25708,18 @@
       </w:r>
       <w:r>
         <w:t xml:space="preserve"> như danh sách thư?</w:t>
+      </w:r>
+    </w:p>
+    <w:p>
+      <w:pPr>
+        <w:pStyle w:val="ListParagraph"/>
+        <w:numPr>
+          <w:ilvl w:val="0"/>
+          <w:numId w:val="100"/>
+        </w:numPr>
+      </w:pPr>
+      <w:r>
+        <w:t xml:space="preserve">"Lỗi tương đương" trong kiểm tra bằng lỗi gài là gì? Vì sao không cần (và không thể) viết test để bắt nó?</w:t>
       </w:r>
     </w:p>
     <w:p/>

</xml_diff>

<commit_message>
feat(fe-61): show whether Sino can reply, and to whom
The conversation's `reply` (F10) decides the reply area: the reply box
with a "Tới" line naming who the reply goes to, "Cấp quyền gửi" through
the reconnect flow for an account connected before Sino could send,
"Kết nối lại" for one that lost its access, and "Gmail chưa cho Sino
gửi thư" when the provider cannot send or the backend does not tell
yet. The "Tới" line wraps rather than cut off a recipient.

Co-Authored-By: Claude Opus 5.5 (1M context) <noreply@anthropic.com>
</commit_message>
<xml_diff>
--- a/docs/knowledge/phase-1-frontend-foundation.docx
+++ b/docs/knowledge/phase-1-frontend-foundation.docx
@@ -23163,6 +23163,307 @@
         <w:pStyle w:val="Heading2"/>
       </w:pPr>
       <w:r>
+        <w:t xml:space="preserve">16. Trả lời từ Sino: phía web (F10, </w:t>
+      </w:r>
+      <w:r>
+        <w:rPr>
+          <w:rFonts w:ascii="Consolas" w:eastAsia="Consolas" w:hAnsi="Consolas" w:cs="Consolas"/>
+        </w:rPr>
+        <w:t xml:space="preserve">f10-reply</w:t>
+      </w:r>
+      <w:r>
+        <w:t xml:space="preserve">)</w:t>
+      </w:r>
+    </w:p>
+    <w:p>
+      <w:pPr>
+        <w:pStyle w:val="Heading3"/>
+      </w:pPr>
+      <w:r>
+        <w:t xml:space="preserve">16.0 Bức tranh</w:t>
+      </w:r>
+    </w:p>
+    <w:p>
+      <w:r>
+        <w:t xml:space="preserve">Gmail chỉ cho Sino gửi thư khi tài khoản đã cấp quyền </w:t>
+      </w:r>
+      <w:r>
+        <w:rPr>
+          <w:rFonts w:ascii="Consolas" w:eastAsia="Consolas" w:hAnsi="Consolas" w:cs="Consolas"/>
+        </w:rPr>
+        <w:t xml:space="preserve">gmail.send</w:t>
+      </w:r>
+      <w:r>
+        <w:t xml:space="preserve">. Tài khoản kết nối trước F10 chỉ có quyền đọc, nên phải "Kết nối lại" để cấp thêm. Server nói cho web biết điều đó qua </w:t>
+      </w:r>
+      <w:r>
+        <w:rPr>
+          <w:rFonts w:ascii="Consolas" w:eastAsia="Consolas" w:hAnsi="Consolas" w:cs="Consolas"/>
+        </w:rPr>
+        <w:t xml:space="preserve">reply</w:t>
+      </w:r>
+      <w:r>
+        <w:t xml:space="preserve"> trong </w:t>
+      </w:r>
+      <w:r>
+        <w:rPr>
+          <w:rFonts w:ascii="Consolas" w:eastAsia="Consolas" w:hAnsi="Consolas" w:cs="Consolas"/>
+        </w:rPr>
+        <w:t xml:space="preserve">GET /api/conversations/{id}</w:t>
+      </w:r>
+      <w:r>
+        <w:t xml:space="preserve">:</w:t>
+      </w:r>
+    </w:p>
+    <w:p>
+      <w:pPr>
+        <w:shd w:val="clear" w:color="auto" w:fill="F2F3F5"/>
+        <w:ind w:left="0"/>
+      </w:pPr>
+      <w:r>
+        <w:rPr>
+          <w:rFonts w:ascii="Consolas" w:eastAsia="Consolas" w:hAnsi="Consolas" w:cs="Consolas"/>
+          <w:sz w:val="19"/>
+          <w:szCs w:val="19"/>
+        </w:rPr>
+        <w:t xml:space="preserve">reply.state            ô trả lời / dòng báo</w:t>
+        <w:br/>
+        <w:t xml:space="preserve">READY               -&gt; ô trả lời + dòng "Tới ..."</w:t>
+        <w:br/>
+        <w:t xml:space="preserve">NEEDS_PERMISSION    -&gt; "Sino chưa có quyền gửi thư từ ..." + nút "Cấp quyền gửi" (mở kết nối lại)</w:t>
+        <w:br/>
+        <w:t xml:space="preserve">ACCOUNT_UNAVAILABLE -&gt; tài khoản hết quyền: "Kết nối lại" (như trước)</w:t>
+        <w:br/>
+        <w:t xml:space="preserve">NOT_SUPPORTED       -&gt; "Gmail chưa cho Sino gửi thư" / "Bạn trả lời trong Gmail."</w:t>
+        <w:br/>
+        <w:t xml:space="preserve">(không có reply)    -&gt; như NOT_SUPPORTED: backend chưa có F10</w:t>
+      </w:r>
+    </w:p>
+    <w:p>
+      <w:pPr>
+        <w:pStyle w:val="Heading3"/>
+      </w:pPr>
+      <w:r>
+        <w:t xml:space="preserve">16.1 Trạng thái trả lời và người nhận (FE-61, D-133, D-134)</w:t>
+      </w:r>
+    </w:p>
+    <w:p>
+      <w:pPr>
+        <w:pStyle w:val="ListParagraph"/>
+        <w:numPr>
+          <w:ilvl w:val="0"/>
+          <w:numId w:val="1"/>
+        </w:numPr>
+      </w:pPr>
+      <w:r>
+        <w:rPr>
+          <w:b/>
+          <w:bCs/>
+        </w:rPr>
+        <w:t xml:space="preserve">Server quyết, web hiện:</w:t>
+      </w:r>
+      <w:r>
+        <w:t xml:space="preserve"> người nhận được tính ở server (</w:t>
+      </w:r>
+      <w:r>
+        <w:rPr>
+          <w:rFonts w:ascii="Consolas" w:eastAsia="Consolas" w:hAnsi="Consolas" w:cs="Consolas"/>
+        </w:rPr>
+        <w:t xml:space="preserve">Reply-To</w:t>
+      </w:r>
+      <w:r>
+        <w:t xml:space="preserve">, không có thì người gửi của thư đến mới nhất) và trả trong </w:t>
+      </w:r>
+      <w:r>
+        <w:rPr>
+          <w:rFonts w:ascii="Consolas" w:eastAsia="Consolas" w:hAnsi="Consolas" w:cs="Consolas"/>
+        </w:rPr>
+        <w:t xml:space="preserve">reply.to</w:t>
+      </w:r>
+      <w:r>
+        <w:t xml:space="preserve">; khi gửi, server tính lại theo cùng quy tắc, không nhận người nhận từ trình duyệt. Web chỉ hiện đúng danh sách đó trên dòng "Tới".</w:t>
+      </w:r>
+    </w:p>
+    <w:p>
+      <w:pPr>
+        <w:pStyle w:val="ListParagraph"/>
+        <w:numPr>
+          <w:ilvl w:val="0"/>
+          <w:numId w:val="1"/>
+        </w:numPr>
+      </w:pPr>
+      <w:r>
+        <w:rPr>
+          <w:b/>
+          <w:bCs/>
+        </w:rPr>
+        <w:t xml:space="preserve">Ánh xạ thành dữ liệu đã có:</w:t>
+      </w:r>
+      <w:r>
+        <w:t xml:space="preserve"> </w:t>
+      </w:r>
+      <w:r>
+        <w:rPr>
+          <w:rFonts w:ascii="Consolas" w:eastAsia="Consolas" w:hAnsi="Consolas" w:cs="Consolas"/>
+        </w:rPr>
+        <w:t xml:space="preserve">reply.state</w:t>
+      </w:r>
+      <w:r>
+        <w:t xml:space="preserve"> thành </w:t>
+      </w:r>
+      <w:r>
+        <w:rPr>
+          <w:rFonts w:ascii="Consolas" w:eastAsia="Consolas" w:hAnsi="Consolas" w:cs="Consolas"/>
+        </w:rPr>
+        <w:t xml:space="preserve">canSend</w:t>
+      </w:r>
+      <w:r>
+        <w:t xml:space="preserve"> (</w:t>
+      </w:r>
+      <w:r>
+        <w:rPr>
+          <w:rFonts w:ascii="Consolas" w:eastAsia="Consolas" w:hAnsi="Consolas" w:cs="Consolas"/>
+        </w:rPr>
+        <w:t xml:space="preserve">true</w:t>
+      </w:r>
+      <w:r>
+        <w:t xml:space="preserve">, </w:t>
+      </w:r>
+      <w:r>
+        <w:rPr>
+          <w:rFonts w:ascii="Consolas" w:eastAsia="Consolas" w:hAnsi="Consolas" w:cs="Consolas"/>
+        </w:rPr>
+        <w:t xml:space="preserve">false</w:t>
+      </w:r>
+      <w:r>
+        <w:t xml:space="preserve">, </w:t>
+      </w:r>
+      <w:r>
+        <w:rPr>
+          <w:rFonts w:ascii="Consolas" w:eastAsia="Consolas" w:hAnsi="Consolas" w:cs="Consolas"/>
+        </w:rPr>
+        <w:t xml:space="preserve">null</w:t>
+      </w:r>
+      <w:r>
+        <w:t xml:space="preserve">) mà </w:t>
+      </w:r>
+      <w:r>
+        <w:rPr>
+          <w:rFonts w:ascii="Consolas" w:eastAsia="Consolas" w:hAnsi="Consolas" w:cs="Consolas"/>
+        </w:rPr>
+        <w:t xml:space="preserve">sendBlock</w:t>
+      </w:r>
+      <w:r>
+        <w:t xml:space="preserve"> đã dùng từ trước, nên </w:t>
+      </w:r>
+      <w:r>
+        <w:rPr>
+          <w:rFonts w:ascii="Consolas" w:eastAsia="Consolas" w:hAnsi="Consolas" w:cs="Consolas"/>
+        </w:rPr>
+        <w:t xml:space="preserve">ThreadNotice</w:t>
+      </w:r>
+      <w:r>
+        <w:t xml:space="preserve"> không phải đổi cách chọn loại dòng báo; chỉ đổi câu chữ.</w:t>
+      </w:r>
+    </w:p>
+    <w:p>
+      <w:pPr>
+        <w:pStyle w:val="ListParagraph"/>
+        <w:numPr>
+          <w:ilvl w:val="0"/>
+          <w:numId w:val="1"/>
+        </w:numPr>
+      </w:pPr>
+      <w:r>
+        <w:rPr>
+          <w:b/>
+          <w:bCs/>
+        </w:rPr>
+        <w:t xml:space="preserve">Câu chữ theo sự thật:</w:t>
+      </w:r>
+      <w:r>
+        <w:t xml:space="preserve"> canvas viết "Cấp lại quyền gửi", nhưng tài khoản kết nối trước F10 chưa bao giờ cấp quyền gửi, nên chữ là "Cấp quyền gửi"; câu "Trả lời từ Sino sẽ có ở bản sau" không còn đúng khi Sino đã gửi được.</w:t>
+      </w:r>
+    </w:p>
+    <w:p>
+      <w:pPr>
+        <w:pStyle w:val="ListParagraph"/>
+        <w:numPr>
+          <w:ilvl w:val="0"/>
+          <w:numId w:val="1"/>
+        </w:numPr>
+      </w:pPr>
+      <w:r>
+        <w:rPr>
+          <w:b/>
+          <w:bCs/>
+        </w:rPr>
+        <w:t xml:space="preserve">Không cắt người nhận:</w:t>
+      </w:r>
+      <w:r>
+        <w:t xml:space="preserve"> dòng "Tới" xuống dòng thay vì cắt (</w:t>
+      </w:r>
+      <w:r>
+        <w:rPr>
+          <w:rFonts w:ascii="Consolas" w:eastAsia="Consolas" w:hAnsi="Consolas" w:cs="Consolas"/>
+        </w:rPr>
+        <w:t xml:space="preserve">truncate</w:t>
+      </w:r>
+      <w:r>
+        <w:t xml:space="preserve">): Chrome cho thấy hai người nhận ở 390 px bị cắt mất người thứ hai, đúng điều dòng này phải tránh.</w:t>
+      </w:r>
+    </w:p>
+    <w:p>
+      <w:pPr>
+        <w:pStyle w:val="ListParagraph"/>
+        <w:numPr>
+          <w:ilvl w:val="0"/>
+          <w:numId w:val="1"/>
+        </w:numPr>
+      </w:pPr>
+      <w:r>
+        <w:rPr>
+          <w:b/>
+          <w:bCs/>
+        </w:rPr>
+        <w:t xml:space="preserve">Một hàng flex có xuống dòng trên điện thoại:</w:t>
+      </w:r>
+      <w:r>
+        <w:t xml:space="preserve"> ô soạn ở điện thoại là một hàng (kẹp giấy, ô chữ, nút gửi). Dòng "Tới" thêm </w:t>
+      </w:r>
+      <w:r>
+        <w:rPr>
+          <w:rFonts w:ascii="Consolas" w:eastAsia="Consolas" w:hAnsi="Consolas" w:cs="Consolas"/>
+        </w:rPr>
+        <w:t xml:space="preserve">w-full</w:t>
+      </w:r>
+      <w:r>
+        <w:t xml:space="preserve"> và </w:t>
+      </w:r>
+      <w:r>
+        <w:rPr>
+          <w:rFonts w:ascii="Consolas" w:eastAsia="Consolas" w:hAnsi="Consolas" w:cs="Consolas"/>
+        </w:rPr>
+        <w:t xml:space="preserve">order-first</w:t>
+      </w:r>
+      <w:r>
+        <w:t xml:space="preserve">, hàng thêm </w:t>
+      </w:r>
+      <w:r>
+        <w:rPr>
+          <w:rFonts w:ascii="Consolas" w:eastAsia="Consolas" w:hAnsi="Consolas" w:cs="Consolas"/>
+        </w:rPr>
+        <w:t xml:space="preserve">flex-wrap</w:t>
+      </w:r>
+      <w:r>
+        <w:t xml:space="preserve">, nên dòng "Tới" nằm riêng ở trên mà không phải dựng lại bố cục.</w:t>
+      </w:r>
+    </w:p>
+    <w:p>
+      <w:pPr>
+        <w:pStyle w:val="Heading2"/>
+      </w:pPr>
+      <w:r>
         <w:t xml:space="preserve">Tự kiểm tra</w:t>
       </w:r>
     </w:p>
@@ -25720,6 +26021,30 @@
       </w:pPr>
       <w:r>
         <w:t xml:space="preserve">"Lỗi tương đương" trong kiểm tra bằng lỗi gài là gì? Vì sao không cần (và không thể) viết test để bắt nó?</w:t>
+      </w:r>
+    </w:p>
+    <w:p>
+      <w:pPr>
+        <w:pStyle w:val="ListParagraph"/>
+        <w:numPr>
+          <w:ilvl w:val="0"/>
+          <w:numId w:val="100"/>
+        </w:numPr>
+      </w:pPr>
+      <w:r>
+        <w:t xml:space="preserve">Vì sao server không nhận danh sách người nhận từ web khi gửi thư trả lời, dù web đã hiện danh sách đó?</w:t>
+      </w:r>
+    </w:p>
+    <w:p>
+      <w:pPr>
+        <w:pStyle w:val="ListParagraph"/>
+        <w:numPr>
+          <w:ilvl w:val="0"/>
+          <w:numId w:val="100"/>
+        </w:numPr>
+      </w:pPr>
+      <w:r>
+        <w:t xml:space="preserve">Tài khoản Gmail kết nối trước F10 thấy dòng báo nào thay cho ô trả lời, và bấm nút đó thì chuyện gì xảy ra?</w:t>
       </w:r>
     </w:p>
     <w:p/>

</xml_diff>

<commit_message>
feat(fe-62): reply on the API, never twice
Each reply gets a clientMessageId and waits in this browser's outbox
(['outbox', id], outside ['inbox']) as "Đang gửi", then shows as the
server stored it; the conversation's list is read again. A refused
send stays with "Gửi lại" (same ID) and "Bỏ" (DELETE when the server
kept it); an unknown outcome says Sino is checking with Gmail; "not
allowed" reads the detail again so its notice shows; "in progress"
keeps waiting. The outbox is merged with the server's list by ID, so
a refresh from the stream never loses a reply that did not go.

The mutation check caught 15 of 15 after four missing tests were added.

Co-Authored-By: Claude Opus 5.5 (1M context) <noreply@anthropic.com>
</commit_message>
<xml_diff>
--- a/docs/knowledge/phase-1-frontend-foundation.docx
+++ b/docs/knowledge/phase-1-frontend-foundation.docx
@@ -23461,6 +23461,272 @@
     </w:p>
     <w:p>
       <w:pPr>
+        <w:pStyle w:val="Heading3"/>
+      </w:pPr>
+      <w:r>
+        <w:t xml:space="preserve">16.2 Gửi thư trả lời không bao giờ trùng (FE-62, D-131, D-132, D-134)</w:t>
+      </w:r>
+    </w:p>
+    <w:p>
+      <w:r>
+        <w:t xml:space="preserve">Gửi thư là lệnh </w:t>
+      </w:r>
+      <w:r>
+        <w:rPr>
+          <w:b/>
+          <w:bCs/>
+        </w:rPr>
+        <w:t xml:space="preserve">không idempotent</w:t>
+      </w:r>
+      <w:r>
+        <w:t xml:space="preserve">: gọi hai lần là hai thư. Mạng chập chờn khiến trình duyệt không biết lần gửi trước đã tới server chưa, nên "Gửi lại" phải an toàn.</w:t>
+      </w:r>
+    </w:p>
+    <w:p>
+      <w:pPr>
+        <w:shd w:val="clear" w:color="auto" w:fill="F2F3F5"/>
+        <w:ind w:left="0"/>
+      </w:pPr>
+      <w:r>
+        <w:rPr>
+          <w:rFonts w:ascii="Consolas" w:eastAsia="Consolas" w:hAnsi="Consolas" w:cs="Consolas"/>
+          <w:sz w:val="19"/>
+          <w:szCs w:val="19"/>
+        </w:rPr>
+        <w:t xml:space="preserve">bấm Gửi</w:t>
+        <w:br/>
+        <w:t xml:space="preserve">  |  web tạo clientMessageId = UUID, thêm thư "Đang gửi" vào hộp thư đi ['outbox', id]</w:t>
+        <w:br/>
+        <w:t xml:space="preserve">  v</w:t>
+        <w:br/>
+        <w:t xml:space="preserve">POST /api/conversations/c-1/messages { text, clientMessageId }</w:t>
+        <w:br/>
+        <w:t xml:space="preserve">  |-- 201  -&gt; thư như server lưu; đọc lại danh sách thư</w:t>
+        <w:br/>
+        <w:t xml:space="preserve">  |-- 502 SEND_FAILED          -&gt; "Không gửi được" + "Gửi lại" (cùng ID) + "Bỏ" (server đã lưu: DELETE)</w:t>
+        <w:br/>
+        <w:t xml:space="preserve">  |-- 504 SEND_OUTCOME_UNKNOWN -&gt; "Chưa rõ đã gửi chưa": không có nút, server tự đối chiếu với Gmail</w:t>
+        <w:br/>
+        <w:t xml:space="preserve">  |-- 409 REPLY_NOT_ALLOWED    -&gt; đọc lại chi tiết: dòng báo thay ô soạn</w:t>
+        <w:br/>
+        <w:t xml:space="preserve">  |-- 409 SEND_IN_PROGRESS     -&gt; vẫn "Đang gửi": một lần thử trước cùng ID còn đang chạy</w:t>
+        <w:br/>
+        <w:t xml:space="preserve">  '-- mất mạng                 -&gt; "Không gửi được" (chỉ ở trình duyệt này) + "Gửi lại" / "Bỏ"</w:t>
+      </w:r>
+    </w:p>
+    <w:p>
+      <w:pPr>
+        <w:pStyle w:val="ListParagraph"/>
+        <w:numPr>
+          <w:ilvl w:val="0"/>
+          <w:numId w:val="1"/>
+        </w:numPr>
+      </w:pPr>
+      <w:r>
+        <w:rPr>
+          <w:b/>
+          <w:bCs/>
+        </w:rPr>
+        <w:t xml:space="preserve">Khóa idempotency do client tạo:</w:t>
+      </w:r>
+      <w:r>
+        <w:t xml:space="preserve"> cùng một thư thì mọi lần gửi dùng cùng </w:t>
+      </w:r>
+      <w:r>
+        <w:rPr>
+          <w:rFonts w:ascii="Consolas" w:eastAsia="Consolas" w:hAnsi="Consolas" w:cs="Consolas"/>
+        </w:rPr>
+        <w:t xml:space="preserve">clientMessageId</w:t>
+      </w:r>
+      <w:r>
+        <w:t xml:space="preserve">; server thấy ID đã </w:t>
+      </w:r>
+      <w:r>
+        <w:rPr>
+          <w:rFonts w:ascii="Consolas" w:eastAsia="Consolas" w:hAnsi="Consolas" w:cs="Consolas"/>
+        </w:rPr>
+        <w:t xml:space="preserve">SENT</w:t>
+      </w:r>
+      <w:r>
+        <w:t xml:space="preserve"> thì trả lại thư đó chứ không gửi nữa. ID nằm trong body JSON vì </w:t>
+      </w:r>
+      <w:r>
+        <w:rPr>
+          <w:rFonts w:ascii="Consolas" w:eastAsia="Consolas" w:hAnsi="Consolas" w:cs="Consolas"/>
+        </w:rPr>
+        <w:t xml:space="preserve">api</w:t>
+      </w:r>
+      <w:r>
+        <w:t xml:space="preserve"> client chỉ có body cho mỗi request.</w:t>
+      </w:r>
+    </w:p>
+    <w:p>
+      <w:pPr>
+        <w:pStyle w:val="ListParagraph"/>
+        <w:numPr>
+          <w:ilvl w:val="0"/>
+          <w:numId w:val="1"/>
+        </w:numPr>
+      </w:pPr>
+      <w:r>
+        <w:rPr>
+          <w:b/>
+          <w:bCs/>
+        </w:rPr>
+        <w:t xml:space="preserve">Hộp thư đi tách khỏi danh sách của server:</w:t>
+      </w:r>
+      <w:r>
+        <w:t xml:space="preserve"> thư đang gửi hoặc gửi lỗi nằm ở </w:t>
+      </w:r>
+      <w:r>
+        <w:rPr>
+          <w:rFonts w:ascii="Consolas" w:eastAsia="Consolas" w:hAnsi="Consolas" w:cs="Consolas"/>
+        </w:rPr>
+        <w:t xml:space="preserve">['outbox', id]</w:t>
+      </w:r>
+      <w:r>
+        <w:t xml:space="preserve">, ngoài </w:t>
+      </w:r>
+      <w:r>
+        <w:rPr>
+          <w:rFonts w:ascii="Consolas" w:eastAsia="Consolas" w:hAnsi="Consolas" w:cs="Consolas"/>
+        </w:rPr>
+        <w:t xml:space="preserve">['inbox']</w:t>
+      </w:r>
+      <w:r>
+        <w:t xml:space="preserve">. Nếu chèn thẳng vào danh sách thư, mỗi lần realtime đọc lại danh sách (thư mới ở cuộc trò chuyện khác cũng gây ra) sẽ xóa mất thư chưa tới được server, cùng chữ người dùng đã gõ. </w:t>
+      </w:r>
+      <w:r>
+        <w:rPr>
+          <w:rFonts w:ascii="Consolas" w:eastAsia="Consolas" w:hAnsi="Consolas" w:cs="Consolas"/>
+        </w:rPr>
+        <w:t xml:space="preserve">withOutbox</w:t>
+      </w:r>
+      <w:r>
+        <w:t xml:space="preserve"> ghép hai nguồn theo </w:t>
+      </w:r>
+      <w:r>
+        <w:rPr>
+          <w:rFonts w:ascii="Consolas" w:eastAsia="Consolas" w:hAnsi="Consolas" w:cs="Consolas"/>
+        </w:rPr>
+        <w:t xml:space="preserve">clientMessageId</w:t>
+      </w:r>
+      <w:r>
+        <w:t xml:space="preserve">: thư đang gửi lại đứng thay bản của server, thư khác chỉ hiện khi server chưa có bản của nó.</w:t>
+      </w:r>
+    </w:p>
+    <w:p>
+      <w:pPr>
+        <w:pStyle w:val="ListParagraph"/>
+        <w:numPr>
+          <w:ilvl w:val="0"/>
+          <w:numId w:val="1"/>
+        </w:numPr>
+      </w:pPr>
+      <w:r>
+        <w:rPr>
+          <w:rFonts w:ascii="Consolas" w:eastAsia="Consolas" w:hAnsi="Consolas" w:cs="Consolas"/>
+          <w:b/>
+          <w:bCs/>
+        </w:rPr>
+        <w:t xml:space="preserve">local</w:t>
+      </w:r>
+      <w:r>
+        <w:rPr>
+          <w:b/>
+          <w:bCs/>
+        </w:rPr>
+        <w:t xml:space="preserve">:</w:t>
+      </w:r>
+      <w:r>
+        <w:t xml:space="preserve"> thư chỉ có ở trình duyệt này (server chưa bao giờ lưu) thì "Bỏ" chỉ xóa ở web; thư server đã lưu (</w:t>
+      </w:r>
+      <w:r>
+        <w:rPr>
+          <w:rFonts w:ascii="Consolas" w:eastAsia="Consolas" w:hAnsi="Consolas" w:cs="Consolas"/>
+        </w:rPr>
+        <w:t xml:space="preserve">502</w:t>
+      </w:r>
+      <w:r>
+        <w:t xml:space="preserve"> kèm </w:t>
+      </w:r>
+      <w:r>
+        <w:rPr>
+          <w:rFonts w:ascii="Consolas" w:eastAsia="Consolas" w:hAnsi="Consolas" w:cs="Consolas"/>
+        </w:rPr>
+        <w:t xml:space="preserve">messageId</w:t>
+      </w:r>
+      <w:r>
+        <w:t xml:space="preserve">) thì "Bỏ" gọi </w:t>
+      </w:r>
+      <w:r>
+        <w:rPr>
+          <w:rFonts w:ascii="Consolas" w:eastAsia="Consolas" w:hAnsi="Consolas" w:cs="Consolas"/>
+        </w:rPr>
+        <w:t xml:space="preserve">DELETE</w:t>
+      </w:r>
+      <w:r>
+        <w:t xml:space="preserve">.</w:t>
+      </w:r>
+    </w:p>
+    <w:p>
+      <w:pPr>
+        <w:pStyle w:val="ListParagraph"/>
+        <w:numPr>
+          <w:ilvl w:val="0"/>
+          <w:numId w:val="1"/>
+        </w:numPr>
+      </w:pPr>
+      <w:r>
+        <w:rPr>
+          <w:b/>
+          <w:bCs/>
+        </w:rPr>
+        <w:t xml:space="preserve">Mất mạng:</w:t>
+      </w:r>
+      <w:r>
+        <w:t xml:space="preserve"> </w:t>
+      </w:r>
+      <w:r>
+        <w:rPr>
+          <w:rFonts w:ascii="Consolas" w:eastAsia="Consolas" w:hAnsi="Consolas" w:cs="Consolas"/>
+        </w:rPr>
+        <w:t xml:space="preserve">useMutation</w:t>
+      </w:r>
+      <w:r>
+        <w:t xml:space="preserve"> mặc định </w:t>
+      </w:r>
+      <w:r>
+        <w:rPr>
+          <w:rFonts w:ascii="Consolas" w:eastAsia="Consolas" w:hAnsi="Consolas" w:cs="Consolas"/>
+        </w:rPr>
+        <w:t xml:space="preserve">networkMode: 'online'</w:t>
+      </w:r>
+      <w:r>
+        <w:t xml:space="preserve">, nên khi trình duyệt báo mất mạng thì lần gửi chờ, có mạng lại thì tự gửi. Hàng chờ này chỉ nằm trong bộ nhớ của trang.</w:t>
+      </w:r>
+    </w:p>
+    <w:p>
+      <w:pPr>
+        <w:pStyle w:val="ListParagraph"/>
+        <w:numPr>
+          <w:ilvl w:val="0"/>
+          <w:numId w:val="1"/>
+        </w:numPr>
+      </w:pPr>
+      <w:r>
+        <w:rPr>
+          <w:b/>
+          <w:bCs/>
+        </w:rPr>
+        <w:t xml:space="preserve">Bố cục do Chrome tìm ra:</w:t>
+      </w:r>
+      <w:r>
+        <w:t xml:space="preserve"> nhãn "14:05 hôm nay · Chưa rõ đã gửi chưa" cạnh thanh công cụ của thư mới nhất ép tên "Bạn" còn một ký tự, nên trạng thái này xuống dòng dưới nội dung. Thư lỗi bị thư mới hơn gập lại thì dòng gập vẫn ghi "Không gửi được".</w:t>
+      </w:r>
+    </w:p>
+    <w:p>
+      <w:pPr>
         <w:pStyle w:val="Heading2"/>
       </w:pPr>
       <w:r>
@@ -26045,6 +26311,75 @@
       </w:pPr>
       <w:r>
         <w:t xml:space="preserve">Tài khoản Gmail kết nối trước F10 thấy dòng báo nào thay cho ô trả lời, và bấm nút đó thì chuyện gì xảy ra?</w:t>
+      </w:r>
+    </w:p>
+    <w:p>
+      <w:pPr>
+        <w:pStyle w:val="ListParagraph"/>
+        <w:numPr>
+          <w:ilvl w:val="0"/>
+          <w:numId w:val="100"/>
+        </w:numPr>
+      </w:pPr>
+      <w:r>
+        <w:t xml:space="preserve">Vì sao "Gửi lại" dùng lại </w:t>
+      </w:r>
+      <w:r>
+        <w:rPr>
+          <w:rFonts w:ascii="Consolas" w:eastAsia="Consolas" w:hAnsi="Consolas" w:cs="Consolas"/>
+        </w:rPr>
+        <w:t xml:space="preserve">clientMessageId</w:t>
+      </w:r>
+      <w:r>
+        <w:t xml:space="preserve"> cũ mà không tạo ID mới? Nếu tạo ID mới thì trường hợp nào gửi trùng?</w:t>
+      </w:r>
+    </w:p>
+    <w:p>
+      <w:pPr>
+        <w:pStyle w:val="ListParagraph"/>
+        <w:numPr>
+          <w:ilvl w:val="0"/>
+          <w:numId w:val="100"/>
+        </w:numPr>
+      </w:pPr>
+      <w:r>
+        <w:t xml:space="preserve">Vì sao thư đang gửi nằm trong </w:t>
+      </w:r>
+      <w:r>
+        <w:rPr>
+          <w:rFonts w:ascii="Consolas" w:eastAsia="Consolas" w:hAnsi="Consolas" w:cs="Consolas"/>
+        </w:rPr>
+        <w:t xml:space="preserve">['outbox', id]</w:t>
+      </w:r>
+      <w:r>
+        <w:t xml:space="preserve"> mà không chèn vào danh sách thư của server? Sự kiện realtime liên quan gì ở đây?</w:t>
+      </w:r>
+    </w:p>
+    <w:p>
+      <w:pPr>
+        <w:pStyle w:val="ListParagraph"/>
+        <w:numPr>
+          <w:ilvl w:val="0"/>
+          <w:numId w:val="100"/>
+        </w:numPr>
+      </w:pPr>
+      <w:r>
+        <w:rPr>
+          <w:rFonts w:ascii="Consolas" w:eastAsia="Consolas" w:hAnsi="Consolas" w:cs="Consolas"/>
+        </w:rPr>
+        <w:t xml:space="preserve">502 SEND_FAILED</w:t>
+      </w:r>
+      <w:r>
+        <w:t xml:space="preserve"> và </w:t>
+      </w:r>
+      <w:r>
+        <w:rPr>
+          <w:rFonts w:ascii="Consolas" w:eastAsia="Consolas" w:hAnsi="Consolas" w:cs="Consolas"/>
+        </w:rPr>
+        <w:t xml:space="preserve">504 SEND_OUTCOME_UNKNOWN</w:t>
+      </w:r>
+      <w:r>
+        <w:t xml:space="preserve"> khác nhau thế nào với người dùng? Vì sao thư "Chưa rõ" không có nút "Gửi lại"?</w:t>
       </w:r>
     </w:p>
     <w:p/>

</xml_diff>

<commit_message>
fix(fe-58,fe-62): what the review of the thread and reply found
- An email sized by the frame (100vh) made the frame grow forever: the
  frame is measured again after each resize, and the same shortfall
  three times in a row stops it at 640px, scrolling inside (fitFrame);
  very long emails are capped. Pictures load only from Sino's API path;
  meta, base and link are dropped again and links forced to a new tab
  without opener or referrer, while the backend has no cleaning yet.
- A reply could stay "Đang gửi" after the server finished it: the
  browser's copy now stands in only for a failed server copy being sent
  again, the list is read again after every send, and the outbox lets
  go once the server has the message. No answer at all now says "Chưa
  rõ" with a safe "Gửi lại"; no reply box while the list cannot load;
  a refused discard says so.

Co-Authored-By: Claude Opus 5.5 (1M context) <noreply@anthropic.com>
</commit_message>
<xml_diff>
--- a/docs/knowledge/phase-1-frontend-foundation.docx
+++ b/docs/knowledge/phase-1-frontend-foundation.docx
@@ -23727,6 +23727,233 @@
     </w:p>
     <w:p>
       <w:pPr>
+        <w:pStyle w:val="Heading3"/>
+      </w:pPr>
+      <w:r>
+        <w:t xml:space="preserve">16.3 Điều review tìm ra (FE-57…FE-62)</w:t>
+      </w:r>
+    </w:p>
+    <w:p>
+      <w:pPr>
+        <w:pStyle w:val="ListParagraph"/>
+        <w:numPr>
+          <w:ilvl w:val="0"/>
+          <w:numId w:val="1"/>
+        </w:numPr>
+      </w:pPr>
+      <w:r>
+        <w:rPr>
+          <w:rFonts w:ascii="Consolas" w:eastAsia="Consolas" w:hAnsi="Consolas" w:cs="Consolas"/>
+          <w:b/>
+          <w:bCs/>
+        </w:rPr>
+        <w:t xml:space="preserve">vh</w:t>
+      </w:r>
+      <w:r>
+        <w:rPr>
+          <w:b/>
+          <w:bCs/>
+        </w:rPr>
+        <w:t xml:space="preserve"> trong iframe là chiều cao của iframe:</w:t>
+      </w:r>
+      <w:r>
+        <w:t xml:space="preserve"> thư có </w:t>
+      </w:r>
+      <w:r>
+        <w:rPr>
+          <w:rFonts w:ascii="Consolas" w:eastAsia="Consolas" w:hAnsi="Consolas" w:cs="Consolas"/>
+        </w:rPr>
+        <w:t xml:space="preserve">height:100vh</w:t>
+      </w:r>
+      <w:r>
+        <w:t xml:space="preserve"> luôn cao hơn khung đúng phần padding, khung cao theo, thư cao theo, không bao giờ dừng. Đo lại sau mỗi lần đổi chiều cao: thư bình thường cho khoảng thiếu 0, thư </w:t>
+      </w:r>
+      <w:r>
+        <w:rPr>
+          <w:rFonts w:ascii="Consolas" w:eastAsia="Consolas" w:hAnsi="Consolas" w:cs="Consolas"/>
+        </w:rPr>
+        <w:t xml:space="preserve">100vh</w:t>
+      </w:r>
+      <w:r>
+        <w:t xml:space="preserve"> cho cùng một khoảng thiếu lặp lại. Ba lần liền thì dừng (640 px, cuộn bên trong). Logic nằm trong hàm thuần </w:t>
+      </w:r>
+      <w:r>
+        <w:rPr>
+          <w:rFonts w:ascii="Consolas" w:eastAsia="Consolas" w:hAnsi="Consolas" w:cs="Consolas"/>
+        </w:rPr>
+        <w:t xml:space="preserve">fitFrame</w:t>
+      </w:r>
+      <w:r>
+        <w:t xml:space="preserve"> để test được mà không cần trình duyệt.</w:t>
+      </w:r>
+    </w:p>
+    <w:p>
+      <w:pPr>
+        <w:pStyle w:val="ListParagraph"/>
+        <w:numPr>
+          <w:ilvl w:val="0"/>
+          <w:numId w:val="1"/>
+        </w:numPr>
+      </w:pPr>
+      <w:r>
+        <w:rPr>
+          <w:rFonts w:ascii="Consolas" w:eastAsia="Consolas" w:hAnsi="Consolas" w:cs="Consolas"/>
+          <w:b/>
+          <w:bCs/>
+        </w:rPr>
+        <w:t xml:space="preserve">ResizeObserver</w:t>
+      </w:r>
+      <w:r>
+        <w:rPr>
+          <w:b/>
+          <w:bCs/>
+        </w:rPr>
+        <w:t xml:space="preserve"> không thấy mọi thứ:</w:t>
+      </w:r>
+      <w:r>
+        <w:t xml:space="preserve"> nó báo khi phần tử được theo dõi đổi kích thước; khung cao lên mà </w:t>
+      </w:r>
+      <w:r>
+        <w:rPr>
+          <w:rFonts w:ascii="Consolas" w:eastAsia="Consolas" w:hAnsi="Consolas" w:cs="Consolas"/>
+        </w:rPr>
+        <w:t xml:space="preserve">body</w:t>
+      </w:r>
+      <w:r>
+        <w:t xml:space="preserve"> của thư không đổi thì không có lần báo nào, nên phải tự đo thêm một lần (</w:t>
+      </w:r>
+      <w:r>
+        <w:rPr>
+          <w:rFonts w:ascii="Consolas" w:eastAsia="Consolas" w:hAnsi="Consolas" w:cs="Consolas"/>
+        </w:rPr>
+        <w:t xml:space="preserve">requestAnimationFrame</w:t>
+      </w:r>
+      <w:r>
+        <w:t xml:space="preserve">).</w:t>
+      </w:r>
+    </w:p>
+    <w:p>
+      <w:pPr>
+        <w:pStyle w:val="ListParagraph"/>
+        <w:numPr>
+          <w:ilvl w:val="0"/>
+          <w:numId w:val="1"/>
+        </w:numPr>
+      </w:pPr>
+      <w:r>
+        <w:rPr>
+          <w:b/>
+          <w:bCs/>
+        </w:rPr>
+        <w:t xml:space="preserve">Hai nguồn dữ liệu phải có luật thắng rõ ràng:</w:t>
+      </w:r>
+      <w:r>
+        <w:t xml:space="preserve"> hộp thư đi và danh sách của server cùng nói về một thư. Luật cũ "bản đang gửi ở trình duyệt luôn thắng" làm thư kẹt "Đang gửi" khi server tự gửi xong. Luật mới: server thắng, trừ bản </w:t>
+      </w:r>
+      <w:r>
+        <w:rPr>
+          <w:rFonts w:ascii="Consolas" w:eastAsia="Consolas" w:hAnsi="Consolas" w:cs="Consolas"/>
+        </w:rPr>
+        <w:t xml:space="preserve">FAILED</w:t>
+      </w:r>
+      <w:r>
+        <w:t xml:space="preserve"> đang được gửi lại; xong mỗi lần gửi thì đọc lại danh sách và dọn hộp thư đi.</w:t>
+      </w:r>
+    </w:p>
+    <w:p>
+      <w:pPr>
+        <w:pStyle w:val="ListParagraph"/>
+        <w:numPr>
+          <w:ilvl w:val="0"/>
+          <w:numId w:val="1"/>
+        </w:numPr>
+      </w:pPr>
+      <w:r>
+        <w:rPr>
+          <w:b/>
+          <w:bCs/>
+        </w:rPr>
+        <w:t xml:space="preserve">Không có câu trả lời không có nghĩa là không gửi được:</w:t>
+      </w:r>
+      <w:r>
+        <w:t xml:space="preserve"> lỗi mạng có thể xảy ra sau khi server đã nhận. Nói "Không gửi được" thì người dùng có thể gửi lại bằng đường khác và thành hai thư; nói "Chưa rõ" và cho "Gửi lại" (an toàn nhờ </w:t>
+      </w:r>
+      <w:r>
+        <w:rPr>
+          <w:rFonts w:ascii="Consolas" w:eastAsia="Consolas" w:hAnsi="Consolas" w:cs="Consolas"/>
+        </w:rPr>
+        <w:t xml:space="preserve">clientMessageId</w:t>
+      </w:r>
+      <w:r>
+        <w:t xml:space="preserve">).</w:t>
+      </w:r>
+    </w:p>
+    <w:p>
+      <w:pPr>
+        <w:pStyle w:val="ListParagraph"/>
+        <w:numPr>
+          <w:ilvl w:val="0"/>
+          <w:numId w:val="1"/>
+        </w:numPr>
+      </w:pPr>
+      <w:r>
+        <w:rPr>
+          <w:b/>
+          <w:bCs/>
+        </w:rPr>
+        <w:t xml:space="preserve">Phòng thủ nhiều lớp ở web dù backend sẽ lọc:</w:t>
+      </w:r>
+      <w:r>
+        <w:t xml:space="preserve"> gỡ </w:t>
+      </w:r>
+      <w:r>
+        <w:rPr>
+          <w:rFonts w:ascii="Consolas" w:eastAsia="Consolas" w:hAnsi="Consolas" w:cs="Consolas"/>
+        </w:rPr>
+        <w:t xml:space="preserve">meta</w:t>
+      </w:r>
+      <w:r>
+        <w:t xml:space="preserve">/</w:t>
+      </w:r>
+      <w:r>
+        <w:rPr>
+          <w:rFonts w:ascii="Consolas" w:eastAsia="Consolas" w:hAnsi="Consolas" w:cs="Consolas"/>
+        </w:rPr>
+        <w:t xml:space="preserve">base</w:t>
+      </w:r>
+      <w:r>
+        <w:t xml:space="preserve">/</w:t>
+      </w:r>
+      <w:r>
+        <w:rPr>
+          <w:rFonts w:ascii="Consolas" w:eastAsia="Consolas" w:hAnsi="Consolas" w:cs="Consolas"/>
+        </w:rPr>
+        <w:t xml:space="preserve">link</w:t>
+      </w:r>
+      <w:r>
+        <w:t xml:space="preserve"> và ép </w:t>
+      </w:r>
+      <w:r>
+        <w:rPr>
+          <w:rFonts w:ascii="Consolas" w:eastAsia="Consolas" w:hAnsi="Consolas" w:cs="Consolas"/>
+        </w:rPr>
+        <w:t xml:space="preserve">rel</w:t>
+      </w:r>
+      <w:r>
+        <w:t xml:space="preserve"> cho liên kết bằng </w:t>
+      </w:r>
+      <w:r>
+        <w:rPr>
+          <w:rFonts w:ascii="Consolas" w:eastAsia="Consolas" w:hAnsi="Consolas" w:cs="Consolas"/>
+        </w:rPr>
+        <w:t xml:space="preserve">DOMParser</w:t>
+      </w:r>
+      <w:r>
+        <w:t xml:space="preserve"> (tạo tài liệu trơ, không chạy và không tải gì); CSP chỉ cho ảnh từ đường dẫn API của Sino, không phải cả origin.</w:t>
+      </w:r>
+    </w:p>
+    <w:p>
+      <w:pPr>
         <w:pStyle w:val="Heading2"/>
       </w:pPr>
       <w:r>
@@ -26380,6 +26607,57 @@
       </w:r>
       <w:r>
         <w:t xml:space="preserve"> khác nhau thế nào với người dùng? Vì sao thư "Chưa rõ" không có nút "Gửi lại"?</w:t>
+      </w:r>
+    </w:p>
+    <w:p>
+      <w:pPr>
+        <w:pStyle w:val="ListParagraph"/>
+        <w:numPr>
+          <w:ilvl w:val="0"/>
+          <w:numId w:val="100"/>
+        </w:numPr>
+      </w:pPr>
+      <w:r>
+        <w:t xml:space="preserve">Vì sao một thư có </w:t>
+      </w:r>
+      <w:r>
+        <w:rPr>
+          <w:rFonts w:ascii="Consolas" w:eastAsia="Consolas" w:hAnsi="Consolas" w:cs="Consolas"/>
+        </w:rPr>
+        <w:t xml:space="preserve">height:100vh</w:t>
+      </w:r>
+      <w:r>
+        <w:t xml:space="preserve"> làm khung iframe cao lên mãi, và </w:t>
+      </w:r>
+      <w:r>
+        <w:rPr>
+          <w:rFonts w:ascii="Consolas" w:eastAsia="Consolas" w:hAnsi="Consolas" w:cs="Consolas"/>
+        </w:rPr>
+        <w:t xml:space="preserve">fitFrame</w:t>
+      </w:r>
+      <w:r>
+        <w:t xml:space="preserve"> nhận ra điều đó thế nào mà không nhầm với ảnh đang tải?</w:t>
+      </w:r>
+    </w:p>
+    <w:p>
+      <w:pPr>
+        <w:pStyle w:val="ListParagraph"/>
+        <w:numPr>
+          <w:ilvl w:val="0"/>
+          <w:numId w:val="100"/>
+        </w:numPr>
+      </w:pPr>
+      <w:r>
+        <w:t xml:space="preserve">Mất mạng giữa lúc gửi thì vì sao thư hiện "Chưa rõ đã gửi chưa" mà vẫn có "Gửi lại", trong khi </w:t>
+      </w:r>
+      <w:r>
+        <w:rPr>
+          <w:rFonts w:ascii="Consolas" w:eastAsia="Consolas" w:hAnsi="Consolas" w:cs="Consolas"/>
+        </w:rPr>
+        <w:t xml:space="preserve">504</w:t>
+      </w:r>
+      <w:r>
+        <w:t xml:space="preserve"> thì không có?</w:t>
       </w:r>
     </w:p>
     <w:p/>

</xml_diff>

<commit_message>
feat(in-10): name the account of a row when a source has more than one
With two Gmail accounts every row said only "Gmail". A row now names its
account (address) at every width when its source has two or more accounts,
after "Gmail · " from 1280px; a source with one account stays as the canvas
draws it (D-97, chosen by the agent: the canvas has one account per source).

The name line becomes a two-column grid (minmax(0,auto) each), so a long
sender no longer runs over the time and both sides keep part of their text.

Verified: RED then GREEN; headless Chrome at 1440/1024/390; lint, tsc,
541/541 tests, build.

Co-Authored-By: Claude Opus 5.5 (1M context) <noreply@anthropic.com>
</commit_message>
<xml_diff>
--- a/docs/knowledge/phase-1-frontend-foundation.docx
+++ b/docs/knowledge/phase-1-frontend-foundation.docx
@@ -23957,6 +23957,343 @@
         <w:pStyle w:val="Heading2"/>
       </w:pPr>
       <w:r>
+        <w:t xml:space="preserve">17. Dòng thư ghi tài khoản (IN-10, D-97)</w:t>
+      </w:r>
+    </w:p>
+    <w:p>
+      <w:pPr>
+        <w:pStyle w:val="Heading3"/>
+      </w:pPr>
+      <w:r>
+        <w:t xml:space="preserve">17.0 Bức tranh</w:t>
+      </w:r>
+    </w:p>
+    <w:p>
+      <w:r>
+        <w:t xml:space="preserve">Khi chạy thật với hai tài khoản Gmail, người dùng không biết thư nào về tài khoản nào: dòng chỉ ghi "Gmail". Canvas vẽ mỗi nguồn một tài khoản nên không có câu trả lời; agent chốt D-97. Nguồn có từ hai tài khoản trở lên thì dòng ghi địa chỉ của tài khoản, ở mọi cỡ màn. Nguồn chỉ có một tài khoản thì giữ như canvas.</w:t>
+      </w:r>
+    </w:p>
+    <w:p>
+      <w:pPr>
+        <w:shd w:val="clear" w:color="auto" w:fill="F2F3F5"/>
+        <w:ind w:left="0"/>
+      </w:pPr>
+      <w:r>
+        <w:rPr>
+          <w:rFonts w:ascii="Consolas" w:eastAsia="Consolas" w:hAnsi="Consolas" w:cs="Consolas"/>
+          <w:sz w:val="19"/>
+          <w:szCs w:val="19"/>
+        </w:rPr>
+        <w:t xml:space="preserve">1 tài khoản Gmail (như canvas)        2 tài khoản Gmail</w:t>
+        <w:br/>
+        <w:t xml:space="preserve">&gt;= 1280px  Udemy  Gmail                &gt;= 1280px  Udemy  Gmail · tienct07@gmail.com</w:t>
+        <w:br/>
+        <w:t xml:space="preserve">&lt;  1280px  Udemy                       &lt;  1280px  Udemy  tienct07@gmail.com</w:t>
+      </w:r>
+    </w:p>
+    <w:p>
+      <w:pPr>
+        <w:pStyle w:val="Heading3"/>
+      </w:pPr>
+      <w:r>
+        <w:t xml:space="preserve">17.1 Hàm thuần quyết định, component chỉ vẽ</w:t>
+      </w:r>
+    </w:p>
+    <w:p>
+      <w:r>
+        <w:rPr>
+          <w:rFonts w:ascii="Consolas" w:eastAsia="Consolas" w:hAnsi="Consolas" w:cs="Consolas"/>
+        </w:rPr>
+        <w:t xml:space="preserve">rowAccount(item, accounts)</w:t>
+      </w:r>
+      <w:r>
+        <w:t xml:space="preserve"> trong </w:t>
+      </w:r>
+      <w:r>
+        <w:rPr>
+          <w:rFonts w:ascii="Consolas" w:eastAsia="Consolas" w:hAnsi="Consolas" w:cs="Consolas"/>
+        </w:rPr>
+        <w:t xml:space="preserve">format.ts</w:t>
+      </w:r>
+      <w:r>
+        <w:t xml:space="preserve">: lọc các tài khoản cùng </w:t>
+      </w:r>
+      <w:r>
+        <w:rPr>
+          <w:rFonts w:ascii="Consolas" w:eastAsia="Consolas" w:hAnsi="Consolas" w:cs="Consolas"/>
+        </w:rPr>
+        <w:t xml:space="preserve">provider</w:t>
+      </w:r>
+      <w:r>
+        <w:t xml:space="preserve"> với dòng; có từ hai trở lên thì trả tài khoản có </w:t>
+      </w:r>
+      <w:r>
+        <w:rPr>
+          <w:rFonts w:ascii="Consolas" w:eastAsia="Consolas" w:hAnsi="Consolas" w:cs="Consolas"/>
+        </w:rPr>
+        <w:t xml:space="preserve">id === item.accountId</w:t>
+      </w:r>
+      <w:r>
+        <w:t xml:space="preserve">, không thì </w:t>
+      </w:r>
+      <w:r>
+        <w:rPr>
+          <w:rFonts w:ascii="Consolas" w:eastAsia="Consolas" w:hAnsi="Consolas" w:cs="Consolas"/>
+        </w:rPr>
+        <w:t xml:space="preserve">null</w:t>
+      </w:r>
+      <w:r>
+        <w:t xml:space="preserve">. Hàm nhận một kiểu chung </w:t>
+      </w:r>
+      <w:r>
+        <w:rPr>
+          <w:rFonts w:ascii="Consolas" w:eastAsia="Consolas" w:hAnsi="Consolas" w:cs="Consolas"/>
+        </w:rPr>
+        <w:t xml:space="preserve">A extends { id; provider }</w:t>
+      </w:r>
+      <w:r>
+        <w:t xml:space="preserve"> và trả lại đúng kiểu đó, nên test truyền object nhỏ còn màn truyền </w:t>
+      </w:r>
+      <w:r>
+        <w:rPr>
+          <w:rFonts w:ascii="Consolas" w:eastAsia="Consolas" w:hAnsi="Consolas" w:cs="Consolas"/>
+        </w:rPr>
+        <w:t xml:space="preserve">InboxAccount</w:t>
+      </w:r>
+      <w:r>
+        <w:t xml:space="preserve"> mà không phải ép kiểu. Danh sách tài khoản đã có sẵn trong khung Hộp thư (</w:t>
+      </w:r>
+      <w:r>
+        <w:rPr>
+          <w:rFonts w:ascii="Consolas" w:eastAsia="Consolas" w:hAnsi="Consolas" w:cs="Consolas"/>
+        </w:rPr>
+        <w:t xml:space="preserve">GET /api/accounts</w:t>
+      </w:r>
+      <w:r>
+        <w:t xml:space="preserve">), nên không cần gọi API mới hay đổi backend.</w:t>
+      </w:r>
+    </w:p>
+    <w:p>
+      <w:pPr>
+        <w:pStyle w:val="Heading3"/>
+      </w:pPr>
+      <w:r>
+        <w:t xml:space="preserve">17.2 Hai cột chia đều bằng CSS Grid</w:t>
+      </w:r>
+    </w:p>
+    <w:p>
+      <w:r>
+        <w:t xml:space="preserve">Tên người gửi trước đây là </w:t>
+      </w:r>
+      <w:r>
+        <w:rPr>
+          <w:rFonts w:ascii="Consolas" w:eastAsia="Consolas" w:hAnsi="Consolas" w:cs="Consolas"/>
+        </w:rPr>
+        <w:t xml:space="preserve">whitespace-nowrap</w:t>
+      </w:r>
+      <w:r>
+        <w:t xml:space="preserve"> và không bao giờ co. Chrome ở 1024px cho thấy hai lỗi: tên "Indeed Job Alerts Vietnam Team" đè lên giờ, và chữ tài khoản bị ép còn rộng 0. Flexbox co các phần tử theo tỷ lệ độ rộng của chúng, nên tên ngắn cũng bị cắt một chút mỗi khi chữ bên cạnh dài. Grid với hai cột </w:t>
+      </w:r>
+      <w:r>
+        <w:rPr>
+          <w:rFonts w:ascii="Consolas" w:eastAsia="Consolas" w:hAnsi="Consolas" w:cs="Consolas"/>
+        </w:rPr>
+        <w:t xml:space="preserve">minmax(0, auto)</w:t>
+      </w:r>
+      <w:r>
+        <w:t xml:space="preserve"> làm đúng điều mình cần:</w:t>
+      </w:r>
+    </w:p>
+    <w:p>
+      <w:pPr>
+        <w:shd w:val="clear" w:color="auto" w:fill="F2F3F5"/>
+        <w:ind w:left="0"/>
+      </w:pPr>
+      <w:r>
+        <w:rPr>
+          <w:rFonts w:ascii="Consolas" w:eastAsia="Consolas" w:hAnsi="Consolas" w:cs="Consolas"/>
+          <w:sz w:val="19"/>
+          <w:szCs w:val="19"/>
+        </w:rPr>
+        <w:t xml:space="preserve">cột:   minmax(0, auto)       minmax(0, auto)      (justify-content: start)</w:t>
+        <w:br/>
+        <w:t xml:space="preserve">       gốc 0, tối đa = độ rộng chữ của nó</w:t>
+        <w:br/>
+        <w:br/>
+        <w:t xml:space="preserve">Udemy | tienct07@gmail.com       tên ngắn lấy đủ, phần còn lại cho địa chỉ</w:t>
+        <w:br/>
+        <w:t xml:space="preserve">Indeed Jo... | tienct07@gm...    cả hai dài: chia đều, mỗi bên tự cắt "..."</w:t>
+      </w:r>
+    </w:p>
+    <w:p>
+      <w:r>
+        <w:t xml:space="preserve">Trình duyệt chia chỗ trống </w:t>
+      </w:r>
+      <w:r>
+        <w:rPr>
+          <w:b/>
+          <w:bCs/>
+        </w:rPr>
+        <w:t xml:space="preserve">đều</w:t>
+      </w:r>
+      <w:r>
+        <w:t xml:space="preserve"> cho các cột </w:t>
+      </w:r>
+      <w:r>
+        <w:rPr>
+          <w:rFonts w:ascii="Consolas" w:eastAsia="Consolas" w:hAnsi="Consolas" w:cs="Consolas"/>
+        </w:rPr>
+        <w:t xml:space="preserve">auto</w:t>
+      </w:r>
+      <w:r>
+        <w:t xml:space="preserve">, và một cột dừng lại khi đã đủ chỗ cho chữ của nó. </w:t>
+      </w:r>
+      <w:r>
+        <w:rPr>
+          <w:rFonts w:ascii="Consolas" w:eastAsia="Consolas" w:hAnsi="Consolas" w:cs="Consolas"/>
+        </w:rPr>
+        <w:t xml:space="preserve">justify-start</w:t>
+      </w:r>
+      <w:r>
+        <w:t xml:space="preserve"> giữ phần thừa ở cuối hàng (mặc định </w:t>
+      </w:r>
+      <w:r>
+        <w:rPr>
+          <w:rFonts w:ascii="Consolas" w:eastAsia="Consolas" w:hAnsi="Consolas" w:cs="Consolas"/>
+        </w:rPr>
+        <w:t xml:space="preserve">normal</w:t>
+      </w:r>
+      <w:r>
+        <w:t xml:space="preserve"> sẽ kéo giãn các cột </w:t>
+      </w:r>
+      <w:r>
+        <w:rPr>
+          <w:rFonts w:ascii="Consolas" w:eastAsia="Consolas" w:hAnsi="Consolas" w:cs="Consolas"/>
+        </w:rPr>
+        <w:t xml:space="preserve">auto</w:t>
+      </w:r>
+      <w:r>
+        <w:t xml:space="preserve">). Mỗi ô là </w:t>
+      </w:r>
+      <w:r>
+        <w:rPr>
+          <w:rFonts w:ascii="Consolas" w:eastAsia="Consolas" w:hAnsi="Consolas" w:cs="Consolas"/>
+        </w:rPr>
+        <w:t xml:space="preserve">truncate</w:t>
+      </w:r>
+      <w:r>
+        <w:t xml:space="preserve"> (</w:t>
+      </w:r>
+      <w:r>
+        <w:rPr>
+          <w:rFonts w:ascii="Consolas" w:eastAsia="Consolas" w:hAnsi="Consolas" w:cs="Consolas"/>
+        </w:rPr>
+        <w:t xml:space="preserve">overflow: hidden</w:t>
+      </w:r>
+      <w:r>
+        <w:t xml:space="preserve">, </w:t>
+      </w:r>
+      <w:r>
+        <w:rPr>
+          <w:rFonts w:ascii="Consolas" w:eastAsia="Consolas" w:hAnsi="Consolas" w:cs="Consolas"/>
+        </w:rPr>
+        <w:t xml:space="preserve">text-overflow: ellipsis</w:t>
+      </w:r>
+      <w:r>
+        <w:t xml:space="preserve">, </w:t>
+      </w:r>
+      <w:r>
+        <w:rPr>
+          <w:rFonts w:ascii="Consolas" w:eastAsia="Consolas" w:hAnsi="Consolas" w:cs="Consolas"/>
+        </w:rPr>
+        <w:t xml:space="preserve">white-space: nowrap</w:t>
+      </w:r>
+      <w:r>
+        <w:t xml:space="preserve">).</w:t>
+      </w:r>
+    </w:p>
+    <w:p>
+      <w:pPr>
+        <w:pStyle w:val="Heading3"/>
+      </w:pPr>
+      <w:r>
+        <w:t xml:space="preserve">17.3 Chữ ẩn theo cỡ màn và test</w:t>
+      </w:r>
+    </w:p>
+    <w:p>
+      <w:r>
+        <w:t xml:space="preserve">Tiền tố "Gmail · " là một </w:t>
+      </w:r>
+      <w:r>
+        <w:rPr>
+          <w:rFonts w:ascii="Consolas" w:eastAsia="Consolas" w:hAnsi="Consolas" w:cs="Consolas"/>
+        </w:rPr>
+        <w:t xml:space="preserve">span</w:t>
+      </w:r>
+      <w:r>
+        <w:t xml:space="preserve"> riêng có </w:t>
+      </w:r>
+      <w:r>
+        <w:rPr>
+          <w:rFonts w:ascii="Consolas" w:eastAsia="Consolas" w:hAnsi="Consolas" w:cs="Consolas"/>
+        </w:rPr>
+        <w:t xml:space="preserve">hidden xl:inline</w:t>
+      </w:r>
+      <w:r>
+        <w:t xml:space="preserve">. jsdom không chạy CSS, nên test kiểm class chứ không kiểm "có thấy không"; chuyện thấy hay không do Chrome thật đo (</w:t>
+      </w:r>
+      <w:r>
+        <w:rPr>
+          <w:rFonts w:ascii="Consolas" w:eastAsia="Consolas" w:hAnsi="Consolas" w:cs="Consolas"/>
+        </w:rPr>
+        <w:t xml:space="preserve">getComputedStyle(...).display</w:t>
+      </w:r>
+      <w:r>
+        <w:t xml:space="preserve">, độ rộng khác 0). </w:t>
+      </w:r>
+      <w:r>
+        <w:rPr>
+          <w:rFonts w:ascii="Consolas" w:eastAsia="Consolas" w:hAnsi="Consolas" w:cs="Consolas"/>
+        </w:rPr>
+        <w:t xml:space="preserve">getByText</w:t>
+      </w:r>
+      <w:r>
+        <w:t xml:space="preserve"> của Testing Library chỉ so chữ của các nút text </w:t>
+      </w:r>
+      <w:r>
+        <w:rPr>
+          <w:b/>
+          <w:bCs/>
+        </w:rPr>
+        <w:t xml:space="preserve">trực tiếp</w:t>
+      </w:r>
+      <w:r>
+        <w:t xml:space="preserve"> trong phần tử, nên </w:t>
+      </w:r>
+      <w:r>
+        <w:rPr>
+          <w:rFonts w:ascii="Consolas" w:eastAsia="Consolas" w:hAnsi="Consolas" w:cs="Consolas"/>
+        </w:rPr>
+        <w:t xml:space="preserve">getByText('an@congty.vn')</w:t>
+      </w:r>
+      <w:r>
+        <w:t xml:space="preserve"> tìm được thẻ ngoài, còn </w:t>
+      </w:r>
+      <w:r>
+        <w:rPr>
+          <w:rFonts w:ascii="Consolas" w:eastAsia="Consolas" w:hAnsi="Consolas" w:cs="Consolas"/>
+        </w:rPr>
+        <w:t xml:space="preserve">toHaveTextContent('Gmail · an@congty.vn')</w:t>
+      </w:r>
+      <w:r>
+        <w:t xml:space="preserve"> kiểm cả chữ của thẻ con.</w:t>
+      </w:r>
+    </w:p>
+    <w:p>
+      <w:pPr>
+        <w:pStyle w:val="Heading2"/>
+      </w:pPr>
+      <w:r>
         <w:t xml:space="preserve">Tự kiểm tra</w:t>
       </w:r>
     </w:p>
@@ -26658,6 +26995,48 @@
       </w:r>
       <w:r>
         <w:t xml:space="preserve"> thì không có?</w:t>
+      </w:r>
+    </w:p>
+    <w:p>
+      <w:pPr>
+        <w:pStyle w:val="ListParagraph"/>
+        <w:numPr>
+          <w:ilvl w:val="0"/>
+          <w:numId w:val="100"/>
+        </w:numPr>
+      </w:pPr>
+      <w:r>
+        <w:t xml:space="preserve">Hai phần tử flex cùng co (</w:t>
+      </w:r>
+      <w:r>
+        <w:rPr>
+          <w:rFonts w:ascii="Consolas" w:eastAsia="Consolas" w:hAnsi="Consolas" w:cs="Consolas"/>
+        </w:rPr>
+        <w:t xml:space="preserve">flex-shrink: 1</w:t>
+      </w:r>
+      <w:r>
+        <w:t xml:space="preserve">) chia phần thiếu theo tỷ lệ nào? Vì sao điều đó cắt cả tên ngắn, còn lưới hai cột </w:t>
+      </w:r>
+      <w:r>
+        <w:rPr>
+          <w:rFonts w:ascii="Consolas" w:eastAsia="Consolas" w:hAnsi="Consolas" w:cs="Consolas"/>
+        </w:rPr>
+        <w:t xml:space="preserve">minmax(0, auto)</w:t>
+      </w:r>
+      <w:r>
+        <w:t xml:space="preserve"> thì không?</w:t>
+      </w:r>
+    </w:p>
+    <w:p>
+      <w:pPr>
+        <w:pStyle w:val="ListParagraph"/>
+        <w:numPr>
+          <w:ilvl w:val="0"/>
+          <w:numId w:val="100"/>
+        </w:numPr>
+      </w:pPr>
+      <w:r>
+        <w:t xml:space="preserve">Vì sao dòng thư chỉ ghi tài khoản khi nguồn có từ hai tài khoản trở lên? Dưới 1280px vì sao bỏ chữ "Gmail · "?</w:t>
       </w:r>
     </w:p>
     <w:p/>

</xml_diff>

<commit_message>
feat(fe-80): rows and thread headers name every account of a merged thread
ConversationItem gets accountIds (every account holding the thread, the
primary copy first; f05b D-182). The adapter fills [accountId] while the
API has no such field yet, so the web runs before and after BE-81.
Rows list every account's address when the source has more than one;
the thread header lists them too, with the mark kept beside the source
so two addresses wrap next to it instead of pushing it to its own line.

Verified: RED then GREEN; headless Chrome at 1440/1024/390; lint, tsc,
557/557 tests, build.

Co-Authored-By: Claude Opus 5.5 (1M context) <noreply@anthropic.com>
</commit_message>
<xml_diff>
--- a/docs/knowledge/phase-1-frontend-foundation.docx
+++ b/docs/knowledge/phase-1-frontend-foundation.docx
@@ -24294,6 +24294,351 @@
         <w:pStyle w:val="Heading2"/>
       </w:pPr>
       <w:r>
+        <w:t xml:space="preserve">18. Một chuỗi ở nhiều tài khoản là một dòng (f05b, phía web)</w:t>
+      </w:r>
+    </w:p>
+    <w:p>
+      <w:pPr>
+        <w:pStyle w:val="Heading3"/>
+      </w:pPr>
+      <w:r>
+        <w:t xml:space="preserve">18.0 Bức tranh</w:t>
+      </w:r>
+    </w:p>
+    <w:p>
+      <w:r>
+        <w:t xml:space="preserve">Hai tài khoản Gmail của cùng một người gửi thư qua lại: mỗi hộp thư giữ một bản của chuỗi, Gmail cho mỗi hộp thư một mã thread riêng, nên Hộp thư hiện hai dòng. Hai bản có chung </w:t>
+      </w:r>
+      <w:r>
+        <w:rPr>
+          <w:rFonts w:ascii="Consolas" w:eastAsia="Consolas" w:hAnsi="Consolas" w:cs="Consolas"/>
+        </w:rPr>
+        <w:t xml:space="preserve">Message-ID</w:t>
+      </w:r>
+      <w:r>
+        <w:t xml:space="preserve"> của từng thư (RFC 5322), nên backend gom chúng thành một </w:t>
+      </w:r>
+      <w:r>
+        <w:rPr>
+          <w:b/>
+          <w:bCs/>
+        </w:rPr>
+        <w:t xml:space="preserve">nhóm</w:t>
+      </w:r>
+      <w:r>
+        <w:t xml:space="preserve"> (change </w:t>
+      </w:r>
+      <w:r>
+        <w:rPr>
+          <w:rFonts w:ascii="Consolas" w:eastAsia="Consolas" w:hAnsi="Consolas" w:cs="Consolas"/>
+        </w:rPr>
+        <w:t xml:space="preserve">f05b-merged-threads</w:t>
+      </w:r>
+      <w:r>
+        <w:t xml:space="preserve">, D-180…D-187). Web nhận một dòng cho mỗi nhóm, kèm danh sách tài khoản.</w:t>
+      </w:r>
+    </w:p>
+    <w:p>
+      <w:pPr>
+        <w:shd w:val="clear" w:color="auto" w:fill="F2F3F5"/>
+        <w:ind w:left="0"/>
+      </w:pPr>
+      <w:r>
+        <w:rPr>
+          <w:rFonts w:ascii="Consolas" w:eastAsia="Consolas" w:hAnsi="Consolas" w:cs="Consolas"/>
+          <w:sz w:val="19"/>
+          <w:szCs w:val="19"/>
+        </w:rPr>
+        <w:t xml:space="preserve">hộp thư tienct07          hộp thư bonzed2001          Hộp thư của Sino</w:t>
+        <w:br/>
+        <w:t xml:space="preserve">thread 1a12fae4...        thread 1a12fadf...</w:t>
+        <w:br/>
+        <w:t xml:space="preserve">  Helllo     &lt;A1@...&gt;       Helllo     &lt;A1@...&gt;   -&gt;   1 dòng: Sinon sama</w:t>
+        <w:br/>
+        <w:t xml:space="preserve">  xin chào   &lt;B2@...&gt;       xin chào   &lt;B2@...&gt;        Gmail · tienct07@gmail.com, bonzed2001@gmail.com</w:t>
+        <w:br/>
+        <w:t xml:space="preserve">  hello      &lt;C3@...&gt;       hello      &lt;C3@...&gt;        accountIds = [tienct07 (bản chính), bonzed2001]</w:t>
+      </w:r>
+    </w:p>
+    <w:p>
+      <w:pPr>
+        <w:pStyle w:val="Heading3"/>
+      </w:pPr>
+      <w:r>
+        <w:t xml:space="preserve">18.1 Đổi hợp đồng mà không làm vỡ API cũ (FE-80)</w:t>
+      </w:r>
+    </w:p>
+    <w:p>
+      <w:pPr>
+        <w:pStyle w:val="ListParagraph"/>
+        <w:numPr>
+          <w:ilvl w:val="0"/>
+          <w:numId w:val="1"/>
+        </w:numPr>
+      </w:pPr>
+      <w:r>
+        <w:rPr>
+          <w:rFonts w:ascii="Consolas" w:eastAsia="Consolas" w:hAnsi="Consolas" w:cs="Consolas"/>
+        </w:rPr>
+        <w:t xml:space="preserve">ConversationItem</w:t>
+      </w:r>
+      <w:r>
+        <w:t xml:space="preserve"> thêm </w:t>
+      </w:r>
+      <w:r>
+        <w:rPr>
+          <w:rFonts w:ascii="Consolas" w:eastAsia="Consolas" w:hAnsi="Consolas" w:cs="Consolas"/>
+        </w:rPr>
+        <w:t xml:space="preserve">accountIds: string[]</w:t>
+      </w:r>
+      <w:r>
+        <w:t xml:space="preserve">, bắt buộc trong kiểu của màn hình, để mọi chỗ dùng không phải hỏi "có hay không".</w:t>
+      </w:r>
+    </w:p>
+    <w:p>
+      <w:pPr>
+        <w:pStyle w:val="ListParagraph"/>
+        <w:numPr>
+          <w:ilvl w:val="0"/>
+          <w:numId w:val="1"/>
+        </w:numPr>
+      </w:pPr>
+      <w:r>
+        <w:t xml:space="preserve">Ở kiểu của API (</w:t>
+      </w:r>
+      <w:r>
+        <w:rPr>
+          <w:rFonts w:ascii="Consolas" w:eastAsia="Consolas" w:hAnsi="Consolas" w:cs="Consolas"/>
+        </w:rPr>
+        <w:t xml:space="preserve">ConversationResponse</w:t>
+      </w:r>
+      <w:r>
+        <w:t xml:space="preserve">) trường này là </w:t>
+      </w:r>
+      <w:r>
+        <w:rPr>
+          <w:rFonts w:ascii="Consolas" w:eastAsia="Consolas" w:hAnsi="Consolas" w:cs="Consolas"/>
+        </w:rPr>
+        <w:t xml:space="preserve">accountIds?</w:t>
+      </w:r>
+      <w:r>
+        <w:t xml:space="preserve">. Adapter </w:t>
+      </w:r>
+      <w:r>
+        <w:rPr>
+          <w:rFonts w:ascii="Consolas" w:eastAsia="Consolas" w:hAnsi="Consolas" w:cs="Consolas"/>
+        </w:rPr>
+        <w:t xml:space="preserve">toItem</w:t>
+      </w:r>
+      <w:r>
+        <w:t xml:space="preserve"> điền </w:t>
+      </w:r>
+      <w:r>
+        <w:rPr>
+          <w:rFonts w:ascii="Consolas" w:eastAsia="Consolas" w:hAnsi="Consolas" w:cs="Consolas"/>
+        </w:rPr>
+        <w:t xml:space="preserve">[accountId]</w:t>
+      </w:r>
+      <w:r>
+        <w:t xml:space="preserve"> khi backend chưa có (D-56: thứ API thiếu thì điền ở </w:t>
+      </w:r>
+      <w:r>
+        <w:rPr>
+          <w:rFonts w:ascii="Consolas" w:eastAsia="Consolas" w:hAnsi="Consolas" w:cs="Consolas"/>
+        </w:rPr>
+        <w:t xml:space="preserve">*.api.ts</w:t>
+      </w:r>
+      <w:r>
+        <w:t xml:space="preserve">, màn hình không biết). Nhờ vậy web chạy được cả trước và sau khi phiên backend làm xong BE-81.</w:t>
+      </w:r>
+    </w:p>
+    <w:p>
+      <w:pPr>
+        <w:pStyle w:val="ListParagraph"/>
+        <w:numPr>
+          <w:ilvl w:val="0"/>
+          <w:numId w:val="1"/>
+        </w:numPr>
+      </w:pPr>
+      <w:r>
+        <w:t xml:space="preserve">Dữ liệu mẫu khai báo các dòng không có </w:t>
+      </w:r>
+      <w:r>
+        <w:rPr>
+          <w:rFonts w:ascii="Consolas" w:eastAsia="Consolas" w:hAnsi="Consolas" w:cs="Consolas"/>
+        </w:rPr>
+        <w:t xml:space="preserve">accountIds</w:t>
+      </w:r>
+      <w:r>
+        <w:t xml:space="preserve"> (</w:t>
+      </w:r>
+      <w:r>
+        <w:rPr>
+          <w:rFonts w:ascii="Consolas" w:eastAsia="Consolas" w:hAnsi="Consolas" w:cs="Consolas"/>
+        </w:rPr>
+        <w:t xml:space="preserve">Omit&lt;ConversationItem, 'accountIds'&gt;[]</w:t>
+      </w:r>
+      <w:r>
+        <w:t xml:space="preserve">) rồi </w:t>
+      </w:r>
+      <w:r>
+        <w:rPr>
+          <w:rFonts w:ascii="Consolas" w:eastAsia="Consolas" w:hAnsi="Consolas" w:cs="Consolas"/>
+        </w:rPr>
+        <w:t xml:space="preserve">map</w:t>
+      </w:r>
+      <w:r>
+        <w:t xml:space="preserve"> thêm một lần, thay vì sửa từng object.</w:t>
+      </w:r>
+    </w:p>
+    <w:p>
+      <w:pPr>
+        <w:pStyle w:val="ListParagraph"/>
+        <w:numPr>
+          <w:ilvl w:val="0"/>
+          <w:numId w:val="1"/>
+        </w:numPr>
+      </w:pPr>
+      <w:r>
+        <w:t xml:space="preserve">Một test cũ (IN-10) chỉ đổi </w:t>
+      </w:r>
+      <w:r>
+        <w:rPr>
+          <w:rFonts w:ascii="Consolas" w:eastAsia="Consolas" w:hAnsi="Consolas" w:cs="Consolas"/>
+        </w:rPr>
+        <w:t xml:space="preserve">accountId</w:t>
+      </w:r>
+      <w:r>
+        <w:t xml:space="preserve"> mà không đổi </w:t>
+      </w:r>
+      <w:r>
+        <w:rPr>
+          <w:rFonts w:ascii="Consolas" w:eastAsia="Consolas" w:hAnsi="Consolas" w:cs="Consolas"/>
+        </w:rPr>
+        <w:t xml:space="preserve">accountIds</w:t>
+      </w:r>
+      <w:r>
+        <w:t xml:space="preserve"> thì đỏ. Đó là dữ liệu test sai hợp đồng mới (tài khoản của bản chính phải đứng đầu </w:t>
+      </w:r>
+      <w:r>
+        <w:rPr>
+          <w:rFonts w:ascii="Consolas" w:eastAsia="Consolas" w:hAnsi="Consolas" w:cs="Consolas"/>
+        </w:rPr>
+        <w:t xml:space="preserve">accountIds</w:t>
+      </w:r>
+      <w:r>
+        <w:t xml:space="preserve">), nên sửa dữ liệu chứ không sửa code.</w:t>
+      </w:r>
+    </w:p>
+    <w:p>
+      <w:pPr>
+        <w:pStyle w:val="Heading3"/>
+      </w:pPr>
+      <w:r>
+        <w:t xml:space="preserve">18.2 </w:t>
+      </w:r>
+      <w:r>
+        <w:rPr>
+          <w:rFonts w:ascii="Consolas" w:eastAsia="Consolas" w:hAnsi="Consolas" w:cs="Consolas"/>
+        </w:rPr>
+        <w:t xml:space="preserve">flatMap</w:t>
+      </w:r>
+      <w:r>
+        <w:t xml:space="preserve"> để giữ thứ tự và bỏ cái không tìm thấy</w:t>
+      </w:r>
+    </w:p>
+    <w:p>
+      <w:r>
+        <w:rPr>
+          <w:rFonts w:ascii="Consolas" w:eastAsia="Consolas" w:hAnsi="Consolas" w:cs="Consolas"/>
+        </w:rPr>
+        <w:t xml:space="preserve">rowAccounts(item, accounts)</w:t>
+      </w:r>
+      <w:r>
+        <w:t xml:space="preserve"> đi theo </w:t>
+      </w:r>
+      <w:r>
+        <w:rPr>
+          <w:rFonts w:ascii="Consolas" w:eastAsia="Consolas" w:hAnsi="Consolas" w:cs="Consolas"/>
+        </w:rPr>
+        <w:t xml:space="preserve">item.accountIds</w:t>
+      </w:r>
+      <w:r>
+        <w:t xml:space="preserve"> (bản chính trước) chứ không theo danh sách tài khoản, rồi </w:t>
+      </w:r>
+      <w:r>
+        <w:rPr>
+          <w:rFonts w:ascii="Consolas" w:eastAsia="Consolas" w:hAnsi="Consolas" w:cs="Consolas"/>
+        </w:rPr>
+        <w:t xml:space="preserve">flatMap</w:t>
+      </w:r>
+      <w:r>
+        <w:t xml:space="preserve"> mỗi mã ra 0 hoặc 1 tài khoản. Tài khoản đã gỡ khỏi danh sách tự rơi ra, không cần </w:t>
+      </w:r>
+      <w:r>
+        <w:rPr>
+          <w:rFonts w:ascii="Consolas" w:eastAsia="Consolas" w:hAnsi="Consolas" w:cs="Consolas"/>
+        </w:rPr>
+        <w:t xml:space="preserve">filter(Boolean)</w:t>
+      </w:r>
+      <w:r>
+        <w:t xml:space="preserve"> và ép kiểu.</w:t>
+      </w:r>
+    </w:p>
+    <w:p>
+      <w:pPr>
+        <w:pStyle w:val="Heading3"/>
+      </w:pPr>
+      <w:r>
+        <w:t xml:space="preserve">18.3 Một cụm không xuống dòng trong một hàng có xuống dòng</w:t>
+      </w:r>
+    </w:p>
+    <w:p>
+      <w:r>
+        <w:t xml:space="preserve">Đầu chuỗi là hàng </w:t>
+      </w:r>
+      <w:r>
+        <w:rPr>
+          <w:rFonts w:ascii="Consolas" w:eastAsia="Consolas" w:hAnsi="Consolas" w:cs="Consolas"/>
+        </w:rPr>
+        <w:t xml:space="preserve">flex-wrap</w:t>
+      </w:r>
+      <w:r>
+        <w:t xml:space="preserve">: icon, chữ nguồn, số thư. Khi chữ nguồn dài (hai địa chỉ), </w:t>
+      </w:r>
+      <w:r>
+        <w:rPr>
+          <w:rFonts w:ascii="Consolas" w:eastAsia="Consolas" w:hAnsi="Consolas" w:cs="Consolas"/>
+        </w:rPr>
+        <w:t xml:space="preserve">flex-wrap</w:t>
+      </w:r>
+      <w:r>
+        <w:t xml:space="preserve"> đẩy icon lên một dòng riêng. Gộp icon và chữ vào một cụm </w:t>
+      </w:r>
+      <w:r>
+        <w:rPr>
+          <w:rFonts w:ascii="Consolas" w:eastAsia="Consolas" w:hAnsi="Consolas" w:cs="Consolas"/>
+        </w:rPr>
+        <w:t xml:space="preserve">flex items-start</w:t>
+      </w:r>
+      <w:r>
+        <w:t xml:space="preserve"> không xuống dòng (</w:t>
+      </w:r>
+      <w:r>
+        <w:rPr>
+          <w:rFonts w:ascii="Consolas" w:eastAsia="Consolas" w:hAnsi="Consolas" w:cs="Consolas"/>
+        </w:rPr>
+        <w:t xml:space="preserve">min-w-0</w:t>
+      </w:r>
+      <w:r>
+        <w:t xml:space="preserve"> cho chữ) thì chữ tự xuống dòng ngay cạnh icon, còn số thư vẫn được xuống hàng như cũ.</w:t>
+      </w:r>
+    </w:p>
+    <w:p>
+      <w:pPr>
+        <w:pStyle w:val="Heading2"/>
+      </w:pPr>
+      <w:r>
         <w:t xml:space="preserve">Tự kiểm tra</w:t>
       </w:r>
     </w:p>
@@ -27037,6 +27382,39 @@
       </w:pPr>
       <w:r>
         <w:t xml:space="preserve">Vì sao dòng thư chỉ ghi tài khoản khi nguồn có từ hai tài khoản trở lên? Dưới 1280px vì sao bỏ chữ "Gmail · "?</w:t>
+      </w:r>
+    </w:p>
+    <w:p>
+      <w:pPr>
+        <w:pStyle w:val="ListParagraph"/>
+        <w:numPr>
+          <w:ilvl w:val="0"/>
+          <w:numId w:val="100"/>
+        </w:numPr>
+      </w:pPr>
+      <w:r>
+        <w:t xml:space="preserve">Vì sao </w:t>
+      </w:r>
+      <w:r>
+        <w:rPr>
+          <w:rFonts w:ascii="Consolas" w:eastAsia="Consolas" w:hAnsi="Consolas" w:cs="Consolas"/>
+        </w:rPr>
+        <w:t xml:space="preserve">accountIds</w:t>
+      </w:r>
+      <w:r>
+        <w:t xml:space="preserve"> bắt buộc trong kiểu của màn hình nhưng không bắt buộc trong kiểu của API? Ai điền nó khi backend chưa có?</w:t>
+      </w:r>
+    </w:p>
+    <w:p>
+      <w:pPr>
+        <w:pStyle w:val="ListParagraph"/>
+        <w:numPr>
+          <w:ilvl w:val="0"/>
+          <w:numId w:val="100"/>
+        </w:numPr>
+      </w:pPr>
+      <w:r>
+        <w:t xml:space="preserve">Hai bản của một chuỗi ở hai hộp thư Gmail có chung thứ gì, và vì sao không gom theo tiêu đề?</w:t>
       </w:r>
     </w:p>
     <w:p/>

</xml_diff>

<commit_message>
feat(fe-81): open a merged thread: own sender address, sending account, one ID
In a thread found in several accounts (f05b), an own email names the
address it went from ("Bạn · tienct07@gmail.com", D-184), and the reply
box says which account sends at every width: a line below 1280px, the
existing bar button above it (D-186). Opening the ID of another copy
replaces the address with the thread's ID, keeping the filter, and the
thread is read once, under that ID (D-183).

Verified: RED then GREEN (MSW); headless Chrome at 1440/1024/390;
lint, tsc, 563/563 tests, build.

Co-Authored-By: Claude Opus 5.5 (1M context) <noreply@anthropic.com>
</commit_message>
<xml_diff>
--- a/docs/knowledge/phase-1-frontend-foundation.docx
+++ b/docs/knowledge/phase-1-frontend-foundation.docx
@@ -24636,6 +24636,242 @@
     </w:p>
     <w:p>
       <w:pPr>
+        <w:pStyle w:val="Heading3"/>
+      </w:pPr>
+      <w:r>
+        <w:t xml:space="preserve">18.4 Mở một chuỗi gộp (FE-81)</w:t>
+      </w:r>
+    </w:p>
+    <w:p>
+      <w:pPr>
+        <w:pStyle w:val="ListParagraph"/>
+        <w:numPr>
+          <w:ilvl w:val="0"/>
+          <w:numId w:val="1"/>
+        </w:numPr>
+      </w:pPr>
+      <w:r>
+        <w:rPr>
+          <w:b/>
+          <w:bCs/>
+        </w:rPr>
+        <w:t xml:space="preserve">Adapter giữ dữ liệu, màn hình quyết định chữ:</w:t>
+      </w:r>
+      <w:r>
+        <w:t xml:space="preserve"> API cho biết thư của bạn đi từ địa chỉ nào (</w:t>
+      </w:r>
+      <w:r>
+        <w:rPr>
+          <w:rFonts w:ascii="Consolas" w:eastAsia="Consolas" w:hAnsi="Consolas" w:cs="Consolas"/>
+        </w:rPr>
+        <w:t xml:space="preserve">sender.self</w:t>
+      </w:r>
+      <w:r>
+        <w:t xml:space="preserve">, </w:t>
+      </w:r>
+      <w:r>
+        <w:rPr>
+          <w:rFonts w:ascii="Consolas" w:eastAsia="Consolas" w:hAnsi="Consolas" w:cs="Consolas"/>
+        </w:rPr>
+        <w:t xml:space="preserve">sender.address</w:t>
+      </w:r>
+      <w:r>
+        <w:t xml:space="preserve">). Adapter chỉ giữ địa chỉ đó (</w:t>
+      </w:r>
+      <w:r>
+        <w:rPr>
+          <w:rFonts w:ascii="Consolas" w:eastAsia="Consolas" w:hAnsi="Consolas" w:cs="Consolas"/>
+        </w:rPr>
+        <w:t xml:space="preserve">ownAddress</w:t>
+      </w:r>
+      <w:r>
+        <w:t xml:space="preserve">). Hàm thuần </w:t>
+      </w:r>
+      <w:r>
+        <w:rPr>
+          <w:rFonts w:ascii="Consolas" w:eastAsia="Consolas" w:hAnsi="Consolas" w:cs="Consolas"/>
+        </w:rPr>
+        <w:t xml:space="preserve">mailSender(mail, manyAccounts)</w:t>
+      </w:r>
+      <w:r>
+        <w:t xml:space="preserve"> mới ghép "Bạn · địa chỉ" khi chuỗi có nhiều tài khoản, vì adapter không biết chuỗi có gộp hay không.</w:t>
+      </w:r>
+    </w:p>
+    <w:p>
+      <w:pPr>
+        <w:pStyle w:val="ListParagraph"/>
+        <w:numPr>
+          <w:ilvl w:val="0"/>
+          <w:numId w:val="1"/>
+        </w:numPr>
+      </w:pPr>
+      <w:r>
+        <w:rPr>
+          <w:b/>
+          <w:bCs/>
+        </w:rPr>
+        <w:t xml:space="preserve">Truyền chữ đã tính xuống component con:</w:t>
+      </w:r>
+      <w:r>
+        <w:t xml:space="preserve"> </w:t>
+      </w:r>
+      <w:r>
+        <w:rPr>
+          <w:rFonts w:ascii="Consolas" w:eastAsia="Consolas" w:hAnsi="Consolas" w:cs="Consolas"/>
+        </w:rPr>
+        <w:t xml:space="preserve">FoldedMail</w:t>
+      </w:r>
+      <w:r>
+        <w:t xml:space="preserve"> và </w:t>
+      </w:r>
+      <w:r>
+        <w:rPr>
+          <w:rFonts w:ascii="Consolas" w:eastAsia="Consolas" w:hAnsi="Consolas" w:cs="Consolas"/>
+        </w:rPr>
+        <w:t xml:space="preserve">MailCard</w:t>
+      </w:r>
+      <w:r>
+        <w:t xml:space="preserve"> nhận prop </w:t>
+      </w:r>
+      <w:r>
+        <w:rPr>
+          <w:rFonts w:ascii="Consolas" w:eastAsia="Consolas" w:hAnsi="Consolas" w:cs="Consolas"/>
+        </w:rPr>
+        <w:t xml:space="preserve">sender</w:t>
+      </w:r>
+      <w:r>
+        <w:t xml:space="preserve">. Không tạo object thư mới (</w:t>
+      </w:r>
+      <w:r>
+        <w:rPr>
+          <w:rFonts w:ascii="Consolas" w:eastAsia="Consolas" w:hAnsi="Consolas" w:cs="Consolas"/>
+        </w:rPr>
+        <w:t xml:space="preserve">{ ...mail, sender }</w:t>
+      </w:r>
+      <w:r>
+        <w:t xml:space="preserve">) mỗi lần vẽ, vì component con dùng </w:t>
+      </w:r>
+      <w:r>
+        <w:rPr>
+          <w:rFonts w:ascii="Consolas" w:eastAsia="Consolas" w:hAnsi="Consolas" w:cs="Consolas"/>
+        </w:rPr>
+        <w:t xml:space="preserve">mail</w:t>
+      </w:r>
+      <w:r>
+        <w:t xml:space="preserve"> để tải nội dung và đổi object là đổi đầu vào của chúng.</w:t>
+      </w:r>
+    </w:p>
+    <w:p>
+      <w:pPr>
+        <w:pStyle w:val="ListParagraph"/>
+        <w:numPr>
+          <w:ilvl w:val="0"/>
+          <w:numId w:val="1"/>
+        </w:numPr>
+      </w:pPr>
+      <w:r>
+        <w:rPr>
+          <w:b/>
+          <w:bCs/>
+        </w:rPr>
+        <w:t xml:space="preserve">Một chỗ cho mỗi cỡ màn:</w:t>
+      </w:r>
+      <w:r>
+        <w:t xml:space="preserve"> từ 1280px, thanh của ô trả lời đã có nút "Gửi từ …"; dưới 1280px thanh không còn chỗ, nên chuỗi gộp có thêm một dòng "Gửi từ" (</w:t>
+      </w:r>
+      <w:r>
+        <w:rPr>
+          <w:rFonts w:ascii="Consolas" w:eastAsia="Consolas" w:hAnsi="Consolas" w:cs="Consolas"/>
+        </w:rPr>
+        <w:t xml:space="preserve">xl:hidden</w:t>
+      </w:r>
+      <w:r>
+        <w:t xml:space="preserve">), đặt giống dòng "Tới".</w:t>
+      </w:r>
+    </w:p>
+    <w:p>
+      <w:pPr>
+        <w:pStyle w:val="ListParagraph"/>
+        <w:numPr>
+          <w:ilvl w:val="0"/>
+          <w:numId w:val="1"/>
+        </w:numPr>
+      </w:pPr>
+      <w:r>
+        <w:rPr>
+          <w:b/>
+          <w:bCs/>
+        </w:rPr>
+        <w:t xml:space="preserve">Chuyển mã bằng </w:t>
+      </w:r>
+      <w:r>
+        <w:rPr>
+          <w:rFonts w:ascii="Consolas" w:eastAsia="Consolas" w:hAnsi="Consolas" w:cs="Consolas"/>
+          <w:b/>
+          <w:bCs/>
+        </w:rPr>
+        <w:t xml:space="preserve">replace</w:t>
+      </w:r>
+      <w:r>
+        <w:rPr>
+          <w:b/>
+          <w:bCs/>
+        </w:rPr>
+        <w:t xml:space="preserve">:</w:t>
+      </w:r>
+      <w:r>
+        <w:t xml:space="preserve"> mở </w:t>
+      </w:r>
+      <w:r>
+        <w:rPr>
+          <w:rFonts w:ascii="Consolas" w:eastAsia="Consolas" w:hAnsi="Consolas" w:cs="Consolas"/>
+        </w:rPr>
+        <w:t xml:space="preserve">/inbox/{mã bản kia}</w:t>
+      </w:r>
+      <w:r>
+        <w:t xml:space="preserve"> thì API trả dòng mang mã của nhóm; </w:t>
+      </w:r>
+      <w:r>
+        <w:rPr>
+          <w:rFonts w:ascii="Consolas" w:eastAsia="Consolas" w:hAnsi="Consolas" w:cs="Consolas"/>
+        </w:rPr>
+        <w:t xml:space="preserve">navigate({ pathname, search }, { replace: true })</w:t>
+      </w:r>
+      <w:r>
+        <w:t xml:space="preserve"> thay đường dẫn mà không thêm mục vào lịch sử, nên nút Quay lại không đưa về đường dẫn cũ rồi lại bị chuyển. Việc đánh dấu đã đọc chờ tới khi đường dẫn đã là mã của nhóm, nên chỉ có một </w:t>
+      </w:r>
+      <w:r>
+        <w:rPr>
+          <w:rFonts w:ascii="Consolas" w:eastAsia="Consolas" w:hAnsi="Consolas" w:cs="Consolas"/>
+        </w:rPr>
+        <w:t xml:space="preserve">PATCH</w:t>
+      </w:r>
+      <w:r>
+        <w:t xml:space="preserve">.</w:t>
+      </w:r>
+    </w:p>
+    <w:p>
+      <w:pPr>
+        <w:shd w:val="clear" w:color="auto" w:fill="F2F3F5"/>
+        <w:ind w:left="0"/>
+      </w:pPr>
+      <w:r>
+        <w:rPr>
+          <w:rFonts w:ascii="Consolas" w:eastAsia="Consolas" w:hAnsi="Consolas" w:cs="Consolas"/>
+          <w:sz w:val="19"/>
+          <w:szCs w:val="19"/>
+        </w:rPr>
+        <w:t xml:space="preserve">/inbox/c-9?view=unread</w:t>
+        <w:br/>
+        <w:t xml:space="preserve">  GET /api/conversations/c-9  -&gt;  { id: "c-1", ... }      (mã của nhóm, D-183)</w:t>
+        <w:br/>
+        <w:t xml:space="preserve">  navigate replace            -&gt;  /inbox/c-1?view=unread</w:t>
+        <w:br/>
+        <w:t xml:space="preserve">  PATCH /api/conversations/c-1 { read: true }             (một lần)</w:t>
+      </w:r>
+    </w:p>
+    <w:p>
+      <w:pPr>
         <w:pStyle w:val="Heading2"/>
       </w:pPr>
       <w:r>
@@ -27415,6 +27651,36 @@
       </w:pPr>
       <w:r>
         <w:t xml:space="preserve">Hai bản của một chuỗi ở hai hộp thư Gmail có chung thứ gì, và vì sao không gom theo tiêu đề?</w:t>
+      </w:r>
+    </w:p>
+    <w:p>
+      <w:pPr>
+        <w:pStyle w:val="ListParagraph"/>
+        <w:numPr>
+          <w:ilvl w:val="0"/>
+          <w:numId w:val="100"/>
+        </w:numPr>
+      </w:pPr>
+      <w:r>
+        <w:t xml:space="preserve">Vì sao chuyển mã của bản khác về mã của nhóm dùng </w:t>
+      </w:r>
+      <w:r>
+        <w:rPr>
+          <w:rFonts w:ascii="Consolas" w:eastAsia="Consolas" w:hAnsi="Consolas" w:cs="Consolas"/>
+        </w:rPr>
+        <w:t xml:space="preserve">replace: true</w:t>
+      </w:r>
+      <w:r>
+        <w:t xml:space="preserve">? Nếu đánh dấu đã đọc trước khi chuyển thì có mấy </w:t>
+      </w:r>
+      <w:r>
+        <w:rPr>
+          <w:rFonts w:ascii="Consolas" w:eastAsia="Consolas" w:hAnsi="Consolas" w:cs="Consolas"/>
+        </w:rPr>
+        <w:t xml:space="preserve">PATCH</w:t>
+      </w:r>
+      <w:r>
+        <w:t xml:space="preserve">?</w:t>
       </w:r>
     </w:p>
     <w:p/>

</xml_diff>

<commit_message>
feat(fe-83): "Thư mới" and the form of a new mail at /inbox/new
A "Thư mới" link sits at the top of the list at every width (the header
from 1280px, the row of chips on a tablet, the page header on a phone)
and opens /inbox/new: the form takes the reading column, or the whole
screen on a phone (f10-new-mail D-191). From lists the accounts of
providers that can send; the ones that cannot are there but out of
reach, with the reason; it starts from the account used last in this
browser (D-193). To is split, checked and deduplicated (D-197). Leaving a
form with text asks first, in the app (useBlocker) and when the tab
closes (beforeunload). Sending itself comes with FE-84.

Verified: RED then GREEN; headless Chrome at 1440/1024/390; lint, tsc,
608/608 tests, build.

Co-Authored-By: Claude Opus 5.5 (1M context) <noreply@anthropic.com>
</commit_message>
<xml_diff>
--- a/docs/knowledge/phase-1-frontend-foundation.docx
+++ b/docs/knowledge/phase-1-frontend-foundation.docx
@@ -24875,6 +24875,460 @@
         <w:pStyle w:val="Heading2"/>
       </w:pPr>
       <w:r>
+        <w:t xml:space="preserve">19. Tạo thư mới (f10-new-mail, phía web)</w:t>
+      </w:r>
+    </w:p>
+    <w:p>
+      <w:pPr>
+        <w:pStyle w:val="Heading3"/>
+      </w:pPr>
+      <w:r>
+        <w:t xml:space="preserve">19.0 Bức tranh</w:t>
+      </w:r>
+    </w:p>
+    <w:p>
+      <w:r>
+        <w:t xml:space="preserve">Trước đây Sino chỉ trả lời trong một cuộc trò chuyện. Change </w:t>
+      </w:r>
+      <w:r>
+        <w:rPr>
+          <w:rFonts w:ascii="Consolas" w:eastAsia="Consolas" w:hAnsi="Consolas" w:cs="Consolas"/>
+        </w:rPr>
+        <w:t xml:space="preserve">f10-new-mail</w:t>
+      </w:r>
+      <w:r>
+        <w:t xml:space="preserve"> (D-190…D-197) thêm nút "Thư mới" và trang </w:t>
+      </w:r>
+      <w:r>
+        <w:rPr>
+          <w:rFonts w:ascii="Consolas" w:eastAsia="Consolas" w:hAnsi="Consolas" w:cs="Consolas"/>
+        </w:rPr>
+        <w:t xml:space="preserve">/inbox/new</w:t>
+      </w:r>
+      <w:r>
+        <w:t xml:space="preserve">: ô soạn nằm ở chỗ đọc thư, giống như mở một cuộc trò chuyện. Backend sẽ tạo cuộc trò chuyện ngay khi bấm Gửi (D-192); phần gửi của web là FE-84.</w:t>
+      </w:r>
+    </w:p>
+    <w:p>
+      <w:pPr>
+        <w:shd w:val="clear" w:color="auto" w:fill="F2F3F5"/>
+        <w:ind w:left="0"/>
+      </w:pPr>
+      <w:r>
+        <w:rPr>
+          <w:rFonts w:ascii="Consolas" w:eastAsia="Consolas" w:hAnsi="Consolas" w:cs="Consolas"/>
+          <w:sz w:val="19"/>
+          <w:szCs w:val="19"/>
+        </w:rPr>
+        <w:t xml:space="preserve">/inbox            -&gt; danh sách | "Chọn một cuộc trò chuyện để đọc."</w:t>
+        <w:br/>
+        <w:t xml:space="preserve">/inbox/new        -&gt; danh sách | ô soạn: Từ, Tới, Tiêu đề, Nội dung, [Bỏ] [Gửi]</w:t>
+        <w:br/>
+        <w:t xml:space="preserve">/inbox/c-1        -&gt; danh sách | cuộc trò chuyện c-1</w:t>
+        <w:br/>
+        <w:t xml:space="preserve">(mobile: cột phải thành trang riêng, có nút quay lại, ẩn thanh dưới)</w:t>
+      </w:r>
+    </w:p>
+    <w:p>
+      <w:pPr>
+        <w:pStyle w:val="Heading3"/>
+      </w:pPr>
+      <w:r>
+        <w:t xml:space="preserve">19.1 Route tĩnh đứng cạnh route có tham số (FE-83)</w:t>
+      </w:r>
+    </w:p>
+    <w:p>
+      <w:r>
+        <w:rPr>
+          <w:rFonts w:ascii="Consolas" w:eastAsia="Consolas" w:hAnsi="Consolas" w:cs="Consolas"/>
+        </w:rPr>
+        <w:t xml:space="preserve">inbox/new</w:t>
+      </w:r>
+      <w:r>
+        <w:t xml:space="preserve"> và </w:t>
+      </w:r>
+      <w:r>
+        <w:rPr>
+          <w:rFonts w:ascii="Consolas" w:eastAsia="Consolas" w:hAnsi="Consolas" w:cs="Consolas"/>
+        </w:rPr>
+        <w:t xml:space="preserve">inbox/:conversationId</w:t>
+      </w:r>
+      <w:r>
+        <w:t xml:space="preserve"> đều khớp đường dẫn </w:t>
+      </w:r>
+      <w:r>
+        <w:rPr>
+          <w:rFonts w:ascii="Consolas" w:eastAsia="Consolas" w:hAnsi="Consolas" w:cs="Consolas"/>
+        </w:rPr>
+        <w:t xml:space="preserve">/inbox/new</w:t>
+      </w:r>
+      <w:r>
+        <w:t xml:space="preserve">. React Router xếp hạng route theo độ cụ thể: một đoạn tĩnh (</w:t>
+      </w:r>
+      <w:r>
+        <w:rPr>
+          <w:rFonts w:ascii="Consolas" w:eastAsia="Consolas" w:hAnsi="Consolas" w:cs="Consolas"/>
+        </w:rPr>
+        <w:t xml:space="preserve">new</w:t>
+      </w:r>
+      <w:r>
+        <w:t xml:space="preserve">) thắng một tham số (</w:t>
+      </w:r>
+      <w:r>
+        <w:rPr>
+          <w:rFonts w:ascii="Consolas" w:eastAsia="Consolas" w:hAnsi="Consolas" w:cs="Consolas"/>
+        </w:rPr>
+        <w:t xml:space="preserve">:conversationId</w:t>
+      </w:r>
+      <w:r>
+        <w:t xml:space="preserve">), nên không cần thủ thuật gì. Cả hai route dùng cùng </w:t>
+      </w:r>
+      <w:r>
+        <w:rPr>
+          <w:rFonts w:ascii="Consolas" w:eastAsia="Consolas" w:hAnsi="Consolas" w:cs="Consolas"/>
+        </w:rPr>
+        <w:t xml:space="preserve">InboxPage</w:t>
+      </w:r>
+      <w:r>
+        <w:t xml:space="preserve">; route mới truyền </w:t>
+      </w:r>
+      <w:r>
+        <w:rPr>
+          <w:rFonts w:ascii="Consolas" w:eastAsia="Consolas" w:hAnsi="Consolas" w:cs="Consolas"/>
+        </w:rPr>
+        <w:t xml:space="preserve">compose</w:t>
+      </w:r>
+      <w:r>
+        <w:t xml:space="preserve">, nên một component vẫn lo cả bố cục ba cỡ màn.</w:t>
+      </w:r>
+    </w:p>
+    <w:p>
+      <w:pPr>
+        <w:pStyle w:val="Heading3"/>
+      </w:pPr>
+      <w:r>
+        <w:t xml:space="preserve">19.2 Hỏi trước khi rời trang: hai đường khác nhau</w:t>
+      </w:r>
+    </w:p>
+    <w:p>
+      <w:pPr>
+        <w:pStyle w:val="ListParagraph"/>
+        <w:numPr>
+          <w:ilvl w:val="0"/>
+          <w:numId w:val="1"/>
+        </w:numPr>
+      </w:pPr>
+      <w:r>
+        <w:rPr>
+          <w:b/>
+          <w:bCs/>
+        </w:rPr>
+        <w:t xml:space="preserve">Trong app</w:t>
+      </w:r>
+      <w:r>
+        <w:t xml:space="preserve"> (bấm thư khác, quay lại, "Bỏ"): </w:t>
+      </w:r>
+      <w:r>
+        <w:rPr>
+          <w:rFonts w:ascii="Consolas" w:eastAsia="Consolas" w:hAnsi="Consolas" w:cs="Consolas"/>
+        </w:rPr>
+        <w:t xml:space="preserve">useBlocker</w:t>
+      </w:r>
+      <w:r>
+        <w:t xml:space="preserve"> của React Router chặn lần chuyển trang khi hàm điều kiện trả </w:t>
+      </w:r>
+      <w:r>
+        <w:rPr>
+          <w:rFonts w:ascii="Consolas" w:eastAsia="Consolas" w:hAnsi="Consolas" w:cs="Consolas"/>
+        </w:rPr>
+        <w:t xml:space="preserve">true</w:t>
+      </w:r>
+      <w:r>
+        <w:t xml:space="preserve">, rồi cho </w:t>
+      </w:r>
+      <w:r>
+        <w:rPr>
+          <w:rFonts w:ascii="Consolas" w:eastAsia="Consolas" w:hAnsi="Consolas" w:cs="Consolas"/>
+        </w:rPr>
+        <w:t xml:space="preserve">blocker.proceed()</w:t>
+      </w:r>
+      <w:r>
+        <w:t xml:space="preserve"> (đi tiếp) hoặc </w:t>
+      </w:r>
+      <w:r>
+        <w:rPr>
+          <w:rFonts w:ascii="Consolas" w:eastAsia="Consolas" w:hAnsi="Consolas" w:cs="Consolas"/>
+        </w:rPr>
+        <w:t xml:space="preserve">blocker.reset()</w:t>
+      </w:r>
+      <w:r>
+        <w:t xml:space="preserve"> (ở lại). Nó chỉ chạy với data router (</w:t>
+      </w:r>
+      <w:r>
+        <w:rPr>
+          <w:rFonts w:ascii="Consolas" w:eastAsia="Consolas" w:hAnsi="Consolas" w:cs="Consolas"/>
+        </w:rPr>
+        <w:t xml:space="preserve">createBrowserRouter</w:t>
+      </w:r>
+      <w:r>
+        <w:t xml:space="preserve">), mà app đã dùng sẵn.</w:t>
+      </w:r>
+    </w:p>
+    <w:p>
+      <w:pPr>
+        <w:pStyle w:val="ListParagraph"/>
+        <w:numPr>
+          <w:ilvl w:val="0"/>
+          <w:numId w:val="1"/>
+        </w:numPr>
+      </w:pPr>
+      <w:r>
+        <w:rPr>
+          <w:b/>
+          <w:bCs/>
+        </w:rPr>
+        <w:t xml:space="preserve">Đóng hay tải lại tab:</w:t>
+      </w:r>
+      <w:r>
+        <w:t xml:space="preserve"> trình duyệt không cho trang tự vẽ hộp hỏi. Trang chỉ được gọi </w:t>
+      </w:r>
+      <w:r>
+        <w:rPr>
+          <w:rFonts w:ascii="Consolas" w:eastAsia="Consolas" w:hAnsi="Consolas" w:cs="Consolas"/>
+        </w:rPr>
+        <w:t xml:space="preserve">event.preventDefault()</w:t>
+      </w:r>
+      <w:r>
+        <w:t xml:space="preserve"> trong </w:t>
+      </w:r>
+      <w:r>
+        <w:rPr>
+          <w:rFonts w:ascii="Consolas" w:eastAsia="Consolas" w:hAnsi="Consolas" w:cs="Consolas"/>
+        </w:rPr>
+        <w:t xml:space="preserve">beforeunload</w:t>
+      </w:r>
+      <w:r>
+        <w:t xml:space="preserve">, và trình duyệt hiện hộp hỏi bằng lời của nó.</w:t>
+      </w:r>
+    </w:p>
+    <w:p>
+      <w:pPr>
+        <w:pStyle w:val="ListParagraph"/>
+        <w:numPr>
+          <w:ilvl w:val="0"/>
+          <w:numId w:val="1"/>
+        </w:numPr>
+      </w:pPr>
+      <w:r>
+        <w:t xml:space="preserve">Khi gửi xong, FE-84 sẽ chuyển trang kèm </w:t>
+      </w:r>
+      <w:r>
+        <w:rPr>
+          <w:rFonts w:ascii="Consolas" w:eastAsia="Consolas" w:hAnsi="Consolas" w:cs="Consolas"/>
+        </w:rPr>
+        <w:t xml:space="preserve">state: LEAVE_FREELY</w:t>
+      </w:r>
+      <w:r>
+        <w:t xml:space="preserve">, và hàm điều kiện bỏ qua lần chuyển đó, nên thư vừa gửi không bị hỏi "Bỏ thư?".</w:t>
+      </w:r>
+    </w:p>
+    <w:p>
+      <w:pPr>
+        <w:pStyle w:val="Heading3"/>
+      </w:pPr>
+      <w:r>
+        <w:t xml:space="preserve">19.3 Kiểm dữ liệu ở web, rồi server kiểm lại</w:t>
+      </w:r>
+    </w:p>
+    <w:p>
+      <w:r>
+        <w:rPr>
+          <w:rFonts w:ascii="Consolas" w:eastAsia="Consolas" w:hAnsi="Consolas" w:cs="Consolas"/>
+        </w:rPr>
+        <w:t xml:space="preserve">parseRecipients</w:t>
+      </w:r>
+      <w:r>
+        <w:t xml:space="preserve"> tách "Tới" theo dấu phẩy, chấm phẩy, xuống dòng, bỏ trùng không phân biệt hoa thường, và tách riêng những gì không phải địa chỉ. Web kiểm để báo ngay dưới ô; server vẫn kiểm lại cùng quy tắc (</w:t>
+      </w:r>
+      <w:r>
+        <w:rPr>
+          <w:rFonts w:ascii="Consolas" w:eastAsia="Consolas" w:hAnsi="Consolas" w:cs="Consolas"/>
+        </w:rPr>
+        <w:t xml:space="preserve">400 VALIDATION_FAILED</w:t>
+      </w:r>
+      <w:r>
+        <w:t xml:space="preserve">), vì không bao giờ tin dữ liệu từ trình duyệt cho một hành động gửi ra ngoài. Ô sai có </w:t>
+      </w:r>
+      <w:r>
+        <w:rPr>
+          <w:rFonts w:ascii="Consolas" w:eastAsia="Consolas" w:hAnsi="Consolas" w:cs="Consolas"/>
+        </w:rPr>
+        <w:t xml:space="preserve">aria-invalid</w:t>
+      </w:r>
+      <w:r>
+        <w:t xml:space="preserve"> và </w:t>
+      </w:r>
+      <w:r>
+        <w:rPr>
+          <w:rFonts w:ascii="Consolas" w:eastAsia="Consolas" w:hAnsi="Consolas" w:cs="Consolas"/>
+        </w:rPr>
+        <w:t xml:space="preserve">aria-describedby</w:t>
+      </w:r>
+      <w:r>
+        <w:t xml:space="preserve"> trỏ tới câu báo, để trình đọc màn hình đọc lỗi cùng ô.</w:t>
+      </w:r>
+    </w:p>
+    <w:p>
+      <w:pPr>
+        <w:pStyle w:val="Heading3"/>
+      </w:pPr>
+      <w:r>
+        <w:t xml:space="preserve">19.4 Ba bài học nhỏ từ Chrome và lint</w:t>
+      </w:r>
+    </w:p>
+    <w:p>
+      <w:pPr>
+        <w:pStyle w:val="ListParagraph"/>
+        <w:numPr>
+          <w:ilvl w:val="0"/>
+          <w:numId w:val="1"/>
+        </w:numPr>
+      </w:pPr>
+      <w:r>
+        <w:rPr>
+          <w:b/>
+          <w:bCs/>
+        </w:rPr>
+        <w:t xml:space="preserve">Một hàng bị ẩn làm lệch lưới:</w:t>
+      </w:r>
+      <w:r>
+        <w:t xml:space="preserve"> form ban đầu là lưới ba hàng </w:t>
+      </w:r>
+      <w:r>
+        <w:rPr>
+          <w:rFonts w:ascii="Consolas" w:eastAsia="Consolas" w:hAnsi="Consolas" w:cs="Consolas"/>
+        </w:rPr>
+        <w:t xml:space="preserve">[auto, 1fr, auto]</w:t>
+      </w:r>
+      <w:r>
+        <w:t xml:space="preserve">. Trên mobile phần đầu bị </w:t>
+      </w:r>
+      <w:r>
+        <w:rPr>
+          <w:rFonts w:ascii="Consolas" w:eastAsia="Consolas" w:hAnsi="Consolas" w:cs="Consolas"/>
+        </w:rPr>
+        <w:t xml:space="preserve">display: none</w:t>
+      </w:r>
+      <w:r>
+        <w:t xml:space="preserve">, nên các phần tử còn lại dồn lên: thanh nút rơi vào hàng </w:t>
+      </w:r>
+      <w:r>
+        <w:rPr>
+          <w:rFonts w:ascii="Consolas" w:eastAsia="Consolas" w:hAnsi="Consolas" w:cs="Consolas"/>
+        </w:rPr>
+        <w:t xml:space="preserve">1fr</w:t>
+      </w:r>
+      <w:r>
+        <w:t xml:space="preserve"> và bị kéo cao giữa màn. Flex dọc không có "hàng" cố định, nên phần tử ẩn không làm lệch gì.</w:t>
+      </w:r>
+    </w:p>
+    <w:p>
+      <w:pPr>
+        <w:pStyle w:val="ListParagraph"/>
+        <w:numPr>
+          <w:ilvl w:val="0"/>
+          <w:numId w:val="1"/>
+        </w:numPr>
+      </w:pPr>
+      <w:r>
+        <w:rPr>
+          <w:b/>
+          <w:bCs/>
+        </w:rPr>
+        <w:t xml:space="preserve">Fast refresh:</w:t>
+      </w:r>
+      <w:r>
+        <w:t xml:space="preserve"> Vite chỉ thay nóng được một file khi file đó chỉ xuất component. </w:t>
+      </w:r>
+      <w:r>
+        <w:rPr>
+          <w:rFonts w:ascii="Consolas" w:eastAsia="Consolas" w:hAnsi="Consolas" w:cs="Consolas"/>
+        </w:rPr>
+        <w:t xml:space="preserve">NewMail.tsx</w:t>
+      </w:r>
+      <w:r>
+        <w:t xml:space="preserve"> từng xuất cả hằng số, nên lint cảnh báo </w:t>
+      </w:r>
+      <w:r>
+        <w:rPr>
+          <w:rFonts w:ascii="Consolas" w:eastAsia="Consolas" w:hAnsi="Consolas" w:cs="Consolas"/>
+        </w:rPr>
+        <w:t xml:space="preserve">only-export-components</w:t>
+      </w:r>
+      <w:r>
+        <w:t xml:space="preserve">; hằng số, kiểu và hàm đọc </w:t>
+      </w:r>
+      <w:r>
+        <w:rPr>
+          <w:rFonts w:ascii="Consolas" w:eastAsia="Consolas" w:hAnsi="Consolas" w:cs="Consolas"/>
+        </w:rPr>
+        <w:t xml:space="preserve">localStorage</w:t>
+      </w:r>
+      <w:r>
+        <w:t xml:space="preserve"> chuyển sang </w:t>
+      </w:r>
+      <w:r>
+        <w:rPr>
+          <w:rFonts w:ascii="Consolas" w:eastAsia="Consolas" w:hAnsi="Consolas" w:cs="Consolas"/>
+        </w:rPr>
+        <w:t xml:space="preserve">newMail.ts</w:t>
+      </w:r>
+      <w:r>
+        <w:t xml:space="preserve">.</w:t>
+      </w:r>
+    </w:p>
+    <w:p>
+      <w:pPr>
+        <w:pStyle w:val="ListParagraph"/>
+        <w:numPr>
+          <w:ilvl w:val="0"/>
+          <w:numId w:val="1"/>
+        </w:numPr>
+      </w:pPr>
+      <w:r>
+        <w:rPr>
+          <w:b/>
+          <w:bCs/>
+        </w:rPr>
+        <w:t xml:space="preserve">Test đếm link:</w:t>
+      </w:r>
+      <w:r>
+        <w:t xml:space="preserve"> ba helper </w:t>
+      </w:r>
+      <w:r>
+        <w:rPr>
+          <w:rFonts w:ascii="Consolas" w:eastAsia="Consolas" w:hAnsi="Consolas" w:cs="Consolas"/>
+        </w:rPr>
+        <w:t xml:space="preserve">rowTitles</w:t>
+      </w:r>
+      <w:r>
+        <w:t xml:space="preserve"> coi mọi link trong vùng danh sách là một dòng thư. Nút "Thư mới" cũng là link trong vùng đó, nên helper giờ chỉ lấy link có dấu của dòng (</w:t>
+      </w:r>
+      <w:r>
+        <w:rPr>
+          <w:rFonts w:ascii="Consolas" w:eastAsia="Consolas" w:hAnsi="Consolas" w:cs="Consolas"/>
+        </w:rPr>
+        <w:t xml:space="preserve">data-slot="row-title"</w:t>
+      </w:r>
+      <w:r>
+        <w:t xml:space="preserve">). Ý của test giữ nguyên, chỉ nói rõ hơn.</w:t>
+      </w:r>
+    </w:p>
+    <w:p>
+      <w:pPr>
+        <w:pStyle w:val="Heading2"/>
+      </w:pPr>
+      <w:r>
         <w:t xml:space="preserve">Tự kiểm tra</w:t>
       </w:r>
     </w:p>
@@ -27681,6 +28135,102 @@
       </w:r>
       <w:r>
         <w:t xml:space="preserve">?</w:t>
+      </w:r>
+    </w:p>
+    <w:p>
+      <w:pPr>
+        <w:pStyle w:val="ListParagraph"/>
+        <w:numPr>
+          <w:ilvl w:val="0"/>
+          <w:numId w:val="100"/>
+        </w:numPr>
+      </w:pPr>
+      <w:r>
+        <w:rPr>
+          <w:rFonts w:ascii="Consolas" w:eastAsia="Consolas" w:hAnsi="Consolas" w:cs="Consolas"/>
+        </w:rPr>
+        <w:t xml:space="preserve">/inbox/new</w:t>
+      </w:r>
+      <w:r>
+        <w:t xml:space="preserve"> khớp cả </w:t>
+      </w:r>
+      <w:r>
+        <w:rPr>
+          <w:rFonts w:ascii="Consolas" w:eastAsia="Consolas" w:hAnsi="Consolas" w:cs="Consolas"/>
+        </w:rPr>
+        <w:t xml:space="preserve">inbox/new</w:t>
+      </w:r>
+      <w:r>
+        <w:t xml:space="preserve"> lẫn </w:t>
+      </w:r>
+      <w:r>
+        <w:rPr>
+          <w:rFonts w:ascii="Consolas" w:eastAsia="Consolas" w:hAnsi="Consolas" w:cs="Consolas"/>
+        </w:rPr>
+        <w:t xml:space="preserve">inbox/:conversationId</w:t>
+      </w:r>
+      <w:r>
+        <w:t xml:space="preserve">. React Router chọn route nào, và vì sao?</w:t>
+      </w:r>
+    </w:p>
+    <w:p>
+      <w:pPr>
+        <w:pStyle w:val="ListParagraph"/>
+        <w:numPr>
+          <w:ilvl w:val="0"/>
+          <w:numId w:val="100"/>
+        </w:numPr>
+      </w:pPr>
+      <w:r>
+        <w:t xml:space="preserve">Vì sao hỏi "Bỏ thư đang soạn?" cần hai cơ chế (</w:t>
+      </w:r>
+      <w:r>
+        <w:rPr>
+          <w:rFonts w:ascii="Consolas" w:eastAsia="Consolas" w:hAnsi="Consolas" w:cs="Consolas"/>
+        </w:rPr>
+        <w:t xml:space="preserve">useBlocker</w:t>
+      </w:r>
+      <w:r>
+        <w:t xml:space="preserve"> và </w:t>
+      </w:r>
+      <w:r>
+        <w:rPr>
+          <w:rFonts w:ascii="Consolas" w:eastAsia="Consolas" w:hAnsi="Consolas" w:cs="Consolas"/>
+        </w:rPr>
+        <w:t xml:space="preserve">beforeunload</w:t>
+      </w:r>
+      <w:r>
+        <w:t xml:space="preserve">)? Trang tự vẽ được hộp hỏi khi đóng tab không?</w:t>
+      </w:r>
+    </w:p>
+    <w:p>
+      <w:pPr>
+        <w:pStyle w:val="ListParagraph"/>
+        <w:numPr>
+          <w:ilvl w:val="0"/>
+          <w:numId w:val="100"/>
+        </w:numPr>
+      </w:pPr>
+      <w:r>
+        <w:t xml:space="preserve">Vì sao một phần tử </w:t>
+      </w:r>
+      <w:r>
+        <w:rPr>
+          <w:rFonts w:ascii="Consolas" w:eastAsia="Consolas" w:hAnsi="Consolas" w:cs="Consolas"/>
+        </w:rPr>
+        <w:t xml:space="preserve">display: none</w:t>
+      </w:r>
+      <w:r>
+        <w:t xml:space="preserve"> làm lệch lưới </w:t>
+      </w:r>
+      <w:r>
+        <w:rPr>
+          <w:rFonts w:ascii="Consolas" w:eastAsia="Consolas" w:hAnsi="Consolas" w:cs="Consolas"/>
+        </w:rPr>
+        <w:t xml:space="preserve">grid-rows-[auto_1fr_auto]</w:t>
+      </w:r>
+      <w:r>
+        <w:t xml:space="preserve"> mà không làm lệch flex dọc?</w:t>
       </w:r>
     </w:p>
     <w:p/>

</xml_diff>

<commit_message>
feat(fe-84): send a new mail, and what follows each answer
"Gửi" posts the mail to POST /api/conversations with a new
clientMessageId (f10-new-mail D-195). Whenever the server answers with
the conversation it made (sent; refused 502; unknown 504 or 409), the
form gives way to that conversation, with no "Bỏ thư?" (D-194). No
answer locks the mail and offers "Gửi lại" under the same ID, which the
server never sends twice. Field errors of a 400 land under their
fields; SEND_NOT_ALLOWED reads the accounts again; a backend without
the request keeps the mail and says so. A conversation whose opening
mail did not go (OPENING_NOT_SENT) has no reply box, and dropping that
mail goes back to the list.

Verified: RED then GREEN (MSW); headless Chrome at 1440/390; lint, tsc,
616/616 tests, build.

Co-Authored-By: Claude Opus 5.5 (1M context) <noreply@anthropic.com>
</commit_message>
<xml_diff>
--- a/docs/knowledge/phase-1-frontend-foundation.docx
+++ b/docs/knowledge/phase-1-frontend-foundation.docx
@@ -25326,6 +25326,255 @@
     </w:p>
     <w:p>
       <w:pPr>
+        <w:pStyle w:val="Heading3"/>
+      </w:pPr>
+      <w:r>
+        <w:t xml:space="preserve">19.5 Gửi thư mới: mỗi câu trả lời một cách xử (FE-84)</w:t>
+      </w:r>
+    </w:p>
+    <w:p>
+      <w:r>
+        <w:rPr>
+          <w:rFonts w:ascii="Consolas" w:eastAsia="Consolas" w:hAnsi="Consolas" w:cs="Consolas"/>
+        </w:rPr>
+        <w:t xml:space="preserve">useCreateConversation</w:t>
+      </w:r>
+      <w:r>
+        <w:t xml:space="preserve"> gửi </w:t>
+      </w:r>
+      <w:r>
+        <w:rPr>
+          <w:rFonts w:ascii="Consolas" w:eastAsia="Consolas" w:hAnsi="Consolas" w:cs="Consolas"/>
+        </w:rPr>
+        <w:t xml:space="preserve">POST /api/conversations</w:t>
+      </w:r>
+      <w:r>
+        <w:t xml:space="preserve"> với một </w:t>
+      </w:r>
+      <w:r>
+        <w:rPr>
+          <w:rFonts w:ascii="Consolas" w:eastAsia="Consolas" w:hAnsi="Consolas" w:cs="Consolas"/>
+        </w:rPr>
+        <w:t xml:space="preserve">clientMessageId</w:t>
+      </w:r>
+      <w:r>
+        <w:t xml:space="preserve"> mới cho mỗi thư. Nó đọc câu trả lời như sau:</w:t>
+      </w:r>
+    </w:p>
+    <w:p>
+      <w:pPr>
+        <w:shd w:val="clear" w:color="auto" w:fill="F2F3F5"/>
+        <w:ind w:left="0"/>
+      </w:pPr>
+      <w:r>
+        <w:rPr>
+          <w:rFonts w:ascii="Consolas" w:eastAsia="Consolas" w:hAnsi="Consolas" w:cs="Consolas"/>
+          <w:sz w:val="19"/>
+          <w:szCs w:val="19"/>
+        </w:rPr>
+        <w:t xml:space="preserve">câu trả lời                          web làm gì</w:t>
+        <w:br/>
+        <w:t xml:space="preserve">201 / 200 (đã gửi)                   sang /inbox/{id} (replace, không hỏi "Bỏ thư?")</w:t>
+        <w:br/>
+        <w:t xml:space="preserve">502 / 504 / 409 có conversationId    cũng sang cuộc trò chuyện: thư hiện trạng thái như F10</w:t>
+        <w:br/>
+        <w:t xml:space="preserve">không có câu trả lời (mạng)          khóa form, "Gửi lại" dùng LẠI cùng ID</w:t>
+        <w:br/>
+        <w:t xml:space="preserve">400 VALIDATION_FAILED                báo dưới đúng ô, form vẫn sửa được</w:t>
+        <w:br/>
+        <w:t xml:space="preserve">409 SEND_NOT_ALLOWED                 đọc lại tài khoản, báo ở "Từ"</w:t>
+        <w:br/>
+        <w:t xml:space="preserve">404 / 405 (backend chưa có)          giữ chữ, "Sino chưa gửi được thư mới..."</w:t>
+      </w:r>
+    </w:p>
+    <w:p>
+      <w:pPr>
+        <w:pStyle w:val="ListParagraph"/>
+        <w:numPr>
+          <w:ilvl w:val="0"/>
+          <w:numId w:val="1"/>
+        </w:numPr>
+      </w:pPr>
+      <w:r>
+        <w:rPr>
+          <w:b/>
+          <w:bCs/>
+        </w:rPr>
+        <w:t xml:space="preserve">Vì sao khóa form khi mất mạng:</w:t>
+      </w:r>
+      <w:r>
+        <w:t xml:space="preserve"> request có thể đã tới server và thư đã đi. "Gửi lại" an toàn chỉ khi gửi </w:t>
+      </w:r>
+      <w:r>
+        <w:rPr>
+          <w:b/>
+          <w:bCs/>
+        </w:rPr>
+        <w:t xml:space="preserve">đúng</w:t>
+      </w:r>
+      <w:r>
+        <w:t xml:space="preserve"> nội dung đó dưới </w:t>
+      </w:r>
+      <w:r>
+        <w:rPr>
+          <w:b/>
+          <w:bCs/>
+        </w:rPr>
+        <w:t xml:space="preserve">đúng</w:t>
+      </w:r>
+      <w:r>
+        <w:t xml:space="preserve"> ID cũ, vì server thấy ID đã gửi thì trả lại thư cũ chứ không gửi nữa. Nếu cho sửa chữ rồi gửi cùng ID, server sẽ trả thư cũ và người dùng tưởng thư mới đã đi. Nếu sửa rồi gửi ID mới, có thể thành hai thư.</w:t>
+      </w:r>
+    </w:p>
+    <w:p>
+      <w:pPr>
+        <w:pStyle w:val="ListParagraph"/>
+        <w:numPr>
+          <w:ilvl w:val="0"/>
+          <w:numId w:val="1"/>
+        </w:numPr>
+      </w:pPr>
+      <w:r>
+        <w:rPr>
+          <w:b/>
+          <w:bCs/>
+        </w:rPr>
+        <w:t xml:space="preserve">Vì sao 400 thì không khóa:</w:t>
+      </w:r>
+      <w:r>
+        <w:t xml:space="preserve"> server chưa tạo gì, nên sửa rồi gửi với ID mới là an toàn.</w:t>
+      </w:r>
+    </w:p>
+    <w:p>
+      <w:pPr>
+        <w:pStyle w:val="ListParagraph"/>
+        <w:numPr>
+          <w:ilvl w:val="0"/>
+          <w:numId w:val="1"/>
+        </w:numPr>
+      </w:pPr>
+      <w:r>
+        <w:rPr>
+          <w:b/>
+          <w:bCs/>
+        </w:rPr>
+        <w:t xml:space="preserve">Lỗi của web và lỗi của server cùng hiện ở một ô:</w:t>
+      </w:r>
+      <w:r>
+        <w:t xml:space="preserve"> kiểm của form để </w:t>
+      </w:r>
+      <w:r>
+        <w:rPr>
+          <w:rFonts w:ascii="Consolas" w:eastAsia="Consolas" w:hAnsi="Consolas" w:cs="Consolas"/>
+        </w:rPr>
+        <w:t xml:space="preserve">undefined</w:t>
+      </w:r>
+      <w:r>
+        <w:t xml:space="preserve"> cho ô đạt, nên trước khi gộp phải bỏ các </w:t>
+      </w:r>
+      <w:r>
+        <w:rPr>
+          <w:rFonts w:ascii="Consolas" w:eastAsia="Consolas" w:hAnsi="Consolas" w:cs="Consolas"/>
+        </w:rPr>
+        <w:t xml:space="preserve">undefined</w:t>
+      </w:r>
+      <w:r>
+        <w:t xml:space="preserve"> (</w:t>
+      </w:r>
+      <w:r>
+        <w:rPr>
+          <w:rFonts w:ascii="Consolas" w:eastAsia="Consolas" w:hAnsi="Consolas" w:cs="Consolas"/>
+        </w:rPr>
+        <w:t xml:space="preserve">dropEmpty</w:t>
+      </w:r>
+      <w:r>
+        <w:t xml:space="preserve">), không thì chúng đè lên lỗi của server khi trải object.</w:t>
+      </w:r>
+    </w:p>
+    <w:p>
+      <w:pPr>
+        <w:pStyle w:val="ListParagraph"/>
+        <w:numPr>
+          <w:ilvl w:val="0"/>
+          <w:numId w:val="1"/>
+        </w:numPr>
+      </w:pPr>
+      <w:r>
+        <w:rPr>
+          <w:rFonts w:ascii="Consolas" w:eastAsia="Consolas" w:hAnsi="Consolas" w:cs="Consolas"/>
+          <w:b/>
+          <w:bCs/>
+        </w:rPr>
+        <w:t xml:space="preserve">useRef</w:t>
+      </w:r>
+      <w:r>
+        <w:rPr>
+          <w:b/>
+          <w:bCs/>
+        </w:rPr>
+        <w:t xml:space="preserve"> cho lần gửi đang thử:</w:t>
+      </w:r>
+      <w:r>
+        <w:t xml:space="preserve"> "Gửi lại" cần nội dung và ID của lần trước ngay lúc bấm, mà không cần vẽ lại màn hình, nên giữ trong </w:t>
+      </w:r>
+      <w:r>
+        <w:rPr>
+          <w:rFonts w:ascii="Consolas" w:eastAsia="Consolas" w:hAnsi="Consolas" w:cs="Consolas"/>
+        </w:rPr>
+        <w:t xml:space="preserve">useRef</w:t>
+      </w:r>
+      <w:r>
+        <w:t xml:space="preserve"> thay vì </w:t>
+      </w:r>
+      <w:r>
+        <w:rPr>
+          <w:rFonts w:ascii="Consolas" w:eastAsia="Consolas" w:hAnsi="Consolas" w:cs="Consolas"/>
+        </w:rPr>
+        <w:t xml:space="preserve">useState</w:t>
+      </w:r>
+      <w:r>
+        <w:t xml:space="preserve">.</w:t>
+      </w:r>
+    </w:p>
+    <w:p>
+      <w:pPr>
+        <w:pStyle w:val="ListParagraph"/>
+        <w:numPr>
+          <w:ilvl w:val="0"/>
+          <w:numId w:val="1"/>
+        </w:numPr>
+      </w:pPr>
+      <w:r>
+        <w:rPr>
+          <w:b/>
+          <w:bCs/>
+        </w:rPr>
+        <w:t xml:space="preserve">Thư mở đầu chưa gửi xong:</w:t>
+      </w:r>
+      <w:r>
+        <w:t xml:space="preserve"> </w:t>
+      </w:r>
+      <w:r>
+        <w:rPr>
+          <w:rFonts w:ascii="Consolas" w:eastAsia="Consolas" w:hAnsi="Consolas" w:cs="Consolas"/>
+        </w:rPr>
+        <w:t xml:space="preserve">reply.state = OPENING_NOT_SENT</w:t>
+      </w:r>
+      <w:r>
+        <w:t xml:space="preserve"> thành </w:t>
+      </w:r>
+      <w:r>
+        <w:rPr>
+          <w:rFonts w:ascii="Consolas" w:eastAsia="Consolas" w:hAnsi="Consolas" w:cs="Consolas"/>
+        </w:rPr>
+        <w:t xml:space="preserve">detail.opening</w:t>
+      </w:r>
+      <w:r>
+        <w:t xml:space="preserve">. Chuỗi đó không có ô trả lời (chưa có thread ở Gmail để trả lời vào), còn "Bỏ" thư duy nhất thì xóa cả cuộc trò chuyện, nên web làm mới danh sách và quay về danh sách.</w:t>
+      </w:r>
+    </w:p>
+    <w:p>
+      <w:pPr>
         <w:pStyle w:val="Heading2"/>
       </w:pPr>
       <w:r>
@@ -28231,6 +28480,57 @@
       </w:r>
       <w:r>
         <w:t xml:space="preserve"> mà không làm lệch flex dọc?</w:t>
+      </w:r>
+    </w:p>
+    <w:p>
+      <w:pPr>
+        <w:pStyle w:val="ListParagraph"/>
+        <w:numPr>
+          <w:ilvl w:val="0"/>
+          <w:numId w:val="100"/>
+        </w:numPr>
+      </w:pPr>
+      <w:r>
+        <w:t xml:space="preserve">Mất mạng khi gửi thư mới: vì sao form bị khóa, mà lỗi </w:t>
+      </w:r>
+      <w:r>
+        <w:rPr>
+          <w:rFonts w:ascii="Consolas" w:eastAsia="Consolas" w:hAnsi="Consolas" w:cs="Consolas"/>
+        </w:rPr>
+        <w:t xml:space="preserve">400</w:t>
+      </w:r>
+      <w:r>
+        <w:t xml:space="preserve"> thì không? Nếu cho sửa chữ rồi "Gửi lại" cùng ID thì chuyện gì xảy ra?</w:t>
+      </w:r>
+    </w:p>
+    <w:p>
+      <w:pPr>
+        <w:pStyle w:val="ListParagraph"/>
+        <w:numPr>
+          <w:ilvl w:val="0"/>
+          <w:numId w:val="100"/>
+        </w:numPr>
+      </w:pPr>
+      <w:r>
+        <w:t xml:space="preserve">Vì sao </w:t>
+      </w:r>
+      <w:r>
+        <w:rPr>
+          <w:rFonts w:ascii="Consolas" w:eastAsia="Consolas" w:hAnsi="Consolas" w:cs="Consolas"/>
+        </w:rPr>
+        <w:t xml:space="preserve">502</w:t>
+      </w:r>
+      <w:r>
+        <w:t xml:space="preserve">/</w:t>
+      </w:r>
+      <w:r>
+        <w:rPr>
+          <w:rFonts w:ascii="Consolas" w:eastAsia="Consolas" w:hAnsi="Consolas" w:cs="Consolas"/>
+        </w:rPr>
+        <w:t xml:space="preserve">504</w:t>
+      </w:r>
+      <w:r>
+        <w:t xml:space="preserve"> của thư mới lại chuyển sang một cuộc trò chuyện, trong khi lỗi mạng thì ở lại form?</w:t>
       </w:r>
     </w:p>
     <w:p/>

</xml_diff>

<commit_message>
feat(nt-01): the notes data contract, sample, text and hooks
The Ghi chú screen starts on sample data (fe-ui-notes, D-42): NotesData
and NoteItem with anchors, quotes and related tasks; six notes as on the
canvas, tied to the inbox and tasks samples; the text of the list and
the editor (groups and order, accent-free search, chip counts, edit
times, source of a note, quote heading, length); hooks that write each
change into the cache. A pin is not an edit: it keeps updatedAt.

Verified: RED on stubs then GREEN; lint, tsc, 629/629 tests, build.

Co-Authored-By: Claude Opus 5.5 (1M context) <noreply@anthropic.com>
</commit_message>
<xml_diff>
--- a/docs/knowledge/phase-1-frontend-foundation.docx
+++ b/docs/knowledge/phase-1-frontend-foundation.docx
@@ -25578,6 +25578,215 @@
         <w:pStyle w:val="Heading2"/>
       </w:pPr>
       <w:r>
+        <w:t xml:space="preserve">20. Màn Ghi chú trên dữ liệu mẫu (</w:t>
+      </w:r>
+      <w:r>
+        <w:rPr>
+          <w:rFonts w:ascii="Consolas" w:eastAsia="Consolas" w:hAnsi="Consolas" w:cs="Consolas"/>
+        </w:rPr>
+        <w:t xml:space="preserve">fe-ui-notes</w:t>
+      </w:r>
+      <w:r>
+        <w:t xml:space="preserve">)</w:t>
+      </w:r>
+    </w:p>
+    <w:p>
+      <w:pPr>
+        <w:pStyle w:val="Heading3"/>
+      </w:pPr>
+      <w:r>
+        <w:t xml:space="preserve">20.0 Bức tranh</w:t>
+      </w:r>
+    </w:p>
+    <w:p>
+      <w:r>
+        <w:t xml:space="preserve">Ghi chú là F15. Backend chưa có, nên màn này dựng trước trên dữ liệu mẫu như Việc cần làm và Lịch (D-42): sáu ghi chú như canvas, neo vào cuộc trò chuyện và việc của dữ liệu mẫu Hộp thư và Việc cần làm. Khi có API, chỉ phần thân của </w:t>
+      </w:r>
+      <w:r>
+        <w:rPr>
+          <w:rFonts w:ascii="Consolas" w:eastAsia="Consolas" w:hAnsi="Consolas" w:cs="Consolas"/>
+        </w:rPr>
+        <w:t xml:space="preserve">notes.api.ts</w:t>
+      </w:r>
+      <w:r>
+        <w:t xml:space="preserve"> đổi.</w:t>
+      </w:r>
+    </w:p>
+    <w:p>
+      <w:pPr>
+        <w:shd w:val="clear" w:color="auto" w:fill="F2F3F5"/>
+        <w:ind w:left="0"/>
+      </w:pPr>
+      <w:r>
+        <w:rPr>
+          <w:rFonts w:ascii="Consolas" w:eastAsia="Consolas" w:hAnsi="Consolas" w:cs="Consolas"/>
+          <w:sz w:val="19"/>
+          <w:szCs w:val="19"/>
+        </w:rPr>
+        <w:t xml:space="preserve">notes.types.ts   hợp đồng (NotesData, NoteItem, NoteAnchor)</w:t>
+        <w:br/>
+        <w:t xml:space="preserve">notes.sample.ts  6 ghi chú, giờ dời theo đồng hồ canvas</w:t>
+        <w:br/>
+        <w:t xml:space="preserve">notes.api.ts     fetchNotes / createNote / saveNote / deleteNote  (mẫu)</w:t>
+        <w:br/>
+        <w:t xml:space="preserve">useNotes.ts      useQuery + useMutation, ghi kết quả vào cache</w:t>
+        <w:br/>
+        <w:t xml:space="preserve">format.ts        hàm thuần: nhóm, lọc, tìm không dấu, chữ giờ, nguồn</w:t>
+      </w:r>
+    </w:p>
+    <w:p>
+      <w:pPr>
+        <w:pStyle w:val="Heading3"/>
+      </w:pPr>
+      <w:r>
+        <w:t xml:space="preserve">20.1 Tìm không dấu bằng Unicode (NT-01)</w:t>
+      </w:r>
+    </w:p>
+    <w:p>
+      <w:r>
+        <w:t xml:space="preserve">Người Việt hay gõ không dấu khi tìm ("thanh toan"). </w:t>
+      </w:r>
+      <w:r>
+        <w:rPr>
+          <w:rFonts w:ascii="Consolas" w:eastAsia="Consolas" w:hAnsi="Consolas" w:cs="Consolas"/>
+        </w:rPr>
+        <w:t xml:space="preserve">normalize('NFD')</w:t>
+      </w:r>
+      <w:r>
+        <w:t xml:space="preserve"> tách chữ có dấu thành chữ gốc cộng các dấu riêng (ví dụ "á" thành "a" + dấu sắc), rồi </w:t>
+      </w:r>
+      <w:r>
+        <w:rPr>
+          <w:rFonts w:ascii="Consolas" w:eastAsia="Consolas" w:hAnsi="Consolas" w:cs="Consolas"/>
+        </w:rPr>
+        <w:t xml:space="preserve">replace(/\p{M}/gu, '')</w:t>
+      </w:r>
+      <w:r>
+        <w:t xml:space="preserve"> bỏ mọi dấu (lớp ký tự Unicode </w:t>
+      </w:r>
+      <w:r>
+        <w:rPr>
+          <w:rFonts w:ascii="Consolas" w:eastAsia="Consolas" w:hAnsi="Consolas" w:cs="Consolas"/>
+        </w:rPr>
+        <w:t xml:space="preserve">Mark</w:t>
+      </w:r>
+      <w:r>
+        <w:t xml:space="preserve">). Riêng "đ" không phải "d" cộng một dấu, nên phải đổi tay. Cùng một phép biến đổi áp cho cả từ khóa lẫn nội dung, nên so sánh công bằng.</w:t>
+      </w:r>
+    </w:p>
+    <w:p>
+      <w:pPr>
+        <w:pStyle w:val="Heading3"/>
+      </w:pPr>
+      <w:r>
+        <w:t xml:space="preserve">20.2 Mẫu trong cache, không đọc lại</w:t>
+      </w:r>
+    </w:p>
+    <w:p>
+      <w:r>
+        <w:rPr>
+          <w:rFonts w:ascii="Consolas" w:eastAsia="Consolas" w:hAnsi="Consolas" w:cs="Consolas"/>
+        </w:rPr>
+        <w:t xml:space="preserve">useNotes</w:t>
+      </w:r>
+      <w:r>
+        <w:t xml:space="preserve"> đặt </w:t>
+      </w:r>
+      <w:r>
+        <w:rPr>
+          <w:rFonts w:ascii="Consolas" w:eastAsia="Consolas" w:hAnsi="Consolas" w:cs="Consolas"/>
+        </w:rPr>
+        <w:t xml:space="preserve">staleTime: Infinity</w:t>
+      </w:r>
+      <w:r>
+        <w:t xml:space="preserve">. Dữ liệu mẫu được tạo lại mỗi lần đọc, nên nếu TanStack đọc lại (khi quay lại tab, khi dữ liệu "cũ"), mọi chỉnh sửa trong phiên sẽ mất. Các mutation ghi kết quả thẳng vào cache bằng </w:t>
+      </w:r>
+      <w:r>
+        <w:rPr>
+          <w:rFonts w:ascii="Consolas" w:eastAsia="Consolas" w:hAnsi="Consolas" w:cs="Consolas"/>
+        </w:rPr>
+        <w:t xml:space="preserve">setQueryData</w:t>
+      </w:r>
+      <w:r>
+        <w:t xml:space="preserve">. Khi nối API thật, đổi lại thành đọc lại sau mỗi thay đổi.</w:t>
+      </w:r>
+    </w:p>
+    <w:p>
+      <w:pPr>
+        <w:pStyle w:val="Heading3"/>
+      </w:pPr>
+      <w:r>
+        <w:t xml:space="preserve">20.3 Ghim không phải là sửa</w:t>
+      </w:r>
+    </w:p>
+    <w:p>
+      <w:r>
+        <w:rPr>
+          <w:rFonts w:ascii="Consolas" w:eastAsia="Consolas" w:hAnsi="Consolas" w:cs="Consolas"/>
+        </w:rPr>
+        <w:t xml:space="preserve">saveNote</w:t>
+      </w:r>
+      <w:r>
+        <w:t xml:space="preserve"> chỉ dời </w:t>
+      </w:r>
+      <w:r>
+        <w:rPr>
+          <w:rFonts w:ascii="Consolas" w:eastAsia="Consolas" w:hAnsi="Consolas" w:cs="Consolas"/>
+        </w:rPr>
+        <w:t xml:space="preserve">updatedAt</w:t>
+      </w:r>
+      <w:r>
+        <w:t xml:space="preserve"> khi tiêu đề hay nội dung đổi. Ghim một ghi chú không làm nó nhảy lên đầu "GẦN ĐÂY" như vừa sửa; nó chỉ chuyển nhóm.</w:t>
+      </w:r>
+    </w:p>
+    <w:p>
+      <w:pPr>
+        <w:pStyle w:val="Heading3"/>
+      </w:pPr>
+      <w:r>
+        <w:t xml:space="preserve">20.4 Vì sao test hook cần </w:t>
+      </w:r>
+      <w:r>
+        <w:rPr>
+          <w:rFonts w:ascii="Consolas" w:eastAsia="Consolas" w:hAnsi="Consolas" w:cs="Consolas"/>
+        </w:rPr>
+        <w:t xml:space="preserve">waitFor</w:t>
+      </w:r>
+    </w:p>
+    <w:p>
+      <w:r>
+        <w:rPr>
+          <w:rFonts w:ascii="Consolas" w:eastAsia="Consolas" w:hAnsi="Consolas" w:cs="Consolas"/>
+        </w:rPr>
+        <w:t xml:space="preserve">mutateAsync</w:t>
+      </w:r>
+      <w:r>
+        <w:t xml:space="preserve"> xong thì cache đã đổi, nhưng TanStack báo cho component qua một nhịp hẹn giờ sau đó (gom nhiều thay đổi thành một lần vẽ). Kiểm ngay sau </w:t>
+      </w:r>
+      <w:r>
+        <w:rPr>
+          <w:rFonts w:ascii="Consolas" w:eastAsia="Consolas" w:hAnsi="Consolas" w:cs="Consolas"/>
+        </w:rPr>
+        <w:t xml:space="preserve">act</w:t>
+      </w:r>
+      <w:r>
+        <w:t xml:space="preserve"> có thể còn thấy dữ liệu cũ; </w:t>
+      </w:r>
+      <w:r>
+        <w:rPr>
+          <w:rFonts w:ascii="Consolas" w:eastAsia="Consolas" w:hAnsi="Consolas" w:cs="Consolas"/>
+        </w:rPr>
+        <w:t xml:space="preserve">waitFor</w:t>
+      </w:r>
+      <w:r>
+        <w:t xml:space="preserve"> chờ tới khi điều kiện đúng.</w:t>
+      </w:r>
+    </w:p>
+    <w:p>
+      <w:pPr>
+        <w:pStyle w:val="Heading2"/>
+      </w:pPr>
+      <w:r>
         <w:t xml:space="preserve">Tự kiểm tra</w:t>
       </w:r>
     </w:p>
@@ -28531,6 +28740,45 @@
       </w:r>
       <w:r>
         <w:t xml:space="preserve"> của thư mới lại chuyển sang một cuộc trò chuyện, trong khi lỗi mạng thì ở lại form?</w:t>
+      </w:r>
+    </w:p>
+    <w:p>
+      <w:pPr>
+        <w:pStyle w:val="ListParagraph"/>
+        <w:numPr>
+          <w:ilvl w:val="0"/>
+          <w:numId w:val="100"/>
+        </w:numPr>
+      </w:pPr>
+      <w:r>
+        <w:rPr>
+          <w:rFonts w:ascii="Consolas" w:eastAsia="Consolas" w:hAnsi="Consolas" w:cs="Consolas"/>
+        </w:rPr>
+        <w:t xml:space="preserve">normalize('NFD')</w:t>
+      </w:r>
+      <w:r>
+        <w:t xml:space="preserve"> làm gì với "thanh toán", và vì sao "đ" phải đổi riêng?</w:t>
+      </w:r>
+    </w:p>
+    <w:p>
+      <w:pPr>
+        <w:pStyle w:val="ListParagraph"/>
+        <w:numPr>
+          <w:ilvl w:val="0"/>
+          <w:numId w:val="100"/>
+        </w:numPr>
+      </w:pPr>
+      <w:r>
+        <w:t xml:space="preserve">Vì sao dữ liệu mẫu của Ghi chú cần </w:t>
+      </w:r>
+      <w:r>
+        <w:rPr>
+          <w:rFonts w:ascii="Consolas" w:eastAsia="Consolas" w:hAnsi="Consolas" w:cs="Consolas"/>
+        </w:rPr>
+        <w:t xml:space="preserve">staleTime: Infinity</w:t>
+      </w:r>
+      <w:r>
+        <w:t xml:space="preserve">? Khi nối API thật thì nên đổi thế nào?</w:t>
       </w:r>
     </w:p>
     <w:p/>

</xml_diff>

<commit_message>
feat(nt-02): the Ghi chú screen: list, search, filters and an autosaving editor
/notes lists the notes as the canvas (pinned, then recent; time, start
and source on each card), with "+ Ghi chú", an accent-free search and
the filter chips, both kept in the address (fe-ui-notes D-205). A note
opens beside the list from 768 px (D-201) with its anchor, quote, text,
related task and foot. Edits save themselves 600 ms after the typing
stops, on leaving a field and on leaving the note; a new note is made
once it has text and keeps its editor when it gets its address (D-203).
Ghim is a toggle; Xóa asks first. Routes /notes, notes/new,
notes/:noteId.

Verified: RED then GREEN; headless Chrome at 1440; lint, tsc, 637/637
tests, build.

Co-Authored-By: Claude Opus 5.5 (1M context) <noreply@anthropic.com>
</commit_message>
<xml_diff>
--- a/docs/knowledge/phase-1-frontend-foundation.docx
+++ b/docs/knowledge/phase-1-frontend-foundation.docx
@@ -25784,6 +25784,190 @@
     </w:p>
     <w:p>
       <w:pPr>
+        <w:pStyle w:val="Heading3"/>
+      </w:pPr>
+      <w:r>
+        <w:t xml:space="preserve">20.5 Tự lưu bằng hẹn giờ và </w:t>
+      </w:r>
+      <w:r>
+        <w:rPr>
+          <w:rFonts w:ascii="Consolas" w:eastAsia="Consolas" w:hAnsi="Consolas" w:cs="Consolas"/>
+        </w:rPr>
+        <w:t xml:space="preserve">useRef</w:t>
+      </w:r>
+      <w:r>
+        <w:t xml:space="preserve"> (NT-02)</w:t>
+      </w:r>
+    </w:p>
+    <w:p>
+      <w:r>
+        <w:t xml:space="preserve">Mỗi lần gõ, ô soạn hủy hẹn giờ cũ và hẹn một lần lưu sau 600 ms (debounce). Rời ô (</w:t>
+      </w:r>
+      <w:r>
+        <w:rPr>
+          <w:rFonts w:ascii="Consolas" w:eastAsia="Consolas" w:hAnsi="Consolas" w:cs="Consolas"/>
+        </w:rPr>
+        <w:t xml:space="preserve">onBlur</w:t>
+      </w:r>
+      <w:r>
+        <w:t xml:space="preserve">) hay rời ghi chú (dọn dẹp của </w:t>
+      </w:r>
+      <w:r>
+        <w:rPr>
+          <w:rFonts w:ascii="Consolas" w:eastAsia="Consolas" w:hAnsi="Consolas" w:cs="Consolas"/>
+        </w:rPr>
+        <w:t xml:space="preserve">useEffect</w:t>
+      </w:r>
+      <w:r>
+        <w:t xml:space="preserve"> khi component bị gỡ) thì lưu ngay.</w:t>
+      </w:r>
+    </w:p>
+    <w:p>
+      <w:pPr>
+        <w:shd w:val="clear" w:color="auto" w:fill="F2F3F5"/>
+        <w:ind w:left="0"/>
+      </w:pPr>
+      <w:r>
+        <w:rPr>
+          <w:rFonts w:ascii="Consolas" w:eastAsia="Consolas" w:hAnsi="Consolas" w:cs="Consolas"/>
+          <w:sz w:val="19"/>
+          <w:szCs w:val="19"/>
+        </w:rPr>
+        <w:t xml:space="preserve">gõ "a" -&gt; hẹn 600ms -&gt; gõ "b" -&gt; hủy, hẹn lại 600ms -&gt; ... ngừng gõ -&gt; lưu một lần</w:t>
+        <w:br/>
+        <w:t xml:space="preserve">rời ô / rời ghi chú ------------------------------------------------&gt; lưu ngay</w:t>
+      </w:r>
+    </w:p>
+    <w:p>
+      <w:r>
+        <w:t xml:space="preserve">Hàm lưu chạy </w:t>
+      </w:r>
+      <w:r>
+        <w:rPr>
+          <w:b/>
+          <w:bCs/>
+        </w:rPr>
+        <w:t xml:space="preserve">sau</w:t>
+      </w:r>
+      <w:r>
+        <w:t xml:space="preserve"> lần vẽ đã hẹn nó, nên nó không được đọc biến của lần vẽ cũ (closure cũ): giá trị mới nhất nằm trong </w:t>
+      </w:r>
+      <w:r>
+        <w:rPr>
+          <w:rFonts w:ascii="Consolas" w:eastAsia="Consolas" w:hAnsi="Consolas" w:cs="Consolas"/>
+        </w:rPr>
+        <w:t xml:space="preserve">useRef</w:t>
+      </w:r>
+      <w:r>
+        <w:t xml:space="preserve">, được cập nhật trong một </w:t>
+      </w:r>
+      <w:r>
+        <w:rPr>
+          <w:rFonts w:ascii="Consolas" w:eastAsia="Consolas" w:hAnsi="Consolas" w:cs="Consolas"/>
+        </w:rPr>
+        <w:t xml:space="preserve">useEffect</w:t>
+      </w:r>
+      <w:r>
+        <w:t xml:space="preserve"> sau mỗi lần vẽ. Ref không làm component vẽ lại, và luôn giữ giá trị mới nhất.</w:t>
+      </w:r>
+    </w:p>
+    <w:p>
+      <w:pPr>
+        <w:pStyle w:val="Heading3"/>
+      </w:pPr>
+      <w:r>
+        <w:t xml:space="preserve">20.6 Ghi chú mới giữ nguyên ô soạn khi đổi địa chỉ</w:t>
+      </w:r>
+    </w:p>
+    <w:p>
+      <w:r>
+        <w:rPr>
+          <w:rFonts w:ascii="Consolas" w:eastAsia="Consolas" w:hAnsi="Consolas" w:cs="Consolas"/>
+        </w:rPr>
+        <w:t xml:space="preserve">/notes/new</w:t>
+      </w:r>
+      <w:r>
+        <w:t xml:space="preserve"> chỉ tạo ghi chú khi đã có chữ, rồi thay địa chỉ bằng </w:t>
+      </w:r>
+      <w:r>
+        <w:rPr>
+          <w:rFonts w:ascii="Consolas" w:eastAsia="Consolas" w:hAnsi="Consolas" w:cs="Consolas"/>
+        </w:rPr>
+        <w:t xml:space="preserve">/notes/{id}</w:t>
+      </w:r>
+      <w:r>
+        <w:t xml:space="preserve">. Nếu React gỡ ô soạn cũ và dựng ô mới (vì </w:t>
+      </w:r>
+      <w:r>
+        <w:rPr>
+          <w:rFonts w:ascii="Consolas" w:eastAsia="Consolas" w:hAnsi="Consolas" w:cs="Consolas"/>
+        </w:rPr>
+        <w:t xml:space="preserve">key</w:t>
+      </w:r>
+      <w:r>
+        <w:t xml:space="preserve"> đổi theo </w:t>
+      </w:r>
+      <w:r>
+        <w:rPr>
+          <w:rFonts w:ascii="Consolas" w:eastAsia="Consolas" w:hAnsi="Consolas" w:cs="Consolas"/>
+        </w:rPr>
+        <w:t xml:space="preserve">noteId</w:t>
+      </w:r>
+      <w:r>
+        <w:t xml:space="preserve">), con trỏ sẽ mất giữa lúc đang gõ. Lần chuyển trang đó mang </w:t>
+      </w:r>
+      <w:r>
+        <w:rPr>
+          <w:rFonts w:ascii="Consolas" w:eastAsia="Consolas" w:hAnsi="Consolas" w:cs="Consolas"/>
+        </w:rPr>
+        <w:t xml:space="preserve">state: FROM_NEW</w:t>
+      </w:r>
+      <w:r>
+        <w:t xml:space="preserve">, và trang giữ </w:t>
+      </w:r>
+      <w:r>
+        <w:rPr>
+          <w:rFonts w:ascii="Consolas" w:eastAsia="Consolas" w:hAnsi="Consolas" w:cs="Consolas"/>
+        </w:rPr>
+        <w:t xml:space="preserve">key="new"</w:t>
+      </w:r>
+      <w:r>
+        <w:t xml:space="preserve"> khi thấy state này, nên React giữ nguyên component: chữ và con trỏ không đổi.</w:t>
+      </w:r>
+    </w:p>
+    <w:p>
+      <w:pPr>
+        <w:pStyle w:val="Heading3"/>
+      </w:pPr>
+      <w:r>
+        <w:t xml:space="preserve">20.7 Nút bật/tắt giữ tên, nói trạng thái</w:t>
+      </w:r>
+    </w:p>
+    <w:p>
+      <w:r>
+        <w:t xml:space="preserve">"Ghim" là một nút bật/tắt: tên luôn là "Ghim", còn trạng thái nằm ở </w:t>
+      </w:r>
+      <w:r>
+        <w:rPr>
+          <w:rFonts w:ascii="Consolas" w:eastAsia="Consolas" w:hAnsi="Consolas" w:cs="Consolas"/>
+        </w:rPr>
+        <w:t xml:space="preserve">aria-pressed="true|false"</w:t>
+      </w:r>
+      <w:r>
+        <w:t xml:space="preserve">. Trình đọc màn hình đọc "Ghim, nút bật/tắt, đang bật". Đổi tên thành "Bỏ ghim" kèm </w:t>
+      </w:r>
+      <w:r>
+        <w:rPr>
+          <w:rFonts w:ascii="Consolas" w:eastAsia="Consolas" w:hAnsi="Consolas" w:cs="Consolas"/>
+        </w:rPr>
+        <w:t xml:space="preserve">aria-pressed</w:t>
+      </w:r>
+      <w:r>
+        <w:t xml:space="preserve"> thì người nghe nhận hai thông tin trái nhau.</w:t>
+      </w:r>
+    </w:p>
+    <w:p>
+      <w:pPr>
         <w:pStyle w:val="Heading2"/>
       </w:pPr>
       <w:r>
@@ -28779,6 +28963,66 @@
       </w:r>
       <w:r>
         <w:t xml:space="preserve">? Khi nối API thật thì nên đổi thế nào?</w:t>
+      </w:r>
+    </w:p>
+    <w:p>
+      <w:pPr>
+        <w:pStyle w:val="ListParagraph"/>
+        <w:numPr>
+          <w:ilvl w:val="0"/>
+          <w:numId w:val="100"/>
+        </w:numPr>
+      </w:pPr>
+      <w:r>
+        <w:t xml:space="preserve">Debounce 600 ms của tự lưu hoạt động thế nào? Vì sao hàm lưu đọc giá trị từ </w:t>
+      </w:r>
+      <w:r>
+        <w:rPr>
+          <w:rFonts w:ascii="Consolas" w:eastAsia="Consolas" w:hAnsi="Consolas" w:cs="Consolas"/>
+        </w:rPr>
+        <w:t xml:space="preserve">useRef</w:t>
+      </w:r>
+      <w:r>
+        <w:t xml:space="preserve"> chứ không từ biến của lần vẽ?</w:t>
+      </w:r>
+    </w:p>
+    <w:p>
+      <w:pPr>
+        <w:pStyle w:val="ListParagraph"/>
+        <w:numPr>
+          <w:ilvl w:val="0"/>
+          <w:numId w:val="100"/>
+        </w:numPr>
+      </w:pPr>
+      <w:r>
+        <w:t xml:space="preserve">Vì sao chuyển từ </w:t>
+      </w:r>
+      <w:r>
+        <w:rPr>
+          <w:rFonts w:ascii="Consolas" w:eastAsia="Consolas" w:hAnsi="Consolas" w:cs="Consolas"/>
+        </w:rPr>
+        <w:t xml:space="preserve">/notes/new</w:t>
+      </w:r>
+      <w:r>
+        <w:t xml:space="preserve"> sang </w:t>
+      </w:r>
+      <w:r>
+        <w:rPr>
+          <w:rFonts w:ascii="Consolas" w:eastAsia="Consolas" w:hAnsi="Consolas" w:cs="Consolas"/>
+        </w:rPr>
+        <w:t xml:space="preserve">/notes/{id}</w:t>
+      </w:r>
+      <w:r>
+        <w:t xml:space="preserve"> không được làm mất con trỏ, và </w:t>
+      </w:r>
+      <w:r>
+        <w:rPr>
+          <w:rFonts w:ascii="Consolas" w:eastAsia="Consolas" w:hAnsi="Consolas" w:cs="Consolas"/>
+        </w:rPr>
+        <w:t xml:space="preserve">key</w:t>
+      </w:r>
+      <w:r>
+        <w:t xml:space="preserve"> của component liên quan gì?</w:t>
       </w:r>
     </w:p>
     <w:p/>

</xml_diff>

<commit_message>
feat(nt-03): Ghi chú on a phone and a tablet, and its states
Below 768 px the list and the note are two pages (canvas MobileNotes,
MobileNoteEditor): the list's own header goes back to "Thêm", counts
the notes, starts a new one and opens the search; the note's header
goes back to the list with its filter, says when it was saved and
holds Ghim, and its foot has the length and Xóa (fe-ui-notes D-201).
Cards span the width as on the canvas. From 768 px the list and the
note sit side by side. Loading, failure (with "Thử lại") and no note
yet (with "+ Ghi chú") each have their state.

A mutation check of notes/format.ts caught 29 of 30 mutants; the one
left (a whole day read in the reader's zone) is now caught by a case
14 hours ahead of UTC.

Verified: RED then GREEN; headless Chrome at 1024/390; lint, tsc,
643/643 tests, build.

Co-Authored-By: Claude Opus 5.5 (1M context) <noreply@anthropic.com>
</commit_message>
<xml_diff>
--- a/docs/knowledge/phase-1-frontend-foundation.docx
+++ b/docs/knowledge/phase-1-frontend-foundation.docx
@@ -25968,6 +25968,101 @@
     </w:p>
     <w:p>
       <w:pPr>
+        <w:pStyle w:val="Heading3"/>
+      </w:pPr>
+      <w:r>
+        <w:t xml:space="preserve">20.8 Một DOM cho mọi cỡ màn, và test không thấy CSS (NT-03)</w:t>
+      </w:r>
+    </w:p>
+    <w:p>
+      <w:r>
+        <w:t xml:space="preserve">Trên điện thoại, danh sách có đầu trang riêng (quay lại "Thêm", "6 GHI CHÚ", "+", tìm); trang ghi chú có đầu trang riêng (quay lại, "TỰ LƯU · 09:52", Ghim) và thanh đáy (số ký tự, "Xóa"). Các phần này nằm cùng DOM với phần của desktop và được ẩn hiện bằng </w:t>
+      </w:r>
+      <w:r>
+        <w:rPr>
+          <w:rFonts w:ascii="Consolas" w:eastAsia="Consolas" w:hAnsi="Consolas" w:cs="Consolas"/>
+        </w:rPr>
+        <w:t xml:space="preserve">md:hidden</w:t>
+      </w:r>
+      <w:r>
+        <w:t xml:space="preserve"> / </w:t>
+      </w:r>
+      <w:r>
+        <w:rPr>
+          <w:rFonts w:ascii="Consolas" w:eastAsia="Consolas" w:hAnsi="Consolas" w:cs="Consolas"/>
+        </w:rPr>
+        <w:t xml:space="preserve">max-md:hidden</w:t>
+      </w:r>
+      <w:r>
+        <w:t xml:space="preserve">. Hệ quả cho test:</w:t>
+      </w:r>
+    </w:p>
+    <w:p>
+      <w:pPr>
+        <w:pStyle w:val="ListParagraph"/>
+        <w:numPr>
+          <w:ilvl w:val="0"/>
+          <w:numId w:val="1"/>
+        </w:numPr>
+      </w:pPr>
+      <w:r>
+        <w:t xml:space="preserve">jsdom không chạy CSS, nên trong test cả hai tiêu đề "Ghi chú" đều có mặt. Test phải tìm đúng phần mình muốn, ví dụ tìm đầu trang theo nút quay lại của nó.</w:t>
+      </w:r>
+    </w:p>
+    <w:p>
+      <w:pPr>
+        <w:pStyle w:val="ListParagraph"/>
+        <w:numPr>
+          <w:ilvl w:val="0"/>
+          <w:numId w:val="1"/>
+        </w:numPr>
+      </w:pPr>
+      <w:r>
+        <w:t xml:space="preserve">Chuyện "thấy hay không" chỉ đo được ở trình duyệt thật (</w:t>
+      </w:r>
+      <w:r>
+        <w:rPr>
+          <w:rFonts w:ascii="Consolas" w:eastAsia="Consolas" w:hAnsi="Consolas" w:cs="Consolas"/>
+        </w:rPr>
+        <w:t xml:space="preserve">getComputedStyle(...).display</w:t>
+      </w:r>
+      <w:r>
+        <w:t xml:space="preserve">, độ rộng). Lượt Chrome mỗi task làm việc đó.</w:t>
+      </w:r>
+    </w:p>
+    <w:p>
+      <w:pPr>
+        <w:pStyle w:val="Heading3"/>
+      </w:pPr>
+      <w:r>
+        <w:t xml:space="preserve">20.9 Kiểm bằng lỗi gài (mutation) một lần cho cả màn</w:t>
+      </w:r>
+    </w:p>
+    <w:p>
+      <w:r>
+        <w:t xml:space="preserve">Script </w:t>
+      </w:r>
+      <w:r>
+        <w:rPr>
+          <w:rFonts w:ascii="Consolas" w:eastAsia="Consolas" w:hAnsi="Consolas" w:cs="Consolas"/>
+        </w:rPr>
+        <w:t xml:space="preserve">mutate.mjs</w:t>
+      </w:r>
+      <w:r>
+        <w:t xml:space="preserve"> lần lượt sửa sai </w:t>
+      </w:r>
+      <w:r>
+        <w:rPr>
+          <w:rFonts w:ascii="Consolas" w:eastAsia="Consolas" w:hAnsi="Consolas" w:cs="Consolas"/>
+        </w:rPr>
+        <w:t xml:space="preserve">format.ts</w:t>
+      </w:r>
+      <w:r>
+        <w:t xml:space="preserve"> ở 30 chỗ (đổi điều kiện, bỏ một phép biến đổi, đổi chữ), chạy test, rồi trả file về như cũ. Test đỏ thì lỗi gài "bị bắt"; test vẫn xanh thì lỗi "sống sót", tức là có một hành vi không test nào canh. Lần này 29/30 bị bắt; lỗi sống sót là "ngày cả ngày tính theo múi giờ người xem". Với múi giờ +7, trưa UTC vẫn là cùng ngày nên test không phân biệt được. Thêm một trường hợp ở múi giờ +14 (Kiribati) thì lỗi đó bị bắt.</w:t>
+      </w:r>
+    </w:p>
+    <w:p>
+      <w:pPr>
         <w:pStyle w:val="Heading2"/>
       </w:pPr>
       <w:r>
@@ -29023,6 +29118,18 @@
       </w:r>
       <w:r>
         <w:t xml:space="preserve"> của component liên quan gì?</w:t>
+      </w:r>
+    </w:p>
+    <w:p>
+      <w:pPr>
+        <w:pStyle w:val="ListParagraph"/>
+        <w:numPr>
+          <w:ilvl w:val="0"/>
+          <w:numId w:val="100"/>
+        </w:numPr>
+      </w:pPr>
+      <w:r>
+        <w:t xml:space="preserve">Một lỗi gài "sống sót" nói lên điều gì về bộ test? Vì sao lỗi "ngày cả ngày theo múi giờ người xem" sống sót với múi giờ +7?</w:t>
       </w:r>
     </w:p>
     <w:p/>

</xml_diff>

<commit_message>
feat(si-01): public static site package with its frame and the 404 page
apps/sino-site builds plain HTML with no script (D-240, D-247): shared
head, top bar with a <details> phone menu, footer in Vietnamese and
English, self-hosted Inter and JetBrains Mono, theme from the OS.
Owner details live in site.config.ts; `pnpm build` refuses to run while
any is missing or badly written, `pnpm build:preview` marks them and
sets noindex (D-242). `pnpm serve` answers like a static host.

Co-Authored-By: Claude Opus 5.5 (1M context) <noreply@anthropic.com>
</commit_message>
<xml_diff>
--- a/docs/knowledge/phase-1-frontend-foundation.docx
+++ b/docs/knowledge/phase-1-frontend-foundation.docx
@@ -26066,6 +26066,727 @@
         <w:pStyle w:val="Heading2"/>
       </w:pPr>
       <w:r>
+        <w:t xml:space="preserve">21. Site công khai cho Google (</w:t>
+      </w:r>
+      <w:r>
+        <w:rPr>
+          <w:rFonts w:ascii="Consolas" w:eastAsia="Consolas" w:hAnsi="Consolas" w:cs="Consolas"/>
+        </w:rPr>
+        <w:t xml:space="preserve">site-public-pages</w:t>
+      </w:r>
+      <w:r>
+        <w:t xml:space="preserve">)</w:t>
+      </w:r>
+    </w:p>
+    <w:p>
+      <w:pPr>
+        <w:pStyle w:val="Heading3"/>
+      </w:pPr>
+      <w:r>
+        <w:t xml:space="preserve">21.0 Bức tranh</w:t>
+      </w:r>
+    </w:p>
+    <w:p>
+      <w:r>
+        <w:t xml:space="preserve">Muốn đưa ứng dụng OAuth của Sino ra khỏi chế độ Testing, Google bắt khai một trang chủ và một Chính sách quyền riêng tư. Hai trang phải công khai, không cần đăng nhập, không chuyển hướng, và đặt trên tên miền mình sở hữu. </w:t>
+      </w:r>
+      <w:r>
+        <w:rPr>
+          <w:rFonts w:ascii="Consolas" w:eastAsia="Consolas" w:hAnsi="Consolas" w:cs="Consolas"/>
+        </w:rPr>
+        <w:t xml:space="preserve">sino-web</w:t>
+      </w:r>
+      <w:r>
+        <w:t xml:space="preserve"> không hợp: mọi trang của nó nằm sau đăng nhập, và </w:t>
+      </w:r>
+      <w:r>
+        <w:rPr>
+          <w:rFonts w:ascii="Consolas" w:eastAsia="Consolas" w:hAnsi="Consolas" w:cs="Consolas"/>
+        </w:rPr>
+        <w:t xml:space="preserve">/</w:t>
+      </w:r>
+      <w:r>
+        <w:t xml:space="preserve"> chuyển hướng. Vì vậy site là một gói riêng </w:t>
+      </w:r>
+      <w:r>
+        <w:rPr>
+          <w:rFonts w:ascii="Consolas" w:eastAsia="Consolas" w:hAnsi="Consolas" w:cs="Consolas"/>
+        </w:rPr>
+        <w:t xml:space="preserve">apps/sino-site</w:t>
+      </w:r>
+      <w:r>
+        <w:t xml:space="preserve">, sinh ra HTML tĩnh và không cần JavaScript (D-240).</w:t>
+      </w:r>
+    </w:p>
+    <w:p>
+      <w:pPr>
+        <w:shd w:val="clear" w:color="auto" w:fill="F2F3F5"/>
+        <w:ind w:left="0"/>
+      </w:pPr>
+      <w:r>
+        <w:rPr>
+          <w:rFonts w:ascii="Consolas" w:eastAsia="Consolas" w:hAnsi="Consolas" w:cs="Consolas"/>
+          <w:sz w:val="19"/>
+          <w:szCs w:val="19"/>
+        </w:rPr>
+        <w:t xml:space="preserve">site.config.ts --&gt; configProblems --&gt; production: thiếu thì dừng, không ghi gì</w:t>
+        <w:br/>
+        <w:t xml:space="preserve">                                      preview: hiện "[chưa điền: ...]", noindex</w:t>
+        <w:br/>
+        <w:br/>
+        <w:t xml:space="preserve">src/pages/*.ts --&gt; PageSpec --&gt; layout.renderPage --&gt; HTML --+</w:t>
+        <w:br/>
+        <w:t xml:space="preserve">styles/site.css, public/, phông chữ -----------------------&gt;+--&gt; dist/</w:t>
+      </w:r>
+    </w:p>
+    <w:p>
+      <w:pPr>
+        <w:pStyle w:val="Heading3"/>
+      </w:pPr>
+      <w:r>
+        <w:t xml:space="preserve">21.1 Chạy TypeScript thẳng bằng Node (SI-01)</w:t>
+      </w:r>
+    </w:p>
+    <w:p>
+      <w:r>
+        <w:t xml:space="preserve">Node 26 chạy được file </w:t>
+      </w:r>
+      <w:r>
+        <w:rPr>
+          <w:rFonts w:ascii="Consolas" w:eastAsia="Consolas" w:hAnsi="Consolas" w:cs="Consolas"/>
+        </w:rPr>
+        <w:t xml:space="preserve">.ts</w:t>
+      </w:r>
+      <w:r>
+        <w:t xml:space="preserve"> bằng cách bỏ phần kiểu đi (type stripping), không biên dịch. Đổi lại có hai luật:</w:t>
+      </w:r>
+    </w:p>
+    <w:p>
+      <w:pPr>
+        <w:pStyle w:val="ListParagraph"/>
+        <w:numPr>
+          <w:ilvl w:val="0"/>
+          <w:numId w:val="1"/>
+        </w:numPr>
+      </w:pPr>
+      <w:r>
+        <w:t xml:space="preserve">Chỉ dùng cú pháp "xóa được": không </w:t>
+      </w:r>
+      <w:r>
+        <w:rPr>
+          <w:rFonts w:ascii="Consolas" w:eastAsia="Consolas" w:hAnsi="Consolas" w:cs="Consolas"/>
+        </w:rPr>
+        <w:t xml:space="preserve">enum</w:t>
+      </w:r>
+      <w:r>
+        <w:t xml:space="preserve">, không </w:t>
+      </w:r>
+      <w:r>
+        <w:rPr>
+          <w:rFonts w:ascii="Consolas" w:eastAsia="Consolas" w:hAnsi="Consolas" w:cs="Consolas"/>
+        </w:rPr>
+        <w:t xml:space="preserve">namespace</w:t>
+      </w:r>
+      <w:r>
+        <w:t xml:space="preserve">, không khai thuộc tính trong tham số constructor (</w:t>
+      </w:r>
+      <w:r>
+        <w:rPr>
+          <w:rFonts w:ascii="Consolas" w:eastAsia="Consolas" w:hAnsi="Consolas" w:cs="Consolas"/>
+        </w:rPr>
+        <w:t xml:space="preserve">constructor(readonly value: string)</w:t>
+      </w:r>
+      <w:r>
+        <w:t xml:space="preserve">). Vì vậy lớp </w:t>
+      </w:r>
+      <w:r>
+        <w:rPr>
+          <w:rFonts w:ascii="Consolas" w:eastAsia="Consolas" w:hAnsi="Consolas" w:cs="Consolas"/>
+        </w:rPr>
+        <w:t xml:space="preserve">Html</w:t>
+      </w:r>
+      <w:r>
+        <w:t xml:space="preserve"> gán </w:t>
+      </w:r>
+      <w:r>
+        <w:rPr>
+          <w:rFonts w:ascii="Consolas" w:eastAsia="Consolas" w:hAnsi="Consolas" w:cs="Consolas"/>
+        </w:rPr>
+        <w:t xml:space="preserve">this.value</w:t>
+      </w:r>
+      <w:r>
+        <w:t xml:space="preserve"> trong thân constructor. </w:t>
+      </w:r>
+      <w:r>
+        <w:rPr>
+          <w:rFonts w:ascii="Consolas" w:eastAsia="Consolas" w:hAnsi="Consolas" w:cs="Consolas"/>
+        </w:rPr>
+        <w:t xml:space="preserve">tsconfig</w:t>
+      </w:r>
+      <w:r>
+        <w:t xml:space="preserve"> bật </w:t>
+      </w:r>
+      <w:r>
+        <w:rPr>
+          <w:rFonts w:ascii="Consolas" w:eastAsia="Consolas" w:hAnsi="Consolas" w:cs="Consolas"/>
+        </w:rPr>
+        <w:t xml:space="preserve">erasableSyntaxOnly</w:t>
+      </w:r>
+      <w:r>
+        <w:t xml:space="preserve"> để </w:t>
+      </w:r>
+      <w:r>
+        <w:rPr>
+          <w:rFonts w:ascii="Consolas" w:eastAsia="Consolas" w:hAnsi="Consolas" w:cs="Consolas"/>
+        </w:rPr>
+        <w:t xml:space="preserve">tsc</w:t>
+      </w:r>
+      <w:r>
+        <w:t xml:space="preserve"> báo lỗi sớm.</w:t>
+      </w:r>
+    </w:p>
+    <w:p>
+      <w:pPr>
+        <w:pStyle w:val="ListParagraph"/>
+        <w:numPr>
+          <w:ilvl w:val="0"/>
+          <w:numId w:val="1"/>
+        </w:numPr>
+      </w:pPr>
+      <w:r>
+        <w:t xml:space="preserve">Import phải ghi đủ đuôi </w:t>
+      </w:r>
+      <w:r>
+        <w:rPr>
+          <w:rFonts w:ascii="Consolas" w:eastAsia="Consolas" w:hAnsi="Consolas" w:cs="Consolas"/>
+        </w:rPr>
+        <w:t xml:space="preserve">.ts</w:t>
+      </w:r>
+      <w:r>
+        <w:t xml:space="preserve"> (</w:t>
+      </w:r>
+      <w:r>
+        <w:rPr>
+          <w:rFonts w:ascii="Consolas" w:eastAsia="Consolas" w:hAnsi="Consolas" w:cs="Consolas"/>
+        </w:rPr>
+        <w:t xml:space="preserve">allowImportingTsExtensions</w:t>
+      </w:r>
+      <w:r>
+        <w:t xml:space="preserve">). </w:t>
+      </w:r>
+      <w:r>
+        <w:rPr>
+          <w:rFonts w:ascii="Consolas" w:eastAsia="Consolas" w:hAnsi="Consolas" w:cs="Consolas"/>
+        </w:rPr>
+        <w:t xml:space="preserve">tsc</w:t>
+      </w:r>
+      <w:r>
+        <w:t xml:space="preserve"> chỉ kiểm tra (</w:t>
+      </w:r>
+      <w:r>
+        <w:rPr>
+          <w:rFonts w:ascii="Consolas" w:eastAsia="Consolas" w:hAnsi="Consolas" w:cs="Consolas"/>
+        </w:rPr>
+        <w:t xml:space="preserve">noEmit</w:t>
+      </w:r>
+      <w:r>
+        <w:t xml:space="preserve">), không sinh file.</w:t>
+      </w:r>
+    </w:p>
+    <w:p>
+      <w:pPr>
+        <w:pStyle w:val="Heading3"/>
+      </w:pPr>
+      <w:r>
+        <w:t xml:space="preserve">21.2 Template </w:t>
+      </w:r>
+      <w:r>
+        <w:rPr>
+          <w:rFonts w:ascii="Consolas" w:eastAsia="Consolas" w:hAnsi="Consolas" w:cs="Consolas"/>
+        </w:rPr>
+        <w:t xml:space="preserve">html</w:t>
+      </w:r>
+      <w:r>
+        <w:t xml:space="preserve"> và escape</w:t>
+      </w:r>
+    </w:p>
+    <w:p>
+      <w:r>
+        <w:t xml:space="preserve">Trang được viết bằng tagged template: </w:t>
+      </w:r>
+      <w:r>
+        <w:rPr>
+          <w:rFonts w:ascii="Consolas" w:eastAsia="Consolas" w:hAnsi="Consolas" w:cs="Consolas"/>
+        </w:rPr>
+        <w:t xml:space="preserve">html`&lt;p&gt;${name}&lt;/p&gt;`</w:t>
+      </w:r>
+      <w:r>
+        <w:t xml:space="preserve">. Phần chữ cố định là markup do mình viết, còn giá trị chèn vào (</w:t>
+      </w:r>
+      <w:r>
+        <w:rPr>
+          <w:rFonts w:ascii="Consolas" w:eastAsia="Consolas" w:hAnsi="Consolas" w:cs="Consolas"/>
+        </w:rPr>
+        <w:t xml:space="preserve">${name}</w:t>
+      </w:r>
+      <w:r>
+        <w:t xml:space="preserve">) luôn được escape (</w:t>
+      </w:r>
+      <w:r>
+        <w:rPr>
+          <w:rFonts w:ascii="Consolas" w:eastAsia="Consolas" w:hAnsi="Consolas" w:cs="Consolas"/>
+        </w:rPr>
+        <w:t xml:space="preserve">&amp;</w:t>
+      </w:r>
+      <w:r>
+        <w:t xml:space="preserve"> thành </w:t>
+      </w:r>
+      <w:r>
+        <w:rPr>
+          <w:rFonts w:ascii="Consolas" w:eastAsia="Consolas" w:hAnsi="Consolas" w:cs="Consolas"/>
+        </w:rPr>
+        <w:t xml:space="preserve">&amp;amp;</w:t>
+      </w:r>
+      <w:r>
+        <w:t xml:space="preserve">, </w:t>
+      </w:r>
+      <w:r>
+        <w:rPr>
+          <w:rFonts w:ascii="Consolas" w:eastAsia="Consolas" w:hAnsi="Consolas" w:cs="Consolas"/>
+        </w:rPr>
+        <w:t xml:space="preserve">&lt;</w:t>
+      </w:r>
+      <w:r>
+        <w:t xml:space="preserve"> thành </w:t>
+      </w:r>
+      <w:r>
+        <w:rPr>
+          <w:rFonts w:ascii="Consolas" w:eastAsia="Consolas" w:hAnsi="Consolas" w:cs="Consolas"/>
+        </w:rPr>
+        <w:t xml:space="preserve">&amp;lt;</w:t>
+      </w:r>
+      <w:r>
+        <w:t xml:space="preserve">...). Trừ khi giá trị đã là </w:t>
+      </w:r>
+      <w:r>
+        <w:rPr>
+          <w:rFonts w:ascii="Consolas" w:eastAsia="Consolas" w:hAnsi="Consolas" w:cs="Consolas"/>
+        </w:rPr>
+        <w:t xml:space="preserve">Html</w:t>
+      </w:r>
+      <w:r>
+        <w:t xml:space="preserve">, tức là markup đã an toàn. Đây cũng là cách JSX của React làm với chữ. Nhờ vậy, một tên như "A &amp; B" trong </w:t>
+      </w:r>
+      <w:r>
+        <w:rPr>
+          <w:rFonts w:ascii="Consolas" w:eastAsia="Consolas" w:hAnsi="Consolas" w:cs="Consolas"/>
+        </w:rPr>
+        <w:t xml:space="preserve">site.config.ts</w:t>
+      </w:r>
+      <w:r>
+        <w:t xml:space="preserve"> không làm hỏng trang.</w:t>
+      </w:r>
+    </w:p>
+    <w:p>
+      <w:pPr>
+        <w:pStyle w:val="Heading3"/>
+      </w:pPr>
+      <w:r>
+        <w:t xml:space="preserve">21.3 Hai chế độ dựng: không để lỡ đưa bản thiếu lên mạng</w:t>
+      </w:r>
+    </w:p>
+    <w:p>
+      <w:r>
+        <w:rPr>
+          <w:rFonts w:ascii="Consolas" w:eastAsia="Consolas" w:hAnsi="Consolas" w:cs="Consolas"/>
+        </w:rPr>
+        <w:t xml:space="preserve">pnpm build</w:t>
+      </w:r>
+      <w:r>
+        <w:t xml:space="preserve"> gọi </w:t>
+      </w:r>
+      <w:r>
+        <w:rPr>
+          <w:rFonts w:ascii="Consolas" w:eastAsia="Consolas" w:hAnsi="Consolas" w:cs="Consolas"/>
+        </w:rPr>
+        <w:t xml:space="preserve">configProblems</w:t>
+      </w:r>
+      <w:r>
+        <w:t xml:space="preserve"> trước khi đụng tới thư mục ra. Còn trường nào trống hoặc viết sai (URL có </w:t>
+      </w:r>
+      <w:r>
+        <w:rPr>
+          <w:rFonts w:ascii="Consolas" w:eastAsia="Consolas" w:hAnsi="Consolas" w:cs="Consolas"/>
+        </w:rPr>
+        <w:t xml:space="preserve">/</w:t>
+      </w:r>
+      <w:r>
+        <w:t xml:space="preserve"> cuối, ngày 30/02...) thì ném </w:t>
+      </w:r>
+      <w:r>
+        <w:rPr>
+          <w:rFonts w:ascii="Consolas" w:eastAsia="Consolas" w:hAnsi="Consolas" w:cs="Consolas"/>
+        </w:rPr>
+        <w:t xml:space="preserve">ConfigError</w:t>
+      </w:r>
+      <w:r>
+        <w:t xml:space="preserve"> và không ghi file nào. Script đặt </w:t>
+      </w:r>
+      <w:r>
+        <w:rPr>
+          <w:rFonts w:ascii="Consolas" w:eastAsia="Consolas" w:hAnsi="Consolas" w:cs="Consolas"/>
+        </w:rPr>
+        <w:t xml:space="preserve">process.exitCode = 1</w:t>
+      </w:r>
+      <w:r>
+        <w:t xml:space="preserve"> thay vì gọi </w:t>
+      </w:r>
+      <w:r>
+        <w:rPr>
+          <w:rFonts w:ascii="Consolas" w:eastAsia="Consolas" w:hAnsi="Consolas" w:cs="Consolas"/>
+        </w:rPr>
+        <w:t xml:space="preserve">process.exit(1)</w:t>
+      </w:r>
+      <w:r>
+        <w:t xml:space="preserve">, để Node in hết thông báo rồi mới thoát. </w:t>
+      </w:r>
+      <w:r>
+        <w:rPr>
+          <w:rFonts w:ascii="Consolas" w:eastAsia="Consolas" w:hAnsi="Consolas" w:cs="Consolas"/>
+        </w:rPr>
+        <w:t xml:space="preserve">pnpm build:preview</w:t>
+      </w:r>
+      <w:r>
+        <w:t xml:space="preserve"> vẫn dựng được để xem, nhưng đánh dấu chỗ thiếu và gắn </w:t>
+      </w:r>
+      <w:r>
+        <w:rPr>
+          <w:rFonts w:ascii="Consolas" w:eastAsia="Consolas" w:hAnsi="Consolas" w:cs="Consolas"/>
+        </w:rPr>
+        <w:t xml:space="preserve">noindex</w:t>
+      </w:r>
+      <w:r>
+        <w:t xml:space="preserve"> cho mọi trang, phòng khi bản xem trước bị lỡ đưa lên mạng.</w:t>
+      </w:r>
+    </w:p>
+    <w:p>
+      <w:pPr>
+        <w:pStyle w:val="Heading3"/>
+      </w:pPr>
+      <w:r>
+        <w:t xml:space="preserve">21.4 Menu điện thoại không cần JavaScript</w:t>
+      </w:r>
+    </w:p>
+    <w:p>
+      <w:r>
+        <w:rPr>
+          <w:rFonts w:ascii="Consolas" w:eastAsia="Consolas" w:hAnsi="Consolas" w:cs="Consolas"/>
+        </w:rPr>
+        <w:t xml:space="preserve">&lt;details&gt;</w:t>
+      </w:r>
+      <w:r>
+        <w:t xml:space="preserve"> và </w:t>
+      </w:r>
+      <w:r>
+        <w:rPr>
+          <w:rFonts w:ascii="Consolas" w:eastAsia="Consolas" w:hAnsi="Consolas" w:cs="Consolas"/>
+        </w:rPr>
+        <w:t xml:space="preserve">&lt;summary&gt;</w:t>
+      </w:r>
+      <w:r>
+        <w:t xml:space="preserve"> là phần tử có sẵn của HTML: bấm </w:t>
+      </w:r>
+      <w:r>
+        <w:rPr>
+          <w:rFonts w:ascii="Consolas" w:eastAsia="Consolas" w:hAnsi="Consolas" w:cs="Consolas"/>
+        </w:rPr>
+        <w:t xml:space="preserve">summary</w:t>
+      </w:r>
+      <w:r>
+        <w:t xml:space="preserve"> thì phần còn lại hiện hoặc ẩn. Bàn phím (Enter, Space) và trình đọc màn hình (trạng thái mở/đóng) đều được trình duyệt lo sẵn. CSS giấu dấu tam giác mặc định (</w:t>
+      </w:r>
+      <w:r>
+        <w:rPr>
+          <w:rFonts w:ascii="Consolas" w:eastAsia="Consolas" w:hAnsi="Consolas" w:cs="Consolas"/>
+        </w:rPr>
+        <w:t xml:space="preserve">list-style: none</w:t>
+      </w:r>
+      <w:r>
+        <w:t xml:space="preserve">, </w:t>
+      </w:r>
+      <w:r>
+        <w:rPr>
+          <w:rFonts w:ascii="Consolas" w:eastAsia="Consolas" w:hAnsi="Consolas" w:cs="Consolas"/>
+        </w:rPr>
+        <w:t xml:space="preserve">::-webkit-details-marker</w:t>
+      </w:r>
+      <w:r>
+        <w:t xml:space="preserve">). Danh sách link đặt </w:t>
+      </w:r>
+      <w:r>
+        <w:rPr>
+          <w:rFonts w:ascii="Consolas" w:eastAsia="Consolas" w:hAnsi="Consolas" w:cs="Consolas"/>
+        </w:rPr>
+        <w:t xml:space="preserve">position: absolute; top: 100%</w:t>
+      </w:r>
+      <w:r>
+        <w:t xml:space="preserve">: phần tử định vị gần nhất bên ngoài là thanh trên </w:t>
+      </w:r>
+      <w:r>
+        <w:rPr>
+          <w:rFonts w:ascii="Consolas" w:eastAsia="Consolas" w:hAnsi="Consolas" w:cs="Consolas"/>
+        </w:rPr>
+        <w:t xml:space="preserve">position: sticky</w:t>
+      </w:r>
+      <w:r>
+        <w:t xml:space="preserve">, nên danh sách hiện ngay dưới thanh trên.</w:t>
+      </w:r>
+    </w:p>
+    <w:p>
+      <w:pPr>
+        <w:pStyle w:val="Heading3"/>
+      </w:pPr>
+      <w:r>
+        <w:t xml:space="preserve">21.5 Theme theo hệ điều hành</w:t>
+      </w:r>
+    </w:p>
+    <w:p>
+      <w:r>
+        <w:t xml:space="preserve">Bộ biến màu tối của canvas là mặc định. </w:t>
+      </w:r>
+      <w:r>
+        <w:rPr>
+          <w:rFonts w:ascii="Consolas" w:eastAsia="Consolas" w:hAnsi="Consolas" w:cs="Consolas"/>
+        </w:rPr>
+        <w:t xml:space="preserve">@media (prefers-color-scheme: light)</w:t>
+      </w:r>
+      <w:r>
+        <w:t xml:space="preserve"> đổi giá trị của cùng những tên biến đó, nên phần còn lại của CSS không cần biết đang ở theme nào. Thẻ </w:t>
+      </w:r>
+      <w:r>
+        <w:rPr>
+          <w:rFonts w:ascii="Consolas" w:eastAsia="Consolas" w:hAnsi="Consolas" w:cs="Consolas"/>
+        </w:rPr>
+        <w:t xml:space="preserve">&lt;meta name="color-scheme" content="dark light"&gt;</w:t>
+      </w:r>
+      <w:r>
+        <w:t xml:space="preserve"> báo cho trình duyệt vẽ thanh cuộn và ô nhập theo cùng theme.</w:t>
+      </w:r>
+    </w:p>
+    <w:p>
+      <w:pPr>
+        <w:pStyle w:val="Heading3"/>
+      </w:pPr>
+      <w:r>
+        <w:t xml:space="preserve">21.6 Test trên HTML thật, và một danh sách chỉ được phép ngắn đi</w:t>
+      </w:r>
+    </w:p>
+    <w:p>
+      <w:r>
+        <w:t xml:space="preserve">Test dựng site vào một thư mục tạm, đọc từng file bằng jsdom, rồi kiểm: thẻ </w:t>
+      </w:r>
+      <w:r>
+        <w:rPr>
+          <w:rFonts w:ascii="Consolas" w:eastAsia="Consolas" w:hAnsi="Consolas" w:cs="Consolas"/>
+        </w:rPr>
+        <w:t xml:space="preserve">head</w:t>
+      </w:r>
+      <w:r>
+        <w:t xml:space="preserve">, không có </w:t>
+      </w:r>
+      <w:r>
+        <w:rPr>
+          <w:rFonts w:ascii="Consolas" w:eastAsia="Consolas" w:hAnsi="Consolas" w:cs="Consolas"/>
+        </w:rPr>
+        <w:t xml:space="preserve">&lt;script&gt;</w:t>
+      </w:r>
+      <w:r>
+        <w:t xml:space="preserve">, mọi tài nguyên lấy từ chính site, mọi link nội bộ trỏ tới trang hay </w:t>
+      </w:r>
+      <w:r>
+        <w:rPr>
+          <w:rFonts w:ascii="Consolas" w:eastAsia="Consolas" w:hAnsi="Consolas" w:cs="Consolas"/>
+        </w:rPr>
+        <w:t xml:space="preserve">id</w:t>
+      </w:r>
+      <w:r>
+        <w:t xml:space="preserve"> có thật. Thanh trên và chân trang đã link tới các trang chưa làm, nên test có danh sách </w:t>
+      </w:r>
+      <w:r>
+        <w:rPr>
+          <w:rFonts w:ascii="Consolas" w:eastAsia="Consolas" w:hAnsi="Consolas" w:cs="Consolas"/>
+        </w:rPr>
+        <w:t xml:space="preserve">PAGES_NOT_BUILT_YET</w:t>
+      </w:r>
+      <w:r>
+        <w:t xml:space="preserve">. Một test khác kiểm rằng các trang trong danh sách đó </w:t>
+      </w:r>
+      <w:r>
+        <w:rPr>
+          <w:b/>
+          <w:bCs/>
+        </w:rPr>
+        <w:t xml:space="preserve">thật sự chưa có</w:t>
+      </w:r>
+      <w:r>
+        <w:t xml:space="preserve">: làm xong một trang mà quên xóa nó khỏi danh sách thì test đỏ. Nhờ vậy danh sách không thể nằm đó mãi để che link gãy.</w:t>
+      </w:r>
+    </w:p>
+    <w:p>
+      <w:r>
+        <w:t xml:space="preserve">Phần "trông có đúng không" thì jsdom không biết, vì nó không chạy CSS. Script CDP mở Chrome headless, giả lập </w:t>
+      </w:r>
+      <w:r>
+        <w:rPr>
+          <w:rFonts w:ascii="Consolas" w:eastAsia="Consolas" w:hAnsi="Consolas" w:cs="Consolas"/>
+        </w:rPr>
+        <w:t xml:space="preserve">prefers-color-scheme</w:t>
+      </w:r>
+      <w:r>
+        <w:t xml:space="preserve">, đặt cỡ màn, đo </w:t>
+      </w:r>
+      <w:r>
+        <w:rPr>
+          <w:rFonts w:ascii="Consolas" w:eastAsia="Consolas" w:hAnsi="Consolas" w:cs="Consolas"/>
+        </w:rPr>
+        <w:t xml:space="preserve">scrollWidth - innerWidth</w:t>
+      </w:r>
+      <w:r>
+        <w:t xml:space="preserve"> (cuộn ngang) và kiểm </w:t>
+      </w:r>
+      <w:r>
+        <w:rPr>
+          <w:rFonts w:ascii="Consolas" w:eastAsia="Consolas" w:hAnsi="Consolas" w:cs="Consolas"/>
+        </w:rPr>
+        <w:t xml:space="preserve">document.fonts.check(...)</w:t>
+      </w:r>
+      <w:r>
+        <w:t xml:space="preserve"> để biết phông tiếng Việt đã nạp.</w:t>
+      </w:r>
+    </w:p>
+    <w:p>
+      <w:pPr>
+        <w:pStyle w:val="Heading3"/>
+      </w:pPr>
+      <w:r>
+        <w:t xml:space="preserve">21.7 Phục vụ như host tĩnh và chặn path traversal</w:t>
+      </w:r>
+    </w:p>
+    <w:p>
+      <w:r>
+        <w:rPr>
+          <w:rFonts w:ascii="Consolas" w:eastAsia="Consolas" w:hAnsi="Consolas" w:cs="Consolas"/>
+        </w:rPr>
+        <w:t xml:space="preserve">pnpm serve</w:t>
+      </w:r>
+      <w:r>
+        <w:t xml:space="preserve"> trả file theo cách Cloudflare Pages hay GitHub Pages làm: </w:t>
+      </w:r>
+      <w:r>
+        <w:rPr>
+          <w:rFonts w:ascii="Consolas" w:eastAsia="Consolas" w:hAnsi="Consolas" w:cs="Consolas"/>
+        </w:rPr>
+        <w:t xml:space="preserve">/privacy</w:t>
+      </w:r>
+      <w:r>
+        <w:t xml:space="preserve"> lấy </w:t>
+      </w:r>
+      <w:r>
+        <w:rPr>
+          <w:rFonts w:ascii="Consolas" w:eastAsia="Consolas" w:hAnsi="Consolas" w:cs="Consolas"/>
+        </w:rPr>
+        <w:t xml:space="preserve">privacy/index.html</w:t>
+      </w:r>
+      <w:r>
+        <w:t xml:space="preserve">, đường dẫn lạ trả </w:t>
+      </w:r>
+      <w:r>
+        <w:rPr>
+          <w:rFonts w:ascii="Consolas" w:eastAsia="Consolas" w:hAnsi="Consolas" w:cs="Consolas"/>
+        </w:rPr>
+        <w:t xml:space="preserve">404.html</w:t>
+      </w:r>
+      <w:r>
+        <w:t xml:space="preserve"> với mã 404. Hàm </w:t>
+      </w:r>
+      <w:r>
+        <w:rPr>
+          <w:rFonts w:ascii="Consolas" w:eastAsia="Consolas" w:hAnsi="Consolas" w:cs="Consolas"/>
+        </w:rPr>
+        <w:t xml:space="preserve">resolveRequest</w:t>
+      </w:r>
+      <w:r>
+        <w:t xml:space="preserve"> chặn đường dẫn tìm cách ra khỏi </w:t>
+      </w:r>
+      <w:r>
+        <w:rPr>
+          <w:rFonts w:ascii="Consolas" w:eastAsia="Consolas" w:hAnsi="Consolas" w:cs="Consolas"/>
+        </w:rPr>
+        <w:t xml:space="preserve">dist/</w:t>
+      </w:r>
+      <w:r>
+        <w:t xml:space="preserve">, như </w:t>
+      </w:r>
+      <w:r>
+        <w:rPr>
+          <w:rFonts w:ascii="Consolas" w:eastAsia="Consolas" w:hAnsi="Consolas" w:cs="Consolas"/>
+        </w:rPr>
+        <w:t xml:space="preserve">/../package.json</w:t>
+      </w:r>
+      <w:r>
+        <w:t xml:space="preserve"> hay bản mã hóa </w:t>
+      </w:r>
+      <w:r>
+        <w:rPr>
+          <w:rFonts w:ascii="Consolas" w:eastAsia="Consolas" w:hAnsi="Consolas" w:cs="Consolas"/>
+        </w:rPr>
+        <w:t xml:space="preserve">/%2e%2e/...</w:t>
+      </w:r>
+      <w:r>
+        <w:t xml:space="preserve">. Cách chặn: giải mã, </w:t>
+      </w:r>
+      <w:r>
+        <w:rPr>
+          <w:rFonts w:ascii="Consolas" w:eastAsia="Consolas" w:hAnsi="Consolas" w:cs="Consolas"/>
+        </w:rPr>
+        <w:t xml:space="preserve">resolve</w:t>
+      </w:r>
+      <w:r>
+        <w:t xml:space="preserve"> thành đường dẫn tuyệt đối, rồi kiểm nó còn bắt đầu bằng thư mục gốc cộng dấu phân cách. </w:t>
+      </w:r>
+      <w:r>
+        <w:rPr>
+          <w:rFonts w:ascii="Consolas" w:eastAsia="Consolas" w:hAnsi="Consolas" w:cs="Consolas"/>
+        </w:rPr>
+        <w:t xml:space="preserve">decodeURIComponent</w:t>
+      </w:r>
+      <w:r>
+        <w:t xml:space="preserve"> ném lỗi với chuỗi hỏng như </w:t>
+      </w:r>
+      <w:r>
+        <w:rPr>
+          <w:rFonts w:ascii="Consolas" w:eastAsia="Consolas" w:hAnsi="Consolas" w:cs="Consolas"/>
+        </w:rPr>
+        <w:t xml:space="preserve">%E0%A4%A</w:t>
+      </w:r>
+      <w:r>
+        <w:t xml:space="preserve">, nên có </w:t>
+      </w:r>
+      <w:r>
+        <w:rPr>
+          <w:rFonts w:ascii="Consolas" w:eastAsia="Consolas" w:hAnsi="Consolas" w:cs="Consolas"/>
+        </w:rPr>
+        <w:t xml:space="preserve">try/catch</w:t>
+      </w:r>
+      <w:r>
+        <w:t xml:space="preserve">.</w:t>
+      </w:r>
+    </w:p>
+    <w:p>
+      <w:pPr>
+        <w:pStyle w:val="Heading2"/>
+      </w:pPr>
+      <w:r>
         <w:t xml:space="preserve">Tự kiểm tra</w:t>
       </w:r>
     </w:p>
@@ -29130,6 +29851,141 @@
       </w:pPr>
       <w:r>
         <w:t xml:space="preserve">Một lỗi gài "sống sót" nói lên điều gì về bộ test? Vì sao lỗi "ngày cả ngày theo múi giờ người xem" sống sót với múi giờ +7?</w:t>
+      </w:r>
+    </w:p>
+    <w:p>
+      <w:pPr>
+        <w:pStyle w:val="ListParagraph"/>
+        <w:numPr>
+          <w:ilvl w:val="0"/>
+          <w:numId w:val="100"/>
+        </w:numPr>
+      </w:pPr>
+      <w:r>
+        <w:t xml:space="preserve">Google bắt trang chủ có URL "không chuyển hướng". Vì sao </w:t>
+      </w:r>
+      <w:r>
+        <w:rPr>
+          <w:rFonts w:ascii="Consolas" w:eastAsia="Consolas" w:hAnsi="Consolas" w:cs="Consolas"/>
+        </w:rPr>
+        <w:t xml:space="preserve">/</w:t>
+      </w:r>
+      <w:r>
+        <w:t xml:space="preserve"> của </w:t>
+      </w:r>
+      <w:r>
+        <w:rPr>
+          <w:rFonts w:ascii="Consolas" w:eastAsia="Consolas" w:hAnsi="Consolas" w:cs="Consolas"/>
+        </w:rPr>
+        <w:t xml:space="preserve">sino-web</w:t>
+      </w:r>
+      <w:r>
+        <w:t xml:space="preserve"> không dùng được, và vì sao site tĩnh thì dùng được?</w:t>
+      </w:r>
+    </w:p>
+    <w:p>
+      <w:pPr>
+        <w:pStyle w:val="ListParagraph"/>
+        <w:numPr>
+          <w:ilvl w:val="0"/>
+          <w:numId w:val="100"/>
+        </w:numPr>
+      </w:pPr>
+      <w:r>
+        <w:t xml:space="preserve">Vì sao lớp </w:t>
+      </w:r>
+      <w:r>
+        <w:rPr>
+          <w:rFonts w:ascii="Consolas" w:eastAsia="Consolas" w:hAnsi="Consolas" w:cs="Consolas"/>
+        </w:rPr>
+        <w:t xml:space="preserve">Html</w:t>
+      </w:r>
+      <w:r>
+        <w:t xml:space="preserve"> không viết </w:t>
+      </w:r>
+      <w:r>
+        <w:rPr>
+          <w:rFonts w:ascii="Consolas" w:eastAsia="Consolas" w:hAnsi="Consolas" w:cs="Consolas"/>
+        </w:rPr>
+        <w:t xml:space="preserve">constructor(readonly value: string)</w:t>
+      </w:r>
+      <w:r>
+        <w:t xml:space="preserve"> như ở các file khác?</w:t>
+      </w:r>
+    </w:p>
+    <w:p>
+      <w:pPr>
+        <w:pStyle w:val="ListParagraph"/>
+        <w:numPr>
+          <w:ilvl w:val="0"/>
+          <w:numId w:val="100"/>
+        </w:numPr>
+      </w:pPr>
+      <w:r>
+        <w:rPr>
+          <w:rFonts w:ascii="Consolas" w:eastAsia="Consolas" w:hAnsi="Consolas" w:cs="Consolas"/>
+        </w:rPr>
+        <w:t xml:space="preserve">pnpm build</w:t>
+      </w:r>
+      <w:r>
+        <w:t xml:space="preserve"> và </w:t>
+      </w:r>
+      <w:r>
+        <w:rPr>
+          <w:rFonts w:ascii="Consolas" w:eastAsia="Consolas" w:hAnsi="Consolas" w:cs="Consolas"/>
+        </w:rPr>
+        <w:t xml:space="preserve">pnpm build:preview</w:t>
+      </w:r>
+      <w:r>
+        <w:t xml:space="preserve"> khác nhau ở những điểm nào, và vì sao bản xem trước có </w:t>
+      </w:r>
+      <w:r>
+        <w:rPr>
+          <w:rFonts w:ascii="Consolas" w:eastAsia="Consolas" w:hAnsi="Consolas" w:cs="Consolas"/>
+        </w:rPr>
+        <w:t xml:space="preserve">noindex</w:t>
+      </w:r>
+      <w:r>
+        <w:t xml:space="preserve">?</w:t>
+      </w:r>
+    </w:p>
+    <w:p>
+      <w:pPr>
+        <w:pStyle w:val="ListParagraph"/>
+        <w:numPr>
+          <w:ilvl w:val="0"/>
+          <w:numId w:val="100"/>
+        </w:numPr>
+      </w:pPr>
+      <w:r>
+        <w:t xml:space="preserve">Test link nội bộ có danh sách </w:t>
+      </w:r>
+      <w:r>
+        <w:rPr>
+          <w:rFonts w:ascii="Consolas" w:eastAsia="Consolas" w:hAnsi="Consolas" w:cs="Consolas"/>
+        </w:rPr>
+        <w:t xml:space="preserve">PAGES_NOT_BUILT_YET</w:t>
+      </w:r>
+      <w:r>
+        <w:t xml:space="preserve">. Điều gì ngăn danh sách đó che mãi một link gãy?</w:t>
+      </w:r>
+    </w:p>
+    <w:p>
+      <w:pPr>
+        <w:pStyle w:val="ListParagraph"/>
+        <w:numPr>
+          <w:ilvl w:val="0"/>
+          <w:numId w:val="100"/>
+        </w:numPr>
+      </w:pPr>
+      <w:r>
+        <w:rPr>
+          <w:rFonts w:ascii="Consolas" w:eastAsia="Consolas" w:hAnsi="Consolas" w:cs="Consolas"/>
+        </w:rPr>
+        <w:t xml:space="preserve">resolveRequest(root, '/%2e%2e/package.json')</w:t>
+      </w:r>
+      <w:r>
+        <w:t xml:space="preserve"> trả gì, và nhờ bước nào?</w:t>
       </w:r>
     </w:p>
     <w:p/>

</xml_diff>

<commit_message>
feat(si-02): home page that says only what Sino does today
The canvas Landing with Gmail-only pictures, Zalo, Messenger and
Telegram marked as coming, no reminders, scheduled sending, snooze,
notifications or data export (D-241), and a block naming each Google
permission Sino asks for and why, with the Limited Use statement
(D-245). FAQ in <details>. Below 960px the top bar uses the menu and
the hero stacks, found in Chrome at 768px.

Co-Authored-By: Claude Opus 5.5 (1M context) <noreply@anthropic.com>
</commit_message>
<xml_diff>
--- a/docs/knowledge/phase-1-frontend-foundation.docx
+++ b/docs/knowledge/phase-1-frontend-foundation.docx
@@ -26784,6 +26784,231 @@
     </w:p>
     <w:p>
       <w:pPr>
+        <w:pStyle w:val="Heading3"/>
+      </w:pPr>
+      <w:r>
+        <w:t xml:space="preserve">21.8 Trang chủ viết theo sự thật, và test chặn chữ sai (SI-02)</w:t>
+      </w:r>
+    </w:p>
+    <w:p>
+      <w:r>
+        <w:t xml:space="preserve">Google so trang chủ với video demo và với cách ứng dụng thật sự chạy. Vì vậy, trước khi viết chữ, mỗi khẳng định đều được dò tới chỗ nó nằm trong code. Ví dụ, "ảnh trong thư chỉ tải khi bạn bấm Hiện ảnh" có thật ở </w:t>
+      </w:r>
+      <w:r>
+        <w:rPr>
+          <w:rFonts w:ascii="Consolas" w:eastAsia="Consolas" w:hAnsi="Consolas" w:cs="Consolas"/>
+        </w:rPr>
+        <w:t xml:space="preserve">MailBody.tsx</w:t>
+      </w:r>
+      <w:r>
+        <w:t xml:space="preserve">. Ngược lại, câu "mỗi tài khoản liệt kê quyền đã cấp" của canvas thì sai, vì API còn trả </w:t>
+      </w:r>
+      <w:r>
+        <w:rPr>
+          <w:rFonts w:ascii="Consolas" w:eastAsia="Consolas" w:hAnsi="Consolas" w:cs="Consolas"/>
+        </w:rPr>
+        <w:t xml:space="preserve">scopes: null</w:t>
+      </w:r>
+      <w:r>
+        <w:t xml:space="preserve">.</w:t>
+      </w:r>
+    </w:p>
+    <w:p>
+      <w:r>
+        <w:t xml:space="preserve">Hai loại test giữ cho trang đúng về sau:</w:t>
+      </w:r>
+    </w:p>
+    <w:p>
+      <w:pPr>
+        <w:pStyle w:val="ListParagraph"/>
+        <w:numPr>
+          <w:ilvl w:val="0"/>
+          <w:numId w:val="1"/>
+        </w:numPr>
+      </w:pPr>
+      <w:r>
+        <w:rPr>
+          <w:b/>
+          <w:bCs/>
+        </w:rPr>
+        <w:t xml:space="preserve">Test phủ định:</w:t>
+      </w:r>
+      <w:r>
+        <w:t xml:space="preserve"> một danh sách cụm từ của canvas mà Sino chưa làm ("Hẹn giờ gửi", "Tạm ẩn", "Nhắc nhở"...) không được xuất hiện trên trang. Ai đó chép lại chữ canvas thì test đỏ.</w:t>
+      </w:r>
+    </w:p>
+    <w:p>
+      <w:pPr>
+        <w:pStyle w:val="ListParagraph"/>
+        <w:numPr>
+          <w:ilvl w:val="0"/>
+          <w:numId w:val="1"/>
+        </w:numPr>
+      </w:pPr>
+      <w:r>
+        <w:rPr>
+          <w:b/>
+          <w:bCs/>
+        </w:rPr>
+        <w:t xml:space="preserve">Test bất biến:</w:t>
+      </w:r>
+      <w:r>
+        <w:t xml:space="preserve"> phần tử nào mang lớp </w:t>
+      </w:r>
+      <w:r>
+        <w:rPr>
+          <w:rFonts w:ascii="Consolas" w:eastAsia="Consolas" w:hAnsi="Consolas" w:cs="Consolas"/>
+        </w:rPr>
+        <w:t xml:space="preserve">is-soon</w:t>
+      </w:r>
+      <w:r>
+        <w:t xml:space="preserve"> thì phải có nhãn "Sắp có". Nhờ vậy, đánh dấu một tính năng chưa có không thể quên phần chữ.</w:t>
+      </w:r>
+    </w:p>
+    <w:p>
+      <w:r>
+        <w:t xml:space="preserve">Khi một tính năng ra mắt, người sửa trang phải xóa nhãn "Sắp có" và cụm từ đó khỏi danh sách phủ định. Đó là lúc đối chiếu lại với code.</w:t>
+      </w:r>
+    </w:p>
+    <w:p>
+      <w:pPr>
+        <w:pStyle w:val="Heading3"/>
+      </w:pPr>
+      <w:r>
+        <w:t xml:space="preserve">21.9 Chrome bắt lỗi ở cỡ màn mà canvas không vẽ</w:t>
+      </w:r>
+    </w:p>
+    <w:p>
+      <w:r>
+        <w:t xml:space="preserve">Canvas chỉ vẽ 1440 và 390 px. jsdom không chạy CSS nên test xanh, nhưng Chrome ở 768 px cho thấy ba lỗi:</w:t>
+      </w:r>
+    </w:p>
+    <w:p>
+      <w:pPr>
+        <w:pStyle w:val="ListParagraph"/>
+        <w:numPr>
+          <w:ilvl w:val="0"/>
+          <w:numId w:val="1"/>
+        </w:numPr>
+      </w:pPr>
+      <w:r>
+        <w:t xml:space="preserve">Năm link của thanh trên gãy thành hai, ba dòng.</w:t>
+      </w:r>
+    </w:p>
+    <w:p>
+      <w:pPr>
+        <w:pStyle w:val="ListParagraph"/>
+        <w:numPr>
+          <w:ilvl w:val="0"/>
+          <w:numId w:val="1"/>
+        </w:numPr>
+      </w:pPr>
+      <w:r>
+        <w:t xml:space="preserve">Hero hai cột làm tiêu đề gãy sáu dòng.</w:t>
+      </w:r>
+    </w:p>
+    <w:p>
+      <w:pPr>
+        <w:pStyle w:val="ListParagraph"/>
+        <w:numPr>
+          <w:ilvl w:val="0"/>
+          <w:numId w:val="1"/>
+        </w:numPr>
+      </w:pPr>
+      <w:r>
+        <w:t xml:space="preserve">Tên người gửi dài tràn đè lên giờ.</w:t>
+      </w:r>
+    </w:p>
+    <w:p>
+      <w:r>
+        <w:t xml:space="preserve">Cách sửa:</w:t>
+      </w:r>
+    </w:p>
+    <w:p>
+      <w:pPr>
+        <w:pStyle w:val="ListParagraph"/>
+        <w:numPr>
+          <w:ilvl w:val="0"/>
+          <w:numId w:val="1"/>
+        </w:numPr>
+      </w:pPr>
+      <w:r>
+        <w:t xml:space="preserve">Thêm một mốc </w:t>
+      </w:r>
+      <w:r>
+        <w:rPr>
+          <w:rFonts w:ascii="Consolas" w:eastAsia="Consolas" w:hAnsi="Consolas" w:cs="Consolas"/>
+        </w:rPr>
+        <w:t xml:space="preserve">@media (max-width: 960px)</w:t>
+      </w:r>
+      <w:r>
+        <w:t xml:space="preserve">: thanh trên dùng nút menu, hero và band xếp một cột.</w:t>
+      </w:r>
+    </w:p>
+    <w:p>
+      <w:pPr>
+        <w:pStyle w:val="ListParagraph"/>
+        <w:numPr>
+          <w:ilvl w:val="0"/>
+          <w:numId w:val="1"/>
+        </w:numPr>
+      </w:pPr>
+      <w:r>
+        <w:t xml:space="preserve">Cho tên người gửi </w:t>
+      </w:r>
+      <w:r>
+        <w:rPr>
+          <w:rFonts w:ascii="Consolas" w:eastAsia="Consolas" w:hAnsi="Consolas" w:cs="Consolas"/>
+        </w:rPr>
+        <w:t xml:space="preserve">overflow: hidden; text-overflow: ellipsis; min-width: 0</w:t>
+      </w:r>
+      <w:r>
+        <w:t xml:space="preserve">. Phần tử con của flex mặc định không co nhỏ hơn chữ bên trong nó (</w:t>
+      </w:r>
+      <w:r>
+        <w:rPr>
+          <w:rFonts w:ascii="Consolas" w:eastAsia="Consolas" w:hAnsi="Consolas" w:cs="Consolas"/>
+        </w:rPr>
+        <w:t xml:space="preserve">min-width: auto</w:t>
+      </w:r>
+      <w:r>
+        <w:t xml:space="preserve">), nên phải đặt </w:t>
+      </w:r>
+      <w:r>
+        <w:rPr>
+          <w:rFonts w:ascii="Consolas" w:eastAsia="Consolas" w:hAnsi="Consolas" w:cs="Consolas"/>
+        </w:rPr>
+        <w:t xml:space="preserve">min-width: 0</w:t>
+      </w:r>
+      <w:r>
+        <w:t xml:space="preserve"> thì dấu "…" mới hiện được.</w:t>
+      </w:r>
+    </w:p>
+    <w:p>
+      <w:r>
+        <w:t xml:space="preserve">Còn một bài học về chính công cụ kiểm: trang bật </w:t>
+      </w:r>
+      <w:r>
+        <w:rPr>
+          <w:rFonts w:ascii="Consolas" w:eastAsia="Consolas" w:hAnsi="Consolas" w:cs="Consolas"/>
+        </w:rPr>
+        <w:t xml:space="preserve">scroll-behavior: smooth</w:t>
+      </w:r>
+      <w:r>
+        <w:t xml:space="preserve">, nên ảnh chụp ngay sau </w:t>
+      </w:r>
+      <w:r>
+        <w:rPr>
+          <w:rFonts w:ascii="Consolas" w:eastAsia="Consolas" w:hAnsi="Consolas" w:cs="Consolas"/>
+        </w:rPr>
+        <w:t xml:space="preserve">scrollIntoView</w:t>
+      </w:r>
+      <w:r>
+        <w:t xml:space="preserve"> bắt được lúc trang còn đang cuộn. Script phải tắt cuộn mượt trước khi chụp.</w:t>
+      </w:r>
+    </w:p>
+    <w:p>
+      <w:pPr>
         <w:pStyle w:val="Heading2"/>
       </w:pPr>
       <w:r>
@@ -29986,6 +30211,69 @@
       </w:r>
       <w:r>
         <w:t xml:space="preserve"> trả gì, và nhờ bước nào?</w:t>
+      </w:r>
+    </w:p>
+    <w:p>
+      <w:pPr>
+        <w:pStyle w:val="ListParagraph"/>
+        <w:numPr>
+          <w:ilvl w:val="0"/>
+          <w:numId w:val="100"/>
+        </w:numPr>
+      </w:pPr>
+      <w:r>
+        <w:t xml:space="preserve">Trang chủ có test "không được chứa cụm từ X". Test đó bảo vệ điều gì, và khi tính năng X ra mắt thì phải làm gì?</w:t>
+      </w:r>
+    </w:p>
+    <w:p>
+      <w:pPr>
+        <w:pStyle w:val="ListParagraph"/>
+        <w:numPr>
+          <w:ilvl w:val="0"/>
+          <w:numId w:val="100"/>
+        </w:numPr>
+      </w:pPr>
+      <w:r>
+        <w:t xml:space="preserve">Vì sao một phần tử con của flex có </w:t>
+      </w:r>
+      <w:r>
+        <w:rPr>
+          <w:rFonts w:ascii="Consolas" w:eastAsia="Consolas" w:hAnsi="Consolas" w:cs="Consolas"/>
+        </w:rPr>
+        <w:t xml:space="preserve">text-overflow: ellipsis</w:t>
+      </w:r>
+      <w:r>
+        <w:t xml:space="preserve"> vẫn tràn ra ngoài, và </w:t>
+      </w:r>
+      <w:r>
+        <w:rPr>
+          <w:rFonts w:ascii="Consolas" w:eastAsia="Consolas" w:hAnsi="Consolas" w:cs="Consolas"/>
+        </w:rPr>
+        <w:t xml:space="preserve">min-width: 0</w:t>
+      </w:r>
+      <w:r>
+        <w:t xml:space="preserve"> sửa thế nào?</w:t>
+      </w:r>
+    </w:p>
+    <w:p>
+      <w:pPr>
+        <w:pStyle w:val="ListParagraph"/>
+        <w:numPr>
+          <w:ilvl w:val="0"/>
+          <w:numId w:val="100"/>
+        </w:numPr>
+      </w:pPr>
+      <w:r>
+        <w:t xml:space="preserve">Ảnh chụp sau </w:t>
+      </w:r>
+      <w:r>
+        <w:rPr>
+          <w:rFonts w:ascii="Consolas" w:eastAsia="Consolas" w:hAnsi="Consolas" w:cs="Consolas"/>
+        </w:rPr>
+        <w:t xml:space="preserve">scrollIntoView</w:t>
+      </w:r>
+      <w:r>
+        <w:t xml:space="preserve"> ra sai vùng. Vì sao, và vì sao đây là lỗi của công cụ kiểm chứ không phải của trang?</w:t>
       </w:r>
     </w:p>
     <w:p/>

</xml_diff>

<commit_message>
feat(si-07): one site for the Sino family; Sino Messages moves to /messages
More Sino products will come, so the site is the family's (D-253, D-254):
- / is a minimal brand page: one sentence about Sino and one card per
  product that runs today (only Sino Messages), no promises
- /messages is the former home page and the App home page for Google
- two top bars from the page table (nav: product | family), one footer
  listing the products; "Mở Sino" becomes "Mở Sino Messages"
- pages/home -> pages/messages (git mv), HomePage -> MessagesPage

vitest 87/87, lint 0, typecheck 0, build:preview 0; Chrome headless
/ at 1440 and 390 x dark and light, /messages at 1440 and 390.

Co-Authored-By: Claude Opus 5.5 (1M context) <noreply@anthropic.com>
</commit_message>
<xml_diff>
--- a/docs/knowledge/phase-1-frontend-foundation.docx
+++ b/docs/knowledge/phase-1-frontend-foundation.docx
@@ -28125,7 +28125,7 @@
     </w:p>
     <w:p>
       <w:r>
-        <w:t xml:space="preserve">Kiểm chứng: jsdom chạy được gsap (đặt style inline) nên test đo được "phần tử dưới màn đầu bị ẩn, phần tử trên màn thì không". Nhưng hover, vệt sáng hay quầng sáng thì phải kiểm bằng Chrome thật. Script CDP gửi </w:t>
+        <w:t xml:space="preserve">Kiểm chứng (SI-02R): jsdom chạy được gsap (đặt style inline) nên test đo được "phần tử dưới màn đầu bị ẩn, phần tử trên màn thì không". Nhưng hover, vệt sáng hay quầng sáng thì phải kiểm bằng Chrome thật. Script CDP gửi </w:t>
       </w:r>
       <w:r>
         <w:rPr>
@@ -28158,6 +28158,282 @@
     </w:p>
     <w:p>
       <w:pPr>
+        <w:pStyle w:val="Heading3"/>
+      </w:pPr>
+      <w:r>
+        <w:t xml:space="preserve">21.12 Một site cho cả nhà Sino (SI-07)</w:t>
+      </w:r>
+    </w:p>
+    <w:p>
+      <w:r>
+        <w:t xml:space="preserve">Người dùng cho biết sẽ có nhiều sản phẩm Sino, và landing phải dùng chung (D-253). Site đổi từ "trang của một app" thành "site của một thương hiệu":</w:t>
+      </w:r>
+    </w:p>
+    <w:p>
+      <w:pPr>
+        <w:shd w:val="clear" w:color="auto" w:fill="F2F3F5"/>
+        <w:ind w:left="0"/>
+      </w:pPr>
+      <w:r>
+        <w:rPr>
+          <w:rFonts w:ascii="Consolas" w:eastAsia="Consolas" w:hAnsi="Consolas" w:cs="Consolas"/>
+          <w:sz w:val="19"/>
+          <w:szCs w:val="19"/>
+        </w:rPr>
+        <w:t xml:space="preserve">/                 trang thương hiệu: một câu về Sino, mỗi sản phẩm một thẻ   (thanh trên: family)</w:t>
+        <w:br/>
+        <w:t xml:space="preserve">/messages         trang Sino Messages (trang chủ cũ)  &lt;- App home page khai với Google   (thanh trên: product)</w:t>
+        <w:br/>
+        <w:t xml:space="preserve">/privacy, /terms  chung cho cả nhà Sino, mỗi sản phẩm một mục                  (thanh trên: family)</w:t>
+        <w:br/>
+        <w:t xml:space="preserve">404.html          chung                                                        (thanh trên: family)</w:t>
+      </w:r>
+    </w:p>
+    <w:p>
+      <w:pPr>
+        <w:pStyle w:val="ListParagraph"/>
+        <w:numPr>
+          <w:ilvl w:val="0"/>
+          <w:numId w:val="1"/>
+        </w:numPr>
+      </w:pPr>
+      <w:r>
+        <w:rPr>
+          <w:b/>
+          <w:bCs/>
+        </w:rPr>
+        <w:t xml:space="preserve">Vì sao chốt URL trước khi khai với Google:</w:t>
+      </w:r>
+    </w:p>
+    <w:p>
+      <w:pPr>
+        <w:pStyle w:val="ListParagraph"/>
+        <w:numPr>
+          <w:ilvl w:val="1"/>
+          <w:numId w:val="1"/>
+        </w:numPr>
+      </w:pPr>
+      <w:r>
+        <w:t xml:space="preserve">Google đòi trang chủ khai trên consent screen "mô tả đúng ứng dụng". Một trang thương hiệu liệt kê nhiều sản phẩm có thể bị coi là không mô tả ứng dụng, nên trang khai là </w:t>
+      </w:r>
+      <w:r>
+        <w:rPr>
+          <w:rFonts w:ascii="Consolas" w:eastAsia="Consolas" w:hAnsi="Consolas" w:cs="Consolas"/>
+        </w:rPr>
+        <w:t xml:space="preserve">/messages</w:t>
+      </w:r>
+      <w:r>
+        <w:t xml:space="preserve">.</w:t>
+      </w:r>
+    </w:p>
+    <w:p>
+      <w:pPr>
+        <w:pStyle w:val="ListParagraph"/>
+        <w:numPr>
+          <w:ilvl w:val="1"/>
+          <w:numId w:val="1"/>
+        </w:numPr>
+      </w:pPr>
+      <w:r>
+        <w:t xml:space="preserve">URL đã khai mà đổi thì phải khai lại, có khi phải thẩm định lại. Vì vậy URL được chốt từ bây giờ, khi chưa khai, để sau này thêm sản phẩm thì chỉ thêm trang, không đổi URL cũ.</w:t>
+      </w:r>
+    </w:p>
+    <w:p>
+      <w:pPr>
+        <w:pStyle w:val="ListParagraph"/>
+        <w:numPr>
+          <w:ilvl w:val="0"/>
+          <w:numId w:val="1"/>
+        </w:numPr>
+      </w:pPr>
+      <w:r>
+        <w:rPr>
+          <w:b/>
+          <w:bCs/>
+        </w:rPr>
+        <w:t xml:space="preserve">Dữ liệu điều khiển giao diện:</w:t>
+      </w:r>
+    </w:p>
+    <w:p>
+      <w:pPr>
+        <w:pStyle w:val="ListParagraph"/>
+        <w:numPr>
+          <w:ilvl w:val="1"/>
+          <w:numId w:val="1"/>
+        </w:numPr>
+      </w:pPr>
+      <w:r>
+        <w:t xml:space="preserve">mỗi trang khai </w:t>
+      </w:r>
+      <w:r>
+        <w:rPr>
+          <w:rFonts w:ascii="Consolas" w:eastAsia="Consolas" w:hAnsi="Consolas" w:cs="Consolas"/>
+        </w:rPr>
+        <w:t xml:space="preserve">nav: 'product' | 'family'</w:t>
+      </w:r>
+      <w:r>
+        <w:t xml:space="preserve"> trong bảng </w:t>
+      </w:r>
+      <w:r>
+        <w:rPr>
+          <w:rFonts w:ascii="Consolas" w:eastAsia="Consolas" w:hAnsi="Consolas" w:cs="Consolas"/>
+        </w:rPr>
+        <w:t xml:space="preserve">PAGES</w:t>
+      </w:r>
+      <w:r>
+        <w:t xml:space="preserve">, và </w:t>
+      </w:r>
+      <w:r>
+        <w:rPr>
+          <w:rFonts w:ascii="Consolas" w:eastAsia="Consolas" w:hAnsi="Consolas" w:cs="Consolas"/>
+        </w:rPr>
+        <w:t xml:space="preserve">PageFrame</w:t>
+      </w:r>
+      <w:r>
+        <w:t xml:space="preserve"> chọn thanh trên theo đó;</w:t>
+      </w:r>
+    </w:p>
+    <w:p>
+      <w:pPr>
+        <w:pStyle w:val="ListParagraph"/>
+        <w:numPr>
+          <w:ilvl w:val="1"/>
+          <w:numId w:val="1"/>
+        </w:numPr>
+      </w:pPr>
+      <w:r>
+        <w:t xml:space="preserve">danh sách sản phẩm là một mảng </w:t>
+      </w:r>
+      <w:r>
+        <w:rPr>
+          <w:rFonts w:ascii="Consolas" w:eastAsia="Consolas" w:hAnsi="Consolas" w:cs="Consolas"/>
+        </w:rPr>
+        <w:t xml:space="preserve">PRODUCTS</w:t>
+      </w:r>
+      <w:r>
+        <w:t xml:space="preserve">, dùng chung cho thanh trên, chân trang và thẻ ở trang thương hiệu.</w:t>
+      </w:r>
+    </w:p>
+    <w:p>
+      <w:pPr>
+        <w:ind w:left="360"/>
+      </w:pPr>
+      <w:r>
+        <w:t xml:space="preserve">Thêm sản phẩm thứ hai chủ yếu là thêm một dòng vào bảng và một trang, không phải sửa từng chỗ.</w:t>
+      </w:r>
+    </w:p>
+    <w:p>
+      <w:pPr>
+        <w:pStyle w:val="ListParagraph"/>
+        <w:numPr>
+          <w:ilvl w:val="0"/>
+          <w:numId w:val="1"/>
+        </w:numPr>
+      </w:pPr>
+      <w:r>
+        <w:rPr>
+          <w:b/>
+          <w:bCs/>
+        </w:rPr>
+        <w:t xml:space="preserve">Đổi tên theo ý nghĩa:</w:t>
+      </w:r>
+      <w:r>
+        <w:t xml:space="preserve"> thư mục </w:t>
+      </w:r>
+      <w:r>
+        <w:rPr>
+          <w:rFonts w:ascii="Consolas" w:eastAsia="Consolas" w:hAnsi="Consolas" w:cs="Consolas"/>
+        </w:rPr>
+        <w:t xml:space="preserve">pages/home</w:t>
+      </w:r>
+      <w:r>
+        <w:t xml:space="preserve"> thành </w:t>
+      </w:r>
+      <w:r>
+        <w:rPr>
+          <w:rFonts w:ascii="Consolas" w:eastAsia="Consolas" w:hAnsi="Consolas" w:cs="Consolas"/>
+        </w:rPr>
+        <w:t xml:space="preserve">pages/messages</w:t>
+      </w:r>
+      <w:r>
+        <w:t xml:space="preserve">, </w:t>
+      </w:r>
+      <w:r>
+        <w:rPr>
+          <w:rFonts w:ascii="Consolas" w:eastAsia="Consolas" w:hAnsi="Consolas" w:cs="Consolas"/>
+        </w:rPr>
+        <w:t xml:space="preserve">HomePage</w:t>
+      </w:r>
+      <w:r>
+        <w:t xml:space="preserve"> thành </w:t>
+      </w:r>
+      <w:r>
+        <w:rPr>
+          <w:rFonts w:ascii="Consolas" w:eastAsia="Consolas" w:hAnsi="Consolas" w:cs="Consolas"/>
+        </w:rPr>
+        <w:t xml:space="preserve">MessagesPage</w:t>
+      </w:r>
+      <w:r>
+        <w:t xml:space="preserve">. Đổi bằng </w:t>
+      </w:r>
+      <w:r>
+        <w:rPr>
+          <w:rFonts w:ascii="Consolas" w:eastAsia="Consolas" w:hAnsi="Consolas" w:cs="Consolas"/>
+        </w:rPr>
+        <w:t xml:space="preserve">git mv</w:t>
+      </w:r>
+      <w:r>
+        <w:t xml:space="preserve"> để git hiểu đây là đổi tên, giữ lịch sử.</w:t>
+      </w:r>
+    </w:p>
+    <w:p>
+      <w:pPr>
+        <w:pStyle w:val="ListParagraph"/>
+        <w:numPr>
+          <w:ilvl w:val="0"/>
+          <w:numId w:val="1"/>
+        </w:numPr>
+      </w:pPr>
+      <w:r>
+        <w:rPr>
+          <w:b/>
+          <w:bCs/>
+        </w:rPr>
+        <w:t xml:space="preserve">Lại bài học về script kiểm:</w:t>
+      </w:r>
+      <w:r>
+        <w:t xml:space="preserve"> lần đo hover đầu tiên ở </w:t>
+      </w:r>
+      <w:r>
+        <w:rPr>
+          <w:rFonts w:ascii="Consolas" w:eastAsia="Consolas" w:hAnsi="Consolas" w:cs="Consolas"/>
+        </w:rPr>
+        <w:t xml:space="preserve">/</w:t>
+      </w:r>
+      <w:r>
+        <w:t xml:space="preserve"> cho kết quả "không nhấc". Lý do: trang bật </w:t>
+      </w:r>
+      <w:r>
+        <w:rPr>
+          <w:rFonts w:ascii="Consolas" w:eastAsia="Consolas" w:hAnsi="Consolas" w:cs="Consolas"/>
+        </w:rPr>
+        <w:t xml:space="preserve">scroll-behavior: smooth</w:t>
+      </w:r>
+      <w:r>
+        <w:t xml:space="preserve">, nên </w:t>
+      </w:r>
+      <w:r>
+        <w:rPr>
+          <w:rFonts w:ascii="Consolas" w:eastAsia="Consolas" w:hAnsi="Consolas" w:cs="Consolas"/>
+        </w:rPr>
+        <w:t xml:space="preserve">scrollIntoView</w:t>
+      </w:r>
+      <w:r>
+        <w:t xml:space="preserve"> còn đang cuộn thì script đã đặt chuột, và chuột rơi ra ngoài thẻ. Script giờ tắt cuộn mượt trước mỗi lần rê chuột. Trước khi kết luận "site lỗi", phải xem công cụ đo có đúng không.</w:t>
+      </w:r>
+    </w:p>
+    <w:p>
+      <w:pPr>
         <w:pStyle w:val="Heading2"/>
       </w:pPr>
       <w:r>
@@ -31588,6 +31864,69 @@
       </w:pPr>
       <w:r>
         <w:t xml:space="preserve">Khi người dùng bật giảm chuyển động, mỗi hiệu ứng của trang chủ lùi về đâu? Code nào lo phần CSS, code nào lo phần JavaScript?</w:t>
+      </w:r>
+    </w:p>
+    <w:p>
+      <w:pPr>
+        <w:pStyle w:val="ListParagraph"/>
+        <w:numPr>
+          <w:ilvl w:val="0"/>
+          <w:numId w:val="100"/>
+        </w:numPr>
+      </w:pPr>
+      <w:r>
+        <w:t xml:space="preserve">Vì sao App home page khai với Google là </w:t>
+      </w:r>
+      <w:r>
+        <w:rPr>
+          <w:rFonts w:ascii="Consolas" w:eastAsia="Consolas" w:hAnsi="Consolas" w:cs="Consolas"/>
+        </w:rPr>
+        <w:t xml:space="preserve">/messages</w:t>
+      </w:r>
+      <w:r>
+        <w:t xml:space="preserve"> chứ không phải </w:t>
+      </w:r>
+      <w:r>
+        <w:rPr>
+          <w:rFonts w:ascii="Consolas" w:eastAsia="Consolas" w:hAnsi="Consolas" w:cs="Consolas"/>
+        </w:rPr>
+        <w:t xml:space="preserve">/</w:t>
+      </w:r>
+      <w:r>
+        <w:t xml:space="preserve">, và vì sao phải chốt URL này trước khi khai?</w:t>
+      </w:r>
+    </w:p>
+    <w:p>
+      <w:pPr>
+        <w:pStyle w:val="ListParagraph"/>
+        <w:numPr>
+          <w:ilvl w:val="0"/>
+          <w:numId w:val="100"/>
+        </w:numPr>
+      </w:pPr>
+      <w:r>
+        <w:t xml:space="preserve">Thêm một sản phẩm Sino thứ hai thì phải sửa những chỗ nào trong </w:t>
+      </w:r>
+      <w:r>
+        <w:rPr>
+          <w:rFonts w:ascii="Consolas" w:eastAsia="Consolas" w:hAnsi="Consolas" w:cs="Consolas"/>
+        </w:rPr>
+        <w:t xml:space="preserve">sino-site</w:t>
+      </w:r>
+      <w:r>
+        <w:t xml:space="preserve">? Vì sao chỉ là vài chỗ?</w:t>
+      </w:r>
+    </w:p>
+    <w:p>
+      <w:pPr>
+        <w:pStyle w:val="ListParagraph"/>
+        <w:numPr>
+          <w:ilvl w:val="0"/>
+          <w:numId w:val="100"/>
+        </w:numPr>
+      </w:pPr>
+      <w:r>
+        <w:t xml:space="preserve">Đo hover cho kết quả "không nhấc" dù CSS đúng. Bạn kiểm điều gì trước khi sửa CSS?</w:t>
       </w:r>
     </w:p>
     <w:p/>

</xml_diff>

<commit_message>
feat(fe-110): web data contract by kind for Tin nhắn and Hộp thư
Providers carry their kind (EMAIL or CHAT); toProviderInfo counts a
provider without one as email (D-308) for the Hộp thư, Tài khoản and
Việc cần làm requests. The inbox counts keep unreadByKind, fetchInbox
and fetchConversations take an optional kind (kind=email|chat), and
fetchUnreadByKind gives the navigation both numbers (Tin nhắn has none
on a backend without unreadByKind). countsAfter moves unreadByKind with
the row. Samples and API fixtures follow (7 email, 5 chat unread).
Query keys by kind and the two new sample chats wait for FE-112.

lint 0; vitest 658/665, the 7 failures in features/notes fail the same
on dev without this change (WIP b23f5b3); tsc -b only the 2 errors of
notes.sample.ts already on dev; vite build green.

Co-Authored-By: Claude Opus 5.5 <noreply@anthropic.com>
</commit_message>
<xml_diff>
--- a/docs/knowledge/phase-1-frontend-foundation.docx
+++ b/docs/knowledge/phase-1-frontend-foundation.docx
@@ -29028,6 +29028,439 @@
         <w:pStyle w:val="Heading2"/>
       </w:pPr>
       <w:r>
+        <w:t xml:space="preserve">22. Tin nhắn và Hộp thư (</w:t>
+      </w:r>
+      <w:r>
+        <w:rPr>
+          <w:rFonts w:ascii="Consolas" w:eastAsia="Consolas" w:hAnsi="Consolas" w:cs="Consolas"/>
+        </w:rPr>
+        <w:t xml:space="preserve">f05c-messages-inbox-split</w:t>
+      </w:r>
+      <w:r>
+        <w:t xml:space="preserve">)</w:t>
+      </w:r>
+    </w:p>
+    <w:p>
+      <w:pPr>
+        <w:pStyle w:val="Heading3"/>
+      </w:pPr>
+      <w:r>
+        <w:t xml:space="preserve">22.0 Bức tranh</w:t>
+      </w:r>
+    </w:p>
+    <w:p>
+      <w:r>
+        <w:t xml:space="preserve">Hộp thư tách thành hai màn: Tin nhắn (</w:t>
+      </w:r>
+      <w:r>
+        <w:rPr>
+          <w:rFonts w:ascii="Consolas" w:eastAsia="Consolas" w:hAnsi="Consolas" w:cs="Consolas"/>
+        </w:rPr>
+        <w:t xml:space="preserve">/messages</w:t>
+      </w:r>
+      <w:r>
+        <w:t xml:space="preserve">, chat) và Hộp thư (</w:t>
+      </w:r>
+      <w:r>
+        <w:rPr>
+          <w:rFonts w:ascii="Consolas" w:eastAsia="Consolas" w:hAnsi="Consolas" w:cs="Consolas"/>
+        </w:rPr>
+        <w:t xml:space="preserve">/inbox</w:t>
+      </w:r>
+      <w:r>
+        <w:t xml:space="preserve">, email). Loại không thuộc về từng cuộc trò chuyện mà thuộc về nhà cung cấp: Gmail là </w:t>
+      </w:r>
+      <w:r>
+        <w:rPr>
+          <w:rFonts w:ascii="Consolas" w:eastAsia="Consolas" w:hAnsi="Consolas" w:cs="Consolas"/>
+        </w:rPr>
+        <w:t xml:space="preserve">EMAIL</w:t>
+      </w:r>
+      <w:r>
+        <w:t xml:space="preserve">, Zalo và Messenger là </w:t>
+      </w:r>
+      <w:r>
+        <w:rPr>
+          <w:rFonts w:ascii="Consolas" w:eastAsia="Consolas" w:hAnsi="Consolas" w:cs="Consolas"/>
+        </w:rPr>
+        <w:t xml:space="preserve">CHAT</w:t>
+      </w:r>
+      <w:r>
+        <w:t xml:space="preserve"> (D-306). FE-110 chỉ đổi lớp dữ liệu; các màn đổi ở FE-111…FE-113.</w:t>
+      </w:r>
+    </w:p>
+    <w:p>
+      <w:pPr>
+        <w:shd w:val="clear" w:color="auto" w:fill="F2F3F5"/>
+        <w:ind w:left="0"/>
+      </w:pPr>
+      <w:r>
+        <w:rPr>
+          <w:rFonts w:ascii="Consolas" w:eastAsia="Consolas" w:hAnsi="Consolas" w:cs="Consolas"/>
+          <w:sz w:val="19"/>
+          <w:szCs w:val="19"/>
+        </w:rPr>
+        <w:t xml:space="preserve">GET /api/providers                   -&gt; ProviderInfo.kind   (thiếu -&gt; EMAIL, D-308)</w:t>
+        <w:br/>
+        <w:t xml:space="preserve">GET /api/conversations?kind=chat     -&gt; chỉ một loại        (không có kind -&gt; cả hai, như cũ)</w:t>
+        <w:br/>
+        <w:t xml:space="preserve">GET /api/conversations/counts?kind=  -&gt; các số của loại đó</w:t>
+        <w:br/>
+        <w:t xml:space="preserve">                                        + unreadByKind { EMAIL, CHAT }, luôn đủ hai loại</w:t>
+      </w:r>
+    </w:p>
+    <w:p>
+      <w:pPr>
+        <w:pStyle w:val="Heading3"/>
+      </w:pPr>
+      <w:r>
+        <w:t xml:space="preserve">22.1 Một hàm cho quy tắc "thiếu loại thì là email" (FE-110)</w:t>
+      </w:r>
+    </w:p>
+    <w:p>
+      <w:r>
+        <w:t xml:space="preserve">Ba màn đọc </w:t>
+      </w:r>
+      <w:r>
+        <w:rPr>
+          <w:rFonts w:ascii="Consolas" w:eastAsia="Consolas" w:hAnsi="Consolas" w:cs="Consolas"/>
+        </w:rPr>
+        <w:t xml:space="preserve">GET /api/providers</w:t>
+      </w:r>
+      <w:r>
+        <w:t xml:space="preserve">: Hộp thư, Tài khoản, Việc cần làm. Trước đây mỗi màn tự viết </w:t>
+      </w:r>
+      <w:r>
+        <w:rPr>
+          <w:rFonts w:ascii="Consolas" w:eastAsia="Consolas" w:hAnsi="Consolas" w:cs="Consolas"/>
+        </w:rPr>
+        <w:t xml:space="preserve">({ type, displayName }) =&gt; ...</w:t>
+      </w:r>
+      <w:r>
+        <w:t xml:space="preserve">. Giờ cả ba gọi </w:t>
+      </w:r>
+      <w:r>
+        <w:rPr>
+          <w:rFonts w:ascii="Consolas" w:eastAsia="Consolas" w:hAnsi="Consolas" w:cs="Consolas"/>
+        </w:rPr>
+        <w:t xml:space="preserve">toProviderInfo</w:t>
+      </w:r>
+      <w:r>
+        <w:t xml:space="preserve"> trong </w:t>
+      </w:r>
+      <w:r>
+        <w:rPr>
+          <w:rFonts w:ascii="Consolas" w:eastAsia="Consolas" w:hAnsi="Consolas" w:cs="Consolas"/>
+        </w:rPr>
+        <w:t xml:space="preserve">shared/api/providers.ts</w:t>
+      </w:r>
+      <w:r>
+        <w:t xml:space="preserve">, nên quy tắc "backend cũ không gửi </w:t>
+      </w:r>
+      <w:r>
+        <w:rPr>
+          <w:rFonts w:ascii="Consolas" w:eastAsia="Consolas" w:hAnsi="Consolas" w:cs="Consolas"/>
+        </w:rPr>
+        <w:t xml:space="preserve">kind</w:t>
+      </w:r>
+      <w:r>
+        <w:t xml:space="preserve"> thì coi là email" chỉ nằm ở một chỗ, giống cách backend coi một provider không có connector là email. Quy tắc đổi thì chỉ sửa một hàm.</w:t>
+      </w:r>
+    </w:p>
+    <w:p>
+      <w:r>
+        <w:rPr>
+          <w:rFonts w:ascii="Consolas" w:eastAsia="Consolas" w:hAnsi="Consolas" w:cs="Consolas"/>
+        </w:rPr>
+        <w:t xml:space="preserve">kind</w:t>
+      </w:r>
+      <w:r>
+        <w:t xml:space="preserve"> trong </w:t>
+      </w:r>
+      <w:r>
+        <w:rPr>
+          <w:rFonts w:ascii="Consolas" w:eastAsia="Consolas" w:hAnsi="Consolas" w:cs="Consolas"/>
+        </w:rPr>
+        <w:t xml:space="preserve">ProviderInfo</w:t>
+      </w:r>
+      <w:r>
+        <w:t xml:space="preserve"> là bắt buộc, không phải </w:t>
+      </w:r>
+      <w:r>
+        <w:rPr>
+          <w:rFonts w:ascii="Consolas" w:eastAsia="Consolas" w:hAnsi="Consolas" w:cs="Consolas"/>
+        </w:rPr>
+        <w:t xml:space="preserve">kind?</w:t>
+      </w:r>
+      <w:r>
+        <w:t xml:space="preserve">. Nếu để tùy chọn, mỗi màn dùng nó lại phải tự viết </w:t>
+      </w:r>
+      <w:r>
+        <w:rPr>
+          <w:rFonts w:ascii="Consolas" w:eastAsia="Consolas" w:hAnsi="Consolas" w:cs="Consolas"/>
+        </w:rPr>
+        <w:t xml:space="preserve">?? 'EMAIL'</w:t>
+      </w:r>
+      <w:r>
+        <w:t xml:space="preserve">, và màn nào quên thì lặng lẽ sai. Bắt buộc thì TypeScript chỉ ra mọi chỗ dựng provider mà thiếu loại: lần này </w:t>
+      </w:r>
+      <w:r>
+        <w:rPr>
+          <w:rFonts w:ascii="Consolas" w:eastAsia="Consolas" w:hAnsi="Consolas" w:cs="Consolas"/>
+        </w:rPr>
+        <w:t xml:space="preserve">tsc -b</w:t>
+      </w:r>
+      <w:r>
+        <w:t xml:space="preserve"> liệt kê 28 chỗ (API, dữ liệu mẫu, test), sửa hết là xong.</w:t>
+      </w:r>
+    </w:p>
+    <w:p>
+      <w:pPr>
+        <w:pStyle w:val="Heading3"/>
+      </w:pPr>
+      <w:r>
+        <w:t xml:space="preserve">22.2 Tham số tùy chọn và cái bẫy </w:t>
+      </w:r>
+      <w:r>
+        <w:rPr>
+          <w:rFonts w:ascii="Consolas" w:eastAsia="Consolas" w:hAnsi="Consolas" w:cs="Consolas"/>
+        </w:rPr>
+        <w:t xml:space="preserve">queryFn: fetchInbox</w:t>
+      </w:r>
+    </w:p>
+    <w:p>
+      <w:r>
+        <w:rPr>
+          <w:rFonts w:ascii="Consolas" w:eastAsia="Consolas" w:hAnsi="Consolas" w:cs="Consolas"/>
+        </w:rPr>
+        <w:t xml:space="preserve">fetchInbox(kind?)</w:t>
+      </w:r>
+      <w:r>
+        <w:t xml:space="preserve"> và </w:t>
+      </w:r>
+      <w:r>
+        <w:rPr>
+          <w:rFonts w:ascii="Consolas" w:eastAsia="Consolas" w:hAnsi="Consolas" w:cs="Consolas"/>
+        </w:rPr>
+        <w:t xml:space="preserve">fetchConversations(filter, cursor, kind?)</w:t>
+      </w:r>
+      <w:r>
+        <w:t xml:space="preserve"> nhận loại không bắt buộc: không truyền thì hỏi cả hai loại, nên màn Hộp thư hiện tại chạy y như cũ cho tới FE-112.</w:t>
+      </w:r>
+    </w:p>
+    <w:p>
+      <w:r>
+        <w:t xml:space="preserve">Bẫy: </w:t>
+      </w:r>
+      <w:r>
+        <w:rPr>
+          <w:rFonts w:ascii="Consolas" w:eastAsia="Consolas" w:hAnsi="Consolas" w:cs="Consolas"/>
+        </w:rPr>
+        <w:t xml:space="preserve">useQuery({ queryFn: fetchInbox })</w:t>
+      </w:r>
+      <w:r>
+        <w:t xml:space="preserve"> truyền cho hàm một đối tượng ngữ cảnh của TanStack Query (</w:t>
+      </w:r>
+      <w:r>
+        <w:rPr>
+          <w:rFonts w:ascii="Consolas" w:eastAsia="Consolas" w:hAnsi="Consolas" w:cs="Consolas"/>
+        </w:rPr>
+        <w:t xml:space="preserve">queryKey</w:t>
+      </w:r>
+      <w:r>
+        <w:t xml:space="preserve">, </w:t>
+      </w:r>
+      <w:r>
+        <w:rPr>
+          <w:rFonts w:ascii="Consolas" w:eastAsia="Consolas" w:hAnsi="Consolas" w:cs="Consolas"/>
+        </w:rPr>
+        <w:t xml:space="preserve">signal</w:t>
+      </w:r>
+      <w:r>
+        <w:t xml:space="preserve">…). Khi </w:t>
+      </w:r>
+      <w:r>
+        <w:rPr>
+          <w:rFonts w:ascii="Consolas" w:eastAsia="Consolas" w:hAnsi="Consolas" w:cs="Consolas"/>
+        </w:rPr>
+        <w:t xml:space="preserve">fetchInbox()</w:t>
+      </w:r>
+      <w:r>
+        <w:t xml:space="preserve"> chưa có tham số thì không sao; giờ tham số đầu là </w:t>
+      </w:r>
+      <w:r>
+        <w:rPr>
+          <w:rFonts w:ascii="Consolas" w:eastAsia="Consolas" w:hAnsi="Consolas" w:cs="Consolas"/>
+        </w:rPr>
+        <w:t xml:space="preserve">kind</w:t>
+      </w:r>
+      <w:r>
+        <w:t xml:space="preserve">, đối tượng đó sẽ bị coi là loại và </w:t>
+      </w:r>
+      <w:r>
+        <w:rPr>
+          <w:rFonts w:ascii="Consolas" w:eastAsia="Consolas" w:hAnsi="Consolas" w:cs="Consolas"/>
+        </w:rPr>
+        <w:t xml:space="preserve">kind.toLowerCase()</w:t>
+      </w:r>
+      <w:r>
+        <w:t xml:space="preserve"> hỏng. Vì vậy </w:t>
+      </w:r>
+      <w:r>
+        <w:rPr>
+          <w:rFonts w:ascii="Consolas" w:eastAsia="Consolas" w:hAnsi="Consolas" w:cs="Consolas"/>
+        </w:rPr>
+        <w:t xml:space="preserve">useInbox</w:t>
+      </w:r>
+      <w:r>
+        <w:t xml:space="preserve"> viết </w:t>
+      </w:r>
+      <w:r>
+        <w:rPr>
+          <w:rFonts w:ascii="Consolas" w:eastAsia="Consolas" w:hAnsi="Consolas" w:cs="Consolas"/>
+        </w:rPr>
+        <w:t xml:space="preserve">queryFn: () =&gt; fetchInbox()</w:t>
+      </w:r>
+      <w:r>
+        <w:t xml:space="preserve">. Quy tắc chung: chỉ đưa thẳng tên hàm cho </w:t>
+      </w:r>
+      <w:r>
+        <w:rPr>
+          <w:rFonts w:ascii="Consolas" w:eastAsia="Consolas" w:hAnsi="Consolas" w:cs="Consolas"/>
+        </w:rPr>
+        <w:t xml:space="preserve">queryFn</w:t>
+      </w:r>
+      <w:r>
+        <w:t xml:space="preserve"> khi hàm không nhận tham số nào.</w:t>
+      </w:r>
+    </w:p>
+    <w:p>
+      <w:pPr>
+        <w:pStyle w:val="Heading3"/>
+      </w:pPr>
+      <w:r>
+        <w:t xml:space="preserve">22.3 "Không biết" khác "không có"</w:t>
+      </w:r>
+    </w:p>
+    <w:p>
+      <w:r>
+        <w:rPr>
+          <w:rFonts w:ascii="Consolas" w:eastAsia="Consolas" w:hAnsi="Consolas" w:cs="Consolas"/>
+        </w:rPr>
+        <w:t xml:space="preserve">fetchUnreadByKind()</w:t>
+      </w:r>
+      <w:r>
+        <w:t xml:space="preserve"> trả </w:t>
+      </w:r>
+      <w:r>
+        <w:rPr>
+          <w:rFonts w:ascii="Consolas" w:eastAsia="Consolas" w:hAnsi="Consolas" w:cs="Consolas"/>
+        </w:rPr>
+        <w:t xml:space="preserve">{ EMAIL, CHAT }</w:t>
+      </w:r>
+      <w:r>
+        <w:t xml:space="preserve"> cho thanh điều hướng. Backend trước f05c không có </w:t>
+      </w:r>
+      <w:r>
+        <w:rPr>
+          <w:rFonts w:ascii="Consolas" w:eastAsia="Consolas" w:hAnsi="Consolas" w:cs="Consolas"/>
+        </w:rPr>
+        <w:t xml:space="preserve">unreadByKind</w:t>
+      </w:r>
+      <w:r>
+        <w:t xml:space="preserve">: Hộp thư lấy tổng </w:t>
+      </w:r>
+      <w:r>
+        <w:rPr>
+          <w:rFonts w:ascii="Consolas" w:eastAsia="Consolas" w:hAnsi="Consolas" w:cs="Consolas"/>
+        </w:rPr>
+        <w:t xml:space="preserve">unread</w:t>
+      </w:r>
+      <w:r>
+        <w:t xml:space="preserve"> (hôm nay chỉ email chạy thật, nên tổng đó đúng là của email), còn Tin nhắn là </w:t>
+      </w:r>
+      <w:r>
+        <w:rPr>
+          <w:rFonts w:ascii="Consolas" w:eastAsia="Consolas" w:hAnsi="Consolas" w:cs="Consolas"/>
+        </w:rPr>
+        <w:t xml:space="preserve">null</w:t>
+      </w:r>
+      <w:r>
+        <w:t xml:space="preserve">, nghĩa là "không biết", và điều hướng không hiện số. Trả </w:t>
+      </w:r>
+      <w:r>
+        <w:rPr>
+          <w:rFonts w:ascii="Consolas" w:eastAsia="Consolas" w:hAnsi="Consolas" w:cs="Consolas"/>
+        </w:rPr>
+        <w:t xml:space="preserve">0</w:t>
+      </w:r>
+      <w:r>
+        <w:t xml:space="preserve"> thì sai: nó nói "không có tin chưa đọc" trong khi sự thật là không biết.</w:t>
+      </w:r>
+    </w:p>
+    <w:p>
+      <w:pPr>
+        <w:pStyle w:val="Heading3"/>
+      </w:pPr>
+      <w:r>
+        <w:t xml:space="preserve">22.4 Cập nhật trước khi server trả lời phải giữ mọi số khớp nhau</w:t>
+      </w:r>
+    </w:p>
+    <w:p>
+      <w:r>
+        <w:t xml:space="preserve">Đọc một thư thì </w:t>
+      </w:r>
+      <w:r>
+        <w:rPr>
+          <w:rFonts w:ascii="Consolas" w:eastAsia="Consolas" w:hAnsi="Consolas" w:cs="Consolas"/>
+        </w:rPr>
+        <w:t xml:space="preserve">countsAfter</w:t>
+      </w:r>
+      <w:r>
+        <w:t xml:space="preserve"> trừ ngay số chưa đọc, số theo nguồn, số cần trả lời, trước khi server trả lời (optimistic update). Thêm </w:t>
+      </w:r>
+      <w:r>
+        <w:rPr>
+          <w:rFonts w:ascii="Consolas" w:eastAsia="Consolas" w:hAnsi="Consolas" w:cs="Consolas"/>
+        </w:rPr>
+        <w:t xml:space="preserve">unreadByKind</w:t>
+      </w:r>
+      <w:r>
+        <w:t xml:space="preserve"> mà không sửa hàm này thì sau khi đọc, tổng giảm còn số của loại vẫn như cũ. Test viết trước bắt đúng lỗi đó (đỏ: </w:t>
+      </w:r>
+      <w:r>
+        <w:rPr>
+          <w:rFonts w:ascii="Consolas" w:eastAsia="Consolas" w:hAnsi="Consolas" w:cs="Consolas"/>
+        </w:rPr>
+        <w:t xml:space="preserve">{ EMAIL: 3, CHAT: 2 }</w:t>
+      </w:r>
+      <w:r>
+        <w:t xml:space="preserve"> thay vì </w:t>
+      </w:r>
+      <w:r>
+        <w:rPr>
+          <w:rFonts w:ascii="Consolas" w:eastAsia="Consolas" w:hAnsi="Consolas" w:cs="Consolas"/>
+        </w:rPr>
+        <w:t xml:space="preserve">{ EMAIL: 2, CHAT: 2 }</w:t>
+      </w:r>
+      <w:r>
+        <w:t xml:space="preserve">). Loại của một dòng không bao giờ đổi, nên chỉ cần cộng trừ vào </w:t>
+      </w:r>
+      <w:r>
+        <w:rPr>
+          <w:rFonts w:ascii="Consolas" w:eastAsia="Consolas" w:hAnsi="Consolas" w:cs="Consolas"/>
+        </w:rPr>
+        <w:t xml:space="preserve">unreadByKind[after.kind]</w:t>
+      </w:r>
+      <w:r>
+        <w:t xml:space="preserve">.</w:t>
+      </w:r>
+    </w:p>
+    <w:p>
+      <w:pPr>
+        <w:pStyle w:val="Heading2"/>
+      </w:pPr>
+      <w:r>
         <w:t xml:space="preserve">Tự kiểm tra</w:t>
       </w:r>
     </w:p>
@@ -32560,6 +32993,111 @@
           <w:rFonts w:ascii="Consolas" w:eastAsia="Consolas" w:hAnsi="Consolas" w:cs="Consolas"/>
         </w:rPr>
         <w:t xml:space="preserve">Intl.DateTimeFormat</w:t>
+      </w:r>
+      <w:r>
+        <w:t xml:space="preserve">?</w:t>
+      </w:r>
+    </w:p>
+    <w:p>
+      <w:pPr>
+        <w:pStyle w:val="ListParagraph"/>
+        <w:numPr>
+          <w:ilvl w:val="0"/>
+          <w:numId w:val="100"/>
+        </w:numPr>
+      </w:pPr>
+      <w:r>
+        <w:t xml:space="preserve">Vì sao </w:t>
+      </w:r>
+      <w:r>
+        <w:rPr>
+          <w:rFonts w:ascii="Consolas" w:eastAsia="Consolas" w:hAnsi="Consolas" w:cs="Consolas"/>
+        </w:rPr>
+        <w:t xml:space="preserve">kind</w:t>
+      </w:r>
+      <w:r>
+        <w:t xml:space="preserve"> của provider là trường bắt buộc trong </w:t>
+      </w:r>
+      <w:r>
+        <w:rPr>
+          <w:rFonts w:ascii="Consolas" w:eastAsia="Consolas" w:hAnsi="Consolas" w:cs="Consolas"/>
+        </w:rPr>
+        <w:t xml:space="preserve">ProviderInfo</w:t>
+      </w:r>
+      <w:r>
+        <w:t xml:space="preserve">, dù backend cũ không gửi nó? Quy tắc cho backend cũ nằm ở đâu?</w:t>
+      </w:r>
+    </w:p>
+    <w:p>
+      <w:pPr>
+        <w:pStyle w:val="ListParagraph"/>
+        <w:numPr>
+          <w:ilvl w:val="0"/>
+          <w:numId w:val="100"/>
+        </w:numPr>
+      </w:pPr>
+      <w:r>
+        <w:rPr>
+          <w:rFonts w:ascii="Consolas" w:eastAsia="Consolas" w:hAnsi="Consolas" w:cs="Consolas"/>
+        </w:rPr>
+        <w:t xml:space="preserve">useQuery({ queryFn: fetchInbox })</w:t>
+      </w:r>
+      <w:r>
+        <w:t xml:space="preserve"> hỏng sau khi </w:t>
+      </w:r>
+      <w:r>
+        <w:rPr>
+          <w:rFonts w:ascii="Consolas" w:eastAsia="Consolas" w:hAnsi="Consolas" w:cs="Consolas"/>
+        </w:rPr>
+        <w:t xml:space="preserve">fetchInbox</w:t>
+      </w:r>
+      <w:r>
+        <w:t xml:space="preserve"> có tham số </w:t>
+      </w:r>
+      <w:r>
+        <w:rPr>
+          <w:rFonts w:ascii="Consolas" w:eastAsia="Consolas" w:hAnsi="Consolas" w:cs="Consolas"/>
+        </w:rPr>
+        <w:t xml:space="preserve">kind</w:t>
+      </w:r>
+      <w:r>
+        <w:t xml:space="preserve">. Vì sao, và viết lại thế nào?</w:t>
+      </w:r>
+    </w:p>
+    <w:p>
+      <w:pPr>
+        <w:pStyle w:val="ListParagraph"/>
+        <w:numPr>
+          <w:ilvl w:val="0"/>
+          <w:numId w:val="100"/>
+        </w:numPr>
+      </w:pPr>
+      <w:r>
+        <w:t xml:space="preserve">Vì sao Tin nhắn nhận </w:t>
+      </w:r>
+      <w:r>
+        <w:rPr>
+          <w:rFonts w:ascii="Consolas" w:eastAsia="Consolas" w:hAnsi="Consolas" w:cs="Consolas"/>
+        </w:rPr>
+        <w:t xml:space="preserve">null</w:t>
+      </w:r>
+      <w:r>
+        <w:t xml:space="preserve"> chứ không nhận </w:t>
+      </w:r>
+      <w:r>
+        <w:rPr>
+          <w:rFonts w:ascii="Consolas" w:eastAsia="Consolas" w:hAnsi="Consolas" w:cs="Consolas"/>
+        </w:rPr>
+        <w:t xml:space="preserve">0</w:t>
+      </w:r>
+      <w:r>
+        <w:t xml:space="preserve"> khi backend chưa có </w:t>
+      </w:r>
+      <w:r>
+        <w:rPr>
+          <w:rFonts w:ascii="Consolas" w:eastAsia="Consolas" w:hAnsi="Consolas" w:cs="Consolas"/>
+        </w:rPr>
+        <w:t xml:space="preserve">unreadByKind</w:t>
       </w:r>
       <w:r>
         <w:t xml:space="preserve">?</w:t>

</xml_diff>

<commit_message>
feat(fe-111): Tin nhắn and Hộp thư on the navigation, Lịch behind Thêm
The sidebar and the rail list Tổng quan, Tin nhắn (/messages) and Hộp
thư, each with its own unread count; the phone tab bar is Tổng quan ·
Tin nhắn · Hộp thư · Việc · Thêm, with Lịch first on the Thêm page and
Thêm current on /calendar (D-300, D-301). useUnreadByKind reads both
numbers from the counts on the old cache key, so realtime still
refreshes them; a backend that cannot count by kind shows no number on
Tin nhắn. /messages shows the under-construction page until FE-112.

lint 0; build 0; vitest 674/674; Chrome on a throwaway worktree backend
at 1440, 1024 and 375 px.

Co-Authored-By: Claude Opus 5.5 <noreply@anthropic.com>
</commit_message>
<xml_diff>
--- a/docs/knowledge/phase-1-frontend-foundation.docx
+++ b/docs/knowledge/phase-1-frontend-foundation.docx
@@ -29458,6 +29458,312 @@
     </w:p>
     <w:p>
       <w:pPr>
+        <w:pStyle w:val="Heading3"/>
+      </w:pPr>
+      <w:r>
+        <w:t xml:space="preserve">22.5 Điều hướng: một bảng dữ liệu, ba cách vẽ (FE-111)</w:t>
+      </w:r>
+    </w:p>
+    <w:p>
+      <w:r>
+        <w:t xml:space="preserve">Thanh bên, rail và tab bar không viết cứng từng mục: cả ba đọc </w:t>
+      </w:r>
+      <w:r>
+        <w:rPr>
+          <w:rFonts w:ascii="Consolas" w:eastAsia="Consolas" w:hAnsi="Consolas" w:cs="Consolas"/>
+        </w:rPr>
+        <w:t xml:space="preserve">NAV_ITEMS</w:t>
+      </w:r>
+      <w:r>
+        <w:t xml:space="preserve"> và </w:t>
+      </w:r>
+      <w:r>
+        <w:rPr>
+          <w:rFonts w:ascii="Consolas" w:eastAsia="Consolas" w:hAnsi="Consolas" w:cs="Consolas"/>
+        </w:rPr>
+        <w:t xml:space="preserve">TAB_ITEMS</w:t>
+      </w:r>
+      <w:r>
+        <w:t xml:space="preserve"> trong </w:t>
+      </w:r>
+      <w:r>
+        <w:rPr>
+          <w:rFonts w:ascii="Consolas" w:eastAsia="Consolas" w:hAnsi="Consolas" w:cs="Consolas"/>
+        </w:rPr>
+        <w:t xml:space="preserve">navItems.ts</w:t>
+      </w:r>
+      <w:r>
+        <w:t xml:space="preserve">. Thêm "Tin nhắn" là thêm một dòng vào bảng. Thanh bên hiện chữ và số; rail chỉ có icon, nên tên đọc được của link thành "Tin nhắn, 5 chưa đọc" (</w:t>
+      </w:r>
+      <w:r>
+        <w:rPr>
+          <w:rFonts w:ascii="Consolas" w:eastAsia="Consolas" w:hAnsi="Consolas" w:cs="Consolas"/>
+        </w:rPr>
+        <w:t xml:space="preserve">aria-label</w:t>
+      </w:r>
+      <w:r>
+        <w:t xml:space="preserve">); tab bar hiện số nhỏ trên icon. Lịch rời tab bar bằng cách bỏ khỏi </w:t>
+      </w:r>
+      <w:r>
+        <w:rPr>
+          <w:rFonts w:ascii="Consolas" w:eastAsia="Consolas" w:hAnsi="Consolas" w:cs="Consolas"/>
+        </w:rPr>
+        <w:t xml:space="preserve">TAB_ITEMS</w:t>
+      </w:r>
+      <w:r>
+        <w:t xml:space="preserve"> và thêm </w:t>
+      </w:r>
+      <w:r>
+        <w:rPr>
+          <w:rFonts w:ascii="Consolas" w:eastAsia="Consolas" w:hAnsi="Consolas" w:cs="Consolas"/>
+        </w:rPr>
+        <w:t xml:space="preserve">/calendar</w:t>
+      </w:r>
+      <w:r>
+        <w:t xml:space="preserve"> vào </w:t>
+      </w:r>
+      <w:r>
+        <w:rPr>
+          <w:rFonts w:ascii="Consolas" w:eastAsia="Consolas" w:hAnsi="Consolas" w:cs="Consolas"/>
+        </w:rPr>
+        <w:t xml:space="preserve">MORE_PATHS</w:t>
+      </w:r>
+      <w:r>
+        <w:t xml:space="preserve">, nhờ đó tab "Thêm" sáng khi đang ở Lịch.</w:t>
+      </w:r>
+    </w:p>
+    <w:p>
+      <w:pPr>
+        <w:shd w:val="clear" w:color="auto" w:fill="F2F3F5"/>
+        <w:ind w:left="0"/>
+      </w:pPr>
+      <w:r>
+        <w:rPr>
+          <w:rFonts w:ascii="Consolas" w:eastAsia="Consolas" w:hAnsi="Consolas" w:cs="Consolas"/>
+          <w:sz w:val="19"/>
+          <w:szCs w:val="19"/>
+        </w:rPr>
+        <w:t xml:space="preserve">navItems.ts  NAV_ITEMS --+--&gt; Sidebar (&gt;= 1280px)   chữ + số</w:t>
+        <w:br/>
+        <w:t xml:space="preserve">                         +--&gt; Rail (768-1279px)     icon + aria-label "Tin nhắn, 5 chưa đọc"</w:t>
+        <w:br/>
+        <w:t xml:space="preserve">             TAB_ITEMS -----&gt; TabBar (&lt; 768px)      icon + chữ + số nhỏ</w:t>
+        <w:br/>
+        <w:t xml:space="preserve">             MORE_PATHS ----&gt; tab "Thêm" sáng ở /calendar, /notes, /accounts...</w:t>
+      </w:r>
+    </w:p>
+    <w:p>
+      <w:r>
+        <w:t xml:space="preserve">Số của hai mục đến từ một request: </w:t>
+      </w:r>
+      <w:r>
+        <w:rPr>
+          <w:rFonts w:ascii="Consolas" w:eastAsia="Consolas" w:hAnsi="Consolas" w:cs="Consolas"/>
+        </w:rPr>
+        <w:t xml:space="preserve">useUnreadByKind</w:t>
+      </w:r>
+      <w:r>
+        <w:t xml:space="preserve"> đọc </w:t>
+      </w:r>
+      <w:r>
+        <w:rPr>
+          <w:rFonts w:ascii="Consolas" w:eastAsia="Consolas" w:hAnsi="Consolas" w:cs="Consolas"/>
+        </w:rPr>
+        <w:t xml:space="preserve">GET /api/conversations/counts</w:t>
+      </w:r>
+      <w:r>
+        <w:t xml:space="preserve"> một lần, lấy </w:t>
+      </w:r>
+      <w:r>
+        <w:rPr>
+          <w:rFonts w:ascii="Consolas" w:eastAsia="Consolas" w:hAnsi="Consolas" w:cs="Consolas"/>
+        </w:rPr>
+        <w:t xml:space="preserve">CHAT</w:t>
+      </w:r>
+      <w:r>
+        <w:t xml:space="preserve"> cho Tin nhắn và </w:t>
+      </w:r>
+      <w:r>
+        <w:rPr>
+          <w:rFonts w:ascii="Consolas" w:eastAsia="Consolas" w:hAnsi="Consolas" w:cs="Consolas"/>
+        </w:rPr>
+        <w:t xml:space="preserve">EMAIL</w:t>
+      </w:r>
+      <w:r>
+        <w:t xml:space="preserve"> cho Hộp thư. Hook giữ nguyên khóa cache </w:t>
+      </w:r>
+      <w:r>
+        <w:rPr>
+          <w:rFonts w:ascii="Consolas" w:eastAsia="Consolas" w:hAnsi="Consolas" w:cs="Consolas"/>
+        </w:rPr>
+        <w:t xml:space="preserve">['inbox-unread']</w:t>
+      </w:r>
+      <w:r>
+        <w:t xml:space="preserve"> của số Hộp thư cũ, nên sự kiện realtime vẫn làm mới số mà không phải sửa </w:t>
+      </w:r>
+      <w:r>
+        <w:rPr>
+          <w:rFonts w:ascii="Consolas" w:eastAsia="Consolas" w:hAnsi="Consolas" w:cs="Consolas"/>
+        </w:rPr>
+        <w:t xml:space="preserve">useEventStream</w:t>
+      </w:r>
+      <w:r>
+        <w:t xml:space="preserve">.</w:t>
+      </w:r>
+    </w:p>
+    <w:p>
+      <w:r>
+        <w:t xml:space="preserve">Số </w:t>
+      </w:r>
+      <w:r>
+        <w:rPr>
+          <w:rFonts w:ascii="Consolas" w:eastAsia="Consolas" w:hAnsi="Consolas" w:cs="Consolas"/>
+        </w:rPr>
+        <w:t xml:space="preserve">null</w:t>
+      </w:r>
+      <w:r>
+        <w:t xml:space="preserve"> (backend chưa đếm theo loại) và số 0 cùng không hiện: </w:t>
+      </w:r>
+      <w:r>
+        <w:rPr>
+          <w:rFonts w:ascii="Consolas" w:eastAsia="Consolas" w:hAnsi="Consolas" w:cs="Consolas"/>
+        </w:rPr>
+        <w:t xml:space="preserve">badgeOf</w:t>
+      </w:r>
+      <w:r>
+        <w:t xml:space="preserve"> viết </w:t>
+      </w:r>
+      <w:r>
+        <w:rPr>
+          <w:rFonts w:ascii="Consolas" w:eastAsia="Consolas" w:hAnsi="Consolas" w:cs="Consolas"/>
+        </w:rPr>
+        <w:t xml:space="preserve">(badge &amp;&amp; counts?.[badge.key]) ?? 0</w:t>
+      </w:r>
+      <w:r>
+        <w:t xml:space="preserve">. </w:t>
+      </w:r>
+      <w:r>
+        <w:rPr>
+          <w:rFonts w:ascii="Consolas" w:eastAsia="Consolas" w:hAnsi="Consolas" w:cs="Consolas"/>
+        </w:rPr>
+        <w:t xml:space="preserve">??</w:t>
+      </w:r>
+      <w:r>
+        <w:t xml:space="preserve"> chỉ thay </w:t>
+      </w:r>
+      <w:r>
+        <w:rPr>
+          <w:rFonts w:ascii="Consolas" w:eastAsia="Consolas" w:hAnsi="Consolas" w:cs="Consolas"/>
+        </w:rPr>
+        <w:t xml:space="preserve">null</w:t>
+      </w:r>
+      <w:r>
+        <w:t xml:space="preserve"> và </w:t>
+      </w:r>
+      <w:r>
+        <w:rPr>
+          <w:rFonts w:ascii="Consolas" w:eastAsia="Consolas" w:hAnsi="Consolas" w:cs="Consolas"/>
+        </w:rPr>
+        <w:t xml:space="preserve">undefined</w:t>
+      </w:r>
+      <w:r>
+        <w:t xml:space="preserve">, nên số 0 vẫn là 0.</w:t>
+      </w:r>
+    </w:p>
+    <w:p>
+      <w:r>
+        <w:t xml:space="preserve">Kiểm trên trình duyệt thật cần đăng nhập, nên lượt Chrome chạy jar backend của một worktree tạm ở cổng 8091 với PostgreSQL 18 dùng một lần trong Docker, và Vite ở cổng 5174 với proxy trỏ vào 8091 (một file cấu hình tạm gộp cấu hình gốc bằng </w:t>
+      </w:r>
+      <w:r>
+        <w:rPr>
+          <w:rFonts w:ascii="Consolas" w:eastAsia="Consolas" w:hAnsi="Consolas" w:cs="Consolas"/>
+        </w:rPr>
+        <w:t xml:space="preserve">mergeConfig</w:t>
+      </w:r>
+      <w:r>
+        <w:t xml:space="preserve">). Database thật và backend IntelliJ ở 8080 không bị đụng. Hai bài học nhỏ:</w:t>
+      </w:r>
+    </w:p>
+    <w:p>
+      <w:pPr>
+        <w:pStyle w:val="ListParagraph"/>
+        <w:numPr>
+          <w:ilvl w:val="0"/>
+          <w:numId w:val="1"/>
+        </w:numPr>
+      </w:pPr>
+      <w:r>
+        <w:t xml:space="preserve">File cấu hình Vite phải nằm trong dự án. Đặt ngoài </w:t>
+      </w:r>
+      <w:r>
+        <w:rPr>
+          <w:rFonts w:ascii="Consolas" w:eastAsia="Consolas" w:hAnsi="Consolas" w:cs="Consolas"/>
+        </w:rPr>
+        <w:t xml:space="preserve">apps/sino-web</w:t>
+      </w:r>
+      <w:r>
+        <w:t xml:space="preserve"> thì Vite không tìm thấy </w:t>
+      </w:r>
+      <w:r>
+        <w:rPr>
+          <w:rFonts w:ascii="Consolas" w:eastAsia="Consolas" w:hAnsi="Consolas" w:cs="Consolas"/>
+        </w:rPr>
+        <w:t xml:space="preserve">vite</w:t>
+      </w:r>
+      <w:r>
+        <w:t xml:space="preserve"> và </w:t>
+      </w:r>
+      <w:r>
+        <w:rPr>
+          <w:rFonts w:ascii="Consolas" w:eastAsia="Consolas" w:hAnsi="Consolas" w:cs="Consolas"/>
+        </w:rPr>
+        <w:t xml:space="preserve">@tailwindcss/vite</w:t>
+      </w:r>
+      <w:r>
+        <w:t xml:space="preserve">, vì Node tìm </w:t>
+      </w:r>
+      <w:r>
+        <w:rPr>
+          <w:rFonts w:ascii="Consolas" w:eastAsia="Consolas" w:hAnsi="Consolas" w:cs="Consolas"/>
+        </w:rPr>
+        <w:t xml:space="preserve">node_modules</w:t>
+      </w:r>
+      <w:r>
+        <w:t xml:space="preserve"> bắt đầu từ thư mục chứa file.</w:t>
+      </w:r>
+    </w:p>
+    <w:p>
+      <w:pPr>
+        <w:pStyle w:val="ListParagraph"/>
+        <w:numPr>
+          <w:ilvl w:val="0"/>
+          <w:numId w:val="1"/>
+        </w:numPr>
+      </w:pPr>
+      <w:r>
+        <w:t xml:space="preserve">Nạp file env bằng </w:t>
+      </w:r>
+      <w:r>
+        <w:rPr>
+          <w:rFonts w:ascii="Consolas" w:eastAsia="Consolas" w:hAnsi="Consolas" w:cs="Consolas"/>
+        </w:rPr>
+        <w:t xml:space="preserve">set -a; . file</w:t>
+      </w:r>
+      <w:r>
+        <w:t xml:space="preserve"> hỏng với giá trị có dấu cách ("An Nguyễn"): shell tách thành một biến và một lệnh. Đọc từng dòng rồi </w:t>
+      </w:r>
+      <w:r>
+        <w:rPr>
+          <w:rFonts w:ascii="Consolas" w:eastAsia="Consolas" w:hAnsi="Consolas" w:cs="Consolas"/>
+        </w:rPr>
+        <w:t xml:space="preserve">export "$line"</w:t>
+      </w:r>
+      <w:r>
+        <w:t xml:space="preserve"> thì giữ nguyên giá trị.</w:t>
+      </w:r>
+    </w:p>
+    <w:p>
+      <w:pPr>
         <w:pStyle w:val="Heading2"/>
       </w:pPr>
       <w:r>
@@ -33568,6 +33874,96 @@
       </w:r>
       <w:r>
         <w:t xml:space="preserve"> chứ không nằm trong component vẽ? Vì sao hàm trả lại đúng đối tượng cũ khi không đổi gì?</w:t>
+      </w:r>
+    </w:p>
+    <w:p>
+      <w:pPr>
+        <w:pStyle w:val="ListParagraph"/>
+        <w:numPr>
+          <w:ilvl w:val="0"/>
+          <w:numId w:val="100"/>
+        </w:numPr>
+      </w:pPr>
+      <w:r>
+        <w:t xml:space="preserve">Thêm mục "Tin nhắn" vào điều hướng phải sửa những file nào? Vì sao </w:t>
+      </w:r>
+      <w:r>
+        <w:rPr>
+          <w:rFonts w:ascii="Consolas" w:eastAsia="Consolas" w:hAnsi="Consolas" w:cs="Consolas"/>
+        </w:rPr>
+        <w:t xml:space="preserve">Sidebar</w:t>
+      </w:r>
+      <w:r>
+        <w:t xml:space="preserve">, </w:t>
+      </w:r>
+      <w:r>
+        <w:rPr>
+          <w:rFonts w:ascii="Consolas" w:eastAsia="Consolas" w:hAnsi="Consolas" w:cs="Consolas"/>
+        </w:rPr>
+        <w:t xml:space="preserve">Rail</w:t>
+      </w:r>
+      <w:r>
+        <w:t xml:space="preserve">, </w:t>
+      </w:r>
+      <w:r>
+        <w:rPr>
+          <w:rFonts w:ascii="Consolas" w:eastAsia="Consolas" w:hAnsi="Consolas" w:cs="Consolas"/>
+        </w:rPr>
+        <w:t xml:space="preserve">TabBar</w:t>
+      </w:r>
+      <w:r>
+        <w:t xml:space="preserve"> không phải sửa?</w:t>
+      </w:r>
+    </w:p>
+    <w:p>
+      <w:pPr>
+        <w:pStyle w:val="ListParagraph"/>
+        <w:numPr>
+          <w:ilvl w:val="0"/>
+          <w:numId w:val="100"/>
+        </w:numPr>
+      </w:pPr>
+      <w:r>
+        <w:t xml:space="preserve">Vì sao </w:t>
+      </w:r>
+      <w:r>
+        <w:rPr>
+          <w:rFonts w:ascii="Consolas" w:eastAsia="Consolas" w:hAnsi="Consolas" w:cs="Consolas"/>
+        </w:rPr>
+        <w:t xml:space="preserve">useUnreadByKind</w:t>
+      </w:r>
+      <w:r>
+        <w:t xml:space="preserve"> dùng lại khóa </w:t>
+      </w:r>
+      <w:r>
+        <w:rPr>
+          <w:rFonts w:ascii="Consolas" w:eastAsia="Consolas" w:hAnsi="Consolas" w:cs="Consolas"/>
+        </w:rPr>
+        <w:t xml:space="preserve">['inbox-unread']</w:t>
+      </w:r>
+      <w:r>
+        <w:t xml:space="preserve"> thay vì đặt một khóa mới?</w:t>
+      </w:r>
+    </w:p>
+    <w:p>
+      <w:pPr>
+        <w:pStyle w:val="ListParagraph"/>
+        <w:numPr>
+          <w:ilvl w:val="0"/>
+          <w:numId w:val="100"/>
+        </w:numPr>
+      </w:pPr>
+      <w:r>
+        <w:t xml:space="preserve">Vì sao file cấu hình Vite tạm phải nằm trong </w:t>
+      </w:r>
+      <w:r>
+        <w:rPr>
+          <w:rFonts w:ascii="Consolas" w:eastAsia="Consolas" w:hAnsi="Consolas" w:cs="Consolas"/>
+        </w:rPr>
+        <w:t xml:space="preserve">apps/sino-web</w:t>
+      </w:r>
+      <w:r>
+        <w:t xml:space="preserve"> mới chạy được?</w:t>
       </w:r>
     </w:p>
     <w:p/>

</xml_diff>

<commit_message>
feat(fe-112): Tin nhắn and Hộp thư as two screens, by kind
/messages lists the chats and /inbox the emails, both on InboxPage with
a kind (keyed routes, so switching screens starts afresh). Each screen
has its own frame and lists in the cache (['inbox','frame',kind], lists
by kind) and asks the API with kind=chat|email; its sources, accounts
and first sync are those of its kind. A conversation opened on the
wrong screen moves to its own with replace, before it shows or is read
(D-303). Thư mới stays on Hộp thư only, Tin nhắn says "N tin mới", a
chat back link goes to Tin nhắn, and a failed scheduled chat reads
"Tin hẹn giờ không gửi được" as the canvas does. The sample gains the
two chats of the canvas and counts by kind.

lint 0; build 0; vitest 686/686; Chrome at 1440, 1024 and 375 px.

Co-Authored-By: Claude Opus 5.5 <noreply@anthropic.com>
</commit_message>
<xml_diff>
--- a/docs/knowledge/phase-1-frontend-foundation.docx
+++ b/docs/knowledge/phase-1-frontend-foundation.docx
@@ -29764,6 +29764,346 @@
     </w:p>
     <w:p>
       <w:pPr>
+        <w:pStyle w:val="Heading3"/>
+      </w:pPr>
+      <w:r>
+        <w:t xml:space="preserve">22.6 Hai màn, một component, khóa cache theo loại (FE-112)</w:t>
+      </w:r>
+    </w:p>
+    <w:p>
+      <w:r>
+        <w:rPr>
+          <w:rFonts w:ascii="Consolas" w:eastAsia="Consolas" w:hAnsi="Consolas" w:cs="Consolas"/>
+        </w:rPr>
+        <w:t xml:space="preserve">InboxPage</w:t>
+      </w:r>
+      <w:r>
+        <w:t xml:space="preserve"> vẫn là một component cho cả hai màn. Nó nhận </w:t>
+      </w:r>
+      <w:r>
+        <w:rPr>
+          <w:rFonts w:ascii="Consolas" w:eastAsia="Consolas" w:hAnsi="Consolas" w:cs="Consolas"/>
+        </w:rPr>
+        <w:t xml:space="preserve">kind</w:t>
+      </w:r>
+      <w:r>
+        <w:t xml:space="preserve"> (</w:t>
+      </w:r>
+      <w:r>
+        <w:rPr>
+          <w:rFonts w:ascii="Consolas" w:eastAsia="Consolas" w:hAnsi="Consolas" w:cs="Consolas"/>
+        </w:rPr>
+        <w:t xml:space="preserve">CHAT</w:t>
+      </w:r>
+      <w:r>
+        <w:t xml:space="preserve"> hoặc </w:t>
+      </w:r>
+      <w:r>
+        <w:rPr>
+          <w:rFonts w:ascii="Consolas" w:eastAsia="Consolas" w:hAnsi="Consolas" w:cs="Consolas"/>
+        </w:rPr>
+        <w:t xml:space="preserve">EMAIL</w:t>
+      </w:r>
+      <w:r>
+        <w:t xml:space="preserve">) và lấy phần còn lại từ </w:t>
+      </w:r>
+      <w:r>
+        <w:rPr>
+          <w:rFonts w:ascii="Consolas" w:eastAsia="Consolas" w:hAnsi="Consolas" w:cs="Consolas"/>
+        </w:rPr>
+        <w:t xml:space="preserve">SCREENS[kind]</w:t>
+      </w:r>
+      <w:r>
+        <w:t xml:space="preserve"> trong </w:t>
+      </w:r>
+      <w:r>
+        <w:rPr>
+          <w:rFonts w:ascii="Consolas" w:eastAsia="Consolas" w:hAnsi="Consolas" w:cs="Consolas"/>
+        </w:rPr>
+        <w:t xml:space="preserve">screen.ts</w:t>
+      </w:r>
+      <w:r>
+        <w:t xml:space="preserve">: đường gốc, tiêu đề, chữ của link quay lại. Router gắn </w:t>
+      </w:r>
+      <w:r>
+        <w:rPr>
+          <w:rFonts w:ascii="Consolas" w:eastAsia="Consolas" w:hAnsi="Consolas" w:cs="Consolas"/>
+        </w:rPr>
+        <w:t xml:space="preserve">/messages</w:t>
+      </w:r>
+      <w:r>
+        <w:t xml:space="preserve"> với </w:t>
+      </w:r>
+      <w:r>
+        <w:rPr>
+          <w:rFonts w:ascii="Consolas" w:eastAsia="Consolas" w:hAnsi="Consolas" w:cs="Consolas"/>
+        </w:rPr>
+        <w:t xml:space="preserve">&lt;InboxPage key="CHAT" kind="CHAT" /&gt;</w:t>
+      </w:r>
+      <w:r>
+        <w:t xml:space="preserve"> và </w:t>
+      </w:r>
+      <w:r>
+        <w:rPr>
+          <w:rFonts w:ascii="Consolas" w:eastAsia="Consolas" w:hAnsi="Consolas" w:cs="Consolas"/>
+        </w:rPr>
+        <w:t xml:space="preserve">/inbox</w:t>
+      </w:r>
+      <w:r>
+        <w:t xml:space="preserve"> với </w:t>
+      </w:r>
+      <w:r>
+        <w:rPr>
+          <w:rFonts w:ascii="Consolas" w:eastAsia="Consolas" w:hAnsi="Consolas" w:cs="Consolas"/>
+        </w:rPr>
+        <w:t xml:space="preserve">kind="EMAIL"</w:t>
+      </w:r>
+      <w:r>
+        <w:t xml:space="preserve">.</w:t>
+      </w:r>
+    </w:p>
+    <w:p>
+      <w:pPr>
+        <w:shd w:val="clear" w:color="auto" w:fill="F2F3F5"/>
+        <w:ind w:left="0"/>
+      </w:pPr>
+      <w:r>
+        <w:rPr>
+          <w:rFonts w:ascii="Consolas" w:eastAsia="Consolas" w:hAnsi="Consolas" w:cs="Consolas"/>
+          <w:sz w:val="19"/>
+          <w:szCs w:val="19"/>
+        </w:rPr>
+        <w:t xml:space="preserve">/messages, /messages/:id -&gt; InboxPage kind=CHAT  -&gt; frame ['inbox','frame','CHAT']                counts?kind=chat</w:t>
+        <w:br/>
+        <w:t xml:space="preserve">                                                 -&gt; list  ['inbox','list','CHAT',view,source]      ?kind=chat</w:t>
+        <w:br/>
+        <w:t xml:space="preserve">/inbox, /inbox/:id       -&gt; InboxPage kind=EMAIL -&gt; frame ['inbox','frame','EMAIL'], list ...EMAIL  ?kind=email</w:t>
+        <w:br/>
+        <w:t xml:space="preserve">/inbox/new               -&gt; InboxPage kind=EMAIL compose</w:t>
+      </w:r>
+    </w:p>
+    <w:p>
+      <w:pPr>
+        <w:pStyle w:val="ListParagraph"/>
+        <w:numPr>
+          <w:ilvl w:val="0"/>
+          <w:numId w:val="1"/>
+        </w:numPr>
+      </w:pPr>
+      <w:r>
+        <w:rPr>
+          <w:rFonts w:ascii="Consolas" w:eastAsia="Consolas" w:hAnsi="Consolas" w:cs="Consolas"/>
+          <w:b/>
+          <w:bCs/>
+        </w:rPr>
+        <w:t xml:space="preserve">key</w:t>
+      </w:r>
+      <w:r>
+        <w:rPr>
+          <w:b/>
+          <w:bCs/>
+        </w:rPr>
+        <w:t xml:space="preserve"> trên element của route.</w:t>
+      </w:r>
+      <w:r>
+        <w:t xml:space="preserve"> Hai route cùng vẽ </w:t>
+      </w:r>
+      <w:r>
+        <w:rPr>
+          <w:rFonts w:ascii="Consolas" w:eastAsia="Consolas" w:hAnsi="Consolas" w:cs="Consolas"/>
+        </w:rPr>
+        <w:t xml:space="preserve">&lt;InboxPage&gt;</w:t>
+      </w:r>
+      <w:r>
+        <w:t xml:space="preserve"> ở cùng chỗ, nên React giữ nguyên component và state khi chuyển từ màn này sang màn kia (bộ đếm "N thư mới", ref nhớ đã đọc). </w:t>
+      </w:r>
+      <w:r>
+        <w:rPr>
+          <w:rFonts w:ascii="Consolas" w:eastAsia="Consolas" w:hAnsi="Consolas" w:cs="Consolas"/>
+        </w:rPr>
+        <w:t xml:space="preserve">key</w:t>
+      </w:r>
+      <w:r>
+        <w:t xml:space="preserve"> khác nhau buộc React dựng lại từ đầu.</w:t>
+      </w:r>
+    </w:p>
+    <w:p>
+      <w:pPr>
+        <w:pStyle w:val="ListParagraph"/>
+        <w:numPr>
+          <w:ilvl w:val="0"/>
+          <w:numId w:val="1"/>
+        </w:numPr>
+      </w:pPr>
+      <w:r>
+        <w:rPr>
+          <w:b/>
+          <w:bCs/>
+        </w:rPr>
+        <w:t xml:space="preserve">Khóa cache có </w:t>
+      </w:r>
+      <w:r>
+        <w:rPr>
+          <w:rFonts w:ascii="Consolas" w:eastAsia="Consolas" w:hAnsi="Consolas" w:cs="Consolas"/>
+          <w:b/>
+          <w:bCs/>
+        </w:rPr>
+        <w:t xml:space="preserve">kind</w:t>
+      </w:r>
+      <w:r>
+        <w:rPr>
+          <w:b/>
+          <w:bCs/>
+        </w:rPr>
+        <w:t xml:space="preserve">.</w:t>
+      </w:r>
+      <w:r>
+        <w:t xml:space="preserve"> Frame và danh sách của hai màn không bao giờ lẫn nhau. Tiền tố </w:t>
+      </w:r>
+      <w:r>
+        <w:rPr>
+          <w:rFonts w:ascii="Consolas" w:eastAsia="Consolas" w:hAnsi="Consolas" w:cs="Consolas"/>
+        </w:rPr>
+        <w:t xml:space="preserve">['inbox']</w:t>
+      </w:r>
+      <w:r>
+        <w:t xml:space="preserve"> vẫn đứng đầu mọi khóa, nên realtime và màn Tài khoản đọc lại cả hai màn bằng một lời gọi </w:t>
+      </w:r>
+      <w:r>
+        <w:rPr>
+          <w:rFonts w:ascii="Consolas" w:eastAsia="Consolas" w:hAnsi="Consolas" w:cs="Consolas"/>
+        </w:rPr>
+        <w:t xml:space="preserve">invalidateQueries({ queryKey: ['inbox'] })</w:t>
+      </w:r>
+      <w:r>
+        <w:t xml:space="preserve"> như trước. Khi đọc một thư, </w:t>
+      </w:r>
+      <w:r>
+        <w:rPr>
+          <w:rFonts w:ascii="Consolas" w:eastAsia="Consolas" w:hAnsi="Consolas" w:cs="Consolas"/>
+        </w:rPr>
+        <w:t xml:space="preserve">moveCounts</w:t>
+      </w:r>
+      <w:r>
+        <w:t xml:space="preserve"> sửa số đếm của frame cùng loại; frame kia chỉ đổi </w:t>
+      </w:r>
+      <w:r>
+        <w:rPr>
+          <w:rFonts w:ascii="Consolas" w:eastAsia="Consolas" w:hAnsi="Consolas" w:cs="Consolas"/>
+        </w:rPr>
+        <w:t xml:space="preserve">unreadByKind</w:t>
+      </w:r>
+      <w:r>
+        <w:t xml:space="preserve">.</w:t>
+      </w:r>
+    </w:p>
+    <w:p>
+      <w:pPr>
+        <w:pStyle w:val="ListParagraph"/>
+        <w:numPr>
+          <w:ilvl w:val="0"/>
+          <w:numId w:val="1"/>
+        </w:numPr>
+      </w:pPr>
+      <w:r>
+        <w:rPr>
+          <w:b/>
+          <w:bCs/>
+        </w:rPr>
+        <w:t xml:space="preserve">Tự chuyển màn.</w:t>
+      </w:r>
+      <w:r>
+        <w:t xml:space="preserve"> Mở </w:t>
+      </w:r>
+      <w:r>
+        <w:rPr>
+          <w:rFonts w:ascii="Consolas" w:eastAsia="Consolas" w:hAnsi="Consolas" w:cs="Consolas"/>
+        </w:rPr>
+        <w:t xml:space="preserve">/inbox/:id</w:t>
+      </w:r>
+      <w:r>
+        <w:t xml:space="preserve"> mà dòng là chat thì </w:t>
+      </w:r>
+      <w:r>
+        <w:rPr>
+          <w:rFonts w:ascii="Consolas" w:eastAsia="Consolas" w:hAnsi="Consolas" w:cs="Consolas"/>
+        </w:rPr>
+        <w:t xml:space="preserve">navigate(..., { replace: true })</w:t>
+      </w:r>
+      <w:r>
+        <w:t xml:space="preserve"> sang </w:t>
+      </w:r>
+      <w:r>
+        <w:rPr>
+          <w:rFonts w:ascii="Consolas" w:eastAsia="Consolas" w:hAnsi="Consolas" w:cs="Consolas"/>
+        </w:rPr>
+        <w:t xml:space="preserve">/messages/:id</w:t>
+      </w:r>
+      <w:r>
+        <w:t xml:space="preserve">. </w:t>
+      </w:r>
+      <w:r>
+        <w:rPr>
+          <w:rFonts w:ascii="Consolas" w:eastAsia="Consolas" w:hAnsi="Consolas" w:cs="Consolas"/>
+        </w:rPr>
+        <w:t xml:space="preserve">replace</w:t>
+      </w:r>
+      <w:r>
+        <w:t xml:space="preserve"> thay mục hiện tại trong lịch sử thay vì thêm một mục, nên Back quay về trang trước link, không bị kẹt giữa hai địa chỉ. Trong lúc chờ chuyển, trang không vẽ cuộc trò chuyện và không đánh dấu đã đọc; màn đúng làm việc đó một lần.</w:t>
+      </w:r>
+    </w:p>
+    <w:p>
+      <w:r>
+        <w:t xml:space="preserve">Kiểm Chrome cần chat, mà backend chưa có provider chat nào. Vì vậy sau khi đăng nhập, một </w:t>
+      </w:r>
+      <w:r>
+        <w:rPr>
+          <w:rFonts w:ascii="Consolas" w:eastAsia="Consolas" w:hAnsi="Consolas" w:cs="Consolas"/>
+        </w:rPr>
+        <w:t xml:space="preserve">window.fetch</w:t>
+      </w:r>
+      <w:r>
+        <w:t xml:space="preserve"> tạm trong trang trả dữ liệu cho </w:t>
+      </w:r>
+      <w:r>
+        <w:rPr>
+          <w:rFonts w:ascii="Consolas" w:eastAsia="Consolas" w:hAnsi="Consolas" w:cs="Consolas"/>
+        </w:rPr>
+        <w:t xml:space="preserve">/api/providers</w:t>
+      </w:r>
+      <w:r>
+        <w:t xml:space="preserve">, </w:t>
+      </w:r>
+      <w:r>
+        <w:rPr>
+          <w:rFonts w:ascii="Consolas" w:eastAsia="Consolas" w:hAnsi="Consolas" w:cs="Consolas"/>
+        </w:rPr>
+        <w:t xml:space="preserve">/api/accounts</w:t>
+      </w:r>
+      <w:r>
+        <w:t xml:space="preserve">, </w:t>
+      </w:r>
+      <w:r>
+        <w:rPr>
+          <w:rFonts w:ascii="Consolas" w:eastAsia="Consolas" w:hAnsi="Consolas" w:cs="Consolas"/>
+        </w:rPr>
+        <w:t xml:space="preserve">/api/conversations*</w:t>
+      </w:r>
+      <w:r>
+        <w:t xml:space="preserve">, giống </w:t>
+      </w:r>
+      <w:r>
+        <w:rPr>
+          <w:rFonts w:ascii="Consolas" w:eastAsia="Consolas" w:hAnsi="Consolas" w:cs="Consolas"/>
+        </w:rPr>
+        <w:t xml:space="preserve">Fetch.fulfillRequest</w:t>
+      </w:r>
+      <w:r>
+        <w:t xml:space="preserve"> qua CDP ở các lượt trước. Bản tạm được cài ngay trên trang đăng nhập: app chuyển trang phía client nên nó còn sống sau khi đăng nhập; tải lại trang là mất.</w:t>
+      </w:r>
+    </w:p>
+    <w:p>
+      <w:pPr>
         <w:pStyle w:val="Heading2"/>
       </w:pPr>
       <w:r>
@@ -33964,6 +34304,132 @@
       </w:r>
       <w:r>
         <w:t xml:space="preserve"> mới chạy được?</w:t>
+      </w:r>
+    </w:p>
+    <w:p>
+      <w:pPr>
+        <w:pStyle w:val="ListParagraph"/>
+        <w:numPr>
+          <w:ilvl w:val="0"/>
+          <w:numId w:val="100"/>
+        </w:numPr>
+      </w:pPr>
+      <w:r>
+        <w:t xml:space="preserve">Vì sao route </w:t>
+      </w:r>
+      <w:r>
+        <w:rPr>
+          <w:rFonts w:ascii="Consolas" w:eastAsia="Consolas" w:hAnsi="Consolas" w:cs="Consolas"/>
+        </w:rPr>
+        <w:t xml:space="preserve">/messages</w:t>
+      </w:r>
+      <w:r>
+        <w:t xml:space="preserve"> và </w:t>
+      </w:r>
+      <w:r>
+        <w:rPr>
+          <w:rFonts w:ascii="Consolas" w:eastAsia="Consolas" w:hAnsi="Consolas" w:cs="Consolas"/>
+        </w:rPr>
+        <w:t xml:space="preserve">/inbox</w:t>
+      </w:r>
+      <w:r>
+        <w:t xml:space="preserve"> cần </w:t>
+      </w:r>
+      <w:r>
+        <w:rPr>
+          <w:rFonts w:ascii="Consolas" w:eastAsia="Consolas" w:hAnsi="Consolas" w:cs="Consolas"/>
+        </w:rPr>
+        <w:t xml:space="preserve">key</w:t>
+      </w:r>
+      <w:r>
+        <w:t xml:space="preserve"> khác nhau dù cùng vẽ </w:t>
+      </w:r>
+      <w:r>
+        <w:rPr>
+          <w:rFonts w:ascii="Consolas" w:eastAsia="Consolas" w:hAnsi="Consolas" w:cs="Consolas"/>
+        </w:rPr>
+        <w:t xml:space="preserve">InboxPage</w:t>
+      </w:r>
+      <w:r>
+        <w:t xml:space="preserve">?</w:t>
+      </w:r>
+    </w:p>
+    <w:p>
+      <w:pPr>
+        <w:pStyle w:val="ListParagraph"/>
+        <w:numPr>
+          <w:ilvl w:val="0"/>
+          <w:numId w:val="100"/>
+        </w:numPr>
+      </w:pPr>
+      <w:r>
+        <w:t xml:space="preserve">Vì sao khóa cache vẫn bắt đầu bằng </w:t>
+      </w:r>
+      <w:r>
+        <w:rPr>
+          <w:rFonts w:ascii="Consolas" w:eastAsia="Consolas" w:hAnsi="Consolas" w:cs="Consolas"/>
+        </w:rPr>
+        <w:t xml:space="preserve">['inbox']</w:t>
+      </w:r>
+      <w:r>
+        <w:t xml:space="preserve"> sau khi có </w:t>
+      </w:r>
+      <w:r>
+        <w:rPr>
+          <w:rFonts w:ascii="Consolas" w:eastAsia="Consolas" w:hAnsi="Consolas" w:cs="Consolas"/>
+        </w:rPr>
+        <w:t xml:space="preserve">kind</w:t>
+      </w:r>
+      <w:r>
+        <w:t xml:space="preserve">? Bỏ tiền tố đó thì realtime hỏng ở đâu?</w:t>
+      </w:r>
+    </w:p>
+    <w:p>
+      <w:pPr>
+        <w:pStyle w:val="ListParagraph"/>
+        <w:numPr>
+          <w:ilvl w:val="0"/>
+          <w:numId w:val="100"/>
+        </w:numPr>
+      </w:pPr>
+      <w:r>
+        <w:t xml:space="preserve">Tự chuyển từ </w:t>
+      </w:r>
+      <w:r>
+        <w:rPr>
+          <w:rFonts w:ascii="Consolas" w:eastAsia="Consolas" w:hAnsi="Consolas" w:cs="Consolas"/>
+        </w:rPr>
+        <w:t xml:space="preserve">/inbox/:id</w:t>
+      </w:r>
+      <w:r>
+        <w:t xml:space="preserve"> sang </w:t>
+      </w:r>
+      <w:r>
+        <w:rPr>
+          <w:rFonts w:ascii="Consolas" w:eastAsia="Consolas" w:hAnsi="Consolas" w:cs="Consolas"/>
+        </w:rPr>
+        <w:t xml:space="preserve">/messages/:id</w:t>
+      </w:r>
+      <w:r>
+        <w:t xml:space="preserve"> dùng </w:t>
+      </w:r>
+      <w:r>
+        <w:rPr>
+          <w:rFonts w:ascii="Consolas" w:eastAsia="Consolas" w:hAnsi="Consolas" w:cs="Consolas"/>
+        </w:rPr>
+        <w:t xml:space="preserve">replace</w:t>
+      </w:r>
+      <w:r>
+        <w:t xml:space="preserve">. Nếu dùng </w:t>
+      </w:r>
+      <w:r>
+        <w:rPr>
+          <w:rFonts w:ascii="Consolas" w:eastAsia="Consolas" w:hAnsi="Consolas" w:cs="Consolas"/>
+        </w:rPr>
+        <w:t xml:space="preserve">push</w:t>
+      </w:r>
+      <w:r>
+        <w:t xml:space="preserve"> thì bấm Back sẽ ra sao?</w:t>
       </w:r>
     </w:p>
     <w:p/>

</xml_diff>

<commit_message>
feat(fe-113): empty state, wizard button and Tổng quan buttons by kind
Tin nhắn and Hộp thư are empty by their own kind: one connect line per
provider of the kind, or one "Kết nối tài khoản" when the catalog has
none. Step 5 of the connect wizard opens the screen of the account's
kind, and the Hộp thư hợp nhất card has "Tin nhắn" and "Hộp thư".
screen.test.ts covers a provider missing from the catalog (D-308), the
mutant that survived the mutation pass.

Co-Authored-By: Claude Opus 5.5 <noreply@anthropic.com>
</commit_message>
<xml_diff>
--- a/docs/knowledge/phase-1-frontend-foundation.docx
+++ b/docs/knowledge/phase-1-frontend-foundation.docx
@@ -30104,6 +30104,357 @@
     </w:p>
     <w:p>
       <w:pPr>
+        <w:pStyle w:val="Heading3"/>
+      </w:pPr>
+      <w:r>
+        <w:t xml:space="preserve">22.7 Trạng thái trống, nút cuối hộp thoại, Tổng quan (FE-113)</w:t>
+      </w:r>
+    </w:p>
+    <w:p>
+      <w:r>
+        <w:t xml:space="preserve">Ba lối vào hai màn đều đọc cùng một nguồn: </w:t>
+      </w:r>
+      <w:r>
+        <w:rPr>
+          <w:rFonts w:ascii="Consolas" w:eastAsia="Consolas" w:hAnsi="Consolas" w:cs="Consolas"/>
+        </w:rPr>
+        <w:t xml:space="preserve">SCREENS[kind]</w:t>
+      </w:r>
+      <w:r>
+        <w:t xml:space="preserve"> (đường dẫn, tên màn) và </w:t>
+      </w:r>
+      <w:r>
+        <w:rPr>
+          <w:rFonts w:ascii="Consolas" w:eastAsia="Consolas" w:hAnsi="Consolas" w:cs="Consolas"/>
+        </w:rPr>
+        <w:t xml:space="preserve">kindOfProvider</w:t>
+      </w:r>
+      <w:r>
+        <w:t xml:space="preserve"> (loại của provider, thiếu thì là email theo D-308).</w:t>
+      </w:r>
+    </w:p>
+    <w:p>
+      <w:pPr>
+        <w:shd w:val="clear" w:color="auto" w:fill="F2F3F5"/>
+        <w:ind w:left="0"/>
+      </w:pPr>
+      <w:r>
+        <w:rPr>
+          <w:rFonts w:ascii="Consolas" w:eastAsia="Consolas" w:hAnsi="Consolas" w:cs="Consolas"/>
+          <w:sz w:val="19"/>
+          <w:szCs w:val="19"/>
+        </w:rPr>
+        <w:t xml:space="preserve">trạng thái trống   InboxPage: frame CỦA MÀN không có tài khoản -&gt; NoSources(screen, provider cùng loại)</w:t>
+        <w:br/>
+        <w:t xml:space="preserve">bước 5 hộp thoại   kindOfProvider(providers, provider của tài khoản) -&gt; SCREENS[kind].path + OPEN_SCREEN[kind]</w:t>
+        <w:br/>
+        <w:t xml:space="preserve">thẻ Tổng quan      OPEN = [SCREENS.CHAT, SCREENS.EMAIL] -&gt; hai nút "Tin nhắn", "Hộp thư"</w:t>
+      </w:r>
+    </w:p>
+    <w:p>
+      <w:pPr>
+        <w:pStyle w:val="ListParagraph"/>
+        <w:numPr>
+          <w:ilvl w:val="0"/>
+          <w:numId w:val="1"/>
+        </w:numPr>
+      </w:pPr>
+      <w:r>
+        <w:rPr>
+          <w:b/>
+          <w:bCs/>
+        </w:rPr>
+        <w:t xml:space="preserve">Trống theo loại của màn.</w:t>
+      </w:r>
+      <w:r>
+        <w:t xml:space="preserve"> Trước FE-113, </w:t>
+      </w:r>
+      <w:r>
+        <w:rPr>
+          <w:rFonts w:ascii="Consolas" w:eastAsia="Consolas" w:hAnsi="Consolas" w:cs="Consolas"/>
+        </w:rPr>
+        <w:t xml:space="preserve">InboxPage</w:t>
+      </w:r>
+      <w:r>
+        <w:t xml:space="preserve"> kiểm </w:t>
+      </w:r>
+      <w:r>
+        <w:rPr>
+          <w:rFonts w:ascii="Consolas" w:eastAsia="Consolas" w:hAnsi="Consolas" w:cs="Consolas"/>
+        </w:rPr>
+        <w:t xml:space="preserve">whole.accounts.length === 0</w:t>
+      </w:r>
+      <w:r>
+        <w:t xml:space="preserve">, tức frame thô có cả tài khoản của loại kia. Chỉ nối Zalo thì Hộp thư không bao giờ "trống": nó hiện một danh sách rỗng, không có nút kết nối Gmail. Giờ điều kiện đọc </w:t>
+      </w:r>
+      <w:r>
+        <w:rPr>
+          <w:rFonts w:ascii="Consolas" w:eastAsia="Consolas" w:hAnsi="Consolas" w:cs="Consolas"/>
+        </w:rPr>
+        <w:t xml:space="preserve">inbox</w:t>
+      </w:r>
+      <w:r>
+        <w:t xml:space="preserve">, là frame đã lọc theo màn (</w:t>
+      </w:r>
+      <w:r>
+        <w:rPr>
+          <w:rFonts w:ascii="Consolas" w:eastAsia="Consolas" w:hAnsi="Consolas" w:cs="Consolas"/>
+        </w:rPr>
+        <w:t xml:space="preserve">screenFrame</w:t>
+      </w:r>
+      <w:r>
+        <w:t xml:space="preserve">). Chỉ đổi một biến, nhưng đổi từ dữ liệu thô sang dữ liệu đúng nghĩa của màn.</w:t>
+      </w:r>
+    </w:p>
+    <w:p>
+      <w:pPr>
+        <w:pStyle w:val="ListParagraph"/>
+        <w:numPr>
+          <w:ilvl w:val="0"/>
+          <w:numId w:val="1"/>
+        </w:numPr>
+      </w:pPr>
+      <w:r>
+        <w:rPr>
+          <w:b/>
+          <w:bCs/>
+        </w:rPr>
+        <w:t xml:space="preserve">Nội dung theo loại nằm trong một bảng.</w:t>
+      </w:r>
+      <w:r>
+        <w:t xml:space="preserve"> </w:t>
+      </w:r>
+      <w:r>
+        <w:rPr>
+          <w:rFonts w:ascii="Consolas" w:eastAsia="Consolas" w:hAnsi="Consolas" w:cs="Consolas"/>
+        </w:rPr>
+        <w:t xml:space="preserve">EMPTY: Record&lt;ProviderKind, { label, text, icon }&gt;</w:t>
+      </w:r>
+      <w:r>
+        <w:t xml:space="preserve"> giữ chữ và icon của từng màn, tiêu đề lấy từ </w:t>
+      </w:r>
+      <w:r>
+        <w:rPr>
+          <w:rFonts w:ascii="Consolas" w:eastAsia="Consolas" w:hAnsi="Consolas" w:cs="Consolas"/>
+        </w:rPr>
+        <w:t xml:space="preserve">screen.title</w:t>
+      </w:r>
+      <w:r>
+        <w:t xml:space="preserve"> ("Tin nhắn đang trống.", "Hộp thư đang trống."). Kiểu </w:t>
+      </w:r>
+      <w:r>
+        <w:rPr>
+          <w:rFonts w:ascii="Consolas" w:eastAsia="Consolas" w:hAnsi="Consolas" w:cs="Consolas"/>
+        </w:rPr>
+        <w:t xml:space="preserve">Record&lt;ProviderKind, ...&gt;</w:t>
+      </w:r>
+      <w:r>
+        <w:t xml:space="preserve"> bắt buộc đủ mọi loại: thêm loại thứ ba vào </w:t>
+      </w:r>
+      <w:r>
+        <w:rPr>
+          <w:rFonts w:ascii="Consolas" w:eastAsia="Consolas" w:hAnsi="Consolas" w:cs="Consolas"/>
+        </w:rPr>
+        <w:t xml:space="preserve">ProviderKind</w:t>
+      </w:r>
+      <w:r>
+        <w:t xml:space="preserve"> thì </w:t>
+      </w:r>
+      <w:r>
+        <w:rPr>
+          <w:rFonts w:ascii="Consolas" w:eastAsia="Consolas" w:hAnsi="Consolas" w:cs="Consolas"/>
+        </w:rPr>
+        <w:t xml:space="preserve">tsc</w:t>
+      </w:r>
+      <w:r>
+        <w:t xml:space="preserve"> báo thiếu ngay, còn một chuỗi </w:t>
+      </w:r>
+      <w:r>
+        <w:rPr>
+          <w:rFonts w:ascii="Consolas" w:eastAsia="Consolas" w:hAnsi="Consolas" w:cs="Consolas"/>
+        </w:rPr>
+        <w:t xml:space="preserve">if (kind === 'CHAT')</w:t>
+      </w:r>
+      <w:r>
+        <w:t xml:space="preserve"> sẽ lặng lẽ rơi vào nhánh </w:t>
+      </w:r>
+      <w:r>
+        <w:rPr>
+          <w:rFonts w:ascii="Consolas" w:eastAsia="Consolas" w:hAnsi="Consolas" w:cs="Consolas"/>
+        </w:rPr>
+        <w:t xml:space="preserve">else</w:t>
+      </w:r>
+      <w:r>
+        <w:t xml:space="preserve">. Danh mục chưa có provider nào của loại đó thì thay danh sách bằng một nút "Kết nối tài khoản".</w:t>
+      </w:r>
+    </w:p>
+    <w:p>
+      <w:pPr>
+        <w:pStyle w:val="ListParagraph"/>
+        <w:numPr>
+          <w:ilvl w:val="0"/>
+          <w:numId w:val="1"/>
+        </w:numPr>
+      </w:pPr>
+      <w:r>
+        <w:rPr>
+          <w:b/>
+          <w:bCs/>
+        </w:rPr>
+        <w:t xml:space="preserve">Nút và câu cùng một nguồn.</w:t>
+      </w:r>
+      <w:r>
+        <w:t xml:space="preserve"> Bước 5 ghép câu "Sino đã nhập xong tin nhắn của tài khoản này. Mở Tin nhắn để đọc." từ đúng chữ của nút (</w:t>
+      </w:r>
+      <w:r>
+        <w:rPr>
+          <w:rFonts w:ascii="Consolas" w:eastAsia="Consolas" w:hAnsi="Consolas" w:cs="Consolas"/>
+        </w:rPr>
+        <w:t xml:space="preserve">OPEN_SCREEN[kind]</w:t>
+      </w:r>
+      <w:r>
+        <w:t xml:space="preserve">), nên câu và nút không thể nói hai màn khác nhau.</w:t>
+      </w:r>
+    </w:p>
+    <w:p>
+      <w:pPr>
+        <w:pStyle w:val="ListParagraph"/>
+        <w:numPr>
+          <w:ilvl w:val="0"/>
+          <w:numId w:val="1"/>
+        </w:numPr>
+      </w:pPr>
+      <w:r>
+        <w:rPr>
+          <w:b/>
+          <w:bCs/>
+        </w:rPr>
+        <w:t xml:space="preserve">Test trên dữ liệu mẫu có giới hạn.</w:t>
+      </w:r>
+      <w:r>
+        <w:t xml:space="preserve"> Câu "đã nhập xong" chỉ hiện khi lần nhập đầu </w:t>
+      </w:r>
+      <w:r>
+        <w:rPr>
+          <w:rFonts w:ascii="Consolas" w:eastAsia="Consolas" w:hAnsi="Consolas" w:cs="Consolas"/>
+        </w:rPr>
+        <w:t xml:space="preserve">DONE</w:t>
+      </w:r>
+      <w:r>
+        <w:t xml:space="preserve">, mà lúc đó hộp thoại đọc lại danh sách tài khoản từ server. Trên dữ liệu mẫu (</w:t>
+      </w:r>
+      <w:r>
+        <w:rPr>
+          <w:rFonts w:ascii="Consolas" w:eastAsia="Consolas" w:hAnsi="Consolas" w:cs="Consolas"/>
+        </w:rPr>
+        <w:t xml:space="preserve">ConnectReturn.test.tsx</w:t>
+      </w:r>
+      <w:r>
+        <w:t xml:space="preserve">) request đó không có handler MSW nào và test hỏng vì "Requests without an MSW handler". Vì vậy phần nút ở lại test dữ liệu mẫu, còn câu </w:t>
+      </w:r>
+      <w:r>
+        <w:rPr>
+          <w:rFonts w:ascii="Consolas" w:eastAsia="Consolas" w:hAnsi="Consolas" w:cs="Consolas"/>
+        </w:rPr>
+        <w:t xml:space="preserve">DONE</w:t>
+      </w:r>
+      <w:r>
+        <w:t xml:space="preserve"> của tài khoản chat chạy trong </w:t>
+      </w:r>
+      <w:r>
+        <w:rPr>
+          <w:rFonts w:ascii="Consolas" w:eastAsia="Consolas" w:hAnsi="Consolas" w:cs="Consolas"/>
+        </w:rPr>
+        <w:t xml:space="preserve">InitialSyncOnApi.test.tsx</w:t>
+      </w:r>
+      <w:r>
+        <w:t xml:space="preserve">, nơi cả </w:t>
+      </w:r>
+      <w:r>
+        <w:rPr>
+          <w:rFonts w:ascii="Consolas" w:eastAsia="Consolas" w:hAnsi="Consolas" w:cs="Consolas"/>
+        </w:rPr>
+        <w:t xml:space="preserve">GET /api/accounts</w:t>
+      </w:r>
+      <w:r>
+        <w:t xml:space="preserve"> và </w:t>
+      </w:r>
+      <w:r>
+        <w:rPr>
+          <w:rFonts w:ascii="Consolas" w:eastAsia="Consolas" w:hAnsi="Consolas" w:cs="Consolas"/>
+        </w:rPr>
+        <w:t xml:space="preserve">GET /api/providers</w:t>
+      </w:r>
+      <w:r>
+        <w:t xml:space="preserve"> đều có handler.</w:t>
+      </w:r>
+    </w:p>
+    <w:p>
+      <w:pPr>
+        <w:pStyle w:val="ListParagraph"/>
+        <w:numPr>
+          <w:ilvl w:val="0"/>
+          <w:numId w:val="1"/>
+        </w:numPr>
+      </w:pPr>
+      <w:r>
+        <w:rPr>
+          <w:b/>
+          <w:bCs/>
+        </w:rPr>
+        <w:t xml:space="preserve">Lỗi gài tìm ra quy tắc chưa ai test.</w:t>
+      </w:r>
+      <w:r>
+        <w:t xml:space="preserve"> Cuối change, 17 lỗi được gài vào các hàm của f05c (chọn màn, lọc nguồn và tài khoản theo loại, số theo loại, chữ "tin"/"thư"...), mỗi lần chạy lại các test liên quan. 16 lỗi làm test đỏ. Lỗi sống sót: đổi </w:t>
+      </w:r>
+      <w:r>
+        <w:rPr>
+          <w:rFonts w:ascii="Consolas" w:eastAsia="Consolas" w:hAnsi="Consolas" w:cs="Consolas"/>
+        </w:rPr>
+        <w:t xml:space="preserve">kindOfProvider</w:t>
+      </w:r>
+      <w:r>
+        <w:t xml:space="preserve"> để provider thiếu trong danh mục thành </w:t>
+      </w:r>
+      <w:r>
+        <w:rPr>
+          <w:rFonts w:ascii="Consolas" w:eastAsia="Consolas" w:hAnsi="Consolas" w:cs="Consolas"/>
+        </w:rPr>
+        <w:t xml:space="preserve">CHAT</w:t>
+      </w:r>
+      <w:r>
+        <w:t xml:space="preserve"> thay vì </w:t>
+      </w:r>
+      <w:r>
+        <w:rPr>
+          <w:rFonts w:ascii="Consolas" w:eastAsia="Consolas" w:hAnsi="Consolas" w:cs="Consolas"/>
+        </w:rPr>
+        <w:t xml:space="preserve">EMAIL</w:t>
+      </w:r>
+      <w:r>
+        <w:t xml:space="preserve">. Mọi test đều dùng provider có trong danh mục, nên không test nào chạm tới quy tắc D-308. </w:t>
+      </w:r>
+      <w:r>
+        <w:rPr>
+          <w:rFonts w:ascii="Consolas" w:eastAsia="Consolas" w:hAnsi="Consolas" w:cs="Consolas"/>
+        </w:rPr>
+        <w:t xml:space="preserve">screen.test.ts</w:t>
+      </w:r>
+      <w:r>
+        <w:t xml:space="preserve"> thêm hai ca cho đúng quy tắc đó, và lỗi gài cũ giờ làm cả hai đỏ. Bài học: một nhánh "mặc định" (</w:t>
+      </w:r>
+      <w:r>
+        <w:rPr>
+          <w:rFonts w:ascii="Consolas" w:eastAsia="Consolas" w:hAnsi="Consolas" w:cs="Consolas"/>
+        </w:rPr>
+        <w:t xml:space="preserve">?? 'EMAIL'</w:t>
+      </w:r>
+      <w:r>
+        <w:t xml:space="preserve">) rất dễ bị bỏ sót, vì dữ liệu mẫu hiếm khi thiếu.</w:t>
+      </w:r>
+    </w:p>
+    <w:p>
+      <w:pPr>
         <w:pStyle w:val="Heading2"/>
       </w:pPr>
       <w:r>
@@ -34430,6 +34781,111 @@
       </w:r>
       <w:r>
         <w:t xml:space="preserve"> thì bấm Back sẽ ra sao?</w:t>
+      </w:r>
+    </w:p>
+    <w:p>
+      <w:pPr>
+        <w:pStyle w:val="ListParagraph"/>
+        <w:numPr>
+          <w:ilvl w:val="0"/>
+          <w:numId w:val="100"/>
+        </w:numPr>
+      </w:pPr>
+      <w:r>
+        <w:t xml:space="preserve">Trước FE-113 trang kiểm </w:t>
+      </w:r>
+      <w:r>
+        <w:rPr>
+          <w:rFonts w:ascii="Consolas" w:eastAsia="Consolas" w:hAnsi="Consolas" w:cs="Consolas"/>
+        </w:rPr>
+        <w:t xml:space="preserve">whole.accounts.length === 0</w:t>
+      </w:r>
+      <w:r>
+        <w:t xml:space="preserve">. Chủ chỉ nối Zalo thì Hộp thư hiện gì? Vì sao kiểm trên frame của màn mới đúng?</w:t>
+      </w:r>
+    </w:p>
+    <w:p>
+      <w:pPr>
+        <w:pStyle w:val="ListParagraph"/>
+        <w:numPr>
+          <w:ilvl w:val="0"/>
+          <w:numId w:val="100"/>
+        </w:numPr>
+      </w:pPr>
+      <w:r>
+        <w:t xml:space="preserve">Vì sao nội dung trạng thái trống nằm trong </w:t>
+      </w:r>
+      <w:r>
+        <w:rPr>
+          <w:rFonts w:ascii="Consolas" w:eastAsia="Consolas" w:hAnsi="Consolas" w:cs="Consolas"/>
+        </w:rPr>
+        <w:t xml:space="preserve">Record&lt;ProviderKind, ...&gt;</w:t>
+      </w:r>
+      <w:r>
+        <w:t xml:space="preserve"> thay vì </w:t>
+      </w:r>
+      <w:r>
+        <w:rPr>
+          <w:rFonts w:ascii="Consolas" w:eastAsia="Consolas" w:hAnsi="Consolas" w:cs="Consolas"/>
+        </w:rPr>
+        <w:t xml:space="preserve">if (kind === 'CHAT')</w:t>
+      </w:r>
+      <w:r>
+        <w:t xml:space="preserve">? Thêm loại thứ ba vào </w:t>
+      </w:r>
+      <w:r>
+        <w:rPr>
+          <w:rFonts w:ascii="Consolas" w:eastAsia="Consolas" w:hAnsi="Consolas" w:cs="Consolas"/>
+        </w:rPr>
+        <w:t xml:space="preserve">ProviderKind</w:t>
+      </w:r>
+      <w:r>
+        <w:t xml:space="preserve"> thì mỗi cách phản ứng ra sao?</w:t>
+      </w:r>
+    </w:p>
+    <w:p>
+      <w:pPr>
+        <w:pStyle w:val="ListParagraph"/>
+        <w:numPr>
+          <w:ilvl w:val="0"/>
+          <w:numId w:val="100"/>
+        </w:numPr>
+      </w:pPr>
+      <w:r>
+        <w:t xml:space="preserve">Câu "Mở Tin nhắn để đọc." và nút "Mở Tin nhắn" cùng lấy chữ từ </w:t>
+      </w:r>
+      <w:r>
+        <w:rPr>
+          <w:rFonts w:ascii="Consolas" w:eastAsia="Consolas" w:hAnsi="Consolas" w:cs="Consolas"/>
+        </w:rPr>
+        <w:t xml:space="preserve">OPEN_SCREEN</w:t>
+      </w:r>
+      <w:r>
+        <w:t xml:space="preserve">. Viết cứng hai chỗ thì rủi ro gì?</w:t>
+      </w:r>
+    </w:p>
+    <w:p>
+      <w:pPr>
+        <w:pStyle w:val="ListParagraph"/>
+        <w:numPr>
+          <w:ilvl w:val="0"/>
+          <w:numId w:val="100"/>
+        </w:numPr>
+      </w:pPr>
+      <w:r>
+        <w:t xml:space="preserve">Vì sao câu "đã nhập xong" của tài khoản chat được test trên API (MSW) chứ không trên dữ liệu mẫu?</w:t>
+      </w:r>
+    </w:p>
+    <w:p>
+      <w:pPr>
+        <w:pStyle w:val="ListParagraph"/>
+        <w:numPr>
+          <w:ilvl w:val="0"/>
+          <w:numId w:val="100"/>
+        </w:numPr>
+      </w:pPr>
+      <w:r>
+        <w:t xml:space="preserve">Lỗi gài "provider lạ thành CHAT" sống sót qua cả bộ test. Vì sao? Viết một test nhỏ nhất làm nó đỏ.</w:t>
       </w:r>
     </w:p>
     <w:p/>

</xml_diff>

<commit_message>
test(fe-114): Tin nhắn and Hộp thư on the backend before BE-110 and BE-111
The web runs on the backend of today: providers without kind, counts
without unreadByKind, a list that ignores kind. BeforeKindsOnApi locks
that, a Việc link to a chat is checked on sample data (tasks have no
source on the API yet), and the redirect waits get a longer limit for
full parallel runs. Run against a throwaway backend from dev with
sample Gmail mail in its database; the unreadByKind check moves to ACC.

Co-Authored-By: Claude Opus 5.5 <noreply@anthropic.com>
</commit_message>
<xml_diff>
--- a/docs/knowledge/phase-1-frontend-foundation.docx
+++ b/docs/knowledge/phase-1-frontend-foundation.docx
@@ -30455,6 +30455,234 @@
     </w:p>
     <w:p>
       <w:pPr>
+        <w:pStyle w:val="Heading3"/>
+      </w:pPr>
+      <w:r>
+        <w:t xml:space="preserve">22.8 Chạy với backend trước khi backend xong (FE-114)</w:t>
+      </w:r>
+    </w:p>
+    <w:p>
+      <w:r>
+        <w:t xml:space="preserve">Web làm xong trước BE-110 và BE-111. Người dùng chọn không chờ: phần backend đã có thì chạy thật, phần chưa có API thì dùng dữ liệu mẫu. Backend trên </w:t>
+      </w:r>
+      <w:r>
+        <w:rPr>
+          <w:rFonts w:ascii="Consolas" w:eastAsia="Consolas" w:hAnsi="Consolas" w:cs="Consolas"/>
+        </w:rPr>
+        <w:t xml:space="preserve">dev</w:t>
+      </w:r>
+      <w:r>
+        <w:t xml:space="preserve"> hôm nay khác hợp đồng của f05c ở ba chỗ, và web phải chạy đúng với cả ba:</w:t>
+      </w:r>
+    </w:p>
+    <w:p>
+      <w:pPr>
+        <w:shd w:val="clear" w:color="auto" w:fill="F2F3F5"/>
+        <w:ind w:left="0"/>
+      </w:pPr>
+      <w:r>
+        <w:rPr>
+          <w:rFonts w:ascii="Consolas" w:eastAsia="Consolas" w:hAnsi="Consolas" w:cs="Consolas"/>
+          <w:sz w:val="19"/>
+          <w:szCs w:val="19"/>
+        </w:rPr>
+        <w:t xml:space="preserve">web hỏi                                   backend hôm nay trả             web xử lý</w:t>
+        <w:br/>
+        <w:t xml:space="preserve">GET /api/providers                        không có kind                   thiếu -&gt; EMAIL (D-308)</w:t>
+        <w:br/>
+        <w:t xml:space="preserve">GET /api/conversations/counts?kind=email  không có unreadByKind           Hộp thư = unread, Tin nhắn = null (không hiện số)</w:t>
+        <w:br/>
+        <w:t xml:space="preserve">GET /api/conversations?kind=chat          bỏ qua kind, trả mọi thư        Tin nhắn không có tài khoản CHAT -&gt; trạng thái trống,</w:t>
+        <w:br/>
+        <w:t xml:space="preserve">                                                                          danh sách đó không được vẽ</w:t>
+      </w:r>
+    </w:p>
+    <w:p>
+      <w:pPr>
+        <w:pStyle w:val="ListParagraph"/>
+        <w:numPr>
+          <w:ilvl w:val="0"/>
+          <w:numId w:val="1"/>
+        </w:numPr>
+      </w:pPr>
+      <w:r>
+        <w:rPr>
+          <w:b/>
+          <w:bCs/>
+        </w:rPr>
+        <w:t xml:space="preserve">Test trên đúng hợp đồng hôm nay.</w:t>
+      </w:r>
+      <w:r>
+        <w:t xml:space="preserve"> </w:t>
+      </w:r>
+      <w:r>
+        <w:rPr>
+          <w:rFonts w:ascii="Consolas" w:eastAsia="Consolas" w:hAnsi="Consolas" w:cs="Consolas"/>
+        </w:rPr>
+        <w:t xml:space="preserve">BeforeKindsOnApi.test.tsx</w:t>
+      </w:r>
+      <w:r>
+        <w:t xml:space="preserve"> dựng MSW trả đúng ba câu trả lời trên. Ba test xanh ngay vì code đã có từ FE-110…FE-113: đây là test khóa hành vi, không phải test dẫn đường. Test xanh ngay chưa chứng minh được gì, nên mỗi test được gài một lỗi đúng quy tắc nó canh (provider thiếu </w:t>
+      </w:r>
+      <w:r>
+        <w:rPr>
+          <w:rFonts w:ascii="Consolas" w:eastAsia="Consolas" w:hAnsi="Consolas" w:cs="Consolas"/>
+        </w:rPr>
+        <w:t xml:space="preserve">kind</w:t>
+      </w:r>
+      <w:r>
+        <w:t xml:space="preserve"> thành CHAT, bỏ tự chuyển màn, không gửi </w:t>
+      </w:r>
+      <w:r>
+        <w:rPr>
+          <w:rFonts w:ascii="Consolas" w:eastAsia="Consolas" w:hAnsi="Consolas" w:cs="Consolas"/>
+        </w:rPr>
+        <w:t xml:space="preserve">kind</w:t>
+      </w:r>
+      <w:r>
+        <w:t xml:space="preserve">) và phải đỏ.</w:t>
+      </w:r>
+    </w:p>
+    <w:p>
+      <w:pPr>
+        <w:pStyle w:val="ListParagraph"/>
+        <w:numPr>
+          <w:ilvl w:val="0"/>
+          <w:numId w:val="1"/>
+        </w:numPr>
+      </w:pPr>
+      <w:r>
+        <w:rPr>
+          <w:b/>
+          <w:bCs/>
+        </w:rPr>
+        <w:t xml:space="preserve">Dữ liệu mẫu nạp vào database, không giả API.</w:t>
+      </w:r>
+      <w:r>
+        <w:t xml:space="preserve"> Backend tạm không có cấu hình Google thật, nên không có thư Gmail thật. Thay vì giả câu trả lời trong trình duyệt, 4 thư mẫu được </w:t>
+      </w:r>
+      <w:r>
+        <w:rPr>
+          <w:rFonts w:ascii="Consolas" w:eastAsia="Consolas" w:hAnsi="Consolas" w:cs="Consolas"/>
+        </w:rPr>
+        <w:t xml:space="preserve">INSERT</w:t>
+      </w:r>
+      <w:r>
+        <w:t xml:space="preserve"> thẳng vào database tạm (tài khoản Gmail với </w:t>
+      </w:r>
+      <w:r>
+        <w:rPr>
+          <w:rFonts w:ascii="Consolas" w:eastAsia="Consolas" w:hAnsi="Consolas" w:cs="Consolas"/>
+        </w:rPr>
+        <w:t xml:space="preserve">sync_enabled = false</w:t>
+      </w:r>
+      <w:r>
+        <w:t xml:space="preserve"> để lịch đồng bộ không chạm tới nó). Như vậy mọi câu trả lời đều do backend thật dựng: đúng tên trường, đúng cách đếm, và lộ ra việc </w:t>
+      </w:r>
+      <w:r>
+        <w:rPr>
+          <w:rFonts w:ascii="Consolas" w:eastAsia="Consolas" w:hAnsi="Consolas" w:cs="Consolas"/>
+        </w:rPr>
+        <w:t xml:space="preserve">?kind=chat</w:t>
+      </w:r>
+      <w:r>
+        <w:t xml:space="preserve"> bị bỏ qua. Đặt </w:t>
+      </w:r>
+      <w:r>
+        <w:rPr>
+          <w:rFonts w:ascii="Consolas" w:eastAsia="Consolas" w:hAnsi="Consolas" w:cs="Consolas"/>
+        </w:rPr>
+        <w:t xml:space="preserve">SINO_GOOGLE_CLIENT_ID</w:t>
+      </w:r>
+      <w:r>
+        <w:t xml:space="preserve">/</w:t>
+      </w:r>
+      <w:r>
+        <w:rPr>
+          <w:rFonts w:ascii="Consolas" w:eastAsia="Consolas" w:hAnsi="Consolas" w:cs="Consolas"/>
+        </w:rPr>
+        <w:t xml:space="preserve">SECRET</w:t>
+      </w:r>
+      <w:r>
+        <w:t xml:space="preserve"> giả cho Gmail có trong danh mục; không gọi Google vì không ai bấm kết nối.</w:t>
+      </w:r>
+    </w:p>
+    <w:p>
+      <w:pPr>
+        <w:pStyle w:val="ListParagraph"/>
+        <w:numPr>
+          <w:ilvl w:val="0"/>
+          <w:numId w:val="1"/>
+        </w:numPr>
+      </w:pPr>
+      <w:r>
+        <w:rPr>
+          <w:b/>
+          <w:bCs/>
+        </w:rPr>
+        <w:t xml:space="preserve">Chỗ không có API thì test trên dữ liệu mẫu.</w:t>
+      </w:r>
+      <w:r>
+        <w:t xml:space="preserve"> Việc trên API chưa có nguồn (D-150), nên link "Gia đình · Zalo" của một việc chỉ có trên dữ liệu mẫu: test bấm nó và thấy </w:t>
+      </w:r>
+      <w:r>
+        <w:rPr>
+          <w:rFonts w:ascii="Consolas" w:eastAsia="Consolas" w:hAnsi="Consolas" w:cs="Consolas"/>
+        </w:rPr>
+        <w:t xml:space="preserve">/inbox/conv-2</w:t>
+      </w:r>
+      <w:r>
+        <w:t xml:space="preserve"> tự chuyển tới </w:t>
+      </w:r>
+      <w:r>
+        <w:rPr>
+          <w:rFonts w:ascii="Consolas" w:eastAsia="Consolas" w:hAnsi="Consolas" w:cs="Consolas"/>
+        </w:rPr>
+        <w:t xml:space="preserve">/messages/conv-2</w:t>
+      </w:r>
+      <w:r>
+        <w:t xml:space="preserve">.</w:t>
+      </w:r>
+    </w:p>
+    <w:p>
+      <w:pPr>
+        <w:pStyle w:val="ListParagraph"/>
+        <w:numPr>
+          <w:ilvl w:val="0"/>
+          <w:numId w:val="1"/>
+        </w:numPr>
+      </w:pPr>
+      <w:r>
+        <w:rPr>
+          <w:b/>
+          <w:bCs/>
+        </w:rPr>
+        <w:t xml:space="preserve">Test chậm khi cả bộ chạy song song.</w:t>
+      </w:r>
+      <w:r>
+        <w:t xml:space="preserve"> Luồng tự chuyển màn dựng cả app hai lần: khoảng 1 giây khi chạy riêng, quá 3 giây (</w:t>
+      </w:r>
+      <w:r>
+        <w:rPr>
+          <w:rFonts w:ascii="Consolas" w:eastAsia="Consolas" w:hAnsi="Consolas" w:cs="Consolas"/>
+        </w:rPr>
+        <w:t xml:space="preserve">asyncUtilTimeout</w:t>
+      </w:r>
+      <w:r>
+        <w:t xml:space="preserve">) khi 80 file chạy cùng lúc. Chỉ các bước chờ tự chuyển màn được hạn dài hơn (</w:t>
+      </w:r>
+      <w:r>
+        <w:rPr>
+          <w:rFonts w:ascii="Consolas" w:eastAsia="Consolas" w:hAnsi="Consolas" w:cs="Consolas"/>
+        </w:rPr>
+        <w:t xml:space="preserve">MOVE = { timeout: 8000 }</w:t>
+      </w:r>
+      <w:r>
+        <w:t xml:space="preserve">), có ghi lý do; hạn chung giữ nguyên để các test khác vẫn báo nhanh khi hỏng.</w:t>
+      </w:r>
+    </w:p>
+    <w:p>
+      <w:pPr>
         <w:pStyle w:val="Heading2"/>
       </w:pPr>
       <w:r>
@@ -34886,6 +35114,81 @@
       </w:pPr>
       <w:r>
         <w:t xml:space="preserve">Lỗi gài "provider lạ thành CHAT" sống sót qua cả bộ test. Vì sao? Viết một test nhỏ nhất làm nó đỏ.</w:t>
+      </w:r>
+    </w:p>
+    <w:p>
+      <w:pPr>
+        <w:pStyle w:val="ListParagraph"/>
+        <w:numPr>
+          <w:ilvl w:val="0"/>
+          <w:numId w:val="100"/>
+        </w:numPr>
+      </w:pPr>
+      <w:r>
+        <w:t xml:space="preserve">Backend hôm nay bỏ qua </w:t>
+      </w:r>
+      <w:r>
+        <w:rPr>
+          <w:rFonts w:ascii="Consolas" w:eastAsia="Consolas" w:hAnsi="Consolas" w:cs="Consolas"/>
+        </w:rPr>
+        <w:t xml:space="preserve">?kind=chat</w:t>
+      </w:r>
+      <w:r>
+        <w:t xml:space="preserve"> và trả mọi thư. Vì sao Tin nhắn vẫn không hiện thư Gmail nào?</w:t>
+      </w:r>
+    </w:p>
+    <w:p>
+      <w:pPr>
+        <w:pStyle w:val="ListParagraph"/>
+        <w:numPr>
+          <w:ilvl w:val="0"/>
+          <w:numId w:val="100"/>
+        </w:numPr>
+      </w:pPr>
+      <w:r>
+        <w:t xml:space="preserve">Một test xanh ngay lần chạy đầu thì chưa chứng minh gì. Làm sao biết nó có bắt được lỗi?</w:t>
+      </w:r>
+    </w:p>
+    <w:p>
+      <w:pPr>
+        <w:pStyle w:val="ListParagraph"/>
+        <w:numPr>
+          <w:ilvl w:val="0"/>
+          <w:numId w:val="100"/>
+        </w:numPr>
+      </w:pPr>
+      <w:r>
+        <w:t xml:space="preserve">Vì sao nạp thư mẫu vào database tạm tốt hơn giả câu trả lời bằng </w:t>
+      </w:r>
+      <w:r>
+        <w:rPr>
+          <w:rFonts w:ascii="Consolas" w:eastAsia="Consolas" w:hAnsi="Consolas" w:cs="Consolas"/>
+        </w:rPr>
+        <w:t xml:space="preserve">fetch</w:t>
+      </w:r>
+      <w:r>
+        <w:t xml:space="preserve"> trong trình duyệt, khi muốn kiểm "chạy với backend"?</w:t>
+      </w:r>
+    </w:p>
+    <w:p>
+      <w:pPr>
+        <w:pStyle w:val="ListParagraph"/>
+        <w:numPr>
+          <w:ilvl w:val="0"/>
+          <w:numId w:val="100"/>
+        </w:numPr>
+      </w:pPr>
+      <w:r>
+        <w:t xml:space="preserve">Vì sao chỉ nới hạn chờ của luồng tự chuyển màn, không tăng </w:t>
+      </w:r>
+      <w:r>
+        <w:rPr>
+          <w:rFonts w:ascii="Consolas" w:eastAsia="Consolas" w:hAnsi="Consolas" w:cs="Consolas"/>
+        </w:rPr>
+        <w:t xml:space="preserve">asyncUtilTimeout</w:t>
+      </w:r>
+      <w:r>
+        <w:t xml:space="preserve"> cho mọi test?</w:t>
       </w:r>
     </w:p>
     <w:p/>

</xml_diff>

<commit_message>
feat(dg-04): diagram notes on a phone and a tablet; mutation check of diagram.ts
Below 768 px a diagram is a page of its own (D-212): the saved time and
Ghim in the header, a bar "Sơ đồ này" with its size and Xóa at the foot.
A long press on empty ground opens "THÊM Ô" (iOS has no context menu for
it); a tap, a slip or a second finger does not. On a touch screen the dots,
the colour dots and the bar buttons are larger and the hint speaks of a
long press (pointer: coarse, not the width). "+ Khối", zoom, Ghim and Xóa
wrap as one group, so a narrow column never leaves Ghim and Xóa alone.

Mutation check of diagram.ts: 31 mutants, 27 then 30 killed after tests for
the three real gaps; the survivor ("freeSpot" stepping 1 px) still keeps
blocks apart and below, as required.

lint 0, build 0, vitest 731/731 three runs, Chrome 1024 / 768 / 390.
Not verified: long press and pinch on a real touch device.

Co-Authored-By: Claude Opus 5.5 (1M context) <noreply@anthropic.com>
</commit_message>
<xml_diff>
--- a/docs/knowledge/phase-1-frontend-foundation.docx
+++ b/docs/knowledge/phase-1-frontend-foundation.docx
@@ -32166,6 +32166,128 @@
     </w:p>
     <w:p>
       <w:pPr>
+        <w:pStyle w:val="Heading3"/>
+      </w:pPr>
+      <w:r>
+        <w:t xml:space="preserve">23.16 Điện thoại và tablet (DG-04, D-212)</w:t>
+      </w:r>
+    </w:p>
+    <w:p>
+      <w:r>
+        <w:t xml:space="preserve">Bố cục như ghi chú chữ: từ 768 px vùng vẽ ở cột phải, dưới 768 px là trang riêng (đầu trang: quay lại "Ghi chú", "TỰ LƯU · giờ", Ghim; thanh đáy "Sơ đồ này": "N khối · M nối" và "Xóa"). Ba điểm riêng của sơ đồ:</w:t>
+      </w:r>
+    </w:p>
+    <w:p>
+      <w:pPr>
+        <w:shd w:val="clear" w:color="auto" w:fill="F2F3F5"/>
+        <w:ind w:left="0"/>
+      </w:pPr>
+      <w:r>
+        <w:rPr>
+          <w:rFonts w:ascii="Consolas" w:eastAsia="Consolas" w:hAnsi="Consolas" w:cs="Consolas"/>
+          <w:sz w:val="19"/>
+          <w:szCs w:val="19"/>
+        </w:rPr>
+        <w:t xml:space="preserve">nhấn giữ chỗ trống 500 ms     -&gt; menu "THÊM Ô" (iOS không có contextmenu khi nhấn giữ)</w:t>
+        <w:br/>
+        <w:t xml:space="preserve">  nhấc ngón sớm               -&gt; hủy (chạm thường)</w:t>
+        <w:br/>
+        <w:t xml:space="preserve">  trượt quá 8 px              -&gt; hủy (đang kéo nền)</w:t>
+        <w:br/>
+        <w:t xml:space="preserve">  ngón thứ hai chạm xuống     -&gt; hủy (đang chụm để thu phóng)</w:t>
+        <w:br/>
+        <w:t xml:space="preserve">màn cảm ứng (pointer: coarse) -&gt; chấm nối, chấm màu, nút thanh chọn to hơn; gợi ý nói "nhấn giữ"</w:t>
+        <w:br/>
+        <w:t xml:space="preserve">cột hẹp (768 px)              -&gt; "+ Khối", thu phóng, Ghim, Xóa xuống hàng cùng nhau, không bỏ Ghim lẻ một hàng</w:t>
+      </w:r>
+    </w:p>
+    <w:p>
+      <w:r>
+        <w:t xml:space="preserve">Gợi ý và cỡ chạm dựa vào loại con trỏ (</w:t>
+      </w:r>
+      <w:r>
+        <w:rPr>
+          <w:rFonts w:ascii="Consolas" w:eastAsia="Consolas" w:hAnsi="Consolas" w:cs="Consolas"/>
+        </w:rPr>
+        <w:t xml:space="preserve">pointer-coarse:</w:t>
+      </w:r>
+      <w:r>
+        <w:t xml:space="preserve"> của Tailwind, tức </w:t>
+      </w:r>
+      <w:r>
+        <w:rPr>
+          <w:rFonts w:ascii="Consolas" w:eastAsia="Consolas" w:hAnsi="Consolas" w:cs="Consolas"/>
+        </w:rPr>
+        <w:t xml:space="preserve">@media (pointer: coarse)</w:t>
+      </w:r>
+      <w:r>
+        <w:t xml:space="preserve">), không dựa vào bề rộng: tablet cảm ứng rộng hơn 768 px vẫn là ngón tay. Test "không mở khi chạm ngắn" lúc đầu dồn ba trường hợp vào một lần chờ; lỗi gài "bỏ </w:t>
+      </w:r>
+      <w:r>
+        <w:rPr>
+          <w:rFonts w:ascii="Consolas" w:eastAsia="Consolas" w:hAnsi="Consolas" w:cs="Consolas"/>
+        </w:rPr>
+        <w:t xml:space="preserve">onPointerUp</w:t>
+      </w:r>
+      <w:r>
+        <w:t xml:space="preserve">" vẫn sống, vì lần nhấn kế tiếp tình cờ hủy hẹn giờ thay cho nó. Tách mỗi trường hợp một lần chờ thì cả ba lỗi gài đều bị bắt.</w:t>
+      </w:r>
+    </w:p>
+    <w:p>
+      <w:pPr>
+        <w:pStyle w:val="Heading3"/>
+      </w:pPr>
+      <w:r>
+        <w:t xml:space="preserve">23.17 Kiểm bằng lỗi gài </w:t>
+      </w:r>
+      <w:r>
+        <w:rPr>
+          <w:rFonts w:ascii="Consolas" w:eastAsia="Consolas" w:hAnsi="Consolas" w:cs="Consolas"/>
+        </w:rPr>
+        <w:t xml:space="preserve">diagram.ts</w:t>
+      </w:r>
+    </w:p>
+    <w:p>
+      <w:r>
+        <w:t xml:space="preserve">31 lỗi gài (giới hạn, căn giữa, không tự nối, không trùng, xóa khối kéo theo đường, cạnh gần nhất, chữ trên đường, </w:t>
+      </w:r>
+      <w:r>
+        <w:rPr>
+          <w:rFonts w:ascii="Consolas" w:eastAsia="Consolas" w:hAnsi="Consolas" w:cs="Consolas"/>
+        </w:rPr>
+        <w:t xml:space="preserve">freeSpot</w:t>
+      </w:r>
+      <w:r>
+        <w:t xml:space="preserve">...). Lượt đầu 27 bị bắt, 4 sống, tức là 4 chỗ test chưa nói:</w:t>
+      </w:r>
+    </w:p>
+    <w:p>
+      <w:pPr>
+        <w:shd w:val="clear" w:color="auto" w:fill="F2F3F5"/>
+        <w:ind w:left="0"/>
+      </w:pPr>
+      <w:r>
+        <w:rPr>
+          <w:rFonts w:ascii="Consolas" w:eastAsia="Consolas" w:hAnsi="Consolas" w:cs="Consolas"/>
+          <w:sz w:val="19"/>
+          <w:szCs w:val="19"/>
+        </w:rPr>
+        <w:t xml:space="preserve">changeBlock đổi mọi khối          -&gt; thêm: đổi màu một khối, các khối khác giữ nguyên</w:t>
+        <w:br/>
+        <w:t xml:space="preserve">freeSpot bỏ kiểm trục x           -&gt; thêm: khối nằm bên cạnh (cùng độ cao) không làm dời chỗ</w:t>
+        <w:br/>
+        <w:t xml:space="preserve">freeSpot bỏ khoảng 16 px          -&gt; thêm: khối ở trên, gần hơn một khối + khoảng, vẫn làm dời</w:t>
+        <w:br/>
+        <w:t xml:space="preserve">freeSpot bước 1 px thay vì 64 px  -&gt; giữ: vẫn không đè và vẫn ở dưới (yêu cầu), chỉ khác khoảng cách</w:t>
+      </w:r>
+    </w:p>
+    <w:p>
+      <w:r>
+        <w:t xml:space="preserve">Lượt hai 30/31. Lỗi còn sống không phải test thiếu mà là một cách làm khác cũng đúng yêu cầu: nó còn tìm được chỗ trống gần hơn. Đổi thuật toán hay ghi thêm yêu cầu về khoảng cách là quyết định riêng, không làm lẳng lặng trong một task kiểm.</w:t>
+      </w:r>
+    </w:p>
+    <w:p>
+      <w:pPr>
         <w:pStyle w:val="Heading2"/>
       </w:pPr>
       <w:r>
@@ -36523,6 +36645,60 @@
       </w:r>
       <w:r>
         <w:t xml:space="preserve"> cho mọi test?</w:t>
+      </w:r>
+    </w:p>
+    <w:p>
+      <w:pPr>
+        <w:pStyle w:val="ListParagraph"/>
+        <w:numPr>
+          <w:ilvl w:val="0"/>
+          <w:numId w:val="100"/>
+        </w:numPr>
+      </w:pPr>
+      <w:r>
+        <w:t xml:space="preserve">Vì sao nhấn giữ trên vùng vẽ phải tự đo bằng hẹn giờ, dù Android Chrome có bắn </w:t>
+      </w:r>
+      <w:r>
+        <w:rPr>
+          <w:rFonts w:ascii="Consolas" w:eastAsia="Consolas" w:hAnsi="Consolas" w:cs="Consolas"/>
+        </w:rPr>
+        <w:t xml:space="preserve">contextmenu</w:t>
+      </w:r>
+      <w:r>
+        <w:t xml:space="preserve"> khi nhấn giữ? Ba trường hợp nào phải hủy hẹn giờ, và vì sao?</w:t>
+      </w:r>
+    </w:p>
+    <w:p>
+      <w:pPr>
+        <w:pStyle w:val="ListParagraph"/>
+        <w:numPr>
+          <w:ilvl w:val="0"/>
+          <w:numId w:val="100"/>
+        </w:numPr>
+      </w:pPr>
+      <w:r>
+        <w:t xml:space="preserve">Vì sao gợi ý "nhấn giữ" và cỡ chấm nối theo </w:t>
+      </w:r>
+      <w:r>
+        <w:rPr>
+          <w:rFonts w:ascii="Consolas" w:eastAsia="Consolas" w:hAnsi="Consolas" w:cs="Consolas"/>
+        </w:rPr>
+        <w:t xml:space="preserve">pointer: coarse</w:t>
+      </w:r>
+      <w:r>
+        <w:t xml:space="preserve"> chứ không theo bề rộng màn hình?</w:t>
+      </w:r>
+    </w:p>
+    <w:p>
+      <w:pPr>
+        <w:pStyle w:val="ListParagraph"/>
+        <w:numPr>
+          <w:ilvl w:val="0"/>
+          <w:numId w:val="100"/>
+        </w:numPr>
+      </w:pPr>
+      <w:r>
+        <w:t xml:space="preserve">Lỗi gài "freeSpot bước 1 px" sống sót. Đó là test thiếu hay một cách làm khác cũng đúng? Bạn quyết thế nào, và ai quyết nếu muốn đổi?</w:t>
       </w:r>
     </w:p>
     <w:p/>

</xml_diff>

<commit_message>
feat(wp-01): / of sino-web as a public gate with the frame of the public pages
/ is no longer the parent route of the app: HomeGate sends the owner to
/overview (replace), shows the session check while it asks, and shows the
Sino Messages page to anybody else, even when the server is down (D-310).
The RequireAuth tree becomes a pathless layout route, so every app path
matches as before.

The public pages load in their own chunk (D-313). The frame of sino-site
is copied (top bar, footer, the five React Bits motion components and their
tests); links go through the router to /login, /overview and /#sections,
and the footer keeps only pages sino-web has (D-311). The frame names the
tab, starts a new page at the top and scrolls to #parts, as a static site
would. gsap 3.15.0 pinned, as in sino-site.

lint 0, build 0, vitest 751/751, Chrome 1440 and 390.

Co-Authored-By: Claude Opus 5.5 (1M context) <noreply@anthropic.com>
</commit_message>
<xml_diff>
--- a/docs/knowledge/phase-1-frontend-foundation.docx
+++ b/docs/knowledge/phase-1-frontend-foundation.docx
@@ -32291,6 +32291,493 @@
         <w:pStyle w:val="Heading2"/>
       </w:pPr>
       <w:r>
+        <w:t xml:space="preserve">24. Trang công khai trong sino-web (</w:t>
+      </w:r>
+      <w:r>
+        <w:rPr>
+          <w:rFonts w:ascii="Consolas" w:eastAsia="Consolas" w:hAnsi="Consolas" w:cs="Consolas"/>
+        </w:rPr>
+        <w:t xml:space="preserve">web-public-pages</w:t>
+      </w:r>
+      <w:r>
+        <w:t xml:space="preserve">)</w:t>
+      </w:r>
+    </w:p>
+    <w:p>
+      <w:pPr>
+        <w:pStyle w:val="Heading3"/>
+      </w:pPr>
+      <w:r>
+        <w:t xml:space="preserve">24.0 Bức tranh</w:t>
+      </w:r>
+    </w:p>
+    <w:p>
+      <w:r>
+        <w:t xml:space="preserve">Trang giới thiệu Sino Messages và Chính sách quyền riêng tư vốn chỉ có ở </w:t>
+      </w:r>
+      <w:r>
+        <w:rPr>
+          <w:rFonts w:ascii="Consolas" w:eastAsia="Consolas" w:hAnsi="Consolas" w:cs="Consolas"/>
+        </w:rPr>
+        <w:t xml:space="preserve">apps/sino-site</w:t>
+      </w:r>
+      <w:r>
+        <w:t xml:space="preserve">, một site tĩnh riêng chưa có host. Người dùng muốn trước mắt chạy một app trên một domain: </w:t>
+      </w:r>
+      <w:r>
+        <w:rPr>
+          <w:rFonts w:ascii="Consolas" w:eastAsia="Consolas" w:hAnsi="Consolas" w:cs="Consolas"/>
+        </w:rPr>
+        <w:t xml:space="preserve">sino-web</w:t>
+      </w:r>
+      <w:r>
+        <w:t xml:space="preserve"> tự có trang chủ và trang privacy, đủ cho Google xác minh OAuth. Code được chép sang </w:t>
+      </w:r>
+      <w:r>
+        <w:rPr>
+          <w:rFonts w:ascii="Consolas" w:eastAsia="Consolas" w:hAnsi="Consolas" w:cs="Consolas"/>
+        </w:rPr>
+        <w:t xml:space="preserve">src/features/public/</w:t>
+      </w:r>
+      <w:r>
+        <w:t xml:space="preserve">; </w:t>
+      </w:r>
+      <w:r>
+        <w:rPr>
+          <w:rFonts w:ascii="Consolas" w:eastAsia="Consolas" w:hAnsi="Consolas" w:cs="Consolas"/>
+        </w:rPr>
+        <w:t xml:space="preserve">sino-site</w:t>
+      </w:r>
+      <w:r>
+        <w:t xml:space="preserve"> để nguyên, mỗi file chép ghi nguồn ở dòng đầu.</w:t>
+      </w:r>
+    </w:p>
+    <w:p>
+      <w:pPr>
+        <w:shd w:val="clear" w:color="auto" w:fill="F2F3F5"/>
+        <w:ind w:left="0"/>
+      </w:pPr>
+      <w:r>
+        <w:rPr>
+          <w:rFonts w:ascii="Consolas" w:eastAsia="Consolas" w:hAnsi="Consolas" w:cs="Consolas"/>
+          <w:sz w:val="19"/>
+          <w:szCs w:val="19"/>
+        </w:rPr>
+        <w:t xml:space="preserve">/              HomeGate: đang hỏi phiên -&gt; dấu chờ; đã đăng nhập -&gt; /overview (replace);</w:t>
+        <w:br/>
+        <w:t xml:space="preserve">               chưa đăng nhập hay máy chủ lỗi -&gt; trang giới thiệu (tải riêng)</w:t>
+        <w:br/>
+        <w:t xml:space="preserve">/privacy       Chính sách quyền riêng tư (WP-03)</w:t>
+        <w:br/>
+        <w:t xml:space="preserve">/en/privacy    Privacy policy (WP-03)</w:t>
+        <w:br/>
+        <w:t xml:space="preserve">mọi trang khác như cũ: RequireAuth -&gt; AppShell</w:t>
+      </w:r>
+    </w:p>
+    <w:p>
+      <w:pPr>
+        <w:pStyle w:val="Heading3"/>
+      </w:pPr>
+      <w:r>
+        <w:t xml:space="preserve">24.1 Một route công khai cạnh cây cần đăng nhập (WP-01)</w:t>
+      </w:r>
+    </w:p>
+    <w:p>
+      <w:r>
+        <w:t xml:space="preserve">Trước đây </w:t>
+      </w:r>
+      <w:r>
+        <w:rPr>
+          <w:rFonts w:ascii="Consolas" w:eastAsia="Consolas" w:hAnsi="Consolas" w:cs="Consolas"/>
+        </w:rPr>
+        <w:t xml:space="preserve">/</w:t>
+      </w:r>
+      <w:r>
+        <w:t xml:space="preserve"> là route cha của cả app, bọc </w:t>
+      </w:r>
+      <w:r>
+        <w:rPr>
+          <w:rFonts w:ascii="Consolas" w:eastAsia="Consolas" w:hAnsi="Consolas" w:cs="Consolas"/>
+        </w:rPr>
+        <w:t xml:space="preserve">RequireAuth</w:t>
+      </w:r>
+      <w:r>
+        <w:t xml:space="preserve">, và route </w:t>
+      </w:r>
+      <w:r>
+        <w:rPr>
+          <w:rFonts w:ascii="Consolas" w:eastAsia="Consolas" w:hAnsi="Consolas" w:cs="Consolas"/>
+        </w:rPr>
+        <w:t xml:space="preserve">index</w:t>
+      </w:r>
+      <w:r>
+        <w:t xml:space="preserve"> của nó chuyển tới </w:t>
+      </w:r>
+      <w:r>
+        <w:rPr>
+          <w:rFonts w:ascii="Consolas" w:eastAsia="Consolas" w:hAnsi="Consolas" w:cs="Consolas"/>
+        </w:rPr>
+        <w:t xml:space="preserve">/overview</w:t>
+      </w:r>
+      <w:r>
+        <w:t xml:space="preserve">. Muốn </w:t>
+      </w:r>
+      <w:r>
+        <w:rPr>
+          <w:rFonts w:ascii="Consolas" w:eastAsia="Consolas" w:hAnsi="Consolas" w:cs="Consolas"/>
+        </w:rPr>
+        <w:t xml:space="preserve">/</w:t>
+      </w:r>
+      <w:r>
+        <w:t xml:space="preserve"> hiện cho khách thì </w:t>
+      </w:r>
+      <w:r>
+        <w:rPr>
+          <w:rFonts w:ascii="Consolas" w:eastAsia="Consolas" w:hAnsi="Consolas" w:cs="Consolas"/>
+        </w:rPr>
+        <w:t xml:space="preserve">/</w:t>
+      </w:r>
+      <w:r>
+        <w:t xml:space="preserve"> không được nằm dưới </w:t>
+      </w:r>
+      <w:r>
+        <w:rPr>
+          <w:rFonts w:ascii="Consolas" w:eastAsia="Consolas" w:hAnsi="Consolas" w:cs="Consolas"/>
+        </w:rPr>
+        <w:t xml:space="preserve">RequireAuth</w:t>
+      </w:r>
+      <w:r>
+        <w:t xml:space="preserve"> nữa:</w:t>
+      </w:r>
+    </w:p>
+    <w:p>
+      <w:pPr>
+        <w:shd w:val="clear" w:color="auto" w:fill="F2F3F5"/>
+        <w:ind w:left="0"/>
+      </w:pPr>
+      <w:r>
+        <w:rPr>
+          <w:rFonts w:ascii="Consolas" w:eastAsia="Consolas" w:hAnsi="Consolas" w:cs="Consolas"/>
+          <w:sz w:val="19"/>
+          <w:szCs w:val="19"/>
+        </w:rPr>
+        <w:t xml:space="preserve">routes = [</w:t>
+        <w:br/>
+        <w:t xml:space="preserve">  { path: '/login', element: &lt;LoginPage /&gt; },</w:t>
+        <w:br/>
+        <w:t xml:space="preserve">  { path: '/', element: &lt;HomeGate /&gt; },                 // công khai</w:t>
+        <w:br/>
+        <w:t xml:space="preserve">  { element: &lt;RequireAuth /&gt;, children: [ AppShell ... ] }   // route bố cục không có path</w:t>
+        <w:br/>
+        <w:t xml:space="preserve">  { path: '*', element: &lt;NotFoundPage /&gt; },</w:t>
+        <w:br/>
+        <w:t xml:space="preserve">]</w:t>
+      </w:r>
+    </w:p>
+    <w:p>
+      <w:r>
+        <w:t xml:space="preserve">Route không có </w:t>
+      </w:r>
+      <w:r>
+        <w:rPr>
+          <w:rFonts w:ascii="Consolas" w:eastAsia="Consolas" w:hAnsi="Consolas" w:cs="Consolas"/>
+        </w:rPr>
+        <w:t xml:space="preserve">path</w:t>
+      </w:r>
+      <w:r>
+        <w:t xml:space="preserve"> (pathless layout route) chỉ bọc giao diện và chạy logic, không chiếm phần nào của đường dẫn. Nhờ vậy </w:t>
+      </w:r>
+      <w:r>
+        <w:rPr>
+          <w:rFonts w:ascii="Consolas" w:eastAsia="Consolas" w:hAnsi="Consolas" w:cs="Consolas"/>
+        </w:rPr>
+        <w:t xml:space="preserve">/overview</w:t>
+      </w:r>
+      <w:r>
+        <w:t xml:space="preserve">, </w:t>
+      </w:r>
+      <w:r>
+        <w:rPr>
+          <w:rFonts w:ascii="Consolas" w:eastAsia="Consolas" w:hAnsi="Consolas" w:cs="Consolas"/>
+        </w:rPr>
+        <w:t xml:space="preserve">/tasks</w:t>
+      </w:r>
+      <w:r>
+        <w:t xml:space="preserve">… vẫn khớp như cũ, còn </w:t>
+      </w:r>
+      <w:r>
+        <w:rPr>
+          <w:rFonts w:ascii="Consolas" w:eastAsia="Consolas" w:hAnsi="Consolas" w:cs="Consolas"/>
+        </w:rPr>
+        <w:t xml:space="preserve">/</w:t>
+      </w:r>
+      <w:r>
+        <w:t xml:space="preserve"> thuộc </w:t>
+      </w:r>
+      <w:r>
+        <w:rPr>
+          <w:rFonts w:ascii="Consolas" w:eastAsia="Consolas" w:hAnsi="Consolas" w:cs="Consolas"/>
+        </w:rPr>
+        <w:t xml:space="preserve">HomeGate</w:t>
+      </w:r>
+      <w:r>
+        <w:t xml:space="preserve">. Cổng dùng lại </w:t>
+      </w:r>
+      <w:r>
+        <w:rPr>
+          <w:rFonts w:ascii="Consolas" w:eastAsia="Consolas" w:hAnsi="Consolas" w:cs="Consolas"/>
+        </w:rPr>
+        <w:t xml:space="preserve">useMe()</w:t>
+      </w:r>
+      <w:r>
+        <w:t xml:space="preserve"> (cùng khóa cache với </w:t>
+      </w:r>
+      <w:r>
+        <w:rPr>
+          <w:rFonts w:ascii="Consolas" w:eastAsia="Consolas" w:hAnsi="Consolas" w:cs="Consolas"/>
+        </w:rPr>
+        <w:t xml:space="preserve">RequireAuth</w:t>
+      </w:r>
+      <w:r>
+        <w:t xml:space="preserve">), nên vào app từ trang giới thiệu không phải hỏi phiên lần nữa.</w:t>
+      </w:r>
+    </w:p>
+    <w:p>
+      <w:r>
+        <w:t xml:space="preserve">Vì sao lúc đang hỏi phiên lại hiện dấu chờ chứ không hiện trang giới thiệu: người đã đăng nhập mở domain sẽ thấy trang giới thiệu chớp qua rồi mới tới Tổng quan. Còn khi máy chủ lỗi (</w:t>
+      </w:r>
+      <w:r>
+        <w:rPr>
+          <w:rFonts w:ascii="Consolas" w:eastAsia="Consolas" w:hAnsi="Consolas" w:cs="Consolas"/>
+        </w:rPr>
+        <w:t xml:space="preserve">isError</w:t>
+      </w:r>
+      <w:r>
+        <w:t xml:space="preserve">), trang công khai vẫn hiện, vì nó không cần API; </w:t>
+      </w:r>
+      <w:r>
+        <w:rPr>
+          <w:rFonts w:ascii="Consolas" w:eastAsia="Consolas" w:hAnsi="Consolas" w:cs="Consolas"/>
+        </w:rPr>
+        <w:t xml:space="preserve">RequireAuth</w:t>
+      </w:r>
+      <w:r>
+        <w:t xml:space="preserve"> thì hiện "Không mở được Sino", vì trang app cần API.</w:t>
+      </w:r>
+    </w:p>
+    <w:p>
+      <w:pPr>
+        <w:pStyle w:val="Heading3"/>
+      </w:pPr>
+      <w:r>
+        <w:t xml:space="preserve">24.2 Thứ một site tĩnh có sẵn mà ứng dụng một trang phải tự làm</w:t>
+      </w:r>
+    </w:p>
+    <w:p>
+      <w:r>
+        <w:rPr>
+          <w:rFonts w:ascii="Consolas" w:eastAsia="Consolas" w:hAnsi="Consolas" w:cs="Consolas"/>
+        </w:rPr>
+        <w:t xml:space="preserve">PublicFrame</w:t>
+      </w:r>
+      <w:r>
+        <w:t xml:space="preserve"> làm ba việc trình duyệt tự làm với site tĩnh:</w:t>
+      </w:r>
+    </w:p>
+    <w:p>
+      <w:pPr>
+        <w:shd w:val="clear" w:color="auto" w:fill="F2F3F5"/>
+        <w:ind w:left="0"/>
+      </w:pPr>
+      <w:r>
+        <w:rPr>
+          <w:rFonts w:ascii="Consolas" w:eastAsia="Consolas" w:hAnsi="Consolas" w:cs="Consolas"/>
+          <w:sz w:val="19"/>
+          <w:szCs w:val="19"/>
+        </w:rPr>
+        <w:t xml:space="preserve">tiêu đề tab    useEffect: đặt document.title, trả tiêu đề cũ khi rời trang</w:t>
+        <w:br/>
+        <w:t xml:space="preserve">lên đầu trang  sang trang khác thì cuộn về 0 (React Router giữ nguyên chỗ cuộn)</w:t>
+        <w:br/>
+        <w:t xml:space="preserve">#phần          địa chỉ có #cau-hoi thì cuộn tới phần tử id="cau-hoi" (React Router không cuộn theo hash)</w:t>
+      </w:r>
+    </w:p>
+    <w:p>
+      <w:r>
+        <w:t xml:space="preserve">Cuộn mượt khi bấm mục (</w:t>
+      </w:r>
+      <w:r>
+        <w:rPr>
+          <w:rFonts w:ascii="Consolas" w:eastAsia="Consolas" w:hAnsi="Consolas" w:cs="Consolas"/>
+        </w:rPr>
+        <w:t xml:space="preserve">scroll-behavior: smooth</w:t>
+      </w:r>
+      <w:r>
+        <w:t xml:space="preserve">) chỉ áp lên trang công khai: </w:t>
+      </w:r>
+      <w:r>
+        <w:rPr>
+          <w:rFonts w:ascii="Consolas" w:eastAsia="Consolas" w:hAnsi="Consolas" w:cs="Consolas"/>
+        </w:rPr>
+        <w:t xml:space="preserve">public.css</w:t>
+      </w:r>
+      <w:r>
+        <w:t xml:space="preserve"> dùng </w:t>
+      </w:r>
+      <w:r>
+        <w:rPr>
+          <w:rFonts w:ascii="Consolas" w:eastAsia="Consolas" w:hAnsi="Consolas" w:cs="Consolas"/>
+        </w:rPr>
+        <w:t xml:space="preserve">html:has([data-public-page])</w:t>
+      </w:r>
+      <w:r>
+        <w:t xml:space="preserve">. Đặt chung cho </w:t>
+      </w:r>
+      <w:r>
+        <w:rPr>
+          <w:rFonts w:ascii="Consolas" w:eastAsia="Consolas" w:hAnsi="Consolas" w:cs="Consolas"/>
+        </w:rPr>
+        <w:t xml:space="preserve">html</w:t>
+      </w:r>
+      <w:r>
+        <w:t xml:space="preserve"> thì mọi lần cuộn bằng code trong app cũng thành mượt. Lên đầu trang dùng </w:t>
+      </w:r>
+      <w:r>
+        <w:rPr>
+          <w:rFonts w:ascii="Consolas" w:eastAsia="Consolas" w:hAnsi="Consolas" w:cs="Consolas"/>
+        </w:rPr>
+        <w:t xml:space="preserve">behavior: 'instant'</w:t>
+      </w:r>
+      <w:r>
+        <w:t xml:space="preserve"> để không trượt cả trang mỗi lần đổi trang.</w:t>
+      </w:r>
+    </w:p>
+    <w:p>
+      <w:pPr>
+        <w:pStyle w:val="Heading3"/>
+      </w:pPr>
+      <w:r>
+        <w:t xml:space="preserve">24.3 Chép mà không nhân đôi</w:t>
+      </w:r>
+    </w:p>
+    <w:p>
+      <w:r>
+        <w:t xml:space="preserve">Chỉ chép phần riêng của trang công khai: khung, thanh đầu, chân trang, chữ của trang, 5 component chuyển động React Bits và test của chúng. Những gì </w:t>
+      </w:r>
+      <w:r>
+        <w:rPr>
+          <w:rFonts w:ascii="Consolas" w:eastAsia="Consolas" w:hAnsi="Consolas" w:cs="Consolas"/>
+        </w:rPr>
+        <w:t xml:space="preserve">sino-site</w:t>
+      </w:r>
+      <w:r>
+        <w:t xml:space="preserve"> vốn chép từ </w:t>
+      </w:r>
+      <w:r>
+        <w:rPr>
+          <w:rFonts w:ascii="Consolas" w:eastAsia="Consolas" w:hAnsi="Consolas" w:cs="Consolas"/>
+        </w:rPr>
+        <w:t xml:space="preserve">sino-web</w:t>
+      </w:r>
+      <w:r>
+        <w:t xml:space="preserve"> (</w:t>
+      </w:r>
+      <w:r>
+        <w:rPr>
+          <w:rFonts w:ascii="Consolas" w:eastAsia="Consolas" w:hAnsi="Consolas" w:cs="Consolas"/>
+        </w:rPr>
+        <w:t xml:space="preserve">Button</w:t>
+      </w:r>
+      <w:r>
+        <w:t xml:space="preserve">, </w:t>
+      </w:r>
+      <w:r>
+        <w:rPr>
+          <w:rFonts w:ascii="Consolas" w:eastAsia="Consolas" w:hAnsi="Consolas" w:cs="Consolas"/>
+        </w:rPr>
+        <w:t xml:space="preserve">Badge</w:t>
+      </w:r>
+      <w:r>
+        <w:t xml:space="preserve">, </w:t>
+      </w:r>
+      <w:r>
+        <w:rPr>
+          <w:rFonts w:ascii="Consolas" w:eastAsia="Consolas" w:hAnsi="Consolas" w:cs="Consolas"/>
+        </w:rPr>
+        <w:t xml:space="preserve">ProviderIcon</w:t>
+      </w:r>
+      <w:r>
+        <w:t xml:space="preserve">, </w:t>
+      </w:r>
+      <w:r>
+        <w:rPr>
+          <w:rFonts w:ascii="Consolas" w:eastAsia="Consolas" w:hAnsi="Consolas" w:cs="Consolas"/>
+        </w:rPr>
+        <w:t xml:space="preserve">SinoMark</w:t>
+      </w:r>
+      <w:r>
+        <w:t xml:space="preserve">, </w:t>
+      </w:r>
+      <w:r>
+        <w:rPr>
+          <w:rFonts w:ascii="Consolas" w:eastAsia="Consolas" w:hAnsi="Consolas" w:cs="Consolas"/>
+        </w:rPr>
+        <w:t xml:space="preserve">cn</w:t>
+      </w:r>
+      <w:r>
+        <w:t xml:space="preserve">, token màu) thì dùng thẳng bản của </w:t>
+      </w:r>
+      <w:r>
+        <w:rPr>
+          <w:rFonts w:ascii="Consolas" w:eastAsia="Consolas" w:hAnsi="Consolas" w:cs="Consolas"/>
+        </w:rPr>
+        <w:t xml:space="preserve">sino-web</w:t>
+      </w:r>
+      <w:r>
+        <w:t xml:space="preserve">. Link vào app đổi từ </w:t>
+      </w:r>
+      <w:r>
+        <w:rPr>
+          <w:rFonts w:ascii="Consolas" w:eastAsia="Consolas" w:hAnsi="Consolas" w:cs="Consolas"/>
+        </w:rPr>
+        <w:t xml:space="preserve">appUrl</w:t>
+      </w:r>
+      <w:r>
+        <w:t xml:space="preserve"> + đường dẫn sang </w:t>
+      </w:r>
+      <w:r>
+        <w:rPr>
+          <w:rFonts w:ascii="Consolas" w:eastAsia="Consolas" w:hAnsi="Consolas" w:cs="Consolas"/>
+        </w:rPr>
+        <w:t xml:space="preserve">&lt;Link to="/login"&gt;</w:t>
+      </w:r>
+      <w:r>
+        <w:t xml:space="preserve">, đi qua router nên không tải lại trang. </w:t>
+      </w:r>
+      <w:r>
+        <w:rPr>
+          <w:rFonts w:ascii="Consolas" w:eastAsia="Consolas" w:hAnsi="Consolas" w:cs="Consolas"/>
+        </w:rPr>
+        <w:t xml:space="preserve">gsap</w:t>
+      </w:r>
+      <w:r>
+        <w:t xml:space="preserve"> (thư viện chuyển động) ghim đúng bản </w:t>
+      </w:r>
+      <w:r>
+        <w:rPr>
+          <w:rFonts w:ascii="Consolas" w:eastAsia="Consolas" w:hAnsi="Consolas" w:cs="Consolas"/>
+        </w:rPr>
+        <w:t xml:space="preserve">sino-site</w:t>
+      </w:r>
+      <w:r>
+        <w:t xml:space="preserve"> dùng, và chỉ nằm trong chunk công khai (kiểm ở bản build).</w:t>
+      </w:r>
+    </w:p>
+    <w:p>
+      <w:pPr>
+        <w:pStyle w:val="Heading2"/>
+      </w:pPr>
+      <w:r>
         <w:t xml:space="preserve">Tự kiểm tra</w:t>
       </w:r>
     </w:p>
@@ -36699,6 +37186,114 @@
       </w:pPr>
       <w:r>
         <w:t xml:space="preserve">Lỗi gài "freeSpot bước 1 px" sống sót. Đó là test thiếu hay một cách làm khác cũng đúng? Bạn quyết thế nào, và ai quyết nếu muốn đổi?</w:t>
+      </w:r>
+    </w:p>
+    <w:p>
+      <w:pPr>
+        <w:pStyle w:val="ListParagraph"/>
+        <w:numPr>
+          <w:ilvl w:val="0"/>
+          <w:numId w:val="100"/>
+        </w:numPr>
+      </w:pPr>
+      <w:r>
+        <w:t xml:space="preserve">Vì sao </w:t>
+      </w:r>
+      <w:r>
+        <w:rPr>
+          <w:rFonts w:ascii="Consolas" w:eastAsia="Consolas" w:hAnsi="Consolas" w:cs="Consolas"/>
+        </w:rPr>
+        <w:t xml:space="preserve">/</w:t>
+      </w:r>
+      <w:r>
+        <w:t xml:space="preserve"> phải ra khỏi route </w:t>
+      </w:r>
+      <w:r>
+        <w:rPr>
+          <w:rFonts w:ascii="Consolas" w:eastAsia="Consolas" w:hAnsi="Consolas" w:cs="Consolas"/>
+        </w:rPr>
+        <w:t xml:space="preserve">RequireAuth</w:t>
+      </w:r>
+      <w:r>
+        <w:t xml:space="preserve">? Route bố cục không có </w:t>
+      </w:r>
+      <w:r>
+        <w:rPr>
+          <w:rFonts w:ascii="Consolas" w:eastAsia="Consolas" w:hAnsi="Consolas" w:cs="Consolas"/>
+        </w:rPr>
+        <w:t xml:space="preserve">path</w:t>
+      </w:r>
+      <w:r>
+        <w:t xml:space="preserve"> giúp gì để </w:t>
+      </w:r>
+      <w:r>
+        <w:rPr>
+          <w:rFonts w:ascii="Consolas" w:eastAsia="Consolas" w:hAnsi="Consolas" w:cs="Consolas"/>
+        </w:rPr>
+        <w:t xml:space="preserve">/overview</w:t>
+      </w:r>
+      <w:r>
+        <w:t xml:space="preserve">, </w:t>
+      </w:r>
+      <w:r>
+        <w:rPr>
+          <w:rFonts w:ascii="Consolas" w:eastAsia="Consolas" w:hAnsi="Consolas" w:cs="Consolas"/>
+        </w:rPr>
+        <w:t xml:space="preserve">/tasks</w:t>
+      </w:r>
+      <w:r>
+        <w:t xml:space="preserve"> vẫn khớp như cũ?</w:t>
+      </w:r>
+    </w:p>
+    <w:p>
+      <w:pPr>
+        <w:pStyle w:val="ListParagraph"/>
+        <w:numPr>
+          <w:ilvl w:val="0"/>
+          <w:numId w:val="100"/>
+        </w:numPr>
+      </w:pPr>
+      <w:r>
+        <w:t xml:space="preserve">Lúc đang hỏi phiên, </w:t>
+      </w:r>
+      <w:r>
+        <w:rPr>
+          <w:rFonts w:ascii="Consolas" w:eastAsia="Consolas" w:hAnsi="Consolas" w:cs="Consolas"/>
+        </w:rPr>
+        <w:t xml:space="preserve">HomeGate</w:t>
+      </w:r>
+      <w:r>
+        <w:t xml:space="preserve"> hiện dấu chờ thay vì trang giới thiệu; lúc máy chủ lỗi thì hiện trang giới thiệu. Giải thích từng lựa chọn, và vì sao </w:t>
+      </w:r>
+      <w:r>
+        <w:rPr>
+          <w:rFonts w:ascii="Consolas" w:eastAsia="Consolas" w:hAnsi="Consolas" w:cs="Consolas"/>
+        </w:rPr>
+        <w:t xml:space="preserve">RequireAuth</w:t>
+      </w:r>
+      <w:r>
+        <w:t xml:space="preserve"> làm khác ở trường hợp lỗi.</w:t>
+      </w:r>
+    </w:p>
+    <w:p>
+      <w:pPr>
+        <w:pStyle w:val="ListParagraph"/>
+        <w:numPr>
+          <w:ilvl w:val="0"/>
+          <w:numId w:val="100"/>
+        </w:numPr>
+      </w:pPr>
+      <w:r>
+        <w:t xml:space="preserve">Kể ba việc site tĩnh có sẵn mà ứng dụng một trang phải tự làm, và chỗ trong </w:t>
+      </w:r>
+      <w:r>
+        <w:rPr>
+          <w:rFonts w:ascii="Consolas" w:eastAsia="Consolas" w:hAnsi="Consolas" w:cs="Consolas"/>
+        </w:rPr>
+        <w:t xml:space="preserve">PublicFrame</w:t>
+      </w:r>
+      <w:r>
+        <w:t xml:space="preserve"> làm từng việc.</w:t>
       </w:r>
     </w:p>
     <w:p/>

</xml_diff>

<commit_message>
feat(wp-02): the Sino Messages page at / of sino-web
The eleven blocks of the sino-site page are copied word for word and class
for class into features/public/landing. Only the links change (D-311): the
buttons into the app are router links to /overview, /login and /tasks, the
section links go to /#..., and the privacy link to /privacy#google. gsap
is now in the public chunk, and only there.

lint 0, build 0, vitest 754/754, Chrome 1440 and 390.

Co-Authored-By: Claude Opus 5.5 (1M context) <noreply@anthropic.com>
</commit_message>
<xml_diff>
--- a/docs/knowledge/phase-1-frontend-foundation.docx
+++ b/docs/knowledge/phase-1-frontend-foundation.docx
@@ -32775,6 +32775,94 @@
     </w:p>
     <w:p>
       <w:pPr>
+        <w:pStyle w:val="Heading3"/>
+      </w:pPr>
+      <w:r>
+        <w:t xml:space="preserve">24.4 Trang giới thiệu: chép chữ, đổi link (WP-02)</w:t>
+      </w:r>
+    </w:p>
+    <w:p>
+      <w:r>
+        <w:t xml:space="preserve">Mười một khối của trang Sino Messages được chép nguyên chữ và nguyên class. Chỗ duy nhất phải nghĩ là link: ở </w:t>
+      </w:r>
+      <w:r>
+        <w:rPr>
+          <w:rFonts w:ascii="Consolas" w:eastAsia="Consolas" w:hAnsi="Consolas" w:cs="Consolas"/>
+        </w:rPr>
+        <w:t xml:space="preserve">sino-site</w:t>
+      </w:r>
+      <w:r>
+        <w:t xml:space="preserve">, mọi nút vào app là </w:t>
+      </w:r>
+      <w:r>
+        <w:rPr>
+          <w:rFonts w:ascii="Consolas" w:eastAsia="Consolas" w:hAnsi="Consolas" w:cs="Consolas"/>
+        </w:rPr>
+        <w:t xml:space="preserve">&lt;a href={appUrl + '/login'}&gt;</w:t>
+      </w:r>
+      <w:r>
+        <w:t xml:space="preserve"> vì app ở một domain khác. Trong </w:t>
+      </w:r>
+      <w:r>
+        <w:rPr>
+          <w:rFonts w:ascii="Consolas" w:eastAsia="Consolas" w:hAnsi="Consolas" w:cs="Consolas"/>
+        </w:rPr>
+        <w:t xml:space="preserve">sino-web</w:t>
+      </w:r>
+      <w:r>
+        <w:t xml:space="preserve"> chúng thành </w:t>
+      </w:r>
+      <w:r>
+        <w:rPr>
+          <w:rFonts w:ascii="Consolas" w:eastAsia="Consolas" w:hAnsi="Consolas" w:cs="Consolas"/>
+        </w:rPr>
+        <w:t xml:space="preserve">&lt;Button asChild&gt;&lt;Link to="/login"&gt;</w:t>
+      </w:r>
+      <w:r>
+        <w:t xml:space="preserve">:</w:t>
+      </w:r>
+    </w:p>
+    <w:p>
+      <w:pPr>
+        <w:shd w:val="clear" w:color="auto" w:fill="F2F3F5"/>
+        <w:ind w:left="0"/>
+      </w:pPr>
+      <w:r>
+        <w:rPr>
+          <w:rFonts w:ascii="Consolas" w:eastAsia="Consolas" w:hAnsi="Consolas" w:cs="Consolas"/>
+          <w:sz w:val="19"/>
+          <w:szCs w:val="19"/>
+        </w:rPr>
+        <w:t xml:space="preserve">asChild    Button không vẽ &lt;button&gt; của nó mà gắn class lên phần tử con (Radix Slot)</w:t>
+        <w:br/>
+        <w:t xml:space="preserve">Link       thẻ &lt;a href="/login"&gt; thật (mở tab mới, đọc màn hình đều đúng), nhưng bấm thì router đổi trang, không tải lại</w:t>
+      </w:r>
+    </w:p>
+    <w:p>
+      <w:r>
+        <w:t xml:space="preserve">Kết quả: nút trông như nút, là một link đúng nghĩa, và vào app không tải lại bundle. Test tìm thanh đầu qua link "Mở Sino Messages" đỏ khi trang có thêm hai nút cùng tên: Testing Library báo </w:t>
+      </w:r>
+      <w:r>
+        <w:rPr>
+          <w:rFonts w:ascii="Consolas" w:eastAsia="Consolas" w:hAnsi="Consolas" w:cs="Consolas"/>
+        </w:rPr>
+        <w:t xml:space="preserve">Found multiple elements</w:t>
+      </w:r>
+      <w:r>
+        <w:t xml:space="preserve">. Tìm theo vai trò </w:t>
+      </w:r>
+      <w:r>
+        <w:rPr>
+          <w:rFonts w:ascii="Consolas" w:eastAsia="Consolas" w:hAnsi="Consolas" w:cs="Consolas"/>
+        </w:rPr>
+        <w:t xml:space="preserve">banner</w:t>
+      </w:r>
+      <w:r>
+        <w:t xml:space="preserve"> (chỉ có một thanh đầu) bền hơn tìm theo một chữ có thể lặp lại.</w:t>
+      </w:r>
+    </w:p>
+    <w:p>
+      <w:pPr>
         <w:pStyle w:val="Heading2"/>
       </w:pPr>
       <w:r>
@@ -37294,6 +37382,36 @@
       </w:r>
       <w:r>
         <w:t xml:space="preserve"> làm từng việc.</w:t>
+      </w:r>
+    </w:p>
+    <w:p>
+      <w:pPr>
+        <w:pStyle w:val="ListParagraph"/>
+        <w:numPr>
+          <w:ilvl w:val="0"/>
+          <w:numId w:val="100"/>
+        </w:numPr>
+      </w:pPr>
+      <w:r>
+        <w:t xml:space="preserve">Vì sao nút "Đăng nhập" của trang giới thiệu là </w:t>
+      </w:r>
+      <w:r>
+        <w:rPr>
+          <w:rFonts w:ascii="Consolas" w:eastAsia="Consolas" w:hAnsi="Consolas" w:cs="Consolas"/>
+        </w:rPr>
+        <w:t xml:space="preserve">&lt;Button asChild&gt;&lt;Link to="/login"&gt;</w:t>
+      </w:r>
+      <w:r>
+        <w:t xml:space="preserve"> mà không phải </w:t>
+      </w:r>
+      <w:r>
+        <w:rPr>
+          <w:rFonts w:ascii="Consolas" w:eastAsia="Consolas" w:hAnsi="Consolas" w:cs="Consolas"/>
+        </w:rPr>
+        <w:t xml:space="preserve">&lt;Button onClick={() =&gt; navigate("/login")}&gt;</w:t>
+      </w:r>
+      <w:r>
+        <w:t xml:space="preserve">? Kể hai điều người dùng mất với cách thứ hai.</w:t>
       </w:r>
     </w:p>
     <w:p/>

</xml_diff>

<commit_message>
feat(wp-03): the privacy policy at /privacy and /en/privacy of sino-web
Both versions of the sino-site policy are copied, the Limited Use statement
word for word; they are public and ask for no session. The owner details
(contact, owner, date, host) come from features/public/owner.ts, still
empty, so the page shows "[chưa điền: ...]" in their place (D-314).

Two changes to the copied words: the link to the security page, which does
not exist yet, is plain text (D-311); and "this site sets no cookies" is
rewritten (D-316, the agent's, for the user to review): in sino-web / asks
the server who is signed in and gets the XSRF-TOKEN cookie, so the policy
now says so and points to the app's cookies it already lists.

lint 0, build 0, vitest 767/767, Chrome 1440 and 390.

Co-Authored-By: Claude Opus 5.5 (1M context) <noreply@anthropic.com>
</commit_message>
<xml_diff>
--- a/docs/knowledge/phase-1-frontend-foundation.docx
+++ b/docs/knowledge/phase-1-frontend-foundation.docx
@@ -32863,6 +32863,166 @@
     </w:p>
     <w:p>
       <w:pPr>
+        <w:pStyle w:val="Heading3"/>
+      </w:pPr>
+      <w:r>
+        <w:t xml:space="preserve">24.5 Chính sách quyền riêng tư: chép chữ, nhưng chữ phải còn đúng (WP-03)</w:t>
+      </w:r>
+    </w:p>
+    <w:p>
+      <w:r>
+        <w:t xml:space="preserve">Hai bản VI/EN được chép nguyên văn, kể cả câu Limited Use mà Google đòi đúng từng chữ. Ba chỗ phải đổi:</w:t>
+      </w:r>
+    </w:p>
+    <w:p>
+      <w:pPr>
+        <w:shd w:val="clear" w:color="auto" w:fill="F2F3F5"/>
+        <w:ind w:left="0"/>
+      </w:pPr>
+      <w:r>
+        <w:rPr>
+          <w:rFonts w:ascii="Consolas" w:eastAsia="Consolas" w:hAnsi="Consolas" w:cs="Consolas"/>
+          <w:sz w:val="19"/>
+          <w:szCs w:val="19"/>
+        </w:rPr>
+        <w:t xml:space="preserve">thông tin chủ sở hữu   site.config.ts của sino-site  -&gt;  features/public/owner.ts, đọc qua ownerDetails()</w:t>
+        <w:br/>
+        <w:t xml:space="preserve">link /security          trang Bảo mật chưa có (SI-05)  -&gt;  giữ câu, bỏ link (D-311)</w:t>
+        <w:br/>
+        <w:t xml:space="preserve">"site này không dùng cookie"  đúng với site tĩnh, SAI trong app  -&gt;  viết lại (D-316)</w:t>
+      </w:r>
+    </w:p>
+    <w:p>
+      <w:r>
+        <w:t xml:space="preserve">Câu cookie là bài học chính. Chép một văn bản sang chỗ mới thì từng câu phải được kiểm lại theo chỗ mới. Ở </w:t>
+      </w:r>
+      <w:r>
+        <w:rPr>
+          <w:rFonts w:ascii="Consolas" w:eastAsia="Consolas" w:hAnsi="Consolas" w:cs="Consolas"/>
+        </w:rPr>
+        <w:t xml:space="preserve">sino-site</w:t>
+      </w:r>
+      <w:r>
+        <w:t xml:space="preserve"> trang không gọi API nào, nên không có cookie. Ở </w:t>
+      </w:r>
+      <w:r>
+        <w:rPr>
+          <w:rFonts w:ascii="Consolas" w:eastAsia="Consolas" w:hAnsi="Consolas" w:cs="Consolas"/>
+        </w:rPr>
+        <w:t xml:space="preserve">sino-web</w:t>
+      </w:r>
+      <w:r>
+        <w:t xml:space="preserve">, mở </w:t>
+      </w:r>
+      <w:r>
+        <w:rPr>
+          <w:rFonts w:ascii="Consolas" w:eastAsia="Consolas" w:hAnsi="Consolas" w:cs="Consolas"/>
+        </w:rPr>
+        <w:t xml:space="preserve">/</w:t>
+      </w:r>
+      <w:r>
+        <w:t xml:space="preserve"> thì </w:t>
+      </w:r>
+      <w:r>
+        <w:rPr>
+          <w:rFonts w:ascii="Consolas" w:eastAsia="Consolas" w:hAnsi="Consolas" w:cs="Consolas"/>
+        </w:rPr>
+        <w:t xml:space="preserve">HomeGate</w:t>
+      </w:r>
+      <w:r>
+        <w:t xml:space="preserve"> hỏi </w:t>
+      </w:r>
+      <w:r>
+        <w:rPr>
+          <w:rFonts w:ascii="Consolas" w:eastAsia="Consolas" w:hAnsi="Consolas" w:cs="Consolas"/>
+        </w:rPr>
+        <w:t xml:space="preserve">GET /api/auth/me</w:t>
+      </w:r>
+      <w:r>
+        <w:t xml:space="preserve">, và máy chủ trả kèm cookie </w:t>
+      </w:r>
+      <w:r>
+        <w:rPr>
+          <w:rFonts w:ascii="Consolas" w:eastAsia="Consolas" w:hAnsi="Consolas" w:cs="Consolas"/>
+        </w:rPr>
+        <w:t xml:space="preserve">XSRF-TOKEN</w:t>
+      </w:r>
+      <w:r>
+        <w:t xml:space="preserve"> (Spring Security </w:t>
+      </w:r>
+      <w:r>
+        <w:rPr>
+          <w:rFonts w:ascii="Consolas" w:eastAsia="Consolas" w:hAnsi="Consolas" w:cs="Consolas"/>
+        </w:rPr>
+        <w:t xml:space="preserve">csrf.spa()</w:t>
+      </w:r>
+      <w:r>
+        <w:t xml:space="preserve">, spec </w:t>
+      </w:r>
+      <w:r>
+        <w:rPr>
+          <w:rFonts w:ascii="Consolas" w:eastAsia="Consolas" w:hAnsi="Consolas" w:cs="Consolas"/>
+        </w:rPr>
+        <w:t xml:space="preserve">web-authentication</w:t>
+      </w:r>
+      <w:r>
+        <w:t xml:space="preserve">). Test viết trước: trong mục </w:t>
+      </w:r>
+      <w:r>
+        <w:rPr>
+          <w:i/>
+          <w:iCs/>
+        </w:rPr>
+        <w:t xml:space="preserve">Phạm vi</w:t>
+      </w:r>
+      <w:r>
+        <w:t xml:space="preserve"> không còn câu "không dùng cookie", có câu về cookie chống giả mạo yêu cầu, và có link về mục </w:t>
+      </w:r>
+      <w:r>
+        <w:rPr>
+          <w:i/>
+          <w:iCs/>
+        </w:rPr>
+        <w:t xml:space="preserve">Dữ liệu Sino lưu</w:t>
+      </w:r>
+      <w:r>
+        <w:t xml:space="preserve">, nơi chính sách vốn đã liệt kê cookie của ứng dụng.</w:t>
+      </w:r>
+    </w:p>
+    <w:p>
+      <w:r>
+        <w:t xml:space="preserve">Thông tin chủ sở hữu đi qua hàm </w:t>
+      </w:r>
+      <w:r>
+        <w:rPr>
+          <w:rFonts w:ascii="Consolas" w:eastAsia="Consolas" w:hAnsi="Consolas" w:cs="Consolas"/>
+        </w:rPr>
+        <w:t xml:space="preserve">ownerDetails()</w:t>
+      </w:r>
+      <w:r>
+        <w:t xml:space="preserve"> chứ không phải một hằng số import thẳng, để test thay được nó bằng </w:t>
+      </w:r>
+      <w:r>
+        <w:rPr>
+          <w:rFonts w:ascii="Consolas" w:eastAsia="Consolas" w:hAnsi="Consolas" w:cs="Consolas"/>
+        </w:rPr>
+        <w:t xml:space="preserve">vi.mock</w:t>
+      </w:r>
+      <w:r>
+        <w:t xml:space="preserve">: test vừa kiểm "[chưa điền: …]" khi còn trống, vừa kiểm email thành link </w:t>
+      </w:r>
+      <w:r>
+        <w:rPr>
+          <w:rFonts w:ascii="Consolas" w:eastAsia="Consolas" w:hAnsi="Consolas" w:cs="Consolas"/>
+        </w:rPr>
+        <w:t xml:space="preserve">mailto:</w:t>
+      </w:r>
+      <w:r>
+        <w:t xml:space="preserve"> và ngày viết kiểu Việt / Anh khi đã điền, mà không đỏ khi chủ sở hữu điền giá trị thật.</w:t>
+      </w:r>
+    </w:p>
+    <w:p>
+      <w:pPr>
         <w:pStyle w:val="Heading2"/>
       </w:pPr>
       <w:r>
@@ -37412,6 +37572,39 @@
       </w:r>
       <w:r>
         <w:t xml:space="preserve">? Kể hai điều người dùng mất với cách thứ hai.</w:t>
+      </w:r>
+    </w:p>
+    <w:p>
+      <w:pPr>
+        <w:pStyle w:val="ListParagraph"/>
+        <w:numPr>
+          <w:ilvl w:val="0"/>
+          <w:numId w:val="100"/>
+        </w:numPr>
+      </w:pPr>
+      <w:r>
+        <w:t xml:space="preserve">Câu "site này không dùng cookie" đúng ở sino-site mà sai ở sino-web. Cookie nào, từ đâu ra? Kể một câu khác trong một văn bản bạn từng chép mà có thể sai theo cùng cách.</w:t>
+      </w:r>
+    </w:p>
+    <w:p>
+      <w:pPr>
+        <w:pStyle w:val="ListParagraph"/>
+        <w:numPr>
+          <w:ilvl w:val="0"/>
+          <w:numId w:val="100"/>
+        </w:numPr>
+      </w:pPr>
+      <w:r>
+        <w:t xml:space="preserve">Vì sao thông tin chủ sở hữu đọc qua hàm </w:t>
+      </w:r>
+      <w:r>
+        <w:rPr>
+          <w:rFonts w:ascii="Consolas" w:eastAsia="Consolas" w:hAnsi="Consolas" w:cs="Consolas"/>
+        </w:rPr>
+        <w:t xml:space="preserve">ownerDetails()</w:t>
+      </w:r>
+      <w:r>
+        <w:t xml:space="preserve"> thay vì import thẳng một hằng số? Test sẽ ra sao nếu import thẳng và chủ sở hữu điền email thật?</w:t>
       </w:r>
     </w:p>
     <w:p/>

</xml_diff>

<commit_message>
docs: update knowledge, roadmap, test config and init zalo-send-images spec
</commit_message>
<xml_diff>
--- a/docs/knowledge/phase-1-frontend-foundation.docx
+++ b/docs/knowledge/phase-1-frontend-foundation.docx
@@ -33026,6 +33026,459 @@
         <w:pStyle w:val="Heading2"/>
       </w:pPr>
       <w:r>
+        <w:t xml:space="preserve">25. Số trên khung app: lấy từ đâu (</w:t>
+      </w:r>
+      <w:r>
+        <w:rPr>
+          <w:rFonts w:ascii="Consolas" w:eastAsia="Consolas" w:hAnsi="Consolas" w:cs="Consolas"/>
+        </w:rPr>
+        <w:t xml:space="preserve">shell-real-counts</w:t>
+      </w:r>
+      <w:r>
+        <w:t xml:space="preserve">)</w:t>
+      </w:r>
+    </w:p>
+    <w:p>
+      <w:pPr>
+        <w:pStyle w:val="Heading3"/>
+      </w:pPr>
+      <w:r>
+        <w:t xml:space="preserve">25.0 Bức tranh</w:t>
+      </w:r>
+    </w:p>
+    <w:p>
+      <w:r>
+        <w:t xml:space="preserve">Khung app (cột bên, dải icon, thanh dưới, thanh trên cùng, trang Thêm) từng đọc vài con số từ một bản dữ liệu mẫu cố định: chuông luôn "3 mới", Tài khoản luôn "1 cần xử lý", Đăng ký luôn "1 mới", chân cột "3 tài khoản". Ở môi trường thật, các số đó nói dối. Change này cho mỗi số một trong hai nguồn: </w:t>
+      </w:r>
+      <w:r>
+        <w:rPr>
+          <w:b/>
+          <w:bCs/>
+        </w:rPr>
+        <w:t xml:space="preserve">đếm từ dữ liệu thật của app</w:t>
+      </w:r>
+      <w:r>
+        <w:t xml:space="preserve">, hoặc </w:t>
+      </w:r>
+      <w:r>
+        <w:rPr>
+          <w:b/>
+          <w:bCs/>
+        </w:rPr>
+        <w:t xml:space="preserve">không nói gì</w:t>
+      </w:r>
+      <w:r>
+        <w:t xml:space="preserve"> khi chưa có nguồn.</w:t>
+      </w:r>
+    </w:p>
+    <w:p>
+      <w:pPr>
+        <w:shd w:val="clear" w:color="auto" w:fill="F2F3F5"/>
+        <w:ind w:left="0"/>
+      </w:pPr>
+      <w:r>
+        <w:rPr>
+          <w:rFonts w:ascii="Consolas" w:eastAsia="Consolas" w:hAnsi="Consolas" w:cs="Consolas"/>
+          <w:sz w:val="19"/>
+          <w:szCs w:val="19"/>
+        </w:rPr>
+        <w:t xml:space="preserve">GET /api/accounts + /api/providers</w:t>
+        <w:br/>
+        <w:t xml:space="preserve">        |</w:t>
+        <w:br/>
+        <w:t xml:space="preserve">        v</w:t>
+        <w:br/>
+        <w:t xml:space="preserve">  ACCOUNTS_QUERY_KEY (một cache, hai người đọc)</w:t>
+        <w:br/>
+        <w:t xml:space="preserve">   |                                  |</w:t>
+        <w:br/>
+        <w:t xml:space="preserve">   |  useAccounts()                   |  useAccountCounts()  select -&gt; { total, needingAction }</w:t>
+        <w:br/>
+        <w:t xml:space="preserve">   v                                  v</w:t>
+        <w:br/>
+        <w:t xml:space="preserve"> màn Tài khoản                  useShellData()  ghép vào ShellData</w:t>
+        <w:br/>
+        <w:t xml:space="preserve"> (đọc lại hộp thư khi            |-- accountCount          -&gt; chân cột bên, thẻ ở trang Thêm</w:t>
+        <w:br/>
+        <w:t xml:space="preserve">  nhập đầu xong)                 '-- accountsNeedingAction -&gt; chấm và chữ ở Sidebar, Rail, TabBar, trang Thêm</w:t>
+        <w:br/>
+        <w:br/>
+        <w:t xml:space="preserve">Không có nguồn nào: unreadNotifications = 0, registrationsNew = 0  (shellToday)</w:t>
+      </w:r>
+    </w:p>
+    <w:p>
+      <w:pPr>
+        <w:pStyle w:val="Heading3"/>
+      </w:pPr>
+      <w:r>
+        <w:t xml:space="preserve">25.1 </w:t>
+      </w:r>
+      <w:r>
+        <w:rPr>
+          <w:rFonts w:ascii="Consolas" w:eastAsia="Consolas" w:hAnsi="Consolas" w:cs="Consolas"/>
+        </w:rPr>
+        <w:t xml:space="preserve">select</w:t>
+      </w:r>
+      <w:r>
+        <w:t xml:space="preserve"> của TanStack Query: đếm mà không giữ bản sao</w:t>
+      </w:r>
+    </w:p>
+    <w:p>
+      <w:r>
+        <w:rPr>
+          <w:rFonts w:ascii="Consolas" w:eastAsia="Consolas" w:hAnsi="Consolas" w:cs="Consolas"/>
+        </w:rPr>
+        <w:t xml:space="preserve">useAccountCounts</w:t>
+      </w:r>
+      <w:r>
+        <w:t xml:space="preserve"> là một </w:t>
+      </w:r>
+      <w:r>
+        <w:rPr>
+          <w:rFonts w:ascii="Consolas" w:eastAsia="Consolas" w:hAnsi="Consolas" w:cs="Consolas"/>
+        </w:rPr>
+        <w:t xml:space="preserve">useQuery</w:t>
+      </w:r>
+      <w:r>
+        <w:t xml:space="preserve"> trên cùng khóa với màn Tài khoản, thêm </w:t>
+      </w:r>
+      <w:r>
+        <w:rPr>
+          <w:rFonts w:ascii="Consolas" w:eastAsia="Consolas" w:hAnsi="Consolas" w:cs="Consolas"/>
+        </w:rPr>
+        <w:t xml:space="preserve">select: countsOf</w:t>
+      </w:r>
+      <w:r>
+        <w:t xml:space="preserve">. </w:t>
+      </w:r>
+      <w:r>
+        <w:rPr>
+          <w:rFonts w:ascii="Consolas" w:eastAsia="Consolas" w:hAnsi="Consolas" w:cs="Consolas"/>
+        </w:rPr>
+        <w:t xml:space="preserve">select</w:t>
+      </w:r>
+      <w:r>
+        <w:t xml:space="preserve"> chạy trên dữ liệu trong cache và chỉ đưa kết quả cho người gọi; cache vẫn giữ cả danh sách. Hai điều đáng biết:</w:t>
+      </w:r>
+    </w:p>
+    <w:p>
+      <w:pPr>
+        <w:pStyle w:val="ListParagraph"/>
+        <w:numPr>
+          <w:ilvl w:val="0"/>
+          <w:numId w:val="1"/>
+        </w:numPr>
+      </w:pPr>
+      <w:r>
+        <w:t xml:space="preserve">Kết quả của </w:t>
+      </w:r>
+      <w:r>
+        <w:rPr>
+          <w:rFonts w:ascii="Consolas" w:eastAsia="Consolas" w:hAnsi="Consolas" w:cs="Consolas"/>
+        </w:rPr>
+        <w:t xml:space="preserve">select</w:t>
+      </w:r>
+      <w:r>
+        <w:t xml:space="preserve"> được so sánh theo cấu trúc với lần trước (structural sharing). Danh sách đổi một công tắc kênh nhưng đếm vẫn </w:t>
+      </w:r>
+      <w:r>
+        <w:rPr>
+          <w:rFonts w:ascii="Consolas" w:eastAsia="Consolas" w:hAnsi="Consolas" w:cs="Consolas"/>
+        </w:rPr>
+        <w:t xml:space="preserve">{ total: 3, needingAction: 2 }</w:t>
+      </w:r>
+      <w:r>
+        <w:t xml:space="preserve"> thì người gọi nhận lại đúng object cũ, không vẽ lại.</w:t>
+      </w:r>
+    </w:p>
+    <w:p>
+      <w:pPr>
+        <w:pStyle w:val="ListParagraph"/>
+        <w:numPr>
+          <w:ilvl w:val="0"/>
+          <w:numId w:val="1"/>
+        </w:numPr>
+      </w:pPr>
+      <w:r>
+        <w:t xml:space="preserve">Hook này không gọi </w:t>
+      </w:r>
+      <w:r>
+        <w:rPr>
+          <w:rFonts w:ascii="Consolas" w:eastAsia="Consolas" w:hAnsi="Consolas" w:cs="Consolas"/>
+        </w:rPr>
+        <w:t xml:space="preserve">useAccounts()</w:t>
+      </w:r>
+      <w:r>
+        <w:t xml:space="preserve">. </w:t>
+      </w:r>
+      <w:r>
+        <w:rPr>
+          <w:rFonts w:ascii="Consolas" w:eastAsia="Consolas" w:hAnsi="Consolas" w:cs="Consolas"/>
+        </w:rPr>
+        <w:t xml:space="preserve">useAccounts</w:t>
+      </w:r>
+      <w:r>
+        <w:t xml:space="preserve"> còn hai bổn phận của màn Tài khoản (đọc lại danh sách khi một lần nhập đầu đang chạy; đọc lại hộp thư khi có tài khoản nhập xong). Trạng thái "nhập xong" ở lại mãi, nên gắn </w:t>
+      </w:r>
+      <w:r>
+        <w:rPr>
+          <w:rFonts w:ascii="Consolas" w:eastAsia="Consolas" w:hAnsi="Consolas" w:cs="Consolas"/>
+        </w:rPr>
+        <w:t xml:space="preserve">useAccounts</w:t>
+      </w:r>
+      <w:r>
+        <w:t xml:space="preserve"> vào khung app thì mỗi lần mở app đọc lại hộp thư một lần thừa.</w:t>
+      </w:r>
+    </w:p>
+    <w:p>
+      <w:pPr>
+        <w:pStyle w:val="Heading3"/>
+      </w:pPr>
+      <w:r>
+        <w:t xml:space="preserve">25.2 Chưa biết thì không nói gì</w:t>
+      </w:r>
+    </w:p>
+    <w:p>
+      <w:r>
+        <w:t xml:space="preserve">Trước khi danh sách về, số tài khoản cần xử lý là 0 và tổng số tài khoản là </w:t>
+      </w:r>
+      <w:r>
+        <w:rPr>
+          <w:rFonts w:ascii="Consolas" w:eastAsia="Consolas" w:hAnsi="Consolas" w:cs="Consolas"/>
+        </w:rPr>
+        <w:t xml:space="preserve">null</w:t>
+      </w:r>
+      <w:r>
+        <w:t xml:space="preserve"> (kiểu </w:t>
+      </w:r>
+      <w:r>
+        <w:rPr>
+          <w:rFonts w:ascii="Consolas" w:eastAsia="Consolas" w:hAnsi="Consolas" w:cs="Consolas"/>
+        </w:rPr>
+        <w:t xml:space="preserve">number | null</w:t>
+      </w:r>
+      <w:r>
+        <w:t xml:space="preserve">). Không phải 0 cho tổng: "0 tài khoản" là một câu khẳng định, còn chưa biết thì phải im. Cột bên bỏ dòng chữ, trang Thêm bỏ dòng "N tài khoản". Cùng cách nghĩ với </w:t>
+      </w:r>
+      <w:r>
+        <w:rPr>
+          <w:rFonts w:ascii="Consolas" w:eastAsia="Consolas" w:hAnsi="Consolas" w:cs="Consolas"/>
+        </w:rPr>
+        <w:t xml:space="preserve">messagesUnread: number | null</w:t>
+      </w:r>
+      <w:r>
+        <w:t xml:space="preserve"> ở f05c.</w:t>
+      </w:r>
+    </w:p>
+    <w:p>
+      <w:pPr>
+        <w:pStyle w:val="Heading3"/>
+      </w:pPr>
+      <w:r>
+        <w:t xml:space="preserve">25.3 Hai loại số, một chỗ ghép</w:t>
+      </w:r>
+    </w:p>
+    <w:p>
+      <w:r>
+        <w:rPr>
+          <w:rFonts w:ascii="Consolas" w:eastAsia="Consolas" w:hAnsi="Consolas" w:cs="Consolas"/>
+        </w:rPr>
+        <w:t xml:space="preserve">useShellData</w:t>
+      </w:r>
+      <w:r>
+        <w:t xml:space="preserve"> làm hai việc, và hai việc không lẫn:</w:t>
+      </w:r>
+    </w:p>
+    <w:p>
+      <w:pPr>
+        <w:pStyle w:val="ListParagraph"/>
+        <w:numPr>
+          <w:ilvl w:val="0"/>
+          <w:numId w:val="1"/>
+        </w:numPr>
+      </w:pPr>
+      <w:r>
+        <w:rPr>
+          <w:rFonts w:ascii="Consolas" w:eastAsia="Consolas" w:hAnsi="Consolas" w:cs="Consolas"/>
+        </w:rPr>
+        <w:t xml:space="preserve">queryFn: shellToday</w:t>
+      </w:r>
+      <w:r>
+        <w:t xml:space="preserve"> là cái backend sẽ nói nếu có endpoint cho khung app. Hôm nay nó là mẫu của canvas trừ hai số không ai đếm được (thông báo, đăng ký) đặt về 0. Backend có endpoint thì thay đúng hàm này.</w:t>
+      </w:r>
+    </w:p>
+    <w:p>
+      <w:pPr>
+        <w:pStyle w:val="ListParagraph"/>
+        <w:numPr>
+          <w:ilvl w:val="0"/>
+          <w:numId w:val="1"/>
+        </w:numPr>
+      </w:pPr>
+      <w:r>
+        <w:t xml:space="preserve">Phần ghép sau </w:t>
+      </w:r>
+      <w:r>
+        <w:rPr>
+          <w:rFonts w:ascii="Consolas" w:eastAsia="Consolas" w:hAnsi="Consolas" w:cs="Consolas"/>
+        </w:rPr>
+        <w:t xml:space="preserve">useQuery</w:t>
+      </w:r>
+      <w:r>
+        <w:t xml:space="preserve"> là số </w:t>
+      </w:r>
+      <w:r>
+        <w:rPr>
+          <w:b/>
+          <w:bCs/>
+        </w:rPr>
+        <w:t xml:space="preserve">app tự tính</w:t>
+      </w:r>
+      <w:r>
+        <w:t xml:space="preserve"> (số tài khoản). Nó chạy dù cache được gieo từ đâu, nên test gieo </w:t>
+      </w:r>
+      <w:r>
+        <w:rPr>
+          <w:rFonts w:ascii="Consolas" w:eastAsia="Consolas" w:hAnsi="Consolas" w:cs="Consolas"/>
+        </w:rPr>
+        <w:t xml:space="preserve">accountCount: 9</w:t>
+      </w:r>
+      <w:r>
+        <w:t xml:space="preserve"> mà danh sách có 3 tài khoản vẫn thấy 3.</w:t>
+      </w:r>
+    </w:p>
+    <w:p>
+      <w:r>
+        <w:t xml:space="preserve">Trước đây </w:t>
+      </w:r>
+      <w:r>
+        <w:rPr>
+          <w:rFonts w:ascii="Consolas" w:eastAsia="Consolas" w:hAnsi="Consolas" w:cs="Consolas"/>
+        </w:rPr>
+        <w:t xml:space="preserve">AppShell</w:t>
+      </w:r>
+      <w:r>
+        <w:t xml:space="preserve"> và </w:t>
+      </w:r>
+      <w:r>
+        <w:rPr>
+          <w:rFonts w:ascii="Consolas" w:eastAsia="Consolas" w:hAnsi="Consolas" w:cs="Consolas"/>
+        </w:rPr>
+        <w:t xml:space="preserve">MorePage</w:t>
+      </w:r>
+      <w:r>
+        <w:t xml:space="preserve"> mỗi nơi tự ghi đè một số. Gom về </w:t>
+      </w:r>
+      <w:r>
+        <w:rPr>
+          <w:rFonts w:ascii="Consolas" w:eastAsia="Consolas" w:hAnsi="Consolas" w:cs="Consolas"/>
+        </w:rPr>
+        <w:t xml:space="preserve">useShellData</w:t>
+      </w:r>
+      <w:r>
+        <w:t xml:space="preserve"> chỉ làm được khi </w:t>
+      </w:r>
+      <w:r>
+        <w:rPr>
+          <w:rFonts w:ascii="Consolas" w:eastAsia="Consolas" w:hAnsi="Consolas" w:cs="Consolas"/>
+        </w:rPr>
+        <w:t xml:space="preserve">useDisconnectAccount</w:t>
+      </w:r>
+      <w:r>
+        <w:t xml:space="preserve"> thôi ghi </w:t>
+      </w:r>
+      <w:r>
+        <w:rPr>
+          <w:rFonts w:ascii="Consolas" w:eastAsia="Consolas" w:hAnsi="Consolas" w:cs="Consolas"/>
+        </w:rPr>
+        <w:t xml:space="preserve">accountCount</w:t>
+      </w:r>
+      <w:r>
+        <w:t xml:space="preserve"> vào cache shell: nếu còn, </w:t>
+      </w:r>
+      <w:r>
+        <w:rPr>
+          <w:rFonts w:ascii="Consolas" w:eastAsia="Consolas" w:hAnsi="Consolas" w:cs="Consolas"/>
+        </w:rPr>
+        <w:t xml:space="preserve">useAccounts.ts</w:t>
+      </w:r>
+      <w:r>
+        <w:t xml:space="preserve"> import </w:t>
+      </w:r>
+      <w:r>
+        <w:rPr>
+          <w:rFonts w:ascii="Consolas" w:eastAsia="Consolas" w:hAnsi="Consolas" w:cs="Consolas"/>
+        </w:rPr>
+        <w:t xml:space="preserve">useShellData.ts</w:t>
+      </w:r>
+      <w:r>
+        <w:t xml:space="preserve"> và </w:t>
+      </w:r>
+      <w:r>
+        <w:rPr>
+          <w:rFonts w:ascii="Consolas" w:eastAsia="Consolas" w:hAnsi="Consolas" w:cs="Consolas"/>
+        </w:rPr>
+        <w:t xml:space="preserve">useShellData.ts</w:t>
+      </w:r>
+      <w:r>
+        <w:t xml:space="preserve"> import </w:t>
+      </w:r>
+      <w:r>
+        <w:rPr>
+          <w:rFonts w:ascii="Consolas" w:eastAsia="Consolas" w:hAnsi="Consolas" w:cs="Consolas"/>
+        </w:rPr>
+        <w:t xml:space="preserve">useAccounts.ts</w:t>
+      </w:r>
+      <w:r>
+        <w:t xml:space="preserve">, tức vòng phụ thuộc. Cái đáng học: mỗi con số có đúng một nguồn thì không còn ai phải nhớ cập nhật nó ở chỗ thứ hai.</w:t>
+      </w:r>
+    </w:p>
+    <w:p>
+      <w:pPr>
+        <w:pStyle w:val="Heading3"/>
+      </w:pPr>
+      <w:r>
+        <w:t xml:space="preserve">25.4 Một test xanh ngay lần chạy đầu chưa chứng minh gì</w:t>
+      </w:r>
+    </w:p>
+    <w:p>
+      <w:r>
+        <w:t xml:space="preserve">Test "chuông không có chấm" dùng </w:t>
+      </w:r>
+      <w:r>
+        <w:rPr>
+          <w:rFonts w:ascii="Consolas" w:eastAsia="Consolas" w:hAnsi="Consolas" w:cs="Consolas"/>
+        </w:rPr>
+        <w:t xml:space="preserve">renderApp('/overview', { shell: null })</w:t>
+      </w:r>
+      <w:r>
+        <w:t xml:space="preserve"> để chạy đường dữ liệu thật của app. Lần đầu nó xanh ngay, kể cả khi code còn trả 3: trước khi dữ liệu về, chuông vốn không có số nào, nên câu hỏi được trả lời bởi trạng thái chưa tải. Sửa: đợi dữ liệu có trong cache rồi mới khẳng định. Sau đó mới đỏ đúng chỗ (</w:t>
+      </w:r>
+      <w:r>
+        <w:rPr>
+          <w:rFonts w:ascii="Consolas" w:eastAsia="Consolas" w:hAnsi="Consolas" w:cs="Consolas"/>
+        </w:rPr>
+        <w:t xml:space="preserve">Unable to find role="link" and name "Thông báo"</w:t>
+      </w:r>
+      <w:r>
+        <w:t xml:space="preserve">, vì chuông đang tên "Thông báo, 3 mới"). Cách tự hỏi: </w:t>
+      </w:r>
+      <w:r>
+        <w:rPr>
+          <w:i/>
+          <w:iCs/>
+        </w:rPr>
+        <w:t xml:space="preserve">nếu code sai, test này có đỏ không?</w:t>
+      </w:r>
+      <w:r>
+        <w:t xml:space="preserve"> Chạy nó trên code cũ là cách rẻ nhất để biết.</w:t>
+      </w:r>
+    </w:p>
+    <w:p>
+      <w:pPr>
+        <w:pStyle w:val="Heading2"/>
+      </w:pPr>
+      <w:r>
         <w:t xml:space="preserve">Tự kiểm tra</w:t>
       </w:r>
     </w:p>
@@ -37605,6 +38058,99 @@
       </w:r>
       <w:r>
         <w:t xml:space="preserve"> thay vì import thẳng một hằng số? Test sẽ ra sao nếu import thẳng và chủ sở hữu điền email thật?</w:t>
+      </w:r>
+    </w:p>
+    <w:p>
+      <w:pPr>
+        <w:pStyle w:val="ListParagraph"/>
+        <w:numPr>
+          <w:ilvl w:val="0"/>
+          <w:numId w:val="100"/>
+        </w:numPr>
+      </w:pPr>
+      <w:r>
+        <w:t xml:space="preserve">Vì sao </w:t>
+      </w:r>
+      <w:r>
+        <w:rPr>
+          <w:rFonts w:ascii="Consolas" w:eastAsia="Consolas" w:hAnsi="Consolas" w:cs="Consolas"/>
+        </w:rPr>
+        <w:t xml:space="preserve">useAccountCounts</w:t>
+      </w:r>
+      <w:r>
+        <w:t xml:space="preserve"> không gọi </w:t>
+      </w:r>
+      <w:r>
+        <w:rPr>
+          <w:rFonts w:ascii="Consolas" w:eastAsia="Consolas" w:hAnsi="Consolas" w:cs="Consolas"/>
+        </w:rPr>
+        <w:t xml:space="preserve">useAccounts()</w:t>
+      </w:r>
+      <w:r>
+        <w:t xml:space="preserve"> dù cùng đọc danh sách? Điều gì xảy ra mỗi lần mở app nếu gọi?</w:t>
+      </w:r>
+    </w:p>
+    <w:p>
+      <w:pPr>
+        <w:pStyle w:val="ListParagraph"/>
+        <w:numPr>
+          <w:ilvl w:val="0"/>
+          <w:numId w:val="100"/>
+        </w:numPr>
+      </w:pPr>
+      <w:r>
+        <w:t xml:space="preserve">Vì sao tổng số tài khoản là </w:t>
+      </w:r>
+      <w:r>
+        <w:rPr>
+          <w:rFonts w:ascii="Consolas" w:eastAsia="Consolas" w:hAnsi="Consolas" w:cs="Consolas"/>
+        </w:rPr>
+        <w:t xml:space="preserve">null</w:t>
+      </w:r>
+      <w:r>
+        <w:t xml:space="preserve"> khi danh sách chưa về, còn số cần xử lý là 0? "Chưa biết" và "bằng 0" khác nhau ở chỗ nào trên màn hình?</w:t>
+      </w:r>
+    </w:p>
+    <w:p>
+      <w:pPr>
+        <w:pStyle w:val="ListParagraph"/>
+        <w:numPr>
+          <w:ilvl w:val="0"/>
+          <w:numId w:val="100"/>
+        </w:numPr>
+      </w:pPr>
+      <w:r>
+        <w:t xml:space="preserve">Gieo cache shell với </w:t>
+      </w:r>
+      <w:r>
+        <w:rPr>
+          <w:rFonts w:ascii="Consolas" w:eastAsia="Consolas" w:hAnsi="Consolas" w:cs="Consolas"/>
+        </w:rPr>
+        <w:t xml:space="preserve">accountCount: 9</w:t>
+      </w:r>
+      <w:r>
+        <w:t xml:space="preserve"> mà danh sách có 3 tài khoản. Cột bên hiện số nào, và vì sao đây là điều ta muốn?</w:t>
+      </w:r>
+    </w:p>
+    <w:p>
+      <w:pPr>
+        <w:pStyle w:val="ListParagraph"/>
+        <w:numPr>
+          <w:ilvl w:val="0"/>
+          <w:numId w:val="100"/>
+        </w:numPr>
+      </w:pPr>
+      <w:r>
+        <w:t xml:space="preserve">Test </w:t>
+      </w:r>
+      <w:r>
+        <w:rPr>
+          <w:rFonts w:ascii="Consolas" w:eastAsia="Consolas" w:hAnsi="Consolas" w:cs="Consolas"/>
+        </w:rPr>
+        <w:t xml:space="preserve">shell: null</w:t>
+      </w:r>
+      <w:r>
+        <w:t xml:space="preserve"> của chuông xanh ngay lần đầu dù code sai. Vì sao, và thêm đúng một dòng nào để nó đỏ khi code sai?</w:t>
       </w:r>
     </w:p>
     <w:p/>

</xml_diff>

<commit_message>
feat(settings): the Cài đặt screen with its table of contents and nine sections (SE-01…SE-03)
/settings follows the canvas Settings: a table of contents from 1280 px
that stays in view and marks the section on screen, and the sections
Giao diện, Ngôn ngữ, Chuyển động, Thông báo, Lịch và nhắc nhở, Quyền
riêng tư và dữ liệu, Nguồn đã kết nối, Bảo mật, Về Sino.

The theme is real and gains "Theo hệ thống", which follows the OS
(shared/theme: preference and choose beside theme and toggleTheme).
Nguồn đã kết nối lists the user's real accounts. Everything else is
sample data kept in the query cache for the session; nothing is saved.

7 new tests; lint 0 errors, tsc -b 0, build 0, pnpm test 1305/1309
(the 4 known FormData upload reds on Node 26). Real Chrome NOT VERIFIED.

Co-Authored-By: Claude Opus 5.5 (1M context) <noreply@anthropic.com>
</commit_message>
<xml_diff>
--- a/docs/knowledge/phase-1-frontend-foundation.docx
+++ b/docs/knowledge/phase-1-frontend-foundation.docx
@@ -33479,6 +33479,999 @@
         <w:pStyle w:val="Heading2"/>
       </w:pPr>
       <w:r>
+        <w:t xml:space="preserve">26. Màn Cài đặt (</w:t>
+      </w:r>
+      <w:r>
+        <w:rPr>
+          <w:rFonts w:ascii="Consolas" w:eastAsia="Consolas" w:hAnsi="Consolas" w:cs="Consolas"/>
+        </w:rPr>
+        <w:t xml:space="preserve">fe-ui-settings</w:t>
+      </w:r>
+      <w:r>
+        <w:t xml:space="preserve">, SE-01…SE-03)</w:t>
+      </w:r>
+    </w:p>
+    <w:p>
+      <w:r>
+        <w:t xml:space="preserve">Màn </w:t>
+      </w:r>
+      <w:r>
+        <w:rPr>
+          <w:rFonts w:ascii="Consolas" w:eastAsia="Consolas" w:hAnsi="Consolas" w:cs="Consolas"/>
+        </w:rPr>
+        <w:t xml:space="preserve">/settings</w:t>
+      </w:r>
+      <w:r>
+        <w:t xml:space="preserve"> dựng theo canvas </w:t>
+      </w:r>
+      <w:r>
+        <w:rPr>
+          <w:rFonts w:ascii="Consolas" w:eastAsia="Consolas" w:hAnsi="Consolas" w:cs="Consolas"/>
+        </w:rPr>
+        <w:t xml:space="preserve">Settings</w:t>
+      </w:r>
+      <w:r>
+        <w:t xml:space="preserve">, gồm 9 mục. Theo lựa chọn của người dùng ("chỉ giao diện, dữ liệu mẫu"), chỉ hai thứ là thật: </w:t>
+      </w:r>
+      <w:r>
+        <w:rPr>
+          <w:b/>
+          <w:bCs/>
+        </w:rPr>
+        <w:t xml:space="preserve">theme</w:t>
+      </w:r>
+      <w:r>
+        <w:t xml:space="preserve"> và </w:t>
+      </w:r>
+      <w:r>
+        <w:rPr>
+          <w:b/>
+          <w:bCs/>
+        </w:rPr>
+        <w:t xml:space="preserve">tài khoản</w:t>
+      </w:r>
+      <w:r>
+        <w:t xml:space="preserve"> ở "Nguồn đã kết nối". Mọi thứ khác bấm được nhưng không lưu và không áp vào app.</w:t>
+      </w:r>
+    </w:p>
+    <w:p>
+      <w:pPr>
+        <w:pStyle w:val="Heading3"/>
+      </w:pPr>
+      <w:r>
+        <w:t xml:space="preserve">26.1 Ở đâu</w:t>
+      </w:r>
+    </w:p>
+    <w:p>
+      <w:r>
+        <w:t xml:space="preserve">Tính từ </w:t>
+      </w:r>
+      <w:r>
+        <w:rPr>
+          <w:rFonts w:ascii="Consolas" w:eastAsia="Consolas" w:hAnsi="Consolas" w:cs="Consolas"/>
+        </w:rPr>
+        <w:t xml:space="preserve">apps/sino-web/src/</w:t>
+      </w:r>
+      <w:r>
+        <w:t xml:space="preserve">:</w:t>
+      </w:r>
+    </w:p>
+    <w:p>
+      <w:pPr>
+        <w:pStyle w:val="ListParagraph"/>
+        <w:numPr>
+          <w:ilvl w:val="0"/>
+          <w:numId w:val="1"/>
+        </w:numPr>
+      </w:pPr>
+      <w:r>
+        <w:rPr>
+          <w:rFonts w:ascii="Consolas" w:eastAsia="Consolas" w:hAnsi="Consolas" w:cs="Consolas"/>
+        </w:rPr>
+        <w:t xml:space="preserve">features/settings/SettingsPage.tsx</w:t>
+      </w:r>
+      <w:r>
+        <w:t xml:space="preserve">: khung trang, cột mục lục từ 1280 px, 9 mục.</w:t>
+      </w:r>
+    </w:p>
+    <w:p>
+      <w:pPr>
+        <w:pStyle w:val="ListParagraph"/>
+        <w:numPr>
+          <w:ilvl w:val="0"/>
+          <w:numId w:val="1"/>
+        </w:numPr>
+      </w:pPr>
+      <w:r>
+        <w:rPr>
+          <w:rFonts w:ascii="Consolas" w:eastAsia="Consolas" w:hAnsi="Consolas" w:cs="Consolas"/>
+        </w:rPr>
+        <w:t xml:space="preserve">features/settings/sections.ts</w:t>
+      </w:r>
+      <w:r>
+        <w:t xml:space="preserve">: danh sách mục (neo </w:t>
+      </w:r>
+      <w:r>
+        <w:rPr>
+          <w:rFonts w:ascii="Consolas" w:eastAsia="Consolas" w:hAnsi="Consolas" w:cs="Consolas"/>
+        </w:rPr>
+        <w:t xml:space="preserve">#giao-dien</w:t>
+      </w:r>
+      <w:r>
+        <w:t xml:space="preserve">…, icon) và lớp của một dòng mục lục.</w:t>
+      </w:r>
+    </w:p>
+    <w:p>
+      <w:pPr>
+        <w:pStyle w:val="ListParagraph"/>
+        <w:numPr>
+          <w:ilvl w:val="0"/>
+          <w:numId w:val="1"/>
+        </w:numPr>
+      </w:pPr>
+      <w:r>
+        <w:rPr>
+          <w:rFonts w:ascii="Consolas" w:eastAsia="Consolas" w:hAnsi="Consolas" w:cs="Consolas"/>
+        </w:rPr>
+        <w:t xml:space="preserve">features/settings/components/SettingsNav.tsx</w:t>
+      </w:r>
+      <w:r>
+        <w:t xml:space="preserve">: mục lục dính khi cuộn, đánh dấu mục đang xem.</w:t>
+      </w:r>
+    </w:p>
+    <w:p>
+      <w:pPr>
+        <w:pStyle w:val="ListParagraph"/>
+        <w:numPr>
+          <w:ilvl w:val="0"/>
+          <w:numId w:val="1"/>
+        </w:numPr>
+      </w:pPr>
+      <w:r>
+        <w:rPr>
+          <w:rFonts w:ascii="Consolas" w:eastAsia="Consolas" w:hAnsi="Consolas" w:cs="Consolas"/>
+        </w:rPr>
+        <w:t xml:space="preserve">features/settings/components/SettingRow.tsx</w:t>
+      </w:r>
+      <w:r>
+        <w:t xml:space="preserve">: </w:t>
+      </w:r>
+      <w:r>
+        <w:rPr>
+          <w:rFonts w:ascii="Consolas" w:eastAsia="Consolas" w:hAnsi="Consolas" w:cs="Consolas"/>
+        </w:rPr>
+        <w:t xml:space="preserve">SettingSection</w:t>
+      </w:r>
+      <w:r>
+        <w:t xml:space="preserve">, </w:t>
+      </w:r>
+      <w:r>
+        <w:rPr>
+          <w:rFonts w:ascii="Consolas" w:eastAsia="Consolas" w:hAnsi="Consolas" w:cs="Consolas"/>
+        </w:rPr>
+        <w:t xml:space="preserve">SettingRow</w:t>
+      </w:r>
+      <w:r>
+        <w:t xml:space="preserve">, </w:t>
+      </w:r>
+      <w:r>
+        <w:rPr>
+          <w:rFonts w:ascii="Consolas" w:eastAsia="Consolas" w:hAnsi="Consolas" w:cs="Consolas"/>
+        </w:rPr>
+        <w:t xml:space="preserve">SettingSelect</w:t>
+      </w:r>
+      <w:r>
+        <w:t xml:space="preserve">, </w:t>
+      </w:r>
+      <w:r>
+        <w:rPr>
+          <w:rFonts w:ascii="Consolas" w:eastAsia="Consolas" w:hAnsi="Consolas" w:cs="Consolas"/>
+        </w:rPr>
+        <w:t xml:space="preserve">SwitchRow</w:t>
+      </w:r>
+      <w:r>
+        <w:t xml:space="preserve">.</w:t>
+      </w:r>
+    </w:p>
+    <w:p>
+      <w:pPr>
+        <w:pStyle w:val="ListParagraph"/>
+        <w:numPr>
+          <w:ilvl w:val="0"/>
+          <w:numId w:val="1"/>
+        </w:numPr>
+      </w:pPr>
+      <w:r>
+        <w:rPr>
+          <w:rFonts w:ascii="Consolas" w:eastAsia="Consolas" w:hAnsi="Consolas" w:cs="Consolas"/>
+        </w:rPr>
+        <w:t xml:space="preserve">features/settings/components/{LookSections,NotifySections,DataSections}.tsx</w:t>
+      </w:r>
+      <w:r>
+        <w:t xml:space="preserve">: các mục.</w:t>
+      </w:r>
+    </w:p>
+    <w:p>
+      <w:pPr>
+        <w:pStyle w:val="ListParagraph"/>
+        <w:numPr>
+          <w:ilvl w:val="0"/>
+          <w:numId w:val="1"/>
+        </w:numPr>
+      </w:pPr>
+      <w:r>
+        <w:rPr>
+          <w:rFonts w:ascii="Consolas" w:eastAsia="Consolas" w:hAnsi="Consolas" w:cs="Consolas"/>
+        </w:rPr>
+        <w:t xml:space="preserve">features/settings/{settings.sample.ts,useSettingsSample.ts}</w:t>
+      </w:r>
+      <w:r>
+        <w:t xml:space="preserve">: dữ liệu mẫu và nơi giữ nó.</w:t>
+      </w:r>
+    </w:p>
+    <w:p>
+      <w:pPr>
+        <w:pStyle w:val="ListParagraph"/>
+        <w:numPr>
+          <w:ilvl w:val="0"/>
+          <w:numId w:val="1"/>
+        </w:numPr>
+      </w:pPr>
+      <w:r>
+        <w:rPr>
+          <w:rFonts w:ascii="Consolas" w:eastAsia="Consolas" w:hAnsi="Consolas" w:cs="Consolas"/>
+        </w:rPr>
+        <w:t xml:space="preserve">shared/theme/**</w:t>
+      </w:r>
+      <w:r>
+        <w:t xml:space="preserve">: thêm lựa chọn "Theo hệ thống".</w:t>
+      </w:r>
+    </w:p>
+    <w:p>
+      <w:pPr>
+        <w:pStyle w:val="ListParagraph"/>
+        <w:numPr>
+          <w:ilvl w:val="0"/>
+          <w:numId w:val="1"/>
+        </w:numPr>
+      </w:pPr>
+      <w:r>
+        <w:t xml:space="preserve">Test: </w:t>
+      </w:r>
+      <w:r>
+        <w:rPr>
+          <w:rFonts w:ascii="Consolas" w:eastAsia="Consolas" w:hAnsi="Consolas" w:cs="Consolas"/>
+        </w:rPr>
+        <w:t xml:space="preserve">features/settings/SettingsPage.test.tsx</w:t>
+      </w:r>
+      <w:r>
+        <w:t xml:space="preserve">.</w:t>
+      </w:r>
+    </w:p>
+    <w:p>
+      <w:pPr>
+        <w:shd w:val="clear" w:color="auto" w:fill="F2F3F5"/>
+        <w:ind w:left="0"/>
+      </w:pPr>
+      <w:r>
+        <w:rPr>
+          <w:rFonts w:ascii="Consolas" w:eastAsia="Consolas" w:hAnsi="Consolas" w:cs="Consolas"/>
+          <w:sz w:val="19"/>
+          <w:szCs w:val="19"/>
+        </w:rPr>
+        <w:t xml:space="preserve"> 1280 px trở lên                                  768 - 1279 px            dưới 768 px</w:t>
+        <w:br/>
+        <w:t xml:space="preserve">+-----------+-------------------------------+     +-------------------+    (SE-05: danh sách</w:t>
+        <w:br/>
+        <w:t xml:space="preserve">| Cài đặt   | CÀI ĐẶT                       |     | CÀI ĐẶT           |     nhóm và trang con)</w:t>
+        <w:br/>
+        <w:t xml:space="preserve">| &gt; Giao diện| Cài đặt                      |     | Cài đặt           |</w:t>
+        <w:br/>
+        <w:t xml:space="preserve">|   Ngôn ngữ |------------------------------|     |-------------------|</w:t>
+        <w:br/>
+        <w:t xml:space="preserve">|   ...      | Giao diện                    |     | Giao diện         |</w:t>
+        <w:br/>
+        <w:t xml:space="preserve">|   Nguồn  * | [Theo hệ thống][Tối][Sáng]   |     | ...               |</w:t>
+        <w:br/>
+        <w:t xml:space="preserve">|   ...      | Ngôn ngữ ...                 |     +-------------------+</w:t>
+        <w:br/>
+        <w:t xml:space="preserve">+-----------+-------------------------------+</w:t>
+        <w:br/>
+        <w:t xml:space="preserve">  mục lục dính khi cuộn; * = có tài khoản cần xử lý</w:t>
+      </w:r>
+    </w:p>
+    <w:p>
+      <w:pPr>
+        <w:pStyle w:val="Heading3"/>
+      </w:pPr>
+      <w:r>
+        <w:t xml:space="preserve">26.2 Theme có thêm "Theo hệ thống"</w:t>
+      </w:r>
+    </w:p>
+    <w:p>
+      <w:r>
+        <w:t xml:space="preserve">Trước đây </w:t>
+      </w:r>
+      <w:r>
+        <w:rPr>
+          <w:rFonts w:ascii="Consolas" w:eastAsia="Consolas" w:hAnsi="Consolas" w:cs="Consolas"/>
+        </w:rPr>
+        <w:t xml:space="preserve">ThemeProvider</w:t>
+      </w:r>
+      <w:r>
+        <w:t xml:space="preserve"> chỉ có Sáng và Tối; lần đầu mở app thì lấy theo hệ điều hành, nhưng không theo dõi về sau. Canvas có ba thẻ, nên lựa chọn được tách khỏi theme đang dùng:</w:t>
+      </w:r>
+    </w:p>
+    <w:p>
+      <w:pPr>
+        <w:pStyle w:val="ListParagraph"/>
+        <w:numPr>
+          <w:ilvl w:val="0"/>
+          <w:numId w:val="1"/>
+        </w:numPr>
+      </w:pPr>
+      <w:r>
+        <w:rPr>
+          <w:rFonts w:ascii="Consolas" w:eastAsia="Consolas" w:hAnsi="Consolas" w:cs="Consolas"/>
+        </w:rPr>
+        <w:t xml:space="preserve">preference</w:t>
+      </w:r>
+      <w:r>
+        <w:t xml:space="preserve"> là cái người dùng chọn (</w:t>
+      </w:r>
+      <w:r>
+        <w:rPr>
+          <w:rFonts w:ascii="Consolas" w:eastAsia="Consolas" w:hAnsi="Consolas" w:cs="Consolas"/>
+        </w:rPr>
+        <w:t xml:space="preserve">system</w:t>
+      </w:r>
+      <w:r>
+        <w:t xml:space="preserve">, </w:t>
+      </w:r>
+      <w:r>
+        <w:rPr>
+          <w:rFonts w:ascii="Consolas" w:eastAsia="Consolas" w:hAnsi="Consolas" w:cs="Consolas"/>
+        </w:rPr>
+        <w:t xml:space="preserve">light</w:t>
+      </w:r>
+      <w:r>
+        <w:t xml:space="preserve"> hoặc </w:t>
+      </w:r>
+      <w:r>
+        <w:rPr>
+          <w:rFonts w:ascii="Consolas" w:eastAsia="Consolas" w:hAnsi="Consolas" w:cs="Consolas"/>
+        </w:rPr>
+        <w:t xml:space="preserve">dark</w:t>
+      </w:r>
+      <w:r>
+        <w:t xml:space="preserve">), lưu ở </w:t>
+      </w:r>
+      <w:r>
+        <w:rPr>
+          <w:rFonts w:ascii="Consolas" w:eastAsia="Consolas" w:hAnsi="Consolas" w:cs="Consolas"/>
+        </w:rPr>
+        <w:t xml:space="preserve">localStorage</w:t>
+      </w:r>
+      <w:r>
+        <w:t xml:space="preserve"> khoá </w:t>
+      </w:r>
+      <w:r>
+        <w:rPr>
+          <w:rFonts w:ascii="Consolas" w:eastAsia="Consolas" w:hAnsi="Consolas" w:cs="Consolas"/>
+        </w:rPr>
+        <w:t xml:space="preserve">sino.theme</w:t>
+      </w:r>
+      <w:r>
+        <w:t xml:space="preserve">.</w:t>
+      </w:r>
+    </w:p>
+    <w:p>
+      <w:pPr>
+        <w:pStyle w:val="ListParagraph"/>
+        <w:numPr>
+          <w:ilvl w:val="0"/>
+          <w:numId w:val="1"/>
+        </w:numPr>
+      </w:pPr>
+      <w:r>
+        <w:rPr>
+          <w:rFonts w:ascii="Consolas" w:eastAsia="Consolas" w:hAnsi="Consolas" w:cs="Consolas"/>
+        </w:rPr>
+        <w:t xml:space="preserve">theme</w:t>
+      </w:r>
+      <w:r>
+        <w:t xml:space="preserve"> là sáng hay tối đang dùng thật.</w:t>
+      </w:r>
+    </w:p>
+    <w:p>
+      <w:r>
+        <w:t xml:space="preserve">Khi </w:t>
+      </w:r>
+      <w:r>
+        <w:rPr>
+          <w:rFonts w:ascii="Consolas" w:eastAsia="Consolas" w:hAnsi="Consolas" w:cs="Consolas"/>
+        </w:rPr>
+        <w:t xml:space="preserve">preference</w:t>
+      </w:r>
+      <w:r>
+        <w:t xml:space="preserve"> là </w:t>
+      </w:r>
+      <w:r>
+        <w:rPr>
+          <w:rFonts w:ascii="Consolas" w:eastAsia="Consolas" w:hAnsi="Consolas" w:cs="Consolas"/>
+        </w:rPr>
+        <w:t xml:space="preserve">system</w:t>
+      </w:r>
+      <w:r>
+        <w:t xml:space="preserve">, </w:t>
+      </w:r>
+      <w:r>
+        <w:rPr>
+          <w:rFonts w:ascii="Consolas" w:eastAsia="Consolas" w:hAnsi="Consolas" w:cs="Consolas"/>
+        </w:rPr>
+        <w:t xml:space="preserve">theme</w:t>
+      </w:r>
+      <w:r>
+        <w:t xml:space="preserve"> đọc </w:t>
+      </w:r>
+      <w:r>
+        <w:rPr>
+          <w:rFonts w:ascii="Consolas" w:eastAsia="Consolas" w:hAnsi="Consolas" w:cs="Consolas"/>
+        </w:rPr>
+        <w:t xml:space="preserve">prefers-color-scheme</w:t>
+      </w:r>
+      <w:r>
+        <w:t xml:space="preserve"> qua </w:t>
+      </w:r>
+      <w:r>
+        <w:rPr>
+          <w:rFonts w:ascii="Consolas" w:eastAsia="Consolas" w:hAnsi="Consolas" w:cs="Consolas"/>
+        </w:rPr>
+        <w:t xml:space="preserve">useSyncExternalStore</w:t>
+      </w:r>
+      <w:r>
+        <w:t xml:space="preserve">, nên đổi theo ngay khi hệ điều hành đổi. Hàm </w:t>
+      </w:r>
+      <w:r>
+        <w:rPr>
+          <w:rFonts w:ascii="Consolas" w:eastAsia="Consolas" w:hAnsi="Consolas" w:cs="Consolas"/>
+        </w:rPr>
+        <w:t xml:space="preserve">subscribe</w:t>
+      </w:r>
+      <w:r>
+        <w:t xml:space="preserve"> được bọc trong </w:t>
+      </w:r>
+      <w:r>
+        <w:rPr>
+          <w:rFonts w:ascii="Consolas" w:eastAsia="Consolas" w:hAnsi="Consolas" w:cs="Consolas"/>
+        </w:rPr>
+        <w:t xml:space="preserve">useCallback</w:t>
+      </w:r>
+      <w:r>
+        <w:t xml:space="preserve"> theo </w:t>
+      </w:r>
+      <w:r>
+        <w:rPr>
+          <w:rFonts w:ascii="Consolas" w:eastAsia="Consolas" w:hAnsi="Consolas" w:cs="Consolas"/>
+        </w:rPr>
+        <w:t xml:space="preserve">preference</w:t>
+      </w:r>
+      <w:r>
+        <w:t xml:space="preserve">: nếu mỗi lần render là một hàm mới, React sẽ huỷ rồi đăng ký lại lắng nghe ở mỗi lần render. </w:t>
+      </w:r>
+      <w:r>
+        <w:rPr>
+          <w:rFonts w:ascii="Consolas" w:eastAsia="Consolas" w:hAnsi="Consolas" w:cs="Consolas"/>
+        </w:rPr>
+        <w:t xml:space="preserve">theme</w:t>
+      </w:r>
+      <w:r>
+        <w:t xml:space="preserve"> và </w:t>
+      </w:r>
+      <w:r>
+        <w:rPr>
+          <w:rFonts w:ascii="Consolas" w:eastAsia="Consolas" w:hAnsi="Consolas" w:cs="Consolas"/>
+        </w:rPr>
+        <w:t xml:space="preserve">toggleTheme</w:t>
+      </w:r>
+      <w:r>
+        <w:t xml:space="preserve"> giữ nguyên tên, nên </w:t>
+      </w:r>
+      <w:r>
+        <w:rPr>
+          <w:rFonts w:ascii="Consolas" w:eastAsia="Consolas" w:hAnsi="Consolas" w:cs="Consolas"/>
+        </w:rPr>
+        <w:t xml:space="preserve">MorePage</w:t>
+      </w:r>
+      <w:r>
+        <w:t xml:space="preserve">, </w:t>
+      </w:r>
+      <w:r>
+        <w:rPr>
+          <w:rFonts w:ascii="Consolas" w:eastAsia="Consolas" w:hAnsi="Consolas" w:cs="Consolas"/>
+        </w:rPr>
+        <w:t xml:space="preserve">UserMenu</w:t>
+      </w:r>
+      <w:r>
+        <w:t xml:space="preserve"> và </w:t>
+      </w:r>
+      <w:r>
+        <w:rPr>
+          <w:rFonts w:ascii="Consolas" w:eastAsia="Consolas" w:hAnsi="Consolas" w:cs="Consolas"/>
+        </w:rPr>
+        <w:t xml:space="preserve">ThemeToggle</w:t>
+      </w:r>
+      <w:r>
+        <w:t xml:space="preserve"> không phải sửa. Người dùng cũ chưa từng chọn gì nay rơi vào </w:t>
+      </w:r>
+      <w:r>
+        <w:rPr>
+          <w:rFonts w:ascii="Consolas" w:eastAsia="Consolas" w:hAnsi="Consolas" w:cs="Consolas"/>
+        </w:rPr>
+        <w:t xml:space="preserve">system</w:t>
+      </w:r>
+      <w:r>
+        <w:t xml:space="preserve">, tức đúng như trước, chỉ khác là app theo được khi hệ điều hành đổi.</w:t>
+      </w:r>
+    </w:p>
+    <w:p>
+      <w:pPr>
+        <w:pStyle w:val="Heading3"/>
+      </w:pPr>
+      <w:r>
+        <w:t xml:space="preserve">26.3 Dữ liệu mẫu giữ trong cache của TanStack Query</w:t>
+      </w:r>
+    </w:p>
+    <w:p>
+      <w:r>
+        <w:rPr>
+          <w:rFonts w:ascii="Consolas" w:eastAsia="Consolas" w:hAnsi="Consolas" w:cs="Consolas"/>
+        </w:rPr>
+        <w:t xml:space="preserve">useSettingsSample</w:t>
+      </w:r>
+      <w:r>
+        <w:t xml:space="preserve"> đặt dữ liệu mẫu vào cache với </w:t>
+      </w:r>
+      <w:r>
+        <w:rPr>
+          <w:rFonts w:ascii="Consolas" w:eastAsia="Consolas" w:hAnsi="Consolas" w:cs="Consolas"/>
+        </w:rPr>
+        <w:t xml:space="preserve">initialData</w:t>
+      </w:r>
+      <w:r>
+        <w:t xml:space="preserve"> (có ngay, không có lúc "đang tải"), </w:t>
+      </w:r>
+      <w:r>
+        <w:rPr>
+          <w:rFonts w:ascii="Consolas" w:eastAsia="Consolas" w:hAnsi="Consolas" w:cs="Consolas"/>
+        </w:rPr>
+        <w:t xml:space="preserve">staleTime: Infinity</w:t>
+      </w:r>
+      <w:r>
+        <w:t xml:space="preserve"> và </w:t>
+      </w:r>
+      <w:r>
+        <w:rPr>
+          <w:rFonts w:ascii="Consolas" w:eastAsia="Consolas" w:hAnsi="Consolas" w:cs="Consolas"/>
+        </w:rPr>
+        <w:t xml:space="preserve">gcTime: Infinity</w:t>
+      </w:r>
+      <w:r>
+        <w:t xml:space="preserve">, và đổi bằng </w:t>
+      </w:r>
+      <w:r>
+        <w:rPr>
+          <w:rFonts w:ascii="Consolas" w:eastAsia="Consolas" w:hAnsi="Consolas" w:cs="Consolas"/>
+        </w:rPr>
+        <w:t xml:space="preserve">setQueryData</w:t>
+      </w:r>
+      <w:r>
+        <w:t xml:space="preserve">. Một </w:t>
+      </w:r>
+      <w:r>
+        <w:rPr>
+          <w:rFonts w:ascii="Consolas" w:eastAsia="Consolas" w:hAnsi="Consolas" w:cs="Consolas"/>
+        </w:rPr>
+        <w:t xml:space="preserve">useState</w:t>
+      </w:r>
+      <w:r>
+        <w:t xml:space="preserve"> trong trang sẽ mất giá trị khi sang trang con trên điện thoại (</w:t>
+      </w:r>
+      <w:r>
+        <w:rPr>
+          <w:rFonts w:ascii="Consolas" w:eastAsia="Consolas" w:hAnsi="Consolas" w:cs="Consolas"/>
+        </w:rPr>
+        <w:t xml:space="preserve">/settings/notifications</w:t>
+      </w:r>
+      <w:r>
+        <w:t xml:space="preserve">); cache thì sống suốt phiên, và mất khi tải lại trang, đúng với "không lưu". Khi có backend, chỉ cần thay </w:t>
+      </w:r>
+      <w:r>
+        <w:rPr>
+          <w:rFonts w:ascii="Consolas" w:eastAsia="Consolas" w:hAnsi="Consolas" w:cs="Consolas"/>
+        </w:rPr>
+        <w:t xml:space="preserve">queryFn</w:t>
+      </w:r>
+      <w:r>
+        <w:t xml:space="preserve"> bằng lời gọi API và </w:t>
+      </w:r>
+      <w:r>
+        <w:rPr>
+          <w:rFonts w:ascii="Consolas" w:eastAsia="Consolas" w:hAnsi="Consolas" w:cs="Consolas"/>
+        </w:rPr>
+        <w:t xml:space="preserve">update</w:t>
+      </w:r>
+      <w:r>
+        <w:t xml:space="preserve"> bằng một mutation.</w:t>
+      </w:r>
+    </w:p>
+    <w:p>
+      <w:pPr>
+        <w:pStyle w:val="Heading3"/>
+      </w:pPr>
+      <w:r>
+        <w:t xml:space="preserve">26.4 Mục lục biết mục nào đang xem</w:t>
+      </w:r>
+    </w:p>
+    <w:p>
+      <w:r>
+        <w:t xml:space="preserve">Mỗi dòng mục lục là một liên kết </w:t>
+      </w:r>
+      <w:r>
+        <w:rPr>
+          <w:rFonts w:ascii="Consolas" w:eastAsia="Consolas" w:hAnsi="Consolas" w:cs="Consolas"/>
+        </w:rPr>
+        <w:t xml:space="preserve">#neo</w:t>
+      </w:r>
+      <w:r>
+        <w:t xml:space="preserve"> thường; trình duyệt tự cuộn khung cuộn của app tới </w:t>
+      </w:r>
+      <w:r>
+        <w:rPr>
+          <w:rFonts w:ascii="Consolas" w:eastAsia="Consolas" w:hAnsi="Consolas" w:cs="Consolas"/>
+        </w:rPr>
+        <w:t xml:space="preserve">section</w:t>
+      </w:r>
+      <w:r>
+        <w:t xml:space="preserve"> có </w:t>
+      </w:r>
+      <w:r>
+        <w:rPr>
+          <w:rFonts w:ascii="Consolas" w:eastAsia="Consolas" w:hAnsi="Consolas" w:cs="Consolas"/>
+        </w:rPr>
+        <w:t xml:space="preserve">id</w:t>
+      </w:r>
+      <w:r>
+        <w:t xml:space="preserve"> đó. </w:t>
+      </w:r>
+      <w:r>
+        <w:rPr>
+          <w:rFonts w:ascii="Consolas" w:eastAsia="Consolas" w:hAnsi="Consolas" w:cs="Consolas"/>
+        </w:rPr>
+        <w:t xml:space="preserve">scroll-mt-6</w:t>
+      </w:r>
+      <w:r>
+        <w:t xml:space="preserve"> chừa một khoảng phía trên tiêu đề. Mục đang xem do </w:t>
+      </w:r>
+      <w:r>
+        <w:rPr>
+          <w:rFonts w:ascii="Consolas" w:eastAsia="Consolas" w:hAnsi="Consolas" w:cs="Consolas"/>
+        </w:rPr>
+        <w:t xml:space="preserve">IntersectionObserver</w:t>
+      </w:r>
+      <w:r>
+        <w:t xml:space="preserve"> quyết:</w:t>
+      </w:r>
+    </w:p>
+    <w:p>
+      <w:pPr>
+        <w:pStyle w:val="ListParagraph"/>
+        <w:numPr>
+          <w:ilvl w:val="0"/>
+          <w:numId w:val="1"/>
+        </w:numPr>
+      </w:pPr>
+      <w:r>
+        <w:rPr>
+          <w:rFonts w:ascii="Consolas" w:eastAsia="Consolas" w:hAnsi="Consolas" w:cs="Consolas"/>
+        </w:rPr>
+        <w:t xml:space="preserve">rootMargin: '0px 0px -66% 0px'</w:t>
+      </w:r>
+      <w:r>
+        <w:t xml:space="preserve"> nghĩa là chỉ một phần ba trên của màn hình được tính.</w:t>
+      </w:r>
+    </w:p>
+    <w:p>
+      <w:pPr>
+        <w:pStyle w:val="ListParagraph"/>
+        <w:numPr>
+          <w:ilvl w:val="0"/>
+          <w:numId w:val="1"/>
+        </w:numPr>
+      </w:pPr>
+      <w:r>
+        <w:t xml:space="preserve">Trong các mục đang có mặt ở vùng đó, mục đầu tiên là mục hiện tại; dòng của nó có </w:t>
+      </w:r>
+      <w:r>
+        <w:rPr>
+          <w:rFonts w:ascii="Consolas" w:eastAsia="Consolas" w:hAnsi="Consolas" w:cs="Consolas"/>
+        </w:rPr>
+        <w:t xml:space="preserve">aria-current="location"</w:t>
+      </w:r>
+      <w:r>
+        <w:t xml:space="preserve">.</w:t>
+      </w:r>
+    </w:p>
+    <w:p>
+      <w:pPr>
+        <w:pStyle w:val="ListParagraph"/>
+        <w:numPr>
+          <w:ilvl w:val="0"/>
+          <w:numId w:val="1"/>
+        </w:numPr>
+      </w:pPr>
+      <w:r>
+        <w:t xml:space="preserve">Bấm một dòng thì dòng đó được đánh dấu ngay, không chờ cuộn xong.</w:t>
+      </w:r>
+    </w:p>
+    <w:p>
+      <w:r>
+        <w:t xml:space="preserve">jsdom không có </w:t>
+      </w:r>
+      <w:r>
+        <w:rPr>
+          <w:rFonts w:ascii="Consolas" w:eastAsia="Consolas" w:hAnsi="Consolas" w:cs="Consolas"/>
+        </w:rPr>
+        <w:t xml:space="preserve">IntersectionObserver</w:t>
+      </w:r>
+      <w:r>
+        <w:t xml:space="preserve">, nên hook kiểm </w:t>
+      </w:r>
+      <w:r>
+        <w:rPr>
+          <w:rFonts w:ascii="Consolas" w:eastAsia="Consolas" w:hAnsi="Consolas" w:cs="Consolas"/>
+        </w:rPr>
+        <w:t xml:space="preserve">typeof IntersectionObserver</w:t>
+      </w:r>
+      <w:r>
+        <w:t xml:space="preserve"> trước khi dùng. Chấm đỏ của "Nguồn đã kết nối" chỉ là hình (</w:t>
+      </w:r>
+      <w:r>
+        <w:rPr>
+          <w:rFonts w:ascii="Consolas" w:eastAsia="Consolas" w:hAnsi="Consolas" w:cs="Consolas"/>
+        </w:rPr>
+        <w:t xml:space="preserve">aria-hidden</w:t>
+      </w:r>
+      <w:r>
+        <w:t xml:space="preserve">), nên tên của liên kết nói thay: "Nguồn đã kết nối, 1 cần xử lý".</w:t>
+      </w:r>
+    </w:p>
+    <w:p>
+      <w:pPr>
+        <w:pStyle w:val="Heading3"/>
+      </w:pPr>
+      <w:r>
+        <w:t xml:space="preserve">26.5 Kiểm chứng</w:t>
+      </w:r>
+    </w:p>
+    <w:p>
+      <w:pPr>
+        <w:pStyle w:val="ListParagraph"/>
+        <w:numPr>
+          <w:ilvl w:val="0"/>
+          <w:numId w:val="1"/>
+        </w:numPr>
+      </w:pPr>
+      <w:r>
+        <w:rPr>
+          <w:b/>
+          <w:bCs/>
+        </w:rPr>
+        <w:t xml:space="preserve">Chrome thật:</w:t>
+      </w:r>
+      <w:r>
+        <w:t xml:space="preserve"> chưa kiểm (Claude in Chrome không kết nối); người dùng xem trên </w:t>
+      </w:r>
+      <w:r>
+        <w:rPr>
+          <w:rFonts w:ascii="Consolas" w:eastAsia="Consolas" w:hAnsi="Consolas" w:cs="Consolas"/>
+        </w:rPr>
+        <w:t xml:space="preserve">localhost:5173</w:t>
+      </w:r>
+      <w:r>
+        <w:t xml:space="preserve">.</w:t>
+      </w:r>
+    </w:p>
+    <w:p>
+      <w:pPr>
+        <w:pStyle w:val="ListParagraph"/>
+        <w:numPr>
+          <w:ilvl w:val="0"/>
+          <w:numId w:val="1"/>
+        </w:numPr>
+      </w:pPr>
+      <w:r>
+        <w:rPr>
+          <w:b/>
+          <w:bCs/>
+        </w:rPr>
+        <w:t xml:space="preserve">Test tự động:</w:t>
+      </w:r>
+      <w:r>
+        <w:t xml:space="preserve"> 7 ca trong </w:t>
+      </w:r>
+      <w:r>
+        <w:rPr>
+          <w:rFonts w:ascii="Consolas" w:eastAsia="Consolas" w:hAnsi="Consolas" w:cs="Consolas"/>
+        </w:rPr>
+        <w:t xml:space="preserve">SettingsPage.test.tsx</w:t>
+      </w:r>
+      <w:r>
+        <w:t xml:space="preserve">:</w:t>
+      </w:r>
+    </w:p>
+    <w:p>
+      <w:pPr>
+        <w:pStyle w:val="ListParagraph"/>
+        <w:numPr>
+          <w:ilvl w:val="1"/>
+          <w:numId w:val="1"/>
+        </w:numPr>
+      </w:pPr>
+      <w:r>
+        <w:t xml:space="preserve">thứ tự 9 mục và mục lục;</w:t>
+      </w:r>
+    </w:p>
+    <w:p>
+      <w:pPr>
+        <w:pStyle w:val="ListParagraph"/>
+        <w:numPr>
+          <w:ilvl w:val="1"/>
+          <w:numId w:val="1"/>
+        </w:numPr>
+      </w:pPr>
+      <w:r>
+        <w:t xml:space="preserve">mục lục đánh dấu mục được bấm;</w:t>
+      </w:r>
+    </w:p>
+    <w:p>
+      <w:pPr>
+        <w:pStyle w:val="ListParagraph"/>
+        <w:numPr>
+          <w:ilvl w:val="1"/>
+          <w:numId w:val="1"/>
+        </w:numPr>
+      </w:pPr>
+      <w:r>
+        <w:t xml:space="preserve">tên có "1 cần xử lý";</w:t>
+      </w:r>
+    </w:p>
+    <w:p>
+      <w:pPr>
+        <w:pStyle w:val="ListParagraph"/>
+        <w:numPr>
+          <w:ilvl w:val="1"/>
+          <w:numId w:val="1"/>
+        </w:numPr>
+      </w:pPr>
+      <w:r>
+        <w:t xml:space="preserve">theme đổi thật, lưu, và theo hệ điều hành;</w:t>
+      </w:r>
+    </w:p>
+    <w:p>
+      <w:pPr>
+        <w:pStyle w:val="ListParagraph"/>
+        <w:numPr>
+          <w:ilvl w:val="1"/>
+          <w:numId w:val="1"/>
+        </w:numPr>
+      </w:pPr>
+      <w:r>
+        <w:t xml:space="preserve">đổi công tắc, ô chọn, mức chuyển động thì giữ được giá trị mới;</w:t>
+      </w:r>
+    </w:p>
+    <w:p>
+      <w:pPr>
+        <w:pStyle w:val="ListParagraph"/>
+        <w:numPr>
+          <w:ilvl w:val="1"/>
+          <w:numId w:val="1"/>
+        </w:numPr>
+      </w:pPr>
+      <w:r>
+        <w:t xml:space="preserve">tài khoản thật kèm "Cần đăng nhập lại", và câu "Chưa kết nối tài khoản nào." khi không có tài khoản;</w:t>
+      </w:r>
+    </w:p>
+    <w:p>
+      <w:pPr>
+        <w:pStyle w:val="ListParagraph"/>
+        <w:numPr>
+          <w:ilvl w:val="1"/>
+          <w:numId w:val="1"/>
+        </w:numPr>
+      </w:pPr>
+      <w:r>
+        <w:t xml:space="preserve">"Chính sách quyền riêng tư" mở </w:t>
+      </w:r>
+      <w:r>
+        <w:rPr>
+          <w:rFonts w:ascii="Consolas" w:eastAsia="Consolas" w:hAnsi="Consolas" w:cs="Consolas"/>
+        </w:rPr>
+        <w:t xml:space="preserve">/privacy</w:t>
+      </w:r>
+      <w:r>
+        <w:t xml:space="preserve">.</w:t>
+      </w:r>
+    </w:p>
+    <w:p>
+      <w:pPr>
+        <w:pStyle w:val="ListParagraph"/>
+        <w:numPr>
+          <w:ilvl w:val="0"/>
+          <w:numId w:val="1"/>
+        </w:numPr>
+      </w:pPr>
+      <w:r>
+        <w:rPr>
+          <w:b/>
+          <w:bCs/>
+        </w:rPr>
+        <w:t xml:space="preserve">Cổng kiểm tra:</w:t>
+      </w:r>
+      <w:r>
+        <w:t xml:space="preserve"> </w:t>
+      </w:r>
+      <w:r>
+        <w:rPr>
+          <w:rFonts w:ascii="Consolas" w:eastAsia="Consolas" w:hAnsi="Consolas" w:cs="Consolas"/>
+        </w:rPr>
+        <w:t xml:space="preserve">pnpm lint</w:t>
+      </w:r>
+      <w:r>
+        <w:t xml:space="preserve"> 0 lỗi; </w:t>
+      </w:r>
+      <w:r>
+        <w:rPr>
+          <w:rFonts w:ascii="Consolas" w:eastAsia="Consolas" w:hAnsi="Consolas" w:cs="Consolas"/>
+        </w:rPr>
+        <w:t xml:space="preserve">tsc -b</w:t>
+      </w:r>
+      <w:r>
+        <w:t xml:space="preserve"> 0; </w:t>
+      </w:r>
+      <w:r>
+        <w:rPr>
+          <w:rFonts w:ascii="Consolas" w:eastAsia="Consolas" w:hAnsi="Consolas" w:cs="Consolas"/>
+        </w:rPr>
+        <w:t xml:space="preserve">pnpm build</w:t>
+      </w:r>
+      <w:r>
+        <w:t xml:space="preserve"> 0; </w:t>
+      </w:r>
+      <w:r>
+        <w:rPr>
+          <w:rFonts w:ascii="Consolas" w:eastAsia="Consolas" w:hAnsi="Consolas" w:cs="Consolas"/>
+        </w:rPr>
+        <w:t xml:space="preserve">pnpm test</w:t>
+      </w:r>
+      <w:r>
+        <w:t xml:space="preserve"> 1305/1309 (4 ca đỏ là các test tải lên </w:t>
+      </w:r>
+      <w:r>
+        <w:rPr>
+          <w:rFonts w:ascii="Consolas" w:eastAsia="Consolas" w:hAnsi="Consolas" w:cs="Consolas"/>
+        </w:rPr>
+        <w:t xml:space="preserve">FormData</w:t>
+      </w:r>
+      <w:r>
+        <w:t xml:space="preserve"> đã đỏ sẵn trên Node 26, ghi ở phase 5, mục 24.2).</w:t>
+      </w:r>
+    </w:p>
+    <w:p>
+      <w:pPr>
+        <w:pStyle w:val="Heading2"/>
+      </w:pPr>
+      <w:r>
         <w:t xml:space="preserve">Tự kiểm tra</w:t>
       </w:r>
     </w:p>

</xml_diff>

<commit_message>
feat(settings): sticker management inside Cài đặt (SE-04)
The sidebar, the rail and Thêm lose their Sticker item. The sticker
library opens at /settings/stickers, as it is, beside the table of
contents of Cài đặt, where "Sticker" follows "Nguồn đã kết nối"; the
other items lead back to /settings#section, which scrolls there.
/stickers redirects to /settings/stickers, so old links and the sticker
tests still land on it. The sticker files are not touched (sticker-packs),
so on a phone its back button still goes to Thêm.

tsc -b 0, lint 0 errors, build 0, pnpm test 1306/1310 (the 4 known
FormData upload reds). Real Chrome NOT VERIFIED.

Co-Authored-By: Claude Opus 5.5 (1M context) <noreply@anthropic.com>
</commit_message>
<xml_diff>
--- a/docs/knowledge/phase-1-frontend-foundation.docx
+++ b/docs/knowledge/phase-1-frontend-foundation.docx
@@ -34251,7 +34251,213 @@
         <w:pStyle w:val="Heading3"/>
       </w:pPr>
       <w:r>
-        <w:t xml:space="preserve">26.5 Kiểm chứng</w:t>
+        <w:t xml:space="preserve">26.5 Sticker trong Cài đặt (SE-04)</w:t>
+      </w:r>
+    </w:p>
+    <w:p>
+      <w:r>
+        <w:t xml:space="preserve">Người dùng muốn quản lý sticker nằm trong Cài đặt. Màn sticker có lưới, bộ sticker và bước sửa ảnh, quá dài để làm một mục cuộn, nên nó thành một đường dẫn riêng </w:t>
+      </w:r>
+      <w:r>
+        <w:rPr>
+          <w:rFonts w:ascii="Consolas" w:eastAsia="Consolas" w:hAnsi="Consolas" w:cs="Consolas"/>
+        </w:rPr>
+        <w:t xml:space="preserve">/settings/stickers</w:t>
+      </w:r>
+      <w:r>
+        <w:t xml:space="preserve"> nằm cạnh mục lục:</w:t>
+      </w:r>
+    </w:p>
+    <w:p>
+      <w:pPr>
+        <w:pStyle w:val="ListParagraph"/>
+        <w:numPr>
+          <w:ilvl w:val="0"/>
+          <w:numId w:val="1"/>
+        </w:numPr>
+      </w:pPr>
+      <w:r>
+        <w:rPr>
+          <w:b/>
+          <w:bCs/>
+        </w:rPr>
+        <w:t xml:space="preserve">Thanh bên và trang "Thêm"</w:t>
+      </w:r>
+      <w:r>
+        <w:t xml:space="preserve"> bỏ mục "Sticker". Tab "Thêm" vẫn là tab hiện tại trên trang này, vì </w:t>
+      </w:r>
+      <w:r>
+        <w:rPr>
+          <w:rFonts w:ascii="Consolas" w:eastAsia="Consolas" w:hAnsi="Consolas" w:cs="Consolas"/>
+        </w:rPr>
+        <w:t xml:space="preserve">MORE_PATHS</w:t>
+      </w:r>
+      <w:r>
+        <w:t xml:space="preserve"> so theo tiền tố: </w:t>
+      </w:r>
+      <w:r>
+        <w:rPr>
+          <w:rFonts w:ascii="Consolas" w:eastAsia="Consolas" w:hAnsi="Consolas" w:cs="Consolas"/>
+        </w:rPr>
+        <w:t xml:space="preserve">/settings/stickers</w:t>
+      </w:r>
+      <w:r>
+        <w:t xml:space="preserve"> bắt đầu bằng </w:t>
+      </w:r>
+      <w:r>
+        <w:rPr>
+          <w:rFonts w:ascii="Consolas" w:eastAsia="Consolas" w:hAnsi="Consolas" w:cs="Consolas"/>
+        </w:rPr>
+        <w:t xml:space="preserve">/settings</w:t>
+      </w:r>
+      <w:r>
+        <w:t xml:space="preserve">.</w:t>
+      </w:r>
+    </w:p>
+    <w:p>
+      <w:pPr>
+        <w:pStyle w:val="ListParagraph"/>
+        <w:numPr>
+          <w:ilvl w:val="0"/>
+          <w:numId w:val="1"/>
+        </w:numPr>
+      </w:pPr>
+      <w:r>
+        <w:rPr>
+          <w:b/>
+          <w:bCs/>
+        </w:rPr>
+        <w:t xml:space="preserve">Địa chỉ cũ</w:t>
+      </w:r>
+      <w:r>
+        <w:t xml:space="preserve"> </w:t>
+      </w:r>
+      <w:r>
+        <w:rPr>
+          <w:rFonts w:ascii="Consolas" w:eastAsia="Consolas" w:hAnsi="Consolas" w:cs="Consolas"/>
+        </w:rPr>
+        <w:t xml:space="preserve">/stickers</w:t>
+      </w:r>
+      <w:r>
+        <w:t xml:space="preserve"> là một </w:t>
+      </w:r>
+      <w:r>
+        <w:rPr>
+          <w:rFonts w:ascii="Consolas" w:eastAsia="Consolas" w:hAnsi="Consolas" w:cs="Consolas"/>
+        </w:rPr>
+        <w:t xml:space="preserve">&lt;Navigate replace&gt;</w:t>
+      </w:r>
+      <w:r>
+        <w:t xml:space="preserve">. Liên kết cũ (như "Mở thư viện sticker" trong khung chọn sticker) và các test của màn sticker vẫn đi đúng chỗ mà không cần sửa. </w:t>
+      </w:r>
+      <w:r>
+        <w:rPr>
+          <w:rFonts w:ascii="Consolas" w:eastAsia="Consolas" w:hAnsi="Consolas" w:cs="Consolas"/>
+        </w:rPr>
+        <w:t xml:space="preserve">replace</w:t>
+      </w:r>
+      <w:r>
+        <w:t xml:space="preserve"> để nút Back của trình duyệt không quay về địa chỉ chỉ có nhiệm vụ chuyển tiếp.</w:t>
+      </w:r>
+    </w:p>
+    <w:p>
+      <w:pPr>
+        <w:pStyle w:val="ListParagraph"/>
+        <w:numPr>
+          <w:ilvl w:val="0"/>
+          <w:numId w:val="1"/>
+        </w:numPr>
+      </w:pPr>
+      <w:r>
+        <w:rPr>
+          <w:b/>
+          <w:bCs/>
+        </w:rPr>
+        <w:t xml:space="preserve">Mục lục trên trang sticker:</w:t>
+      </w:r>
+      <w:r>
+        <w:t xml:space="preserve"> mỗi mục là một </w:t>
+      </w:r>
+      <w:r>
+        <w:rPr>
+          <w:rFonts w:ascii="Consolas" w:eastAsia="Consolas" w:hAnsi="Consolas" w:cs="Consolas"/>
+        </w:rPr>
+        <w:t xml:space="preserve">Link</w:t>
+      </w:r>
+      <w:r>
+        <w:t xml:space="preserve"> tới </w:t>
+      </w:r>
+      <w:r>
+        <w:rPr>
+          <w:rFonts w:ascii="Consolas" w:eastAsia="Consolas" w:hAnsi="Consolas" w:cs="Consolas"/>
+        </w:rPr>
+        <w:t xml:space="preserve">/settings#neo</w:t>
+      </w:r>
+      <w:r>
+        <w:t xml:space="preserve">. React Router không tự cuộn tới </w:t>
+      </w:r>
+      <w:r>
+        <w:rPr>
+          <w:rFonts w:ascii="Consolas" w:eastAsia="Consolas" w:hAnsi="Consolas" w:cs="Consolas"/>
+        </w:rPr>
+        <w:t xml:space="preserve">#neo</w:t>
+      </w:r>
+      <w:r>
+        <w:t xml:space="preserve"> khi đổi trang, nên </w:t>
+      </w:r>
+      <w:r>
+        <w:rPr>
+          <w:rFonts w:ascii="Consolas" w:eastAsia="Consolas" w:hAnsi="Consolas" w:cs="Consolas"/>
+        </w:rPr>
+        <w:t xml:space="preserve">SettingsPage</w:t>
+      </w:r>
+      <w:r>
+        <w:t xml:space="preserve"> đọc </w:t>
+      </w:r>
+      <w:r>
+        <w:rPr>
+          <w:rFonts w:ascii="Consolas" w:eastAsia="Consolas" w:hAnsi="Consolas" w:cs="Consolas"/>
+        </w:rPr>
+        <w:t xml:space="preserve">location.hash</w:t>
+      </w:r>
+      <w:r>
+        <w:t xml:space="preserve"> trong một effect và gọi </w:t>
+      </w:r>
+      <w:r>
+        <w:rPr>
+          <w:rFonts w:ascii="Consolas" w:eastAsia="Consolas" w:hAnsi="Consolas" w:cs="Consolas"/>
+        </w:rPr>
+        <w:t xml:space="preserve">scrollIntoView()</w:t>
+      </w:r>
+      <w:r>
+        <w:t xml:space="preserve">.</w:t>
+      </w:r>
+    </w:p>
+    <w:p>
+      <w:pPr>
+        <w:pStyle w:val="ListParagraph"/>
+        <w:numPr>
+          <w:ilvl w:val="0"/>
+          <w:numId w:val="1"/>
+        </w:numPr>
+      </w:pPr>
+      <w:r>
+        <w:rPr>
+          <w:b/>
+          <w:bCs/>
+        </w:rPr>
+        <w:t xml:space="preserve">Không sửa file nào của màn sticker</w:t>
+      </w:r>
+      <w:r>
+        <w:t xml:space="preserve">, vì chúng thuộc một change khác. Hệ quả: trên điện thoại, nút quay lại của màn sticker vẫn về "Thêm".</w:t>
+      </w:r>
+    </w:p>
+    <w:p>
+      <w:pPr>
+        <w:pStyle w:val="Heading3"/>
+      </w:pPr>
+      <w:r>
+        <w:t xml:space="preserve">26.6 Kiểm chứng</w:t>
       </w:r>
     </w:p>
     <w:p>

</xml_diff>